<commit_message>
Added cnn-lstm, cnn-bilstm, and stlstm
</commit_message>
<xml_diff>
--- a/docs/24202141_p1_report.docx
+++ b/docs/24202141_p1_report.docx
@@ -3807,30 +3807,109 @@
         <w:t>ith intricate</w:t>
       </w:r>
       <w:r>
+        <w:t xml:space="preserve"> spatio-temporal interconnections</w:t>
+      </w:r>
+      <w:r>
         <w:t xml:space="preserve"> </w:t>
       </w:r>
-      <w:proofErr w:type="spellStart"/>
-      <w:r>
-        <w:t>spatio</w:t>
-      </w:r>
-      <w:proofErr w:type="spellEnd"/>
-      <w:r>
-        <w:t>-temporal interconnections</w:t>
+      <w:r>
+        <w:t>within</w:t>
+      </w:r>
+      <w:r>
+        <w:t xml:space="preserve"> public transit networks </w:t>
+      </w:r>
+      <w:r>
+        <w:rPr>
+          <w:noProof/>
+        </w:rPr>
+        <w:t>(Chen, Fu, &amp; Wang, 2022)</w:t>
+      </w:r>
+      <w:r>
+        <w:t>.</w:t>
       </w:r>
       <w:r>
         <w:t xml:space="preserve"> </w:t>
       </w:r>
       <w:r>
-        <w:t>within</w:t>
-      </w:r>
-      <w:r>
-        <w:t xml:space="preserve"> public transit networks </w:t>
+        <w:t xml:space="preserve">Unlike traditional models like AutoRegressive Integrated Moving Average (ARIMA), </w:t>
+      </w:r>
+      <w:r>
+        <w:t>DL</w:t>
+      </w:r>
+      <w:r>
+        <w:t xml:space="preserve"> approaches such as Long Short-Term Memory (LSTM) and Graph Convolutional Networks (GCN)</w:t>
+      </w:r>
+      <w:r>
+        <w:t xml:space="preserve"> </w:t>
+      </w:r>
+      <w:r>
+        <w:t>can integrate</w:t>
+      </w:r>
+      <w:r>
+        <w:t xml:space="preserve"> </w:t>
+      </w:r>
+      <w:r>
+        <w:t>multiple</w:t>
+      </w:r>
+      <w:r>
+        <w:t xml:space="preserve"> data sources</w:t>
+      </w:r>
+      <w:r>
+        <w:t xml:space="preserve"> to be trained on</w:t>
+      </w:r>
+      <w:r>
+        <w:t>, f</w:t>
+      </w:r>
+      <w:r>
+        <w:t xml:space="preserve">or </w:t>
+      </w:r>
+      <w:r>
+        <w:t>example</w:t>
+      </w:r>
+      <w:r>
+        <w:t xml:space="preserve">, </w:t>
+      </w:r>
+      <w:r>
+        <w:t xml:space="preserve">General Transit Feed Specification (GTFS) data, </w:t>
+      </w:r>
+      <w:r>
+        <w:t>historical weather patterns, Points of Interest (POIs) and so on</w:t>
+      </w:r>
+      <w:r>
+        <w:t xml:space="preserve">, thus </w:t>
+      </w:r>
+      <w:r>
+        <w:t>allow</w:t>
+      </w:r>
+      <w:r>
+        <w:t>ing</w:t>
+      </w:r>
+      <w:r>
+        <w:t xml:space="preserve"> the model to </w:t>
+      </w:r>
+      <w:r>
+        <w:t>fully capture both spatial and temporal relationships within transit systems</w:t>
+      </w:r>
+      <w:r>
+        <w:t xml:space="preserve"> </w:t>
       </w:r>
       <w:r>
         <w:rPr>
           <w:noProof/>
         </w:rPr>
-        <w:t>(Chen, Fu, &amp; Wang, 2022)</w:t>
+        <w:t>(</w:t>
+      </w:r>
+      <w:r>
+        <w:rPr>
+          <w:noProof/>
+        </w:rPr>
+        <w:t xml:space="preserve">Ge et al., 2021; </w:t>
+      </w:r>
+      <w:r>
+        <w:rPr>
+          <w:noProof/>
+        </w:rPr>
+        <w:t>Chen, Fu, &amp; Wang, 2022)</w:t>
       </w:r>
       <w:r>
         <w:t>.</w:t>
@@ -3839,128 +3918,25 @@
         <w:t xml:space="preserve"> </w:t>
       </w:r>
       <w:r>
-        <w:t xml:space="preserve">Unlike traditional models like </w:t>
-      </w:r>
-      <w:proofErr w:type="spellStart"/>
-      <w:r>
-        <w:t>AutoRegressive</w:t>
-      </w:r>
-      <w:proofErr w:type="spellEnd"/>
-      <w:r>
-        <w:t xml:space="preserve"> Integrated Moving Average (ARIMA), </w:t>
+        <w:t>As a result</w:t>
+      </w:r>
+      <w:r>
+        <w:t xml:space="preserve">, </w:t>
+      </w:r>
+      <w:r>
+        <w:t xml:space="preserve">state-of-the-art (SOTA) </w:t>
       </w:r>
       <w:r>
         <w:t>DL</w:t>
       </w:r>
       <w:r>
-        <w:t xml:space="preserve"> approaches such as Long Short-Term Memory (LSTM) and Graph Convolutional Networks (GCN)</w:t>
-      </w:r>
-      <w:r>
-        <w:t xml:space="preserve"> </w:t>
-      </w:r>
-      <w:r>
-        <w:t>can integrate</w:t>
-      </w:r>
-      <w:r>
-        <w:t xml:space="preserve"> </w:t>
-      </w:r>
-      <w:r>
-        <w:t>multiple</w:t>
-      </w:r>
-      <w:r>
-        <w:t xml:space="preserve"> data sources</w:t>
-      </w:r>
-      <w:r>
-        <w:t xml:space="preserve"> to be trained on</w:t>
-      </w:r>
-      <w:r>
-        <w:t>, f</w:t>
-      </w:r>
-      <w:r>
-        <w:t xml:space="preserve">or </w:t>
-      </w:r>
-      <w:r>
-        <w:t>example</w:t>
-      </w:r>
-      <w:r>
-        <w:t xml:space="preserve">, </w:t>
-      </w:r>
-      <w:r>
-        <w:t xml:space="preserve">General Transit Feed Specification (GTFS) data, </w:t>
-      </w:r>
-      <w:r>
-        <w:t>historical weather patterns, Points of Interest (POIs) and so on</w:t>
-      </w:r>
-      <w:r>
-        <w:t xml:space="preserve">, thus </w:t>
-      </w:r>
-      <w:r>
-        <w:t>allow</w:t>
-      </w:r>
-      <w:r>
-        <w:t>ing</w:t>
-      </w:r>
-      <w:r>
-        <w:t xml:space="preserve"> the model to </w:t>
-      </w:r>
-      <w:r>
-        <w:t>fully capture both spatial and temporal relationships within transit systems</w:t>
-      </w:r>
-      <w:r>
-        <w:t xml:space="preserve"> </w:t>
-      </w:r>
-      <w:r>
-        <w:rPr>
-          <w:noProof/>
-        </w:rPr>
-        <w:t>(</w:t>
-      </w:r>
-      <w:r>
-        <w:rPr>
-          <w:noProof/>
-        </w:rPr>
-        <w:t xml:space="preserve">Ge et al., 2021; </w:t>
-      </w:r>
-      <w:r>
-        <w:rPr>
-          <w:noProof/>
-        </w:rPr>
-        <w:t>Chen, Fu, &amp; Wang, 2022)</w:t>
-      </w:r>
-      <w:r>
-        <w:t>.</w:t>
-      </w:r>
-      <w:r>
-        <w:t xml:space="preserve"> </w:t>
-      </w:r>
-      <w:r>
-        <w:t>As a result</w:t>
-      </w:r>
-      <w:r>
-        <w:t xml:space="preserve">, </w:t>
-      </w:r>
-      <w:r>
-        <w:t xml:space="preserve">state-of-the-art (SOTA) </w:t>
-      </w:r>
-      <w:r>
-        <w:t>DL</w:t>
-      </w:r>
-      <w:r>
         <w:t xml:space="preserve"> architectures must be implemented </w:t>
       </w:r>
       <w:r>
         <w:t xml:space="preserve">to achieve </w:t>
       </w:r>
       <w:r>
-        <w:t xml:space="preserve">highly accurate ridership predictions with complex </w:t>
-      </w:r>
-      <w:proofErr w:type="spellStart"/>
-      <w:r>
-        <w:t>spatio</w:t>
-      </w:r>
-      <w:proofErr w:type="spellEnd"/>
-      <w:r>
-        <w:t>-temporal data</w:t>
+        <w:t>highly accurate ridership predictions with complex spatio-temporal data</w:t>
       </w:r>
       <w:r>
         <w:t>.</w:t>
@@ -4023,35 +3999,7 @@
         <w:rPr>
           <w:lang w:val="en-US"/>
         </w:rPr>
-        <w:t xml:space="preserve">Consequently, transit authorities face a critical bottleneck in optimizing schedules, routes, and intervals amid peak hours and holidays, thus increasing the unreliability of Malaysia’s public transit and dissatisfaction among passengers. To solve this problem, it requires a dual approach: (1) identify specific </w:t>
-      </w:r>
-      <w:proofErr w:type="spellStart"/>
-      <w:r>
-        <w:rPr>
-          <w:lang w:val="en-US"/>
-        </w:rPr>
-        <w:t>spatio</w:t>
-      </w:r>
-      <w:proofErr w:type="spellEnd"/>
-      <w:r>
-        <w:rPr>
-          <w:lang w:val="en-US"/>
-        </w:rPr>
-        <w:t xml:space="preserve">-temporal factors that heavily influence the ridership trend in Malaysia’s public transit; (2) develop a robust predictive model capable of accurately forecasting daily ridership trends based on these identified </w:t>
-      </w:r>
-      <w:proofErr w:type="spellStart"/>
-      <w:r>
-        <w:rPr>
-          <w:lang w:val="en-US"/>
-        </w:rPr>
-        <w:t>spatio</w:t>
-      </w:r>
-      <w:proofErr w:type="spellEnd"/>
-      <w:r>
-        <w:rPr>
-          <w:lang w:val="en-US"/>
-        </w:rPr>
-        <w:t>-temporal features.</w:t>
+        <w:t>Consequently, transit authorities face a critical bottleneck in optimizing schedules, routes, and intervals amid peak hours and holidays, thus increasing the unreliability of Malaysia’s public transit and dissatisfaction among passengers. To solve this problem, it requires a dual approach: (1) identify specific spatio-temporal factors that heavily influence the ridership trend in Malaysia’s public transit; (2) develop a robust predictive model capable of accurately forecasting daily ridership trends based on these identified spatio-temporal features.</w:t>
       </w:r>
     </w:p>
     <w:p>
@@ -4218,13 +4166,8 @@
       <w:r>
         <w:t xml:space="preserve"> </w:t>
       </w:r>
-      <w:proofErr w:type="spellStart"/>
-      <w:r>
-        <w:t>spatio</w:t>
-      </w:r>
-      <w:proofErr w:type="spellEnd"/>
-      <w:r>
-        <w:t xml:space="preserve">-temporal architectures </w:t>
+      <w:r>
+        <w:t xml:space="preserve">spatio-temporal architectures </w:t>
       </w:r>
       <w:r>
         <w:t>compared</w:t>
@@ -4375,7 +4318,7 @@
         <w:t xml:space="preserve"> of </w:t>
       </w:r>
       <w:r>
-        <w:t>90</w:t>
+        <w:t>85</w:t>
       </w:r>
       <w:r>
         <w:t>%</w:t>
@@ -4393,15 +4336,7 @@
         </w:numPr>
       </w:pPr>
       <w:r>
-        <w:t xml:space="preserve">To evaluate and benchmark the performance of </w:t>
-      </w:r>
-      <w:proofErr w:type="spellStart"/>
-      <w:r>
-        <w:t>spatio</w:t>
-      </w:r>
-      <w:proofErr w:type="spellEnd"/>
-      <w:r>
-        <w:t xml:space="preserve">-temporal architectures against a baseline LSTM model using </w:t>
+        <w:t xml:space="preserve">To evaluate and benchmark the performance of spatio-temporal architectures against a baseline LSTM model using </w:t>
       </w:r>
       <w:r>
         <w:t xml:space="preserve">combined </w:t>
@@ -4606,41 +4541,6 @@
               </w:rPr>
             </w:pPr>
             <w:r>
-              <w:t xml:space="preserve">Graph Convolution Network </w:t>
-            </w:r>
-            <w:r>
-              <w:t xml:space="preserve">– Stacked Bidirectional Unidirectional LSTM </w:t>
-            </w:r>
-            <w:r>
-              <w:rPr>
-                <w:b/>
-                <w:bCs/>
-              </w:rPr>
-              <w:t>(GCN-</w:t>
-            </w:r>
-            <w:r>
-              <w:rPr>
-                <w:b/>
-                <w:bCs/>
-              </w:rPr>
-              <w:t>SBULSTM)</w:t>
-            </w:r>
-          </w:p>
-          <w:p>
-            <w:pPr>
-              <w:pStyle w:val="ListParagraph"/>
-              <w:numPr>
-                <w:ilvl w:val="0"/>
-                <w:numId w:val="9"/>
-              </w:numPr>
-              <w:ind w:left="381"/>
-              <w:jc w:val="left"/>
-              <w:rPr>
-                <w:b/>
-                <w:bCs/>
-              </w:rPr>
-            </w:pPr>
-            <w:r>
               <w:t>Bi</w:t>
             </w:r>
             <w:r>
@@ -5566,7 +5466,6 @@
           <w:u w:val="single"/>
         </w:rPr>
       </w:pPr>
-      <w:bookmarkStart w:id="26" w:name="_Toc228807708"/>
       <w:r>
         <w:rPr>
           <w:b/>
@@ -5575,9 +5474,8 @@
           <w:szCs w:val="24"/>
           <w:u w:val="single"/>
         </w:rPr>
-        <w:t>Explanatory Data Analysis</w:t>
-      </w:r>
-      <w:bookmarkEnd w:id="26"/>
+        <w:t>Feature Engineering</w:t>
+      </w:r>
     </w:p>
     <w:p>
       <w:pPr>
@@ -5594,7 +5492,7 @@
           <w:u w:val="single"/>
         </w:rPr>
       </w:pPr>
-      <w:bookmarkStart w:id="27" w:name="_Toc228807709"/>
+      <w:bookmarkStart w:id="26" w:name="_Toc228807708"/>
       <w:r>
         <w:rPr>
           <w:b/>
@@ -5603,6 +5501,34 @@
           <w:szCs w:val="24"/>
           <w:u w:val="single"/>
         </w:rPr>
+        <w:t>Explanatory Data Analysis</w:t>
+      </w:r>
+      <w:bookmarkEnd w:id="26"/>
+    </w:p>
+    <w:p>
+      <w:pPr>
+        <w:pStyle w:val="Heading2"/>
+        <w:numPr>
+          <w:ilvl w:val="1"/>
+          <w:numId w:val="10"/>
+        </w:numPr>
+        <w:rPr>
+          <w:b/>
+          <w:bCs/>
+          <w:sz w:val="24"/>
+          <w:szCs w:val="24"/>
+          <w:u w:val="single"/>
+        </w:rPr>
+      </w:pPr>
+      <w:bookmarkStart w:id="27" w:name="_Toc228807709"/>
+      <w:r>
+        <w:rPr>
+          <w:b/>
+          <w:bCs/>
+          <w:sz w:val="24"/>
+          <w:szCs w:val="24"/>
+          <w:u w:val="single"/>
+        </w:rPr>
         <w:t>Baseline &amp; Comparative Models</w:t>
       </w:r>
       <w:bookmarkEnd w:id="27"/>
@@ -5650,7 +5576,7 @@
           <w:u w:val="single"/>
         </w:rPr>
       </w:pPr>
-      <w:bookmarkStart w:id="29" w:name="_Toc228807711"/>
+      <w:bookmarkStart w:id="29" w:name="_Toc228807712"/>
       <w:r>
         <w:rPr>
           <w:b/>
@@ -5659,7 +5585,8 @@
           <w:szCs w:val="24"/>
           <w:u w:val="single"/>
         </w:rPr>
-        <w:t>GCN-SBULSTM</w:t>
+        <w:lastRenderedPageBreak/>
+        <w:t>BiLSTM</w:t>
       </w:r>
       <w:bookmarkEnd w:id="29"/>
     </w:p>
@@ -5678,7 +5605,7 @@
           <w:u w:val="single"/>
         </w:rPr>
       </w:pPr>
-      <w:bookmarkStart w:id="30" w:name="_Toc228807712"/>
+      <w:bookmarkStart w:id="30" w:name="_Toc228807713"/>
       <w:r>
         <w:rPr>
           <w:b/>
@@ -5687,8 +5614,7 @@
           <w:szCs w:val="24"/>
           <w:u w:val="single"/>
         </w:rPr>
-        <w:lastRenderedPageBreak/>
-        <w:t>BiLSTM</w:t>
+        <w:t>TPA-LSTM</w:t>
       </w:r>
       <w:bookmarkEnd w:id="30"/>
     </w:p>
@@ -5707,7 +5633,7 @@
           <w:u w:val="single"/>
         </w:rPr>
       </w:pPr>
-      <w:bookmarkStart w:id="31" w:name="_Toc228807713"/>
+      <w:bookmarkStart w:id="31" w:name="_Toc228807714"/>
       <w:r>
         <w:rPr>
           <w:b/>
@@ -5716,7 +5642,7 @@
           <w:szCs w:val="24"/>
           <w:u w:val="single"/>
         </w:rPr>
-        <w:t>TPA-LSTM</w:t>
+        <w:t>TGACN</w:t>
       </w:r>
       <w:bookmarkEnd w:id="31"/>
     </w:p>
@@ -5735,7 +5661,7 @@
           <w:u w:val="single"/>
         </w:rPr>
       </w:pPr>
-      <w:bookmarkStart w:id="32" w:name="_Toc228807714"/>
+      <w:bookmarkStart w:id="32" w:name="_Toc228807715"/>
       <w:r>
         <w:rPr>
           <w:b/>
@@ -5744,17 +5670,9 @@
           <w:szCs w:val="24"/>
           <w:u w:val="single"/>
         </w:rPr>
-        <w:t>TGACN</w:t>
-      </w:r>
-      <w:bookmarkEnd w:id="32"/>
-    </w:p>
-    <w:p>
-      <w:pPr>
-        <w:pStyle w:val="Heading3"/>
-        <w:numPr>
-          <w:ilvl w:val="0"/>
-          <w:numId w:val="10"/>
-        </w:numPr>
+        <w:t>STGNN-</w:t>
+      </w:r>
+      <w:r>
         <w:rPr>
           <w:b/>
           <w:bCs/>
@@ -5762,19 +5680,9 @@
           <w:szCs w:val="24"/>
           <w:u w:val="single"/>
         </w:rPr>
-      </w:pPr>
-      <w:bookmarkStart w:id="33" w:name="_Toc228807715"/>
-      <w:r>
-        <w:rPr>
-          <w:b/>
-          <w:bCs/>
-          <w:sz w:val="24"/>
-          <w:szCs w:val="24"/>
-          <w:u w:val="single"/>
-        </w:rPr>
         <w:t>STEP</w:t>
       </w:r>
-      <w:bookmarkEnd w:id="33"/>
+      <w:bookmarkEnd w:id="32"/>
     </w:p>
     <w:p>
       <w:pPr>
@@ -5792,7 +5700,7 @@
           <w:u w:val="single"/>
         </w:rPr>
       </w:pPr>
-      <w:bookmarkStart w:id="34" w:name="_Toc228807716"/>
+      <w:bookmarkStart w:id="33" w:name="_Toc228807716"/>
       <w:r>
         <w:rPr>
           <w:b/>
@@ -5803,7 +5711,7 @@
         </w:rPr>
         <w:t>Expected Outcomes</w:t>
       </w:r>
-      <w:bookmarkEnd w:id="34"/>
+      <w:bookmarkEnd w:id="33"/>
     </w:p>
     <w:p>
       <w:pPr>
@@ -5821,7 +5729,7 @@
           <w:u w:val="single"/>
         </w:rPr>
       </w:pPr>
-      <w:bookmarkStart w:id="35" w:name="_Toc228807717"/>
+      <w:bookmarkStart w:id="34" w:name="_Toc228807717"/>
       <w:r>
         <w:rPr>
           <w:b/>
@@ -5832,7 +5740,7 @@
         </w:rPr>
         <w:t>References</w:t>
       </w:r>
-      <w:bookmarkEnd w:id="35"/>
+      <w:bookmarkEnd w:id="34"/>
     </w:p>
     <w:p>
       <w:pPr>
@@ -6031,6 +5939,92 @@
     </w:lvl>
   </w:abstractNum>
   <w:abstractNum w:abstractNumId="2" w15:restartNumberingAfterBreak="0">
+    <w:nsid w:val="0CAE27FB"/>
+    <w:multiLevelType w:val="multilevel"/>
+    <w:tmpl w:val="4409001F"/>
+    <w:lvl w:ilvl="0">
+      <w:start w:val="1"/>
+      <w:numFmt w:val="decimal"/>
+      <w:lvlText w:val="%1."/>
+      <w:lvlJc w:val="left"/>
+      <w:pPr>
+        <w:ind w:left="360" w:hanging="360"/>
+      </w:pPr>
+    </w:lvl>
+    <w:lvl w:ilvl="1">
+      <w:start w:val="1"/>
+      <w:numFmt w:val="decimal"/>
+      <w:lvlText w:val="%1.%2."/>
+      <w:lvlJc w:val="left"/>
+      <w:pPr>
+        <w:ind w:left="792" w:hanging="432"/>
+      </w:pPr>
+    </w:lvl>
+    <w:lvl w:ilvl="2">
+      <w:start w:val="1"/>
+      <w:numFmt w:val="decimal"/>
+      <w:lvlText w:val="%1.%2.%3."/>
+      <w:lvlJc w:val="left"/>
+      <w:pPr>
+        <w:ind w:left="1224" w:hanging="504"/>
+      </w:pPr>
+    </w:lvl>
+    <w:lvl w:ilvl="3">
+      <w:start w:val="1"/>
+      <w:numFmt w:val="decimal"/>
+      <w:lvlText w:val="%1.%2.%3.%4."/>
+      <w:lvlJc w:val="left"/>
+      <w:pPr>
+        <w:ind w:left="1728" w:hanging="648"/>
+      </w:pPr>
+    </w:lvl>
+    <w:lvl w:ilvl="4">
+      <w:start w:val="1"/>
+      <w:numFmt w:val="decimal"/>
+      <w:lvlText w:val="%1.%2.%3.%4.%5."/>
+      <w:lvlJc w:val="left"/>
+      <w:pPr>
+        <w:ind w:left="2232" w:hanging="792"/>
+      </w:pPr>
+    </w:lvl>
+    <w:lvl w:ilvl="5">
+      <w:start w:val="1"/>
+      <w:numFmt w:val="decimal"/>
+      <w:lvlText w:val="%1.%2.%3.%4.%5.%6."/>
+      <w:lvlJc w:val="left"/>
+      <w:pPr>
+        <w:ind w:left="2736" w:hanging="936"/>
+      </w:pPr>
+    </w:lvl>
+    <w:lvl w:ilvl="6">
+      <w:start w:val="1"/>
+      <w:numFmt w:val="decimal"/>
+      <w:lvlText w:val="%1.%2.%3.%4.%5.%6.%7."/>
+      <w:lvlJc w:val="left"/>
+      <w:pPr>
+        <w:ind w:left="3240" w:hanging="1080"/>
+      </w:pPr>
+    </w:lvl>
+    <w:lvl w:ilvl="7">
+      <w:start w:val="1"/>
+      <w:numFmt w:val="decimal"/>
+      <w:lvlText w:val="%1.%2.%3.%4.%5.%6.%7.%8."/>
+      <w:lvlJc w:val="left"/>
+      <w:pPr>
+        <w:ind w:left="3744" w:hanging="1224"/>
+      </w:pPr>
+    </w:lvl>
+    <w:lvl w:ilvl="8">
+      <w:start w:val="1"/>
+      <w:numFmt w:val="decimal"/>
+      <w:lvlText w:val="%1.%2.%3.%4.%5.%6.%7.%8.%9."/>
+      <w:lvlJc w:val="left"/>
+      <w:pPr>
+        <w:ind w:left="4320" w:hanging="1440"/>
+      </w:pPr>
+    </w:lvl>
+  </w:abstractNum>
+  <w:abstractNum w:abstractNumId="3" w15:restartNumberingAfterBreak="0">
     <w:nsid w:val="224E535D"/>
     <w:multiLevelType w:val="hybridMultilevel"/>
     <w:tmpl w:val="C47A0DB4"/>
@@ -6119,7 +6113,7 @@
       </w:pPr>
     </w:lvl>
   </w:abstractNum>
-  <w:abstractNum w:abstractNumId="3" w15:restartNumberingAfterBreak="0">
+  <w:abstractNum w:abstractNumId="4" w15:restartNumberingAfterBreak="0">
     <w:nsid w:val="391A47EE"/>
     <w:multiLevelType w:val="hybridMultilevel"/>
     <w:tmpl w:val="608C2FC8"/>
@@ -6208,7 +6202,7 @@
       </w:pPr>
     </w:lvl>
   </w:abstractNum>
-  <w:abstractNum w:abstractNumId="4" w15:restartNumberingAfterBreak="0">
+  <w:abstractNum w:abstractNumId="5" w15:restartNumberingAfterBreak="0">
     <w:nsid w:val="4AC53607"/>
     <w:multiLevelType w:val="hybridMultilevel"/>
     <w:tmpl w:val="CAB8B28C"/>
@@ -6297,7 +6291,7 @@
       </w:pPr>
     </w:lvl>
   </w:abstractNum>
-  <w:abstractNum w:abstractNumId="5" w15:restartNumberingAfterBreak="0">
+  <w:abstractNum w:abstractNumId="6" w15:restartNumberingAfterBreak="0">
     <w:nsid w:val="4C767CF7"/>
     <w:multiLevelType w:val="hybridMultilevel"/>
     <w:tmpl w:val="E006DF60"/>
@@ -6386,7 +6380,7 @@
       </w:pPr>
     </w:lvl>
   </w:abstractNum>
-  <w:abstractNum w:abstractNumId="6" w15:restartNumberingAfterBreak="0">
+  <w:abstractNum w:abstractNumId="7" w15:restartNumberingAfterBreak="0">
     <w:nsid w:val="576B70A5"/>
     <w:multiLevelType w:val="hybridMultilevel"/>
     <w:tmpl w:val="CBCCF546"/>
@@ -6499,7 +6493,7 @@
       </w:rPr>
     </w:lvl>
   </w:abstractNum>
-  <w:abstractNum w:abstractNumId="7" w15:restartNumberingAfterBreak="0">
+  <w:abstractNum w:abstractNumId="8" w15:restartNumberingAfterBreak="0">
     <w:nsid w:val="595C5C89"/>
     <w:multiLevelType w:val="hybridMultilevel"/>
     <w:tmpl w:val="BB58A9A2"/>
@@ -6589,7 +6583,7 @@
       </w:pPr>
     </w:lvl>
   </w:abstractNum>
-  <w:abstractNum w:abstractNumId="8" w15:restartNumberingAfterBreak="0">
+  <w:abstractNum w:abstractNumId="9" w15:restartNumberingAfterBreak="0">
     <w:nsid w:val="707B624C"/>
     <w:multiLevelType w:val="hybridMultilevel"/>
     <w:tmpl w:val="4066D8D2"/>
@@ -6678,7 +6672,7 @@
       </w:pPr>
     </w:lvl>
   </w:abstractNum>
-  <w:abstractNum w:abstractNumId="9" w15:restartNumberingAfterBreak="0">
+  <w:abstractNum w:abstractNumId="10" w15:restartNumberingAfterBreak="0">
     <w:nsid w:val="76C22FEC"/>
     <w:multiLevelType w:val="hybridMultilevel"/>
     <w:tmpl w:val="7D661E6A"/>
@@ -6768,34 +6762,37 @@
     </w:lvl>
   </w:abstractNum>
   <w:num w:numId="1" w16cid:durableId="422532857">
-    <w:abstractNumId w:val="2"/>
+    <w:abstractNumId w:val="3"/>
   </w:num>
   <w:num w:numId="2" w16cid:durableId="1890915732">
+    <w:abstractNumId w:val="7"/>
+  </w:num>
+  <w:num w:numId="3" w16cid:durableId="558782592">
     <w:abstractNumId w:val="6"/>
   </w:num>
-  <w:num w:numId="3" w16cid:durableId="558782592">
-    <w:abstractNumId w:val="5"/>
-  </w:num>
   <w:num w:numId="4" w16cid:durableId="291253581">
-    <w:abstractNumId w:val="8"/>
+    <w:abstractNumId w:val="9"/>
   </w:num>
   <w:num w:numId="5" w16cid:durableId="991061032">
     <w:abstractNumId w:val="0"/>
   </w:num>
   <w:num w:numId="6" w16cid:durableId="1289168179">
-    <w:abstractNumId w:val="9"/>
+    <w:abstractNumId w:val="10"/>
   </w:num>
   <w:num w:numId="7" w16cid:durableId="197862497">
+    <w:abstractNumId w:val="5"/>
+  </w:num>
+  <w:num w:numId="8" w16cid:durableId="551042543">
     <w:abstractNumId w:val="4"/>
   </w:num>
-  <w:num w:numId="8" w16cid:durableId="551042543">
-    <w:abstractNumId w:val="3"/>
-  </w:num>
   <w:num w:numId="9" w16cid:durableId="608927404">
-    <w:abstractNumId w:val="7"/>
+    <w:abstractNumId w:val="8"/>
   </w:num>
   <w:num w:numId="10" w16cid:durableId="495653598">
     <w:abstractNumId w:val="1"/>
+  </w:num>
+  <w:num w:numId="11" w16cid:durableId="2090609939">
+    <w:abstractNumId w:val="2"/>
   </w:num>
 </w:numbering>
 </file>

</xml_diff>

<commit_message>
refactor: :ambulance: Update ridership headline to 2026-04-30 and include extra lag features
</commit_message>
<xml_diff>
--- a/docs/24202141_p1_report.docx
+++ b/docs/24202141_p1_report.docx
@@ -4122,25 +4122,28 @@
         </w:numPr>
       </w:pPr>
       <w:r>
-        <w:t xml:space="preserve">To what extent can a unified </w:t>
-      </w:r>
-      <w:r>
-        <w:t>DL</w:t>
-      </w:r>
-      <w:r>
-        <w:t xml:space="preserve"> framework accurately predict </w:t>
+        <w:t>To what extent can a</w:t>
+      </w:r>
+      <w:r>
+        <w:t xml:space="preserve">n existing SOTA </w:t>
+      </w:r>
+      <w:r>
+        <w:t xml:space="preserve">accurately predict </w:t>
       </w:r>
       <w:r>
         <w:t xml:space="preserve">future </w:t>
       </w:r>
       <w:r>
-        <w:t xml:space="preserve">ridership trends by integrating </w:t>
-      </w:r>
-      <w:r>
-        <w:t>GTFS</w:t>
-      </w:r>
-      <w:r>
-        <w:t xml:space="preserve"> </w:t>
+        <w:t>ridership trends</w:t>
+      </w:r>
+      <w:r>
+        <w:t xml:space="preserve"> in Malaysia</w:t>
+      </w:r>
+      <w:r>
+        <w:t xml:space="preserve"> by integrating </w:t>
+      </w:r>
+      <w:r>
+        <w:t xml:space="preserve">Malaysia’s spatial and temporal </w:t>
       </w:r>
       <w:r>
         <w:t>data?</w:t>
@@ -4155,25 +4158,25 @@
         </w:numPr>
       </w:pPr>
       <w:r>
-        <w:t xml:space="preserve">How do </w:t>
-      </w:r>
-      <w:r>
-        <w:t xml:space="preserve">existing </w:t>
-      </w:r>
-      <w:r>
-        <w:t>SOTA</w:t>
-      </w:r>
-      <w:r>
-        <w:t xml:space="preserve"> </w:t>
-      </w:r>
-      <w:r>
-        <w:t xml:space="preserve">spatio-temporal architectures </w:t>
+        <w:t>How do</w:t>
+      </w:r>
+      <w:r>
+        <w:t xml:space="preserve"> spatio-temporal</w:t>
+      </w:r>
+      <w:r>
+        <w:t>-based, graph-based and attention-based</w:t>
+      </w:r>
+      <w:r>
+        <w:t xml:space="preserve"> architectures </w:t>
       </w:r>
       <w:r>
         <w:t>compared</w:t>
       </w:r>
       <w:r>
-        <w:t xml:space="preserve"> to baseline LSTM models in terms of </w:t>
+        <w:t xml:space="preserve"> with each other</w:t>
+      </w:r>
+      <w:r>
+        <w:t xml:space="preserve"> in terms of </w:t>
       </w:r>
       <w:r>
         <w:t xml:space="preserve">combined score of </w:t>
@@ -4282,13 +4285,19 @@
         </w:numPr>
       </w:pPr>
       <w:r>
-        <w:t xml:space="preserve">To develop and implement a unified </w:t>
-      </w:r>
-      <w:r>
-        <w:t>DL</w:t>
-      </w:r>
-      <w:r>
-        <w:t xml:space="preserve"> framework that integrates GTFS data to </w:t>
+        <w:t xml:space="preserve">To </w:t>
+      </w:r>
+      <w:r>
+        <w:t xml:space="preserve">identify a single best DL model </w:t>
+      </w:r>
+      <w:r>
+        <w:t xml:space="preserve">that integrates </w:t>
+      </w:r>
+      <w:r>
+        <w:t>Malaysia’s spatial and temporal</w:t>
+      </w:r>
+      <w:r>
+        <w:t xml:space="preserve"> data to </w:t>
       </w:r>
       <w:r>
         <w:t>estimate</w:t>
@@ -4312,13 +4321,16 @@
         <w:t xml:space="preserve">combined </w:t>
       </w:r>
       <w:r>
-        <w:t>target predictive accuracy</w:t>
+        <w:t>accuracy metrics</w:t>
       </w:r>
       <w:r>
         <w:t xml:space="preserve"> of </w:t>
       </w:r>
       <w:r>
-        <w:t>85</w:t>
+        <w:t>8</w:t>
+      </w:r>
+      <w:r>
+        <w:t>0</w:t>
       </w:r>
       <w:r>
         <w:t>%</w:t>
@@ -4336,7 +4348,13 @@
         </w:numPr>
       </w:pPr>
       <w:r>
-        <w:t xml:space="preserve">To evaluate and benchmark the performance of spatio-temporal architectures against a baseline LSTM model using </w:t>
+        <w:t>To evaluate and benchmark the performance of spatio-temporal</w:t>
+      </w:r>
+      <w:r>
+        <w:t xml:space="preserve">-based, graph-based and attention-based </w:t>
+      </w:r>
+      <w:r>
+        <w:t xml:space="preserve">model using </w:t>
       </w:r>
       <w:r>
         <w:t xml:space="preserve">combined </w:t>
@@ -4518,7 +4536,81 @@
               <w:jc w:val="left"/>
             </w:pPr>
             <w:r>
-              <w:t>Selected SOTA</w:t>
+              <w:t>Spatio-temporal</w:t>
+            </w:r>
+          </w:p>
+        </w:tc>
+        <w:tc>
+          <w:tcPr>
+            <w:tcW w:w="6044" w:type="dxa"/>
+          </w:tcPr>
+          <w:p>
+            <w:pPr>
+              <w:jc w:val="left"/>
+            </w:pPr>
+          </w:p>
+        </w:tc>
+      </w:tr>
+      <w:tr>
+        <w:tc>
+          <w:tcPr>
+            <w:tcW w:w="1696" w:type="dxa"/>
+            <w:vMerge/>
+            <w:shd w:val="clear" w:color="auto" w:fill="F2F2F2" w:themeFill="background1" w:themeFillShade="F2"/>
+          </w:tcPr>
+          <w:p>
+            <w:pPr>
+              <w:jc w:val="left"/>
+            </w:pPr>
+          </w:p>
+        </w:tc>
+        <w:tc>
+          <w:tcPr>
+            <w:tcW w:w="1276" w:type="dxa"/>
+          </w:tcPr>
+          <w:p>
+            <w:pPr>
+              <w:jc w:val="left"/>
+            </w:pPr>
+            <w:r>
+              <w:t>Graph</w:t>
+            </w:r>
+          </w:p>
+        </w:tc>
+        <w:tc>
+          <w:tcPr>
+            <w:tcW w:w="6044" w:type="dxa"/>
+          </w:tcPr>
+          <w:p>
+            <w:pPr>
+              <w:jc w:val="left"/>
+            </w:pPr>
+          </w:p>
+        </w:tc>
+      </w:tr>
+      <w:tr>
+        <w:tc>
+          <w:tcPr>
+            <w:tcW w:w="1696" w:type="dxa"/>
+            <w:vMerge/>
+            <w:shd w:val="clear" w:color="auto" w:fill="F2F2F2" w:themeFill="background1" w:themeFillShade="F2"/>
+          </w:tcPr>
+          <w:p>
+            <w:pPr>
+              <w:jc w:val="left"/>
+            </w:pPr>
+          </w:p>
+        </w:tc>
+        <w:tc>
+          <w:tcPr>
+            <w:tcW w:w="1276" w:type="dxa"/>
+          </w:tcPr>
+          <w:p>
+            <w:pPr>
+              <w:jc w:val="left"/>
+            </w:pPr>
+            <w:r>
+              <w:t>Attention</w:t>
             </w:r>
           </w:p>
         </w:tc>
@@ -4619,7 +4711,10 @@
               <w:jc w:val="left"/>
             </w:pPr>
             <w:r>
-              <w:t>Data Omission</w:t>
+              <w:t xml:space="preserve">Data </w:t>
+            </w:r>
+            <w:r>
+              <w:t>Optionality</w:t>
             </w:r>
           </w:p>
         </w:tc>
@@ -4636,7 +4731,13 @@
               <w:t>Ridership data</w:t>
             </w:r>
             <w:r>
-              <w:t xml:space="preserve"> between 18 March 2020 to 31 December 2021 is omitted due to the enforcement of Movement Control Order (MCO) in Malaysia</w:t>
+              <w:t xml:space="preserve"> between 18 March 2020 to 31 December 2021 is omitted </w:t>
+            </w:r>
+            <w:r>
+              <w:t xml:space="preserve">optionally </w:t>
+            </w:r>
+            <w:r>
+              <w:t>due to the enforcement of Movement Control Order (MCO) in Malaysia</w:t>
             </w:r>
             <w:r>
               <w:t xml:space="preserve"> as this</w:t>
@@ -4667,6 +4768,9 @@
             </w:r>
             <w:r>
               <w:t>.</w:t>
+            </w:r>
+            <w:r>
+              <w:t xml:space="preserve"> The researcher performed a separate comparison with MCO-features included and excluded.</w:t>
             </w:r>
           </w:p>
         </w:tc>

</xml_diff>

<commit_message>
feat: :sparkles: Added fine-tuned version with tuned comparison and strategy
</commit_message>
<xml_diff>
--- a/docs/24202141_p1_report.docx
+++ b/docs/24202141_p1_report.docx
@@ -3807,11 +3807,19 @@
         <w:t>ith intricate</w:t>
       </w:r>
       <w:r>
-        <w:t xml:space="preserve"> spatio-temporal interconnections</w:t>
-      </w:r>
-      <w:r>
         <w:t xml:space="preserve"> </w:t>
       </w:r>
+      <w:proofErr w:type="spellStart"/>
+      <w:r>
+        <w:t>spatio</w:t>
+      </w:r>
+      <w:proofErr w:type="spellEnd"/>
+      <w:r>
+        <w:t>-temporal interconnections</w:t>
+      </w:r>
+      <w:r>
+        <w:t xml:space="preserve"> </w:t>
+      </w:r>
       <w:r>
         <w:t>within</w:t>
       </w:r>
@@ -3831,7 +3839,15 @@
         <w:t xml:space="preserve"> </w:t>
       </w:r>
       <w:r>
-        <w:t xml:space="preserve">Unlike traditional models like AutoRegressive Integrated Moving Average (ARIMA), </w:t>
+        <w:t xml:space="preserve">Unlike traditional models like </w:t>
+      </w:r>
+      <w:proofErr w:type="spellStart"/>
+      <w:r>
+        <w:t>AutoRegressive</w:t>
+      </w:r>
+      <w:proofErr w:type="spellEnd"/>
+      <w:r>
+        <w:t xml:space="preserve"> Integrated Moving Average (ARIMA), </w:t>
       </w:r>
       <w:r>
         <w:t>DL</w:t>
@@ -3936,7 +3952,15 @@
         <w:t xml:space="preserve">to achieve </w:t>
       </w:r>
       <w:r>
-        <w:t>highly accurate ridership predictions with complex spatio-temporal data</w:t>
+        <w:t xml:space="preserve">highly accurate ridership predictions with complex </w:t>
+      </w:r>
+      <w:proofErr w:type="spellStart"/>
+      <w:r>
+        <w:t>spatio</w:t>
+      </w:r>
+      <w:proofErr w:type="spellEnd"/>
+      <w:r>
+        <w:t>-temporal data</w:t>
       </w:r>
       <w:r>
         <w:t>.</w:t>
@@ -3999,7 +4023,35 @@
         <w:rPr>
           <w:lang w:val="en-US"/>
         </w:rPr>
-        <w:t>Consequently, transit authorities face a critical bottleneck in optimizing schedules, routes, and intervals amid peak hours and holidays, thus increasing the unreliability of Malaysia’s public transit and dissatisfaction among passengers. To solve this problem, it requires a dual approach: (1) identify specific spatio-temporal factors that heavily influence the ridership trend in Malaysia’s public transit; (2) develop a robust predictive model capable of accurately forecasting daily ridership trends based on these identified spatio-temporal features.</w:t>
+        <w:t xml:space="preserve">Consequently, transit authorities face a critical bottleneck in optimizing schedules, routes, and intervals amid peak hours and holidays, thus increasing the unreliability of Malaysia’s public transit and dissatisfaction among passengers. To solve this problem, it requires a dual approach: (1) identify specific </w:t>
+      </w:r>
+      <w:proofErr w:type="spellStart"/>
+      <w:r>
+        <w:rPr>
+          <w:lang w:val="en-US"/>
+        </w:rPr>
+        <w:t>spatio</w:t>
+      </w:r>
+      <w:proofErr w:type="spellEnd"/>
+      <w:r>
+        <w:rPr>
+          <w:lang w:val="en-US"/>
+        </w:rPr>
+        <w:t xml:space="preserve">-temporal factors that heavily influence the ridership trend in Malaysia’s public transit; (2) develop a robust predictive model capable of accurately forecasting daily ridership trends based on these identified </w:t>
+      </w:r>
+      <w:proofErr w:type="spellStart"/>
+      <w:r>
+        <w:rPr>
+          <w:lang w:val="en-US"/>
+        </w:rPr>
+        <w:t>spatio</w:t>
+      </w:r>
+      <w:proofErr w:type="spellEnd"/>
+      <w:r>
+        <w:rPr>
+          <w:lang w:val="en-US"/>
+        </w:rPr>
+        <w:t>-temporal features.</w:t>
       </w:r>
     </w:p>
     <w:p>
@@ -4064,7 +4116,55 @@
         <w:rPr>
           <w:noProof/>
         </w:rPr>
-        <w:t xml:space="preserve"> Using these data to train models often struggle to capture true, normal peaks when daily lifes are back to normal (Lv et al., 2021). Therefore, the period of Malaysia’s MCO are strategically omitted to prevent the neural network from learning non-representative noise based on extreme riderships trends.</w:t>
+        <w:t xml:space="preserve"> Using these data to train models often struggle to capture true, normal peaks when daily lifes are back to normal (Lv et al., 2021). Therefore, </w:t>
+      </w:r>
+      <w:r>
+        <w:rPr>
+          <w:noProof/>
+        </w:rPr>
+        <w:t>the researcher</w:t>
+      </w:r>
+      <w:r>
+        <w:rPr>
+          <w:noProof/>
+        </w:rPr>
+        <w:t xml:space="preserve"> strategically </w:t>
+      </w:r>
+      <w:r>
+        <w:rPr>
+          <w:noProof/>
+        </w:rPr>
+        <w:t xml:space="preserve">compare two datasets, one with Malaysia’s MCO period, one without, </w:t>
+      </w:r>
+      <w:r>
+        <w:rPr>
+          <w:noProof/>
+        </w:rPr>
+        <w:t>to</w:t>
+      </w:r>
+      <w:r>
+        <w:rPr>
+          <w:noProof/>
+        </w:rPr>
+        <w:t xml:space="preserve"> examine whether this period can be considered as noise</w:t>
+      </w:r>
+      <w:r>
+        <w:rPr>
+          <w:noProof/>
+        </w:rPr>
+        <w:t xml:space="preserve"> </w:t>
+      </w:r>
+      <w:r>
+        <w:rPr>
+          <w:noProof/>
+        </w:rPr>
+        <w:t xml:space="preserve">due to the </w:t>
+      </w:r>
+      <w:r>
+        <w:rPr>
+          <w:noProof/>
+        </w:rPr>
+        <w:t>extreme riderships trends.</w:t>
       </w:r>
     </w:p>
     <w:p>
@@ -4161,7 +4261,15 @@
         <w:t>How do</w:t>
       </w:r>
       <w:r>
-        <w:t xml:space="preserve"> spatio-temporal</w:t>
+        <w:t xml:space="preserve"> </w:t>
+      </w:r>
+      <w:proofErr w:type="spellStart"/>
+      <w:r>
+        <w:t>spatio</w:t>
+      </w:r>
+      <w:proofErr w:type="spellEnd"/>
+      <w:r>
+        <w:t>-temporal</w:t>
       </w:r>
       <w:r>
         <w:t>-based, graph-based and attention-based</w:t>
@@ -4348,7 +4456,15 @@
         </w:numPr>
       </w:pPr>
       <w:r>
-        <w:t>To evaluate and benchmark the performance of spatio-temporal</w:t>
+        <w:t xml:space="preserve">To evaluate and benchmark the performance of </w:t>
+      </w:r>
+      <w:proofErr w:type="spellStart"/>
+      <w:r>
+        <w:t>spatio</w:t>
+      </w:r>
+      <w:proofErr w:type="spellEnd"/>
+      <w:r>
+        <w:t>-temporal</w:t>
       </w:r>
       <w:r>
         <w:t xml:space="preserve">-based, graph-based and attention-based </w:t>
@@ -4695,7 +4811,19 @@
               <w:jc w:val="left"/>
             </w:pPr>
             <w:r>
-              <w:t>Specific bus, urban rail, commuter transit networks in Malaysia</w:t>
+              <w:t xml:space="preserve">Specific bus, urban rail, commuter transit networks </w:t>
+            </w:r>
+            <w:r>
+              <w:t xml:space="preserve">with available data </w:t>
+            </w:r>
+            <w:r>
+              <w:t>in</w:t>
+            </w:r>
+            <w:r>
+              <w:t xml:space="preserve"> whole</w:t>
+            </w:r>
+            <w:r>
+              <w:t xml:space="preserve"> Malaysia</w:t>
             </w:r>
           </w:p>
         </w:tc>
@@ -4711,10 +4839,10 @@
               <w:jc w:val="left"/>
             </w:pPr>
             <w:r>
-              <w:t xml:space="preserve">Data </w:t>
-            </w:r>
-            <w:r>
-              <w:t>Optionality</w:t>
+              <w:t>Data</w:t>
+            </w:r>
+            <w:r>
+              <w:t>sets</w:t>
             </w:r>
           </w:p>
         </w:tc>
@@ -4726,51 +4854,115 @@
           <w:p>
             <w:pPr>
               <w:jc w:val="left"/>
+              <w:rPr>
+                <w:noProof/>
+              </w:rPr>
             </w:pPr>
             <w:r>
               <w:t>Ridership data</w:t>
             </w:r>
             <w:r>
-              <w:t xml:space="preserve"> between 18 March 2020 to 31 December 2021 is omitted </w:t>
-            </w:r>
-            <w:r>
-              <w:t xml:space="preserve">optionally </w:t>
-            </w:r>
-            <w:r>
-              <w:t>due to the enforcement of Movement Control Order (MCO) in Malaysia</w:t>
-            </w:r>
-            <w:r>
-              <w:t xml:space="preserve"> as this</w:t>
-            </w:r>
-            <w:r>
-              <w:t xml:space="preserve"> period contains extreme anomalies (85-90% ridership drop) </w:t>
-            </w:r>
-            <w:r>
-              <w:t>which is</w:t>
-            </w:r>
-            <w:r>
-              <w:t xml:space="preserve"> unsuitable for </w:t>
-            </w:r>
-            <w:r>
-              <w:t>artificial intelligence (AI)</w:t>
-            </w:r>
-            <w:r>
-              <w:t xml:space="preserve"> training as they introduce significant noise and predictive bias</w:t>
+              <w:t xml:space="preserve"> between 18 March 2020 to 31 December 2021 </w:t>
+            </w:r>
+            <w:r>
+              <w:t>is strategically separated, giving one dataset with MCO period, one dataset without it as they might</w:t>
+            </w:r>
+            <w:r>
+              <w:t xml:space="preserve"> introduce significant noise and predictive bias</w:t>
             </w:r>
             <w:r>
               <w:t xml:space="preserve"> </w:t>
             </w:r>
             <w:r>
-              <w:rPr>
-                <w:noProof/>
-              </w:rPr>
-              <w:t>(Zhao &amp; Lan, 2025)</w:t>
-            </w:r>
-            <w:r>
+              <w:t xml:space="preserve">based on the article written by </w:t>
+            </w:r>
+            <w:r>
+              <w:rPr>
+                <w:noProof/>
+              </w:rPr>
+              <w:t xml:space="preserve">Zhao &amp; Lan </w:t>
+            </w:r>
+            <w:r>
+              <w:rPr>
+                <w:noProof/>
+              </w:rPr>
+              <w:t>(</w:t>
+            </w:r>
+            <w:r>
+              <w:rPr>
+                <w:noProof/>
+              </w:rPr>
+              <w:t>2025)</w:t>
+            </w:r>
+            <w:r>
+              <w:rPr>
+                <w:noProof/>
+              </w:rPr>
               <w:t>.</w:t>
             </w:r>
-            <w:r>
-              <w:t xml:space="preserve"> The researcher performed a separate comparison with MCO-features included and excluded.</w:t>
+          </w:p>
+          <w:p>
+            <w:pPr>
+              <w:jc w:val="left"/>
+            </w:pPr>
+            <w:r>
+              <w:rPr>
+                <w:b/>
+                <w:bCs/>
+              </w:rPr>
+              <w:t>Without MCO:</w:t>
+            </w:r>
+            <w:r>
+              <w:t xml:space="preserve"> 1 January </w:t>
+            </w:r>
+            <w:r>
+              <w:rPr>
+                <w:b/>
+                <w:bCs/>
+              </w:rPr>
+              <w:t xml:space="preserve">2022 </w:t>
+            </w:r>
+            <w:r>
+              <w:t xml:space="preserve">to 31 December </w:t>
+            </w:r>
+            <w:r>
+              <w:rPr>
+                <w:b/>
+                <w:bCs/>
+              </w:rPr>
+              <w:t>2025</w:t>
+            </w:r>
+          </w:p>
+          <w:p>
+            <w:pPr>
+              <w:jc w:val="left"/>
+            </w:pPr>
+            <w:r>
+              <w:rPr>
+                <w:b/>
+                <w:bCs/>
+              </w:rPr>
+              <w:t>With MCO:</w:t>
+            </w:r>
+            <w:r>
+              <w:t xml:space="preserve"> 1 January </w:t>
+            </w:r>
+            <w:r>
+              <w:rPr>
+                <w:b/>
+                <w:bCs/>
+              </w:rPr>
+              <w:t>2019</w:t>
+            </w:r>
+            <w:r>
+              <w:t xml:space="preserve"> to 31 December </w:t>
+            </w:r>
+            <w:r>
+              <w:rPr>
+                <w:b/>
+                <w:bCs/>
+              </w:rPr>
+              <w:t>2025</w:t>
             </w:r>
           </w:p>
         </w:tc>

</xml_diff>

<commit_message>
feat: :sparkles: Added results for fine-tuned without MCO
</commit_message>
<xml_diff>
--- a/docs/24202141_p1_report.docx
+++ b/docs/24202141_p1_report.docx
@@ -3807,30 +3807,109 @@
         <w:t>ith intricate</w:t>
       </w:r>
       <w:r>
+        <w:t xml:space="preserve"> spatio-temporal interconnections</w:t>
+      </w:r>
+      <w:r>
         <w:t xml:space="preserve"> </w:t>
       </w:r>
-      <w:proofErr w:type="spellStart"/>
-      <w:r>
-        <w:t>spatio</w:t>
-      </w:r>
-      <w:proofErr w:type="spellEnd"/>
-      <w:r>
-        <w:t>-temporal interconnections</w:t>
+      <w:r>
+        <w:t>within</w:t>
+      </w:r>
+      <w:r>
+        <w:t xml:space="preserve"> public transit networks </w:t>
+      </w:r>
+      <w:r>
+        <w:rPr>
+          <w:noProof/>
+        </w:rPr>
+        <w:t>(Chen, Fu, &amp; Wang, 2022)</w:t>
+      </w:r>
+      <w:r>
+        <w:t>.</w:t>
       </w:r>
       <w:r>
         <w:t xml:space="preserve"> </w:t>
       </w:r>
       <w:r>
-        <w:t>within</w:t>
-      </w:r>
-      <w:r>
-        <w:t xml:space="preserve"> public transit networks </w:t>
+        <w:t xml:space="preserve">Unlike traditional models like AutoRegressive Integrated Moving Average (ARIMA), </w:t>
+      </w:r>
+      <w:r>
+        <w:t>DL</w:t>
+      </w:r>
+      <w:r>
+        <w:t xml:space="preserve"> approaches such as Long Short-Term Memory (LSTM) and Graph Convolutional Networks (GCN)</w:t>
+      </w:r>
+      <w:r>
+        <w:t xml:space="preserve"> </w:t>
+      </w:r>
+      <w:r>
+        <w:t>can integrate</w:t>
+      </w:r>
+      <w:r>
+        <w:t xml:space="preserve"> </w:t>
+      </w:r>
+      <w:r>
+        <w:t>multiple</w:t>
+      </w:r>
+      <w:r>
+        <w:t xml:space="preserve"> data sources</w:t>
+      </w:r>
+      <w:r>
+        <w:t xml:space="preserve"> to be trained on</w:t>
+      </w:r>
+      <w:r>
+        <w:t>, f</w:t>
+      </w:r>
+      <w:r>
+        <w:t xml:space="preserve">or </w:t>
+      </w:r>
+      <w:r>
+        <w:t>example</w:t>
+      </w:r>
+      <w:r>
+        <w:t xml:space="preserve">, </w:t>
+      </w:r>
+      <w:r>
+        <w:t xml:space="preserve">General Transit Feed Specification (GTFS) data, </w:t>
+      </w:r>
+      <w:r>
+        <w:t>historical weather patterns, Points of Interest (POIs) and so on</w:t>
+      </w:r>
+      <w:r>
+        <w:t xml:space="preserve">, thus </w:t>
+      </w:r>
+      <w:r>
+        <w:t>allow</w:t>
+      </w:r>
+      <w:r>
+        <w:t>ing</w:t>
+      </w:r>
+      <w:r>
+        <w:t xml:space="preserve"> the model to </w:t>
+      </w:r>
+      <w:r>
+        <w:t>fully capture both spatial and temporal relationships within transit systems</w:t>
+      </w:r>
+      <w:r>
+        <w:t xml:space="preserve"> </w:t>
       </w:r>
       <w:r>
         <w:rPr>
           <w:noProof/>
         </w:rPr>
-        <w:t>(Chen, Fu, &amp; Wang, 2022)</w:t>
+        <w:t>(</w:t>
+      </w:r>
+      <w:r>
+        <w:rPr>
+          <w:noProof/>
+        </w:rPr>
+        <w:t xml:space="preserve">Ge et al., 2021; </w:t>
+      </w:r>
+      <w:r>
+        <w:rPr>
+          <w:noProof/>
+        </w:rPr>
+        <w:t>Chen, Fu, &amp; Wang, 2022)</w:t>
       </w:r>
       <w:r>
         <w:t>.</w:t>
@@ -3839,128 +3918,25 @@
         <w:t xml:space="preserve"> </w:t>
       </w:r>
       <w:r>
-        <w:t xml:space="preserve">Unlike traditional models like </w:t>
-      </w:r>
-      <w:proofErr w:type="spellStart"/>
-      <w:r>
-        <w:t>AutoRegressive</w:t>
-      </w:r>
-      <w:proofErr w:type="spellEnd"/>
-      <w:r>
-        <w:t xml:space="preserve"> Integrated Moving Average (ARIMA), </w:t>
+        <w:t>As a result</w:t>
+      </w:r>
+      <w:r>
+        <w:t xml:space="preserve">, </w:t>
+      </w:r>
+      <w:r>
+        <w:t xml:space="preserve">state-of-the-art (SOTA) </w:t>
       </w:r>
       <w:r>
         <w:t>DL</w:t>
       </w:r>
       <w:r>
-        <w:t xml:space="preserve"> approaches such as Long Short-Term Memory (LSTM) and Graph Convolutional Networks (GCN)</w:t>
-      </w:r>
-      <w:r>
-        <w:t xml:space="preserve"> </w:t>
-      </w:r>
-      <w:r>
-        <w:t>can integrate</w:t>
-      </w:r>
-      <w:r>
-        <w:t xml:space="preserve"> </w:t>
-      </w:r>
-      <w:r>
-        <w:t>multiple</w:t>
-      </w:r>
-      <w:r>
-        <w:t xml:space="preserve"> data sources</w:t>
-      </w:r>
-      <w:r>
-        <w:t xml:space="preserve"> to be trained on</w:t>
-      </w:r>
-      <w:r>
-        <w:t>, f</w:t>
-      </w:r>
-      <w:r>
-        <w:t xml:space="preserve">or </w:t>
-      </w:r>
-      <w:r>
-        <w:t>example</w:t>
-      </w:r>
-      <w:r>
-        <w:t xml:space="preserve">, </w:t>
-      </w:r>
-      <w:r>
-        <w:t xml:space="preserve">General Transit Feed Specification (GTFS) data, </w:t>
-      </w:r>
-      <w:r>
-        <w:t>historical weather patterns, Points of Interest (POIs) and so on</w:t>
-      </w:r>
-      <w:r>
-        <w:t xml:space="preserve">, thus </w:t>
-      </w:r>
-      <w:r>
-        <w:t>allow</w:t>
-      </w:r>
-      <w:r>
-        <w:t>ing</w:t>
-      </w:r>
-      <w:r>
-        <w:t xml:space="preserve"> the model to </w:t>
-      </w:r>
-      <w:r>
-        <w:t>fully capture both spatial and temporal relationships within transit systems</w:t>
-      </w:r>
-      <w:r>
-        <w:t xml:space="preserve"> </w:t>
-      </w:r>
-      <w:r>
-        <w:rPr>
-          <w:noProof/>
-        </w:rPr>
-        <w:t>(</w:t>
-      </w:r>
-      <w:r>
-        <w:rPr>
-          <w:noProof/>
-        </w:rPr>
-        <w:t xml:space="preserve">Ge et al., 2021; </w:t>
-      </w:r>
-      <w:r>
-        <w:rPr>
-          <w:noProof/>
-        </w:rPr>
-        <w:t>Chen, Fu, &amp; Wang, 2022)</w:t>
-      </w:r>
-      <w:r>
-        <w:t>.</w:t>
-      </w:r>
-      <w:r>
-        <w:t xml:space="preserve"> </w:t>
-      </w:r>
-      <w:r>
-        <w:t>As a result</w:t>
-      </w:r>
-      <w:r>
-        <w:t xml:space="preserve">, </w:t>
-      </w:r>
-      <w:r>
-        <w:t xml:space="preserve">state-of-the-art (SOTA) </w:t>
-      </w:r>
-      <w:r>
-        <w:t>DL</w:t>
-      </w:r>
-      <w:r>
         <w:t xml:space="preserve"> architectures must be implemented </w:t>
       </w:r>
       <w:r>
         <w:t xml:space="preserve">to achieve </w:t>
       </w:r>
       <w:r>
-        <w:t xml:space="preserve">highly accurate ridership predictions with complex </w:t>
-      </w:r>
-      <w:proofErr w:type="spellStart"/>
-      <w:r>
-        <w:t>spatio</w:t>
-      </w:r>
-      <w:proofErr w:type="spellEnd"/>
-      <w:r>
-        <w:t>-temporal data</w:t>
+        <w:t>highly accurate ridership predictions with complex spatio-temporal data</w:t>
       </w:r>
       <w:r>
         <w:t>.</w:t>
@@ -4023,35 +3999,7 @@
         <w:rPr>
           <w:lang w:val="en-US"/>
         </w:rPr>
-        <w:t xml:space="preserve">Consequently, transit authorities face a critical bottleneck in optimizing schedules, routes, and intervals amid peak hours and holidays, thus increasing the unreliability of Malaysia’s public transit and dissatisfaction among passengers. To solve this problem, it requires a dual approach: (1) identify specific </w:t>
-      </w:r>
-      <w:proofErr w:type="spellStart"/>
-      <w:r>
-        <w:rPr>
-          <w:lang w:val="en-US"/>
-        </w:rPr>
-        <w:t>spatio</w:t>
-      </w:r>
-      <w:proofErr w:type="spellEnd"/>
-      <w:r>
-        <w:rPr>
-          <w:lang w:val="en-US"/>
-        </w:rPr>
-        <w:t xml:space="preserve">-temporal factors that heavily influence the ridership trend in Malaysia’s public transit; (2) develop a robust predictive model capable of accurately forecasting daily ridership trends based on these identified </w:t>
-      </w:r>
-      <w:proofErr w:type="spellStart"/>
-      <w:r>
-        <w:rPr>
-          <w:lang w:val="en-US"/>
-        </w:rPr>
-        <w:t>spatio</w:t>
-      </w:r>
-      <w:proofErr w:type="spellEnd"/>
-      <w:r>
-        <w:rPr>
-          <w:lang w:val="en-US"/>
-        </w:rPr>
-        <w:t>-temporal features.</w:t>
+        <w:t>Consequently, transit authorities face a critical bottleneck in optimizing schedules, routes, and intervals amid peak hours and holidays, thus increasing the unreliability of Malaysia’s public transit and dissatisfaction among passengers. To solve this problem, it requires a dual approach: (1) identify specific spatio-temporal factors that heavily influence the ridership trend in Malaysia’s public transit; (2) develop a robust predictive model capable of accurately forecasting daily ridership trends based on these identified spatio-temporal features.</w:t>
       </w:r>
     </w:p>
     <w:p>
@@ -4261,15 +4209,7 @@
         <w:t>How do</w:t>
       </w:r>
       <w:r>
-        <w:t xml:space="preserve"> </w:t>
-      </w:r>
-      <w:proofErr w:type="spellStart"/>
-      <w:r>
-        <w:t>spatio</w:t>
-      </w:r>
-      <w:proofErr w:type="spellEnd"/>
-      <w:r>
-        <w:t>-temporal</w:t>
+        <w:t xml:space="preserve"> spatio-temporal</w:t>
       </w:r>
       <w:r>
         <w:t>-based, graph-based and attention-based</w:t>
@@ -4435,13 +4375,22 @@
         <w:t xml:space="preserve"> of </w:t>
       </w:r>
       <w:r>
-        <w:t>8</w:t>
-      </w:r>
-      <w:r>
-        <w:t>0</w:t>
+        <w:t>75</w:t>
       </w:r>
       <w:r>
         <w:t>%</w:t>
+      </w:r>
+      <w:r>
+        <w:t xml:space="preserve"> with R</w:t>
+      </w:r>
+      <w:r>
+        <w:rPr>
+          <w:vertAlign w:val="superscript"/>
+        </w:rPr>
+        <w:t>2</w:t>
+      </w:r>
+      <w:r>
+        <w:t xml:space="preserve"> of 0.75</w:t>
       </w:r>
       <w:r>
         <w:t>.</w:t>
@@ -4456,15 +4405,7 @@
         </w:numPr>
       </w:pPr>
       <w:r>
-        <w:t xml:space="preserve">To evaluate and benchmark the performance of </w:t>
-      </w:r>
-      <w:proofErr w:type="spellStart"/>
-      <w:r>
-        <w:t>spatio</w:t>
-      </w:r>
-      <w:proofErr w:type="spellEnd"/>
-      <w:r>
-        <w:t>-temporal</w:t>
+        <w:t>To evaluate and benchmark the performance of spatio-temporal</w:t>
       </w:r>
       <w:r>
         <w:t xml:space="preserve">-based, graph-based and attention-based </w:t>
@@ -4591,6 +4532,7 @@
               <w:jc w:val="left"/>
             </w:pPr>
             <w:r>
+              <w:lastRenderedPageBreak/>
               <w:t>Models Compared</w:t>
             </w:r>
           </w:p>

</xml_diff>

<commit_message>
fix: :zap: Optimised HMT-TSF
</commit_message>
<xml_diff>
--- a/docs/24202141_p1_report.docx
+++ b/docs/24202141_p1_report.docx
@@ -3760,7 +3760,13 @@
         <w:t xml:space="preserve">find patterns within. This </w:t>
       </w:r>
       <w:r>
-        <w:t xml:space="preserve">emphasizes the need for an advanced predictive model to accurately forecast public transit ridership to facilitate </w:t>
+        <w:t>emphasizes the need for an advanced predictive model to accurately</w:t>
+      </w:r>
+      <w:r>
+        <w:t xml:space="preserve"> and consistently</w:t>
+      </w:r>
+      <w:r>
+        <w:t xml:space="preserve"> forecast public transit ridership to facilitate </w:t>
       </w:r>
       <w:r>
         <w:t>better urban planning and resource allocation.</w:t>
@@ -3936,7 +3942,13 @@
         <w:t xml:space="preserve">to achieve </w:t>
       </w:r>
       <w:r>
-        <w:t>highly accurate ridership predictions with complex spatio-temporal data</w:t>
+        <w:t>highly accurate</w:t>
+      </w:r>
+      <w:r>
+        <w:t xml:space="preserve"> and consistent</w:t>
+      </w:r>
+      <w:r>
+        <w:t xml:space="preserve"> ridership predictions with complex spatio-temporal data</w:t>
       </w:r>
       <w:r>
         <w:t>.</w:t>
@@ -3999,7 +4011,19 @@
         <w:rPr>
           <w:lang w:val="en-US"/>
         </w:rPr>
-        <w:t>Consequently, transit authorities face a critical bottleneck in optimizing schedules, routes, and intervals amid peak hours and holidays, thus increasing the unreliability of Malaysia’s public transit and dissatisfaction among passengers. To solve this problem, it requires a dual approach: (1) identify specific spatio-temporal factors that heavily influence the ridership trend in Malaysia’s public transit; (2) develop a robust predictive model capable of accurately forecasting daily ridership trends based on these identified spatio-temporal features.</w:t>
+        <w:t>Consequently, transit authorities face a critical bottleneck in optimizing schedules, routes, and intervals amid peak hours and holidays, thus increasing the unreliability of Malaysia’s public transit and dissatisfaction among passengers. To solve this problem, it requires a dual approach: (1) identify specific spatio-temporal factors that heavily influence the ridership trend in Malaysia’s public transit; (2) develop a robust predictive model capable of accurately</w:t>
+      </w:r>
+      <w:r>
+        <w:rPr>
+          <w:lang w:val="en-US"/>
+        </w:rPr>
+        <w:t xml:space="preserve"> and consistently</w:t>
+      </w:r>
+      <w:r>
+        <w:rPr>
+          <w:lang w:val="en-US"/>
+        </w:rPr>
+        <w:t xml:space="preserve"> forecasting daily ridership trends based on these identified spatio-temporal features.</w:t>
       </w:r>
     </w:p>
     <w:p>
@@ -4176,7 +4200,13 @@
         <w:t xml:space="preserve">n existing SOTA </w:t>
       </w:r>
       <w:r>
-        <w:t xml:space="preserve">accurately predict </w:t>
+        <w:t>accurately</w:t>
+      </w:r>
+      <w:r>
+        <w:t xml:space="preserve"> and consistently</w:t>
+      </w:r>
+      <w:r>
+        <w:t xml:space="preserve"> predict </w:t>
       </w:r>
       <w:r>
         <w:t xml:space="preserve">future </w:t>
@@ -4336,7 +4366,19 @@
         <w:t xml:space="preserve">To </w:t>
       </w:r>
       <w:r>
-        <w:t xml:space="preserve">identify a single best DL model </w:t>
+        <w:t>identify a single</w:t>
+      </w:r>
+      <w:r>
+        <w:t xml:space="preserve">, </w:t>
+      </w:r>
+      <w:r>
+        <w:t>best</w:t>
+      </w:r>
+      <w:r>
+        <w:t>, and consistent</w:t>
+      </w:r>
+      <w:r>
+        <w:t xml:space="preserve"> DL model </w:t>
       </w:r>
       <w:r>
         <w:t xml:space="preserve">that integrates </w:t>
@@ -4369,10 +4411,10 @@
         <w:t xml:space="preserve">combined </w:t>
       </w:r>
       <w:r>
-        <w:t>accuracy metrics</w:t>
-      </w:r>
-      <w:r>
-        <w:t xml:space="preserve"> of </w:t>
+        <w:t xml:space="preserve">accuracy </w:t>
+      </w:r>
+      <w:r>
+        <w:t xml:space="preserve">of </w:t>
       </w:r>
       <w:r>
         <w:t>75</w:t>
@@ -4390,7 +4432,7 @@
         <w:t>2</w:t>
       </w:r>
       <w:r>
-        <w:t xml:space="preserve"> of 0.75</w:t>
+        <w:t xml:space="preserve"> of 0.7</w:t>
       </w:r>
       <w:r>
         <w:t>.</w:t>
@@ -4711,7 +4753,16 @@
               </w:rPr>
             </w:pPr>
             <w:r>
-              <w:t>Combined MAE, RMSE, MAPE</w:t>
+              <w:t>Combined MAE, RMSE</w:t>
+            </w:r>
+            <w:r>
+              <w:t xml:space="preserve"> and</w:t>
+            </w:r>
+            <w:r>
+              <w:t xml:space="preserve"> MAPE</w:t>
+            </w:r>
+            <w:r>
+              <w:t>,</w:t>
             </w:r>
             <w:r>
               <w:t xml:space="preserve"> and</w:t>
@@ -4781,10 +4832,7 @@
               <w:jc w:val="left"/>
             </w:pPr>
             <w:r>
-              <w:t>Data</w:t>
-            </w:r>
-            <w:r>
-              <w:t>sets</w:t>
+              <w:t>Dataset Period</w:t>
             </w:r>
           </w:p>
         </w:tc>
@@ -5637,6 +5685,33 @@
     </w:p>
     <w:p>
       <w:pPr>
+        <w:pStyle w:val="Heading2"/>
+        <w:numPr>
+          <w:ilvl w:val="1"/>
+          <w:numId w:val="10"/>
+        </w:numPr>
+        <w:rPr>
+          <w:b/>
+          <w:bCs/>
+          <w:sz w:val="24"/>
+          <w:szCs w:val="24"/>
+          <w:u w:val="single"/>
+        </w:rPr>
+      </w:pPr>
+      <w:r>
+        <w:rPr>
+          <w:b/>
+          <w:bCs/>
+          <w:sz w:val="24"/>
+          <w:szCs w:val="24"/>
+          <w:u w:val="single"/>
+        </w:rPr>
+        <w:t>Proposed Model</w:t>
+      </w:r>
+    </w:p>
+    <w:p/>
+    <w:p>
+      <w:pPr>
         <w:pStyle w:val="Heading1"/>
         <w:numPr>
           <w:ilvl w:val="0"/>
@@ -5689,7 +5764,6 @@
           <w:szCs w:val="24"/>
           <w:u w:val="single"/>
         </w:rPr>
-        <w:lastRenderedPageBreak/>
         <w:t>References</w:t>
       </w:r>
       <w:bookmarkEnd w:id="29"/>
@@ -6066,6 +6140,92 @@
     </w:lvl>
   </w:abstractNum>
   <w:abstractNum w:abstractNumId="4" w15:restartNumberingAfterBreak="0">
+    <w:nsid w:val="2C864025"/>
+    <w:multiLevelType w:val="multilevel"/>
+    <w:tmpl w:val="4409001F"/>
+    <w:lvl w:ilvl="0">
+      <w:start w:val="1"/>
+      <w:numFmt w:val="decimal"/>
+      <w:lvlText w:val="%1."/>
+      <w:lvlJc w:val="left"/>
+      <w:pPr>
+        <w:ind w:left="360" w:hanging="360"/>
+      </w:pPr>
+    </w:lvl>
+    <w:lvl w:ilvl="1">
+      <w:start w:val="1"/>
+      <w:numFmt w:val="decimal"/>
+      <w:lvlText w:val="%1.%2."/>
+      <w:lvlJc w:val="left"/>
+      <w:pPr>
+        <w:ind w:left="792" w:hanging="432"/>
+      </w:pPr>
+    </w:lvl>
+    <w:lvl w:ilvl="2">
+      <w:start w:val="1"/>
+      <w:numFmt w:val="decimal"/>
+      <w:lvlText w:val="%1.%2.%3."/>
+      <w:lvlJc w:val="left"/>
+      <w:pPr>
+        <w:ind w:left="1224" w:hanging="504"/>
+      </w:pPr>
+    </w:lvl>
+    <w:lvl w:ilvl="3">
+      <w:start w:val="1"/>
+      <w:numFmt w:val="decimal"/>
+      <w:lvlText w:val="%1.%2.%3.%4."/>
+      <w:lvlJc w:val="left"/>
+      <w:pPr>
+        <w:ind w:left="1728" w:hanging="648"/>
+      </w:pPr>
+    </w:lvl>
+    <w:lvl w:ilvl="4">
+      <w:start w:val="1"/>
+      <w:numFmt w:val="decimal"/>
+      <w:lvlText w:val="%1.%2.%3.%4.%5."/>
+      <w:lvlJc w:val="left"/>
+      <w:pPr>
+        <w:ind w:left="2232" w:hanging="792"/>
+      </w:pPr>
+    </w:lvl>
+    <w:lvl w:ilvl="5">
+      <w:start w:val="1"/>
+      <w:numFmt w:val="decimal"/>
+      <w:lvlText w:val="%1.%2.%3.%4.%5.%6."/>
+      <w:lvlJc w:val="left"/>
+      <w:pPr>
+        <w:ind w:left="2736" w:hanging="936"/>
+      </w:pPr>
+    </w:lvl>
+    <w:lvl w:ilvl="6">
+      <w:start w:val="1"/>
+      <w:numFmt w:val="decimal"/>
+      <w:lvlText w:val="%1.%2.%3.%4.%5.%6.%7."/>
+      <w:lvlJc w:val="left"/>
+      <w:pPr>
+        <w:ind w:left="3240" w:hanging="1080"/>
+      </w:pPr>
+    </w:lvl>
+    <w:lvl w:ilvl="7">
+      <w:start w:val="1"/>
+      <w:numFmt w:val="decimal"/>
+      <w:lvlText w:val="%1.%2.%3.%4.%5.%6.%7.%8."/>
+      <w:lvlJc w:val="left"/>
+      <w:pPr>
+        <w:ind w:left="3744" w:hanging="1224"/>
+      </w:pPr>
+    </w:lvl>
+    <w:lvl w:ilvl="8">
+      <w:start w:val="1"/>
+      <w:numFmt w:val="decimal"/>
+      <w:lvlText w:val="%1.%2.%3.%4.%5.%6.%7.%8.%9."/>
+      <w:lvlJc w:val="left"/>
+      <w:pPr>
+        <w:ind w:left="4320" w:hanging="1440"/>
+      </w:pPr>
+    </w:lvl>
+  </w:abstractNum>
+  <w:abstractNum w:abstractNumId="5" w15:restartNumberingAfterBreak="0">
     <w:nsid w:val="391A47EE"/>
     <w:multiLevelType w:val="hybridMultilevel"/>
     <w:tmpl w:val="608C2FC8"/>
@@ -6154,7 +6314,7 @@
       </w:pPr>
     </w:lvl>
   </w:abstractNum>
-  <w:abstractNum w:abstractNumId="5" w15:restartNumberingAfterBreak="0">
+  <w:abstractNum w:abstractNumId="6" w15:restartNumberingAfterBreak="0">
     <w:nsid w:val="4AC53607"/>
     <w:multiLevelType w:val="hybridMultilevel"/>
     <w:tmpl w:val="CAB8B28C"/>
@@ -6243,7 +6403,7 @@
       </w:pPr>
     </w:lvl>
   </w:abstractNum>
-  <w:abstractNum w:abstractNumId="6" w15:restartNumberingAfterBreak="0">
+  <w:abstractNum w:abstractNumId="7" w15:restartNumberingAfterBreak="0">
     <w:nsid w:val="4C767CF7"/>
     <w:multiLevelType w:val="hybridMultilevel"/>
     <w:tmpl w:val="E006DF60"/>
@@ -6332,7 +6492,7 @@
       </w:pPr>
     </w:lvl>
   </w:abstractNum>
-  <w:abstractNum w:abstractNumId="7" w15:restartNumberingAfterBreak="0">
+  <w:abstractNum w:abstractNumId="8" w15:restartNumberingAfterBreak="0">
     <w:nsid w:val="576B70A5"/>
     <w:multiLevelType w:val="hybridMultilevel"/>
     <w:tmpl w:val="CBCCF546"/>
@@ -6445,7 +6605,7 @@
       </w:rPr>
     </w:lvl>
   </w:abstractNum>
-  <w:abstractNum w:abstractNumId="8" w15:restartNumberingAfterBreak="0">
+  <w:abstractNum w:abstractNumId="9" w15:restartNumberingAfterBreak="0">
     <w:nsid w:val="595C5C89"/>
     <w:multiLevelType w:val="hybridMultilevel"/>
     <w:tmpl w:val="BB58A9A2"/>
@@ -6535,7 +6695,7 @@
       </w:pPr>
     </w:lvl>
   </w:abstractNum>
-  <w:abstractNum w:abstractNumId="9" w15:restartNumberingAfterBreak="0">
+  <w:abstractNum w:abstractNumId="10" w15:restartNumberingAfterBreak="0">
     <w:nsid w:val="707B624C"/>
     <w:multiLevelType w:val="hybridMultilevel"/>
     <w:tmpl w:val="4066D8D2"/>
@@ -6624,7 +6784,7 @@
       </w:pPr>
     </w:lvl>
   </w:abstractNum>
-  <w:abstractNum w:abstractNumId="10" w15:restartNumberingAfterBreak="0">
+  <w:abstractNum w:abstractNumId="11" w15:restartNumberingAfterBreak="0">
     <w:nsid w:val="76C22FEC"/>
     <w:multiLevelType w:val="hybridMultilevel"/>
     <w:tmpl w:val="7D661E6A"/>
@@ -6717,34 +6877,37 @@
     <w:abstractNumId w:val="3"/>
   </w:num>
   <w:num w:numId="2" w16cid:durableId="1890915732">
+    <w:abstractNumId w:val="8"/>
+  </w:num>
+  <w:num w:numId="3" w16cid:durableId="558782592">
     <w:abstractNumId w:val="7"/>
   </w:num>
-  <w:num w:numId="3" w16cid:durableId="558782592">
-    <w:abstractNumId w:val="6"/>
-  </w:num>
   <w:num w:numId="4" w16cid:durableId="291253581">
-    <w:abstractNumId w:val="9"/>
+    <w:abstractNumId w:val="10"/>
   </w:num>
   <w:num w:numId="5" w16cid:durableId="991061032">
     <w:abstractNumId w:val="0"/>
   </w:num>
   <w:num w:numId="6" w16cid:durableId="1289168179">
-    <w:abstractNumId w:val="10"/>
+    <w:abstractNumId w:val="11"/>
   </w:num>
   <w:num w:numId="7" w16cid:durableId="197862497">
+    <w:abstractNumId w:val="6"/>
+  </w:num>
+  <w:num w:numId="8" w16cid:durableId="551042543">
     <w:abstractNumId w:val="5"/>
   </w:num>
-  <w:num w:numId="8" w16cid:durableId="551042543">
-    <w:abstractNumId w:val="4"/>
-  </w:num>
   <w:num w:numId="9" w16cid:durableId="608927404">
-    <w:abstractNumId w:val="8"/>
+    <w:abstractNumId w:val="9"/>
   </w:num>
   <w:num w:numId="10" w16cid:durableId="495653598">
     <w:abstractNumId w:val="1"/>
   </w:num>
   <w:num w:numId="11" w16cid:durableId="2090609939">
     <w:abstractNumId w:val="2"/>
+  </w:num>
+  <w:num w:numId="12" w16cid:durableId="395125979">
+    <w:abstractNumId w:val="4"/>
   </w:num>
 </w:numbering>
 </file>

</xml_diff>

<commit_message>
docs: :memo: Included GTFS report
</commit_message>
<xml_diff>
--- a/docs/24202141_p1_report.docx
+++ b/docs/24202141_p1_report.docx
@@ -76,7 +76,7 @@
           <w:r>
             <w:fldChar w:fldCharType="separate"/>
           </w:r>
-          <w:hyperlink w:anchor="_Toc228807682" w:history="1">
+          <w:hyperlink w:anchor="_Toc230633009" w:history="1">
             <w:r>
               <w:rPr>
                 <w:rStyle w:val="Hyperlink"/>
@@ -121,7 +121,7 @@
                 <w:noProof/>
                 <w:webHidden/>
               </w:rPr>
-              <w:instrText xml:space="preserve"> PAGEREF _Toc228807682 \h </w:instrText>
+              <w:instrText xml:space="preserve"> PAGEREF _Toc230633009 \h </w:instrText>
             </w:r>
             <w:r>
               <w:rPr>
@@ -164,7 +164,7 @@
               <w:noProof/>
             </w:rPr>
           </w:pPr>
-          <w:hyperlink w:anchor="_Toc228807683" w:history="1">
+          <w:hyperlink w:anchor="_Toc230633010" w:history="1">
             <w:r>
               <w:rPr>
                 <w:rStyle w:val="Hyperlink"/>
@@ -209,7 +209,7 @@
                 <w:noProof/>
                 <w:webHidden/>
               </w:rPr>
-              <w:instrText xml:space="preserve"> PAGEREF _Toc228807683 \h </w:instrText>
+              <w:instrText xml:space="preserve"> PAGEREF _Toc230633010 \h </w:instrText>
             </w:r>
             <w:r>
               <w:rPr>
@@ -252,7 +252,7 @@
               <w:noProof/>
             </w:rPr>
           </w:pPr>
-          <w:hyperlink w:anchor="_Toc228807684" w:history="1">
+          <w:hyperlink w:anchor="_Toc230633011" w:history="1">
             <w:r>
               <w:rPr>
                 <w:rStyle w:val="Hyperlink"/>
@@ -297,7 +297,7 @@
                 <w:noProof/>
                 <w:webHidden/>
               </w:rPr>
-              <w:instrText xml:space="preserve"> PAGEREF _Toc228807684 \h </w:instrText>
+              <w:instrText xml:space="preserve"> PAGEREF _Toc230633011 \h </w:instrText>
             </w:r>
             <w:r>
               <w:rPr>
@@ -340,7 +340,7 @@
               <w:noProof/>
             </w:rPr>
           </w:pPr>
-          <w:hyperlink w:anchor="_Toc228807685" w:history="1">
+          <w:hyperlink w:anchor="_Toc230633012" w:history="1">
             <w:r>
               <w:rPr>
                 <w:rStyle w:val="Hyperlink"/>
@@ -385,7 +385,7 @@
                 <w:noProof/>
                 <w:webHidden/>
               </w:rPr>
-              <w:instrText xml:space="preserve"> PAGEREF _Toc228807685 \h </w:instrText>
+              <w:instrText xml:space="preserve"> PAGEREF _Toc230633012 \h </w:instrText>
             </w:r>
             <w:r>
               <w:rPr>
@@ -405,7 +405,7 @@
                 <w:noProof/>
                 <w:webHidden/>
               </w:rPr>
-              <w:t>3</w:t>
+              <w:t>4</w:t>
             </w:r>
             <w:r>
               <w:rPr>
@@ -428,7 +428,7 @@
               <w:noProof/>
             </w:rPr>
           </w:pPr>
-          <w:hyperlink w:anchor="_Toc228807686" w:history="1">
+          <w:hyperlink w:anchor="_Toc230633013" w:history="1">
             <w:r>
               <w:rPr>
                 <w:rStyle w:val="Hyperlink"/>
@@ -473,7 +473,7 @@
                 <w:noProof/>
                 <w:webHidden/>
               </w:rPr>
-              <w:instrText xml:space="preserve"> PAGEREF _Toc228807686 \h </w:instrText>
+              <w:instrText xml:space="preserve"> PAGEREF _Toc230633013 \h </w:instrText>
             </w:r>
             <w:r>
               <w:rPr>
@@ -516,7 +516,7 @@
               <w:noProof/>
             </w:rPr>
           </w:pPr>
-          <w:hyperlink w:anchor="_Toc228807687" w:history="1">
+          <w:hyperlink w:anchor="_Toc230633014" w:history="1">
             <w:r>
               <w:rPr>
                 <w:rStyle w:val="Hyperlink"/>
@@ -561,7 +561,7 @@
                 <w:noProof/>
                 <w:webHidden/>
               </w:rPr>
-              <w:instrText xml:space="preserve"> PAGEREF _Toc228807687 \h </w:instrText>
+              <w:instrText xml:space="preserve"> PAGEREF _Toc230633014 \h </w:instrText>
             </w:r>
             <w:r>
               <w:rPr>
@@ -604,7 +604,7 @@
               <w:noProof/>
             </w:rPr>
           </w:pPr>
-          <w:hyperlink w:anchor="_Toc228807688" w:history="1">
+          <w:hyperlink w:anchor="_Toc230633015" w:history="1">
             <w:r>
               <w:rPr>
                 <w:rStyle w:val="Hyperlink"/>
@@ -649,7 +649,7 @@
                 <w:noProof/>
                 <w:webHidden/>
               </w:rPr>
-              <w:instrText xml:space="preserve"> PAGEREF _Toc228807688 \h </w:instrText>
+              <w:instrText xml:space="preserve"> PAGEREF _Toc230633015 \h </w:instrText>
             </w:r>
             <w:r>
               <w:rPr>
@@ -669,7 +669,7 @@
                 <w:noProof/>
                 <w:webHidden/>
               </w:rPr>
-              <w:t>5</w:t>
+              <w:t>6</w:t>
             </w:r>
             <w:r>
               <w:rPr>
@@ -692,7 +692,7 @@
               <w:noProof/>
             </w:rPr>
           </w:pPr>
-          <w:hyperlink w:anchor="_Toc228807689" w:history="1">
+          <w:hyperlink w:anchor="_Toc230633016" w:history="1">
             <w:r>
               <w:rPr>
                 <w:rStyle w:val="Hyperlink"/>
@@ -737,7 +737,7 @@
                 <w:noProof/>
                 <w:webHidden/>
               </w:rPr>
-              <w:instrText xml:space="preserve"> PAGEREF _Toc228807689 \h </w:instrText>
+              <w:instrText xml:space="preserve"> PAGEREF _Toc230633016 \h </w:instrText>
             </w:r>
             <w:r>
               <w:rPr>
@@ -757,7 +757,7 @@
                 <w:noProof/>
                 <w:webHidden/>
               </w:rPr>
-              <w:t>5</w:t>
+              <w:t>6</w:t>
             </w:r>
             <w:r>
               <w:rPr>
@@ -780,7 +780,7 @@
               <w:noProof/>
             </w:rPr>
           </w:pPr>
-          <w:hyperlink w:anchor="_Toc228807690" w:history="1">
+          <w:hyperlink w:anchor="_Toc230633017" w:history="1">
             <w:r>
               <w:rPr>
                 <w:rStyle w:val="Hyperlink"/>
@@ -825,7 +825,7 @@
                 <w:noProof/>
                 <w:webHidden/>
               </w:rPr>
-              <w:instrText xml:space="preserve"> PAGEREF _Toc228807690 \h </w:instrText>
+              <w:instrText xml:space="preserve"> PAGEREF _Toc230633017 \h </w:instrText>
             </w:r>
             <w:r>
               <w:rPr>
@@ -845,7 +845,7 @@
                 <w:noProof/>
                 <w:webHidden/>
               </w:rPr>
-              <w:t>5</w:t>
+              <w:t>6</w:t>
             </w:r>
             <w:r>
               <w:rPr>
@@ -868,7 +868,7 @@
               <w:noProof/>
             </w:rPr>
           </w:pPr>
-          <w:hyperlink w:anchor="_Toc228807691" w:history="1">
+          <w:hyperlink w:anchor="_Toc230633018" w:history="1">
             <w:r>
               <w:rPr>
                 <w:rStyle w:val="Hyperlink"/>
@@ -913,7 +913,7 @@
                 <w:noProof/>
                 <w:webHidden/>
               </w:rPr>
-              <w:instrText xml:space="preserve"> PAGEREF _Toc228807691 \h </w:instrText>
+              <w:instrText xml:space="preserve"> PAGEREF _Toc230633018 \h </w:instrText>
             </w:r>
             <w:r>
               <w:rPr>
@@ -933,7 +933,7 @@
                 <w:noProof/>
                 <w:webHidden/>
               </w:rPr>
-              <w:t>5</w:t>
+              <w:t>6</w:t>
             </w:r>
             <w:r>
               <w:rPr>
@@ -956,7 +956,7 @@
               <w:noProof/>
             </w:rPr>
           </w:pPr>
-          <w:hyperlink w:anchor="_Toc228807692" w:history="1">
+          <w:hyperlink w:anchor="_Toc230633019" w:history="1">
             <w:r>
               <w:rPr>
                 <w:rStyle w:val="Hyperlink"/>
@@ -1001,7 +1001,7 @@
                 <w:noProof/>
                 <w:webHidden/>
               </w:rPr>
-              <w:instrText xml:space="preserve"> PAGEREF _Toc228807692 \h </w:instrText>
+              <w:instrText xml:space="preserve"> PAGEREF _Toc230633019 \h </w:instrText>
             </w:r>
             <w:r>
               <w:rPr>
@@ -1021,7 +1021,7 @@
                 <w:noProof/>
                 <w:webHidden/>
               </w:rPr>
-              <w:t>5</w:t>
+              <w:t>6</w:t>
             </w:r>
             <w:r>
               <w:rPr>
@@ -1044,7 +1044,7 @@
               <w:noProof/>
             </w:rPr>
           </w:pPr>
-          <w:hyperlink w:anchor="_Toc228807693" w:history="1">
+          <w:hyperlink w:anchor="_Toc230633020" w:history="1">
             <w:r>
               <w:rPr>
                 <w:rStyle w:val="Hyperlink"/>
@@ -1089,7 +1089,7 @@
                 <w:noProof/>
                 <w:webHidden/>
               </w:rPr>
-              <w:instrText xml:space="preserve"> PAGEREF _Toc228807693 \h </w:instrText>
+              <w:instrText xml:space="preserve"> PAGEREF _Toc230633020 \h </w:instrText>
             </w:r>
             <w:r>
               <w:rPr>
@@ -1109,7 +1109,7 @@
                 <w:noProof/>
                 <w:webHidden/>
               </w:rPr>
-              <w:t>5</w:t>
+              <w:t>6</w:t>
             </w:r>
             <w:r>
               <w:rPr>
@@ -1132,7 +1132,7 @@
               <w:noProof/>
             </w:rPr>
           </w:pPr>
-          <w:hyperlink w:anchor="_Toc228807694" w:history="1">
+          <w:hyperlink w:anchor="_Toc230633021" w:history="1">
             <w:r>
               <w:rPr>
                 <w:rStyle w:val="Hyperlink"/>
@@ -1177,7 +1177,7 @@
                 <w:noProof/>
                 <w:webHidden/>
               </w:rPr>
-              <w:instrText xml:space="preserve"> PAGEREF _Toc228807694 \h </w:instrText>
+              <w:instrText xml:space="preserve"> PAGEREF _Toc230633021 \h </w:instrText>
             </w:r>
             <w:r>
               <w:rPr>
@@ -1197,7 +1197,7 @@
                 <w:noProof/>
                 <w:webHidden/>
               </w:rPr>
-              <w:t>5</w:t>
+              <w:t>6</w:t>
             </w:r>
             <w:r>
               <w:rPr>
@@ -1220,7 +1220,7 @@
               <w:noProof/>
             </w:rPr>
           </w:pPr>
-          <w:hyperlink w:anchor="_Toc228807695" w:history="1">
+          <w:hyperlink w:anchor="_Toc230633022" w:history="1">
             <w:r>
               <w:rPr>
                 <w:rStyle w:val="Hyperlink"/>
@@ -1265,7 +1265,7 @@
                 <w:noProof/>
                 <w:webHidden/>
               </w:rPr>
-              <w:instrText xml:space="preserve"> PAGEREF _Toc228807695 \h </w:instrText>
+              <w:instrText xml:space="preserve"> PAGEREF _Toc230633022 \h </w:instrText>
             </w:r>
             <w:r>
               <w:rPr>
@@ -1285,7 +1285,7 @@
                 <w:noProof/>
                 <w:webHidden/>
               </w:rPr>
-              <w:t>5</w:t>
+              <w:t>6</w:t>
             </w:r>
             <w:r>
               <w:rPr>
@@ -1308,7 +1308,7 @@
               <w:noProof/>
             </w:rPr>
           </w:pPr>
-          <w:hyperlink w:anchor="_Toc228807696" w:history="1">
+          <w:hyperlink w:anchor="_Toc230633023" w:history="1">
             <w:r>
               <w:rPr>
                 <w:rStyle w:val="Hyperlink"/>
@@ -1353,7 +1353,7 @@
                 <w:noProof/>
                 <w:webHidden/>
               </w:rPr>
-              <w:instrText xml:space="preserve"> PAGEREF _Toc228807696 \h </w:instrText>
+              <w:instrText xml:space="preserve"> PAGEREF _Toc230633023 \h </w:instrText>
             </w:r>
             <w:r>
               <w:rPr>
@@ -1373,7 +1373,7 @@
                 <w:noProof/>
                 <w:webHidden/>
               </w:rPr>
-              <w:t>5</w:t>
+              <w:t>6</w:t>
             </w:r>
             <w:r>
               <w:rPr>
@@ -1396,7 +1396,7 @@
               <w:noProof/>
             </w:rPr>
           </w:pPr>
-          <w:hyperlink w:anchor="_Toc228807697" w:history="1">
+          <w:hyperlink w:anchor="_Toc230633024" w:history="1">
             <w:r>
               <w:rPr>
                 <w:rStyle w:val="Hyperlink"/>
@@ -1441,7 +1441,7 @@
                 <w:noProof/>
                 <w:webHidden/>
               </w:rPr>
-              <w:instrText xml:space="preserve"> PAGEREF _Toc228807697 \h </w:instrText>
+              <w:instrText xml:space="preserve"> PAGEREF _Toc230633024 \h </w:instrText>
             </w:r>
             <w:r>
               <w:rPr>
@@ -1461,7 +1461,7 @@
                 <w:noProof/>
                 <w:webHidden/>
               </w:rPr>
-              <w:t>5</w:t>
+              <w:t>6</w:t>
             </w:r>
             <w:r>
               <w:rPr>
@@ -1484,7 +1484,7 @@
               <w:noProof/>
             </w:rPr>
           </w:pPr>
-          <w:hyperlink w:anchor="_Toc228807698" w:history="1">
+          <w:hyperlink w:anchor="_Toc230633025" w:history="1">
             <w:r>
               <w:rPr>
                 <w:rStyle w:val="Hyperlink"/>
@@ -1529,7 +1529,7 @@
                 <w:noProof/>
                 <w:webHidden/>
               </w:rPr>
-              <w:instrText xml:space="preserve"> PAGEREF _Toc228807698 \h </w:instrText>
+              <w:instrText xml:space="preserve"> PAGEREF _Toc230633025 \h </w:instrText>
             </w:r>
             <w:r>
               <w:rPr>
@@ -1549,7 +1549,7 @@
                 <w:noProof/>
                 <w:webHidden/>
               </w:rPr>
-              <w:t>5</w:t>
+              <w:t>6</w:t>
             </w:r>
             <w:r>
               <w:rPr>
@@ -1572,7 +1572,7 @@
               <w:noProof/>
             </w:rPr>
           </w:pPr>
-          <w:hyperlink w:anchor="_Toc228807699" w:history="1">
+          <w:hyperlink w:anchor="_Toc230633026" w:history="1">
             <w:r>
               <w:rPr>
                 <w:rStyle w:val="Hyperlink"/>
@@ -1617,7 +1617,7 @@
                 <w:noProof/>
                 <w:webHidden/>
               </w:rPr>
-              <w:instrText xml:space="preserve"> PAGEREF _Toc228807699 \h </w:instrText>
+              <w:instrText xml:space="preserve"> PAGEREF _Toc230633026 \h </w:instrText>
             </w:r>
             <w:r>
               <w:rPr>
@@ -1637,7 +1637,7 @@
                 <w:noProof/>
                 <w:webHidden/>
               </w:rPr>
-              <w:t>5</w:t>
+              <w:t>6</w:t>
             </w:r>
             <w:r>
               <w:rPr>
@@ -1660,7 +1660,7 @@
               <w:noProof/>
             </w:rPr>
           </w:pPr>
-          <w:hyperlink w:anchor="_Toc228807700" w:history="1">
+          <w:hyperlink w:anchor="_Toc230633027" w:history="1">
             <w:r>
               <w:rPr>
                 <w:rStyle w:val="Hyperlink"/>
@@ -1705,7 +1705,7 @@
                 <w:noProof/>
                 <w:webHidden/>
               </w:rPr>
-              <w:instrText xml:space="preserve"> PAGEREF _Toc228807700 \h </w:instrText>
+              <w:instrText xml:space="preserve"> PAGEREF _Toc230633027 \h </w:instrText>
             </w:r>
             <w:r>
               <w:rPr>
@@ -1725,7 +1725,7 @@
                 <w:noProof/>
                 <w:webHidden/>
               </w:rPr>
-              <w:t>5</w:t>
+              <w:t>6</w:t>
             </w:r>
             <w:r>
               <w:rPr>
@@ -1748,7 +1748,7 @@
               <w:noProof/>
             </w:rPr>
           </w:pPr>
-          <w:hyperlink w:anchor="_Toc228807701" w:history="1">
+          <w:hyperlink w:anchor="_Toc230633028" w:history="1">
             <w:r>
               <w:rPr>
                 <w:rStyle w:val="Hyperlink"/>
@@ -1793,7 +1793,7 @@
                 <w:noProof/>
                 <w:webHidden/>
               </w:rPr>
-              <w:instrText xml:space="preserve"> PAGEREF _Toc228807701 \h </w:instrText>
+              <w:instrText xml:space="preserve"> PAGEREF _Toc230633028 \h </w:instrText>
             </w:r>
             <w:r>
               <w:rPr>
@@ -1813,7 +1813,7 @@
                 <w:noProof/>
                 <w:webHidden/>
               </w:rPr>
-              <w:t>5</w:t>
+              <w:t>6</w:t>
             </w:r>
             <w:r>
               <w:rPr>
@@ -1836,7 +1836,7 @@
               <w:noProof/>
             </w:rPr>
           </w:pPr>
-          <w:hyperlink w:anchor="_Toc228807702" w:history="1">
+          <w:hyperlink w:anchor="_Toc230633029" w:history="1">
             <w:r>
               <w:rPr>
                 <w:rStyle w:val="Hyperlink"/>
@@ -1881,7 +1881,7 @@
                 <w:noProof/>
                 <w:webHidden/>
               </w:rPr>
-              <w:instrText xml:space="preserve"> PAGEREF _Toc228807702 \h </w:instrText>
+              <w:instrText xml:space="preserve"> PAGEREF _Toc230633029 \h </w:instrText>
             </w:r>
             <w:r>
               <w:rPr>
@@ -1901,7 +1901,7 @@
                 <w:noProof/>
                 <w:webHidden/>
               </w:rPr>
-              <w:t>5</w:t>
+              <w:t>6</w:t>
             </w:r>
             <w:r>
               <w:rPr>
@@ -1924,7 +1924,7 @@
               <w:noProof/>
             </w:rPr>
           </w:pPr>
-          <w:hyperlink w:anchor="_Toc228807703" w:history="1">
+          <w:hyperlink w:anchor="_Toc230633030" w:history="1">
             <w:r>
               <w:rPr>
                 <w:rStyle w:val="Hyperlink"/>
@@ -1969,7 +1969,7 @@
                 <w:noProof/>
                 <w:webHidden/>
               </w:rPr>
-              <w:instrText xml:space="preserve"> PAGEREF _Toc228807703 \h </w:instrText>
+              <w:instrText xml:space="preserve"> PAGEREF _Toc230633030 \h </w:instrText>
             </w:r>
             <w:r>
               <w:rPr>
@@ -1989,7 +1989,7 @@
                 <w:noProof/>
                 <w:webHidden/>
               </w:rPr>
-              <w:t>5</w:t>
+              <w:t>6</w:t>
             </w:r>
             <w:r>
               <w:rPr>
@@ -2012,7 +2012,7 @@
               <w:noProof/>
             </w:rPr>
           </w:pPr>
-          <w:hyperlink w:anchor="_Toc228807704" w:history="1">
+          <w:hyperlink w:anchor="_Toc230633031" w:history="1">
             <w:r>
               <w:rPr>
                 <w:rStyle w:val="Hyperlink"/>
@@ -2057,7 +2057,7 @@
                 <w:noProof/>
                 <w:webHidden/>
               </w:rPr>
-              <w:instrText xml:space="preserve"> PAGEREF _Toc228807704 \h </w:instrText>
+              <w:instrText xml:space="preserve"> PAGEREF _Toc230633031 \h </w:instrText>
             </w:r>
             <w:r>
               <w:rPr>
@@ -2077,7 +2077,7 @@
                 <w:noProof/>
                 <w:webHidden/>
               </w:rPr>
-              <w:t>5</w:t>
+              <w:t>6</w:t>
             </w:r>
             <w:r>
               <w:rPr>
@@ -2100,7 +2100,7 @@
               <w:noProof/>
             </w:rPr>
           </w:pPr>
-          <w:hyperlink w:anchor="_Toc228807705" w:history="1">
+          <w:hyperlink w:anchor="_Toc230633032" w:history="1">
             <w:r>
               <w:rPr>
                 <w:rStyle w:val="Hyperlink"/>
@@ -2145,7 +2145,7 @@
                 <w:noProof/>
                 <w:webHidden/>
               </w:rPr>
-              <w:instrText xml:space="preserve"> PAGEREF _Toc228807705 \h </w:instrText>
+              <w:instrText xml:space="preserve"> PAGEREF _Toc230633032 \h </w:instrText>
             </w:r>
             <w:r>
               <w:rPr>
@@ -2165,7 +2165,7 @@
                 <w:noProof/>
                 <w:webHidden/>
               </w:rPr>
-              <w:t>5</w:t>
+              <w:t>6</w:t>
             </w:r>
             <w:r>
               <w:rPr>
@@ -2188,7 +2188,7 @@
               <w:noProof/>
             </w:rPr>
           </w:pPr>
-          <w:hyperlink w:anchor="_Toc228807706" w:history="1">
+          <w:hyperlink w:anchor="_Toc230633033" w:history="1">
             <w:r>
               <w:rPr>
                 <w:rStyle w:val="Hyperlink"/>
@@ -2233,7 +2233,7 @@
                 <w:noProof/>
                 <w:webHidden/>
               </w:rPr>
-              <w:instrText xml:space="preserve"> PAGEREF _Toc228807706 \h </w:instrText>
+              <w:instrText xml:space="preserve"> PAGEREF _Toc230633033 \h </w:instrText>
             </w:r>
             <w:r>
               <w:rPr>
@@ -2253,7 +2253,7 @@
                 <w:noProof/>
                 <w:webHidden/>
               </w:rPr>
-              <w:t>5</w:t>
+              <w:t>6</w:t>
             </w:r>
             <w:r>
               <w:rPr>
@@ -2276,7 +2276,7 @@
               <w:noProof/>
             </w:rPr>
           </w:pPr>
-          <w:hyperlink w:anchor="_Toc228807707" w:history="1">
+          <w:hyperlink w:anchor="_Toc230633034" w:history="1">
             <w:r>
               <w:rPr>
                 <w:rStyle w:val="Hyperlink"/>
@@ -2321,7 +2321,7 @@
                 <w:noProof/>
                 <w:webHidden/>
               </w:rPr>
-              <w:instrText xml:space="preserve"> PAGEREF _Toc228807707 \h </w:instrText>
+              <w:instrText xml:space="preserve"> PAGEREF _Toc230633034 \h </w:instrText>
             </w:r>
             <w:r>
               <w:rPr>
@@ -2341,7 +2341,7 @@
                 <w:noProof/>
                 <w:webHidden/>
               </w:rPr>
-              <w:t>5</w:t>
+              <w:t>6</w:t>
             </w:r>
             <w:r>
               <w:rPr>
@@ -2364,7 +2364,7 @@
               <w:noProof/>
             </w:rPr>
           </w:pPr>
-          <w:hyperlink w:anchor="_Toc228807708" w:history="1">
+          <w:hyperlink w:anchor="_Toc230633035" w:history="1">
             <w:r>
               <w:rPr>
                 <w:rStyle w:val="Hyperlink"/>
@@ -2388,7 +2388,7 @@
                 <w:bCs/>
                 <w:noProof/>
               </w:rPr>
-              <w:t>Explanatory Data Analysis</w:t>
+              <w:t>Feature Engineering</w:t>
             </w:r>
             <w:r>
               <w:rPr>
@@ -2409,7 +2409,7 @@
                 <w:noProof/>
                 <w:webHidden/>
               </w:rPr>
-              <w:instrText xml:space="preserve"> PAGEREF _Toc228807708 \h </w:instrText>
+              <w:instrText xml:space="preserve"> PAGEREF _Toc230633035 \h </w:instrText>
             </w:r>
             <w:r>
               <w:rPr>
@@ -2429,7 +2429,7 @@
                 <w:noProof/>
                 <w:webHidden/>
               </w:rPr>
-              <w:t>5</w:t>
+              <w:t>6</w:t>
             </w:r>
             <w:r>
               <w:rPr>
@@ -2452,7 +2452,7 @@
               <w:noProof/>
             </w:rPr>
           </w:pPr>
-          <w:hyperlink w:anchor="_Toc228807709" w:history="1">
+          <w:hyperlink w:anchor="_Toc230633036" w:history="1">
             <w:r>
               <w:rPr>
                 <w:rStyle w:val="Hyperlink"/>
@@ -2476,7 +2476,7 @@
                 <w:bCs/>
                 <w:noProof/>
               </w:rPr>
-              <w:t>Baseline &amp; Comparative Models</w:t>
+              <w:t>Explanatory Data Analysis</w:t>
             </w:r>
             <w:r>
               <w:rPr>
@@ -2497,7 +2497,7 @@
                 <w:noProof/>
                 <w:webHidden/>
               </w:rPr>
-              <w:instrText xml:space="preserve"> PAGEREF _Toc228807709 \h </w:instrText>
+              <w:instrText xml:space="preserve"> PAGEREF _Toc230633036 \h </w:instrText>
             </w:r>
             <w:r>
               <w:rPr>
@@ -2517,7 +2517,7 @@
                 <w:noProof/>
                 <w:webHidden/>
               </w:rPr>
-              <w:t>5</w:t>
+              <w:t>6</w:t>
             </w:r>
             <w:r>
               <w:rPr>
@@ -2530,447 +2530,7 @@
         </w:p>
         <w:p>
           <w:pPr>
-            <w:pStyle w:val="TOC3"/>
-            <w:tabs>
-              <w:tab w:val="left" w:pos="1440"/>
-              <w:tab w:val="right" w:leader="dot" w:pos="9016"/>
-            </w:tabs>
-            <w:rPr>
-              <w:rFonts w:asciiTheme="minorHAnsi" w:hAnsiTheme="minorHAnsi"/>
-              <w:noProof/>
-            </w:rPr>
-          </w:pPr>
-          <w:hyperlink w:anchor="_Toc228807710" w:history="1">
-            <w:r>
-              <w:rPr>
-                <w:rStyle w:val="Hyperlink"/>
-                <w:b/>
-                <w:bCs/>
-                <w:noProof/>
-              </w:rPr>
-              <w:t>3.4.1.</w:t>
-            </w:r>
-            <w:r>
-              <w:rPr>
-                <w:rFonts w:asciiTheme="minorHAnsi" w:hAnsiTheme="minorHAnsi"/>
-                <w:noProof/>
-              </w:rPr>
-              <w:tab/>
-            </w:r>
-            <w:r>
-              <w:rPr>
-                <w:rStyle w:val="Hyperlink"/>
-                <w:b/>
-                <w:bCs/>
-                <w:noProof/>
-              </w:rPr>
-              <w:t>LSTM</w:t>
-            </w:r>
-            <w:r>
-              <w:rPr>
-                <w:noProof/>
-                <w:webHidden/>
-              </w:rPr>
-              <w:tab/>
-            </w:r>
-            <w:r>
-              <w:rPr>
-                <w:noProof/>
-                <w:webHidden/>
-              </w:rPr>
-              <w:fldChar w:fldCharType="begin"/>
-            </w:r>
-            <w:r>
-              <w:rPr>
-                <w:noProof/>
-                <w:webHidden/>
-              </w:rPr>
-              <w:instrText xml:space="preserve"> PAGEREF _Toc228807710 \h </w:instrText>
-            </w:r>
-            <w:r>
-              <w:rPr>
-                <w:noProof/>
-                <w:webHidden/>
-              </w:rPr>
-            </w:r>
-            <w:r>
-              <w:rPr>
-                <w:noProof/>
-                <w:webHidden/>
-              </w:rPr>
-              <w:fldChar w:fldCharType="separate"/>
-            </w:r>
-            <w:r>
-              <w:rPr>
-                <w:noProof/>
-                <w:webHidden/>
-              </w:rPr>
-              <w:t>5</w:t>
-            </w:r>
-            <w:r>
-              <w:rPr>
-                <w:noProof/>
-                <w:webHidden/>
-              </w:rPr>
-              <w:fldChar w:fldCharType="end"/>
-            </w:r>
-          </w:hyperlink>
-        </w:p>
-        <w:p>
-          <w:pPr>
-            <w:pStyle w:val="TOC3"/>
-            <w:tabs>
-              <w:tab w:val="left" w:pos="1440"/>
-              <w:tab w:val="right" w:leader="dot" w:pos="9016"/>
-            </w:tabs>
-            <w:rPr>
-              <w:rFonts w:asciiTheme="minorHAnsi" w:hAnsiTheme="minorHAnsi"/>
-              <w:noProof/>
-            </w:rPr>
-          </w:pPr>
-          <w:hyperlink w:anchor="_Toc228807711" w:history="1">
-            <w:r>
-              <w:rPr>
-                <w:rStyle w:val="Hyperlink"/>
-                <w:b/>
-                <w:bCs/>
-                <w:noProof/>
-              </w:rPr>
-              <w:t>3.4.2.</w:t>
-            </w:r>
-            <w:r>
-              <w:rPr>
-                <w:rFonts w:asciiTheme="minorHAnsi" w:hAnsiTheme="minorHAnsi"/>
-                <w:noProof/>
-              </w:rPr>
-              <w:tab/>
-            </w:r>
-            <w:r>
-              <w:rPr>
-                <w:rStyle w:val="Hyperlink"/>
-                <w:b/>
-                <w:bCs/>
-                <w:noProof/>
-              </w:rPr>
-              <w:t>GCN-SBULSTM</w:t>
-            </w:r>
-            <w:r>
-              <w:rPr>
-                <w:noProof/>
-                <w:webHidden/>
-              </w:rPr>
-              <w:tab/>
-            </w:r>
-            <w:r>
-              <w:rPr>
-                <w:noProof/>
-                <w:webHidden/>
-              </w:rPr>
-              <w:fldChar w:fldCharType="begin"/>
-            </w:r>
-            <w:r>
-              <w:rPr>
-                <w:noProof/>
-                <w:webHidden/>
-              </w:rPr>
-              <w:instrText xml:space="preserve"> PAGEREF _Toc228807711 \h </w:instrText>
-            </w:r>
-            <w:r>
-              <w:rPr>
-                <w:noProof/>
-                <w:webHidden/>
-              </w:rPr>
-            </w:r>
-            <w:r>
-              <w:rPr>
-                <w:noProof/>
-                <w:webHidden/>
-              </w:rPr>
-              <w:fldChar w:fldCharType="separate"/>
-            </w:r>
-            <w:r>
-              <w:rPr>
-                <w:noProof/>
-                <w:webHidden/>
-              </w:rPr>
-              <w:t>5</w:t>
-            </w:r>
-            <w:r>
-              <w:rPr>
-                <w:noProof/>
-                <w:webHidden/>
-              </w:rPr>
-              <w:fldChar w:fldCharType="end"/>
-            </w:r>
-          </w:hyperlink>
-        </w:p>
-        <w:p>
-          <w:pPr>
-            <w:pStyle w:val="TOC3"/>
-            <w:tabs>
-              <w:tab w:val="left" w:pos="1440"/>
-              <w:tab w:val="right" w:leader="dot" w:pos="9016"/>
-            </w:tabs>
-            <w:rPr>
-              <w:rFonts w:asciiTheme="minorHAnsi" w:hAnsiTheme="minorHAnsi"/>
-              <w:noProof/>
-            </w:rPr>
-          </w:pPr>
-          <w:hyperlink w:anchor="_Toc228807712" w:history="1">
-            <w:r>
-              <w:rPr>
-                <w:rStyle w:val="Hyperlink"/>
-                <w:b/>
-                <w:bCs/>
-                <w:noProof/>
-              </w:rPr>
-              <w:t>3.4.3.</w:t>
-            </w:r>
-            <w:r>
-              <w:rPr>
-                <w:rFonts w:asciiTheme="minorHAnsi" w:hAnsiTheme="minorHAnsi"/>
-                <w:noProof/>
-              </w:rPr>
-              <w:tab/>
-            </w:r>
-            <w:r>
-              <w:rPr>
-                <w:rStyle w:val="Hyperlink"/>
-                <w:b/>
-                <w:bCs/>
-                <w:noProof/>
-              </w:rPr>
-              <w:t>BiLSTM</w:t>
-            </w:r>
-            <w:r>
-              <w:rPr>
-                <w:noProof/>
-                <w:webHidden/>
-              </w:rPr>
-              <w:tab/>
-            </w:r>
-            <w:r>
-              <w:rPr>
-                <w:noProof/>
-                <w:webHidden/>
-              </w:rPr>
-              <w:fldChar w:fldCharType="begin"/>
-            </w:r>
-            <w:r>
-              <w:rPr>
-                <w:noProof/>
-                <w:webHidden/>
-              </w:rPr>
-              <w:instrText xml:space="preserve"> PAGEREF _Toc228807712 \h </w:instrText>
-            </w:r>
-            <w:r>
-              <w:rPr>
-                <w:noProof/>
-                <w:webHidden/>
-              </w:rPr>
-            </w:r>
-            <w:r>
-              <w:rPr>
-                <w:noProof/>
-                <w:webHidden/>
-              </w:rPr>
-              <w:fldChar w:fldCharType="separate"/>
-            </w:r>
-            <w:r>
-              <w:rPr>
-                <w:noProof/>
-                <w:webHidden/>
-              </w:rPr>
-              <w:t>6</w:t>
-            </w:r>
-            <w:r>
-              <w:rPr>
-                <w:noProof/>
-                <w:webHidden/>
-              </w:rPr>
-              <w:fldChar w:fldCharType="end"/>
-            </w:r>
-          </w:hyperlink>
-        </w:p>
-        <w:p>
-          <w:pPr>
-            <w:pStyle w:val="TOC3"/>
-            <w:tabs>
-              <w:tab w:val="left" w:pos="1440"/>
-              <w:tab w:val="right" w:leader="dot" w:pos="9016"/>
-            </w:tabs>
-            <w:rPr>
-              <w:rFonts w:asciiTheme="minorHAnsi" w:hAnsiTheme="minorHAnsi"/>
-              <w:noProof/>
-            </w:rPr>
-          </w:pPr>
-          <w:hyperlink w:anchor="_Toc228807713" w:history="1">
-            <w:r>
-              <w:rPr>
-                <w:rStyle w:val="Hyperlink"/>
-                <w:b/>
-                <w:bCs/>
-                <w:noProof/>
-              </w:rPr>
-              <w:t>3.4.4.</w:t>
-            </w:r>
-            <w:r>
-              <w:rPr>
-                <w:rFonts w:asciiTheme="minorHAnsi" w:hAnsiTheme="minorHAnsi"/>
-                <w:noProof/>
-              </w:rPr>
-              <w:tab/>
-            </w:r>
-            <w:r>
-              <w:rPr>
-                <w:rStyle w:val="Hyperlink"/>
-                <w:b/>
-                <w:bCs/>
-                <w:noProof/>
-              </w:rPr>
-              <w:t>TPA-LSTM</w:t>
-            </w:r>
-            <w:r>
-              <w:rPr>
-                <w:noProof/>
-                <w:webHidden/>
-              </w:rPr>
-              <w:tab/>
-            </w:r>
-            <w:r>
-              <w:rPr>
-                <w:noProof/>
-                <w:webHidden/>
-              </w:rPr>
-              <w:fldChar w:fldCharType="begin"/>
-            </w:r>
-            <w:r>
-              <w:rPr>
-                <w:noProof/>
-                <w:webHidden/>
-              </w:rPr>
-              <w:instrText xml:space="preserve"> PAGEREF _Toc228807713 \h </w:instrText>
-            </w:r>
-            <w:r>
-              <w:rPr>
-                <w:noProof/>
-                <w:webHidden/>
-              </w:rPr>
-            </w:r>
-            <w:r>
-              <w:rPr>
-                <w:noProof/>
-                <w:webHidden/>
-              </w:rPr>
-              <w:fldChar w:fldCharType="separate"/>
-            </w:r>
-            <w:r>
-              <w:rPr>
-                <w:noProof/>
-                <w:webHidden/>
-              </w:rPr>
-              <w:t>6</w:t>
-            </w:r>
-            <w:r>
-              <w:rPr>
-                <w:noProof/>
-                <w:webHidden/>
-              </w:rPr>
-              <w:fldChar w:fldCharType="end"/>
-            </w:r>
-          </w:hyperlink>
-        </w:p>
-        <w:p>
-          <w:pPr>
-            <w:pStyle w:val="TOC3"/>
-            <w:tabs>
-              <w:tab w:val="left" w:pos="1440"/>
-              <w:tab w:val="right" w:leader="dot" w:pos="9016"/>
-            </w:tabs>
-            <w:rPr>
-              <w:rFonts w:asciiTheme="minorHAnsi" w:hAnsiTheme="minorHAnsi"/>
-              <w:noProof/>
-            </w:rPr>
-          </w:pPr>
-          <w:hyperlink w:anchor="_Toc228807714" w:history="1">
-            <w:r>
-              <w:rPr>
-                <w:rStyle w:val="Hyperlink"/>
-                <w:b/>
-                <w:bCs/>
-                <w:noProof/>
-              </w:rPr>
-              <w:t>3.4.5.</w:t>
-            </w:r>
-            <w:r>
-              <w:rPr>
-                <w:rFonts w:asciiTheme="minorHAnsi" w:hAnsiTheme="minorHAnsi"/>
-                <w:noProof/>
-              </w:rPr>
-              <w:tab/>
-            </w:r>
-            <w:r>
-              <w:rPr>
-                <w:rStyle w:val="Hyperlink"/>
-                <w:b/>
-                <w:bCs/>
-                <w:noProof/>
-              </w:rPr>
-              <w:t>TGACN</w:t>
-            </w:r>
-            <w:r>
-              <w:rPr>
-                <w:noProof/>
-                <w:webHidden/>
-              </w:rPr>
-              <w:tab/>
-            </w:r>
-            <w:r>
-              <w:rPr>
-                <w:noProof/>
-                <w:webHidden/>
-              </w:rPr>
-              <w:fldChar w:fldCharType="begin"/>
-            </w:r>
-            <w:r>
-              <w:rPr>
-                <w:noProof/>
-                <w:webHidden/>
-              </w:rPr>
-              <w:instrText xml:space="preserve"> PAGEREF _Toc228807714 \h </w:instrText>
-            </w:r>
-            <w:r>
-              <w:rPr>
-                <w:noProof/>
-                <w:webHidden/>
-              </w:rPr>
-            </w:r>
-            <w:r>
-              <w:rPr>
-                <w:noProof/>
-                <w:webHidden/>
-              </w:rPr>
-              <w:fldChar w:fldCharType="separate"/>
-            </w:r>
-            <w:r>
-              <w:rPr>
-                <w:noProof/>
-                <w:webHidden/>
-              </w:rPr>
-              <w:t>6</w:t>
-            </w:r>
-            <w:r>
-              <w:rPr>
-                <w:noProof/>
-                <w:webHidden/>
-              </w:rPr>
-              <w:fldChar w:fldCharType="end"/>
-            </w:r>
-          </w:hyperlink>
-        </w:p>
-        <w:p>
-          <w:pPr>
-            <w:pStyle w:val="TOC3"/>
+            <w:pStyle w:val="TOC2"/>
             <w:tabs>
               <w:tab w:val="left" w:pos="960"/>
               <w:tab w:val="right" w:leader="dot" w:pos="9016"/>
@@ -2980,7 +2540,7 @@
               <w:noProof/>
             </w:rPr>
           </w:pPr>
-          <w:hyperlink w:anchor="_Toc228807715" w:history="1">
+          <w:hyperlink w:anchor="_Toc230633037" w:history="1">
             <w:r>
               <w:rPr>
                 <w:rStyle w:val="Hyperlink"/>
@@ -2988,7 +2548,7 @@
                 <w:bCs/>
                 <w:noProof/>
               </w:rPr>
-              <w:t>4.</w:t>
+              <w:t>3.5.</w:t>
             </w:r>
             <w:r>
               <w:rPr>
@@ -3004,7 +2564,7 @@
                 <w:bCs/>
                 <w:noProof/>
               </w:rPr>
-              <w:t>STEP</w:t>
+              <w:t>Baseline &amp; Comparative Models</w:t>
             </w:r>
             <w:r>
               <w:rPr>
@@ -3025,7 +2585,95 @@
                 <w:noProof/>
                 <w:webHidden/>
               </w:rPr>
-              <w:instrText xml:space="preserve"> PAGEREF _Toc228807715 \h </w:instrText>
+              <w:instrText xml:space="preserve"> PAGEREF _Toc230633037 \h </w:instrText>
+            </w:r>
+            <w:r>
+              <w:rPr>
+                <w:noProof/>
+                <w:webHidden/>
+              </w:rPr>
+            </w:r>
+            <w:r>
+              <w:rPr>
+                <w:noProof/>
+                <w:webHidden/>
+              </w:rPr>
+              <w:fldChar w:fldCharType="separate"/>
+            </w:r>
+            <w:r>
+              <w:rPr>
+                <w:noProof/>
+                <w:webHidden/>
+              </w:rPr>
+              <w:t>6</w:t>
+            </w:r>
+            <w:r>
+              <w:rPr>
+                <w:noProof/>
+                <w:webHidden/>
+              </w:rPr>
+              <w:fldChar w:fldCharType="end"/>
+            </w:r>
+          </w:hyperlink>
+        </w:p>
+        <w:p>
+          <w:pPr>
+            <w:pStyle w:val="TOC2"/>
+            <w:tabs>
+              <w:tab w:val="left" w:pos="960"/>
+              <w:tab w:val="right" w:leader="dot" w:pos="9016"/>
+            </w:tabs>
+            <w:rPr>
+              <w:rFonts w:asciiTheme="minorHAnsi" w:hAnsiTheme="minorHAnsi"/>
+              <w:noProof/>
+            </w:rPr>
+          </w:pPr>
+          <w:hyperlink w:anchor="_Toc230633038" w:history="1">
+            <w:r>
+              <w:rPr>
+                <w:rStyle w:val="Hyperlink"/>
+                <w:b/>
+                <w:bCs/>
+                <w:noProof/>
+              </w:rPr>
+              <w:t>3.6.</w:t>
+            </w:r>
+            <w:r>
+              <w:rPr>
+                <w:rFonts w:asciiTheme="minorHAnsi" w:hAnsiTheme="minorHAnsi"/>
+                <w:noProof/>
+              </w:rPr>
+              <w:tab/>
+            </w:r>
+            <w:r>
+              <w:rPr>
+                <w:rStyle w:val="Hyperlink"/>
+                <w:b/>
+                <w:bCs/>
+                <w:noProof/>
+              </w:rPr>
+              <w:t>Proposed Model</w:t>
+            </w:r>
+            <w:r>
+              <w:rPr>
+                <w:noProof/>
+                <w:webHidden/>
+              </w:rPr>
+              <w:tab/>
+            </w:r>
+            <w:r>
+              <w:rPr>
+                <w:noProof/>
+                <w:webHidden/>
+              </w:rPr>
+              <w:fldChar w:fldCharType="begin"/>
+            </w:r>
+            <w:r>
+              <w:rPr>
+                <w:noProof/>
+                <w:webHidden/>
+              </w:rPr>
+              <w:instrText xml:space="preserve"> PAGEREF _Toc230633038 \h </w:instrText>
             </w:r>
             <w:r>
               <w:rPr>
@@ -3068,7 +2716,7 @@
               <w:noProof/>
             </w:rPr>
           </w:pPr>
-          <w:hyperlink w:anchor="_Toc228807716" w:history="1">
+          <w:hyperlink w:anchor="_Toc230633039" w:history="1">
             <w:r>
               <w:rPr>
                 <w:rStyle w:val="Hyperlink"/>
@@ -3076,7 +2724,7 @@
                 <w:bCs/>
                 <w:noProof/>
               </w:rPr>
-              <w:t>5.</w:t>
+              <w:t>4.</w:t>
             </w:r>
             <w:r>
               <w:rPr>
@@ -3113,7 +2761,7 @@
                 <w:noProof/>
                 <w:webHidden/>
               </w:rPr>
-              <w:instrText xml:space="preserve"> PAGEREF _Toc228807716 \h </w:instrText>
+              <w:instrText xml:space="preserve"> PAGEREF _Toc230633039 \h </w:instrText>
             </w:r>
             <w:r>
               <w:rPr>
@@ -3133,7 +2781,7 @@
                 <w:noProof/>
                 <w:webHidden/>
               </w:rPr>
-              <w:t>6</w:t>
+              <w:t>7</w:t>
             </w:r>
             <w:r>
               <w:rPr>
@@ -3156,7 +2804,7 @@
               <w:noProof/>
             </w:rPr>
           </w:pPr>
-          <w:hyperlink w:anchor="_Toc228807717" w:history="1">
+          <w:hyperlink w:anchor="_Toc230633040" w:history="1">
             <w:r>
               <w:rPr>
                 <w:rStyle w:val="Hyperlink"/>
@@ -3164,7 +2812,7 @@
                 <w:bCs/>
                 <w:noProof/>
               </w:rPr>
-              <w:t>6.</w:t>
+              <w:t>5.</w:t>
             </w:r>
             <w:r>
               <w:rPr>
@@ -3201,7 +2849,7 @@
                 <w:noProof/>
                 <w:webHidden/>
               </w:rPr>
-              <w:instrText xml:space="preserve"> PAGEREF _Toc228807717 \h </w:instrText>
+              <w:instrText xml:space="preserve"> PAGEREF _Toc230633040 \h </w:instrText>
             </w:r>
             <w:r>
               <w:rPr>
@@ -3221,7 +2869,7 @@
                 <w:noProof/>
                 <w:webHidden/>
               </w:rPr>
-              <w:t>6</w:t>
+              <w:t>7</w:t>
             </w:r>
             <w:r>
               <w:rPr>
@@ -3260,7 +2908,7 @@
           <w:u w:val="single"/>
         </w:rPr>
       </w:pPr>
-      <w:bookmarkStart w:id="0" w:name="_Toc228807682"/>
+      <w:bookmarkStart w:id="0" w:name="_Toc230633009"/>
       <w:r>
         <w:rPr>
           <w:b/>
@@ -3288,7 +2936,7 @@
           <w:u w:val="single"/>
         </w:rPr>
       </w:pPr>
-      <w:bookmarkStart w:id="1" w:name="_Toc228807683"/>
+      <w:bookmarkStart w:id="1" w:name="_Toc230633010"/>
       <w:r>
         <w:rPr>
           <w:b/>
@@ -3603,112 +3251,112 @@
         <w:ind w:firstLine="720"/>
       </w:pPr>
       <w:r>
+        <w:t xml:space="preserve">Even thought </w:t>
+      </w:r>
+      <w:r>
+        <w:t xml:space="preserve">there were investments by the Malaysian government towards major </w:t>
+      </w:r>
+      <w:r>
+        <w:t xml:space="preserve">development in </w:t>
+      </w:r>
+      <w:r>
+        <w:t xml:space="preserve">public transportation such as the introduction of </w:t>
+      </w:r>
+      <w:r>
+        <w:t>mass rapid transit (MRT) Putrajaya</w:t>
+      </w:r>
+      <w:r>
+        <w:t xml:space="preserve">, </w:t>
+      </w:r>
+      <w:r>
+        <w:t>Shah Alam</w:t>
+      </w:r>
+      <w:r>
+        <w:t xml:space="preserve">, </w:t>
+      </w:r>
+      <w:r>
+        <w:t xml:space="preserve">and </w:t>
+      </w:r>
+      <w:r>
+        <w:t>future MRT Circle Line</w:t>
+      </w:r>
+      <w:r>
+        <w:t xml:space="preserve">, </w:t>
+      </w:r>
+      <w:r>
+        <w:t xml:space="preserve">the ridership levels </w:t>
+      </w:r>
+      <w:r>
+        <w:t>remain</w:t>
+      </w:r>
+      <w:r>
+        <w:t xml:space="preserve"> below average, mostly </w:t>
+      </w:r>
+      <w:r>
+        <w:t xml:space="preserve">affected by the </w:t>
+      </w:r>
+      <w:r>
+        <w:t>uncertainties and flaws</w:t>
+      </w:r>
+      <w:r>
+        <w:t xml:space="preserve"> in service quality</w:t>
+      </w:r>
+      <w:r>
+        <w:t xml:space="preserve"> </w:t>
+      </w:r>
+      <w:r>
+        <w:rPr>
+          <w:noProof/>
+        </w:rPr>
+        <w:t>(Amir et al., 2025)</w:t>
+      </w:r>
+      <w:r>
+        <w:t>.</w:t>
+      </w:r>
+      <w:r>
+        <w:t xml:space="preserve"> </w:t>
+      </w:r>
+      <w:r>
+        <w:t>As cited by</w:t>
+      </w:r>
+      <w:r>
+        <w:rPr>
+          <w:noProof/>
+        </w:rPr>
+        <w:t xml:space="preserve"> Mee et al., (2022), </w:t>
+      </w:r>
+      <w:r>
+        <w:rPr>
+          <w:noProof/>
+        </w:rPr>
+        <w:t xml:space="preserve">both studies </w:t>
+      </w:r>
+      <w:r>
+        <w:rPr>
+          <w:noProof/>
+        </w:rPr>
+        <w:t xml:space="preserve">from </w:t>
+      </w:r>
+      <w:r>
+        <w:t xml:space="preserve">Shen, Xiao &amp; Wang (2016) and </w:t>
+      </w:r>
+      <w:r>
+        <w:t>Borhan et al. (2019)</w:t>
+      </w:r>
+      <w:r>
+        <w:t xml:space="preserve"> agreed that prolonged travel times, untimely delays, and limited accessibility</w:t>
+      </w:r>
+      <w:r>
+        <w:t xml:space="preserve"> </w:t>
+      </w:r>
+      <w:r>
+        <w:t xml:space="preserve">are </w:t>
+      </w:r>
+      <w:r>
+        <w:t xml:space="preserve">frequently </w:t>
+      </w:r>
+      <w:r>
         <w:lastRenderedPageBreak/>
-        <w:t xml:space="preserve">Even thought </w:t>
-      </w:r>
-      <w:r>
-        <w:t xml:space="preserve">there were investments by the Malaysian government towards major </w:t>
-      </w:r>
-      <w:r>
-        <w:t xml:space="preserve">development in </w:t>
-      </w:r>
-      <w:r>
-        <w:t xml:space="preserve">public transportation such as the introduction of </w:t>
-      </w:r>
-      <w:r>
-        <w:t>mass rapid transit (MRT) Putrajaya</w:t>
-      </w:r>
-      <w:r>
-        <w:t xml:space="preserve">, </w:t>
-      </w:r>
-      <w:r>
-        <w:t>Shah Alam</w:t>
-      </w:r>
-      <w:r>
-        <w:t xml:space="preserve">, </w:t>
-      </w:r>
-      <w:r>
-        <w:t xml:space="preserve">and </w:t>
-      </w:r>
-      <w:r>
-        <w:t>future MRT Circle Line</w:t>
-      </w:r>
-      <w:r>
-        <w:t xml:space="preserve">, </w:t>
-      </w:r>
-      <w:r>
-        <w:t xml:space="preserve">the ridership levels </w:t>
-      </w:r>
-      <w:r>
-        <w:t>remain</w:t>
-      </w:r>
-      <w:r>
-        <w:t xml:space="preserve"> below average, mostly </w:t>
-      </w:r>
-      <w:r>
-        <w:t xml:space="preserve">affected by the </w:t>
-      </w:r>
-      <w:r>
-        <w:t>uncertainties and flaws</w:t>
-      </w:r>
-      <w:r>
-        <w:t xml:space="preserve"> in service quality</w:t>
-      </w:r>
-      <w:r>
-        <w:t xml:space="preserve"> </w:t>
-      </w:r>
-      <w:r>
-        <w:rPr>
-          <w:noProof/>
-        </w:rPr>
-        <w:t>(Amir et al., 2025)</w:t>
-      </w:r>
-      <w:r>
-        <w:t>.</w:t>
-      </w:r>
-      <w:r>
-        <w:t xml:space="preserve"> </w:t>
-      </w:r>
-      <w:r>
-        <w:t>As cited by</w:t>
-      </w:r>
-      <w:r>
-        <w:rPr>
-          <w:noProof/>
-        </w:rPr>
-        <w:t xml:space="preserve"> Mee et al., (2022), </w:t>
-      </w:r>
-      <w:r>
-        <w:rPr>
-          <w:noProof/>
-        </w:rPr>
-        <w:t xml:space="preserve">both studies </w:t>
-      </w:r>
-      <w:r>
-        <w:rPr>
-          <w:noProof/>
-        </w:rPr>
-        <w:t xml:space="preserve">from </w:t>
-      </w:r>
-      <w:r>
-        <w:t xml:space="preserve">Shen, Xiao &amp; Wang (2016) and </w:t>
-      </w:r>
-      <w:r>
-        <w:t>Borhan et al. (2019)</w:t>
-      </w:r>
-      <w:r>
-        <w:t xml:space="preserve"> agreed that prolonged travel times, untimely delays, and limited accessibility</w:t>
-      </w:r>
-      <w:r>
-        <w:t xml:space="preserve"> </w:t>
-      </w:r>
-      <w:r>
-        <w:t xml:space="preserve">are </w:t>
-      </w:r>
-      <w:r>
-        <w:t xml:space="preserve">frequently </w:t>
-      </w:r>
-      <w:r>
         <w:t>highlighted as</w:t>
       </w:r>
       <w:r>
@@ -3813,11 +3461,19 @@
         <w:t>ith intricate</w:t>
       </w:r>
       <w:r>
-        <w:t xml:space="preserve"> spatio-temporal interconnections</w:t>
-      </w:r>
-      <w:r>
         <w:t xml:space="preserve"> </w:t>
       </w:r>
+      <w:proofErr w:type="spellStart"/>
+      <w:r>
+        <w:t>spatio</w:t>
+      </w:r>
+      <w:proofErr w:type="spellEnd"/>
+      <w:r>
+        <w:t>-temporal interconnections</w:t>
+      </w:r>
+      <w:r>
+        <w:t xml:space="preserve"> </w:t>
+      </w:r>
       <w:r>
         <w:t>within</w:t>
       </w:r>
@@ -3837,7 +3493,15 @@
         <w:t xml:space="preserve"> </w:t>
       </w:r>
       <w:r>
-        <w:t xml:space="preserve">Unlike traditional models like AutoRegressive Integrated Moving Average (ARIMA), </w:t>
+        <w:t xml:space="preserve">Unlike traditional models like </w:t>
+      </w:r>
+      <w:proofErr w:type="spellStart"/>
+      <w:r>
+        <w:t>AutoRegressive</w:t>
+      </w:r>
+      <w:proofErr w:type="spellEnd"/>
+      <w:r>
+        <w:t xml:space="preserve"> Integrated Moving Average (ARIMA), </w:t>
       </w:r>
       <w:r>
         <w:t>DL</w:t>
@@ -3948,7 +3612,15 @@
         <w:t xml:space="preserve"> and consistent</w:t>
       </w:r>
       <w:r>
-        <w:t xml:space="preserve"> ridership predictions with complex spatio-temporal data</w:t>
+        <w:t xml:space="preserve"> ridership predictions with complex </w:t>
+      </w:r>
+      <w:proofErr w:type="spellStart"/>
+      <w:r>
+        <w:t>spatio</w:t>
+      </w:r>
+      <w:proofErr w:type="spellEnd"/>
+      <w:r>
+        <w:t>-temporal data</w:t>
       </w:r>
       <w:r>
         <w:t>.</w:t>
@@ -3969,7 +3641,7 @@
           <w:u w:val="single"/>
         </w:rPr>
       </w:pPr>
-      <w:bookmarkStart w:id="2" w:name="_Toc228807684"/>
+      <w:bookmarkStart w:id="2" w:name="_Toc230633011"/>
       <w:r>
         <w:rPr>
           <w:b/>
@@ -4011,19 +3683,47 @@
         <w:rPr>
           <w:lang w:val="en-US"/>
         </w:rPr>
-        <w:t>Consequently, transit authorities face a critical bottleneck in optimizing schedules, routes, and intervals amid peak hours and holidays, thus increasing the unreliability of Malaysia’s public transit and dissatisfaction among passengers. To solve this problem, it requires a dual approach: (1) identify specific spatio-temporal factors that heavily influence the ridership trend in Malaysia’s public transit; (2) develop a robust predictive model capable of accurately</w:t>
-      </w:r>
+        <w:t xml:space="preserve">Consequently, transit authorities face a critical bottleneck in optimizing schedules, routes, and intervals amid peak hours and holidays, thus increasing the unreliability of Malaysia’s public transit and dissatisfaction among passengers. To solve this problem, it requires a dual approach: (1) identify specific </w:t>
+      </w:r>
+      <w:proofErr w:type="spellStart"/>
       <w:r>
         <w:rPr>
           <w:lang w:val="en-US"/>
         </w:rPr>
+        <w:t>spatio</w:t>
+      </w:r>
+      <w:proofErr w:type="spellEnd"/>
+      <w:r>
+        <w:rPr>
+          <w:lang w:val="en-US"/>
+        </w:rPr>
+        <w:t>-temporal factors that heavily influence the ridership trend in Malaysia’s public transit; (2) develop a robust predictive model capable of accurately</w:t>
+      </w:r>
+      <w:r>
+        <w:rPr>
+          <w:lang w:val="en-US"/>
+        </w:rPr>
         <w:t xml:space="preserve"> and consistently</w:t>
       </w:r>
       <w:r>
         <w:rPr>
           <w:lang w:val="en-US"/>
         </w:rPr>
-        <w:t xml:space="preserve"> forecasting daily ridership trends based on these identified spatio-temporal features.</w:t>
+        <w:t xml:space="preserve"> forecasting daily ridership trends based on these identified </w:t>
+      </w:r>
+      <w:proofErr w:type="spellStart"/>
+      <w:r>
+        <w:rPr>
+          <w:lang w:val="en-US"/>
+        </w:rPr>
+        <w:t>spatio</w:t>
+      </w:r>
+      <w:proofErr w:type="spellEnd"/>
+      <w:r>
+        <w:rPr>
+          <w:lang w:val="en-US"/>
+        </w:rPr>
+        <w:t>-temporal features.</w:t>
       </w:r>
     </w:p>
     <w:p>
@@ -4037,7 +3737,6 @@
         <w:rPr>
           <w:lang w:val="en-US"/>
         </w:rPr>
-        <w:lastRenderedPageBreak/>
         <w:t>However, the presence of extreme data anomalies in historical ridership data presented a confounding scenario, which is the enforcement of Movement Control Order (MCO) in Malaysia from 18</w:t>
       </w:r>
       <w:r>
@@ -4082,7 +3781,14 @@
         <w:rPr>
           <w:noProof/>
         </w:rPr>
-        <w:t>Zhao &amp; Lan (2025), they suggests that training AI models on such extreme outlier data can cause significant predictive bias, as these kind of events like Covid-19 pandemic outbreak do not represent daily, mundane urban mobility behaviour.</w:t>
+        <w:t xml:space="preserve">Zhao &amp; Lan (2025), they suggests </w:t>
+      </w:r>
+      <w:r>
+        <w:rPr>
+          <w:noProof/>
+        </w:rPr>
+        <w:lastRenderedPageBreak/>
+        <w:t>that training AI models on such extreme outlier data can cause significant predictive bias, as these kind of events like Covid-19 pandemic outbreak do not represent daily, mundane urban mobility behaviour.</w:t>
       </w:r>
       <w:r>
         <w:rPr>
@@ -4154,7 +3860,7 @@
           <w:u w:val="single"/>
         </w:rPr>
       </w:pPr>
-      <w:bookmarkStart w:id="3" w:name="_Toc228807685"/>
+      <w:bookmarkStart w:id="3" w:name="_Toc230633012"/>
       <w:r>
         <w:rPr>
           <w:b/>
@@ -4239,7 +3945,15 @@
         <w:t>How do</w:t>
       </w:r>
       <w:r>
-        <w:t xml:space="preserve"> spatio-temporal</w:t>
+        <w:t xml:space="preserve"> </w:t>
+      </w:r>
+      <w:proofErr w:type="spellStart"/>
+      <w:r>
+        <w:t>spatio</w:t>
+      </w:r>
+      <w:proofErr w:type="spellEnd"/>
+      <w:r>
+        <w:t>-temporal</w:t>
       </w:r>
       <w:r>
         <w:t>-based, graph-based and attention-based</w:t>
@@ -4329,7 +4043,7 @@
           <w:u w:val="single"/>
         </w:rPr>
       </w:pPr>
-      <w:bookmarkStart w:id="4" w:name="_Toc228807686"/>
+      <w:bookmarkStart w:id="4" w:name="_Toc230633013"/>
       <w:r>
         <w:rPr>
           <w:b/>
@@ -4366,7 +4080,13 @@
         <w:t xml:space="preserve">To </w:t>
       </w:r>
       <w:r>
-        <w:t>identify a single</w:t>
+        <w:t>identify</w:t>
+      </w:r>
+      <w:r>
+        <w:t xml:space="preserve"> and propose</w:t>
+      </w:r>
+      <w:r>
+        <w:t xml:space="preserve"> a single</w:t>
       </w:r>
       <w:r>
         <w:t xml:space="preserve">, </w:t>
@@ -4447,7 +4167,15 @@
         </w:numPr>
       </w:pPr>
       <w:r>
-        <w:t>To evaluate and benchmark the performance of spatio-temporal</w:t>
+        <w:t xml:space="preserve">To evaluate and benchmark the performance of </w:t>
+      </w:r>
+      <w:proofErr w:type="spellStart"/>
+      <w:r>
+        <w:t>spatio</w:t>
+      </w:r>
+      <w:proofErr w:type="spellEnd"/>
+      <w:r>
+        <w:t>-temporal</w:t>
       </w:r>
       <w:r>
         <w:t xml:space="preserve">-based, graph-based and attention-based </w:t>
@@ -4474,6 +4202,11 @@
         <w:t>.</w:t>
       </w:r>
     </w:p>
+    <w:p/>
+    <w:p/>
+    <w:p/>
+    <w:p/>
+    <w:p/>
     <w:p>
       <w:pPr>
         <w:pStyle w:val="Heading2"/>
@@ -4489,7 +4222,7 @@
           <w:u w:val="single"/>
         </w:rPr>
       </w:pPr>
-      <w:bookmarkStart w:id="5" w:name="_Toc228807687"/>
+      <w:bookmarkStart w:id="5" w:name="_Toc230633014"/>
       <w:r>
         <w:rPr>
           <w:b/>
@@ -4498,6 +4231,7 @@
           <w:szCs w:val="24"/>
           <w:u w:val="single"/>
         </w:rPr>
+        <w:lastRenderedPageBreak/>
         <w:t>Research Scope</w:t>
       </w:r>
       <w:bookmarkEnd w:id="5"/>
@@ -4574,7 +4308,6 @@
               <w:jc w:val="left"/>
             </w:pPr>
             <w:r>
-              <w:lastRenderedPageBreak/>
               <w:t>Models Compared</w:t>
             </w:r>
           </w:p>
@@ -4586,8 +4319,16 @@
           <w:p>
             <w:pPr>
               <w:jc w:val="left"/>
+              <w:rPr>
+                <w:b/>
+                <w:bCs/>
+              </w:rPr>
             </w:pPr>
             <w:r>
+              <w:rPr>
+                <w:b/>
+                <w:bCs/>
+              </w:rPr>
               <w:t xml:space="preserve">Baseline </w:t>
             </w:r>
           </w:p>
@@ -4634,8 +4375,16 @@
           <w:p>
             <w:pPr>
               <w:jc w:val="left"/>
+              <w:rPr>
+                <w:b/>
+                <w:bCs/>
+              </w:rPr>
             </w:pPr>
             <w:r>
+              <w:rPr>
+                <w:b/>
+                <w:bCs/>
+              </w:rPr>
               <w:t>Spatio-temporal</w:t>
             </w:r>
           </w:p>
@@ -4648,6 +4397,52 @@
             <w:pPr>
               <w:jc w:val="left"/>
             </w:pPr>
+            <w:r>
+              <w:t>Bidirectional LSTM (</w:t>
+            </w:r>
+            <w:r>
+              <w:rPr>
+                <w:b/>
+                <w:bCs/>
+              </w:rPr>
+              <w:t>BiLSTM</w:t>
+            </w:r>
+            <w:r>
+              <w:t>); Spatio-Temporal LSTM (</w:t>
+            </w:r>
+            <w:r>
+              <w:rPr>
+                <w:b/>
+                <w:bCs/>
+              </w:rPr>
+              <w:t>ST-LSTM</w:t>
+            </w:r>
+            <w:r>
+              <w:t xml:space="preserve">); </w:t>
+            </w:r>
+            <w:r>
+              <w:t>Convolutional Neural Networ</w:t>
+            </w:r>
+            <w:r>
+              <w:t>k LSTM (</w:t>
+            </w:r>
+            <w:r>
+              <w:rPr>
+                <w:b/>
+                <w:bCs/>
+              </w:rPr>
+              <w:t>CNN-LSTM</w:t>
+            </w:r>
+            <w:r>
+              <w:t xml:space="preserve">) - Sequential/Parallel/Augmented; </w:t>
+            </w:r>
+            <w:r>
+              <w:rPr>
+                <w:b/>
+                <w:bCs/>
+              </w:rPr>
+              <w:t>CNN-BiLSTM</w:t>
+            </w:r>
           </w:p>
         </w:tc>
       </w:tr>
@@ -4671,8 +4466,16 @@
           <w:p>
             <w:pPr>
               <w:jc w:val="left"/>
+              <w:rPr>
+                <w:b/>
+                <w:bCs/>
+              </w:rPr>
             </w:pPr>
             <w:r>
+              <w:rPr>
+                <w:b/>
+                <w:bCs/>
+              </w:rPr>
               <w:t>Graph</w:t>
             </w:r>
           </w:p>
@@ -4685,6 +4488,96 @@
             <w:pPr>
               <w:jc w:val="left"/>
             </w:pPr>
+            <w:r>
+              <w:t>Spatio-Temporal Graph Convolutional Network</w:t>
+            </w:r>
+            <w:r>
+              <w:t xml:space="preserve"> (</w:t>
+            </w:r>
+            <w:r>
+              <w:rPr>
+                <w:b/>
+                <w:bCs/>
+              </w:rPr>
+              <w:t>STGCN</w:t>
+            </w:r>
+            <w:r>
+              <w:t xml:space="preserve">); </w:t>
+            </w:r>
+            <w:r>
+              <w:t>Spatial-Temporal Synchronous Graph Convolutional Network</w:t>
+            </w:r>
+            <w:r>
+              <w:t xml:space="preserve"> (</w:t>
+            </w:r>
+            <w:r>
+              <w:rPr>
+                <w:b/>
+                <w:bCs/>
+              </w:rPr>
+              <w:t>STSGCN</w:t>
+            </w:r>
+            <w:r>
+              <w:t xml:space="preserve">); </w:t>
+            </w:r>
+            <w:r>
+              <w:t>Spatial-Temporal Fusion Graph Neural Network</w:t>
+            </w:r>
+            <w:r>
+              <w:t xml:space="preserve"> (</w:t>
+            </w:r>
+            <w:r>
+              <w:rPr>
+                <w:b/>
+                <w:bCs/>
+              </w:rPr>
+              <w:t>STFGNN</w:t>
+            </w:r>
+            <w:r>
+              <w:t xml:space="preserve">); </w:t>
+            </w:r>
+            <w:r>
+              <w:t>Multi-Scale Temporal Graph Neural Network</w:t>
+            </w:r>
+            <w:r>
+              <w:t xml:space="preserve"> (</w:t>
+            </w:r>
+            <w:r>
+              <w:rPr>
+                <w:b/>
+                <w:bCs/>
+              </w:rPr>
+              <w:t>MTGNN</w:t>
+            </w:r>
+            <w:r>
+              <w:t xml:space="preserve">); </w:t>
+            </w:r>
+            <w:r>
+              <w:t>Periodicity-Aware Dynamic Relational</w:t>
+            </w:r>
+            <w:r>
+              <w:t xml:space="preserve"> (</w:t>
+            </w:r>
+            <w:r>
+              <w:rPr>
+                <w:b/>
+                <w:bCs/>
+              </w:rPr>
+              <w:t>PDR</w:t>
+            </w:r>
+            <w:r>
+              <w:t>)</w:t>
+            </w:r>
+            <w:r>
+              <w:t>-</w:t>
+            </w:r>
+            <w:r>
+              <w:rPr>
+                <w:b/>
+                <w:bCs/>
+              </w:rPr>
+              <w:t>STGCN</w:t>
+            </w:r>
           </w:p>
         </w:tc>
       </w:tr>
@@ -4708,8 +4601,16 @@
           <w:p>
             <w:pPr>
               <w:jc w:val="left"/>
+              <w:rPr>
+                <w:b/>
+                <w:bCs/>
+              </w:rPr>
             </w:pPr>
             <w:r>
+              <w:rPr>
+                <w:b/>
+                <w:bCs/>
+              </w:rPr>
               <w:t>Attention</w:t>
             </w:r>
           </w:p>
@@ -4722,6 +4623,97 @@
             <w:pPr>
               <w:jc w:val="left"/>
             </w:pPr>
+            <w:r>
+              <w:t>ASTGCN</w:t>
+            </w:r>
+          </w:p>
+          <w:p>
+            <w:pPr>
+              <w:jc w:val="left"/>
+            </w:pPr>
+            <w:r>
+              <w:t>TPA-LSTM</w:t>
+            </w:r>
+          </w:p>
+          <w:p>
+            <w:pPr>
+              <w:jc w:val="left"/>
+            </w:pPr>
+            <w:r>
+              <w:t>TFT</w:t>
+            </w:r>
+          </w:p>
+          <w:p>
+            <w:pPr>
+              <w:jc w:val="left"/>
+            </w:pPr>
+            <w:proofErr w:type="spellStart"/>
+            <w:r>
+              <w:t>Autoformer</w:t>
+            </w:r>
+            <w:proofErr w:type="spellEnd"/>
+          </w:p>
+          <w:p>
+            <w:pPr>
+              <w:jc w:val="left"/>
+            </w:pPr>
+            <w:r>
+              <w:t>Informer</w:t>
+            </w:r>
+          </w:p>
+        </w:tc>
+      </w:tr>
+      <w:tr>
+        <w:tc>
+          <w:tcPr>
+            <w:tcW w:w="1696" w:type="dxa"/>
+            <w:vMerge/>
+            <w:shd w:val="clear" w:color="auto" w:fill="F2F2F2" w:themeFill="background1" w:themeFillShade="F2"/>
+          </w:tcPr>
+          <w:p>
+            <w:pPr>
+              <w:jc w:val="left"/>
+            </w:pPr>
+          </w:p>
+        </w:tc>
+        <w:tc>
+          <w:tcPr>
+            <w:tcW w:w="1276" w:type="dxa"/>
+          </w:tcPr>
+          <w:p>
+            <w:pPr>
+              <w:jc w:val="left"/>
+              <w:rPr>
+                <w:b/>
+                <w:bCs/>
+              </w:rPr>
+            </w:pPr>
+            <w:r>
+              <w:rPr>
+                <w:b/>
+                <w:bCs/>
+              </w:rPr>
+              <w:t>Proposed</w:t>
+            </w:r>
+          </w:p>
+        </w:tc>
+        <w:tc>
+          <w:tcPr>
+            <w:tcW w:w="6044" w:type="dxa"/>
+          </w:tcPr>
+          <w:p>
+            <w:pPr>
+              <w:jc w:val="left"/>
+            </w:pPr>
+            <w:r>
+              <w:t>Hybrid Multi-scale Temporal Spatio-Feature</w:t>
+            </w:r>
+            <w:r>
+              <w:t xml:space="preserve"> (HMT-TSF) </w:t>
+            </w:r>
+            <w:r>
+              <w:t>Forecaster</w:t>
+            </w:r>
           </w:p>
         </w:tc>
       </w:tr>
@@ -5044,7 +5036,7 @@
           <w:u w:val="single"/>
         </w:rPr>
       </w:pPr>
-      <w:bookmarkStart w:id="6" w:name="_Toc228807688"/>
+      <w:bookmarkStart w:id="6" w:name="_Toc230633015"/>
       <w:r>
         <w:rPr>
           <w:b/>
@@ -5073,7 +5065,7 @@
           <w:u w:val="single"/>
         </w:rPr>
       </w:pPr>
-      <w:bookmarkStart w:id="7" w:name="_Toc228807689"/>
+      <w:bookmarkStart w:id="7" w:name="_Toc230633016"/>
       <w:r>
         <w:rPr>
           <w:b/>
@@ -5101,7 +5093,7 @@
           <w:u w:val="single"/>
         </w:rPr>
       </w:pPr>
-      <w:bookmarkStart w:id="8" w:name="_Toc228807690"/>
+      <w:bookmarkStart w:id="8" w:name="_Toc230633017"/>
       <w:r>
         <w:rPr>
           <w:b/>
@@ -5129,7 +5121,7 @@
           <w:u w:val="single"/>
         </w:rPr>
       </w:pPr>
-      <w:bookmarkStart w:id="9" w:name="_Toc228807691"/>
+      <w:bookmarkStart w:id="9" w:name="_Toc230633018"/>
       <w:r>
         <w:rPr>
           <w:b/>
@@ -5157,7 +5149,7 @@
           <w:u w:val="single"/>
         </w:rPr>
       </w:pPr>
-      <w:bookmarkStart w:id="10" w:name="_Toc228807692"/>
+      <w:bookmarkStart w:id="10" w:name="_Toc230633019"/>
       <w:r>
         <w:rPr>
           <w:b/>
@@ -5185,7 +5177,7 @@
           <w:u w:val="single"/>
         </w:rPr>
       </w:pPr>
-      <w:bookmarkStart w:id="11" w:name="_Toc228807693"/>
+      <w:bookmarkStart w:id="11" w:name="_Toc230633020"/>
       <w:r>
         <w:rPr>
           <w:b/>
@@ -5213,7 +5205,7 @@
           <w:u w:val="single"/>
         </w:rPr>
       </w:pPr>
-      <w:bookmarkStart w:id="12" w:name="_Toc228807694"/>
+      <w:bookmarkStart w:id="12" w:name="_Toc230633021"/>
       <w:r>
         <w:rPr>
           <w:b/>
@@ -5241,7 +5233,7 @@
           <w:u w:val="single"/>
         </w:rPr>
       </w:pPr>
-      <w:bookmarkStart w:id="13" w:name="_Toc228807695"/>
+      <w:bookmarkStart w:id="13" w:name="_Toc230633022"/>
       <w:r>
         <w:rPr>
           <w:b/>
@@ -5269,7 +5261,7 @@
           <w:u w:val="single"/>
         </w:rPr>
       </w:pPr>
-      <w:bookmarkStart w:id="14" w:name="_Toc228807696"/>
+      <w:bookmarkStart w:id="14" w:name="_Toc230633023"/>
       <w:r>
         <w:rPr>
           <w:b/>
@@ -5297,7 +5289,7 @@
           <w:u w:val="single"/>
         </w:rPr>
       </w:pPr>
-      <w:bookmarkStart w:id="15" w:name="_Toc228807697"/>
+      <w:bookmarkStart w:id="15" w:name="_Toc230633024"/>
       <w:r>
         <w:rPr>
           <w:b/>
@@ -5325,7 +5317,7 @@
           <w:u w:val="single"/>
         </w:rPr>
       </w:pPr>
-      <w:bookmarkStart w:id="16" w:name="_Toc228807698"/>
+      <w:bookmarkStart w:id="16" w:name="_Toc230633025"/>
       <w:r>
         <w:rPr>
           <w:b/>
@@ -5353,7 +5345,7 @@
           <w:u w:val="single"/>
         </w:rPr>
       </w:pPr>
-      <w:bookmarkStart w:id="17" w:name="_Toc228807699"/>
+      <w:bookmarkStart w:id="17" w:name="_Toc230633026"/>
       <w:r>
         <w:rPr>
           <w:b/>
@@ -5381,7 +5373,7 @@
           <w:u w:val="single"/>
         </w:rPr>
       </w:pPr>
-      <w:bookmarkStart w:id="18" w:name="_Toc228807700"/>
+      <w:bookmarkStart w:id="18" w:name="_Toc230633027"/>
       <w:r>
         <w:rPr>
           <w:b/>
@@ -5409,7 +5401,7 @@
           <w:u w:val="single"/>
         </w:rPr>
       </w:pPr>
-      <w:bookmarkStart w:id="19" w:name="_Toc228807701"/>
+      <w:bookmarkStart w:id="19" w:name="_Toc230633028"/>
       <w:r>
         <w:rPr>
           <w:b/>
@@ -5447,7 +5439,7 @@
           <w:u w:val="single"/>
         </w:rPr>
       </w:pPr>
-      <w:bookmarkStart w:id="20" w:name="_Toc228807702"/>
+      <w:bookmarkStart w:id="20" w:name="_Toc230633029"/>
       <w:r>
         <w:rPr>
           <w:b/>
@@ -5475,7 +5467,7 @@
           <w:u w:val="single"/>
         </w:rPr>
       </w:pPr>
-      <w:bookmarkStart w:id="21" w:name="_Toc228807703"/>
+      <w:bookmarkStart w:id="21" w:name="_Toc230633030"/>
       <w:r>
         <w:rPr>
           <w:b/>
@@ -5503,7 +5495,7 @@
           <w:u w:val="single"/>
         </w:rPr>
       </w:pPr>
-      <w:bookmarkStart w:id="22" w:name="_Toc228807704"/>
+      <w:bookmarkStart w:id="22" w:name="_Toc230633031"/>
       <w:r>
         <w:rPr>
           <w:b/>
@@ -5532,7 +5524,7 @@
           <w:u w:val="single"/>
         </w:rPr>
       </w:pPr>
-      <w:bookmarkStart w:id="23" w:name="_Toc228807705"/>
+      <w:bookmarkStart w:id="23" w:name="_Toc230633032"/>
       <w:r>
         <w:rPr>
           <w:b/>
@@ -5560,7 +5552,7 @@
           <w:u w:val="single"/>
         </w:rPr>
       </w:pPr>
-      <w:bookmarkStart w:id="24" w:name="_Toc228807706"/>
+      <w:bookmarkStart w:id="24" w:name="_Toc230633033"/>
       <w:r>
         <w:rPr>
           <w:b/>
@@ -5588,7 +5580,7 @@
           <w:u w:val="single"/>
         </w:rPr>
       </w:pPr>
-      <w:bookmarkStart w:id="25" w:name="_Toc228807707"/>
+      <w:bookmarkStart w:id="25" w:name="_Toc230633034"/>
       <w:r>
         <w:rPr>
           <w:b/>
@@ -5616,6 +5608,7 @@
           <w:u w:val="single"/>
         </w:rPr>
       </w:pPr>
+      <w:bookmarkStart w:id="26" w:name="_Toc230633035"/>
       <w:r>
         <w:rPr>
           <w:b/>
@@ -5626,6 +5619,7 @@
         </w:rPr>
         <w:t>Feature Engineering</w:t>
       </w:r>
+      <w:bookmarkEnd w:id="26"/>
     </w:p>
     <w:p>
       <w:pPr>
@@ -5642,7 +5636,7 @@
           <w:u w:val="single"/>
         </w:rPr>
       </w:pPr>
-      <w:bookmarkStart w:id="26" w:name="_Toc228807708"/>
+      <w:bookmarkStart w:id="27" w:name="_Toc230633036"/>
       <w:r>
         <w:rPr>
           <w:b/>
@@ -5653,7 +5647,7 @@
         </w:rPr>
         <w:t>Explanatory Data Analysis</w:t>
       </w:r>
-      <w:bookmarkEnd w:id="26"/>
+      <w:bookmarkEnd w:id="27"/>
     </w:p>
     <w:p>
       <w:pPr>
@@ -5670,7 +5664,7 @@
           <w:u w:val="single"/>
         </w:rPr>
       </w:pPr>
-      <w:bookmarkStart w:id="27" w:name="_Toc228807709"/>
+      <w:bookmarkStart w:id="28" w:name="_Toc230633037"/>
       <w:r>
         <w:rPr>
           <w:b/>
@@ -5681,7 +5675,7 @@
         </w:rPr>
         <w:t>Baseline &amp; Comparative Models</w:t>
       </w:r>
-      <w:bookmarkEnd w:id="27"/>
+      <w:bookmarkEnd w:id="28"/>
     </w:p>
     <w:p>
       <w:pPr>
@@ -5698,6 +5692,7 @@
           <w:u w:val="single"/>
         </w:rPr>
       </w:pPr>
+      <w:bookmarkStart w:id="29" w:name="_Toc230633038"/>
       <w:r>
         <w:rPr>
           <w:b/>
@@ -5708,6 +5703,7 @@
         </w:rPr>
         <w:t>Proposed Model</w:t>
       </w:r>
+      <w:bookmarkEnd w:id="29"/>
     </w:p>
     <w:p/>
     <w:p>
@@ -5726,7 +5722,7 @@
           <w:u w:val="single"/>
         </w:rPr>
       </w:pPr>
-      <w:bookmarkStart w:id="28" w:name="_Toc228807716"/>
+      <w:bookmarkStart w:id="30" w:name="_Toc230633039"/>
       <w:r>
         <w:rPr>
           <w:b/>
@@ -5737,7 +5733,7 @@
         </w:rPr>
         <w:t>Expected Outcomes</w:t>
       </w:r>
-      <w:bookmarkEnd w:id="28"/>
+      <w:bookmarkEnd w:id="30"/>
     </w:p>
     <w:p>
       <w:pPr>
@@ -5755,7 +5751,7 @@
           <w:u w:val="single"/>
         </w:rPr>
       </w:pPr>
-      <w:bookmarkStart w:id="29" w:name="_Toc228807717"/>
+      <w:bookmarkStart w:id="31" w:name="_Toc230633040"/>
       <w:r>
         <w:rPr>
           <w:b/>
@@ -5766,7 +5762,7 @@
         </w:rPr>
         <w:t>References</w:t>
       </w:r>
-      <w:bookmarkEnd w:id="29"/>
+      <w:bookmarkEnd w:id="31"/>
     </w:p>
     <w:p>
       <w:pPr>
@@ -5879,6 +5875,95 @@
     </w:lvl>
   </w:abstractNum>
   <w:abstractNum w:abstractNumId="1" w15:restartNumberingAfterBreak="0">
+    <w:nsid w:val="07644860"/>
+    <w:multiLevelType w:val="hybridMultilevel"/>
+    <w:tmpl w:val="C9A0BDD8"/>
+    <w:lvl w:ilvl="0" w:tplc="4409000F">
+      <w:start w:val="1"/>
+      <w:numFmt w:val="decimal"/>
+      <w:lvlText w:val="%1."/>
+      <w:lvlJc w:val="left"/>
+      <w:pPr>
+        <w:ind w:left="720" w:hanging="360"/>
+      </w:pPr>
+      <w:rPr>
+        <w:rFonts w:hint="default"/>
+      </w:rPr>
+    </w:lvl>
+    <w:lvl w:ilvl="1" w:tplc="44090019" w:tentative="1">
+      <w:start w:val="1"/>
+      <w:numFmt w:val="lowerLetter"/>
+      <w:lvlText w:val="%2."/>
+      <w:lvlJc w:val="left"/>
+      <w:pPr>
+        <w:ind w:left="1440" w:hanging="360"/>
+      </w:pPr>
+    </w:lvl>
+    <w:lvl w:ilvl="2" w:tplc="4409001B" w:tentative="1">
+      <w:start w:val="1"/>
+      <w:numFmt w:val="lowerRoman"/>
+      <w:lvlText w:val="%3."/>
+      <w:lvlJc w:val="right"/>
+      <w:pPr>
+        <w:ind w:left="2160" w:hanging="180"/>
+      </w:pPr>
+    </w:lvl>
+    <w:lvl w:ilvl="3" w:tplc="4409000F" w:tentative="1">
+      <w:start w:val="1"/>
+      <w:numFmt w:val="decimal"/>
+      <w:lvlText w:val="%4."/>
+      <w:lvlJc w:val="left"/>
+      <w:pPr>
+        <w:ind w:left="2880" w:hanging="360"/>
+      </w:pPr>
+    </w:lvl>
+    <w:lvl w:ilvl="4" w:tplc="44090019" w:tentative="1">
+      <w:start w:val="1"/>
+      <w:numFmt w:val="lowerLetter"/>
+      <w:lvlText w:val="%5."/>
+      <w:lvlJc w:val="left"/>
+      <w:pPr>
+        <w:ind w:left="3600" w:hanging="360"/>
+      </w:pPr>
+    </w:lvl>
+    <w:lvl w:ilvl="5" w:tplc="4409001B" w:tentative="1">
+      <w:start w:val="1"/>
+      <w:numFmt w:val="lowerRoman"/>
+      <w:lvlText w:val="%6."/>
+      <w:lvlJc w:val="right"/>
+      <w:pPr>
+        <w:ind w:left="4320" w:hanging="180"/>
+      </w:pPr>
+    </w:lvl>
+    <w:lvl w:ilvl="6" w:tplc="4409000F" w:tentative="1">
+      <w:start w:val="1"/>
+      <w:numFmt w:val="decimal"/>
+      <w:lvlText w:val="%7."/>
+      <w:lvlJc w:val="left"/>
+      <w:pPr>
+        <w:ind w:left="5040" w:hanging="360"/>
+      </w:pPr>
+    </w:lvl>
+    <w:lvl w:ilvl="7" w:tplc="44090019" w:tentative="1">
+      <w:start w:val="1"/>
+      <w:numFmt w:val="lowerLetter"/>
+      <w:lvlText w:val="%8."/>
+      <w:lvlJc w:val="left"/>
+      <w:pPr>
+        <w:ind w:left="5760" w:hanging="360"/>
+      </w:pPr>
+    </w:lvl>
+    <w:lvl w:ilvl="8" w:tplc="4409001B" w:tentative="1">
+      <w:start w:val="1"/>
+      <w:numFmt w:val="lowerRoman"/>
+      <w:lvlText w:val="%9."/>
+      <w:lvlJc w:val="right"/>
+      <w:pPr>
+        <w:ind w:left="6480" w:hanging="180"/>
+      </w:pPr>
+    </w:lvl>
+  </w:abstractNum>
+  <w:abstractNum w:abstractNumId="2" w15:restartNumberingAfterBreak="0">
     <w:nsid w:val="07C37237"/>
     <w:multiLevelType w:val="multilevel"/>
     <w:tmpl w:val="4409001F"/>
@@ -5964,7 +6049,7 @@
       </w:pPr>
     </w:lvl>
   </w:abstractNum>
-  <w:abstractNum w:abstractNumId="2" w15:restartNumberingAfterBreak="0">
+  <w:abstractNum w:abstractNumId="3" w15:restartNumberingAfterBreak="0">
     <w:nsid w:val="0CAE27FB"/>
     <w:multiLevelType w:val="multilevel"/>
     <w:tmpl w:val="4409001F"/>
@@ -6050,7 +6135,185 @@
       </w:pPr>
     </w:lvl>
   </w:abstractNum>
-  <w:abstractNum w:abstractNumId="3" w15:restartNumberingAfterBreak="0">
+  <w:abstractNum w:abstractNumId="4" w15:restartNumberingAfterBreak="0">
+    <w:nsid w:val="111B6815"/>
+    <w:multiLevelType w:val="hybridMultilevel"/>
+    <w:tmpl w:val="ABFC905E"/>
+    <w:lvl w:ilvl="0" w:tplc="4409000F">
+      <w:start w:val="1"/>
+      <w:numFmt w:val="decimal"/>
+      <w:lvlText w:val="%1."/>
+      <w:lvlJc w:val="left"/>
+      <w:pPr>
+        <w:ind w:left="720" w:hanging="360"/>
+      </w:pPr>
+      <w:rPr>
+        <w:rFonts w:hint="default"/>
+      </w:rPr>
+    </w:lvl>
+    <w:lvl w:ilvl="1" w:tplc="44090019" w:tentative="1">
+      <w:start w:val="1"/>
+      <w:numFmt w:val="lowerLetter"/>
+      <w:lvlText w:val="%2."/>
+      <w:lvlJc w:val="left"/>
+      <w:pPr>
+        <w:ind w:left="1440" w:hanging="360"/>
+      </w:pPr>
+    </w:lvl>
+    <w:lvl w:ilvl="2" w:tplc="4409001B" w:tentative="1">
+      <w:start w:val="1"/>
+      <w:numFmt w:val="lowerRoman"/>
+      <w:lvlText w:val="%3."/>
+      <w:lvlJc w:val="right"/>
+      <w:pPr>
+        <w:ind w:left="2160" w:hanging="180"/>
+      </w:pPr>
+    </w:lvl>
+    <w:lvl w:ilvl="3" w:tplc="4409000F" w:tentative="1">
+      <w:start w:val="1"/>
+      <w:numFmt w:val="decimal"/>
+      <w:lvlText w:val="%4."/>
+      <w:lvlJc w:val="left"/>
+      <w:pPr>
+        <w:ind w:left="2880" w:hanging="360"/>
+      </w:pPr>
+    </w:lvl>
+    <w:lvl w:ilvl="4" w:tplc="44090019" w:tentative="1">
+      <w:start w:val="1"/>
+      <w:numFmt w:val="lowerLetter"/>
+      <w:lvlText w:val="%5."/>
+      <w:lvlJc w:val="left"/>
+      <w:pPr>
+        <w:ind w:left="3600" w:hanging="360"/>
+      </w:pPr>
+    </w:lvl>
+    <w:lvl w:ilvl="5" w:tplc="4409001B" w:tentative="1">
+      <w:start w:val="1"/>
+      <w:numFmt w:val="lowerRoman"/>
+      <w:lvlText w:val="%6."/>
+      <w:lvlJc w:val="right"/>
+      <w:pPr>
+        <w:ind w:left="4320" w:hanging="180"/>
+      </w:pPr>
+    </w:lvl>
+    <w:lvl w:ilvl="6" w:tplc="4409000F" w:tentative="1">
+      <w:start w:val="1"/>
+      <w:numFmt w:val="decimal"/>
+      <w:lvlText w:val="%7."/>
+      <w:lvlJc w:val="left"/>
+      <w:pPr>
+        <w:ind w:left="5040" w:hanging="360"/>
+      </w:pPr>
+    </w:lvl>
+    <w:lvl w:ilvl="7" w:tplc="44090019" w:tentative="1">
+      <w:start w:val="1"/>
+      <w:numFmt w:val="lowerLetter"/>
+      <w:lvlText w:val="%8."/>
+      <w:lvlJc w:val="left"/>
+      <w:pPr>
+        <w:ind w:left="5760" w:hanging="360"/>
+      </w:pPr>
+    </w:lvl>
+    <w:lvl w:ilvl="8" w:tplc="4409001B" w:tentative="1">
+      <w:start w:val="1"/>
+      <w:numFmt w:val="lowerRoman"/>
+      <w:lvlText w:val="%9."/>
+      <w:lvlJc w:val="right"/>
+      <w:pPr>
+        <w:ind w:left="6480" w:hanging="180"/>
+      </w:pPr>
+    </w:lvl>
+  </w:abstractNum>
+  <w:abstractNum w:abstractNumId="5" w15:restartNumberingAfterBreak="0">
+    <w:nsid w:val="206A4D7B"/>
+    <w:multiLevelType w:val="hybridMultilevel"/>
+    <w:tmpl w:val="68EEF4B0"/>
+    <w:lvl w:ilvl="0" w:tplc="4409000F">
+      <w:start w:val="1"/>
+      <w:numFmt w:val="decimal"/>
+      <w:lvlText w:val="%1."/>
+      <w:lvlJc w:val="left"/>
+      <w:pPr>
+        <w:ind w:left="720" w:hanging="360"/>
+      </w:pPr>
+      <w:rPr>
+        <w:rFonts w:hint="default"/>
+      </w:rPr>
+    </w:lvl>
+    <w:lvl w:ilvl="1" w:tplc="44090019" w:tentative="1">
+      <w:start w:val="1"/>
+      <w:numFmt w:val="lowerLetter"/>
+      <w:lvlText w:val="%2."/>
+      <w:lvlJc w:val="left"/>
+      <w:pPr>
+        <w:ind w:left="1440" w:hanging="360"/>
+      </w:pPr>
+    </w:lvl>
+    <w:lvl w:ilvl="2" w:tplc="4409001B" w:tentative="1">
+      <w:start w:val="1"/>
+      <w:numFmt w:val="lowerRoman"/>
+      <w:lvlText w:val="%3."/>
+      <w:lvlJc w:val="right"/>
+      <w:pPr>
+        <w:ind w:left="2160" w:hanging="180"/>
+      </w:pPr>
+    </w:lvl>
+    <w:lvl w:ilvl="3" w:tplc="4409000F" w:tentative="1">
+      <w:start w:val="1"/>
+      <w:numFmt w:val="decimal"/>
+      <w:lvlText w:val="%4."/>
+      <w:lvlJc w:val="left"/>
+      <w:pPr>
+        <w:ind w:left="2880" w:hanging="360"/>
+      </w:pPr>
+    </w:lvl>
+    <w:lvl w:ilvl="4" w:tplc="44090019" w:tentative="1">
+      <w:start w:val="1"/>
+      <w:numFmt w:val="lowerLetter"/>
+      <w:lvlText w:val="%5."/>
+      <w:lvlJc w:val="left"/>
+      <w:pPr>
+        <w:ind w:left="3600" w:hanging="360"/>
+      </w:pPr>
+    </w:lvl>
+    <w:lvl w:ilvl="5" w:tplc="4409001B" w:tentative="1">
+      <w:start w:val="1"/>
+      <w:numFmt w:val="lowerRoman"/>
+      <w:lvlText w:val="%6."/>
+      <w:lvlJc w:val="right"/>
+      <w:pPr>
+        <w:ind w:left="4320" w:hanging="180"/>
+      </w:pPr>
+    </w:lvl>
+    <w:lvl w:ilvl="6" w:tplc="4409000F" w:tentative="1">
+      <w:start w:val="1"/>
+      <w:numFmt w:val="decimal"/>
+      <w:lvlText w:val="%7."/>
+      <w:lvlJc w:val="left"/>
+      <w:pPr>
+        <w:ind w:left="5040" w:hanging="360"/>
+      </w:pPr>
+    </w:lvl>
+    <w:lvl w:ilvl="7" w:tplc="44090019" w:tentative="1">
+      <w:start w:val="1"/>
+      <w:numFmt w:val="lowerLetter"/>
+      <w:lvlText w:val="%8."/>
+      <w:lvlJc w:val="left"/>
+      <w:pPr>
+        <w:ind w:left="5760" w:hanging="360"/>
+      </w:pPr>
+    </w:lvl>
+    <w:lvl w:ilvl="8" w:tplc="4409001B" w:tentative="1">
+      <w:start w:val="1"/>
+      <w:numFmt w:val="lowerRoman"/>
+      <w:lvlText w:val="%9."/>
+      <w:lvlJc w:val="right"/>
+      <w:pPr>
+        <w:ind w:left="6480" w:hanging="180"/>
+      </w:pPr>
+    </w:lvl>
+  </w:abstractNum>
+  <w:abstractNum w:abstractNumId="6" w15:restartNumberingAfterBreak="0">
     <w:nsid w:val="224E535D"/>
     <w:multiLevelType w:val="hybridMultilevel"/>
     <w:tmpl w:val="C47A0DB4"/>
@@ -6139,7 +6402,7 @@
       </w:pPr>
     </w:lvl>
   </w:abstractNum>
-  <w:abstractNum w:abstractNumId="4" w15:restartNumberingAfterBreak="0">
+  <w:abstractNum w:abstractNumId="7" w15:restartNumberingAfterBreak="0">
     <w:nsid w:val="2C864025"/>
     <w:multiLevelType w:val="multilevel"/>
     <w:tmpl w:val="4409001F"/>
@@ -6225,7 +6488,7 @@
       </w:pPr>
     </w:lvl>
   </w:abstractNum>
-  <w:abstractNum w:abstractNumId="5" w15:restartNumberingAfterBreak="0">
+  <w:abstractNum w:abstractNumId="8" w15:restartNumberingAfterBreak="0">
     <w:nsid w:val="391A47EE"/>
     <w:multiLevelType w:val="hybridMultilevel"/>
     <w:tmpl w:val="608C2FC8"/>
@@ -6314,7 +6577,7 @@
       </w:pPr>
     </w:lvl>
   </w:abstractNum>
-  <w:abstractNum w:abstractNumId="6" w15:restartNumberingAfterBreak="0">
+  <w:abstractNum w:abstractNumId="9" w15:restartNumberingAfterBreak="0">
     <w:nsid w:val="4AC53607"/>
     <w:multiLevelType w:val="hybridMultilevel"/>
     <w:tmpl w:val="CAB8B28C"/>
@@ -6403,7 +6666,7 @@
       </w:pPr>
     </w:lvl>
   </w:abstractNum>
-  <w:abstractNum w:abstractNumId="7" w15:restartNumberingAfterBreak="0">
+  <w:abstractNum w:abstractNumId="10" w15:restartNumberingAfterBreak="0">
     <w:nsid w:val="4C767CF7"/>
     <w:multiLevelType w:val="hybridMultilevel"/>
     <w:tmpl w:val="E006DF60"/>
@@ -6492,7 +6755,7 @@
       </w:pPr>
     </w:lvl>
   </w:abstractNum>
-  <w:abstractNum w:abstractNumId="8" w15:restartNumberingAfterBreak="0">
+  <w:abstractNum w:abstractNumId="11" w15:restartNumberingAfterBreak="0">
     <w:nsid w:val="576B70A5"/>
     <w:multiLevelType w:val="hybridMultilevel"/>
     <w:tmpl w:val="CBCCF546"/>
@@ -6605,7 +6868,7 @@
       </w:rPr>
     </w:lvl>
   </w:abstractNum>
-  <w:abstractNum w:abstractNumId="9" w15:restartNumberingAfterBreak="0">
+  <w:abstractNum w:abstractNumId="12" w15:restartNumberingAfterBreak="0">
     <w:nsid w:val="595C5C89"/>
     <w:multiLevelType w:val="hybridMultilevel"/>
     <w:tmpl w:val="BB58A9A2"/>
@@ -6695,7 +6958,7 @@
       </w:pPr>
     </w:lvl>
   </w:abstractNum>
-  <w:abstractNum w:abstractNumId="10" w15:restartNumberingAfterBreak="0">
+  <w:abstractNum w:abstractNumId="13" w15:restartNumberingAfterBreak="0">
     <w:nsid w:val="707B624C"/>
     <w:multiLevelType w:val="hybridMultilevel"/>
     <w:tmpl w:val="4066D8D2"/>
@@ -6784,7 +7047,7 @@
       </w:pPr>
     </w:lvl>
   </w:abstractNum>
-  <w:abstractNum w:abstractNumId="11" w15:restartNumberingAfterBreak="0">
+  <w:abstractNum w:abstractNumId="14" w15:restartNumberingAfterBreak="0">
     <w:nsid w:val="76C22FEC"/>
     <w:multiLevelType w:val="hybridMultilevel"/>
     <w:tmpl w:val="7D661E6A"/>
@@ -6874,40 +7137,49 @@
     </w:lvl>
   </w:abstractNum>
   <w:num w:numId="1" w16cid:durableId="422532857">
-    <w:abstractNumId w:val="3"/>
+    <w:abstractNumId w:val="6"/>
   </w:num>
   <w:num w:numId="2" w16cid:durableId="1890915732">
-    <w:abstractNumId w:val="8"/>
+    <w:abstractNumId w:val="11"/>
   </w:num>
   <w:num w:numId="3" w16cid:durableId="558782592">
-    <w:abstractNumId w:val="7"/>
+    <w:abstractNumId w:val="10"/>
   </w:num>
   <w:num w:numId="4" w16cid:durableId="291253581">
-    <w:abstractNumId w:val="10"/>
+    <w:abstractNumId w:val="13"/>
   </w:num>
   <w:num w:numId="5" w16cid:durableId="991061032">
     <w:abstractNumId w:val="0"/>
   </w:num>
   <w:num w:numId="6" w16cid:durableId="1289168179">
-    <w:abstractNumId w:val="11"/>
+    <w:abstractNumId w:val="14"/>
   </w:num>
   <w:num w:numId="7" w16cid:durableId="197862497">
-    <w:abstractNumId w:val="6"/>
+    <w:abstractNumId w:val="9"/>
   </w:num>
   <w:num w:numId="8" w16cid:durableId="551042543">
+    <w:abstractNumId w:val="8"/>
+  </w:num>
+  <w:num w:numId="9" w16cid:durableId="608927404">
+    <w:abstractNumId w:val="12"/>
+  </w:num>
+  <w:num w:numId="10" w16cid:durableId="495653598">
+    <w:abstractNumId w:val="2"/>
+  </w:num>
+  <w:num w:numId="11" w16cid:durableId="2090609939">
+    <w:abstractNumId w:val="3"/>
+  </w:num>
+  <w:num w:numId="12" w16cid:durableId="395125979">
+    <w:abstractNumId w:val="7"/>
+  </w:num>
+  <w:num w:numId="13" w16cid:durableId="791440515">
     <w:abstractNumId w:val="5"/>
   </w:num>
-  <w:num w:numId="9" w16cid:durableId="608927404">
-    <w:abstractNumId w:val="9"/>
+  <w:num w:numId="14" w16cid:durableId="1409495815">
+    <w:abstractNumId w:val="4"/>
   </w:num>
-  <w:num w:numId="10" w16cid:durableId="495653598">
+  <w:num w:numId="15" w16cid:durableId="770663729">
     <w:abstractNumId w:val="1"/>
-  </w:num>
-  <w:num w:numId="11" w16cid:durableId="2090609939">
-    <w:abstractNumId w:val="2"/>
-  </w:num>
-  <w:num w:numId="12" w16cid:durableId="395125979">
-    <w:abstractNumId w:val="4"/>
   </w:num>
 </w:numbering>
 </file>
@@ -7518,7 +7790,6 @@
   <w:style w:type="character" w:default="1" w:styleId="DefaultParagraphFont">
     <w:name w:val="Default Paragraph Font"/>
     <w:uiPriority w:val="1"/>
-    <w:semiHidden/>
     <w:unhideWhenUsed/>
   </w:style>
   <w:style w:type="table" w:default="1" w:styleId="TableNormal">

</xml_diff>

<commit_message>
refactor: :zap: Updated HMTTSF
</commit_message>
<xml_diff>
--- a/docs/24202141_p1_report.docx
+++ b/docs/24202141_p1_report.docx
@@ -2,6 +2,160 @@
 <file path=word/document.xml><?xml version="1.0" encoding="utf-8"?>
 <w:document xmlns:wpc="http://schemas.microsoft.com/office/word/2010/wordprocessingCanvas" xmlns:cx="http://schemas.microsoft.com/office/drawing/2014/chartex" xmlns:cx1="http://schemas.microsoft.com/office/drawing/2015/9/8/chartex" xmlns:cx2="http://schemas.microsoft.com/office/drawing/2015/10/21/chartex" xmlns:cx3="http://schemas.microsoft.com/office/drawing/2016/5/9/chartex" xmlns:cx4="http://schemas.microsoft.com/office/drawing/2016/5/10/chartex" xmlns:cx5="http://schemas.microsoft.com/office/drawing/2016/5/11/chartex" xmlns:cx6="http://schemas.microsoft.com/office/drawing/2016/5/12/chartex" xmlns:cx7="http://schemas.microsoft.com/office/drawing/2016/5/13/chartex" xmlns:cx8="http://schemas.microsoft.com/office/drawing/2016/5/14/chartex" xmlns:mc="http://schemas.openxmlformats.org/markup-compatibility/2006" xmlns:aink="http://schemas.microsoft.com/office/drawing/2016/ink" xmlns:am3d="http://schemas.microsoft.com/office/drawing/2017/model3d" xmlns:o="urn:schemas-microsoft-com:office:office" xmlns:oel="http://schemas.microsoft.com/office/2019/extlst" xmlns:r="http://schemas.openxmlformats.org/officeDocument/2006/relationships" xmlns:m="http://schemas.openxmlformats.org/officeDocument/2006/math" xmlns:v="urn:schemas-microsoft-com:vml" xmlns:wp14="http://schemas.microsoft.com/office/word/2010/wordprocessingDrawing" xmlns:wp="http://schemas.openxmlformats.org/drawingml/2006/wordprocessingDrawing" xmlns:w10="urn:schemas-microsoft-com:office:word" xmlns:w="http://schemas.openxmlformats.org/wordprocessingml/2006/main" xmlns:w14="http://schemas.microsoft.com/office/word/2010/wordml" xmlns:w15="http://schemas.microsoft.com/office/word/2012/wordml" xmlns:w16cex="http://schemas.microsoft.com/office/word/2018/wordml/cex" xmlns:w16cid="http://schemas.microsoft.com/office/word/2016/wordml/cid" xmlns:w16="http://schemas.microsoft.com/office/word/2018/wordml" xmlns:w16du="http://schemas.microsoft.com/office/word/2023/wordml/word16du" xmlns:w16sdtdh="http://schemas.microsoft.com/office/word/2020/wordml/sdtdatahash" xmlns:w16sdtfl="http://schemas.microsoft.com/office/word/2024/wordml/sdtformatlock" xmlns:w16se="http://schemas.microsoft.com/office/word/2015/wordml/symex" xmlns:wpg="http://schemas.microsoft.com/office/word/2010/wordprocessingGroup" xmlns:wpi="http://schemas.microsoft.com/office/word/2010/wordprocessingInk" xmlns:wne="http://schemas.microsoft.com/office/word/2006/wordml" xmlns:wps="http://schemas.microsoft.com/office/word/2010/wordprocessingShape" mc:Ignorable="w14 w15 w16se w16cid w16 w16cex w16sdtdh w16sdtfl w16du wp14">
   <w:body>
+    <w:p>
+      <w:pPr>
+        <w:jc w:val="center"/>
+        <w:rPr>
+          <w:b/>
+          <w:bCs/>
+          <w:sz w:val="48"/>
+          <w:szCs w:val="48"/>
+          <w:u w:val="single"/>
+        </w:rPr>
+      </w:pPr>
+    </w:p>
+    <w:p>
+      <w:pPr>
+        <w:jc w:val="center"/>
+        <w:rPr>
+          <w:b/>
+          <w:bCs/>
+          <w:sz w:val="48"/>
+          <w:szCs w:val="48"/>
+          <w:u w:val="single"/>
+        </w:rPr>
+      </w:pPr>
+    </w:p>
+    <w:p>
+      <w:pPr>
+        <w:jc w:val="center"/>
+        <w:rPr>
+          <w:b/>
+          <w:bCs/>
+          <w:sz w:val="48"/>
+          <w:szCs w:val="48"/>
+          <w:u w:val="single"/>
+        </w:rPr>
+      </w:pPr>
+    </w:p>
+    <w:p>
+      <w:pPr>
+        <w:jc w:val="center"/>
+        <w:rPr>
+          <w:b/>
+          <w:bCs/>
+          <w:sz w:val="48"/>
+          <w:szCs w:val="48"/>
+          <w:u w:val="single"/>
+        </w:rPr>
+      </w:pPr>
+    </w:p>
+    <w:p>
+      <w:pPr>
+        <w:jc w:val="center"/>
+        <w:rPr>
+          <w:b/>
+          <w:bCs/>
+          <w:sz w:val="48"/>
+          <w:szCs w:val="48"/>
+          <w:u w:val="single"/>
+        </w:rPr>
+      </w:pPr>
+    </w:p>
+    <w:p>
+      <w:pPr>
+        <w:jc w:val="center"/>
+        <w:rPr>
+          <w:b/>
+          <w:bCs/>
+          <w:sz w:val="48"/>
+          <w:szCs w:val="48"/>
+          <w:u w:val="single"/>
+        </w:rPr>
+      </w:pPr>
+    </w:p>
+    <w:p>
+      <w:pPr>
+        <w:jc w:val="center"/>
+        <w:rPr>
+          <w:b/>
+          <w:bCs/>
+          <w:sz w:val="48"/>
+          <w:szCs w:val="48"/>
+          <w:u w:val="single"/>
+        </w:rPr>
+      </w:pPr>
+      <w:r>
+        <w:rPr>
+          <w:b/>
+          <w:bCs/>
+          <w:sz w:val="48"/>
+          <w:szCs w:val="48"/>
+          <w:u w:val="single"/>
+        </w:rPr>
+        <w:t>Mitigating Public Transit Unreliability in Malaysia through Deep Learning Analytics and Ridership Forecasting</w:t>
+      </w:r>
+    </w:p>
+    <w:p>
+      <w:pPr>
+        <w:jc w:val="center"/>
+        <w:rPr>
+          <w:b/>
+          <w:bCs/>
+          <w:sz w:val="48"/>
+          <w:szCs w:val="48"/>
+          <w:u w:val="single"/>
+        </w:rPr>
+      </w:pPr>
+    </w:p>
+    <w:p>
+      <w:pPr>
+        <w:jc w:val="center"/>
+        <w:rPr>
+          <w:b/>
+          <w:bCs/>
+          <w:sz w:val="48"/>
+          <w:szCs w:val="48"/>
+          <w:u w:val="single"/>
+        </w:rPr>
+      </w:pPr>
+    </w:p>
+    <w:p>
+      <w:pPr>
+        <w:jc w:val="center"/>
+        <w:rPr>
+          <w:b/>
+          <w:bCs/>
+          <w:sz w:val="48"/>
+          <w:szCs w:val="48"/>
+          <w:u w:val="single"/>
+        </w:rPr>
+      </w:pPr>
+    </w:p>
+    <w:p>
+      <w:pPr>
+        <w:jc w:val="center"/>
+        <w:rPr>
+          <w:b/>
+          <w:bCs/>
+          <w:sz w:val="48"/>
+          <w:szCs w:val="48"/>
+          <w:u w:val="single"/>
+        </w:rPr>
+      </w:pPr>
+    </w:p>
+    <w:p>
+      <w:pPr>
+        <w:jc w:val="center"/>
+        <w:rPr>
+          <w:b/>
+          <w:bCs/>
+          <w:sz w:val="48"/>
+          <w:szCs w:val="48"/>
+          <w:u w:val="single"/>
+        </w:rPr>
+      </w:pPr>
+    </w:p>
     <w:sdt>
       <w:sdtPr>
         <w:rPr>
@@ -76,7 +230,7 @@
           <w:r>
             <w:fldChar w:fldCharType="separate"/>
           </w:r>
-          <w:hyperlink w:anchor="_Toc230633009" w:history="1">
+          <w:hyperlink w:anchor="_Toc230647571" w:history="1">
             <w:r>
               <w:rPr>
                 <w:rStyle w:val="Hyperlink"/>
@@ -121,7 +275,7 @@
                 <w:noProof/>
                 <w:webHidden/>
               </w:rPr>
-              <w:instrText xml:space="preserve"> PAGEREF _Toc230633009 \h </w:instrText>
+              <w:instrText xml:space="preserve"> PAGEREF _Toc230647571 \h </w:instrText>
             </w:r>
             <w:r>
               <w:rPr>
@@ -141,7 +295,7 @@
                 <w:noProof/>
                 <w:webHidden/>
               </w:rPr>
-              <w:t>2</w:t>
+              <w:t>3</w:t>
             </w:r>
             <w:r>
               <w:rPr>
@@ -164,7 +318,7 @@
               <w:noProof/>
             </w:rPr>
           </w:pPr>
-          <w:hyperlink w:anchor="_Toc230633010" w:history="1">
+          <w:hyperlink w:anchor="_Toc230647572" w:history="1">
             <w:r>
               <w:rPr>
                 <w:rStyle w:val="Hyperlink"/>
@@ -209,7 +363,7 @@
                 <w:noProof/>
                 <w:webHidden/>
               </w:rPr>
-              <w:instrText xml:space="preserve"> PAGEREF _Toc230633010 \h </w:instrText>
+              <w:instrText xml:space="preserve"> PAGEREF _Toc230647572 \h </w:instrText>
             </w:r>
             <w:r>
               <w:rPr>
@@ -229,7 +383,7 @@
                 <w:noProof/>
                 <w:webHidden/>
               </w:rPr>
-              <w:t>2</w:t>
+              <w:t>3</w:t>
             </w:r>
             <w:r>
               <w:rPr>
@@ -252,7 +406,7 @@
               <w:noProof/>
             </w:rPr>
           </w:pPr>
-          <w:hyperlink w:anchor="_Toc230633011" w:history="1">
+          <w:hyperlink w:anchor="_Toc230647573" w:history="1">
             <w:r>
               <w:rPr>
                 <w:rStyle w:val="Hyperlink"/>
@@ -297,7 +451,7 @@
                 <w:noProof/>
                 <w:webHidden/>
               </w:rPr>
-              <w:instrText xml:space="preserve"> PAGEREF _Toc230633011 \h </w:instrText>
+              <w:instrText xml:space="preserve"> PAGEREF _Toc230647573 \h </w:instrText>
             </w:r>
             <w:r>
               <w:rPr>
@@ -317,7 +471,7 @@
                 <w:noProof/>
                 <w:webHidden/>
               </w:rPr>
-              <w:t>3</w:t>
+              <w:t>4</w:t>
             </w:r>
             <w:r>
               <w:rPr>
@@ -340,7 +494,7 @@
               <w:noProof/>
             </w:rPr>
           </w:pPr>
-          <w:hyperlink w:anchor="_Toc230633012" w:history="1">
+          <w:hyperlink w:anchor="_Toc230647574" w:history="1">
             <w:r>
               <w:rPr>
                 <w:rStyle w:val="Hyperlink"/>
@@ -385,7 +539,7 @@
                 <w:noProof/>
                 <w:webHidden/>
               </w:rPr>
-              <w:instrText xml:space="preserve"> PAGEREF _Toc230633012 \h </w:instrText>
+              <w:instrText xml:space="preserve"> PAGEREF _Toc230647574 \h </w:instrText>
             </w:r>
             <w:r>
               <w:rPr>
@@ -405,7 +559,7 @@
                 <w:noProof/>
                 <w:webHidden/>
               </w:rPr>
-              <w:t>4</w:t>
+              <w:t>5</w:t>
             </w:r>
             <w:r>
               <w:rPr>
@@ -428,7 +582,7 @@
               <w:noProof/>
             </w:rPr>
           </w:pPr>
-          <w:hyperlink w:anchor="_Toc230633013" w:history="1">
+          <w:hyperlink w:anchor="_Toc230647575" w:history="1">
             <w:r>
               <w:rPr>
                 <w:rStyle w:val="Hyperlink"/>
@@ -473,7 +627,7 @@
                 <w:noProof/>
                 <w:webHidden/>
               </w:rPr>
-              <w:instrText xml:space="preserve"> PAGEREF _Toc230633013 \h </w:instrText>
+              <w:instrText xml:space="preserve"> PAGEREF _Toc230647575 \h </w:instrText>
             </w:r>
             <w:r>
               <w:rPr>
@@ -493,7 +647,7 @@
                 <w:noProof/>
                 <w:webHidden/>
               </w:rPr>
-              <w:t>4</w:t>
+              <w:t>5</w:t>
             </w:r>
             <w:r>
               <w:rPr>
@@ -516,7 +670,7 @@
               <w:noProof/>
             </w:rPr>
           </w:pPr>
-          <w:hyperlink w:anchor="_Toc230633014" w:history="1">
+          <w:hyperlink w:anchor="_Toc230647576" w:history="1">
             <w:r>
               <w:rPr>
                 <w:rStyle w:val="Hyperlink"/>
@@ -561,7 +715,7 @@
                 <w:noProof/>
                 <w:webHidden/>
               </w:rPr>
-              <w:instrText xml:space="preserve"> PAGEREF _Toc230633014 \h </w:instrText>
+              <w:instrText xml:space="preserve"> PAGEREF _Toc230647576 \h </w:instrText>
             </w:r>
             <w:r>
               <w:rPr>
@@ -581,7 +735,7 @@
                 <w:noProof/>
                 <w:webHidden/>
               </w:rPr>
-              <w:t>4</w:t>
+              <w:t>6</w:t>
             </w:r>
             <w:r>
               <w:rPr>
@@ -604,7 +758,7 @@
               <w:noProof/>
             </w:rPr>
           </w:pPr>
-          <w:hyperlink w:anchor="_Toc230633015" w:history="1">
+          <w:hyperlink w:anchor="_Toc230647577" w:history="1">
             <w:r>
               <w:rPr>
                 <w:rStyle w:val="Hyperlink"/>
@@ -649,7 +803,7 @@
                 <w:noProof/>
                 <w:webHidden/>
               </w:rPr>
-              <w:instrText xml:space="preserve"> PAGEREF _Toc230633015 \h </w:instrText>
+              <w:instrText xml:space="preserve"> PAGEREF _Toc230647577 \h </w:instrText>
             </w:r>
             <w:r>
               <w:rPr>
@@ -669,7 +823,7 @@
                 <w:noProof/>
                 <w:webHidden/>
               </w:rPr>
-              <w:t>6</w:t>
+              <w:t>7</w:t>
             </w:r>
             <w:r>
               <w:rPr>
@@ -692,7 +846,7 @@
               <w:noProof/>
             </w:rPr>
           </w:pPr>
-          <w:hyperlink w:anchor="_Toc230633016" w:history="1">
+          <w:hyperlink w:anchor="_Toc230647578" w:history="1">
             <w:r>
               <w:rPr>
                 <w:rStyle w:val="Hyperlink"/>
@@ -716,7 +870,7 @@
                 <w:bCs/>
                 <w:noProof/>
               </w:rPr>
-              <w:t>Public Transport Reliability</w:t>
+              <w:t>Public Transport Reliability and Demand Dynamics</w:t>
             </w:r>
             <w:r>
               <w:rPr>
@@ -737,7 +891,7 @@
                 <w:noProof/>
                 <w:webHidden/>
               </w:rPr>
-              <w:instrText xml:space="preserve"> PAGEREF _Toc230633016 \h </w:instrText>
+              <w:instrText xml:space="preserve"> PAGEREF _Toc230647578 \h </w:instrText>
             </w:r>
             <w:r>
               <w:rPr>
@@ -757,7 +911,7 @@
                 <w:noProof/>
                 <w:webHidden/>
               </w:rPr>
-              <w:t>6</w:t>
+              <w:t>7</w:t>
             </w:r>
             <w:r>
               <w:rPr>
@@ -780,7 +934,7 @@
               <w:noProof/>
             </w:rPr>
           </w:pPr>
-          <w:hyperlink w:anchor="_Toc230633017" w:history="1">
+          <w:hyperlink w:anchor="_Toc230647579" w:history="1">
             <w:r>
               <w:rPr>
                 <w:rStyle w:val="Hyperlink"/>
@@ -825,7 +979,7 @@
                 <w:noProof/>
                 <w:webHidden/>
               </w:rPr>
-              <w:instrText xml:space="preserve"> PAGEREF _Toc230633017 \h </w:instrText>
+              <w:instrText xml:space="preserve"> PAGEREF _Toc230647579 \h </w:instrText>
             </w:r>
             <w:r>
               <w:rPr>
@@ -845,7 +999,7 @@
                 <w:noProof/>
                 <w:webHidden/>
               </w:rPr>
-              <w:t>6</w:t>
+              <w:t>7</w:t>
             </w:r>
             <w:r>
               <w:rPr>
@@ -868,7 +1022,7 @@
               <w:noProof/>
             </w:rPr>
           </w:pPr>
-          <w:hyperlink w:anchor="_Toc230633018" w:history="1">
+          <w:hyperlink w:anchor="_Toc230647580" w:history="1">
             <w:r>
               <w:rPr>
                 <w:rStyle w:val="Hyperlink"/>
@@ -892,7 +1046,7 @@
                 <w:bCs/>
                 <w:noProof/>
               </w:rPr>
-              <w:t>The Landscape of Public Transit in Malaysia</w:t>
+              <w:t>The Relationship between Ridership and Service Unreliability</w:t>
             </w:r>
             <w:r>
               <w:rPr>
@@ -913,7 +1067,7 @@
                 <w:noProof/>
                 <w:webHidden/>
               </w:rPr>
-              <w:instrText xml:space="preserve"> PAGEREF _Toc230633018 \h </w:instrText>
+              <w:instrText xml:space="preserve"> PAGEREF _Toc230647580 \h </w:instrText>
             </w:r>
             <w:r>
               <w:rPr>
@@ -933,7 +1087,7 @@
                 <w:noProof/>
                 <w:webHidden/>
               </w:rPr>
-              <w:t>6</w:t>
+              <w:t>7</w:t>
             </w:r>
             <w:r>
               <w:rPr>
@@ -956,7 +1110,7 @@
               <w:noProof/>
             </w:rPr>
           </w:pPr>
-          <w:hyperlink w:anchor="_Toc230633019" w:history="1">
+          <w:hyperlink w:anchor="_Toc230647581" w:history="1">
             <w:r>
               <w:rPr>
                 <w:rStyle w:val="Hyperlink"/>
@@ -980,7 +1134,7 @@
                 <w:bCs/>
                 <w:noProof/>
               </w:rPr>
-              <w:t>Impact of External Factors</w:t>
+              <w:t>The Landscape of Public Transit in Malaysia</w:t>
             </w:r>
             <w:r>
               <w:rPr>
@@ -1001,7 +1155,7 @@
                 <w:noProof/>
                 <w:webHidden/>
               </w:rPr>
-              <w:instrText xml:space="preserve"> PAGEREF _Toc230633019 \h </w:instrText>
+              <w:instrText xml:space="preserve"> PAGEREF _Toc230647581 \h </w:instrText>
             </w:r>
             <w:r>
               <w:rPr>
@@ -1021,7 +1175,7 @@
                 <w:noProof/>
                 <w:webHidden/>
               </w:rPr>
-              <w:t>6</w:t>
+              <w:t>7</w:t>
             </w:r>
             <w:r>
               <w:rPr>
@@ -1044,7 +1198,7 @@
               <w:noProof/>
             </w:rPr>
           </w:pPr>
-          <w:hyperlink w:anchor="_Toc230633020" w:history="1">
+          <w:hyperlink w:anchor="_Toc230647582" w:history="1">
             <w:r>
               <w:rPr>
                 <w:rStyle w:val="Hyperlink"/>
@@ -1068,7 +1222,7 @@
                 <w:bCs/>
                 <w:noProof/>
               </w:rPr>
-              <w:t>Sources of Transit Data</w:t>
+              <w:t>Transit Data Ecosystems and Anomalies</w:t>
             </w:r>
             <w:r>
               <w:rPr>
@@ -1089,7 +1243,7 @@
                 <w:noProof/>
                 <w:webHidden/>
               </w:rPr>
-              <w:instrText xml:space="preserve"> PAGEREF _Toc230633020 \h </w:instrText>
+              <w:instrText xml:space="preserve"> PAGEREF _Toc230647582 \h </w:instrText>
             </w:r>
             <w:r>
               <w:rPr>
@@ -1109,7 +1263,7 @@
                 <w:noProof/>
                 <w:webHidden/>
               </w:rPr>
-              <w:t>6</w:t>
+              <w:t>7</w:t>
             </w:r>
             <w:r>
               <w:rPr>
@@ -1132,7 +1286,7 @@
               <w:noProof/>
             </w:rPr>
           </w:pPr>
-          <w:hyperlink w:anchor="_Toc230633021" w:history="1">
+          <w:hyperlink w:anchor="_Toc230647583" w:history="1">
             <w:r>
               <w:rPr>
                 <w:rStyle w:val="Hyperlink"/>
@@ -1156,7 +1310,7 @@
                 <w:bCs/>
                 <w:noProof/>
               </w:rPr>
-              <w:t>Data Quality and Preprocessing Challenges</w:t>
+              <w:t>Sources of Transit Data</w:t>
             </w:r>
             <w:r>
               <w:rPr>
@@ -1177,7 +1331,7 @@
                 <w:noProof/>
                 <w:webHidden/>
               </w:rPr>
-              <w:instrText xml:space="preserve"> PAGEREF _Toc230633021 \h </w:instrText>
+              <w:instrText xml:space="preserve"> PAGEREF _Toc230647583 \h </w:instrText>
             </w:r>
             <w:r>
               <w:rPr>
@@ -1197,7 +1351,7 @@
                 <w:noProof/>
                 <w:webHidden/>
               </w:rPr>
-              <w:t>6</w:t>
+              <w:t>7</w:t>
             </w:r>
             <w:r>
               <w:rPr>
@@ -1220,7 +1374,7 @@
               <w:noProof/>
             </w:rPr>
           </w:pPr>
-          <w:hyperlink w:anchor="_Toc230633022" w:history="1">
+          <w:hyperlink w:anchor="_Toc230647584" w:history="1">
             <w:r>
               <w:rPr>
                 <w:rStyle w:val="Hyperlink"/>
@@ -1244,7 +1398,7 @@
                 <w:bCs/>
                 <w:noProof/>
               </w:rPr>
-              <w:t>Data-Driven Transit Analytics</w:t>
+              <w:t>Data Quality, Noise and Preprocessing Challenges</w:t>
             </w:r>
             <w:r>
               <w:rPr>
@@ -1265,7 +1419,7 @@
                 <w:noProof/>
                 <w:webHidden/>
               </w:rPr>
-              <w:instrText xml:space="preserve"> PAGEREF _Toc230633022 \h </w:instrText>
+              <w:instrText xml:space="preserve"> PAGEREF _Toc230647584 \h </w:instrText>
             </w:r>
             <w:r>
               <w:rPr>
@@ -1285,7 +1439,95 @@
                 <w:noProof/>
                 <w:webHidden/>
               </w:rPr>
-              <w:t>6</w:t>
+              <w:t>7</w:t>
+            </w:r>
+            <w:r>
+              <w:rPr>
+                <w:noProof/>
+                <w:webHidden/>
+              </w:rPr>
+              <w:fldChar w:fldCharType="end"/>
+            </w:r>
+          </w:hyperlink>
+        </w:p>
+        <w:p>
+          <w:pPr>
+            <w:pStyle w:val="TOC3"/>
+            <w:tabs>
+              <w:tab w:val="left" w:pos="1440"/>
+              <w:tab w:val="right" w:leader="dot" w:pos="9016"/>
+            </w:tabs>
+            <w:rPr>
+              <w:rFonts w:asciiTheme="minorHAnsi" w:hAnsiTheme="minorHAnsi"/>
+              <w:noProof/>
+            </w:rPr>
+          </w:pPr>
+          <w:hyperlink w:anchor="_Toc230647585" w:history="1">
+            <w:r>
+              <w:rPr>
+                <w:rStyle w:val="Hyperlink"/>
+                <w:b/>
+                <w:bCs/>
+                <w:noProof/>
+              </w:rPr>
+              <w:t>2.2.3.</w:t>
+            </w:r>
+            <w:r>
+              <w:rPr>
+                <w:rFonts w:asciiTheme="minorHAnsi" w:hAnsiTheme="minorHAnsi"/>
+                <w:noProof/>
+              </w:rPr>
+              <w:tab/>
+            </w:r>
+            <w:r>
+              <w:rPr>
+                <w:rStyle w:val="Hyperlink"/>
+                <w:b/>
+                <w:bCs/>
+                <w:noProof/>
+              </w:rPr>
+              <w:t>Extreme Anomalies in Spatiotemporal Data</w:t>
+            </w:r>
+            <w:r>
+              <w:rPr>
+                <w:noProof/>
+                <w:webHidden/>
+              </w:rPr>
+              <w:tab/>
+            </w:r>
+            <w:r>
+              <w:rPr>
+                <w:noProof/>
+                <w:webHidden/>
+              </w:rPr>
+              <w:fldChar w:fldCharType="begin"/>
+            </w:r>
+            <w:r>
+              <w:rPr>
+                <w:noProof/>
+                <w:webHidden/>
+              </w:rPr>
+              <w:instrText xml:space="preserve"> PAGEREF _Toc230647585 \h </w:instrText>
+            </w:r>
+            <w:r>
+              <w:rPr>
+                <w:noProof/>
+                <w:webHidden/>
+              </w:rPr>
+            </w:r>
+            <w:r>
+              <w:rPr>
+                <w:noProof/>
+                <w:webHidden/>
+              </w:rPr>
+              <w:fldChar w:fldCharType="separate"/>
+            </w:r>
+            <w:r>
+              <w:rPr>
+                <w:noProof/>
+                <w:webHidden/>
+              </w:rPr>
+              <w:t>7</w:t>
             </w:r>
             <w:r>
               <w:rPr>
@@ -1308,7 +1550,7 @@
               <w:noProof/>
             </w:rPr>
           </w:pPr>
-          <w:hyperlink w:anchor="_Toc230633023" w:history="1">
+          <w:hyperlink w:anchor="_Toc230647586" w:history="1">
             <w:r>
               <w:rPr>
                 <w:rStyle w:val="Hyperlink"/>
@@ -1353,7 +1595,7 @@
                 <w:noProof/>
                 <w:webHidden/>
               </w:rPr>
-              <w:instrText xml:space="preserve"> PAGEREF _Toc230633023 \h </w:instrText>
+              <w:instrText xml:space="preserve"> PAGEREF _Toc230647586 \h </w:instrText>
             </w:r>
             <w:r>
               <w:rPr>
@@ -1373,7 +1615,7 @@
                 <w:noProof/>
                 <w:webHidden/>
               </w:rPr>
-              <w:t>6</w:t>
+              <w:t>7</w:t>
             </w:r>
             <w:r>
               <w:rPr>
@@ -1396,7 +1638,7 @@
               <w:noProof/>
             </w:rPr>
           </w:pPr>
-          <w:hyperlink w:anchor="_Toc230633024" w:history="1">
+          <w:hyperlink w:anchor="_Toc230647587" w:history="1">
             <w:r>
               <w:rPr>
                 <w:rStyle w:val="Hyperlink"/>
@@ -1420,7 +1662,7 @@
                 <w:bCs/>
                 <w:noProof/>
               </w:rPr>
-              <w:t>Core Deep Learning Architectures for Spatiotemporal Data</w:t>
+              <w:t>Traditional Architectures</w:t>
             </w:r>
             <w:r>
               <w:rPr>
@@ -1441,7 +1683,7 @@
                 <w:noProof/>
                 <w:webHidden/>
               </w:rPr>
-              <w:instrText xml:space="preserve"> PAGEREF _Toc230633024 \h </w:instrText>
+              <w:instrText xml:space="preserve"> PAGEREF _Toc230647587 \h </w:instrText>
             </w:r>
             <w:r>
               <w:rPr>
@@ -1461,7 +1703,7 @@
                 <w:noProof/>
                 <w:webHidden/>
               </w:rPr>
-              <w:t>6</w:t>
+              <w:t>7</w:t>
             </w:r>
             <w:r>
               <w:rPr>
@@ -1484,7 +1726,7 @@
               <w:noProof/>
             </w:rPr>
           </w:pPr>
-          <w:hyperlink w:anchor="_Toc230633025" w:history="1">
+          <w:hyperlink w:anchor="_Toc230647588" w:history="1">
             <w:r>
               <w:rPr>
                 <w:rStyle w:val="Hyperlink"/>
@@ -1508,7 +1750,7 @@
                 <w:bCs/>
                 <w:noProof/>
               </w:rPr>
-              <w:t>Transit Delay and Ridership Prediction</w:t>
+              <w:t>Deep Learning Approaches in Spatiotemporal Transit Data</w:t>
             </w:r>
             <w:r>
               <w:rPr>
@@ -1529,7 +1771,7 @@
                 <w:noProof/>
                 <w:webHidden/>
               </w:rPr>
-              <w:instrText xml:space="preserve"> PAGEREF _Toc230633025 \h </w:instrText>
+              <w:instrText xml:space="preserve"> PAGEREF _Toc230647588 \h </w:instrText>
             </w:r>
             <w:r>
               <w:rPr>
@@ -1549,7 +1791,7 @@
                 <w:noProof/>
                 <w:webHidden/>
               </w:rPr>
-              <w:t>6</w:t>
+              <w:t>7</w:t>
             </w:r>
             <w:r>
               <w:rPr>
@@ -1572,7 +1814,7 @@
               <w:noProof/>
             </w:rPr>
           </w:pPr>
-          <w:hyperlink w:anchor="_Toc230633026" w:history="1">
+          <w:hyperlink w:anchor="_Toc230647589" w:history="1">
             <w:r>
               <w:rPr>
                 <w:rStyle w:val="Hyperlink"/>
@@ -1596,7 +1838,7 @@
                 <w:bCs/>
                 <w:noProof/>
               </w:rPr>
-              <w:t>Benchmarking and Evaluation Metrics</w:t>
+              <w:t>Benchmarking Methodologies and Evaluation Metrics</w:t>
             </w:r>
             <w:r>
               <w:rPr>
@@ -1617,7 +1859,7 @@
                 <w:noProof/>
                 <w:webHidden/>
               </w:rPr>
-              <w:instrText xml:space="preserve"> PAGEREF _Toc230633026 \h </w:instrText>
+              <w:instrText xml:space="preserve"> PAGEREF _Toc230647589 \h </w:instrText>
             </w:r>
             <w:r>
               <w:rPr>
@@ -1637,7 +1879,95 @@
                 <w:noProof/>
                 <w:webHidden/>
               </w:rPr>
-              <w:t>6</w:t>
+              <w:t>7</w:t>
+            </w:r>
+            <w:r>
+              <w:rPr>
+                <w:noProof/>
+                <w:webHidden/>
+              </w:rPr>
+              <w:fldChar w:fldCharType="end"/>
+            </w:r>
+          </w:hyperlink>
+        </w:p>
+        <w:p>
+          <w:pPr>
+            <w:pStyle w:val="TOC2"/>
+            <w:tabs>
+              <w:tab w:val="left" w:pos="960"/>
+              <w:tab w:val="right" w:leader="dot" w:pos="9016"/>
+            </w:tabs>
+            <w:rPr>
+              <w:rFonts w:asciiTheme="minorHAnsi" w:hAnsiTheme="minorHAnsi"/>
+              <w:noProof/>
+            </w:rPr>
+          </w:pPr>
+          <w:hyperlink w:anchor="_Toc230647590" w:history="1">
+            <w:r>
+              <w:rPr>
+                <w:rStyle w:val="Hyperlink"/>
+                <w:b/>
+                <w:bCs/>
+                <w:noProof/>
+              </w:rPr>
+              <w:t>2.4.</w:t>
+            </w:r>
+            <w:r>
+              <w:rPr>
+                <w:rFonts w:asciiTheme="minorHAnsi" w:hAnsiTheme="minorHAnsi"/>
+                <w:noProof/>
+              </w:rPr>
+              <w:tab/>
+            </w:r>
+            <w:r>
+              <w:rPr>
+                <w:rStyle w:val="Hyperlink"/>
+                <w:b/>
+                <w:bCs/>
+                <w:noProof/>
+              </w:rPr>
+              <w:t>AI-Driven Operational Strategies and Sustainability</w:t>
+            </w:r>
+            <w:r>
+              <w:rPr>
+                <w:noProof/>
+                <w:webHidden/>
+              </w:rPr>
+              <w:tab/>
+            </w:r>
+            <w:r>
+              <w:rPr>
+                <w:noProof/>
+                <w:webHidden/>
+              </w:rPr>
+              <w:fldChar w:fldCharType="begin"/>
+            </w:r>
+            <w:r>
+              <w:rPr>
+                <w:noProof/>
+                <w:webHidden/>
+              </w:rPr>
+              <w:instrText xml:space="preserve"> PAGEREF _Toc230647590 \h </w:instrText>
+            </w:r>
+            <w:r>
+              <w:rPr>
+                <w:noProof/>
+                <w:webHidden/>
+              </w:rPr>
+            </w:r>
+            <w:r>
+              <w:rPr>
+                <w:noProof/>
+                <w:webHidden/>
+              </w:rPr>
+              <w:fldChar w:fldCharType="separate"/>
+            </w:r>
+            <w:r>
+              <w:rPr>
+                <w:noProof/>
+                <w:webHidden/>
+              </w:rPr>
+              <w:t>7</w:t>
             </w:r>
             <w:r>
               <w:rPr>
@@ -1660,7 +1990,7 @@
               <w:noProof/>
             </w:rPr>
           </w:pPr>
-          <w:hyperlink w:anchor="_Toc230633027" w:history="1">
+          <w:hyperlink w:anchor="_Toc230647591" w:history="1">
             <w:r>
               <w:rPr>
                 <w:rStyle w:val="Hyperlink"/>
@@ -1668,7 +1998,7 @@
                 <w:bCs/>
                 <w:noProof/>
               </w:rPr>
-              <w:t>2.3.4.</w:t>
+              <w:t>2.4.1.</w:t>
             </w:r>
             <w:r>
               <w:rPr>
@@ -1684,7 +2014,7 @@
                 <w:bCs/>
                 <w:noProof/>
               </w:rPr>
-              <w:t>Deep Learning Approaches in Transit Analytics</w:t>
+              <w:t>Proactive Scheduling and Resource Allocation</w:t>
             </w:r>
             <w:r>
               <w:rPr>
@@ -1705,7 +2035,7 @@
                 <w:noProof/>
                 <w:webHidden/>
               </w:rPr>
-              <w:instrText xml:space="preserve"> PAGEREF _Toc230633027 \h </w:instrText>
+              <w:instrText xml:space="preserve"> PAGEREF _Toc230647591 \h </w:instrText>
             </w:r>
             <w:r>
               <w:rPr>
@@ -1725,7 +2055,183 @@
                 <w:noProof/>
                 <w:webHidden/>
               </w:rPr>
-              <w:t>6</w:t>
+              <w:t>7</w:t>
+            </w:r>
+            <w:r>
+              <w:rPr>
+                <w:noProof/>
+                <w:webHidden/>
+              </w:rPr>
+              <w:fldChar w:fldCharType="end"/>
+            </w:r>
+          </w:hyperlink>
+        </w:p>
+        <w:p>
+          <w:pPr>
+            <w:pStyle w:val="TOC3"/>
+            <w:tabs>
+              <w:tab w:val="left" w:pos="1440"/>
+              <w:tab w:val="right" w:leader="dot" w:pos="9016"/>
+            </w:tabs>
+            <w:rPr>
+              <w:rFonts w:asciiTheme="minorHAnsi" w:hAnsiTheme="minorHAnsi"/>
+              <w:noProof/>
+            </w:rPr>
+          </w:pPr>
+          <w:hyperlink w:anchor="_Toc230647592" w:history="1">
+            <w:r>
+              <w:rPr>
+                <w:rStyle w:val="Hyperlink"/>
+                <w:b/>
+                <w:bCs/>
+                <w:noProof/>
+              </w:rPr>
+              <w:t>2.4.2.</w:t>
+            </w:r>
+            <w:r>
+              <w:rPr>
+                <w:rFonts w:asciiTheme="minorHAnsi" w:hAnsiTheme="minorHAnsi"/>
+                <w:noProof/>
+              </w:rPr>
+              <w:tab/>
+            </w:r>
+            <w:r>
+              <w:rPr>
+                <w:rStyle w:val="Hyperlink"/>
+                <w:b/>
+                <w:bCs/>
+                <w:noProof/>
+              </w:rPr>
+              <w:t>Deployment Challenges of AI in Transit Management</w:t>
+            </w:r>
+            <w:r>
+              <w:rPr>
+                <w:noProof/>
+                <w:webHidden/>
+              </w:rPr>
+              <w:tab/>
+            </w:r>
+            <w:r>
+              <w:rPr>
+                <w:noProof/>
+                <w:webHidden/>
+              </w:rPr>
+              <w:fldChar w:fldCharType="begin"/>
+            </w:r>
+            <w:r>
+              <w:rPr>
+                <w:noProof/>
+                <w:webHidden/>
+              </w:rPr>
+              <w:instrText xml:space="preserve"> PAGEREF _Toc230647592 \h </w:instrText>
+            </w:r>
+            <w:r>
+              <w:rPr>
+                <w:noProof/>
+                <w:webHidden/>
+              </w:rPr>
+            </w:r>
+            <w:r>
+              <w:rPr>
+                <w:noProof/>
+                <w:webHidden/>
+              </w:rPr>
+              <w:fldChar w:fldCharType="separate"/>
+            </w:r>
+            <w:r>
+              <w:rPr>
+                <w:noProof/>
+                <w:webHidden/>
+              </w:rPr>
+              <w:t>7</w:t>
+            </w:r>
+            <w:r>
+              <w:rPr>
+                <w:noProof/>
+                <w:webHidden/>
+              </w:rPr>
+              <w:fldChar w:fldCharType="end"/>
+            </w:r>
+          </w:hyperlink>
+        </w:p>
+        <w:p>
+          <w:pPr>
+            <w:pStyle w:val="TOC3"/>
+            <w:tabs>
+              <w:tab w:val="left" w:pos="1440"/>
+              <w:tab w:val="right" w:leader="dot" w:pos="9016"/>
+            </w:tabs>
+            <w:rPr>
+              <w:rFonts w:asciiTheme="minorHAnsi" w:hAnsiTheme="minorHAnsi"/>
+              <w:noProof/>
+            </w:rPr>
+          </w:pPr>
+          <w:hyperlink w:anchor="_Toc230647593" w:history="1">
+            <w:r>
+              <w:rPr>
+                <w:rStyle w:val="Hyperlink"/>
+                <w:b/>
+                <w:bCs/>
+                <w:noProof/>
+              </w:rPr>
+              <w:t>2.4.3.</w:t>
+            </w:r>
+            <w:r>
+              <w:rPr>
+                <w:rFonts w:asciiTheme="minorHAnsi" w:hAnsiTheme="minorHAnsi"/>
+                <w:noProof/>
+              </w:rPr>
+              <w:tab/>
+            </w:r>
+            <w:r>
+              <w:rPr>
+                <w:rStyle w:val="Hyperlink"/>
+                <w:b/>
+                <w:bCs/>
+                <w:noProof/>
+              </w:rPr>
+              <w:t>Sustainable Urban Mobility and Environmental Impact</w:t>
+            </w:r>
+            <w:r>
+              <w:rPr>
+                <w:noProof/>
+                <w:webHidden/>
+              </w:rPr>
+              <w:tab/>
+            </w:r>
+            <w:r>
+              <w:rPr>
+                <w:noProof/>
+                <w:webHidden/>
+              </w:rPr>
+              <w:fldChar w:fldCharType="begin"/>
+            </w:r>
+            <w:r>
+              <w:rPr>
+                <w:noProof/>
+                <w:webHidden/>
+              </w:rPr>
+              <w:instrText xml:space="preserve"> PAGEREF _Toc230647593 \h </w:instrText>
+            </w:r>
+            <w:r>
+              <w:rPr>
+                <w:noProof/>
+                <w:webHidden/>
+              </w:rPr>
+            </w:r>
+            <w:r>
+              <w:rPr>
+                <w:noProof/>
+                <w:webHidden/>
+              </w:rPr>
+              <w:fldChar w:fldCharType="separate"/>
+            </w:r>
+            <w:r>
+              <w:rPr>
+                <w:noProof/>
+                <w:webHidden/>
+              </w:rPr>
+              <w:t>7</w:t>
             </w:r>
             <w:r>
               <w:rPr>
@@ -1748,7 +2254,7 @@
               <w:noProof/>
             </w:rPr>
           </w:pPr>
-          <w:hyperlink w:anchor="_Toc230633028" w:history="1">
+          <w:hyperlink w:anchor="_Toc230647594" w:history="1">
             <w:r>
               <w:rPr>
                 <w:rStyle w:val="Hyperlink"/>
@@ -1756,7 +2262,7 @@
                 <w:bCs/>
                 <w:noProof/>
               </w:rPr>
-              <w:t>2.4.</w:t>
+              <w:t>2.5.</w:t>
             </w:r>
             <w:r>
               <w:rPr>
@@ -1772,7 +2278,7 @@
                 <w:bCs/>
                 <w:noProof/>
               </w:rPr>
-              <w:t>AI for Public Transport Systems</w:t>
+              <w:t>Research Gap</w:t>
             </w:r>
             <w:r>
               <w:rPr>
@@ -1793,7 +2299,7 @@
                 <w:noProof/>
                 <w:webHidden/>
               </w:rPr>
-              <w:instrText xml:space="preserve"> PAGEREF _Toc230633028 \h </w:instrText>
+              <w:instrText xml:space="preserve"> PAGEREF _Toc230647594 \h </w:instrText>
             </w:r>
             <w:r>
               <w:rPr>
@@ -1813,7 +2319,7 @@
                 <w:noProof/>
                 <w:webHidden/>
               </w:rPr>
-              <w:t>6</w:t>
+              <w:t>7</w:t>
             </w:r>
             <w:r>
               <w:rPr>
@@ -1826,9 +2332,9 @@
         </w:p>
         <w:p>
           <w:pPr>
-            <w:pStyle w:val="TOC3"/>
+            <w:pStyle w:val="TOC1"/>
             <w:tabs>
-              <w:tab w:val="left" w:pos="1440"/>
+              <w:tab w:val="left" w:pos="480"/>
               <w:tab w:val="right" w:leader="dot" w:pos="9016"/>
             </w:tabs>
             <w:rPr>
@@ -1836,7 +2342,7 @@
               <w:noProof/>
             </w:rPr>
           </w:pPr>
-          <w:hyperlink w:anchor="_Toc230633029" w:history="1">
+          <w:hyperlink w:anchor="_Toc230647595" w:history="1">
             <w:r>
               <w:rPr>
                 <w:rStyle w:val="Hyperlink"/>
@@ -1844,7 +2350,7 @@
                 <w:bCs/>
                 <w:noProof/>
               </w:rPr>
-              <w:t>2.4.1.</w:t>
+              <w:t>3.</w:t>
             </w:r>
             <w:r>
               <w:rPr>
@@ -1860,7 +2366,7 @@
                 <w:bCs/>
                 <w:noProof/>
               </w:rPr>
-              <w:t>Deployment Challenges</w:t>
+              <w:t>Methodology</w:t>
             </w:r>
             <w:r>
               <w:rPr>
@@ -1881,7 +2387,7 @@
                 <w:noProof/>
                 <w:webHidden/>
               </w:rPr>
-              <w:instrText xml:space="preserve"> PAGEREF _Toc230633029 \h </w:instrText>
+              <w:instrText xml:space="preserve"> PAGEREF _Toc230647595 \h </w:instrText>
             </w:r>
             <w:r>
               <w:rPr>
@@ -1901,95 +2407,7 @@
                 <w:noProof/>
                 <w:webHidden/>
               </w:rPr>
-              <w:t>6</w:t>
-            </w:r>
-            <w:r>
-              <w:rPr>
-                <w:noProof/>
-                <w:webHidden/>
-              </w:rPr>
-              <w:fldChar w:fldCharType="end"/>
-            </w:r>
-          </w:hyperlink>
-        </w:p>
-        <w:p>
-          <w:pPr>
-            <w:pStyle w:val="TOC3"/>
-            <w:tabs>
-              <w:tab w:val="left" w:pos="1440"/>
-              <w:tab w:val="right" w:leader="dot" w:pos="9016"/>
-            </w:tabs>
-            <w:rPr>
-              <w:rFonts w:asciiTheme="minorHAnsi" w:hAnsiTheme="minorHAnsi"/>
-              <w:noProof/>
-            </w:rPr>
-          </w:pPr>
-          <w:hyperlink w:anchor="_Toc230633030" w:history="1">
-            <w:r>
-              <w:rPr>
-                <w:rStyle w:val="Hyperlink"/>
-                <w:b/>
-                <w:bCs/>
-                <w:noProof/>
-              </w:rPr>
-              <w:t>2.4.2.</w:t>
-            </w:r>
-            <w:r>
-              <w:rPr>
-                <w:rFonts w:asciiTheme="minorHAnsi" w:hAnsiTheme="minorHAnsi"/>
-                <w:noProof/>
-              </w:rPr>
-              <w:tab/>
-            </w:r>
-            <w:r>
-              <w:rPr>
-                <w:rStyle w:val="Hyperlink"/>
-                <w:b/>
-                <w:bCs/>
-                <w:noProof/>
-              </w:rPr>
-              <w:t>Sustainable Urban Mobility</w:t>
-            </w:r>
-            <w:r>
-              <w:rPr>
-                <w:noProof/>
-                <w:webHidden/>
-              </w:rPr>
-              <w:tab/>
-            </w:r>
-            <w:r>
-              <w:rPr>
-                <w:noProof/>
-                <w:webHidden/>
-              </w:rPr>
-              <w:fldChar w:fldCharType="begin"/>
-            </w:r>
-            <w:r>
-              <w:rPr>
-                <w:noProof/>
-                <w:webHidden/>
-              </w:rPr>
-              <w:instrText xml:space="preserve"> PAGEREF _Toc230633030 \h </w:instrText>
-            </w:r>
-            <w:r>
-              <w:rPr>
-                <w:noProof/>
-                <w:webHidden/>
-              </w:rPr>
-            </w:r>
-            <w:r>
-              <w:rPr>
-                <w:noProof/>
-                <w:webHidden/>
-              </w:rPr>
-              <w:fldChar w:fldCharType="separate"/>
-            </w:r>
-            <w:r>
-              <w:rPr>
-                <w:noProof/>
-                <w:webHidden/>
-              </w:rPr>
-              <w:t>6</w:t>
+              <w:t>7</w:t>
             </w:r>
             <w:r>
               <w:rPr>
@@ -2012,7 +2430,7 @@
               <w:noProof/>
             </w:rPr>
           </w:pPr>
-          <w:hyperlink w:anchor="_Toc230633031" w:history="1">
+          <w:hyperlink w:anchor="_Toc230647596" w:history="1">
             <w:r>
               <w:rPr>
                 <w:rStyle w:val="Hyperlink"/>
@@ -2020,7 +2438,7 @@
                 <w:bCs/>
                 <w:noProof/>
               </w:rPr>
-              <w:t>2.5.</w:t>
+              <w:t>3.1.</w:t>
             </w:r>
             <w:r>
               <w:rPr>
@@ -2036,7 +2454,7 @@
                 <w:bCs/>
                 <w:noProof/>
               </w:rPr>
-              <w:t>Research Gap</w:t>
+              <w:t>Data Collection</w:t>
             </w:r>
             <w:r>
               <w:rPr>
@@ -2057,7 +2475,7 @@
                 <w:noProof/>
                 <w:webHidden/>
               </w:rPr>
-              <w:instrText xml:space="preserve"> PAGEREF _Toc230633031 \h </w:instrText>
+              <w:instrText xml:space="preserve"> PAGEREF _Toc230647596 \h </w:instrText>
             </w:r>
             <w:r>
               <w:rPr>
@@ -2077,7 +2495,447 @@
                 <w:noProof/>
                 <w:webHidden/>
               </w:rPr>
-              <w:t>6</w:t>
+              <w:t>7</w:t>
+            </w:r>
+            <w:r>
+              <w:rPr>
+                <w:noProof/>
+                <w:webHidden/>
+              </w:rPr>
+              <w:fldChar w:fldCharType="end"/>
+            </w:r>
+          </w:hyperlink>
+        </w:p>
+        <w:p>
+          <w:pPr>
+            <w:pStyle w:val="TOC2"/>
+            <w:tabs>
+              <w:tab w:val="left" w:pos="960"/>
+              <w:tab w:val="right" w:leader="dot" w:pos="9016"/>
+            </w:tabs>
+            <w:rPr>
+              <w:rFonts w:asciiTheme="minorHAnsi" w:hAnsiTheme="minorHAnsi"/>
+              <w:noProof/>
+            </w:rPr>
+          </w:pPr>
+          <w:hyperlink w:anchor="_Toc230647597" w:history="1">
+            <w:r>
+              <w:rPr>
+                <w:rStyle w:val="Hyperlink"/>
+                <w:b/>
+                <w:bCs/>
+                <w:noProof/>
+              </w:rPr>
+              <w:t>3.2.</w:t>
+            </w:r>
+            <w:r>
+              <w:rPr>
+                <w:rFonts w:asciiTheme="minorHAnsi" w:hAnsiTheme="minorHAnsi"/>
+                <w:noProof/>
+              </w:rPr>
+              <w:tab/>
+            </w:r>
+            <w:r>
+              <w:rPr>
+                <w:rStyle w:val="Hyperlink"/>
+                <w:b/>
+                <w:bCs/>
+                <w:noProof/>
+              </w:rPr>
+              <w:t>Data Preprocessing</w:t>
+            </w:r>
+            <w:r>
+              <w:rPr>
+                <w:noProof/>
+                <w:webHidden/>
+              </w:rPr>
+              <w:tab/>
+            </w:r>
+            <w:r>
+              <w:rPr>
+                <w:noProof/>
+                <w:webHidden/>
+              </w:rPr>
+              <w:fldChar w:fldCharType="begin"/>
+            </w:r>
+            <w:r>
+              <w:rPr>
+                <w:noProof/>
+                <w:webHidden/>
+              </w:rPr>
+              <w:instrText xml:space="preserve"> PAGEREF _Toc230647597 \h </w:instrText>
+            </w:r>
+            <w:r>
+              <w:rPr>
+                <w:noProof/>
+                <w:webHidden/>
+              </w:rPr>
+            </w:r>
+            <w:r>
+              <w:rPr>
+                <w:noProof/>
+                <w:webHidden/>
+              </w:rPr>
+              <w:fldChar w:fldCharType="separate"/>
+            </w:r>
+            <w:r>
+              <w:rPr>
+                <w:noProof/>
+                <w:webHidden/>
+              </w:rPr>
+              <w:t>7</w:t>
+            </w:r>
+            <w:r>
+              <w:rPr>
+                <w:noProof/>
+                <w:webHidden/>
+              </w:rPr>
+              <w:fldChar w:fldCharType="end"/>
+            </w:r>
+          </w:hyperlink>
+        </w:p>
+        <w:p>
+          <w:pPr>
+            <w:pStyle w:val="TOC2"/>
+            <w:tabs>
+              <w:tab w:val="left" w:pos="960"/>
+              <w:tab w:val="right" w:leader="dot" w:pos="9016"/>
+            </w:tabs>
+            <w:rPr>
+              <w:rFonts w:asciiTheme="minorHAnsi" w:hAnsiTheme="minorHAnsi"/>
+              <w:noProof/>
+            </w:rPr>
+          </w:pPr>
+          <w:hyperlink w:anchor="_Toc230647598" w:history="1">
+            <w:r>
+              <w:rPr>
+                <w:rStyle w:val="Hyperlink"/>
+                <w:b/>
+                <w:bCs/>
+                <w:noProof/>
+              </w:rPr>
+              <w:t>3.3.</w:t>
+            </w:r>
+            <w:r>
+              <w:rPr>
+                <w:rFonts w:asciiTheme="minorHAnsi" w:hAnsiTheme="minorHAnsi"/>
+                <w:noProof/>
+              </w:rPr>
+              <w:tab/>
+            </w:r>
+            <w:r>
+              <w:rPr>
+                <w:rStyle w:val="Hyperlink"/>
+                <w:b/>
+                <w:bCs/>
+                <w:noProof/>
+              </w:rPr>
+              <w:t>Feature Engineering</w:t>
+            </w:r>
+            <w:r>
+              <w:rPr>
+                <w:noProof/>
+                <w:webHidden/>
+              </w:rPr>
+              <w:tab/>
+            </w:r>
+            <w:r>
+              <w:rPr>
+                <w:noProof/>
+                <w:webHidden/>
+              </w:rPr>
+              <w:fldChar w:fldCharType="begin"/>
+            </w:r>
+            <w:r>
+              <w:rPr>
+                <w:noProof/>
+                <w:webHidden/>
+              </w:rPr>
+              <w:instrText xml:space="preserve"> PAGEREF _Toc230647598 \h </w:instrText>
+            </w:r>
+            <w:r>
+              <w:rPr>
+                <w:noProof/>
+                <w:webHidden/>
+              </w:rPr>
+            </w:r>
+            <w:r>
+              <w:rPr>
+                <w:noProof/>
+                <w:webHidden/>
+              </w:rPr>
+              <w:fldChar w:fldCharType="separate"/>
+            </w:r>
+            <w:r>
+              <w:rPr>
+                <w:noProof/>
+                <w:webHidden/>
+              </w:rPr>
+              <w:t>7</w:t>
+            </w:r>
+            <w:r>
+              <w:rPr>
+                <w:noProof/>
+                <w:webHidden/>
+              </w:rPr>
+              <w:fldChar w:fldCharType="end"/>
+            </w:r>
+          </w:hyperlink>
+        </w:p>
+        <w:p>
+          <w:pPr>
+            <w:pStyle w:val="TOC2"/>
+            <w:tabs>
+              <w:tab w:val="left" w:pos="960"/>
+              <w:tab w:val="right" w:leader="dot" w:pos="9016"/>
+            </w:tabs>
+            <w:rPr>
+              <w:rFonts w:asciiTheme="minorHAnsi" w:hAnsiTheme="minorHAnsi"/>
+              <w:noProof/>
+            </w:rPr>
+          </w:pPr>
+          <w:hyperlink w:anchor="_Toc230647599" w:history="1">
+            <w:r>
+              <w:rPr>
+                <w:rStyle w:val="Hyperlink"/>
+                <w:b/>
+                <w:bCs/>
+                <w:noProof/>
+              </w:rPr>
+              <w:t>3.4.</w:t>
+            </w:r>
+            <w:r>
+              <w:rPr>
+                <w:rFonts w:asciiTheme="minorHAnsi" w:hAnsiTheme="minorHAnsi"/>
+                <w:noProof/>
+              </w:rPr>
+              <w:tab/>
+            </w:r>
+            <w:r>
+              <w:rPr>
+                <w:rStyle w:val="Hyperlink"/>
+                <w:b/>
+                <w:bCs/>
+                <w:noProof/>
+              </w:rPr>
+              <w:t>Explanatory Data Analysis</w:t>
+            </w:r>
+            <w:r>
+              <w:rPr>
+                <w:noProof/>
+                <w:webHidden/>
+              </w:rPr>
+              <w:tab/>
+            </w:r>
+            <w:r>
+              <w:rPr>
+                <w:noProof/>
+                <w:webHidden/>
+              </w:rPr>
+              <w:fldChar w:fldCharType="begin"/>
+            </w:r>
+            <w:r>
+              <w:rPr>
+                <w:noProof/>
+                <w:webHidden/>
+              </w:rPr>
+              <w:instrText xml:space="preserve"> PAGEREF _Toc230647599 \h </w:instrText>
+            </w:r>
+            <w:r>
+              <w:rPr>
+                <w:noProof/>
+                <w:webHidden/>
+              </w:rPr>
+            </w:r>
+            <w:r>
+              <w:rPr>
+                <w:noProof/>
+                <w:webHidden/>
+              </w:rPr>
+              <w:fldChar w:fldCharType="separate"/>
+            </w:r>
+            <w:r>
+              <w:rPr>
+                <w:noProof/>
+                <w:webHidden/>
+              </w:rPr>
+              <w:t>7</w:t>
+            </w:r>
+            <w:r>
+              <w:rPr>
+                <w:noProof/>
+                <w:webHidden/>
+              </w:rPr>
+              <w:fldChar w:fldCharType="end"/>
+            </w:r>
+          </w:hyperlink>
+        </w:p>
+        <w:p>
+          <w:pPr>
+            <w:pStyle w:val="TOC2"/>
+            <w:tabs>
+              <w:tab w:val="left" w:pos="960"/>
+              <w:tab w:val="right" w:leader="dot" w:pos="9016"/>
+            </w:tabs>
+            <w:rPr>
+              <w:rFonts w:asciiTheme="minorHAnsi" w:hAnsiTheme="minorHAnsi"/>
+              <w:noProof/>
+            </w:rPr>
+          </w:pPr>
+          <w:hyperlink w:anchor="_Toc230647600" w:history="1">
+            <w:r>
+              <w:rPr>
+                <w:rStyle w:val="Hyperlink"/>
+                <w:b/>
+                <w:bCs/>
+                <w:noProof/>
+              </w:rPr>
+              <w:t>3.5.</w:t>
+            </w:r>
+            <w:r>
+              <w:rPr>
+                <w:rFonts w:asciiTheme="minorHAnsi" w:hAnsiTheme="minorHAnsi"/>
+                <w:noProof/>
+              </w:rPr>
+              <w:tab/>
+            </w:r>
+            <w:r>
+              <w:rPr>
+                <w:rStyle w:val="Hyperlink"/>
+                <w:b/>
+                <w:bCs/>
+                <w:noProof/>
+              </w:rPr>
+              <w:t>Baseline &amp; Comparative Models</w:t>
+            </w:r>
+            <w:r>
+              <w:rPr>
+                <w:noProof/>
+                <w:webHidden/>
+              </w:rPr>
+              <w:tab/>
+            </w:r>
+            <w:r>
+              <w:rPr>
+                <w:noProof/>
+                <w:webHidden/>
+              </w:rPr>
+              <w:fldChar w:fldCharType="begin"/>
+            </w:r>
+            <w:r>
+              <w:rPr>
+                <w:noProof/>
+                <w:webHidden/>
+              </w:rPr>
+              <w:instrText xml:space="preserve"> PAGEREF _Toc230647600 \h </w:instrText>
+            </w:r>
+            <w:r>
+              <w:rPr>
+                <w:noProof/>
+                <w:webHidden/>
+              </w:rPr>
+            </w:r>
+            <w:r>
+              <w:rPr>
+                <w:noProof/>
+                <w:webHidden/>
+              </w:rPr>
+              <w:fldChar w:fldCharType="separate"/>
+            </w:r>
+            <w:r>
+              <w:rPr>
+                <w:noProof/>
+                <w:webHidden/>
+              </w:rPr>
+              <w:t>7</w:t>
+            </w:r>
+            <w:r>
+              <w:rPr>
+                <w:noProof/>
+                <w:webHidden/>
+              </w:rPr>
+              <w:fldChar w:fldCharType="end"/>
+            </w:r>
+          </w:hyperlink>
+        </w:p>
+        <w:p>
+          <w:pPr>
+            <w:pStyle w:val="TOC2"/>
+            <w:tabs>
+              <w:tab w:val="left" w:pos="960"/>
+              <w:tab w:val="right" w:leader="dot" w:pos="9016"/>
+            </w:tabs>
+            <w:rPr>
+              <w:rFonts w:asciiTheme="minorHAnsi" w:hAnsiTheme="minorHAnsi"/>
+              <w:noProof/>
+            </w:rPr>
+          </w:pPr>
+          <w:hyperlink w:anchor="_Toc230647601" w:history="1">
+            <w:r>
+              <w:rPr>
+                <w:rStyle w:val="Hyperlink"/>
+                <w:b/>
+                <w:bCs/>
+                <w:noProof/>
+              </w:rPr>
+              <w:t>3.6.</w:t>
+            </w:r>
+            <w:r>
+              <w:rPr>
+                <w:rFonts w:asciiTheme="minorHAnsi" w:hAnsiTheme="minorHAnsi"/>
+                <w:noProof/>
+              </w:rPr>
+              <w:tab/>
+            </w:r>
+            <w:r>
+              <w:rPr>
+                <w:rStyle w:val="Hyperlink"/>
+                <w:b/>
+                <w:bCs/>
+                <w:noProof/>
+              </w:rPr>
+              <w:t>Proposed Model</w:t>
+            </w:r>
+            <w:r>
+              <w:rPr>
+                <w:noProof/>
+                <w:webHidden/>
+              </w:rPr>
+              <w:tab/>
+            </w:r>
+            <w:r>
+              <w:rPr>
+                <w:noProof/>
+                <w:webHidden/>
+              </w:rPr>
+              <w:fldChar w:fldCharType="begin"/>
+            </w:r>
+            <w:r>
+              <w:rPr>
+                <w:noProof/>
+                <w:webHidden/>
+              </w:rPr>
+              <w:instrText xml:space="preserve"> PAGEREF _Toc230647601 \h </w:instrText>
+            </w:r>
+            <w:r>
+              <w:rPr>
+                <w:noProof/>
+                <w:webHidden/>
+              </w:rPr>
+            </w:r>
+            <w:r>
+              <w:rPr>
+                <w:noProof/>
+                <w:webHidden/>
+              </w:rPr>
+              <w:fldChar w:fldCharType="separate"/>
+            </w:r>
+            <w:r>
+              <w:rPr>
+                <w:noProof/>
+                <w:webHidden/>
+              </w:rPr>
+              <w:t>8</w:t>
             </w:r>
             <w:r>
               <w:rPr>
@@ -2100,7 +2958,7 @@
               <w:noProof/>
             </w:rPr>
           </w:pPr>
-          <w:hyperlink w:anchor="_Toc230633032" w:history="1">
+          <w:hyperlink w:anchor="_Toc230647602" w:history="1">
             <w:r>
               <w:rPr>
                 <w:rStyle w:val="Hyperlink"/>
@@ -2108,7 +2966,7 @@
                 <w:bCs/>
                 <w:noProof/>
               </w:rPr>
-              <w:t>3.</w:t>
+              <w:t>4.</w:t>
             </w:r>
             <w:r>
               <w:rPr>
@@ -2124,7 +2982,7 @@
                 <w:bCs/>
                 <w:noProof/>
               </w:rPr>
-              <w:t>Methodology</w:t>
+              <w:t>Expected Outcomes</w:t>
             </w:r>
             <w:r>
               <w:rPr>
@@ -2145,7 +3003,7 @@
                 <w:noProof/>
                 <w:webHidden/>
               </w:rPr>
-              <w:instrText xml:space="preserve"> PAGEREF _Toc230633032 \h </w:instrText>
+              <w:instrText xml:space="preserve"> PAGEREF _Toc230647602 \h </w:instrText>
             </w:r>
             <w:r>
               <w:rPr>
@@ -2165,535 +3023,7 @@
                 <w:noProof/>
                 <w:webHidden/>
               </w:rPr>
-              <w:t>6</w:t>
-            </w:r>
-            <w:r>
-              <w:rPr>
-                <w:noProof/>
-                <w:webHidden/>
-              </w:rPr>
-              <w:fldChar w:fldCharType="end"/>
-            </w:r>
-          </w:hyperlink>
-        </w:p>
-        <w:p>
-          <w:pPr>
-            <w:pStyle w:val="TOC2"/>
-            <w:tabs>
-              <w:tab w:val="left" w:pos="960"/>
-              <w:tab w:val="right" w:leader="dot" w:pos="9016"/>
-            </w:tabs>
-            <w:rPr>
-              <w:rFonts w:asciiTheme="minorHAnsi" w:hAnsiTheme="minorHAnsi"/>
-              <w:noProof/>
-            </w:rPr>
-          </w:pPr>
-          <w:hyperlink w:anchor="_Toc230633033" w:history="1">
-            <w:r>
-              <w:rPr>
-                <w:rStyle w:val="Hyperlink"/>
-                <w:b/>
-                <w:bCs/>
-                <w:noProof/>
-              </w:rPr>
-              <w:t>3.1.</w:t>
-            </w:r>
-            <w:r>
-              <w:rPr>
-                <w:rFonts w:asciiTheme="minorHAnsi" w:hAnsiTheme="minorHAnsi"/>
-                <w:noProof/>
-              </w:rPr>
-              <w:tab/>
-            </w:r>
-            <w:r>
-              <w:rPr>
-                <w:rStyle w:val="Hyperlink"/>
-                <w:b/>
-                <w:bCs/>
-                <w:noProof/>
-              </w:rPr>
-              <w:t>Data Collection</w:t>
-            </w:r>
-            <w:r>
-              <w:rPr>
-                <w:noProof/>
-                <w:webHidden/>
-              </w:rPr>
-              <w:tab/>
-            </w:r>
-            <w:r>
-              <w:rPr>
-                <w:noProof/>
-                <w:webHidden/>
-              </w:rPr>
-              <w:fldChar w:fldCharType="begin"/>
-            </w:r>
-            <w:r>
-              <w:rPr>
-                <w:noProof/>
-                <w:webHidden/>
-              </w:rPr>
-              <w:instrText xml:space="preserve"> PAGEREF _Toc230633033 \h </w:instrText>
-            </w:r>
-            <w:r>
-              <w:rPr>
-                <w:noProof/>
-                <w:webHidden/>
-              </w:rPr>
-            </w:r>
-            <w:r>
-              <w:rPr>
-                <w:noProof/>
-                <w:webHidden/>
-              </w:rPr>
-              <w:fldChar w:fldCharType="separate"/>
-            </w:r>
-            <w:r>
-              <w:rPr>
-                <w:noProof/>
-                <w:webHidden/>
-              </w:rPr>
-              <w:t>6</w:t>
-            </w:r>
-            <w:r>
-              <w:rPr>
-                <w:noProof/>
-                <w:webHidden/>
-              </w:rPr>
-              <w:fldChar w:fldCharType="end"/>
-            </w:r>
-          </w:hyperlink>
-        </w:p>
-        <w:p>
-          <w:pPr>
-            <w:pStyle w:val="TOC2"/>
-            <w:tabs>
-              <w:tab w:val="left" w:pos="960"/>
-              <w:tab w:val="right" w:leader="dot" w:pos="9016"/>
-            </w:tabs>
-            <w:rPr>
-              <w:rFonts w:asciiTheme="minorHAnsi" w:hAnsiTheme="minorHAnsi"/>
-              <w:noProof/>
-            </w:rPr>
-          </w:pPr>
-          <w:hyperlink w:anchor="_Toc230633034" w:history="1">
-            <w:r>
-              <w:rPr>
-                <w:rStyle w:val="Hyperlink"/>
-                <w:b/>
-                <w:bCs/>
-                <w:noProof/>
-              </w:rPr>
-              <w:t>3.2.</w:t>
-            </w:r>
-            <w:r>
-              <w:rPr>
-                <w:rFonts w:asciiTheme="minorHAnsi" w:hAnsiTheme="minorHAnsi"/>
-                <w:noProof/>
-              </w:rPr>
-              <w:tab/>
-            </w:r>
-            <w:r>
-              <w:rPr>
-                <w:rStyle w:val="Hyperlink"/>
-                <w:b/>
-                <w:bCs/>
-                <w:noProof/>
-              </w:rPr>
-              <w:t>Data Preprocessing</w:t>
-            </w:r>
-            <w:r>
-              <w:rPr>
-                <w:noProof/>
-                <w:webHidden/>
-              </w:rPr>
-              <w:tab/>
-            </w:r>
-            <w:r>
-              <w:rPr>
-                <w:noProof/>
-                <w:webHidden/>
-              </w:rPr>
-              <w:fldChar w:fldCharType="begin"/>
-            </w:r>
-            <w:r>
-              <w:rPr>
-                <w:noProof/>
-                <w:webHidden/>
-              </w:rPr>
-              <w:instrText xml:space="preserve"> PAGEREF _Toc230633034 \h </w:instrText>
-            </w:r>
-            <w:r>
-              <w:rPr>
-                <w:noProof/>
-                <w:webHidden/>
-              </w:rPr>
-            </w:r>
-            <w:r>
-              <w:rPr>
-                <w:noProof/>
-                <w:webHidden/>
-              </w:rPr>
-              <w:fldChar w:fldCharType="separate"/>
-            </w:r>
-            <w:r>
-              <w:rPr>
-                <w:noProof/>
-                <w:webHidden/>
-              </w:rPr>
-              <w:t>6</w:t>
-            </w:r>
-            <w:r>
-              <w:rPr>
-                <w:noProof/>
-                <w:webHidden/>
-              </w:rPr>
-              <w:fldChar w:fldCharType="end"/>
-            </w:r>
-          </w:hyperlink>
-        </w:p>
-        <w:p>
-          <w:pPr>
-            <w:pStyle w:val="TOC2"/>
-            <w:tabs>
-              <w:tab w:val="left" w:pos="960"/>
-              <w:tab w:val="right" w:leader="dot" w:pos="9016"/>
-            </w:tabs>
-            <w:rPr>
-              <w:rFonts w:asciiTheme="minorHAnsi" w:hAnsiTheme="minorHAnsi"/>
-              <w:noProof/>
-            </w:rPr>
-          </w:pPr>
-          <w:hyperlink w:anchor="_Toc230633035" w:history="1">
-            <w:r>
-              <w:rPr>
-                <w:rStyle w:val="Hyperlink"/>
-                <w:b/>
-                <w:bCs/>
-                <w:noProof/>
-              </w:rPr>
-              <w:t>3.3.</w:t>
-            </w:r>
-            <w:r>
-              <w:rPr>
-                <w:rFonts w:asciiTheme="minorHAnsi" w:hAnsiTheme="minorHAnsi"/>
-                <w:noProof/>
-              </w:rPr>
-              <w:tab/>
-            </w:r>
-            <w:r>
-              <w:rPr>
-                <w:rStyle w:val="Hyperlink"/>
-                <w:b/>
-                <w:bCs/>
-                <w:noProof/>
-              </w:rPr>
-              <w:t>Feature Engineering</w:t>
-            </w:r>
-            <w:r>
-              <w:rPr>
-                <w:noProof/>
-                <w:webHidden/>
-              </w:rPr>
-              <w:tab/>
-            </w:r>
-            <w:r>
-              <w:rPr>
-                <w:noProof/>
-                <w:webHidden/>
-              </w:rPr>
-              <w:fldChar w:fldCharType="begin"/>
-            </w:r>
-            <w:r>
-              <w:rPr>
-                <w:noProof/>
-                <w:webHidden/>
-              </w:rPr>
-              <w:instrText xml:space="preserve"> PAGEREF _Toc230633035 \h </w:instrText>
-            </w:r>
-            <w:r>
-              <w:rPr>
-                <w:noProof/>
-                <w:webHidden/>
-              </w:rPr>
-            </w:r>
-            <w:r>
-              <w:rPr>
-                <w:noProof/>
-                <w:webHidden/>
-              </w:rPr>
-              <w:fldChar w:fldCharType="separate"/>
-            </w:r>
-            <w:r>
-              <w:rPr>
-                <w:noProof/>
-                <w:webHidden/>
-              </w:rPr>
-              <w:t>6</w:t>
-            </w:r>
-            <w:r>
-              <w:rPr>
-                <w:noProof/>
-                <w:webHidden/>
-              </w:rPr>
-              <w:fldChar w:fldCharType="end"/>
-            </w:r>
-          </w:hyperlink>
-        </w:p>
-        <w:p>
-          <w:pPr>
-            <w:pStyle w:val="TOC2"/>
-            <w:tabs>
-              <w:tab w:val="left" w:pos="960"/>
-              <w:tab w:val="right" w:leader="dot" w:pos="9016"/>
-            </w:tabs>
-            <w:rPr>
-              <w:rFonts w:asciiTheme="minorHAnsi" w:hAnsiTheme="minorHAnsi"/>
-              <w:noProof/>
-            </w:rPr>
-          </w:pPr>
-          <w:hyperlink w:anchor="_Toc230633036" w:history="1">
-            <w:r>
-              <w:rPr>
-                <w:rStyle w:val="Hyperlink"/>
-                <w:b/>
-                <w:bCs/>
-                <w:noProof/>
-              </w:rPr>
-              <w:t>3.4.</w:t>
-            </w:r>
-            <w:r>
-              <w:rPr>
-                <w:rFonts w:asciiTheme="minorHAnsi" w:hAnsiTheme="minorHAnsi"/>
-                <w:noProof/>
-              </w:rPr>
-              <w:tab/>
-            </w:r>
-            <w:r>
-              <w:rPr>
-                <w:rStyle w:val="Hyperlink"/>
-                <w:b/>
-                <w:bCs/>
-                <w:noProof/>
-              </w:rPr>
-              <w:t>Explanatory Data Analysis</w:t>
-            </w:r>
-            <w:r>
-              <w:rPr>
-                <w:noProof/>
-                <w:webHidden/>
-              </w:rPr>
-              <w:tab/>
-            </w:r>
-            <w:r>
-              <w:rPr>
-                <w:noProof/>
-                <w:webHidden/>
-              </w:rPr>
-              <w:fldChar w:fldCharType="begin"/>
-            </w:r>
-            <w:r>
-              <w:rPr>
-                <w:noProof/>
-                <w:webHidden/>
-              </w:rPr>
-              <w:instrText xml:space="preserve"> PAGEREF _Toc230633036 \h </w:instrText>
-            </w:r>
-            <w:r>
-              <w:rPr>
-                <w:noProof/>
-                <w:webHidden/>
-              </w:rPr>
-            </w:r>
-            <w:r>
-              <w:rPr>
-                <w:noProof/>
-                <w:webHidden/>
-              </w:rPr>
-              <w:fldChar w:fldCharType="separate"/>
-            </w:r>
-            <w:r>
-              <w:rPr>
-                <w:noProof/>
-                <w:webHidden/>
-              </w:rPr>
-              <w:t>6</w:t>
-            </w:r>
-            <w:r>
-              <w:rPr>
-                <w:noProof/>
-                <w:webHidden/>
-              </w:rPr>
-              <w:fldChar w:fldCharType="end"/>
-            </w:r>
-          </w:hyperlink>
-        </w:p>
-        <w:p>
-          <w:pPr>
-            <w:pStyle w:val="TOC2"/>
-            <w:tabs>
-              <w:tab w:val="left" w:pos="960"/>
-              <w:tab w:val="right" w:leader="dot" w:pos="9016"/>
-            </w:tabs>
-            <w:rPr>
-              <w:rFonts w:asciiTheme="minorHAnsi" w:hAnsiTheme="minorHAnsi"/>
-              <w:noProof/>
-            </w:rPr>
-          </w:pPr>
-          <w:hyperlink w:anchor="_Toc230633037" w:history="1">
-            <w:r>
-              <w:rPr>
-                <w:rStyle w:val="Hyperlink"/>
-                <w:b/>
-                <w:bCs/>
-                <w:noProof/>
-              </w:rPr>
-              <w:t>3.5.</w:t>
-            </w:r>
-            <w:r>
-              <w:rPr>
-                <w:rFonts w:asciiTheme="minorHAnsi" w:hAnsiTheme="minorHAnsi"/>
-                <w:noProof/>
-              </w:rPr>
-              <w:tab/>
-            </w:r>
-            <w:r>
-              <w:rPr>
-                <w:rStyle w:val="Hyperlink"/>
-                <w:b/>
-                <w:bCs/>
-                <w:noProof/>
-              </w:rPr>
-              <w:t>Baseline &amp; Comparative Models</w:t>
-            </w:r>
-            <w:r>
-              <w:rPr>
-                <w:noProof/>
-                <w:webHidden/>
-              </w:rPr>
-              <w:tab/>
-            </w:r>
-            <w:r>
-              <w:rPr>
-                <w:noProof/>
-                <w:webHidden/>
-              </w:rPr>
-              <w:fldChar w:fldCharType="begin"/>
-            </w:r>
-            <w:r>
-              <w:rPr>
-                <w:noProof/>
-                <w:webHidden/>
-              </w:rPr>
-              <w:instrText xml:space="preserve"> PAGEREF _Toc230633037 \h </w:instrText>
-            </w:r>
-            <w:r>
-              <w:rPr>
-                <w:noProof/>
-                <w:webHidden/>
-              </w:rPr>
-            </w:r>
-            <w:r>
-              <w:rPr>
-                <w:noProof/>
-                <w:webHidden/>
-              </w:rPr>
-              <w:fldChar w:fldCharType="separate"/>
-            </w:r>
-            <w:r>
-              <w:rPr>
-                <w:noProof/>
-                <w:webHidden/>
-              </w:rPr>
-              <w:t>6</w:t>
-            </w:r>
-            <w:r>
-              <w:rPr>
-                <w:noProof/>
-                <w:webHidden/>
-              </w:rPr>
-              <w:fldChar w:fldCharType="end"/>
-            </w:r>
-          </w:hyperlink>
-        </w:p>
-        <w:p>
-          <w:pPr>
-            <w:pStyle w:val="TOC2"/>
-            <w:tabs>
-              <w:tab w:val="left" w:pos="960"/>
-              <w:tab w:val="right" w:leader="dot" w:pos="9016"/>
-            </w:tabs>
-            <w:rPr>
-              <w:rFonts w:asciiTheme="minorHAnsi" w:hAnsiTheme="minorHAnsi"/>
-              <w:noProof/>
-            </w:rPr>
-          </w:pPr>
-          <w:hyperlink w:anchor="_Toc230633038" w:history="1">
-            <w:r>
-              <w:rPr>
-                <w:rStyle w:val="Hyperlink"/>
-                <w:b/>
-                <w:bCs/>
-                <w:noProof/>
-              </w:rPr>
-              <w:t>3.6.</w:t>
-            </w:r>
-            <w:r>
-              <w:rPr>
-                <w:rFonts w:asciiTheme="minorHAnsi" w:hAnsiTheme="minorHAnsi"/>
-                <w:noProof/>
-              </w:rPr>
-              <w:tab/>
-            </w:r>
-            <w:r>
-              <w:rPr>
-                <w:rStyle w:val="Hyperlink"/>
-                <w:b/>
-                <w:bCs/>
-                <w:noProof/>
-              </w:rPr>
-              <w:t>Proposed Model</w:t>
-            </w:r>
-            <w:r>
-              <w:rPr>
-                <w:noProof/>
-                <w:webHidden/>
-              </w:rPr>
-              <w:tab/>
-            </w:r>
-            <w:r>
-              <w:rPr>
-                <w:noProof/>
-                <w:webHidden/>
-              </w:rPr>
-              <w:fldChar w:fldCharType="begin"/>
-            </w:r>
-            <w:r>
-              <w:rPr>
-                <w:noProof/>
-                <w:webHidden/>
-              </w:rPr>
-              <w:instrText xml:space="preserve"> PAGEREF _Toc230633038 \h </w:instrText>
-            </w:r>
-            <w:r>
-              <w:rPr>
-                <w:noProof/>
-                <w:webHidden/>
-              </w:rPr>
-            </w:r>
-            <w:r>
-              <w:rPr>
-                <w:noProof/>
-                <w:webHidden/>
-              </w:rPr>
-              <w:fldChar w:fldCharType="separate"/>
-            </w:r>
-            <w:r>
-              <w:rPr>
-                <w:noProof/>
-                <w:webHidden/>
-              </w:rPr>
-              <w:t>6</w:t>
+              <w:t>8</w:t>
             </w:r>
             <w:r>
               <w:rPr>
@@ -2716,7 +3046,7 @@
               <w:noProof/>
             </w:rPr>
           </w:pPr>
-          <w:hyperlink w:anchor="_Toc230633039" w:history="1">
+          <w:hyperlink w:anchor="_Toc230647603" w:history="1">
             <w:r>
               <w:rPr>
                 <w:rStyle w:val="Hyperlink"/>
@@ -2724,7 +3054,7 @@
                 <w:bCs/>
                 <w:noProof/>
               </w:rPr>
-              <w:t>4.</w:t>
+              <w:t>5.</w:t>
             </w:r>
             <w:r>
               <w:rPr>
@@ -2740,7 +3070,7 @@
                 <w:bCs/>
                 <w:noProof/>
               </w:rPr>
-              <w:t>Expected Outcomes</w:t>
+              <w:t>References</w:t>
             </w:r>
             <w:r>
               <w:rPr>
@@ -2761,7 +3091,7 @@
                 <w:noProof/>
                 <w:webHidden/>
               </w:rPr>
-              <w:instrText xml:space="preserve"> PAGEREF _Toc230633039 \h </w:instrText>
+              <w:instrText xml:space="preserve"> PAGEREF _Toc230647603 \h </w:instrText>
             </w:r>
             <w:r>
               <w:rPr>
@@ -2781,95 +3111,7 @@
                 <w:noProof/>
                 <w:webHidden/>
               </w:rPr>
-              <w:t>7</w:t>
-            </w:r>
-            <w:r>
-              <w:rPr>
-                <w:noProof/>
-                <w:webHidden/>
-              </w:rPr>
-              <w:fldChar w:fldCharType="end"/>
-            </w:r>
-          </w:hyperlink>
-        </w:p>
-        <w:p>
-          <w:pPr>
-            <w:pStyle w:val="TOC1"/>
-            <w:tabs>
-              <w:tab w:val="left" w:pos="480"/>
-              <w:tab w:val="right" w:leader="dot" w:pos="9016"/>
-            </w:tabs>
-            <w:rPr>
-              <w:rFonts w:asciiTheme="minorHAnsi" w:hAnsiTheme="minorHAnsi"/>
-              <w:noProof/>
-            </w:rPr>
-          </w:pPr>
-          <w:hyperlink w:anchor="_Toc230633040" w:history="1">
-            <w:r>
-              <w:rPr>
-                <w:rStyle w:val="Hyperlink"/>
-                <w:b/>
-                <w:bCs/>
-                <w:noProof/>
-              </w:rPr>
-              <w:t>5.</w:t>
-            </w:r>
-            <w:r>
-              <w:rPr>
-                <w:rFonts w:asciiTheme="minorHAnsi" w:hAnsiTheme="minorHAnsi"/>
-                <w:noProof/>
-              </w:rPr>
-              <w:tab/>
-            </w:r>
-            <w:r>
-              <w:rPr>
-                <w:rStyle w:val="Hyperlink"/>
-                <w:b/>
-                <w:bCs/>
-                <w:noProof/>
-              </w:rPr>
-              <w:t>References</w:t>
-            </w:r>
-            <w:r>
-              <w:rPr>
-                <w:noProof/>
-                <w:webHidden/>
-              </w:rPr>
-              <w:tab/>
-            </w:r>
-            <w:r>
-              <w:rPr>
-                <w:noProof/>
-                <w:webHidden/>
-              </w:rPr>
-              <w:fldChar w:fldCharType="begin"/>
-            </w:r>
-            <w:r>
-              <w:rPr>
-                <w:noProof/>
-                <w:webHidden/>
-              </w:rPr>
-              <w:instrText xml:space="preserve"> PAGEREF _Toc230633040 \h </w:instrText>
-            </w:r>
-            <w:r>
-              <w:rPr>
-                <w:noProof/>
-                <w:webHidden/>
-              </w:rPr>
-            </w:r>
-            <w:r>
-              <w:rPr>
-                <w:noProof/>
-                <w:webHidden/>
-              </w:rPr>
-              <w:fldChar w:fldCharType="separate"/>
-            </w:r>
-            <w:r>
-              <w:rPr>
-                <w:noProof/>
-                <w:webHidden/>
-              </w:rPr>
-              <w:t>7</w:t>
+              <w:t>8</w:t>
             </w:r>
             <w:r>
               <w:rPr>
@@ -2908,7 +3150,7 @@
           <w:u w:val="single"/>
         </w:rPr>
       </w:pPr>
-      <w:bookmarkStart w:id="0" w:name="_Toc230633009"/>
+      <w:bookmarkStart w:id="0" w:name="_Toc230647571"/>
       <w:r>
         <w:rPr>
           <w:b/>
@@ -2936,7 +3178,7 @@
           <w:u w:val="single"/>
         </w:rPr>
       </w:pPr>
-      <w:bookmarkStart w:id="1" w:name="_Toc230633010"/>
+      <w:bookmarkStart w:id="1" w:name="_Toc230647572"/>
       <w:r>
         <w:rPr>
           <w:b/>
@@ -3060,10 +3302,10 @@
         <w:t>(Wang, et al., 2025)</w:t>
       </w:r>
       <w:r>
-        <w:t xml:space="preserve">. However, </w:t>
-      </w:r>
-      <w:r>
-        <w:t xml:space="preserve">according to </w:t>
+        <w:t xml:space="preserve">. </w:t>
+      </w:r>
+      <w:r>
+        <w:t xml:space="preserve">However, </w:t>
       </w:r>
       <w:r>
         <w:rPr>
@@ -3087,7 +3329,13 @@
         <w:rPr>
           <w:noProof/>
         </w:rPr>
-        <w:t xml:space="preserve">, </w:t>
+        <w:t xml:space="preserve"> suggested that</w:t>
+      </w:r>
+      <w:r>
+        <w:rPr>
+          <w:noProof/>
+        </w:rPr>
+        <w:t xml:space="preserve"> </w:t>
       </w:r>
       <w:r>
         <w:rPr>
@@ -3620,10 +3868,13 @@
       </w:r>
       <w:proofErr w:type="spellEnd"/>
       <w:r>
-        <w:t>-temporal data</w:t>
-      </w:r>
-      <w:r>
-        <w:t>.</w:t>
+        <w:t>-temporal</w:t>
+      </w:r>
+      <w:r>
+        <w:t xml:space="preserve"> data. This directly </w:t>
+      </w:r>
+      <w:r>
+        <w:t>target the lack of advanced DL models implemented in Malaysia’s public transit networks.</w:t>
       </w:r>
     </w:p>
     <w:p>
@@ -3641,7 +3892,7 @@
           <w:u w:val="single"/>
         </w:rPr>
       </w:pPr>
-      <w:bookmarkStart w:id="2" w:name="_Toc230633011"/>
+      <w:bookmarkStart w:id="2" w:name="_Toc230647573"/>
       <w:r>
         <w:rPr>
           <w:b/>
@@ -3665,7 +3916,19 @@
         <w:rPr>
           <w:lang w:val="en-US"/>
         </w:rPr>
-        <w:t xml:space="preserve">A significant, existing challenge in the current Malaysia’s transit management system is that it can’t accurately predict a daily ridership. The main blocker before being able to address this issue is because of the intricate relationship between various spatial and temporal factors that affect public transport usage </w:t>
+        <w:t xml:space="preserve">A significant, existing challenge in the current Malaysia’s transit management system is that </w:t>
+      </w:r>
+      <w:r>
+        <w:rPr>
+          <w:lang w:val="en-US"/>
+        </w:rPr>
+        <w:t>the inability to accurately and consistently</w:t>
+      </w:r>
+      <w:r>
+        <w:rPr>
+          <w:lang w:val="en-US"/>
+        </w:rPr>
+        <w:t xml:space="preserve"> predict a daily ridership. The main blocker before being able to address this issue is because of the intricate relationship between various spatial and temporal factors that affect public transport usage </w:t>
       </w:r>
       <w:r>
         <w:rPr>
@@ -3677,7 +3940,19 @@
         <w:rPr>
           <w:lang w:val="en-US"/>
         </w:rPr>
-        <w:t xml:space="preserve">. </w:t>
+        <w:t>.</w:t>
+      </w:r>
+      <w:r>
+        <w:rPr>
+          <w:lang w:val="en-US"/>
+        </w:rPr>
+        <w:t xml:space="preserve"> For instance, population density, weather, accessibility to stops/stations, and so on.</w:t>
+      </w:r>
+      <w:r>
+        <w:rPr>
+          <w:lang w:val="en-US"/>
+        </w:rPr>
+        <w:t xml:space="preserve"> </w:t>
       </w:r>
       <w:r>
         <w:rPr>
@@ -3737,7 +4012,20 @@
         <w:rPr>
           <w:lang w:val="en-US"/>
         </w:rPr>
-        <w:t>However, the presence of extreme data anomalies in historical ridership data presented a confounding scenario, which is the enforcement of Movement Control Order (MCO) in Malaysia from 18</w:t>
+        <w:t>Traditional models often fail to process highly fluctuating data compared to a robust DL model. A recent example would be</w:t>
+      </w:r>
+      <w:r>
+        <w:rPr>
+          <w:lang w:val="en-US"/>
+        </w:rPr>
+        <w:t xml:space="preserve"> the presence of extreme data anomalies in historical </w:t>
+      </w:r>
+      <w:r>
+        <w:rPr>
+          <w:lang w:val="en-US"/>
+        </w:rPr>
+        <w:lastRenderedPageBreak/>
+        <w:t>ridership data presented a confounding scenario, which is the enforcement of Movement Control Order (MCO) in Malaysia from 18</w:t>
       </w:r>
       <w:r>
         <w:rPr>
@@ -3781,20 +4069,25 @@
         <w:rPr>
           <w:noProof/>
         </w:rPr>
-        <w:t xml:space="preserve">Zhao &amp; Lan (2025), they suggests </w:t>
+        <w:t>Zhao &amp; Lan (2025), they suggests that training AI models on such extreme outlier data can cause significant predictive bias, as these kind of events like Covid-19 pandemic outbreak do not represent daily, mundane urban mobility behaviour.</w:t>
       </w:r>
       <w:r>
         <w:rPr>
           <w:noProof/>
         </w:rPr>
-        <w:lastRenderedPageBreak/>
-        <w:t>that training AI models on such extreme outlier data can cause significant predictive bias, as these kind of events like Covid-19 pandemic outbreak do not represent daily, mundane urban mobility behaviour.</w:t>
+        <w:t xml:space="preserve"> Using these data to train models often struggle to capture true, normal peaks when daily li</w:t>
       </w:r>
       <w:r>
         <w:rPr>
           <w:noProof/>
         </w:rPr>
-        <w:t xml:space="preserve"> Using these data to train models often struggle to capture true, normal peaks when daily lifes are back to normal (Lv et al., 2021). Therefore, </w:t>
+        <w:t>v</w:t>
+      </w:r>
+      <w:r>
+        <w:rPr>
+          <w:noProof/>
+        </w:rPr>
+        <w:t xml:space="preserve">es are back to normal (Lv et al., 2021). Therefore, </w:t>
       </w:r>
       <w:r>
         <w:rPr>
@@ -3860,7 +4153,7 @@
           <w:u w:val="single"/>
         </w:rPr>
       </w:pPr>
-      <w:bookmarkStart w:id="3" w:name="_Toc230633012"/>
+      <w:bookmarkStart w:id="3" w:name="_Toc230647574"/>
       <w:r>
         <w:rPr>
           <w:b/>
@@ -3885,7 +4178,16 @@
         <w:t>What are the primary spatial and temporal factors</w:t>
       </w:r>
       <w:r>
-        <w:t xml:space="preserve"> that contribute to the unreliability of public transit services in Malaysia</w:t>
+        <w:t xml:space="preserve"> (e.g. weather, POIs, population density)</w:t>
+      </w:r>
+      <w:r>
+        <w:t xml:space="preserve"> that </w:t>
+      </w:r>
+      <w:r>
+        <w:t xml:space="preserve">heavily affect public transit ridership trends </w:t>
+      </w:r>
+      <w:r>
+        <w:t>in Malaysia</w:t>
       </w:r>
       <w:r>
         <w:t>?</w:t>
@@ -3900,37 +4202,45 @@
         </w:numPr>
       </w:pPr>
       <w:r>
-        <w:t>To what extent can a</w:t>
-      </w:r>
-      <w:r>
-        <w:t xml:space="preserve">n existing SOTA </w:t>
-      </w:r>
-      <w:r>
-        <w:t>accurately</w:t>
-      </w:r>
-      <w:r>
-        <w:t xml:space="preserve"> and consistently</w:t>
-      </w:r>
-      <w:r>
-        <w:t xml:space="preserve"> predict </w:t>
-      </w:r>
-      <w:r>
-        <w:t xml:space="preserve">future </w:t>
-      </w:r>
-      <w:r>
-        <w:t>ridership trends</w:t>
-      </w:r>
-      <w:r>
-        <w:t xml:space="preserve"> in Malaysia</w:t>
-      </w:r>
-      <w:r>
-        <w:t xml:space="preserve"> by integrating </w:t>
-      </w:r>
-      <w:r>
-        <w:t xml:space="preserve">Malaysia’s spatial and temporal </w:t>
-      </w:r>
-      <w:r>
-        <w:t>data?</w:t>
+        <w:t>How accurately and consistently</w:t>
+      </w:r>
+      <w:r>
+        <w:t xml:space="preserve"> can</w:t>
+      </w:r>
+      <w:r>
+        <w:t xml:space="preserve"> </w:t>
+      </w:r>
+      <w:r>
+        <w:t>existing DL architectures (</w:t>
+      </w:r>
+      <w:proofErr w:type="spellStart"/>
+      <w:r>
+        <w:t>spatio</w:t>
+      </w:r>
+      <w:proofErr w:type="spellEnd"/>
+      <w:r>
+        <w:t>-temporal, graph-based, and attention-based)</w:t>
+      </w:r>
+      <w:r>
+        <w:t xml:space="preserve"> </w:t>
+      </w:r>
+      <w:r>
+        <w:t xml:space="preserve">compare against each other and proposed model in </w:t>
+      </w:r>
+      <w:r>
+        <w:t>predict</w:t>
+      </w:r>
+      <w:r>
+        <w:t>ing</w:t>
+      </w:r>
+      <w:r>
+        <w:t xml:space="preserve"> </w:t>
+      </w:r>
+      <w:r>
+        <w:t>Malaysia’s public transit ridership</w:t>
+      </w:r>
+      <w:r>
+        <w:t>?</w:t>
       </w:r>
     </w:p>
     <w:p>
@@ -3942,87 +4252,7 @@
         </w:numPr>
       </w:pPr>
       <w:r>
-        <w:t>How do</w:t>
-      </w:r>
-      <w:r>
-        <w:t xml:space="preserve"> </w:t>
-      </w:r>
-      <w:proofErr w:type="spellStart"/>
-      <w:r>
-        <w:t>spatio</w:t>
-      </w:r>
-      <w:proofErr w:type="spellEnd"/>
-      <w:r>
-        <w:t>-temporal</w:t>
-      </w:r>
-      <w:r>
-        <w:t>-based, graph-based and attention-based</w:t>
-      </w:r>
-      <w:r>
-        <w:t xml:space="preserve"> architectures </w:t>
-      </w:r>
-      <w:r>
-        <w:t>compared</w:t>
-      </w:r>
-      <w:r>
-        <w:t xml:space="preserve"> with each other</w:t>
-      </w:r>
-      <w:r>
-        <w:t xml:space="preserve"> in terms of </w:t>
-      </w:r>
-      <w:r>
-        <w:t xml:space="preserve">combined score of </w:t>
-      </w:r>
-      <w:r>
-        <w:t>m</w:t>
-      </w:r>
-      <w:r>
-        <w:t xml:space="preserve">ean absolute error (MAE), </w:t>
-      </w:r>
-      <w:r>
-        <w:t xml:space="preserve">root </w:t>
-      </w:r>
-      <w:r>
-        <w:t>mean square error</w:t>
-      </w:r>
-      <w:r>
-        <w:t xml:space="preserve"> </w:t>
-      </w:r>
-      <w:r>
-        <w:t>(RMSE)</w:t>
-      </w:r>
-      <w:r>
-        <w:t xml:space="preserve">, </w:t>
-      </w:r>
-      <w:r>
-        <w:t xml:space="preserve">mean </w:t>
-      </w:r>
-      <w:r>
-        <w:t>absolute</w:t>
-      </w:r>
-      <w:r>
-        <w:t xml:space="preserve"> percentage error</w:t>
-      </w:r>
-      <w:r>
-        <w:t xml:space="preserve"> (MAPE)</w:t>
-      </w:r>
-      <w:r>
-        <w:t>, and coefficient of</w:t>
-      </w:r>
-      <w:r>
-        <w:t xml:space="preserve"> determination (R</w:t>
-      </w:r>
-      <w:r>
-        <w:rPr>
-          <w:vertAlign w:val="superscript"/>
-        </w:rPr>
-        <w:t>2</w:t>
-      </w:r>
-      <w:r>
-        <w:t>)</w:t>
-      </w:r>
-      <w:r>
-        <w:t xml:space="preserve"> in predicting future ridership trends</w:t>
+        <w:t>How does the inclusion of extreme data anomalies, specifically the Malaysia’s MCO period, impact the predictive accuracy and bias of existing DL models and proposed model</w:t>
       </w:r>
       <w:r>
         <w:t>?</w:t>
@@ -4043,7 +4273,7 @@
           <w:u w:val="single"/>
         </w:rPr>
       </w:pPr>
-      <w:bookmarkStart w:id="4" w:name="_Toc230633013"/>
+      <w:bookmarkStart w:id="4" w:name="_Toc230647575"/>
       <w:r>
         <w:rPr>
           <w:b/>
@@ -4065,7 +4295,19 @@
         </w:numPr>
       </w:pPr>
       <w:r>
-        <w:t>To identify and categorize the primary spatial and temporal factors contributing to unreliability in Malaysian public transit systems through a systematic analysis of historical performance data.</w:t>
+        <w:t xml:space="preserve">To identify and categorize the primary spatial and temporal factors </w:t>
+      </w:r>
+      <w:r>
+        <w:t>affecting</w:t>
+      </w:r>
+      <w:r>
+        <w:t xml:space="preserve"> </w:t>
+      </w:r>
+      <w:r>
+        <w:t>Malaysian public transit ridership</w:t>
+      </w:r>
+      <w:r>
+        <w:t xml:space="preserve"> through a systematic analysis of historical performance data.</w:t>
       </w:r>
     </w:p>
     <w:p>
@@ -4080,25 +4322,19 @@
         <w:t xml:space="preserve">To </w:t>
       </w:r>
       <w:r>
-        <w:t>identify</w:t>
-      </w:r>
-      <w:r>
-        <w:t xml:space="preserve"> and propose</w:t>
-      </w:r>
-      <w:r>
-        <w:t xml:space="preserve"> a single</w:t>
-      </w:r>
-      <w:r>
-        <w:t xml:space="preserve">, </w:t>
-      </w:r>
-      <w:r>
-        <w:t>best</w:t>
-      </w:r>
-      <w:r>
-        <w:t>, and consistent</w:t>
-      </w:r>
-      <w:r>
-        <w:t xml:space="preserve"> DL model </w:t>
+        <w:t>develop and</w:t>
+      </w:r>
+      <w:r>
+        <w:t xml:space="preserve"> propose</w:t>
+      </w:r>
+      <w:r>
+        <w:t xml:space="preserve"> </w:t>
+      </w:r>
+      <w:r>
+        <w:t>Hybrid Multi-scale Temporal Spatio-Feature (HMT-TSF) Forecaster</w:t>
+      </w:r>
+      <w:r>
+        <w:t xml:space="preserve"> </w:t>
       </w:r>
       <w:r>
         <w:t xml:space="preserve">that integrates </w:t>
@@ -4167,7 +4403,25 @@
         </w:numPr>
       </w:pPr>
       <w:r>
-        <w:t xml:space="preserve">To evaluate and benchmark the performance of </w:t>
+        <w:t xml:space="preserve">To </w:t>
+      </w:r>
+      <w:r>
+        <w:t>benchmark the proposed</w:t>
+      </w:r>
+      <w:r>
+        <w:t xml:space="preserve"> </w:t>
+      </w:r>
+      <w:r>
+        <w:t>model</w:t>
+      </w:r>
+      <w:r>
+        <w:t xml:space="preserve"> </w:t>
+      </w:r>
+      <w:r>
+        <w:t xml:space="preserve">against existing </w:t>
+      </w:r>
+      <w:r>
+        <w:t xml:space="preserve">baseline, </w:t>
       </w:r>
       <w:proofErr w:type="spellStart"/>
       <w:r>
@@ -4178,10 +4432,22 @@
         <w:t>-temporal</w:t>
       </w:r>
       <w:r>
-        <w:t xml:space="preserve">-based, graph-based and attention-based </w:t>
-      </w:r>
-      <w:r>
-        <w:t xml:space="preserve">model using </w:t>
+        <w:t>-based, graph-based</w:t>
+      </w:r>
+      <w:r>
+        <w:t xml:space="preserve"> and </w:t>
+      </w:r>
+      <w:r>
+        <w:t xml:space="preserve">attention-based </w:t>
+      </w:r>
+      <w:r>
+        <w:t>model</w:t>
+      </w:r>
+      <w:r>
+        <w:t xml:space="preserve">s </w:t>
+      </w:r>
+      <w:r>
+        <w:t xml:space="preserve">using </w:t>
       </w:r>
       <w:r>
         <w:t xml:space="preserve">combined </w:t>
@@ -4202,11 +4468,18 @@
         <w:t>.</w:t>
       </w:r>
     </w:p>
-    <w:p/>
-    <w:p/>
-    <w:p/>
-    <w:p/>
-    <w:p/>
+    <w:p>
+      <w:pPr>
+        <w:pStyle w:val="ListParagraph"/>
+        <w:numPr>
+          <w:ilvl w:val="0"/>
+          <w:numId w:val="2"/>
+        </w:numPr>
+      </w:pPr>
+      <w:r>
+        <w:t>To evaluate and compare model performance across two distinct dataset segmentations (with and without MCO period) to determine the impact of extreme outlier data on predictive bias.</w:t>
+      </w:r>
+    </w:p>
     <w:p>
       <w:pPr>
         <w:pStyle w:val="Heading2"/>
@@ -4222,7 +4495,7 @@
           <w:u w:val="single"/>
         </w:rPr>
       </w:pPr>
-      <w:bookmarkStart w:id="5" w:name="_Toc230633014"/>
+      <w:bookmarkStart w:id="5" w:name="_Toc230647576"/>
       <w:r>
         <w:rPr>
           <w:b/>
@@ -4622,9 +4895,65 @@
           <w:p>
             <w:pPr>
               <w:jc w:val="left"/>
+              <w:rPr>
+                <w:b/>
+                <w:bCs/>
+              </w:rPr>
             </w:pPr>
             <w:r>
+              <w:t>A</w:t>
+            </w:r>
+            <w:r>
+              <w:t xml:space="preserve">ttention-based </w:t>
+            </w:r>
+            <w:r>
+              <w:t>STGCN</w:t>
+            </w:r>
+            <w:r>
+              <w:t xml:space="preserve"> (</w:t>
+            </w:r>
+            <w:r>
+              <w:rPr>
+                <w:b/>
+                <w:bCs/>
+              </w:rPr>
               <w:t>ASTGCN</w:t>
+            </w:r>
+            <w:r>
+              <w:t xml:space="preserve">); </w:t>
+            </w:r>
+            <w:r>
+              <w:t>Temporal Pattern Attention</w:t>
+            </w:r>
+            <w:r>
+              <w:t xml:space="preserve"> (</w:t>
+            </w:r>
+            <w:r>
+              <w:rPr>
+                <w:b/>
+                <w:bCs/>
+              </w:rPr>
+              <w:t>TPA</w:t>
+            </w:r>
+            <w:r>
+              <w:t>)</w:t>
+            </w:r>
+            <w:r>
+              <w:rPr>
+                <w:b/>
+                <w:bCs/>
+              </w:rPr>
+              <w:t>-LSTM</w:t>
+            </w:r>
+            <w:r>
+              <w:rPr>
+                <w:b/>
+                <w:bCs/>
+              </w:rPr>
+              <w:t xml:space="preserve">; </w:t>
+            </w:r>
+            <w:r>
+              <w:t>Temporal Fusion Transformer</w:t>
             </w:r>
           </w:p>
           <w:p>
@@ -4632,32 +4961,35 @@
               <w:jc w:val="left"/>
             </w:pPr>
             <w:r>
-              <w:t>TPA-LSTM</w:t>
-            </w:r>
-          </w:p>
-          <w:p>
-            <w:pPr>
-              <w:jc w:val="left"/>
-            </w:pPr>
-            <w:r>
+              <w:t>(</w:t>
+            </w:r>
+            <w:r>
+              <w:rPr>
+                <w:b/>
+                <w:bCs/>
+              </w:rPr>
               <w:t>TFT</w:t>
             </w:r>
-          </w:p>
-          <w:p>
-            <w:pPr>
-              <w:jc w:val="left"/>
-            </w:pPr>
+            <w:r>
+              <w:t xml:space="preserve">); </w:t>
+            </w:r>
             <w:proofErr w:type="spellStart"/>
             <w:r>
+              <w:rPr>
+                <w:b/>
+                <w:bCs/>
+              </w:rPr>
               <w:t>Autoformer</w:t>
             </w:r>
             <w:proofErr w:type="spellEnd"/>
-          </w:p>
-          <w:p>
-            <w:pPr>
-              <w:jc w:val="left"/>
-            </w:pPr>
-            <w:r>
+            <w:r>
+              <w:t xml:space="preserve">; </w:t>
+            </w:r>
+            <w:r>
+              <w:rPr>
+                <w:b/>
+                <w:bCs/>
+              </w:rPr>
               <w:t>Informer</w:t>
             </w:r>
           </w:p>
@@ -4709,7 +5041,17 @@
               <w:t>Hybrid Multi-scale Temporal Spatio-Feature</w:t>
             </w:r>
             <w:r>
-              <w:t xml:space="preserve"> (HMT-TSF) </w:t>
+              <w:t xml:space="preserve"> (</w:t>
+            </w:r>
+            <w:r>
+              <w:rPr>
+                <w:b/>
+                <w:bCs/>
+              </w:rPr>
+              <w:t>HMT-TSF</w:t>
+            </w:r>
+            <w:r>
+              <w:t xml:space="preserve">) </w:t>
             </w:r>
             <w:r>
               <w:t>Forecaster</w:t>
@@ -4796,19 +5138,25 @@
               <w:jc w:val="left"/>
             </w:pPr>
             <w:r>
-              <w:t xml:space="preserve">Specific bus, urban rail, commuter transit networks </w:t>
+              <w:t>B</w:t>
+            </w:r>
+            <w:r>
+              <w:t xml:space="preserve">us, urban rail, commuter transit networks </w:t>
             </w:r>
             <w:r>
               <w:t xml:space="preserve">with available data </w:t>
             </w:r>
             <w:r>
-              <w:t>in</w:t>
+              <w:t>throughout</w:t>
             </w:r>
             <w:r>
               <w:t xml:space="preserve"> whole</w:t>
             </w:r>
             <w:r>
               <w:t xml:space="preserve"> Malaysia</w:t>
+            </w:r>
+            <w:r>
+              <w:t>.</w:t>
             </w:r>
           </w:p>
         </w:tc>
@@ -4824,7 +5172,16 @@
               <w:jc w:val="left"/>
             </w:pPr>
             <w:r>
-              <w:t>Dataset Period</w:t>
+              <w:t>MCO</w:t>
+            </w:r>
+            <w:r>
+              <w:t xml:space="preserve"> Period</w:t>
+            </w:r>
+            <w:r>
+              <w:t xml:space="preserve"> </w:t>
+            </w:r>
+            <w:r>
+              <w:t>Segmentation</w:t>
             </w:r>
           </w:p>
         </w:tc>
@@ -5016,7 +5373,15 @@
           <w:sz w:val="24"/>
           <w:szCs w:val="24"/>
         </w:rPr>
-        <w:t>: Detailed aspects and descriptions about research scope.</w:t>
+        <w:t xml:space="preserve">: </w:t>
+      </w:r>
+      <w:r>
+        <w:rPr>
+          <w:color w:val="auto"/>
+          <w:sz w:val="24"/>
+          <w:szCs w:val="24"/>
+        </w:rPr>
+        <w:t>Summary of Research Scope, including Model Architectures, Evaluation Metrics, Geographical Focus, and Dataset Segmentation relative to Malaysia’s MCO period.</w:t>
       </w:r>
     </w:p>
     <w:p/>
@@ -5036,7 +5401,7 @@
           <w:u w:val="single"/>
         </w:rPr>
       </w:pPr>
-      <w:bookmarkStart w:id="6" w:name="_Toc230633015"/>
+      <w:bookmarkStart w:id="6" w:name="_Toc230647577"/>
       <w:r>
         <w:rPr>
           <w:b/>
@@ -5065,7 +5430,7 @@
           <w:u w:val="single"/>
         </w:rPr>
       </w:pPr>
-      <w:bookmarkStart w:id="7" w:name="_Toc230633016"/>
+      <w:bookmarkStart w:id="7" w:name="_Toc230647578"/>
       <w:r>
         <w:rPr>
           <w:b/>
@@ -5076,6 +5441,16 @@
         </w:rPr>
         <w:t>Public Transport Reliability</w:t>
       </w:r>
+      <w:r>
+        <w:rPr>
+          <w:b/>
+          <w:bCs/>
+          <w:sz w:val="24"/>
+          <w:szCs w:val="24"/>
+          <w:u w:val="single"/>
+        </w:rPr>
+        <w:t xml:space="preserve"> and Demand Dynamics</w:t>
+      </w:r>
       <w:bookmarkEnd w:id="7"/>
     </w:p>
     <w:p>
@@ -5093,7 +5468,7 @@
           <w:u w:val="single"/>
         </w:rPr>
       </w:pPr>
-      <w:bookmarkStart w:id="8" w:name="_Toc230633017"/>
+      <w:bookmarkStart w:id="8" w:name="_Toc230647579"/>
       <w:r>
         <w:rPr>
           <w:b/>
@@ -5121,7 +5496,7 @@
           <w:u w:val="single"/>
         </w:rPr>
       </w:pPr>
-      <w:bookmarkStart w:id="9" w:name="_Toc230633018"/>
+      <w:bookmarkStart w:id="9" w:name="_Toc230647580"/>
       <w:r>
         <w:rPr>
           <w:b/>
@@ -5130,7 +5505,17 @@
           <w:szCs w:val="24"/>
           <w:u w:val="single"/>
         </w:rPr>
-        <w:t>The Landscape of Public Transit in Malaysia</w:t>
+        <w:t xml:space="preserve">The </w:t>
+      </w:r>
+      <w:r>
+        <w:rPr>
+          <w:b/>
+          <w:bCs/>
+          <w:sz w:val="24"/>
+          <w:szCs w:val="24"/>
+          <w:u w:val="single"/>
+        </w:rPr>
+        <w:t>Relationship between Ridership and Service Unreliability</w:t>
       </w:r>
       <w:bookmarkEnd w:id="9"/>
     </w:p>
@@ -5149,7 +5534,7 @@
           <w:u w:val="single"/>
         </w:rPr>
       </w:pPr>
-      <w:bookmarkStart w:id="10" w:name="_Toc230633019"/>
+      <w:bookmarkStart w:id="10" w:name="_Toc230647581"/>
       <w:r>
         <w:rPr>
           <w:b/>
@@ -5158,7 +5543,7 @@
           <w:szCs w:val="24"/>
           <w:u w:val="single"/>
         </w:rPr>
-        <w:t>Impact of External Factors</w:t>
+        <w:t>The Landscape of Public Transit in Malaysia</w:t>
       </w:r>
       <w:bookmarkEnd w:id="10"/>
     </w:p>
@@ -5177,7 +5562,7 @@
           <w:u w:val="single"/>
         </w:rPr>
       </w:pPr>
-      <w:bookmarkStart w:id="11" w:name="_Toc230633020"/>
+      <w:bookmarkStart w:id="11" w:name="_Toc230647582"/>
       <w:r>
         <w:rPr>
           <w:b/>
@@ -5186,7 +5571,7 @@
           <w:szCs w:val="24"/>
           <w:u w:val="single"/>
         </w:rPr>
-        <w:t>Sources of Transit Data</w:t>
+        <w:t>Transit Data Ecosystems and Anomalies</w:t>
       </w:r>
       <w:bookmarkEnd w:id="11"/>
     </w:p>
@@ -5205,7 +5590,7 @@
           <w:u w:val="single"/>
         </w:rPr>
       </w:pPr>
-      <w:bookmarkStart w:id="12" w:name="_Toc230633021"/>
+      <w:bookmarkStart w:id="12" w:name="_Toc230647583"/>
       <w:r>
         <w:rPr>
           <w:b/>
@@ -5214,7 +5599,7 @@
           <w:szCs w:val="24"/>
           <w:u w:val="single"/>
         </w:rPr>
-        <w:t>Data Quality and Preprocessing Challenges</w:t>
+        <w:t>Sources of Transit Data</w:t>
       </w:r>
       <w:bookmarkEnd w:id="12"/>
     </w:p>
@@ -5233,7 +5618,7 @@
           <w:u w:val="single"/>
         </w:rPr>
       </w:pPr>
-      <w:bookmarkStart w:id="13" w:name="_Toc230633022"/>
+      <w:bookmarkStart w:id="13" w:name="_Toc230647584"/>
       <w:r>
         <w:rPr>
           <w:b/>
@@ -5242,9 +5627,57 @@
           <w:szCs w:val="24"/>
           <w:u w:val="single"/>
         </w:rPr>
-        <w:t>Data-Driven Transit Analytics</w:t>
+        <w:t>Data Quality</w:t>
+      </w:r>
+      <w:r>
+        <w:rPr>
+          <w:b/>
+          <w:bCs/>
+          <w:sz w:val="24"/>
+          <w:szCs w:val="24"/>
+          <w:u w:val="single"/>
+        </w:rPr>
+        <w:t>, Noise</w:t>
+      </w:r>
+      <w:r>
+        <w:rPr>
+          <w:b/>
+          <w:bCs/>
+          <w:sz w:val="24"/>
+          <w:szCs w:val="24"/>
+          <w:u w:val="single"/>
+        </w:rPr>
+        <w:t xml:space="preserve"> and Preprocessing Challenges</w:t>
       </w:r>
       <w:bookmarkEnd w:id="13"/>
+    </w:p>
+    <w:p>
+      <w:pPr>
+        <w:pStyle w:val="Heading3"/>
+        <w:numPr>
+          <w:ilvl w:val="2"/>
+          <w:numId w:val="10"/>
+        </w:numPr>
+        <w:rPr>
+          <w:b/>
+          <w:bCs/>
+          <w:sz w:val="24"/>
+          <w:szCs w:val="24"/>
+          <w:u w:val="single"/>
+        </w:rPr>
+      </w:pPr>
+      <w:bookmarkStart w:id="14" w:name="_Toc230647585"/>
+      <w:r>
+        <w:rPr>
+          <w:b/>
+          <w:bCs/>
+          <w:sz w:val="24"/>
+          <w:szCs w:val="24"/>
+          <w:u w:val="single"/>
+        </w:rPr>
+        <w:t>Extreme Anomalies in Spatiotemporal Data</w:t>
+      </w:r>
+      <w:bookmarkEnd w:id="14"/>
     </w:p>
     <w:p>
       <w:pPr>
@@ -5261,7 +5694,7 @@
           <w:u w:val="single"/>
         </w:rPr>
       </w:pPr>
-      <w:bookmarkStart w:id="14" w:name="_Toc230633023"/>
+      <w:bookmarkStart w:id="15" w:name="_Toc230647586"/>
       <w:r>
         <w:rPr>
           <w:b/>
@@ -5272,7 +5705,7 @@
         </w:rPr>
         <w:t>Evolution from Traditional to DL Models</w:t>
       </w:r>
-      <w:bookmarkEnd w:id="14"/>
+      <w:bookmarkEnd w:id="15"/>
     </w:p>
     <w:p>
       <w:pPr>
@@ -5289,7 +5722,7 @@
           <w:u w:val="single"/>
         </w:rPr>
       </w:pPr>
-      <w:bookmarkStart w:id="15" w:name="_Toc230633024"/>
+      <w:bookmarkStart w:id="16" w:name="_Toc230647587"/>
       <w:r>
         <w:rPr>
           <w:b/>
@@ -5298,9 +5731,19 @@
           <w:szCs w:val="24"/>
           <w:u w:val="single"/>
         </w:rPr>
-        <w:t>Core Deep Learning Architectures for Spatiotemporal Data</w:t>
-      </w:r>
-      <w:bookmarkEnd w:id="15"/>
+        <w:t>Traditional</w:t>
+      </w:r>
+      <w:r>
+        <w:rPr>
+          <w:b/>
+          <w:bCs/>
+          <w:sz w:val="24"/>
+          <w:szCs w:val="24"/>
+          <w:u w:val="single"/>
+        </w:rPr>
+        <w:t xml:space="preserve"> Architectures</w:t>
+      </w:r>
+      <w:bookmarkEnd w:id="16"/>
     </w:p>
     <w:p>
       <w:pPr>
@@ -5317,7 +5760,7 @@
           <w:u w:val="single"/>
         </w:rPr>
       </w:pPr>
-      <w:bookmarkStart w:id="16" w:name="_Toc230633025"/>
+      <w:bookmarkStart w:id="17" w:name="_Toc230647588"/>
       <w:r>
         <w:rPr>
           <w:b/>
@@ -5326,9 +5769,9 @@
           <w:szCs w:val="24"/>
           <w:u w:val="single"/>
         </w:rPr>
-        <w:t>Transit Delay and Ridership Prediction</w:t>
-      </w:r>
-      <w:bookmarkEnd w:id="16"/>
+        <w:t>Deep Learning Approaches in Spatiotemporal Transit Data</w:t>
+      </w:r>
+      <w:bookmarkEnd w:id="17"/>
     </w:p>
     <w:p>
       <w:pPr>
@@ -5345,7 +5788,7 @@
           <w:u w:val="single"/>
         </w:rPr>
       </w:pPr>
-      <w:bookmarkStart w:id="17" w:name="_Toc230633026"/>
+      <w:bookmarkStart w:id="18" w:name="_Toc230647589"/>
       <w:r>
         <w:rPr>
           <w:b/>
@@ -5354,9 +5797,87 @@
           <w:szCs w:val="24"/>
           <w:u w:val="single"/>
         </w:rPr>
-        <w:t>Benchmarking and Evaluation Metrics</w:t>
-      </w:r>
-      <w:bookmarkEnd w:id="17"/>
+        <w:t xml:space="preserve">Benchmarking </w:t>
+      </w:r>
+      <w:r>
+        <w:rPr>
+          <w:b/>
+          <w:bCs/>
+          <w:sz w:val="24"/>
+          <w:szCs w:val="24"/>
+          <w:u w:val="single"/>
+        </w:rPr>
+        <w:t xml:space="preserve">Methodologies </w:t>
+      </w:r>
+      <w:r>
+        <w:rPr>
+          <w:b/>
+          <w:bCs/>
+          <w:sz w:val="24"/>
+          <w:szCs w:val="24"/>
+          <w:u w:val="single"/>
+        </w:rPr>
+        <w:t>and Evaluation Metrics</w:t>
+      </w:r>
+      <w:bookmarkEnd w:id="18"/>
+    </w:p>
+    <w:p>
+      <w:pPr>
+        <w:pStyle w:val="Heading2"/>
+        <w:numPr>
+          <w:ilvl w:val="1"/>
+          <w:numId w:val="10"/>
+        </w:numPr>
+        <w:rPr>
+          <w:b/>
+          <w:bCs/>
+          <w:sz w:val="24"/>
+          <w:szCs w:val="24"/>
+          <w:u w:val="single"/>
+        </w:rPr>
+      </w:pPr>
+      <w:bookmarkStart w:id="19" w:name="_Toc230647590"/>
+      <w:r>
+        <w:rPr>
+          <w:b/>
+          <w:bCs/>
+          <w:sz w:val="24"/>
+          <w:szCs w:val="24"/>
+          <w:u w:val="single"/>
+        </w:rPr>
+        <w:t>AI</w:t>
+      </w:r>
+      <w:r>
+        <w:rPr>
+          <w:b/>
+          <w:bCs/>
+          <w:sz w:val="24"/>
+          <w:szCs w:val="24"/>
+          <w:u w:val="single"/>
+        </w:rPr>
+        <w:t>-Driven Operational Strategies</w:t>
+      </w:r>
+      <w:r>
+        <w:rPr>
+          <w:b/>
+          <w:bCs/>
+          <w:sz w:val="24"/>
+          <w:szCs w:val="24"/>
+          <w:u w:val="single"/>
+        </w:rPr>
+        <w:t xml:space="preserve"> </w:t>
+      </w:r>
+      <w:r>
+        <w:rPr>
+          <w:b/>
+          <w:bCs/>
+          <w:sz w:val="24"/>
+          <w:szCs w:val="24"/>
+          <w:u w:val="single"/>
+        </w:rPr>
+        <w:t>and Sustainability</w:t>
+      </w:r>
+      <w:bookmarkEnd w:id="19"/>
     </w:p>
     <w:p>
       <w:pPr>
@@ -5373,7 +5894,7 @@
           <w:u w:val="single"/>
         </w:rPr>
       </w:pPr>
-      <w:bookmarkStart w:id="18" w:name="_Toc230633027"/>
+      <w:bookmarkStart w:id="20" w:name="_Toc230647591"/>
       <w:r>
         <w:rPr>
           <w:b/>
@@ -5382,9 +5903,85 @@
           <w:szCs w:val="24"/>
           <w:u w:val="single"/>
         </w:rPr>
-        <w:t>Deep Learning Approaches in Transit Analytics</w:t>
-      </w:r>
-      <w:bookmarkEnd w:id="18"/>
+        <w:t>Proactive Scheduling and Resource Allocation</w:t>
+      </w:r>
+      <w:bookmarkEnd w:id="20"/>
+    </w:p>
+    <w:p>
+      <w:pPr>
+        <w:pStyle w:val="Heading3"/>
+        <w:numPr>
+          <w:ilvl w:val="2"/>
+          <w:numId w:val="10"/>
+        </w:numPr>
+        <w:rPr>
+          <w:b/>
+          <w:bCs/>
+          <w:sz w:val="24"/>
+          <w:szCs w:val="24"/>
+          <w:u w:val="single"/>
+        </w:rPr>
+      </w:pPr>
+      <w:bookmarkStart w:id="21" w:name="_Toc230647592"/>
+      <w:r>
+        <w:rPr>
+          <w:b/>
+          <w:bCs/>
+          <w:sz w:val="24"/>
+          <w:szCs w:val="24"/>
+          <w:u w:val="single"/>
+        </w:rPr>
+        <w:t>Deployment Challenges</w:t>
+      </w:r>
+      <w:r>
+        <w:rPr>
+          <w:b/>
+          <w:bCs/>
+          <w:sz w:val="24"/>
+          <w:szCs w:val="24"/>
+          <w:u w:val="single"/>
+        </w:rPr>
+        <w:t xml:space="preserve"> of AI in Transit Management</w:t>
+      </w:r>
+      <w:bookmarkEnd w:id="21"/>
+    </w:p>
+    <w:p>
+      <w:pPr>
+        <w:pStyle w:val="Heading3"/>
+        <w:numPr>
+          <w:ilvl w:val="2"/>
+          <w:numId w:val="10"/>
+        </w:numPr>
+        <w:rPr>
+          <w:b/>
+          <w:bCs/>
+          <w:sz w:val="24"/>
+          <w:szCs w:val="24"/>
+          <w:u w:val="single"/>
+        </w:rPr>
+      </w:pPr>
+      <w:bookmarkStart w:id="22" w:name="_Toc230647593"/>
+      <w:r>
+        <w:rPr>
+          <w:b/>
+          <w:bCs/>
+          <w:sz w:val="24"/>
+          <w:szCs w:val="24"/>
+          <w:u w:val="single"/>
+        </w:rPr>
+        <w:t>Sustainable Urban Mobility</w:t>
+      </w:r>
+      <w:r>
+        <w:rPr>
+          <w:b/>
+          <w:bCs/>
+          <w:sz w:val="24"/>
+          <w:szCs w:val="24"/>
+          <w:u w:val="single"/>
+        </w:rPr>
+        <w:t xml:space="preserve"> and Environmental Impact</w:t>
+      </w:r>
+      <w:bookmarkEnd w:id="22"/>
     </w:p>
     <w:p>
       <w:pPr>
@@ -5401,7 +5998,7 @@
           <w:u w:val="single"/>
         </w:rPr>
       </w:pPr>
-      <w:bookmarkStart w:id="19" w:name="_Toc230633028"/>
+      <w:bookmarkStart w:id="23" w:name="_Toc230647594"/>
       <w:r>
         <w:rPr>
           <w:b/>
@@ -5410,103 +6007,9 @@
           <w:szCs w:val="24"/>
           <w:u w:val="single"/>
         </w:rPr>
-        <w:t>AI</w:t>
-      </w:r>
-      <w:r>
-        <w:rPr>
-          <w:b/>
-          <w:bCs/>
-          <w:sz w:val="24"/>
-          <w:szCs w:val="24"/>
-          <w:u w:val="single"/>
-        </w:rPr>
-        <w:t xml:space="preserve"> for Public Transport Systems</w:t>
-      </w:r>
-      <w:bookmarkEnd w:id="19"/>
-    </w:p>
-    <w:p>
-      <w:pPr>
-        <w:pStyle w:val="Heading3"/>
-        <w:numPr>
-          <w:ilvl w:val="2"/>
-          <w:numId w:val="10"/>
-        </w:numPr>
-        <w:rPr>
-          <w:b/>
-          <w:bCs/>
-          <w:sz w:val="24"/>
-          <w:szCs w:val="24"/>
-          <w:u w:val="single"/>
-        </w:rPr>
-      </w:pPr>
-      <w:bookmarkStart w:id="20" w:name="_Toc230633029"/>
-      <w:r>
-        <w:rPr>
-          <w:b/>
-          <w:bCs/>
-          <w:sz w:val="24"/>
-          <w:szCs w:val="24"/>
-          <w:u w:val="single"/>
-        </w:rPr>
-        <w:t>Deployment Challenges</w:t>
-      </w:r>
-      <w:bookmarkEnd w:id="20"/>
-    </w:p>
-    <w:p>
-      <w:pPr>
-        <w:pStyle w:val="Heading3"/>
-        <w:numPr>
-          <w:ilvl w:val="2"/>
-          <w:numId w:val="10"/>
-        </w:numPr>
-        <w:rPr>
-          <w:b/>
-          <w:bCs/>
-          <w:sz w:val="24"/>
-          <w:szCs w:val="24"/>
-          <w:u w:val="single"/>
-        </w:rPr>
-      </w:pPr>
-      <w:bookmarkStart w:id="21" w:name="_Toc230633030"/>
-      <w:r>
-        <w:rPr>
-          <w:b/>
-          <w:bCs/>
-          <w:sz w:val="24"/>
-          <w:szCs w:val="24"/>
-          <w:u w:val="single"/>
-        </w:rPr>
-        <w:t>Sustainable Urban Mobility</w:t>
-      </w:r>
-      <w:bookmarkEnd w:id="21"/>
-    </w:p>
-    <w:p>
-      <w:pPr>
-        <w:pStyle w:val="Heading2"/>
-        <w:numPr>
-          <w:ilvl w:val="1"/>
-          <w:numId w:val="10"/>
-        </w:numPr>
-        <w:rPr>
-          <w:b/>
-          <w:bCs/>
-          <w:sz w:val="24"/>
-          <w:szCs w:val="24"/>
-          <w:u w:val="single"/>
-        </w:rPr>
-      </w:pPr>
-      <w:bookmarkStart w:id="22" w:name="_Toc230633031"/>
-      <w:r>
-        <w:rPr>
-          <w:b/>
-          <w:bCs/>
-          <w:sz w:val="24"/>
-          <w:szCs w:val="24"/>
-          <w:u w:val="single"/>
-        </w:rPr>
         <w:t>Research Gap</w:t>
       </w:r>
-      <w:bookmarkEnd w:id="22"/>
+      <w:bookmarkEnd w:id="23"/>
     </w:p>
     <w:p>
       <w:pPr>
@@ -5524,7 +6027,7 @@
           <w:u w:val="single"/>
         </w:rPr>
       </w:pPr>
-      <w:bookmarkStart w:id="23" w:name="_Toc230633032"/>
+      <w:bookmarkStart w:id="24" w:name="_Toc230647595"/>
       <w:r>
         <w:rPr>
           <w:b/>
@@ -5535,7 +6038,7 @@
         </w:rPr>
         <w:t>Methodology</w:t>
       </w:r>
-      <w:bookmarkEnd w:id="23"/>
+      <w:bookmarkEnd w:id="24"/>
     </w:p>
     <w:p>
       <w:pPr>
@@ -5552,7 +6055,7 @@
           <w:u w:val="single"/>
         </w:rPr>
       </w:pPr>
-      <w:bookmarkStart w:id="24" w:name="_Toc230633033"/>
+      <w:bookmarkStart w:id="25" w:name="_Toc230647596"/>
       <w:r>
         <w:rPr>
           <w:b/>
@@ -5563,7 +6066,7 @@
         </w:rPr>
         <w:t>Data Collection</w:t>
       </w:r>
-      <w:bookmarkEnd w:id="24"/>
+      <w:bookmarkEnd w:id="25"/>
     </w:p>
     <w:p>
       <w:pPr>
@@ -5580,7 +6083,7 @@
           <w:u w:val="single"/>
         </w:rPr>
       </w:pPr>
-      <w:bookmarkStart w:id="25" w:name="_Toc230633034"/>
+      <w:bookmarkStart w:id="26" w:name="_Toc230647597"/>
       <w:r>
         <w:rPr>
           <w:b/>
@@ -5591,7 +6094,7 @@
         </w:rPr>
         <w:t>Data Preprocessing</w:t>
       </w:r>
-      <w:bookmarkEnd w:id="25"/>
+      <w:bookmarkEnd w:id="26"/>
     </w:p>
     <w:p>
       <w:pPr>
@@ -5608,7 +6111,7 @@
           <w:u w:val="single"/>
         </w:rPr>
       </w:pPr>
-      <w:bookmarkStart w:id="26" w:name="_Toc230633035"/>
+      <w:bookmarkStart w:id="27" w:name="_Toc230647598"/>
       <w:r>
         <w:rPr>
           <w:b/>
@@ -5619,7 +6122,7 @@
         </w:rPr>
         <w:t>Feature Engineering</w:t>
       </w:r>
-      <w:bookmarkEnd w:id="26"/>
+      <w:bookmarkEnd w:id="27"/>
     </w:p>
     <w:p>
       <w:pPr>
@@ -5636,7 +6139,7 @@
           <w:u w:val="single"/>
         </w:rPr>
       </w:pPr>
-      <w:bookmarkStart w:id="27" w:name="_Toc230633036"/>
+      <w:bookmarkStart w:id="28" w:name="_Toc230647599"/>
       <w:r>
         <w:rPr>
           <w:b/>
@@ -5647,7 +6150,7 @@
         </w:rPr>
         <w:t>Explanatory Data Analysis</w:t>
       </w:r>
-      <w:bookmarkEnd w:id="27"/>
+      <w:bookmarkEnd w:id="28"/>
     </w:p>
     <w:p>
       <w:pPr>
@@ -5664,7 +6167,7 @@
           <w:u w:val="single"/>
         </w:rPr>
       </w:pPr>
-      <w:bookmarkStart w:id="28" w:name="_Toc230633037"/>
+      <w:bookmarkStart w:id="29" w:name="_Toc230647600"/>
       <w:r>
         <w:rPr>
           <w:b/>
@@ -5675,7 +6178,7 @@
         </w:rPr>
         <w:t>Baseline &amp; Comparative Models</w:t>
       </w:r>
-      <w:bookmarkEnd w:id="28"/>
+      <w:bookmarkEnd w:id="29"/>
     </w:p>
     <w:p>
       <w:pPr>
@@ -5692,7 +6195,7 @@
           <w:u w:val="single"/>
         </w:rPr>
       </w:pPr>
-      <w:bookmarkStart w:id="29" w:name="_Toc230633038"/>
+      <w:bookmarkStart w:id="30" w:name="_Toc230647601"/>
       <w:r>
         <w:rPr>
           <w:b/>
@@ -5701,11 +6204,11 @@
           <w:szCs w:val="24"/>
           <w:u w:val="single"/>
         </w:rPr>
+        <w:lastRenderedPageBreak/>
         <w:t>Proposed Model</w:t>
       </w:r>
-      <w:bookmarkEnd w:id="29"/>
+      <w:bookmarkEnd w:id="30"/>
     </w:p>
-    <w:p/>
     <w:p>
       <w:pPr>
         <w:pStyle w:val="Heading1"/>
@@ -5722,7 +6225,7 @@
           <w:u w:val="single"/>
         </w:rPr>
       </w:pPr>
-      <w:bookmarkStart w:id="30" w:name="_Toc230633039"/>
+      <w:bookmarkStart w:id="31" w:name="_Toc230647602"/>
       <w:r>
         <w:rPr>
           <w:b/>
@@ -5733,7 +6236,7 @@
         </w:rPr>
         <w:t>Expected Outcomes</w:t>
       </w:r>
-      <w:bookmarkEnd w:id="30"/>
+      <w:bookmarkEnd w:id="31"/>
     </w:p>
     <w:p>
       <w:pPr>
@@ -5751,7 +6254,7 @@
           <w:u w:val="single"/>
         </w:rPr>
       </w:pPr>
-      <w:bookmarkStart w:id="31" w:name="_Toc230633040"/>
+      <w:bookmarkStart w:id="32" w:name="_Toc230647603"/>
       <w:r>
         <w:rPr>
           <w:b/>
@@ -5762,7 +6265,7 @@
         </w:rPr>
         <w:t>References</w:t>
       </w:r>
-      <w:bookmarkEnd w:id="31"/>
+      <w:bookmarkEnd w:id="32"/>
     </w:p>
     <w:p>
       <w:pPr>
@@ -6403,6 +6906,92 @@
     </w:lvl>
   </w:abstractNum>
   <w:abstractNum w:abstractNumId="7" w15:restartNumberingAfterBreak="0">
+    <w:nsid w:val="22BA62DA"/>
+    <w:multiLevelType w:val="multilevel"/>
+    <w:tmpl w:val="4409001F"/>
+    <w:lvl w:ilvl="0">
+      <w:start w:val="1"/>
+      <w:numFmt w:val="decimal"/>
+      <w:lvlText w:val="%1."/>
+      <w:lvlJc w:val="left"/>
+      <w:pPr>
+        <w:ind w:left="360" w:hanging="360"/>
+      </w:pPr>
+    </w:lvl>
+    <w:lvl w:ilvl="1">
+      <w:start w:val="1"/>
+      <w:numFmt w:val="decimal"/>
+      <w:lvlText w:val="%1.%2."/>
+      <w:lvlJc w:val="left"/>
+      <w:pPr>
+        <w:ind w:left="792" w:hanging="432"/>
+      </w:pPr>
+    </w:lvl>
+    <w:lvl w:ilvl="2">
+      <w:start w:val="1"/>
+      <w:numFmt w:val="decimal"/>
+      <w:lvlText w:val="%1.%2.%3."/>
+      <w:lvlJc w:val="left"/>
+      <w:pPr>
+        <w:ind w:left="1224" w:hanging="504"/>
+      </w:pPr>
+    </w:lvl>
+    <w:lvl w:ilvl="3">
+      <w:start w:val="1"/>
+      <w:numFmt w:val="decimal"/>
+      <w:lvlText w:val="%1.%2.%3.%4."/>
+      <w:lvlJc w:val="left"/>
+      <w:pPr>
+        <w:ind w:left="1728" w:hanging="648"/>
+      </w:pPr>
+    </w:lvl>
+    <w:lvl w:ilvl="4">
+      <w:start w:val="1"/>
+      <w:numFmt w:val="decimal"/>
+      <w:lvlText w:val="%1.%2.%3.%4.%5."/>
+      <w:lvlJc w:val="left"/>
+      <w:pPr>
+        <w:ind w:left="2232" w:hanging="792"/>
+      </w:pPr>
+    </w:lvl>
+    <w:lvl w:ilvl="5">
+      <w:start w:val="1"/>
+      <w:numFmt w:val="decimal"/>
+      <w:lvlText w:val="%1.%2.%3.%4.%5.%6."/>
+      <w:lvlJc w:val="left"/>
+      <w:pPr>
+        <w:ind w:left="2736" w:hanging="936"/>
+      </w:pPr>
+    </w:lvl>
+    <w:lvl w:ilvl="6">
+      <w:start w:val="1"/>
+      <w:numFmt w:val="decimal"/>
+      <w:lvlText w:val="%1.%2.%3.%4.%5.%6.%7."/>
+      <w:lvlJc w:val="left"/>
+      <w:pPr>
+        <w:ind w:left="3240" w:hanging="1080"/>
+      </w:pPr>
+    </w:lvl>
+    <w:lvl w:ilvl="7">
+      <w:start w:val="1"/>
+      <w:numFmt w:val="decimal"/>
+      <w:lvlText w:val="%1.%2.%3.%4.%5.%6.%7.%8."/>
+      <w:lvlJc w:val="left"/>
+      <w:pPr>
+        <w:ind w:left="3744" w:hanging="1224"/>
+      </w:pPr>
+    </w:lvl>
+    <w:lvl w:ilvl="8">
+      <w:start w:val="1"/>
+      <w:numFmt w:val="decimal"/>
+      <w:lvlText w:val="%1.%2.%3.%4.%5.%6.%7.%8.%9."/>
+      <w:lvlJc w:val="left"/>
+      <w:pPr>
+        <w:ind w:left="4320" w:hanging="1440"/>
+      </w:pPr>
+    </w:lvl>
+  </w:abstractNum>
+  <w:abstractNum w:abstractNumId="8" w15:restartNumberingAfterBreak="0">
     <w:nsid w:val="2C864025"/>
     <w:multiLevelType w:val="multilevel"/>
     <w:tmpl w:val="4409001F"/>
@@ -6488,7 +7077,7 @@
       </w:pPr>
     </w:lvl>
   </w:abstractNum>
-  <w:abstractNum w:abstractNumId="8" w15:restartNumberingAfterBreak="0">
+  <w:abstractNum w:abstractNumId="9" w15:restartNumberingAfterBreak="0">
     <w:nsid w:val="391A47EE"/>
     <w:multiLevelType w:val="hybridMultilevel"/>
     <w:tmpl w:val="608C2FC8"/>
@@ -6577,7 +7166,7 @@
       </w:pPr>
     </w:lvl>
   </w:abstractNum>
-  <w:abstractNum w:abstractNumId="9" w15:restartNumberingAfterBreak="0">
+  <w:abstractNum w:abstractNumId="10" w15:restartNumberingAfterBreak="0">
     <w:nsid w:val="4AC53607"/>
     <w:multiLevelType w:val="hybridMultilevel"/>
     <w:tmpl w:val="CAB8B28C"/>
@@ -6666,7 +7255,7 @@
       </w:pPr>
     </w:lvl>
   </w:abstractNum>
-  <w:abstractNum w:abstractNumId="10" w15:restartNumberingAfterBreak="0">
+  <w:abstractNum w:abstractNumId="11" w15:restartNumberingAfterBreak="0">
     <w:nsid w:val="4C767CF7"/>
     <w:multiLevelType w:val="hybridMultilevel"/>
     <w:tmpl w:val="E006DF60"/>
@@ -6755,7 +7344,7 @@
       </w:pPr>
     </w:lvl>
   </w:abstractNum>
-  <w:abstractNum w:abstractNumId="11" w15:restartNumberingAfterBreak="0">
+  <w:abstractNum w:abstractNumId="12" w15:restartNumberingAfterBreak="0">
     <w:nsid w:val="576B70A5"/>
     <w:multiLevelType w:val="hybridMultilevel"/>
     <w:tmpl w:val="CBCCF546"/>
@@ -6868,7 +7457,7 @@
       </w:rPr>
     </w:lvl>
   </w:abstractNum>
-  <w:abstractNum w:abstractNumId="12" w15:restartNumberingAfterBreak="0">
+  <w:abstractNum w:abstractNumId="13" w15:restartNumberingAfterBreak="0">
     <w:nsid w:val="595C5C89"/>
     <w:multiLevelType w:val="hybridMultilevel"/>
     <w:tmpl w:val="BB58A9A2"/>
@@ -6958,7 +7547,7 @@
       </w:pPr>
     </w:lvl>
   </w:abstractNum>
-  <w:abstractNum w:abstractNumId="13" w15:restartNumberingAfterBreak="0">
+  <w:abstractNum w:abstractNumId="14" w15:restartNumberingAfterBreak="0">
     <w:nsid w:val="707B624C"/>
     <w:multiLevelType w:val="hybridMultilevel"/>
     <w:tmpl w:val="4066D8D2"/>
@@ -7047,7 +7636,7 @@
       </w:pPr>
     </w:lvl>
   </w:abstractNum>
-  <w:abstractNum w:abstractNumId="14" w15:restartNumberingAfterBreak="0">
+  <w:abstractNum w:abstractNumId="15" w15:restartNumberingAfterBreak="0">
     <w:nsid w:val="76C22FEC"/>
     <w:multiLevelType w:val="hybridMultilevel"/>
     <w:tmpl w:val="7D661E6A"/>
@@ -7140,28 +7729,28 @@
     <w:abstractNumId w:val="6"/>
   </w:num>
   <w:num w:numId="2" w16cid:durableId="1890915732">
+    <w:abstractNumId w:val="12"/>
+  </w:num>
+  <w:num w:numId="3" w16cid:durableId="558782592">
     <w:abstractNumId w:val="11"/>
   </w:num>
-  <w:num w:numId="3" w16cid:durableId="558782592">
-    <w:abstractNumId w:val="10"/>
-  </w:num>
   <w:num w:numId="4" w16cid:durableId="291253581">
-    <w:abstractNumId w:val="13"/>
+    <w:abstractNumId w:val="14"/>
   </w:num>
   <w:num w:numId="5" w16cid:durableId="991061032">
     <w:abstractNumId w:val="0"/>
   </w:num>
   <w:num w:numId="6" w16cid:durableId="1289168179">
-    <w:abstractNumId w:val="14"/>
+    <w:abstractNumId w:val="15"/>
   </w:num>
   <w:num w:numId="7" w16cid:durableId="197862497">
+    <w:abstractNumId w:val="10"/>
+  </w:num>
+  <w:num w:numId="8" w16cid:durableId="551042543">
     <w:abstractNumId w:val="9"/>
   </w:num>
-  <w:num w:numId="8" w16cid:durableId="551042543">
-    <w:abstractNumId w:val="8"/>
-  </w:num>
   <w:num w:numId="9" w16cid:durableId="608927404">
-    <w:abstractNumId w:val="12"/>
+    <w:abstractNumId w:val="13"/>
   </w:num>
   <w:num w:numId="10" w16cid:durableId="495653598">
     <w:abstractNumId w:val="2"/>
@@ -7170,7 +7759,7 @@
     <w:abstractNumId w:val="3"/>
   </w:num>
   <w:num w:numId="12" w16cid:durableId="395125979">
-    <w:abstractNumId w:val="7"/>
+    <w:abstractNumId w:val="8"/>
   </w:num>
   <w:num w:numId="13" w16cid:durableId="791440515">
     <w:abstractNumId w:val="5"/>
@@ -7180,6 +7769,9 @@
   </w:num>
   <w:num w:numId="15" w16cid:durableId="770663729">
     <w:abstractNumId w:val="1"/>
+  </w:num>
+  <w:num w:numId="16" w16cid:durableId="373818277">
+    <w:abstractNumId w:val="7"/>
   </w:num>
 </w:numbering>
 </file>
@@ -7790,6 +8382,7 @@
   <w:style w:type="character" w:default="1" w:styleId="DefaultParagraphFont">
     <w:name w:val="Default Paragraph Font"/>
     <w:uiPriority w:val="1"/>
+    <w:semiHidden/>
     <w:unhideWhenUsed/>
   </w:style>
   <w:style w:type="table" w:default="1" w:styleId="TableNormal">

</xml_diff>

<commit_message>
fix: :zap: Optimise to solve overfit, need to rerun all 10 configurations
</commit_message>
<xml_diff>
--- a/docs/24202141_p1_report.docx
+++ b/docs/24202141_p1_report.docx
@@ -230,7 +230,7 @@
           <w:r>
             <w:fldChar w:fldCharType="separate"/>
           </w:r>
-          <w:hyperlink w:anchor="_Toc230647571" w:history="1">
+          <w:hyperlink w:anchor="_Toc230901599" w:history="1">
             <w:r>
               <w:rPr>
                 <w:rStyle w:val="Hyperlink"/>
@@ -275,7 +275,7 @@
                 <w:noProof/>
                 <w:webHidden/>
               </w:rPr>
-              <w:instrText xml:space="preserve"> PAGEREF _Toc230647571 \h </w:instrText>
+              <w:instrText xml:space="preserve"> PAGEREF _Toc230901599 \h </w:instrText>
             </w:r>
             <w:r>
               <w:rPr>
@@ -318,7 +318,7 @@
               <w:noProof/>
             </w:rPr>
           </w:pPr>
-          <w:hyperlink w:anchor="_Toc230647572" w:history="1">
+          <w:hyperlink w:anchor="_Toc230901600" w:history="1">
             <w:r>
               <w:rPr>
                 <w:rStyle w:val="Hyperlink"/>
@@ -363,7 +363,7 @@
                 <w:noProof/>
                 <w:webHidden/>
               </w:rPr>
-              <w:instrText xml:space="preserve"> PAGEREF _Toc230647572 \h </w:instrText>
+              <w:instrText xml:space="preserve"> PAGEREF _Toc230901600 \h </w:instrText>
             </w:r>
             <w:r>
               <w:rPr>
@@ -383,7 +383,7 @@
                 <w:noProof/>
                 <w:webHidden/>
               </w:rPr>
-              <w:t>3</w:t>
+              <w:t>4</w:t>
             </w:r>
             <w:r>
               <w:rPr>
@@ -406,7 +406,7 @@
               <w:noProof/>
             </w:rPr>
           </w:pPr>
-          <w:hyperlink w:anchor="_Toc230647573" w:history="1">
+          <w:hyperlink w:anchor="_Toc230901601" w:history="1">
             <w:r>
               <w:rPr>
                 <w:rStyle w:val="Hyperlink"/>
@@ -451,7 +451,7 @@
                 <w:noProof/>
                 <w:webHidden/>
               </w:rPr>
-              <w:instrText xml:space="preserve"> PAGEREF _Toc230647573 \h </w:instrText>
+              <w:instrText xml:space="preserve"> PAGEREF _Toc230901601 \h </w:instrText>
             </w:r>
             <w:r>
               <w:rPr>
@@ -471,7 +471,7 @@
                 <w:noProof/>
                 <w:webHidden/>
               </w:rPr>
-              <w:t>4</w:t>
+              <w:t>5</w:t>
             </w:r>
             <w:r>
               <w:rPr>
@@ -494,7 +494,7 @@
               <w:noProof/>
             </w:rPr>
           </w:pPr>
-          <w:hyperlink w:anchor="_Toc230647574" w:history="1">
+          <w:hyperlink w:anchor="_Toc230901602" w:history="1">
             <w:r>
               <w:rPr>
                 <w:rStyle w:val="Hyperlink"/>
@@ -539,7 +539,7 @@
                 <w:noProof/>
                 <w:webHidden/>
               </w:rPr>
-              <w:instrText xml:space="preserve"> PAGEREF _Toc230647574 \h </w:instrText>
+              <w:instrText xml:space="preserve"> PAGEREF _Toc230901602 \h </w:instrText>
             </w:r>
             <w:r>
               <w:rPr>
@@ -559,7 +559,7 @@
                 <w:noProof/>
                 <w:webHidden/>
               </w:rPr>
-              <w:t>5</w:t>
+              <w:t>6</w:t>
             </w:r>
             <w:r>
               <w:rPr>
@@ -582,7 +582,7 @@
               <w:noProof/>
             </w:rPr>
           </w:pPr>
-          <w:hyperlink w:anchor="_Toc230647575" w:history="1">
+          <w:hyperlink w:anchor="_Toc230901603" w:history="1">
             <w:r>
               <w:rPr>
                 <w:rStyle w:val="Hyperlink"/>
@@ -627,7 +627,7 @@
                 <w:noProof/>
                 <w:webHidden/>
               </w:rPr>
-              <w:instrText xml:space="preserve"> PAGEREF _Toc230647575 \h </w:instrText>
+              <w:instrText xml:space="preserve"> PAGEREF _Toc230901603 \h </w:instrText>
             </w:r>
             <w:r>
               <w:rPr>
@@ -647,7 +647,7 @@
                 <w:noProof/>
                 <w:webHidden/>
               </w:rPr>
-              <w:t>5</w:t>
+              <w:t>6</w:t>
             </w:r>
             <w:r>
               <w:rPr>
@@ -670,7 +670,7 @@
               <w:noProof/>
             </w:rPr>
           </w:pPr>
-          <w:hyperlink w:anchor="_Toc230647576" w:history="1">
+          <w:hyperlink w:anchor="_Toc230901604" w:history="1">
             <w:r>
               <w:rPr>
                 <w:rStyle w:val="Hyperlink"/>
@@ -715,7 +715,7 @@
                 <w:noProof/>
                 <w:webHidden/>
               </w:rPr>
-              <w:instrText xml:space="preserve"> PAGEREF _Toc230647576 \h </w:instrText>
+              <w:instrText xml:space="preserve"> PAGEREF _Toc230901604 \h </w:instrText>
             </w:r>
             <w:r>
               <w:rPr>
@@ -758,7 +758,7 @@
               <w:noProof/>
             </w:rPr>
           </w:pPr>
-          <w:hyperlink w:anchor="_Toc230647577" w:history="1">
+          <w:hyperlink w:anchor="_Toc230901605" w:history="1">
             <w:r>
               <w:rPr>
                 <w:rStyle w:val="Hyperlink"/>
@@ -803,7 +803,7 @@
                 <w:noProof/>
                 <w:webHidden/>
               </w:rPr>
-              <w:instrText xml:space="preserve"> PAGEREF _Toc230647577 \h </w:instrText>
+              <w:instrText xml:space="preserve"> PAGEREF _Toc230901605 \h </w:instrText>
             </w:r>
             <w:r>
               <w:rPr>
@@ -846,7 +846,7 @@
               <w:noProof/>
             </w:rPr>
           </w:pPr>
-          <w:hyperlink w:anchor="_Toc230647578" w:history="1">
+          <w:hyperlink w:anchor="_Toc230901606" w:history="1">
             <w:r>
               <w:rPr>
                 <w:rStyle w:val="Hyperlink"/>
@@ -891,7 +891,7 @@
                 <w:noProof/>
                 <w:webHidden/>
               </w:rPr>
-              <w:instrText xml:space="preserve"> PAGEREF _Toc230647578 \h </w:instrText>
+              <w:instrText xml:space="preserve"> PAGEREF _Toc230901606 \h </w:instrText>
             </w:r>
             <w:r>
               <w:rPr>
@@ -934,7 +934,7 @@
               <w:noProof/>
             </w:rPr>
           </w:pPr>
-          <w:hyperlink w:anchor="_Toc230647579" w:history="1">
+          <w:hyperlink w:anchor="_Toc230901607" w:history="1">
             <w:r>
               <w:rPr>
                 <w:rStyle w:val="Hyperlink"/>
@@ -979,7 +979,7 @@
                 <w:noProof/>
                 <w:webHidden/>
               </w:rPr>
-              <w:instrText xml:space="preserve"> PAGEREF _Toc230647579 \h </w:instrText>
+              <w:instrText xml:space="preserve"> PAGEREF _Toc230901607 \h </w:instrText>
             </w:r>
             <w:r>
               <w:rPr>
@@ -999,7 +999,7 @@
                 <w:noProof/>
                 <w:webHidden/>
               </w:rPr>
-              <w:t>7</w:t>
+              <w:t>8</w:t>
             </w:r>
             <w:r>
               <w:rPr>
@@ -1022,7 +1022,7 @@
               <w:noProof/>
             </w:rPr>
           </w:pPr>
-          <w:hyperlink w:anchor="_Toc230647580" w:history="1">
+          <w:hyperlink w:anchor="_Toc230901608" w:history="1">
             <w:r>
               <w:rPr>
                 <w:rStyle w:val="Hyperlink"/>
@@ -1067,7 +1067,7 @@
                 <w:noProof/>
                 <w:webHidden/>
               </w:rPr>
-              <w:instrText xml:space="preserve"> PAGEREF _Toc230647580 \h </w:instrText>
+              <w:instrText xml:space="preserve"> PAGEREF _Toc230901608 \h </w:instrText>
             </w:r>
             <w:r>
               <w:rPr>
@@ -1087,7 +1087,7 @@
                 <w:noProof/>
                 <w:webHidden/>
               </w:rPr>
-              <w:t>7</w:t>
+              <w:t>9</w:t>
             </w:r>
             <w:r>
               <w:rPr>
@@ -1110,7 +1110,7 @@
               <w:noProof/>
             </w:rPr>
           </w:pPr>
-          <w:hyperlink w:anchor="_Toc230647581" w:history="1">
+          <w:hyperlink w:anchor="_Toc230901609" w:history="1">
             <w:r>
               <w:rPr>
                 <w:rStyle w:val="Hyperlink"/>
@@ -1155,7 +1155,7 @@
                 <w:noProof/>
                 <w:webHidden/>
               </w:rPr>
-              <w:instrText xml:space="preserve"> PAGEREF _Toc230647581 \h </w:instrText>
+              <w:instrText xml:space="preserve"> PAGEREF _Toc230901609 \h </w:instrText>
             </w:r>
             <w:r>
               <w:rPr>
@@ -1175,7 +1175,7 @@
                 <w:noProof/>
                 <w:webHidden/>
               </w:rPr>
-              <w:t>7</w:t>
+              <w:t>10</w:t>
             </w:r>
             <w:r>
               <w:rPr>
@@ -1198,7 +1198,7 @@
               <w:noProof/>
             </w:rPr>
           </w:pPr>
-          <w:hyperlink w:anchor="_Toc230647582" w:history="1">
+          <w:hyperlink w:anchor="_Toc230901610" w:history="1">
             <w:r>
               <w:rPr>
                 <w:rStyle w:val="Hyperlink"/>
@@ -1243,7 +1243,7 @@
                 <w:noProof/>
                 <w:webHidden/>
               </w:rPr>
-              <w:instrText xml:space="preserve"> PAGEREF _Toc230647582 \h </w:instrText>
+              <w:instrText xml:space="preserve"> PAGEREF _Toc230901610 \h </w:instrText>
             </w:r>
             <w:r>
               <w:rPr>
@@ -1263,7 +1263,7 @@
                 <w:noProof/>
                 <w:webHidden/>
               </w:rPr>
-              <w:t>7</w:t>
+              <w:t>11</w:t>
             </w:r>
             <w:r>
               <w:rPr>
@@ -1286,7 +1286,7 @@
               <w:noProof/>
             </w:rPr>
           </w:pPr>
-          <w:hyperlink w:anchor="_Toc230647583" w:history="1">
+          <w:hyperlink w:anchor="_Toc230901611" w:history="1">
             <w:r>
               <w:rPr>
                 <w:rStyle w:val="Hyperlink"/>
@@ -1331,7 +1331,7 @@
                 <w:noProof/>
                 <w:webHidden/>
               </w:rPr>
-              <w:instrText xml:space="preserve"> PAGEREF _Toc230647583 \h </w:instrText>
+              <w:instrText xml:space="preserve"> PAGEREF _Toc230901611 \h </w:instrText>
             </w:r>
             <w:r>
               <w:rPr>
@@ -1351,7 +1351,7 @@
                 <w:noProof/>
                 <w:webHidden/>
               </w:rPr>
-              <w:t>7</w:t>
+              <w:t>11</w:t>
             </w:r>
             <w:r>
               <w:rPr>
@@ -1374,7 +1374,7 @@
               <w:noProof/>
             </w:rPr>
           </w:pPr>
-          <w:hyperlink w:anchor="_Toc230647584" w:history="1">
+          <w:hyperlink w:anchor="_Toc230901612" w:history="1">
             <w:r>
               <w:rPr>
                 <w:rStyle w:val="Hyperlink"/>
@@ -1419,7 +1419,7 @@
                 <w:noProof/>
                 <w:webHidden/>
               </w:rPr>
-              <w:instrText xml:space="preserve"> PAGEREF _Toc230647584 \h </w:instrText>
+              <w:instrText xml:space="preserve"> PAGEREF _Toc230901612 \h </w:instrText>
             </w:r>
             <w:r>
               <w:rPr>
@@ -1439,7 +1439,7 @@
                 <w:noProof/>
                 <w:webHidden/>
               </w:rPr>
-              <w:t>7</w:t>
+              <w:t>11</w:t>
             </w:r>
             <w:r>
               <w:rPr>
@@ -1462,7 +1462,7 @@
               <w:noProof/>
             </w:rPr>
           </w:pPr>
-          <w:hyperlink w:anchor="_Toc230647585" w:history="1">
+          <w:hyperlink w:anchor="_Toc230901613" w:history="1">
             <w:r>
               <w:rPr>
                 <w:rStyle w:val="Hyperlink"/>
@@ -1507,7 +1507,7 @@
                 <w:noProof/>
                 <w:webHidden/>
               </w:rPr>
-              <w:instrText xml:space="preserve"> PAGEREF _Toc230647585 \h </w:instrText>
+              <w:instrText xml:space="preserve"> PAGEREF _Toc230901613 \h </w:instrText>
             </w:r>
             <w:r>
               <w:rPr>
@@ -1527,7 +1527,7 @@
                 <w:noProof/>
                 <w:webHidden/>
               </w:rPr>
-              <w:t>7</w:t>
+              <w:t>11</w:t>
             </w:r>
             <w:r>
               <w:rPr>
@@ -1550,7 +1550,7 @@
               <w:noProof/>
             </w:rPr>
           </w:pPr>
-          <w:hyperlink w:anchor="_Toc230647586" w:history="1">
+          <w:hyperlink w:anchor="_Toc230901614" w:history="1">
             <w:r>
               <w:rPr>
                 <w:rStyle w:val="Hyperlink"/>
@@ -1595,7 +1595,7 @@
                 <w:noProof/>
                 <w:webHidden/>
               </w:rPr>
-              <w:instrText xml:space="preserve"> PAGEREF _Toc230647586 \h </w:instrText>
+              <w:instrText xml:space="preserve"> PAGEREF _Toc230901614 \h </w:instrText>
             </w:r>
             <w:r>
               <w:rPr>
@@ -1615,7 +1615,7 @@
                 <w:noProof/>
                 <w:webHidden/>
               </w:rPr>
-              <w:t>7</w:t>
+              <w:t>11</w:t>
             </w:r>
             <w:r>
               <w:rPr>
@@ -1638,7 +1638,7 @@
               <w:noProof/>
             </w:rPr>
           </w:pPr>
-          <w:hyperlink w:anchor="_Toc230647587" w:history="1">
+          <w:hyperlink w:anchor="_Toc230901615" w:history="1">
             <w:r>
               <w:rPr>
                 <w:rStyle w:val="Hyperlink"/>
@@ -1683,7 +1683,7 @@
                 <w:noProof/>
                 <w:webHidden/>
               </w:rPr>
-              <w:instrText xml:space="preserve"> PAGEREF _Toc230647587 \h </w:instrText>
+              <w:instrText xml:space="preserve"> PAGEREF _Toc230901615 \h </w:instrText>
             </w:r>
             <w:r>
               <w:rPr>
@@ -1703,7 +1703,7 @@
                 <w:noProof/>
                 <w:webHidden/>
               </w:rPr>
-              <w:t>7</w:t>
+              <w:t>11</w:t>
             </w:r>
             <w:r>
               <w:rPr>
@@ -1726,7 +1726,7 @@
               <w:noProof/>
             </w:rPr>
           </w:pPr>
-          <w:hyperlink w:anchor="_Toc230647588" w:history="1">
+          <w:hyperlink w:anchor="_Toc230901616" w:history="1">
             <w:r>
               <w:rPr>
                 <w:rStyle w:val="Hyperlink"/>
@@ -1771,7 +1771,7 @@
                 <w:noProof/>
                 <w:webHidden/>
               </w:rPr>
-              <w:instrText xml:space="preserve"> PAGEREF _Toc230647588 \h </w:instrText>
+              <w:instrText xml:space="preserve"> PAGEREF _Toc230901616 \h </w:instrText>
             </w:r>
             <w:r>
               <w:rPr>
@@ -1791,7 +1791,7 @@
                 <w:noProof/>
                 <w:webHidden/>
               </w:rPr>
-              <w:t>7</w:t>
+              <w:t>11</w:t>
             </w:r>
             <w:r>
               <w:rPr>
@@ -1814,7 +1814,7 @@
               <w:noProof/>
             </w:rPr>
           </w:pPr>
-          <w:hyperlink w:anchor="_Toc230647589" w:history="1">
+          <w:hyperlink w:anchor="_Toc230901617" w:history="1">
             <w:r>
               <w:rPr>
                 <w:rStyle w:val="Hyperlink"/>
@@ -1859,7 +1859,7 @@
                 <w:noProof/>
                 <w:webHidden/>
               </w:rPr>
-              <w:instrText xml:space="preserve"> PAGEREF _Toc230647589 \h </w:instrText>
+              <w:instrText xml:space="preserve"> PAGEREF _Toc230901617 \h </w:instrText>
             </w:r>
             <w:r>
               <w:rPr>
@@ -1879,7 +1879,7 @@
                 <w:noProof/>
                 <w:webHidden/>
               </w:rPr>
-              <w:t>7</w:t>
+              <w:t>11</w:t>
             </w:r>
             <w:r>
               <w:rPr>
@@ -1902,7 +1902,7 @@
               <w:noProof/>
             </w:rPr>
           </w:pPr>
-          <w:hyperlink w:anchor="_Toc230647590" w:history="1">
+          <w:hyperlink w:anchor="_Toc230901618" w:history="1">
             <w:r>
               <w:rPr>
                 <w:rStyle w:val="Hyperlink"/>
@@ -1947,7 +1947,7 @@
                 <w:noProof/>
                 <w:webHidden/>
               </w:rPr>
-              <w:instrText xml:space="preserve"> PAGEREF _Toc230647590 \h </w:instrText>
+              <w:instrText xml:space="preserve"> PAGEREF _Toc230901618 \h </w:instrText>
             </w:r>
             <w:r>
               <w:rPr>
@@ -1967,7 +1967,7 @@
                 <w:noProof/>
                 <w:webHidden/>
               </w:rPr>
-              <w:t>7</w:t>
+              <w:t>12</w:t>
             </w:r>
             <w:r>
               <w:rPr>
@@ -1990,7 +1990,7 @@
               <w:noProof/>
             </w:rPr>
           </w:pPr>
-          <w:hyperlink w:anchor="_Toc230647591" w:history="1">
+          <w:hyperlink w:anchor="_Toc230901619" w:history="1">
             <w:r>
               <w:rPr>
                 <w:rStyle w:val="Hyperlink"/>
@@ -2035,7 +2035,7 @@
                 <w:noProof/>
                 <w:webHidden/>
               </w:rPr>
-              <w:instrText xml:space="preserve"> PAGEREF _Toc230647591 \h </w:instrText>
+              <w:instrText xml:space="preserve"> PAGEREF _Toc230901619 \h </w:instrText>
             </w:r>
             <w:r>
               <w:rPr>
@@ -2055,7 +2055,7 @@
                 <w:noProof/>
                 <w:webHidden/>
               </w:rPr>
-              <w:t>7</w:t>
+              <w:t>12</w:t>
             </w:r>
             <w:r>
               <w:rPr>
@@ -2078,7 +2078,7 @@
               <w:noProof/>
             </w:rPr>
           </w:pPr>
-          <w:hyperlink w:anchor="_Toc230647592" w:history="1">
+          <w:hyperlink w:anchor="_Toc230901620" w:history="1">
             <w:r>
               <w:rPr>
                 <w:rStyle w:val="Hyperlink"/>
@@ -2123,7 +2123,7 @@
                 <w:noProof/>
                 <w:webHidden/>
               </w:rPr>
-              <w:instrText xml:space="preserve"> PAGEREF _Toc230647592 \h </w:instrText>
+              <w:instrText xml:space="preserve"> PAGEREF _Toc230901620 \h </w:instrText>
             </w:r>
             <w:r>
               <w:rPr>
@@ -2143,7 +2143,7 @@
                 <w:noProof/>
                 <w:webHidden/>
               </w:rPr>
-              <w:t>7</w:t>
+              <w:t>12</w:t>
             </w:r>
             <w:r>
               <w:rPr>
@@ -2166,7 +2166,7 @@
               <w:noProof/>
             </w:rPr>
           </w:pPr>
-          <w:hyperlink w:anchor="_Toc230647593" w:history="1">
+          <w:hyperlink w:anchor="_Toc230901621" w:history="1">
             <w:r>
               <w:rPr>
                 <w:rStyle w:val="Hyperlink"/>
@@ -2211,7 +2211,7 @@
                 <w:noProof/>
                 <w:webHidden/>
               </w:rPr>
-              <w:instrText xml:space="preserve"> PAGEREF _Toc230647593 \h </w:instrText>
+              <w:instrText xml:space="preserve"> PAGEREF _Toc230901621 \h </w:instrText>
             </w:r>
             <w:r>
               <w:rPr>
@@ -2231,7 +2231,7 @@
                 <w:noProof/>
                 <w:webHidden/>
               </w:rPr>
-              <w:t>7</w:t>
+              <w:t>12</w:t>
             </w:r>
             <w:r>
               <w:rPr>
@@ -2254,7 +2254,7 @@
               <w:noProof/>
             </w:rPr>
           </w:pPr>
-          <w:hyperlink w:anchor="_Toc230647594" w:history="1">
+          <w:hyperlink w:anchor="_Toc230901622" w:history="1">
             <w:r>
               <w:rPr>
                 <w:rStyle w:val="Hyperlink"/>
@@ -2299,7 +2299,7 @@
                 <w:noProof/>
                 <w:webHidden/>
               </w:rPr>
-              <w:instrText xml:space="preserve"> PAGEREF _Toc230647594 \h </w:instrText>
+              <w:instrText xml:space="preserve"> PAGEREF _Toc230901622 \h </w:instrText>
             </w:r>
             <w:r>
               <w:rPr>
@@ -2319,7 +2319,7 @@
                 <w:noProof/>
                 <w:webHidden/>
               </w:rPr>
-              <w:t>7</w:t>
+              <w:t>12</w:t>
             </w:r>
             <w:r>
               <w:rPr>
@@ -2342,7 +2342,7 @@
               <w:noProof/>
             </w:rPr>
           </w:pPr>
-          <w:hyperlink w:anchor="_Toc230647595" w:history="1">
+          <w:hyperlink w:anchor="_Toc230901623" w:history="1">
             <w:r>
               <w:rPr>
                 <w:rStyle w:val="Hyperlink"/>
@@ -2387,7 +2387,7 @@
                 <w:noProof/>
                 <w:webHidden/>
               </w:rPr>
-              <w:instrText xml:space="preserve"> PAGEREF _Toc230647595 \h </w:instrText>
+              <w:instrText xml:space="preserve"> PAGEREF _Toc230901623 \h </w:instrText>
             </w:r>
             <w:r>
               <w:rPr>
@@ -2407,7 +2407,7 @@
                 <w:noProof/>
                 <w:webHidden/>
               </w:rPr>
-              <w:t>7</w:t>
+              <w:t>12</w:t>
             </w:r>
             <w:r>
               <w:rPr>
@@ -2430,7 +2430,7 @@
               <w:noProof/>
             </w:rPr>
           </w:pPr>
-          <w:hyperlink w:anchor="_Toc230647596" w:history="1">
+          <w:hyperlink w:anchor="_Toc230901624" w:history="1">
             <w:r>
               <w:rPr>
                 <w:rStyle w:val="Hyperlink"/>
@@ -2475,7 +2475,7 @@
                 <w:noProof/>
                 <w:webHidden/>
               </w:rPr>
-              <w:instrText xml:space="preserve"> PAGEREF _Toc230647596 \h </w:instrText>
+              <w:instrText xml:space="preserve"> PAGEREF _Toc230901624 \h </w:instrText>
             </w:r>
             <w:r>
               <w:rPr>
@@ -2495,7 +2495,7 @@
                 <w:noProof/>
                 <w:webHidden/>
               </w:rPr>
-              <w:t>7</w:t>
+              <w:t>12</w:t>
             </w:r>
             <w:r>
               <w:rPr>
@@ -2518,7 +2518,7 @@
               <w:noProof/>
             </w:rPr>
           </w:pPr>
-          <w:hyperlink w:anchor="_Toc230647597" w:history="1">
+          <w:hyperlink w:anchor="_Toc230901625" w:history="1">
             <w:r>
               <w:rPr>
                 <w:rStyle w:val="Hyperlink"/>
@@ -2563,7 +2563,7 @@
                 <w:noProof/>
                 <w:webHidden/>
               </w:rPr>
-              <w:instrText xml:space="preserve"> PAGEREF _Toc230647597 \h </w:instrText>
+              <w:instrText xml:space="preserve"> PAGEREF _Toc230901625 \h </w:instrText>
             </w:r>
             <w:r>
               <w:rPr>
@@ -2583,7 +2583,7 @@
                 <w:noProof/>
                 <w:webHidden/>
               </w:rPr>
-              <w:t>7</w:t>
+              <w:t>12</w:t>
             </w:r>
             <w:r>
               <w:rPr>
@@ -2606,7 +2606,7 @@
               <w:noProof/>
             </w:rPr>
           </w:pPr>
-          <w:hyperlink w:anchor="_Toc230647598" w:history="1">
+          <w:hyperlink w:anchor="_Toc230901626" w:history="1">
             <w:r>
               <w:rPr>
                 <w:rStyle w:val="Hyperlink"/>
@@ -2651,7 +2651,7 @@
                 <w:noProof/>
                 <w:webHidden/>
               </w:rPr>
-              <w:instrText xml:space="preserve"> PAGEREF _Toc230647598 \h </w:instrText>
+              <w:instrText xml:space="preserve"> PAGEREF _Toc230901626 \h </w:instrText>
             </w:r>
             <w:r>
               <w:rPr>
@@ -2671,7 +2671,7 @@
                 <w:noProof/>
                 <w:webHidden/>
               </w:rPr>
-              <w:t>7</w:t>
+              <w:t>12</w:t>
             </w:r>
             <w:r>
               <w:rPr>
@@ -2694,7 +2694,7 @@
               <w:noProof/>
             </w:rPr>
           </w:pPr>
-          <w:hyperlink w:anchor="_Toc230647599" w:history="1">
+          <w:hyperlink w:anchor="_Toc230901627" w:history="1">
             <w:r>
               <w:rPr>
                 <w:rStyle w:val="Hyperlink"/>
@@ -2739,7 +2739,7 @@
                 <w:noProof/>
                 <w:webHidden/>
               </w:rPr>
-              <w:instrText xml:space="preserve"> PAGEREF _Toc230647599 \h </w:instrText>
+              <w:instrText xml:space="preserve"> PAGEREF _Toc230901627 \h </w:instrText>
             </w:r>
             <w:r>
               <w:rPr>
@@ -2759,7 +2759,7 @@
                 <w:noProof/>
                 <w:webHidden/>
               </w:rPr>
-              <w:t>7</w:t>
+              <w:t>12</w:t>
             </w:r>
             <w:r>
               <w:rPr>
@@ -2782,7 +2782,7 @@
               <w:noProof/>
             </w:rPr>
           </w:pPr>
-          <w:hyperlink w:anchor="_Toc230647600" w:history="1">
+          <w:hyperlink w:anchor="_Toc230901628" w:history="1">
             <w:r>
               <w:rPr>
                 <w:rStyle w:val="Hyperlink"/>
@@ -2827,7 +2827,7 @@
                 <w:noProof/>
                 <w:webHidden/>
               </w:rPr>
-              <w:instrText xml:space="preserve"> PAGEREF _Toc230647600 \h </w:instrText>
+              <w:instrText xml:space="preserve"> PAGEREF _Toc230901628 \h </w:instrText>
             </w:r>
             <w:r>
               <w:rPr>
@@ -2847,7 +2847,7 @@
                 <w:noProof/>
                 <w:webHidden/>
               </w:rPr>
-              <w:t>7</w:t>
+              <w:t>12</w:t>
             </w:r>
             <w:r>
               <w:rPr>
@@ -2870,7 +2870,7 @@
               <w:noProof/>
             </w:rPr>
           </w:pPr>
-          <w:hyperlink w:anchor="_Toc230647601" w:history="1">
+          <w:hyperlink w:anchor="_Toc230901629" w:history="1">
             <w:r>
               <w:rPr>
                 <w:rStyle w:val="Hyperlink"/>
@@ -2915,7 +2915,7 @@
                 <w:noProof/>
                 <w:webHidden/>
               </w:rPr>
-              <w:instrText xml:space="preserve"> PAGEREF _Toc230647601 \h </w:instrText>
+              <w:instrText xml:space="preserve"> PAGEREF _Toc230901629 \h </w:instrText>
             </w:r>
             <w:r>
               <w:rPr>
@@ -2935,7 +2935,7 @@
                 <w:noProof/>
                 <w:webHidden/>
               </w:rPr>
-              <w:t>8</w:t>
+              <w:t>12</w:t>
             </w:r>
             <w:r>
               <w:rPr>
@@ -2958,7 +2958,7 @@
               <w:noProof/>
             </w:rPr>
           </w:pPr>
-          <w:hyperlink w:anchor="_Toc230647602" w:history="1">
+          <w:hyperlink w:anchor="_Toc230901630" w:history="1">
             <w:r>
               <w:rPr>
                 <w:rStyle w:val="Hyperlink"/>
@@ -3003,7 +3003,7 @@
                 <w:noProof/>
                 <w:webHidden/>
               </w:rPr>
-              <w:instrText xml:space="preserve"> PAGEREF _Toc230647602 \h </w:instrText>
+              <w:instrText xml:space="preserve"> PAGEREF _Toc230901630 \h </w:instrText>
             </w:r>
             <w:r>
               <w:rPr>
@@ -3023,7 +3023,7 @@
                 <w:noProof/>
                 <w:webHidden/>
               </w:rPr>
-              <w:t>8</w:t>
+              <w:t>12</w:t>
             </w:r>
             <w:r>
               <w:rPr>
@@ -3046,7 +3046,7 @@
               <w:noProof/>
             </w:rPr>
           </w:pPr>
-          <w:hyperlink w:anchor="_Toc230647603" w:history="1">
+          <w:hyperlink w:anchor="_Toc230901631" w:history="1">
             <w:r>
               <w:rPr>
                 <w:rStyle w:val="Hyperlink"/>
@@ -3091,7 +3091,7 @@
                 <w:noProof/>
                 <w:webHidden/>
               </w:rPr>
-              <w:instrText xml:space="preserve"> PAGEREF _Toc230647603 \h </w:instrText>
+              <w:instrText xml:space="preserve"> PAGEREF _Toc230901631 \h </w:instrText>
             </w:r>
             <w:r>
               <w:rPr>
@@ -3111,7 +3111,7 @@
                 <w:noProof/>
                 <w:webHidden/>
               </w:rPr>
-              <w:t>8</w:t>
+              <w:t>12</w:t>
             </w:r>
             <w:r>
               <w:rPr>
@@ -3136,6 +3136,302 @@
     </w:sdt>
     <w:p>
       <w:pPr>
+        <w:pStyle w:val="TOCHeading"/>
+        <w:spacing w:after="240"/>
+        <w:jc w:val="center"/>
+        <w:rPr>
+          <w:rFonts w:ascii="Times New Roman" w:hAnsi="Times New Roman" w:cs="Times New Roman"/>
+          <w:b/>
+          <w:bCs/>
+          <w:color w:val="auto"/>
+          <w:sz w:val="40"/>
+          <w:szCs w:val="40"/>
+          <w:u w:val="single"/>
+        </w:rPr>
+      </w:pPr>
+      <w:bookmarkStart w:id="0" w:name="_Toc230901599"/>
+      <w:r>
+        <w:rPr>
+          <w:rFonts w:ascii="Times New Roman" w:hAnsi="Times New Roman" w:cs="Times New Roman"/>
+          <w:b/>
+          <w:bCs/>
+          <w:color w:val="auto"/>
+          <w:sz w:val="40"/>
+          <w:szCs w:val="40"/>
+          <w:u w:val="single"/>
+        </w:rPr>
+        <w:t>List of Figures</w:t>
+      </w:r>
+    </w:p>
+    <w:p>
+      <w:pPr>
+        <w:pStyle w:val="TableofFigures"/>
+        <w:tabs>
+          <w:tab w:val="right" w:leader="dot" w:pos="9016"/>
+        </w:tabs>
+        <w:rPr>
+          <w:noProof/>
+        </w:rPr>
+      </w:pPr>
+      <w:r>
+        <w:fldChar w:fldCharType="begin"/>
+      </w:r>
+      <w:r>
+        <w:instrText xml:space="preserve"> TOC \h \z \c "Figure" </w:instrText>
+      </w:r>
+      <w:r>
+        <w:fldChar w:fldCharType="separate"/>
+      </w:r>
+      <w:hyperlink w:anchor="_Toc230901632" w:history="1">
+        <w:r>
+          <w:rPr>
+            <w:rStyle w:val="Hyperlink"/>
+            <w:noProof/>
+          </w:rPr>
+          <w:t>Figure 1: The Vicious Cycle of Public Bus and Rail Transit Unreliability and Ridership Uncertainty.</w:t>
+        </w:r>
+        <w:r>
+          <w:rPr>
+            <w:noProof/>
+            <w:webHidden/>
+          </w:rPr>
+          <w:tab/>
+        </w:r>
+        <w:r>
+          <w:rPr>
+            <w:noProof/>
+            <w:webHidden/>
+          </w:rPr>
+          <w:fldChar w:fldCharType="begin"/>
+        </w:r>
+        <w:r>
+          <w:rPr>
+            <w:noProof/>
+            <w:webHidden/>
+          </w:rPr>
+          <w:instrText xml:space="preserve"> PAGEREF _Toc230901632 \h </w:instrText>
+        </w:r>
+        <w:r>
+          <w:rPr>
+            <w:noProof/>
+            <w:webHidden/>
+          </w:rPr>
+        </w:r>
+        <w:r>
+          <w:rPr>
+            <w:noProof/>
+            <w:webHidden/>
+          </w:rPr>
+          <w:fldChar w:fldCharType="separate"/>
+        </w:r>
+        <w:r>
+          <w:rPr>
+            <w:noProof/>
+            <w:webHidden/>
+          </w:rPr>
+          <w:t>10</w:t>
+        </w:r>
+        <w:r>
+          <w:rPr>
+            <w:noProof/>
+            <w:webHidden/>
+          </w:rPr>
+          <w:fldChar w:fldCharType="end"/>
+        </w:r>
+      </w:hyperlink>
+    </w:p>
+    <w:p>
+      <w:r>
+        <w:fldChar w:fldCharType="end"/>
+      </w:r>
+    </w:p>
+    <w:p>
+      <w:pPr>
+        <w:pStyle w:val="TOCHeading"/>
+        <w:spacing w:after="240"/>
+        <w:jc w:val="center"/>
+        <w:rPr>
+          <w:rFonts w:ascii="Times New Roman" w:hAnsi="Times New Roman" w:cs="Times New Roman"/>
+          <w:b/>
+          <w:bCs/>
+          <w:color w:val="auto"/>
+          <w:sz w:val="40"/>
+          <w:szCs w:val="40"/>
+          <w:u w:val="single"/>
+        </w:rPr>
+      </w:pPr>
+      <w:r>
+        <w:rPr>
+          <w:rFonts w:ascii="Times New Roman" w:hAnsi="Times New Roman" w:cs="Times New Roman"/>
+          <w:b/>
+          <w:bCs/>
+          <w:color w:val="auto"/>
+          <w:sz w:val="40"/>
+          <w:szCs w:val="40"/>
+          <w:u w:val="single"/>
+        </w:rPr>
+        <w:t>List of Tables</w:t>
+      </w:r>
+    </w:p>
+    <w:p>
+      <w:pPr>
+        <w:pStyle w:val="TableofFigures"/>
+        <w:tabs>
+          <w:tab w:val="right" w:leader="dot" w:pos="9016"/>
+        </w:tabs>
+        <w:rPr>
+          <w:rFonts w:asciiTheme="minorHAnsi" w:hAnsiTheme="minorHAnsi"/>
+          <w:noProof/>
+        </w:rPr>
+      </w:pPr>
+      <w:r>
+        <w:fldChar w:fldCharType="begin"/>
+      </w:r>
+      <w:r>
+        <w:instrText xml:space="preserve"> TOC \h \z \c "Table" </w:instrText>
+      </w:r>
+      <w:r>
+        <w:fldChar w:fldCharType="separate"/>
+      </w:r>
+      <w:hyperlink w:anchor="_Toc230901673" w:history="1">
+        <w:r>
+          <w:rPr>
+            <w:rStyle w:val="Hyperlink"/>
+            <w:noProof/>
+          </w:rPr>
+          <w:t>Table 1: Summary of Research Scope, including Model Architectures, Evaluation Metrics, Geographical Focus, and Dataset Segmentation relative to Malaysia’s MCO period.</w:t>
+        </w:r>
+        <w:r>
+          <w:rPr>
+            <w:noProof/>
+            <w:webHidden/>
+          </w:rPr>
+          <w:tab/>
+        </w:r>
+        <w:r>
+          <w:rPr>
+            <w:noProof/>
+            <w:webHidden/>
+          </w:rPr>
+          <w:fldChar w:fldCharType="begin"/>
+        </w:r>
+        <w:r>
+          <w:rPr>
+            <w:noProof/>
+            <w:webHidden/>
+          </w:rPr>
+          <w:instrText xml:space="preserve"> PAGEREF _Toc230901673 \h </w:instrText>
+        </w:r>
+        <w:r>
+          <w:rPr>
+            <w:noProof/>
+            <w:webHidden/>
+          </w:rPr>
+        </w:r>
+        <w:r>
+          <w:rPr>
+            <w:noProof/>
+            <w:webHidden/>
+          </w:rPr>
+          <w:fldChar w:fldCharType="separate"/>
+        </w:r>
+        <w:r>
+          <w:rPr>
+            <w:noProof/>
+            <w:webHidden/>
+          </w:rPr>
+          <w:t>7</w:t>
+        </w:r>
+        <w:r>
+          <w:rPr>
+            <w:noProof/>
+            <w:webHidden/>
+          </w:rPr>
+          <w:fldChar w:fldCharType="end"/>
+        </w:r>
+      </w:hyperlink>
+    </w:p>
+    <w:p>
+      <w:pPr>
+        <w:pStyle w:val="TableofFigures"/>
+        <w:tabs>
+          <w:tab w:val="right" w:leader="dot" w:pos="9016"/>
+        </w:tabs>
+        <w:rPr>
+          <w:rFonts w:asciiTheme="minorHAnsi" w:hAnsiTheme="minorHAnsi"/>
+          <w:noProof/>
+        </w:rPr>
+      </w:pPr>
+      <w:hyperlink w:anchor="_Toc230901674" w:history="1">
+        <w:r>
+          <w:rPr>
+            <w:rStyle w:val="Hyperlink"/>
+            <w:noProof/>
+          </w:rPr>
+          <w:t>Table 2: Comparison of Technical Reliability Metrics and Subjective User Perception Factors based on Multiple Sources.</w:t>
+        </w:r>
+        <w:r>
+          <w:rPr>
+            <w:noProof/>
+            <w:webHidden/>
+          </w:rPr>
+          <w:tab/>
+        </w:r>
+        <w:r>
+          <w:rPr>
+            <w:noProof/>
+            <w:webHidden/>
+          </w:rPr>
+          <w:fldChar w:fldCharType="begin"/>
+        </w:r>
+        <w:r>
+          <w:rPr>
+            <w:noProof/>
+            <w:webHidden/>
+          </w:rPr>
+          <w:instrText xml:space="preserve"> PAGEREF _Toc230901674 \h </w:instrText>
+        </w:r>
+        <w:r>
+          <w:rPr>
+            <w:noProof/>
+            <w:webHidden/>
+          </w:rPr>
+        </w:r>
+        <w:r>
+          <w:rPr>
+            <w:noProof/>
+            <w:webHidden/>
+          </w:rPr>
+          <w:fldChar w:fldCharType="separate"/>
+        </w:r>
+        <w:r>
+          <w:rPr>
+            <w:noProof/>
+            <w:webHidden/>
+          </w:rPr>
+          <w:t>9</w:t>
+        </w:r>
+        <w:r>
+          <w:rPr>
+            <w:noProof/>
+            <w:webHidden/>
+          </w:rPr>
+          <w:fldChar w:fldCharType="end"/>
+        </w:r>
+      </w:hyperlink>
+    </w:p>
+    <w:p>
+      <w:r>
+        <w:fldChar w:fldCharType="end"/>
+      </w:r>
+    </w:p>
+    <w:p/>
+    <w:p/>
+    <w:p/>
+    <w:p/>
+    <w:p/>
+    <w:p>
+      <w:pPr>
         <w:pStyle w:val="Heading1"/>
         <w:numPr>
           <w:ilvl w:val="0"/>
@@ -3150,7 +3446,6 @@
           <w:u w:val="single"/>
         </w:rPr>
       </w:pPr>
-      <w:bookmarkStart w:id="0" w:name="_Toc230647571"/>
       <w:r>
         <w:rPr>
           <w:b/>
@@ -3159,6 +3454,7 @@
           <w:szCs w:val="24"/>
           <w:u w:val="single"/>
         </w:rPr>
+        <w:lastRenderedPageBreak/>
         <w:t>Introduction</w:t>
       </w:r>
       <w:bookmarkEnd w:id="0"/>
@@ -3178,7 +3474,7 @@
           <w:u w:val="single"/>
         </w:rPr>
       </w:pPr>
-      <w:bookmarkStart w:id="1" w:name="_Toc230647572"/>
+      <w:bookmarkStart w:id="1" w:name="_Toc230901600"/>
       <w:r>
         <w:rPr>
           <w:b/>
@@ -3586,7 +3882,13 @@
         <w:t xml:space="preserve">from </w:t>
       </w:r>
       <w:r>
-        <w:t xml:space="preserve">Shen, Xiao &amp; Wang (2016) and </w:t>
+        <w:t>Shen</w:t>
+      </w:r>
+      <w:r>
+        <w:t xml:space="preserve"> et al. </w:t>
+      </w:r>
+      <w:r>
+        <w:t xml:space="preserve">(2016) and </w:t>
       </w:r>
       <w:r>
         <w:t>Borhan et al. (2019)</w:t>
@@ -3604,7 +3906,6 @@
         <w:t xml:space="preserve">frequently </w:t>
       </w:r>
       <w:r>
-        <w:lastRenderedPageBreak/>
         <w:t>highlighted as</w:t>
       </w:r>
       <w:r>
@@ -3709,30 +4010,134 @@
         <w:t>ith intricate</w:t>
       </w:r>
       <w:r>
+        <w:t xml:space="preserve"> spatio-temporal interconnections</w:t>
+      </w:r>
+      <w:r>
         <w:t xml:space="preserve"> </w:t>
       </w:r>
-      <w:proofErr w:type="spellStart"/>
-      <w:r>
-        <w:t>spatio</w:t>
-      </w:r>
-      <w:proofErr w:type="spellEnd"/>
-      <w:r>
-        <w:t>-temporal interconnections</w:t>
+      <w:r>
+        <w:t>within</w:t>
+      </w:r>
+      <w:r>
+        <w:t xml:space="preserve"> public transit networks </w:t>
+      </w:r>
+      <w:r>
+        <w:rPr>
+          <w:noProof/>
+        </w:rPr>
+        <w:t>(Chen</w:t>
+      </w:r>
+      <w:r>
+        <w:rPr>
+          <w:noProof/>
+        </w:rPr>
+        <w:t xml:space="preserve"> et al.</w:t>
+      </w:r>
+      <w:r>
+        <w:rPr>
+          <w:noProof/>
+        </w:rPr>
+        <w:t>, 2022)</w:t>
+      </w:r>
+      <w:r>
+        <w:t>.</w:t>
       </w:r>
       <w:r>
         <w:t xml:space="preserve"> </w:t>
       </w:r>
       <w:r>
-        <w:t>within</w:t>
-      </w:r>
-      <w:r>
-        <w:t xml:space="preserve"> public transit networks </w:t>
-      </w:r>
-      <w:r>
-        <w:rPr>
-          <w:noProof/>
-        </w:rPr>
-        <w:t>(Chen, Fu, &amp; Wang, 2022)</w:t>
+        <w:t xml:space="preserve">Unlike traditional models like AutoRegressive Integrated Moving Average (ARIMA), </w:t>
+      </w:r>
+      <w:r>
+        <w:t>DL</w:t>
+      </w:r>
+      <w:r>
+        <w:t xml:space="preserve"> approaches such as Long Short-Term Memory (LSTM) and Graph Convolutional Networks (GCN)</w:t>
+      </w:r>
+      <w:r>
+        <w:t xml:space="preserve"> </w:t>
+      </w:r>
+      <w:r>
+        <w:t>can integrate</w:t>
+      </w:r>
+      <w:r>
+        <w:t xml:space="preserve"> </w:t>
+      </w:r>
+      <w:r>
+        <w:t>multiple</w:t>
+      </w:r>
+      <w:r>
+        <w:t xml:space="preserve"> data sources</w:t>
+      </w:r>
+      <w:r>
+        <w:t xml:space="preserve"> to be trained on</w:t>
+      </w:r>
+      <w:r>
+        <w:t>, f</w:t>
+      </w:r>
+      <w:r>
+        <w:t xml:space="preserve">or </w:t>
+      </w:r>
+      <w:r>
+        <w:lastRenderedPageBreak/>
+        <w:t>example</w:t>
+      </w:r>
+      <w:r>
+        <w:t xml:space="preserve">, </w:t>
+      </w:r>
+      <w:r>
+        <w:t xml:space="preserve">General Transit Feed Specification (GTFS) data, </w:t>
+      </w:r>
+      <w:r>
+        <w:t>historical weather patterns, Points of Interest (POIs) and so on</w:t>
+      </w:r>
+      <w:r>
+        <w:t xml:space="preserve">, thus </w:t>
+      </w:r>
+      <w:r>
+        <w:t>allow</w:t>
+      </w:r>
+      <w:r>
+        <w:t>ing</w:t>
+      </w:r>
+      <w:r>
+        <w:t xml:space="preserve"> the model to </w:t>
+      </w:r>
+      <w:r>
+        <w:t>fully capture both spatial and temporal relationships within transit systems</w:t>
+      </w:r>
+      <w:r>
+        <w:t xml:space="preserve"> </w:t>
+      </w:r>
+      <w:r>
+        <w:rPr>
+          <w:noProof/>
+        </w:rPr>
+        <w:t>(</w:t>
+      </w:r>
+      <w:r>
+        <w:rPr>
+          <w:noProof/>
+        </w:rPr>
+        <w:t xml:space="preserve">Ge et al., 2021; </w:t>
+      </w:r>
+      <w:r>
+        <w:rPr>
+          <w:noProof/>
+        </w:rPr>
+        <w:t>Chen</w:t>
+      </w:r>
+      <w:r>
+        <w:rPr>
+          <w:noProof/>
+        </w:rPr>
+        <w:t xml:space="preserve"> et al.</w:t>
+      </w:r>
+      <w:r>
+        <w:rPr>
+          <w:noProof/>
+        </w:rPr>
+        <w:t>, 2022)</w:t>
       </w:r>
       <w:r>
         <w:t>.</w:t>
@@ -3741,113 +4146,18 @@
         <w:t xml:space="preserve"> </w:t>
       </w:r>
       <w:r>
-        <w:t xml:space="preserve">Unlike traditional models like </w:t>
-      </w:r>
-      <w:proofErr w:type="spellStart"/>
-      <w:r>
-        <w:t>AutoRegressive</w:t>
-      </w:r>
-      <w:proofErr w:type="spellEnd"/>
-      <w:r>
-        <w:t xml:space="preserve"> Integrated Moving Average (ARIMA), </w:t>
+        <w:t>As a result</w:t>
+      </w:r>
+      <w:r>
+        <w:t xml:space="preserve">, </w:t>
+      </w:r>
+      <w:r>
+        <w:t xml:space="preserve">state-of-the-art (SOTA) </w:t>
       </w:r>
       <w:r>
         <w:t>DL</w:t>
       </w:r>
       <w:r>
-        <w:t xml:space="preserve"> approaches such as Long Short-Term Memory (LSTM) and Graph Convolutional Networks (GCN)</w:t>
-      </w:r>
-      <w:r>
-        <w:t xml:space="preserve"> </w:t>
-      </w:r>
-      <w:r>
-        <w:t>can integrate</w:t>
-      </w:r>
-      <w:r>
-        <w:t xml:space="preserve"> </w:t>
-      </w:r>
-      <w:r>
-        <w:t>multiple</w:t>
-      </w:r>
-      <w:r>
-        <w:t xml:space="preserve"> data sources</w:t>
-      </w:r>
-      <w:r>
-        <w:t xml:space="preserve"> to be trained on</w:t>
-      </w:r>
-      <w:r>
-        <w:t>, f</w:t>
-      </w:r>
-      <w:r>
-        <w:t xml:space="preserve">or </w:t>
-      </w:r>
-      <w:r>
-        <w:t>example</w:t>
-      </w:r>
-      <w:r>
-        <w:t xml:space="preserve">, </w:t>
-      </w:r>
-      <w:r>
-        <w:t xml:space="preserve">General Transit Feed Specification (GTFS) data, </w:t>
-      </w:r>
-      <w:r>
-        <w:t>historical weather patterns, Points of Interest (POIs) and so on</w:t>
-      </w:r>
-      <w:r>
-        <w:t xml:space="preserve">, thus </w:t>
-      </w:r>
-      <w:r>
-        <w:t>allow</w:t>
-      </w:r>
-      <w:r>
-        <w:t>ing</w:t>
-      </w:r>
-      <w:r>
-        <w:t xml:space="preserve"> the model to </w:t>
-      </w:r>
-      <w:r>
-        <w:t>fully capture both spatial and temporal relationships within transit systems</w:t>
-      </w:r>
-      <w:r>
-        <w:t xml:space="preserve"> </w:t>
-      </w:r>
-      <w:r>
-        <w:rPr>
-          <w:noProof/>
-        </w:rPr>
-        <w:t>(</w:t>
-      </w:r>
-      <w:r>
-        <w:rPr>
-          <w:noProof/>
-        </w:rPr>
-        <w:t xml:space="preserve">Ge et al., 2021; </w:t>
-      </w:r>
-      <w:r>
-        <w:rPr>
-          <w:noProof/>
-        </w:rPr>
-        <w:t>Chen, Fu, &amp; Wang, 2022)</w:t>
-      </w:r>
-      <w:r>
-        <w:t>.</w:t>
-      </w:r>
-      <w:r>
-        <w:t xml:space="preserve"> </w:t>
-      </w:r>
-      <w:r>
-        <w:t>As a result</w:t>
-      </w:r>
-      <w:r>
-        <w:t xml:space="preserve">, </w:t>
-      </w:r>
-      <w:r>
-        <w:t xml:space="preserve">state-of-the-art (SOTA) </w:t>
-      </w:r>
-      <w:r>
-        <w:t>DL</w:t>
-      </w:r>
-      <w:r>
         <w:t xml:space="preserve"> architectures must be implemented </w:t>
       </w:r>
       <w:r>
@@ -3860,15 +4170,7 @@
         <w:t xml:space="preserve"> and consistent</w:t>
       </w:r>
       <w:r>
-        <w:t xml:space="preserve"> ridership predictions with complex </w:t>
-      </w:r>
-      <w:proofErr w:type="spellStart"/>
-      <w:r>
-        <w:t>spatio</w:t>
-      </w:r>
-      <w:proofErr w:type="spellEnd"/>
-      <w:r>
-        <w:t>-temporal</w:t>
+        <w:t xml:space="preserve"> ridership predictions with complex spatio-temporal</w:t>
       </w:r>
       <w:r>
         <w:t xml:space="preserve"> data. This directly </w:t>
@@ -3892,7 +4194,7 @@
           <w:u w:val="single"/>
         </w:rPr>
       </w:pPr>
-      <w:bookmarkStart w:id="2" w:name="_Toc230647573"/>
+      <w:bookmarkStart w:id="2" w:name="_Toc230901601"/>
       <w:r>
         <w:rPr>
           <w:b/>
@@ -4018,14 +4320,7 @@
         <w:rPr>
           <w:lang w:val="en-US"/>
         </w:rPr>
-        <w:t xml:space="preserve"> the presence of extreme data anomalies in historical </w:t>
-      </w:r>
-      <w:r>
-        <w:rPr>
-          <w:lang w:val="en-US"/>
-        </w:rPr>
-        <w:lastRenderedPageBreak/>
-        <w:t>ridership data presented a confounding scenario, which is the enforcement of Movement Control Order (MCO) in Malaysia from 18</w:t>
+        <w:t xml:space="preserve"> the presence of extreme data anomalies in historical ridership data presented a confounding scenario, which is the enforcement of Movement Control Order (MCO) in Malaysia from 18</w:t>
       </w:r>
       <w:r>
         <w:rPr>
@@ -4153,7 +4448,7 @@
           <w:u w:val="single"/>
         </w:rPr>
       </w:pPr>
-      <w:bookmarkStart w:id="3" w:name="_Toc230647574"/>
+      <w:bookmarkStart w:id="3" w:name="_Toc230901602"/>
       <w:r>
         <w:rPr>
           <w:b/>
@@ -4162,6 +4457,7 @@
           <w:szCs w:val="24"/>
           <w:u w:val="single"/>
         </w:rPr>
+        <w:lastRenderedPageBreak/>
         <w:t>Research Questions</w:t>
       </w:r>
       <w:bookmarkEnd w:id="3"/>
@@ -4211,15 +4507,7 @@
         <w:t xml:space="preserve"> </w:t>
       </w:r>
       <w:r>
-        <w:t>existing DL architectures (</w:t>
-      </w:r>
-      <w:proofErr w:type="spellStart"/>
-      <w:r>
-        <w:t>spatio</w:t>
-      </w:r>
-      <w:proofErr w:type="spellEnd"/>
-      <w:r>
-        <w:t>-temporal, graph-based, and attention-based)</w:t>
+        <w:t>existing DL architectures (spatio-temporal, graph-based, and attention-based)</w:t>
       </w:r>
       <w:r>
         <w:t xml:space="preserve"> </w:t>
@@ -4273,7 +4561,7 @@
           <w:u w:val="single"/>
         </w:rPr>
       </w:pPr>
-      <w:bookmarkStart w:id="4" w:name="_Toc230647575"/>
+      <w:bookmarkStart w:id="4" w:name="_Toc230901603"/>
       <w:r>
         <w:rPr>
           <w:b/>
@@ -4423,13 +4711,8 @@
       <w:r>
         <w:t xml:space="preserve">baseline, </w:t>
       </w:r>
-      <w:proofErr w:type="spellStart"/>
-      <w:r>
-        <w:t>spatio</w:t>
-      </w:r>
-      <w:proofErr w:type="spellEnd"/>
-      <w:r>
-        <w:t>-temporal</w:t>
+      <w:r>
+        <w:t>spatio-temporal</w:t>
       </w:r>
       <w:r>
         <w:t>-based, graph-based</w:t>
@@ -4495,7 +4778,7 @@
           <w:u w:val="single"/>
         </w:rPr>
       </w:pPr>
-      <w:bookmarkStart w:id="5" w:name="_Toc230647576"/>
+      <w:bookmarkStart w:id="5" w:name="_Toc230901604"/>
       <w:r>
         <w:rPr>
           <w:b/>
@@ -4504,7 +4787,6 @@
           <w:szCs w:val="24"/>
           <w:u w:val="single"/>
         </w:rPr>
-        <w:lastRenderedPageBreak/>
         <w:t>Research Scope</w:t>
       </w:r>
       <w:bookmarkEnd w:id="5"/>
@@ -5318,6 +5600,7 @@
           <w:szCs w:val="24"/>
         </w:rPr>
       </w:pPr>
+      <w:bookmarkStart w:id="6" w:name="_Toc230901673"/>
       <w:r>
         <w:rPr>
           <w:color w:val="auto"/>
@@ -5383,6 +5666,7 @@
         </w:rPr>
         <w:t>Summary of Research Scope, including Model Architectures, Evaluation Metrics, Geographical Focus, and Dataset Segmentation relative to Malaysia’s MCO period.</w:t>
       </w:r>
+      <w:bookmarkEnd w:id="6"/>
     </w:p>
     <w:p/>
     <w:p>
@@ -5401,7 +5685,7 @@
           <w:u w:val="single"/>
         </w:rPr>
       </w:pPr>
-      <w:bookmarkStart w:id="6" w:name="_Toc230647577"/>
+      <w:bookmarkStart w:id="7" w:name="_Toc230901605"/>
       <w:r>
         <w:rPr>
           <w:b/>
@@ -5410,10 +5694,9 @@
           <w:szCs w:val="24"/>
           <w:u w:val="single"/>
         </w:rPr>
-        <w:lastRenderedPageBreak/>
         <w:t>Literature Review</w:t>
       </w:r>
-      <w:bookmarkEnd w:id="6"/>
+      <w:bookmarkEnd w:id="7"/>
     </w:p>
     <w:p>
       <w:pPr>
@@ -5430,7 +5713,7 @@
           <w:u w:val="single"/>
         </w:rPr>
       </w:pPr>
-      <w:bookmarkStart w:id="7" w:name="_Toc230647578"/>
+      <w:bookmarkStart w:id="8" w:name="_Toc230901606"/>
       <w:r>
         <w:rPr>
           <w:b/>
@@ -5451,7 +5734,45 @@
         </w:rPr>
         <w:t xml:space="preserve"> and Demand Dynamics</w:t>
       </w:r>
-      <w:bookmarkEnd w:id="7"/>
+      <w:bookmarkEnd w:id="8"/>
+    </w:p>
+    <w:p>
+      <w:pPr>
+        <w:ind w:firstLine="720"/>
+      </w:pPr>
+      <w:r>
+        <w:t xml:space="preserve">Public transport reliability is the primary linkage between service supply and passenger model choice. It serves as the critical determinant of transit demand. According to Lu et al. (2020), </w:t>
+      </w:r>
+      <w:r>
+        <w:t>the presence of big data applications has successfully influenced the efficiency of urban transit systems by finding the equilibrium between travel demand and network supply.</w:t>
+      </w:r>
+      <w:r>
+        <w:t xml:space="preserve"> From the perspective of developing nations, </w:t>
+      </w:r>
+      <w:r>
+        <w:rPr>
+          <w:noProof/>
+        </w:rPr>
+        <w:t>Sogbe</w:t>
+      </w:r>
+      <w:r>
+        <w:rPr>
+          <w:noProof/>
+        </w:rPr>
+        <w:t xml:space="preserve"> et al.</w:t>
+      </w:r>
+      <w:r>
+        <w:rPr>
+          <w:noProof/>
+        </w:rPr>
+        <w:t xml:space="preserve"> (2024)</w:t>
+      </w:r>
+      <w:r>
+        <w:rPr>
+          <w:noProof/>
+        </w:rPr>
+        <w:t xml:space="preserve"> emphasizes that reliability, safety, and accessibility are the most substantial drivers. These determinants help to shape user satisfaction and long-term usage patterns. When transit systems fail to provide consistent service, the resulting uncertainty will cause a shift toward private vehicle ownership. As a result, it further exacerbates traffic congestion and environmental degradation. Understanding the intricate dynamics between how a service performs and how users respond to that performance is essential for achieving sustainble urban mobility goals.</w:t>
+      </w:r>
     </w:p>
     <w:p>
       <w:pPr>
@@ -5468,7 +5789,7 @@
           <w:u w:val="single"/>
         </w:rPr>
       </w:pPr>
-      <w:bookmarkStart w:id="8" w:name="_Toc230647579"/>
+      <w:bookmarkStart w:id="9" w:name="_Toc230901607"/>
       <w:r>
         <w:rPr>
           <w:b/>
@@ -5477,9 +5798,722 @@
           <w:szCs w:val="24"/>
           <w:u w:val="single"/>
         </w:rPr>
+        <w:lastRenderedPageBreak/>
         <w:t>Defining Reliability: Metrics and User Perception</w:t>
       </w:r>
-      <w:bookmarkEnd w:id="8"/>
+      <w:bookmarkEnd w:id="9"/>
+    </w:p>
+    <w:p>
+      <w:pPr>
+        <w:ind w:firstLine="720"/>
+        <w:rPr>
+          <w:noProof/>
+        </w:rPr>
+      </w:pPr>
+      <w:r>
+        <w:t xml:space="preserve">Reliability in public transit is a multi-dimensional construct that covers both objective operational performance and subjective passenger experience. </w:t>
+      </w:r>
+      <w:r>
+        <w:rPr>
+          <w:noProof/>
+        </w:rPr>
+        <w:t xml:space="preserve">Mohamed et al. (2021) define travel time reliability as the measurement of time gap between the expected and actual travel time. This definition can be identified as a key index of network uncertainty. Their research indicates that factors such as route length, the number of signalized intersections, departure delays are primary causes </w:t>
+      </w:r>
+      <w:r>
+        <w:rPr>
+          <w:noProof/>
+        </w:rPr>
+        <w:t>to</w:t>
+      </w:r>
+      <w:r>
+        <w:rPr>
+          <w:noProof/>
+        </w:rPr>
+        <w:t xml:space="preserve"> bus system unreliability.</w:t>
+      </w:r>
+      <w:r>
+        <w:rPr>
+          <w:noProof/>
+        </w:rPr>
+        <w:t xml:space="preserve"> However, as mentioned, reliability also covers the subjective passenger experience where it differs from different user perception.</w:t>
+      </w:r>
+      <w:r>
+        <w:rPr>
+          <w:noProof/>
+        </w:rPr>
+        <w:t xml:space="preserve"> </w:t>
+      </w:r>
+      <w:r>
+        <w:rPr>
+          <w:noProof/>
+        </w:rPr>
+        <w:t xml:space="preserve">Ibrahim et al. (2022) found that in the Klang Valley LRT system, users’ perceived satisfaction is heavily influenced by “soft” reliability factors like the provision of accurate information and the quality of station amenities. This suggests that </w:t>
+      </w:r>
+      <w:r>
+        <w:rPr>
+          <w:noProof/>
+        </w:rPr>
+        <w:t xml:space="preserve">the irrelevance of </w:t>
+      </w:r>
+      <w:r>
+        <w:rPr>
+          <w:noProof/>
+        </w:rPr>
+        <w:t>transit agencies like RapidKL focus on “hard” metrics such as on-time performance.</w:t>
+      </w:r>
+      <w:r>
+        <w:rPr>
+          <w:noProof/>
+        </w:rPr>
+        <w:t xml:space="preserve"> The passenger’s sense of reliability is often mediated by the environment and the information provided during the wait. For instance, the difference between open-aired and underground air-conditioned stations and the accuracy of arrivals displayed on scrolling text.</w:t>
+      </w:r>
+    </w:p>
+    <w:p>
+      <w:pPr>
+        <w:ind w:firstLine="720"/>
+        <w:rPr>
+          <w:noProof/>
+        </w:rPr>
+      </w:pPr>
+      <w:r>
+        <w:rPr>
+          <w:noProof/>
+        </w:rPr>
+        <w:t xml:space="preserve">The psychological impact of unreliability further complicates its defintion, as delays are often translated into stress and anxiety for the passenger. </w:t>
+      </w:r>
+      <w:r>
+        <w:rPr>
+          <w:noProof/>
+          <w:lang w:val="en-US"/>
+        </w:rPr>
+        <w:t xml:space="preserve">Rezapour &amp; Ferraro (2021) </w:t>
+      </w:r>
+      <w:r>
+        <w:rPr>
+          <w:noProof/>
+          <w:lang w:val="en-US"/>
+        </w:rPr>
+        <w:t>claims that rail transport delays lead to negative psychological feelings,</w:t>
+      </w:r>
+      <w:r>
+        <w:rPr>
+          <w:noProof/>
+        </w:rPr>
+        <w:t xml:space="preserve"> </w:t>
+      </w:r>
+      <w:r>
+        <w:rPr>
+          <w:noProof/>
+        </w:rPr>
+        <w:t xml:space="preserve">which are significantly mitigated by the presence of Passenger Information System (PIS). </w:t>
+      </w:r>
+      <w:r>
+        <w:rPr>
+          <w:noProof/>
+        </w:rPr>
+        <w:t xml:space="preserve">Their study of Malaysian rail passengers revealed that inaccurate or imprecise real-time information can aggravate feelings of anger and uncertainty. Consequently, it will tarnish the perceived quality of the entire transit network. For example, </w:t>
+      </w:r>
+      <w:r>
+        <w:rPr>
+          <w:noProof/>
+        </w:rPr>
+        <w:t>from</w:t>
+      </w:r>
+      <w:r>
+        <w:rPr>
+          <w:noProof/>
+        </w:rPr>
+        <w:t xml:space="preserve"> 2026 to date, there are multiple reports of major breakdowns, stalls, congestions for LRT Kelana Jaya line that caused a lot of distruptions, delays and avoidance of this line. </w:t>
+      </w:r>
+      <w:r>
+        <w:rPr>
+          <w:noProof/>
+        </w:rPr>
+        <w:t>Other case is the recent derailment on 28</w:t>
+      </w:r>
+      <w:r>
+        <w:rPr>
+          <w:noProof/>
+          <w:vertAlign w:val="superscript"/>
+        </w:rPr>
+        <w:t>th</w:t>
+      </w:r>
+      <w:r>
+        <w:rPr>
+          <w:noProof/>
+        </w:rPr>
+        <w:t xml:space="preserve"> May 2026 at LRT Ampang-Sri Petaling line while passing through a track switch near Chan Sow Lin station. </w:t>
+      </w:r>
+      <w:r>
+        <w:rPr>
+          <w:noProof/>
+        </w:rPr>
+        <w:t>These incidents</w:t>
+      </w:r>
+      <w:r>
+        <w:rPr>
+          <w:noProof/>
+        </w:rPr>
+        <w:t xml:space="preserve"> highlight that reliability is all about the predictability of the service as it is about its speed.</w:t>
+      </w:r>
+      <w:r>
+        <w:rPr>
+          <w:noProof/>
+        </w:rPr>
+        <w:t xml:space="preserve"> A summary of important reliability metrics and corresponding user perception factors is mapped in Table 2 below:</w:t>
+      </w:r>
+    </w:p>
+    <w:tbl>
+      <w:tblPr>
+        <w:tblStyle w:val="TableGrid"/>
+        <w:tblW w:w="0" w:type="auto"/>
+        <w:tblLook w:val="04A0" w:firstRow="1" w:lastRow="0" w:firstColumn="1" w:lastColumn="0" w:noHBand="0" w:noVBand="1"/>
+      </w:tblPr>
+      <w:tblGrid>
+        <w:gridCol w:w="1838"/>
+        <w:gridCol w:w="2827"/>
+        <w:gridCol w:w="2396"/>
+        <w:gridCol w:w="1955"/>
+      </w:tblGrid>
+      <w:tr>
+        <w:tc>
+          <w:tcPr>
+            <w:tcW w:w="1838" w:type="dxa"/>
+            <w:shd w:val="clear" w:color="auto" w:fill="C1E4F5" w:themeFill="accent1" w:themeFillTint="33"/>
+          </w:tcPr>
+          <w:p>
+            <w:pPr>
+              <w:jc w:val="left"/>
+              <w:rPr>
+                <w:b/>
+                <w:bCs/>
+                <w:lang w:val="en-US"/>
+              </w:rPr>
+            </w:pPr>
+            <w:r>
+              <w:rPr>
+                <w:b/>
+                <w:bCs/>
+                <w:lang w:val="en-US"/>
+              </w:rPr>
+              <w:t>Metric Category</w:t>
+            </w:r>
+          </w:p>
+        </w:tc>
+        <w:tc>
+          <w:tcPr>
+            <w:tcW w:w="2827" w:type="dxa"/>
+            <w:shd w:val="clear" w:color="auto" w:fill="C1E4F5" w:themeFill="accent1" w:themeFillTint="33"/>
+          </w:tcPr>
+          <w:p>
+            <w:pPr>
+              <w:jc w:val="left"/>
+              <w:rPr>
+                <w:b/>
+                <w:bCs/>
+                <w:lang w:val="en-US"/>
+              </w:rPr>
+            </w:pPr>
+            <w:r>
+              <w:rPr>
+                <w:b/>
+                <w:bCs/>
+                <w:lang w:val="en-US"/>
+              </w:rPr>
+              <w:t>Operational Indicator (Technical)</w:t>
+            </w:r>
+          </w:p>
+        </w:tc>
+        <w:tc>
+          <w:tcPr>
+            <w:tcW w:w="2396" w:type="dxa"/>
+            <w:shd w:val="clear" w:color="auto" w:fill="C1E4F5" w:themeFill="accent1" w:themeFillTint="33"/>
+          </w:tcPr>
+          <w:p>
+            <w:pPr>
+              <w:jc w:val="left"/>
+              <w:rPr>
+                <w:b/>
+                <w:bCs/>
+                <w:lang w:val="en-US"/>
+              </w:rPr>
+            </w:pPr>
+            <w:r>
+              <w:rPr>
+                <w:b/>
+                <w:bCs/>
+                <w:lang w:val="en-US"/>
+              </w:rPr>
+              <w:t>User Perception (Subjective)</w:t>
+            </w:r>
+          </w:p>
+        </w:tc>
+        <w:tc>
+          <w:tcPr>
+            <w:tcW w:w="1955" w:type="dxa"/>
+            <w:shd w:val="clear" w:color="auto" w:fill="C1E4F5" w:themeFill="accent1" w:themeFillTint="33"/>
+          </w:tcPr>
+          <w:p>
+            <w:pPr>
+              <w:jc w:val="left"/>
+              <w:rPr>
+                <w:b/>
+                <w:bCs/>
+                <w:lang w:val="en-US"/>
+              </w:rPr>
+            </w:pPr>
+            <w:r>
+              <w:rPr>
+                <w:b/>
+                <w:bCs/>
+                <w:lang w:val="en-US"/>
+              </w:rPr>
+              <w:t>Source</w:t>
+            </w:r>
+          </w:p>
+        </w:tc>
+      </w:tr>
+      <w:tr>
+        <w:tc>
+          <w:tcPr>
+            <w:tcW w:w="1838" w:type="dxa"/>
+            <w:shd w:val="clear" w:color="auto" w:fill="F2F2F2" w:themeFill="background1" w:themeFillShade="F2"/>
+          </w:tcPr>
+          <w:p>
+            <w:pPr>
+              <w:rPr>
+                <w:lang w:val="en-US"/>
+              </w:rPr>
+            </w:pPr>
+            <w:r>
+              <w:rPr>
+                <w:lang w:val="en-US"/>
+              </w:rPr>
+              <w:t>Temporal</w:t>
+            </w:r>
+          </w:p>
+        </w:tc>
+        <w:tc>
+          <w:tcPr>
+            <w:tcW w:w="2827" w:type="dxa"/>
+          </w:tcPr>
+          <w:p>
+            <w:pPr>
+              <w:jc w:val="left"/>
+              <w:rPr>
+                <w:lang w:val="en-US"/>
+              </w:rPr>
+            </w:pPr>
+            <w:r>
+              <w:rPr>
+                <w:lang w:val="en-US"/>
+              </w:rPr>
+              <w:t>Headway adherence, Travel time variability</w:t>
+            </w:r>
+          </w:p>
+        </w:tc>
+        <w:tc>
+          <w:tcPr>
+            <w:tcW w:w="2396" w:type="dxa"/>
+          </w:tcPr>
+          <w:p>
+            <w:pPr>
+              <w:jc w:val="left"/>
+              <w:rPr>
+                <w:lang w:val="en-US"/>
+              </w:rPr>
+            </w:pPr>
+            <w:r>
+              <w:rPr>
+                <w:lang w:val="en-US"/>
+              </w:rPr>
+              <w:t>Punctuality, Wait time anxiety</w:t>
+            </w:r>
+          </w:p>
+        </w:tc>
+        <w:tc>
+          <w:tcPr>
+            <w:tcW w:w="1955" w:type="dxa"/>
+          </w:tcPr>
+          <w:p>
+            <w:pPr>
+              <w:jc w:val="left"/>
+              <w:rPr>
+                <w:lang w:val="en-US"/>
+              </w:rPr>
+            </w:pPr>
+            <w:r>
+              <w:rPr>
+                <w:lang w:val="en-US"/>
+              </w:rPr>
+              <w:t>Mohamed et al. (2021)</w:t>
+            </w:r>
+          </w:p>
+        </w:tc>
+      </w:tr>
+      <w:tr>
+        <w:tc>
+          <w:tcPr>
+            <w:tcW w:w="1838" w:type="dxa"/>
+            <w:shd w:val="clear" w:color="auto" w:fill="F2F2F2" w:themeFill="background1" w:themeFillShade="F2"/>
+          </w:tcPr>
+          <w:p>
+            <w:pPr>
+              <w:rPr>
+                <w:lang w:val="en-US"/>
+              </w:rPr>
+            </w:pPr>
+            <w:r>
+              <w:rPr>
+                <w:lang w:val="en-US"/>
+              </w:rPr>
+              <w:lastRenderedPageBreak/>
+              <w:t>Informational</w:t>
+            </w:r>
+          </w:p>
+        </w:tc>
+        <w:tc>
+          <w:tcPr>
+            <w:tcW w:w="2827" w:type="dxa"/>
+          </w:tcPr>
+          <w:p>
+            <w:pPr>
+              <w:jc w:val="left"/>
+              <w:rPr>
+                <w:lang w:val="en-US"/>
+              </w:rPr>
+            </w:pPr>
+            <w:r>
+              <w:rPr>
+                <w:lang w:val="en-US"/>
+              </w:rPr>
+              <w:t>PIS accuracy, Real-time data latency</w:t>
+            </w:r>
+          </w:p>
+        </w:tc>
+        <w:tc>
+          <w:tcPr>
+            <w:tcW w:w="2396" w:type="dxa"/>
+          </w:tcPr>
+          <w:p>
+            <w:pPr>
+              <w:jc w:val="left"/>
+              <w:rPr>
+                <w:lang w:val="en-US"/>
+              </w:rPr>
+            </w:pPr>
+            <w:r>
+              <w:rPr>
+                <w:lang w:val="en-US"/>
+              </w:rPr>
+              <w:t>Certainty, Reduced stress</w:t>
+            </w:r>
+          </w:p>
+        </w:tc>
+        <w:tc>
+          <w:tcPr>
+            <w:tcW w:w="1955" w:type="dxa"/>
+          </w:tcPr>
+          <w:p>
+            <w:pPr>
+              <w:jc w:val="left"/>
+              <w:rPr>
+                <w:lang w:val="en-US"/>
+              </w:rPr>
+            </w:pPr>
+            <w:r>
+              <w:rPr>
+                <w:lang w:val="en-US"/>
+              </w:rPr>
+              <w:t>Rezapour &amp; Ferraro (2021)</w:t>
+            </w:r>
+          </w:p>
+        </w:tc>
+      </w:tr>
+      <w:tr>
+        <w:tc>
+          <w:tcPr>
+            <w:tcW w:w="1838" w:type="dxa"/>
+            <w:shd w:val="clear" w:color="auto" w:fill="F2F2F2" w:themeFill="background1" w:themeFillShade="F2"/>
+          </w:tcPr>
+          <w:p>
+            <w:pPr>
+              <w:rPr>
+                <w:lang w:val="en-US"/>
+              </w:rPr>
+            </w:pPr>
+            <w:r>
+              <w:rPr>
+                <w:lang w:val="en-US"/>
+              </w:rPr>
+              <w:t>Service Quality</w:t>
+            </w:r>
+          </w:p>
+        </w:tc>
+        <w:tc>
+          <w:tcPr>
+            <w:tcW w:w="2827" w:type="dxa"/>
+          </w:tcPr>
+          <w:p>
+            <w:pPr>
+              <w:jc w:val="left"/>
+              <w:rPr>
+                <w:lang w:val="en-US"/>
+              </w:rPr>
+            </w:pPr>
+            <w:r>
+              <w:rPr>
+                <w:lang w:val="en-US"/>
+              </w:rPr>
+              <w:t>Vehicle cleanliness, Amenity availability</w:t>
+            </w:r>
+          </w:p>
+        </w:tc>
+        <w:tc>
+          <w:tcPr>
+            <w:tcW w:w="2396" w:type="dxa"/>
+          </w:tcPr>
+          <w:p>
+            <w:pPr>
+              <w:jc w:val="left"/>
+              <w:rPr>
+                <w:lang w:val="en-US"/>
+              </w:rPr>
+            </w:pPr>
+            <w:r>
+              <w:rPr>
+                <w:lang w:val="en-US"/>
+              </w:rPr>
+              <w:t>Comfort, Perceived safety</w:t>
+            </w:r>
+          </w:p>
+        </w:tc>
+        <w:tc>
+          <w:tcPr>
+            <w:tcW w:w="1955" w:type="dxa"/>
+          </w:tcPr>
+          <w:p>
+            <w:pPr>
+              <w:jc w:val="left"/>
+              <w:rPr>
+                <w:lang w:val="en-US"/>
+              </w:rPr>
+            </w:pPr>
+            <w:r>
+              <w:rPr>
+                <w:lang w:val="en-US"/>
+              </w:rPr>
+              <w:t>Ibrahim et al. (2022)</w:t>
+            </w:r>
+          </w:p>
+        </w:tc>
+      </w:tr>
+      <w:tr>
+        <w:tc>
+          <w:tcPr>
+            <w:tcW w:w="1838" w:type="dxa"/>
+            <w:shd w:val="clear" w:color="auto" w:fill="F2F2F2" w:themeFill="background1" w:themeFillShade="F2"/>
+          </w:tcPr>
+          <w:p>
+            <w:pPr>
+              <w:rPr>
+                <w:lang w:val="en-US"/>
+              </w:rPr>
+            </w:pPr>
+            <w:r>
+              <w:rPr>
+                <w:lang w:val="en-US"/>
+              </w:rPr>
+              <w:t>Operational</w:t>
+            </w:r>
+          </w:p>
+        </w:tc>
+        <w:tc>
+          <w:tcPr>
+            <w:tcW w:w="2827" w:type="dxa"/>
+          </w:tcPr>
+          <w:p>
+            <w:pPr>
+              <w:jc w:val="left"/>
+              <w:rPr>
+                <w:lang w:val="en-US"/>
+              </w:rPr>
+            </w:pPr>
+            <w:r>
+              <w:rPr>
+                <w:lang w:val="en-US"/>
+              </w:rPr>
+              <w:t>Frequency, Route coverage</w:t>
+            </w:r>
+          </w:p>
+        </w:tc>
+        <w:tc>
+          <w:tcPr>
+            <w:tcW w:w="2396" w:type="dxa"/>
+          </w:tcPr>
+          <w:p>
+            <w:pPr>
+              <w:jc w:val="left"/>
+              <w:rPr>
+                <w:lang w:val="en-US"/>
+              </w:rPr>
+            </w:pPr>
+            <w:r>
+              <w:rPr>
+                <w:lang w:val="en-US"/>
+              </w:rPr>
+              <w:t>Accessibility, Convenience</w:t>
+            </w:r>
+          </w:p>
+        </w:tc>
+        <w:tc>
+          <w:tcPr>
+            <w:tcW w:w="1955" w:type="dxa"/>
+          </w:tcPr>
+          <w:p>
+            <w:pPr>
+              <w:jc w:val="left"/>
+              <w:rPr>
+                <w:lang w:val="en-US"/>
+              </w:rPr>
+            </w:pPr>
+            <w:proofErr w:type="spellStart"/>
+            <w:r>
+              <w:rPr>
+                <w:lang w:val="en-US"/>
+              </w:rPr>
+              <w:t>Sogbe</w:t>
+            </w:r>
+            <w:proofErr w:type="spellEnd"/>
+            <w:r>
+              <w:rPr>
+                <w:lang w:val="en-US"/>
+              </w:rPr>
+              <w:t xml:space="preserve"> et al. (2024)</w:t>
+            </w:r>
+          </w:p>
+        </w:tc>
+      </w:tr>
+    </w:tbl>
+    <w:p>
+      <w:pPr>
+        <w:pStyle w:val="Caption"/>
+        <w:spacing w:before="240"/>
+        <w:jc w:val="center"/>
+        <w:rPr>
+          <w:sz w:val="24"/>
+          <w:szCs w:val="24"/>
+          <w:lang w:val="en-US"/>
+        </w:rPr>
+      </w:pPr>
+      <w:bookmarkStart w:id="10" w:name="_Toc230901674"/>
+      <w:r>
+        <w:rPr>
+          <w:sz w:val="24"/>
+          <w:szCs w:val="24"/>
+        </w:rPr>
+        <w:t xml:space="preserve">Table </w:t>
+      </w:r>
+      <w:r>
+        <w:rPr>
+          <w:sz w:val="24"/>
+          <w:szCs w:val="24"/>
+        </w:rPr>
+        <w:fldChar w:fldCharType="begin"/>
+      </w:r>
+      <w:r>
+        <w:rPr>
+          <w:sz w:val="24"/>
+          <w:szCs w:val="24"/>
+        </w:rPr>
+        <w:instrText xml:space="preserve"> SEQ Table \* ARABIC </w:instrText>
+      </w:r>
+      <w:r>
+        <w:rPr>
+          <w:sz w:val="24"/>
+          <w:szCs w:val="24"/>
+        </w:rPr>
+        <w:fldChar w:fldCharType="separate"/>
+      </w:r>
+      <w:r>
+        <w:rPr>
+          <w:noProof/>
+          <w:sz w:val="24"/>
+          <w:szCs w:val="24"/>
+        </w:rPr>
+        <w:t>2</w:t>
+      </w:r>
+      <w:r>
+        <w:rPr>
+          <w:sz w:val="24"/>
+          <w:szCs w:val="24"/>
+        </w:rPr>
+        <w:fldChar w:fldCharType="end"/>
+      </w:r>
+      <w:r>
+        <w:rPr>
+          <w:sz w:val="24"/>
+          <w:szCs w:val="24"/>
+        </w:rPr>
+        <w:t xml:space="preserve">: Comparison of Technical Reliability Metrics and </w:t>
+      </w:r>
+      <w:r>
+        <w:rPr>
+          <w:sz w:val="24"/>
+          <w:szCs w:val="24"/>
+        </w:rPr>
+        <w:t xml:space="preserve">Subjective </w:t>
+      </w:r>
+      <w:r>
+        <w:rPr>
+          <w:sz w:val="24"/>
+          <w:szCs w:val="24"/>
+        </w:rPr>
+        <w:t>User Perception Factors</w:t>
+      </w:r>
+      <w:r>
+        <w:rPr>
+          <w:sz w:val="24"/>
+          <w:szCs w:val="24"/>
+        </w:rPr>
+        <w:t xml:space="preserve"> based on </w:t>
+      </w:r>
+      <w:r>
+        <w:rPr>
+          <w:sz w:val="24"/>
+          <w:szCs w:val="24"/>
+        </w:rPr>
+        <w:t>M</w:t>
+      </w:r>
+      <w:r>
+        <w:rPr>
+          <w:sz w:val="24"/>
+          <w:szCs w:val="24"/>
+        </w:rPr>
+        <w:t xml:space="preserve">ultiple </w:t>
+      </w:r>
+      <w:r>
+        <w:rPr>
+          <w:sz w:val="24"/>
+          <w:szCs w:val="24"/>
+        </w:rPr>
+        <w:t>S</w:t>
+      </w:r>
+      <w:r>
+        <w:rPr>
+          <w:sz w:val="24"/>
+          <w:szCs w:val="24"/>
+        </w:rPr>
+        <w:t>ources</w:t>
+      </w:r>
+      <w:r>
+        <w:rPr>
+          <w:sz w:val="24"/>
+          <w:szCs w:val="24"/>
+        </w:rPr>
+        <w:t>.</w:t>
+      </w:r>
+      <w:bookmarkEnd w:id="10"/>
     </w:p>
     <w:p>
       <w:pPr>
@@ -5496,7 +6530,7 @@
           <w:u w:val="single"/>
         </w:rPr>
       </w:pPr>
-      <w:bookmarkStart w:id="9" w:name="_Toc230647580"/>
+      <w:bookmarkStart w:id="11" w:name="_Toc230901608"/>
       <w:r>
         <w:rPr>
           <w:b/>
@@ -5517,7 +6551,279 @@
         </w:rPr>
         <w:t>Relationship between Ridership and Service Unreliability</w:t>
       </w:r>
-      <w:bookmarkEnd w:id="9"/>
+      <w:bookmarkEnd w:id="11"/>
+    </w:p>
+    <w:p>
+      <w:pPr>
+        <w:ind w:firstLine="720"/>
+        <w:rPr>
+          <w:noProof/>
+          <w:lang w:val="en-US"/>
+        </w:rPr>
+      </w:pPr>
+      <w:r>
+        <w:t>The erosion of ridership is a direct consequence of chronic service unreliability which creates a negative feedback loop of transit decline. Amir et al. (2025) suggest that the absence of accurate predictions and frequent uncertainties</w:t>
+      </w:r>
+      <w:r>
+        <w:t xml:space="preserve"> such as weather and traffic are the main reason for citizens to prioritize private vehicles over public transit.</w:t>
+      </w:r>
+      <w:r>
+        <w:t xml:space="preserve"> This statement is then supported by </w:t>
+      </w:r>
+      <w:r>
+        <w:rPr>
+          <w:noProof/>
+          <w:lang w:val="en-US"/>
+        </w:rPr>
+        <w:t xml:space="preserve">Mee et al. (2022), who found that prolonged travel times and untimely delays are the foremost factors in passenger dissatisfaction in Kuala Lumpur and Manila. When a transit system becomes unpredictable, passengers will need to allocate more “buffer time” into their schedules to account for potential delays. For most citizens, this </w:t>
+      </w:r>
+      <w:r>
+        <w:rPr>
+          <w:noProof/>
+          <w:lang w:val="en-US"/>
+        </w:rPr>
+        <w:t>buffer time allocation</w:t>
+      </w:r>
+      <w:r>
+        <w:rPr>
+          <w:noProof/>
+          <w:lang w:val="en-US"/>
+        </w:rPr>
+        <w:t xml:space="preserve"> outweights the financial benefits of public transport</w:t>
+      </w:r>
+      <w:r>
+        <w:rPr>
+          <w:noProof/>
+          <w:lang w:val="en-US"/>
+        </w:rPr>
+        <w:t xml:space="preserve"> and regardless of the increase of fuel price. Thus, it leads to a steady decline in daily ridership numbers.</w:t>
+      </w:r>
+    </w:p>
+    <w:p>
+      <w:pPr>
+        <w:ind w:firstLine="720"/>
+        <w:rPr>
+          <w:noProof/>
+          <w:lang w:val="en-US"/>
+        </w:rPr>
+      </w:pPr>
+      <w:r>
+        <w:rPr>
+          <w:noProof/>
+          <w:lang w:val="en-US"/>
+        </w:rPr>
+        <w:t xml:space="preserve">Furthermore, </w:t>
+      </w:r>
+      <w:r>
+        <w:rPr>
+          <w:noProof/>
+          <w:lang w:val="en-US"/>
+        </w:rPr>
+        <w:t xml:space="preserve">the relationship between unreliability and demand is often influenced by extreme events and data anomalies. Zhao &amp; Lan (2025) </w:t>
+      </w:r>
+      <w:r>
+        <w:rPr>
+          <w:noProof/>
+          <w:lang w:val="en-US"/>
+        </w:rPr>
+        <w:t>mentioned that training predictive models on extreme outlier data can introduce significant bias</w:t>
+      </w:r>
+      <w:r>
+        <w:rPr>
+          <w:noProof/>
+          <w:lang w:val="en-US"/>
+        </w:rPr>
+        <w:t xml:space="preserve">. </w:t>
+      </w:r>
+      <w:r>
+        <w:rPr>
+          <w:noProof/>
+          <w:lang w:val="en-US"/>
+        </w:rPr>
+        <w:t>For instance, the MCO period in Malaysia because it</w:t>
+      </w:r>
+      <w:r>
+        <w:rPr>
+          <w:noProof/>
+          <w:lang w:val="en-US"/>
+        </w:rPr>
+        <w:t xml:space="preserve"> do not reflect normal urban mobility behavior</w:t>
+      </w:r>
+      <w:r>
+        <w:rPr>
+          <w:noProof/>
+          <w:lang w:val="en-US"/>
+        </w:rPr>
+        <w:t>. On the other hand, the perceived unreliability of bus services in cities like Kota Samarahan has kept ridership levels low, despite high car ownership costs (Ubaidillah, et al., 2022). The analysis suggests that the ridership will remain stagnant until public transit system are as reliable as passenger perceived</w:t>
+      </w:r>
+      <w:r>
+        <w:rPr>
+          <w:noProof/>
+          <w:lang w:val="en-US"/>
+        </w:rPr>
+        <w:t xml:space="preserve"> it to be</w:t>
+      </w:r>
+      <w:r>
+        <w:rPr>
+          <w:noProof/>
+          <w:lang w:val="en-US"/>
+        </w:rPr>
+        <w:t>. In terms of public rail transit, it is mainly caused by the delays between each intervals, weather, accessibility, and operational uncertainties.</w:t>
+      </w:r>
+      <w:r>
+        <w:rPr>
+          <w:noProof/>
+          <w:lang w:val="en-US"/>
+        </w:rPr>
+        <w:t xml:space="preserve"> This relationship can be visualized as a cycle of transit dependency, where unreliability fuels private vehicle grow</w:t>
+      </w:r>
+      <w:r>
+        <w:rPr>
+          <w:noProof/>
+          <w:lang w:val="en-US"/>
+        </w:rPr>
+        <w:t>th, which then</w:t>
+      </w:r>
+      <w:r>
+        <w:rPr>
+          <w:noProof/>
+          <w:lang w:val="en-US"/>
+        </w:rPr>
+        <w:t xml:space="preserve"> increases the traffic congestion that makes transit even less reliable.</w:t>
+      </w:r>
+    </w:p>
+    <w:p>
+      <w:pPr>
+        <w:spacing w:after="0"/>
+        <w:jc w:val="center"/>
+      </w:pPr>
+      <w:r>
+        <w:rPr>
+          <w:noProof/>
+          <w:lang w:val="en-US"/>
+        </w:rPr>
+        <w:lastRenderedPageBreak/>
+        <w:drawing>
+          <wp:inline distT="0" distB="0" distL="0" distR="0" wp14:anchorId="125BB2D3" wp14:editId="1A1AED34">
+            <wp:extent cx="5722620" cy="4290060"/>
+            <wp:effectExtent l="19050" t="19050" r="11430" b="15240"/>
+            <wp:docPr id="1339339132" name="Picture 1"/>
+            <wp:cNvGraphicFramePr>
+              <a:graphicFrameLocks xmlns:a="http://schemas.openxmlformats.org/drawingml/2006/main" noChangeAspect="1"/>
+            </wp:cNvGraphicFramePr>
+            <a:graphic xmlns:a="http://schemas.openxmlformats.org/drawingml/2006/main">
+              <a:graphicData uri="http://schemas.openxmlformats.org/drawingml/2006/picture">
+                <pic:pic xmlns:pic="http://schemas.openxmlformats.org/drawingml/2006/picture">
+                  <pic:nvPicPr>
+                    <pic:cNvPr id="0" name="Picture 1"/>
+                    <pic:cNvPicPr>
+                      <a:picLocks noChangeAspect="1" noChangeArrowheads="1"/>
+                    </pic:cNvPicPr>
+                  </pic:nvPicPr>
+                  <pic:blipFill>
+                    <a:blip r:embed="rId8" cstate="print">
+                      <a:extLst>
+                        <a:ext uri="{28A0092B-C50C-407E-A947-70E740481C1C}">
+                          <a14:useLocalDpi xmlns:a14="http://schemas.microsoft.com/office/drawing/2010/main" val="0"/>
+                        </a:ext>
+                      </a:extLst>
+                    </a:blip>
+                    <a:srcRect/>
+                    <a:stretch>
+                      <a:fillRect/>
+                    </a:stretch>
+                  </pic:blipFill>
+                  <pic:spPr bwMode="auto">
+                    <a:xfrm>
+                      <a:off x="0" y="0"/>
+                      <a:ext cx="5722620" cy="4290060"/>
+                    </a:xfrm>
+                    <a:prstGeom prst="rect">
+                      <a:avLst/>
+                    </a:prstGeom>
+                    <a:noFill/>
+                    <a:ln>
+                      <a:solidFill>
+                        <a:schemeClr val="tx1"/>
+                      </a:solidFill>
+                    </a:ln>
+                  </pic:spPr>
+                </pic:pic>
+              </a:graphicData>
+            </a:graphic>
+          </wp:inline>
+        </w:drawing>
+      </w:r>
+    </w:p>
+    <w:p>
+      <w:pPr>
+        <w:pStyle w:val="Caption"/>
+        <w:jc w:val="center"/>
+        <w:rPr>
+          <w:color w:val="auto"/>
+          <w:sz w:val="24"/>
+          <w:szCs w:val="24"/>
+        </w:rPr>
+      </w:pPr>
+      <w:bookmarkStart w:id="12" w:name="_Toc230901632"/>
+      <w:r>
+        <w:rPr>
+          <w:color w:val="auto"/>
+          <w:sz w:val="24"/>
+          <w:szCs w:val="24"/>
+        </w:rPr>
+        <w:t xml:space="preserve">Figure </w:t>
+      </w:r>
+      <w:r>
+        <w:rPr>
+          <w:color w:val="auto"/>
+          <w:sz w:val="24"/>
+          <w:szCs w:val="24"/>
+        </w:rPr>
+        <w:fldChar w:fldCharType="begin"/>
+      </w:r>
+      <w:r>
+        <w:rPr>
+          <w:color w:val="auto"/>
+          <w:sz w:val="24"/>
+          <w:szCs w:val="24"/>
+        </w:rPr>
+        <w:instrText xml:space="preserve"> SEQ Figure \* ARABIC </w:instrText>
+      </w:r>
+      <w:r>
+        <w:rPr>
+          <w:color w:val="auto"/>
+          <w:sz w:val="24"/>
+          <w:szCs w:val="24"/>
+        </w:rPr>
+        <w:fldChar w:fldCharType="separate"/>
+      </w:r>
+      <w:r>
+        <w:rPr>
+          <w:noProof/>
+          <w:color w:val="auto"/>
+          <w:sz w:val="24"/>
+          <w:szCs w:val="24"/>
+        </w:rPr>
+        <w:t>1</w:t>
+      </w:r>
+      <w:r>
+        <w:rPr>
+          <w:color w:val="auto"/>
+          <w:sz w:val="24"/>
+          <w:szCs w:val="24"/>
+        </w:rPr>
+        <w:fldChar w:fldCharType="end"/>
+      </w:r>
+      <w:r>
+        <w:rPr>
+          <w:color w:val="auto"/>
+          <w:sz w:val="24"/>
+          <w:szCs w:val="24"/>
+        </w:rPr>
+        <w:t>: The Vicious Cycle of Public Bus and Rail Transit Unreliability and Ridership Uncertainty.</w:t>
+      </w:r>
+      <w:bookmarkEnd w:id="12"/>
     </w:p>
     <w:p>
       <w:pPr>
@@ -5534,7 +6840,7 @@
           <w:u w:val="single"/>
         </w:rPr>
       </w:pPr>
-      <w:bookmarkStart w:id="10" w:name="_Toc230647581"/>
+      <w:bookmarkStart w:id="13" w:name="_Toc230901609"/>
       <w:r>
         <w:rPr>
           <w:b/>
@@ -5545,7 +6851,110 @@
         </w:rPr>
         <w:t>The Landscape of Public Transit in Malaysia</w:t>
       </w:r>
-      <w:bookmarkEnd w:id="10"/>
+      <w:bookmarkEnd w:id="13"/>
+    </w:p>
+    <w:p>
+      <w:pPr>
+        <w:ind w:firstLine="720"/>
+        <w:rPr>
+          <w:noProof/>
+          <w:lang w:val="en-US"/>
+        </w:rPr>
+      </w:pPr>
+      <w:r>
+        <w:t xml:space="preserve">The Malaysian public transit landscape is currently at a crossroads, characterized by massive infrastructure investments contrasted with persistently low </w:t>
+      </w:r>
+      <w:r>
+        <w:rPr>
+          <w:lang w:val="en-US"/>
+        </w:rPr>
+        <w:t>modal shares. This can be supported with governmental projects like MRT Putrajaya line, MRT Shah Alam line, and the upcoming MRT3</w:t>
+      </w:r>
+      <w:r>
+        <w:rPr>
+          <w:rFonts w:hint="eastAsia"/>
+          <w:lang w:val="en-US"/>
+        </w:rPr>
+        <w:t xml:space="preserve"> </w:t>
+      </w:r>
+      <w:r>
+        <w:rPr>
+          <w:lang w:val="en-US"/>
+        </w:rPr>
+        <w:t>Circle line.</w:t>
+      </w:r>
+      <w:r>
+        <w:rPr>
+          <w:lang w:val="en-US"/>
+        </w:rPr>
+        <w:t xml:space="preserve"> </w:t>
+      </w:r>
+      <w:r>
+        <w:rPr>
+          <w:noProof/>
+          <w:lang w:val="en-US"/>
+        </w:rPr>
+        <w:t xml:space="preserve">Ubaidillah et al. (2022) </w:t>
+      </w:r>
+      <w:r>
+        <w:rPr>
+          <w:noProof/>
+          <w:lang w:val="en-US"/>
+        </w:rPr>
+        <w:t>point out that the national public transport usage remains at appoximately 20%, well below the 40% target set by the National Transport Policy (NTP) 2019 – 2030. In regions like Sarawak, car ownership remains exceptionaly high (292 cars per 1,000 inhabitants). This is driven by the perceived inadequacy of bus service quality in terns of tangibility and responsiveness. It highlights that infrastructure alone is insufficient to drive demand whereas service reliability and quality must be localized and consistent.</w:t>
+      </w:r>
+    </w:p>
+    <w:p>
+      <w:pPr>
+        <w:ind w:firstLine="720"/>
+        <w:rPr>
+          <w:lang w:val="en-US"/>
+        </w:rPr>
+      </w:pPr>
+      <w:r>
+        <w:rPr>
+          <w:noProof/>
+          <w:lang w:val="en-US"/>
+        </w:rPr>
+        <w:t xml:space="preserve">Recent advancements in data-driven transit management offer a potential pathway to improving this landscape. Hassan et al. (2025) stated the success of the myBas intiative in Johor Bahru and Penang by utilizing GTFS data to optimize netwrok efficiency. It has recorded over </w:t>
+      </w:r>
+      <w:r>
+        <w:rPr>
+          <w:noProof/>
+          <w:lang w:val="en-US"/>
+        </w:rPr>
+        <w:lastRenderedPageBreak/>
+        <w:t>14.5 million passenger trips in 2024. Despite these localized successes, the broader Malaysian context still struggles with the “first-mile last-mile”</w:t>
+      </w:r>
+      <w:r>
+        <w:rPr>
+          <w:rStyle w:val="FootnoteReference"/>
+          <w:noProof/>
+          <w:lang w:val="en-US"/>
+        </w:rPr>
+        <w:footnoteReference w:id="1"/>
+      </w:r>
+      <w:r>
+        <w:rPr>
+          <w:noProof/>
+          <w:lang w:val="en-US"/>
+        </w:rPr>
+        <w:t xml:space="preserve"> (FMLM) connectivity gap. The FMLM issue has been identified by Sogbe et al. (2025) as the primary barrier in developing Asian cities.</w:t>
+      </w:r>
+      <w:r>
+        <w:rPr>
+          <w:noProof/>
+          <w:lang w:val="en-US"/>
+        </w:rPr>
+        <w:t xml:space="preserve"> As Malaysia moves toward 2030, </w:t>
+      </w:r>
+      <w:r>
+        <w:rPr>
+          <w:noProof/>
+          <w:lang w:val="en-US"/>
+        </w:rPr>
+        <w:t>the focus is shifting from purely physical expansion to the integration of DL and big data analytics. Both approaches are to mitigate unreliability as evidenced by the growing body of research into spatio-temporal ridership forecasting (Chen et al., 2022; Amir et al., 2025).</w:t>
+      </w:r>
     </w:p>
     <w:p>
       <w:pPr>
@@ -5562,7 +6971,7 @@
           <w:u w:val="single"/>
         </w:rPr>
       </w:pPr>
-      <w:bookmarkStart w:id="11" w:name="_Toc230647582"/>
+      <w:bookmarkStart w:id="14" w:name="_Toc230901610"/>
       <w:r>
         <w:rPr>
           <w:b/>
@@ -5573,8 +6982,9 @@
         </w:rPr>
         <w:t>Transit Data Ecosystems and Anomalies</w:t>
       </w:r>
-      <w:bookmarkEnd w:id="11"/>
+      <w:bookmarkEnd w:id="14"/>
     </w:p>
+    <w:p/>
     <w:p>
       <w:pPr>
         <w:pStyle w:val="Heading3"/>
@@ -5590,7 +7000,7 @@
           <w:u w:val="single"/>
         </w:rPr>
       </w:pPr>
-      <w:bookmarkStart w:id="12" w:name="_Toc230647583"/>
+      <w:bookmarkStart w:id="15" w:name="_Toc230901611"/>
       <w:r>
         <w:rPr>
           <w:b/>
@@ -5601,8 +7011,9 @@
         </w:rPr>
         <w:t>Sources of Transit Data</w:t>
       </w:r>
-      <w:bookmarkEnd w:id="12"/>
+      <w:bookmarkEnd w:id="15"/>
     </w:p>
+    <w:p/>
     <w:p>
       <w:pPr>
         <w:pStyle w:val="Heading3"/>
@@ -5618,7 +7029,7 @@
           <w:u w:val="single"/>
         </w:rPr>
       </w:pPr>
-      <w:bookmarkStart w:id="13" w:name="_Toc230647584"/>
+      <w:bookmarkStart w:id="16" w:name="_Toc230901612"/>
       <w:r>
         <w:rPr>
           <w:b/>
@@ -5649,8 +7060,9 @@
         </w:rPr>
         <w:t xml:space="preserve"> and Preprocessing Challenges</w:t>
       </w:r>
-      <w:bookmarkEnd w:id="13"/>
+      <w:bookmarkEnd w:id="16"/>
     </w:p>
+    <w:p/>
     <w:p>
       <w:pPr>
         <w:pStyle w:val="Heading3"/>
@@ -5666,7 +7078,7 @@
           <w:u w:val="single"/>
         </w:rPr>
       </w:pPr>
-      <w:bookmarkStart w:id="14" w:name="_Toc230647585"/>
+      <w:bookmarkStart w:id="17" w:name="_Toc230901613"/>
       <w:r>
         <w:rPr>
           <w:b/>
@@ -5677,8 +7089,9 @@
         </w:rPr>
         <w:t>Extreme Anomalies in Spatiotemporal Data</w:t>
       </w:r>
-      <w:bookmarkEnd w:id="14"/>
+      <w:bookmarkEnd w:id="17"/>
     </w:p>
+    <w:p/>
     <w:p>
       <w:pPr>
         <w:pStyle w:val="Heading2"/>
@@ -5694,7 +7107,7 @@
           <w:u w:val="single"/>
         </w:rPr>
       </w:pPr>
-      <w:bookmarkStart w:id="15" w:name="_Toc230647586"/>
+      <w:bookmarkStart w:id="18" w:name="_Toc230901614"/>
       <w:r>
         <w:rPr>
           <w:b/>
@@ -5705,8 +7118,9 @@
         </w:rPr>
         <w:t>Evolution from Traditional to DL Models</w:t>
       </w:r>
-      <w:bookmarkEnd w:id="15"/>
+      <w:bookmarkEnd w:id="18"/>
     </w:p>
+    <w:p/>
     <w:p>
       <w:pPr>
         <w:pStyle w:val="Heading3"/>
@@ -5722,7 +7136,7 @@
           <w:u w:val="single"/>
         </w:rPr>
       </w:pPr>
-      <w:bookmarkStart w:id="16" w:name="_Toc230647587"/>
+      <w:bookmarkStart w:id="19" w:name="_Toc230901615"/>
       <w:r>
         <w:rPr>
           <w:b/>
@@ -5743,8 +7157,9 @@
         </w:rPr>
         <w:t xml:space="preserve"> Architectures</w:t>
       </w:r>
-      <w:bookmarkEnd w:id="16"/>
+      <w:bookmarkEnd w:id="19"/>
     </w:p>
+    <w:p/>
     <w:p>
       <w:pPr>
         <w:pStyle w:val="Heading3"/>
@@ -5760,7 +7175,7 @@
           <w:u w:val="single"/>
         </w:rPr>
       </w:pPr>
-      <w:bookmarkStart w:id="17" w:name="_Toc230647588"/>
+      <w:bookmarkStart w:id="20" w:name="_Toc230901616"/>
       <w:r>
         <w:rPr>
           <w:b/>
@@ -5771,8 +7186,9 @@
         </w:rPr>
         <w:t>Deep Learning Approaches in Spatiotemporal Transit Data</w:t>
       </w:r>
-      <w:bookmarkEnd w:id="17"/>
+      <w:bookmarkEnd w:id="20"/>
     </w:p>
+    <w:p/>
     <w:p>
       <w:pPr>
         <w:pStyle w:val="Heading3"/>
@@ -5788,7 +7204,7 @@
           <w:u w:val="single"/>
         </w:rPr>
       </w:pPr>
-      <w:bookmarkStart w:id="18" w:name="_Toc230647589"/>
+      <w:bookmarkStart w:id="21" w:name="_Toc230901617"/>
       <w:r>
         <w:rPr>
           <w:b/>
@@ -5819,8 +7235,9 @@
         </w:rPr>
         <w:t>and Evaluation Metrics</w:t>
       </w:r>
-      <w:bookmarkEnd w:id="18"/>
+      <w:bookmarkEnd w:id="21"/>
     </w:p>
+    <w:p/>
     <w:p>
       <w:pPr>
         <w:pStyle w:val="Heading2"/>
@@ -5836,7 +7253,7 @@
           <w:u w:val="single"/>
         </w:rPr>
       </w:pPr>
-      <w:bookmarkStart w:id="19" w:name="_Toc230647590"/>
+      <w:bookmarkStart w:id="22" w:name="_Toc230901618"/>
       <w:r>
         <w:rPr>
           <w:b/>
@@ -5845,6 +7262,7 @@
           <w:szCs w:val="24"/>
           <w:u w:val="single"/>
         </w:rPr>
+        <w:lastRenderedPageBreak/>
         <w:t>AI</w:t>
       </w:r>
       <w:r>
@@ -5877,8 +7295,9 @@
         </w:rPr>
         <w:t>and Sustainability</w:t>
       </w:r>
-      <w:bookmarkEnd w:id="19"/>
+      <w:bookmarkEnd w:id="22"/>
     </w:p>
+    <w:p/>
     <w:p>
       <w:pPr>
         <w:pStyle w:val="Heading3"/>
@@ -5894,7 +7313,7 @@
           <w:u w:val="single"/>
         </w:rPr>
       </w:pPr>
-      <w:bookmarkStart w:id="20" w:name="_Toc230647591"/>
+      <w:bookmarkStart w:id="23" w:name="_Toc230901619"/>
       <w:r>
         <w:rPr>
           <w:b/>
@@ -5905,8 +7324,9 @@
         </w:rPr>
         <w:t>Proactive Scheduling and Resource Allocation</w:t>
       </w:r>
-      <w:bookmarkEnd w:id="20"/>
+      <w:bookmarkEnd w:id="23"/>
     </w:p>
+    <w:p/>
     <w:p>
       <w:pPr>
         <w:pStyle w:val="Heading3"/>
@@ -5922,7 +7342,7 @@
           <w:u w:val="single"/>
         </w:rPr>
       </w:pPr>
-      <w:bookmarkStart w:id="21" w:name="_Toc230647592"/>
+      <w:bookmarkStart w:id="24" w:name="_Toc230901620"/>
       <w:r>
         <w:rPr>
           <w:b/>
@@ -5943,8 +7363,9 @@
         </w:rPr>
         <w:t xml:space="preserve"> of AI in Transit Management</w:t>
       </w:r>
-      <w:bookmarkEnd w:id="21"/>
+      <w:bookmarkEnd w:id="24"/>
     </w:p>
+    <w:p/>
     <w:p>
       <w:pPr>
         <w:pStyle w:val="Heading3"/>
@@ -5960,7 +7381,7 @@
           <w:u w:val="single"/>
         </w:rPr>
       </w:pPr>
-      <w:bookmarkStart w:id="22" w:name="_Toc230647593"/>
+      <w:bookmarkStart w:id="25" w:name="_Toc230901621"/>
       <w:r>
         <w:rPr>
           <w:b/>
@@ -5981,8 +7402,9 @@
         </w:rPr>
         <w:t xml:space="preserve"> and Environmental Impact</w:t>
       </w:r>
-      <w:bookmarkEnd w:id="22"/>
+      <w:bookmarkEnd w:id="25"/>
     </w:p>
+    <w:p/>
     <w:p>
       <w:pPr>
         <w:pStyle w:val="Heading2"/>
@@ -5998,7 +7420,7 @@
           <w:u w:val="single"/>
         </w:rPr>
       </w:pPr>
-      <w:bookmarkStart w:id="23" w:name="_Toc230647594"/>
+      <w:bookmarkStart w:id="26" w:name="_Toc230901622"/>
       <w:r>
         <w:rPr>
           <w:b/>
@@ -6009,8 +7431,9 @@
         </w:rPr>
         <w:t>Research Gap</w:t>
       </w:r>
-      <w:bookmarkEnd w:id="23"/>
+      <w:bookmarkEnd w:id="26"/>
     </w:p>
+    <w:p/>
     <w:p>
       <w:pPr>
         <w:pStyle w:val="Heading1"/>
@@ -6027,7 +7450,7 @@
           <w:u w:val="single"/>
         </w:rPr>
       </w:pPr>
-      <w:bookmarkStart w:id="24" w:name="_Toc230647595"/>
+      <w:bookmarkStart w:id="27" w:name="_Toc230901623"/>
       <w:r>
         <w:rPr>
           <w:b/>
@@ -6038,7 +7461,7 @@
         </w:rPr>
         <w:t>Methodology</w:t>
       </w:r>
-      <w:bookmarkEnd w:id="24"/>
+      <w:bookmarkEnd w:id="27"/>
     </w:p>
     <w:p>
       <w:pPr>
@@ -6055,7 +7478,7 @@
           <w:u w:val="single"/>
         </w:rPr>
       </w:pPr>
-      <w:bookmarkStart w:id="25" w:name="_Toc230647596"/>
+      <w:bookmarkStart w:id="28" w:name="_Toc230901624"/>
       <w:r>
         <w:rPr>
           <w:b/>
@@ -6066,7 +7489,7 @@
         </w:rPr>
         <w:t>Data Collection</w:t>
       </w:r>
-      <w:bookmarkEnd w:id="25"/>
+      <w:bookmarkEnd w:id="28"/>
     </w:p>
     <w:p>
       <w:pPr>
@@ -6083,7 +7506,7 @@
           <w:u w:val="single"/>
         </w:rPr>
       </w:pPr>
-      <w:bookmarkStart w:id="26" w:name="_Toc230647597"/>
+      <w:bookmarkStart w:id="29" w:name="_Toc230901625"/>
       <w:r>
         <w:rPr>
           <w:b/>
@@ -6094,7 +7517,7 @@
         </w:rPr>
         <w:t>Data Preprocessing</w:t>
       </w:r>
-      <w:bookmarkEnd w:id="26"/>
+      <w:bookmarkEnd w:id="29"/>
     </w:p>
     <w:p>
       <w:pPr>
@@ -6111,7 +7534,7 @@
           <w:u w:val="single"/>
         </w:rPr>
       </w:pPr>
-      <w:bookmarkStart w:id="27" w:name="_Toc230647598"/>
+      <w:bookmarkStart w:id="30" w:name="_Toc230901626"/>
       <w:r>
         <w:rPr>
           <w:b/>
@@ -6122,7 +7545,7 @@
         </w:rPr>
         <w:t>Feature Engineering</w:t>
       </w:r>
-      <w:bookmarkEnd w:id="27"/>
+      <w:bookmarkEnd w:id="30"/>
     </w:p>
     <w:p>
       <w:pPr>
@@ -6139,7 +7562,7 @@
           <w:u w:val="single"/>
         </w:rPr>
       </w:pPr>
-      <w:bookmarkStart w:id="28" w:name="_Toc230647599"/>
+      <w:bookmarkStart w:id="31" w:name="_Toc230901627"/>
       <w:r>
         <w:rPr>
           <w:b/>
@@ -6150,7 +7573,7 @@
         </w:rPr>
         <w:t>Explanatory Data Analysis</w:t>
       </w:r>
-      <w:bookmarkEnd w:id="28"/>
+      <w:bookmarkEnd w:id="31"/>
     </w:p>
     <w:p>
       <w:pPr>
@@ -6167,7 +7590,7 @@
           <w:u w:val="single"/>
         </w:rPr>
       </w:pPr>
-      <w:bookmarkStart w:id="29" w:name="_Toc230647600"/>
+      <w:bookmarkStart w:id="32" w:name="_Toc230901628"/>
       <w:r>
         <w:rPr>
           <w:b/>
@@ -6178,7 +7601,7 @@
         </w:rPr>
         <w:t>Baseline &amp; Comparative Models</w:t>
       </w:r>
-      <w:bookmarkEnd w:id="29"/>
+      <w:bookmarkEnd w:id="32"/>
     </w:p>
     <w:p>
       <w:pPr>
@@ -6195,7 +7618,7 @@
           <w:u w:val="single"/>
         </w:rPr>
       </w:pPr>
-      <w:bookmarkStart w:id="30" w:name="_Toc230647601"/>
+      <w:bookmarkStart w:id="33" w:name="_Toc230901629"/>
       <w:r>
         <w:rPr>
           <w:b/>
@@ -6204,10 +7627,9 @@
           <w:szCs w:val="24"/>
           <w:u w:val="single"/>
         </w:rPr>
-        <w:lastRenderedPageBreak/>
         <w:t>Proposed Model</w:t>
       </w:r>
-      <w:bookmarkEnd w:id="30"/>
+      <w:bookmarkEnd w:id="33"/>
     </w:p>
     <w:p>
       <w:pPr>
@@ -6225,7 +7647,7 @@
           <w:u w:val="single"/>
         </w:rPr>
       </w:pPr>
-      <w:bookmarkStart w:id="31" w:name="_Toc230647602"/>
+      <w:bookmarkStart w:id="34" w:name="_Toc230901630"/>
       <w:r>
         <w:rPr>
           <w:b/>
@@ -6236,7 +7658,7 @@
         </w:rPr>
         <w:t>Expected Outcomes</w:t>
       </w:r>
-      <w:bookmarkEnd w:id="31"/>
+      <w:bookmarkEnd w:id="34"/>
     </w:p>
     <w:p>
       <w:pPr>
@@ -6254,7 +7676,7 @@
           <w:u w:val="single"/>
         </w:rPr>
       </w:pPr>
-      <w:bookmarkStart w:id="32" w:name="_Toc230647603"/>
+      <w:bookmarkStart w:id="35" w:name="_Toc230901631"/>
       <w:r>
         <w:rPr>
           <w:b/>
@@ -6265,16 +7687,466 @@
         </w:rPr>
         <w:t>References</w:t>
       </w:r>
-      <w:bookmarkEnd w:id="32"/>
+      <w:bookmarkEnd w:id="35"/>
     </w:p>
     <w:p>
       <w:pPr>
+        <w:pStyle w:val="Bibliography"/>
+        <w:ind w:left="720" w:hanging="720"/>
+        <w:rPr>
+          <w:noProof/>
+          <w:kern w:val="0"/>
+          <w14:ligatures w14:val="none"/>
+        </w:rPr>
+      </w:pPr>
+      <w:r>
         <w:rPr>
           <w:b/>
           <w:bCs/>
           <w:u w:val="single"/>
         </w:rPr>
-      </w:pPr>
+        <w:fldChar w:fldCharType="begin"/>
+      </w:r>
+      <w:r>
+        <w:rPr>
+          <w:b/>
+          <w:bCs/>
+          <w:u w:val="single"/>
+        </w:rPr>
+        <w:instrText xml:space="preserve"> BIBLIOGRAPHY  \l 17417 </w:instrText>
+      </w:r>
+      <w:r>
+        <w:rPr>
+          <w:b/>
+          <w:bCs/>
+          <w:u w:val="single"/>
+        </w:rPr>
+        <w:fldChar w:fldCharType="separate"/>
+      </w:r>
+      <w:r>
+        <w:rPr>
+          <w:noProof/>
+        </w:rPr>
+        <w:t xml:space="preserve">Amir, N. N., Anuar, N. S., Ismail, B., Azreen, N. A., &amp; Ramli, N. A. (28 December, 2025). Ridership Prediction System for Rapid Bus Kuantan and Penang using Multi-Feature Analysis. </w:t>
+      </w:r>
+      <w:r>
+        <w:rPr>
+          <w:i/>
+          <w:iCs/>
+          <w:noProof/>
+        </w:rPr>
+        <w:t>Journal of the Malaysian Institute of Planners, 23</w:t>
+      </w:r>
+      <w:r>
+        <w:rPr>
+          <w:noProof/>
+        </w:rPr>
+        <w:t>(6), 332 - 347. doi:10.21837/pm.v23i39.1913</w:t>
+      </w:r>
+    </w:p>
+    <w:p>
+      <w:pPr>
+        <w:pStyle w:val="Bibliography"/>
+        <w:ind w:left="720" w:hanging="720"/>
+        <w:rPr>
+          <w:noProof/>
+        </w:rPr>
+      </w:pPr>
+      <w:r>
+        <w:rPr>
+          <w:noProof/>
+        </w:rPr>
+        <w:t xml:space="preserve">Chen, P., Fu, X., &amp; Wang, X. (7 July, 2022). A Graph Convolutional Stacked Bidirectional Unidirectional-LSTM Neural Network for Metro Ridership Prediction. </w:t>
+      </w:r>
+      <w:r>
+        <w:rPr>
+          <w:i/>
+          <w:iCs/>
+          <w:noProof/>
+        </w:rPr>
+        <w:t xml:space="preserve">IEEE </w:t>
+      </w:r>
+      <w:r>
+        <w:rPr>
+          <w:i/>
+          <w:iCs/>
+          <w:noProof/>
+        </w:rPr>
+        <w:lastRenderedPageBreak/>
+        <w:t>Transactions on Intelligent Transportation Systems, 23</w:t>
+      </w:r>
+      <w:r>
+        <w:rPr>
+          <w:noProof/>
+        </w:rPr>
+        <w:t>(7), 6950 - 6962. doi:10.1109/TITS.2021.3065404</w:t>
+      </w:r>
+    </w:p>
+    <w:p>
+      <w:pPr>
+        <w:pStyle w:val="Bibliography"/>
+        <w:ind w:left="720" w:hanging="720"/>
+        <w:rPr>
+          <w:noProof/>
+        </w:rPr>
+      </w:pPr>
+      <w:r>
+        <w:rPr>
+          <w:noProof/>
+        </w:rPr>
+        <w:t xml:space="preserve">Ge, L., Sarhani, M., Voss, S., &amp; Xie, L. (16 October, 2021). Review of Transit Data Sources: Potentials, Challenges and Complementarity. </w:t>
+      </w:r>
+      <w:r>
+        <w:rPr>
+          <w:i/>
+          <w:iCs/>
+          <w:noProof/>
+        </w:rPr>
+        <w:t>Sustainability, 13</w:t>
+      </w:r>
+      <w:r>
+        <w:rPr>
+          <w:noProof/>
+        </w:rPr>
+        <w:t>(20), 11450. doi:10.3390/su132011450</w:t>
+      </w:r>
+    </w:p>
+    <w:p>
+      <w:pPr>
+        <w:pStyle w:val="Bibliography"/>
+        <w:ind w:left="720" w:hanging="720"/>
+        <w:rPr>
+          <w:noProof/>
+        </w:rPr>
+      </w:pPr>
+      <w:r>
+        <w:rPr>
+          <w:noProof/>
+        </w:rPr>
+        <w:t xml:space="preserve">Hassan, M., Mahin, H. D., Ahmed, F., Hassan, M. M., Rahaman, A., &amp; Abdullah, M. (4 July, 2025). Assessing Public Transit Network Efficiency and Accessibility in Johor Bahru and Penang, Malaysia: A Data-driven Approach. </w:t>
+      </w:r>
+      <w:r>
+        <w:rPr>
+          <w:i/>
+          <w:iCs/>
+          <w:noProof/>
+        </w:rPr>
+        <w:t>Results in Engineering, 27</w:t>
+      </w:r>
+      <w:r>
+        <w:rPr>
+          <w:noProof/>
+        </w:rPr>
+        <w:t>, 106126. doi:10.1016/j.rineng.2025.106126</w:t>
+      </w:r>
+    </w:p>
+    <w:p>
+      <w:pPr>
+        <w:pStyle w:val="Bibliography"/>
+        <w:ind w:left="720" w:hanging="720"/>
+        <w:rPr>
+          <w:noProof/>
+        </w:rPr>
+      </w:pPr>
+      <w:r>
+        <w:rPr>
+          <w:noProof/>
+        </w:rPr>
+        <w:t xml:space="preserve">Ibrahim, A. N., Borhan, M. N., Osman, M. H., Yazid, M. R., &amp; Rohani, M. M. (24 June, 2022). The Influence of Service Quality on User's Perceived Satisfaction with Light Rail Transit Service in Klang Valley, Malaysia. </w:t>
+      </w:r>
+      <w:r>
+        <w:rPr>
+          <w:i/>
+          <w:iCs/>
+          <w:noProof/>
+        </w:rPr>
+        <w:t>Mathematics, 10</w:t>
+      </w:r>
+      <w:r>
+        <w:rPr>
+          <w:noProof/>
+        </w:rPr>
+        <w:t>, 2213. doi:10.3390/math10132213</w:t>
+      </w:r>
+    </w:p>
+    <w:p>
+      <w:pPr>
+        <w:pStyle w:val="Bibliography"/>
+        <w:ind w:left="720" w:hanging="720"/>
+        <w:rPr>
+          <w:noProof/>
+        </w:rPr>
+      </w:pPr>
+      <w:r>
+        <w:rPr>
+          <w:noProof/>
+        </w:rPr>
+        <w:t xml:space="preserve">Lu, K., Liu, J., Zhou, X., &amp; Han, B. (19 February, 2020). A Review of Big Data Applications in Urban Transit Systems. </w:t>
+      </w:r>
+      <w:r>
+        <w:rPr>
+          <w:i/>
+          <w:iCs/>
+          <w:noProof/>
+        </w:rPr>
+        <w:t>IEEE Transactions on Intelligent Transportation Systems, 22</w:t>
+      </w:r>
+      <w:r>
+        <w:rPr>
+          <w:noProof/>
+        </w:rPr>
+        <w:t>(5), 2535-2552. doi:10.1109/TITS.2020.2973365</w:t>
+      </w:r>
+    </w:p>
+    <w:p>
+      <w:pPr>
+        <w:pStyle w:val="Bibliography"/>
+        <w:ind w:left="720" w:hanging="720"/>
+        <w:rPr>
+          <w:noProof/>
+        </w:rPr>
+      </w:pPr>
+      <w:r>
+        <w:rPr>
+          <w:noProof/>
+        </w:rPr>
+        <w:t xml:space="preserve">Lv, Z., Li, J., Dong, C., Li, H., &amp; Xu, Z. (29 June, 2021). Deep Learning in the COVID-19 epidemic: A deep model for urban traffic revitalization index. </w:t>
+      </w:r>
+      <w:r>
+        <w:rPr>
+          <w:i/>
+          <w:iCs/>
+          <w:noProof/>
+        </w:rPr>
+        <w:t>Data &amp; Knowledge Engineering, 135</w:t>
+      </w:r>
+      <w:r>
+        <w:rPr>
+          <w:noProof/>
+        </w:rPr>
+        <w:t>, 101912. doi:10.1016/j.datak.2021.101912</w:t>
+      </w:r>
+    </w:p>
+    <w:p>
+      <w:pPr>
+        <w:pStyle w:val="Bibliography"/>
+        <w:ind w:left="720" w:hanging="720"/>
+        <w:rPr>
+          <w:noProof/>
+        </w:rPr>
+      </w:pPr>
+      <w:r>
+        <w:rPr>
+          <w:noProof/>
+        </w:rPr>
+        <w:t xml:space="preserve">Mee, C. K., Subramaniam, G., Ating, R., &amp; Separa, L. A. (30 September, 2022). Willingness to use Public Transport in Kuala Lumpur &amp; Manila. </w:t>
+      </w:r>
+      <w:r>
+        <w:rPr>
+          <w:i/>
+          <w:iCs/>
+          <w:noProof/>
+        </w:rPr>
+        <w:t>Environment-Behaviour Proceedings Journal, 7</w:t>
+      </w:r>
+      <w:r>
+        <w:rPr>
+          <w:noProof/>
+        </w:rPr>
+        <w:t>(21), 1 - 9. doi:10.21834/ebpj.v7i21.3751</w:t>
+      </w:r>
+    </w:p>
+    <w:p>
+      <w:pPr>
+        <w:pStyle w:val="Bibliography"/>
+        <w:ind w:left="720" w:hanging="720"/>
+        <w:rPr>
+          <w:noProof/>
+        </w:rPr>
+      </w:pPr>
+      <w:r>
+        <w:rPr>
+          <w:noProof/>
+        </w:rPr>
+        <w:t xml:space="preserve">Mohamed, A. H., Adwan, I. A., Ahmeda, A. G., Hrtemih, H., &amp; Al-MSari, H. (25 April, 2021). Identification of Affecting Factors on the Travel Time Reliability for Bus Transportation. </w:t>
+      </w:r>
+      <w:r>
+        <w:rPr>
+          <w:i/>
+          <w:iCs/>
+          <w:noProof/>
+        </w:rPr>
+        <w:t>Knowledge-based Engineering and Science, 2</w:t>
+      </w:r>
+      <w:r>
+        <w:rPr>
+          <w:noProof/>
+        </w:rPr>
+        <w:t>(1), 19 - 30. doi:10.51526/kbes.2021.2.1.19-30</w:t>
+      </w:r>
+    </w:p>
+    <w:p>
+      <w:pPr>
+        <w:pStyle w:val="Bibliography"/>
+        <w:ind w:left="720" w:hanging="720"/>
+        <w:rPr>
+          <w:noProof/>
+        </w:rPr>
+      </w:pPr>
+      <w:r>
+        <w:rPr>
+          <w:noProof/>
+        </w:rPr>
+        <w:t xml:space="preserve">Rezapour, M., &amp; Ferraro, F. R. (16 June, 2021). Rail Transport Delay and Its Effects on the Perceived Importance of a Real-time Information. </w:t>
+      </w:r>
+      <w:r>
+        <w:rPr>
+          <w:i/>
+          <w:iCs/>
+          <w:noProof/>
+        </w:rPr>
+        <w:t>Frontiers in Psychology, 12</w:t>
+      </w:r>
+      <w:r>
+        <w:rPr>
+          <w:noProof/>
+        </w:rPr>
+        <w:t>, 1 - 11. doi:10.3389/fpsyg.2021.619308</w:t>
+      </w:r>
+    </w:p>
+    <w:p>
+      <w:pPr>
+        <w:pStyle w:val="Bibliography"/>
+        <w:ind w:left="720" w:hanging="720"/>
+        <w:rPr>
+          <w:noProof/>
+        </w:rPr>
+      </w:pPr>
+      <w:r>
+        <w:rPr>
+          <w:noProof/>
+        </w:rPr>
+        <w:lastRenderedPageBreak/>
+        <w:t xml:space="preserve">Sogbe, E., Susilawati, S., &amp; Tan, C. P. (26 September, 2024). Scaling up public transport usage: a systematic literature review of service quality, satisfaction and attitude towards bus transport systems in developing countries. </w:t>
+      </w:r>
+      <w:r>
+        <w:rPr>
+          <w:i/>
+          <w:iCs/>
+          <w:noProof/>
+        </w:rPr>
+        <w:t>Public Transport, 17</w:t>
+      </w:r>
+      <w:r>
+        <w:rPr>
+          <w:noProof/>
+        </w:rPr>
+        <w:t>, 1 - 44. doi:10.1007/s12469-024-00367-6</w:t>
+      </w:r>
+    </w:p>
+    <w:p>
+      <w:pPr>
+        <w:pStyle w:val="Bibliography"/>
+        <w:ind w:left="720" w:hanging="720"/>
+        <w:rPr>
+          <w:noProof/>
+        </w:rPr>
+      </w:pPr>
+      <w:r>
+        <w:rPr>
+          <w:noProof/>
+        </w:rPr>
+        <w:t xml:space="preserve">Ubaidillah, N. Z., Sa'ad, N. H., Ismail, F., Nordin, N. A., Baharuddin, N., &amp; Hassam, M. K. (June, 2022). The Impact of Public Bus Service Quality on the Users’ Satisfaction: Evidence from a Developing Asian City. </w:t>
+      </w:r>
+      <w:r>
+        <w:rPr>
+          <w:i/>
+          <w:iCs/>
+          <w:noProof/>
+        </w:rPr>
+        <w:t>Review of Applied Socio-Economic Research, 23</w:t>
+      </w:r>
+      <w:r>
+        <w:rPr>
+          <w:noProof/>
+        </w:rPr>
+        <w:t>(1), 83 - 96. doi:10.54609/reaser.v23i1.185</w:t>
+      </w:r>
+    </w:p>
+    <w:p>
+      <w:pPr>
+        <w:pStyle w:val="Bibliography"/>
+        <w:ind w:left="720" w:hanging="720"/>
+        <w:rPr>
+          <w:noProof/>
+        </w:rPr>
+      </w:pPr>
+      <w:r>
+        <w:rPr>
+          <w:noProof/>
+        </w:rPr>
+        <w:t xml:space="preserve">Wang, J., Liu, C., Wu, Z., Liao, R., Li, G., &amp; Lu, H. (March, 2025). The Roadmap and Strategy for Prioritizing the Development of Public Transport in China. </w:t>
+      </w:r>
+      <w:r>
+        <w:rPr>
+          <w:i/>
+          <w:iCs/>
+          <w:noProof/>
+        </w:rPr>
+        <w:t>Multimodal Transportation, 4</w:t>
+      </w:r>
+      <w:r>
+        <w:rPr>
+          <w:noProof/>
+        </w:rPr>
+        <w:t>(1), 100184. doi:10.1016/j.multra.2024.100184</w:t>
+      </w:r>
+    </w:p>
+    <w:p>
+      <w:pPr>
+        <w:pStyle w:val="Bibliography"/>
+        <w:ind w:left="720" w:hanging="720"/>
+        <w:rPr>
+          <w:noProof/>
+        </w:rPr>
+      </w:pPr>
+      <w:r>
+        <w:rPr>
+          <w:noProof/>
+        </w:rPr>
+        <w:t xml:space="preserve">Zhao, M., &amp; Lan, C.-L. (Novemeber, 2025). Modeling Travel Time Reliability for Non-Interstate National Highway System Routes. </w:t>
+      </w:r>
+      <w:r>
+        <w:rPr>
+          <w:i/>
+          <w:iCs/>
+          <w:noProof/>
+        </w:rPr>
+        <w:t>Virginia Transportation Research Council</w:t>
+      </w:r>
+      <w:r>
+        <w:rPr>
+          <w:noProof/>
+        </w:rPr>
+        <w:t>, 1 - 68. Retrieved from https://vtrc.virginia.gov/media/vtrc/vtrc-pdf/vtrc-pdf/26-R23.pdf</w:t>
+      </w:r>
+    </w:p>
+    <w:p>
+      <w:pPr>
+        <w:rPr>
+          <w:b/>
+          <w:bCs/>
+          <w:u w:val="single"/>
+        </w:rPr>
+      </w:pPr>
+      <w:r>
+        <w:rPr>
+          <w:b/>
+          <w:bCs/>
+          <w:u w:val="single"/>
+        </w:rPr>
+        <w:fldChar w:fldCharType="end"/>
+      </w:r>
     </w:p>
     <w:sectPr>
       <w:pgSz w:w="11906" w:h="16838"/>
@@ -6284,6 +8156,124 @@
     </w:sectPr>
   </w:body>
 </w:document>
+</file>
+
+<file path=word/endnotes.xml><?xml version="1.0" encoding="utf-8"?>
+<w:endnotes xmlns:wpc="http://schemas.microsoft.com/office/word/2010/wordprocessingCanvas" xmlns:cx="http://schemas.microsoft.com/office/drawing/2014/chartex" xmlns:cx1="http://schemas.microsoft.com/office/drawing/2015/9/8/chartex" xmlns:cx2="http://schemas.microsoft.com/office/drawing/2015/10/21/chartex" xmlns:cx3="http://schemas.microsoft.com/office/drawing/2016/5/9/chartex" xmlns:cx4="http://schemas.microsoft.com/office/drawing/2016/5/10/chartex" xmlns:cx5="http://schemas.microsoft.com/office/drawing/2016/5/11/chartex" xmlns:cx6="http://schemas.microsoft.com/office/drawing/2016/5/12/chartex" xmlns:cx7="http://schemas.microsoft.com/office/drawing/2016/5/13/chartex" xmlns:cx8="http://schemas.microsoft.com/office/drawing/2016/5/14/chartex" xmlns:mc="http://schemas.openxmlformats.org/markup-compatibility/2006" xmlns:aink="http://schemas.microsoft.com/office/drawing/2016/ink" xmlns:am3d="http://schemas.microsoft.com/office/drawing/2017/model3d" xmlns:o="urn:schemas-microsoft-com:office:office" xmlns:oel="http://schemas.microsoft.com/office/2019/extlst" xmlns:r="http://schemas.openxmlformats.org/officeDocument/2006/relationships" xmlns:m="http://schemas.openxmlformats.org/officeDocument/2006/math" xmlns:v="urn:schemas-microsoft-com:vml" xmlns:wp14="http://schemas.microsoft.com/office/word/2010/wordprocessingDrawing" xmlns:wp="http://schemas.openxmlformats.org/drawingml/2006/wordprocessingDrawing" xmlns:w10="urn:schemas-microsoft-com:office:word" xmlns:w="http://schemas.openxmlformats.org/wordprocessingml/2006/main" xmlns:w14="http://schemas.microsoft.com/office/word/2010/wordml" xmlns:w15="http://schemas.microsoft.com/office/word/2012/wordml" xmlns:w16cex="http://schemas.microsoft.com/office/word/2018/wordml/cex" xmlns:w16cid="http://schemas.microsoft.com/office/word/2016/wordml/cid" xmlns:w16="http://schemas.microsoft.com/office/word/2018/wordml" xmlns:w16du="http://schemas.microsoft.com/office/word/2023/wordml/word16du" xmlns:w16sdtdh="http://schemas.microsoft.com/office/word/2020/wordml/sdtdatahash" xmlns:w16sdtfl="http://schemas.microsoft.com/office/word/2024/wordml/sdtformatlock" xmlns:w16se="http://schemas.microsoft.com/office/word/2015/wordml/symex" xmlns:wpg="http://schemas.microsoft.com/office/word/2010/wordprocessingGroup" xmlns:wpi="http://schemas.microsoft.com/office/word/2010/wordprocessingInk" xmlns:wne="http://schemas.microsoft.com/office/word/2006/wordml" xmlns:wps="http://schemas.microsoft.com/office/word/2010/wordprocessingShape" mc:Ignorable="w14 w15 w16se w16cid w16 w16cex w16sdtdh w16sdtfl w16du wp14">
+  <w:endnote w:type="separator" w:id="-1">
+    <w:p>
+      <w:pPr>
+        <w:spacing w:after="0" w:line="240" w:lineRule="auto"/>
+      </w:pPr>
+      <w:r>
+        <w:separator/>
+      </w:r>
+    </w:p>
+  </w:endnote>
+  <w:endnote w:type="continuationSeparator" w:id="0">
+    <w:p>
+      <w:pPr>
+        <w:spacing w:after="0" w:line="240" w:lineRule="auto"/>
+      </w:pPr>
+      <w:r>
+        <w:continuationSeparator/>
+      </w:r>
+    </w:p>
+  </w:endnote>
+</w:endnotes>
+</file>
+
+<file path=word/footnotes.xml><?xml version="1.0" encoding="utf-8"?>
+<w:footnotes xmlns:wpc="http://schemas.microsoft.com/office/word/2010/wordprocessingCanvas" xmlns:cx="http://schemas.microsoft.com/office/drawing/2014/chartex" xmlns:cx1="http://schemas.microsoft.com/office/drawing/2015/9/8/chartex" xmlns:cx2="http://schemas.microsoft.com/office/drawing/2015/10/21/chartex" xmlns:cx3="http://schemas.microsoft.com/office/drawing/2016/5/9/chartex" xmlns:cx4="http://schemas.microsoft.com/office/drawing/2016/5/10/chartex" xmlns:cx5="http://schemas.microsoft.com/office/drawing/2016/5/11/chartex" xmlns:cx6="http://schemas.microsoft.com/office/drawing/2016/5/12/chartex" xmlns:cx7="http://schemas.microsoft.com/office/drawing/2016/5/13/chartex" xmlns:cx8="http://schemas.microsoft.com/office/drawing/2016/5/14/chartex" xmlns:mc="http://schemas.openxmlformats.org/markup-compatibility/2006" xmlns:aink="http://schemas.microsoft.com/office/drawing/2016/ink" xmlns:am3d="http://schemas.microsoft.com/office/drawing/2017/model3d" xmlns:o="urn:schemas-microsoft-com:office:office" xmlns:oel="http://schemas.microsoft.com/office/2019/extlst" xmlns:r="http://schemas.openxmlformats.org/officeDocument/2006/relationships" xmlns:m="http://schemas.openxmlformats.org/officeDocument/2006/math" xmlns:v="urn:schemas-microsoft-com:vml" xmlns:wp14="http://schemas.microsoft.com/office/word/2010/wordprocessingDrawing" xmlns:wp="http://schemas.openxmlformats.org/drawingml/2006/wordprocessingDrawing" xmlns:w10="urn:schemas-microsoft-com:office:word" xmlns:w="http://schemas.openxmlformats.org/wordprocessingml/2006/main" xmlns:w14="http://schemas.microsoft.com/office/word/2010/wordml" xmlns:w15="http://schemas.microsoft.com/office/word/2012/wordml" xmlns:w16cex="http://schemas.microsoft.com/office/word/2018/wordml/cex" xmlns:w16cid="http://schemas.microsoft.com/office/word/2016/wordml/cid" xmlns:w16="http://schemas.microsoft.com/office/word/2018/wordml" xmlns:w16du="http://schemas.microsoft.com/office/word/2023/wordml/word16du" xmlns:w16sdtdh="http://schemas.microsoft.com/office/word/2020/wordml/sdtdatahash" xmlns:w16sdtfl="http://schemas.microsoft.com/office/word/2024/wordml/sdtformatlock" xmlns:w16se="http://schemas.microsoft.com/office/word/2015/wordml/symex" xmlns:wpg="http://schemas.microsoft.com/office/word/2010/wordprocessingGroup" xmlns:wpi="http://schemas.microsoft.com/office/word/2010/wordprocessingInk" xmlns:wne="http://schemas.microsoft.com/office/word/2006/wordml" xmlns:wps="http://schemas.microsoft.com/office/word/2010/wordprocessingShape" mc:Ignorable="w14 w15 w16se w16cid w16 w16cex w16sdtdh w16sdtfl w16du wp14">
+  <w:footnote w:type="separator" w:id="-1">
+    <w:p>
+      <w:pPr>
+        <w:spacing w:after="0" w:line="240" w:lineRule="auto"/>
+      </w:pPr>
+      <w:r>
+        <w:separator/>
+      </w:r>
+    </w:p>
+  </w:footnote>
+  <w:footnote w:type="continuationSeparator" w:id="0">
+    <w:p>
+      <w:pPr>
+        <w:spacing w:after="0" w:line="240" w:lineRule="auto"/>
+      </w:pPr>
+      <w:r>
+        <w:continuationSeparator/>
+      </w:r>
+    </w:p>
+  </w:footnote>
+  <w:footnote w:id="1">
+    <w:p>
+      <w:pPr>
+        <w:pStyle w:val="FootnoteText"/>
+        <w:spacing w:line="360" w:lineRule="auto"/>
+        <w:rPr>
+          <w:lang w:val="en-US"/>
+        </w:rPr>
+      </w:pPr>
+      <w:r>
+        <w:rPr>
+          <w:rStyle w:val="FootnoteReference"/>
+        </w:rPr>
+        <w:footnoteRef/>
+      </w:r>
+      <w:r>
+        <w:t xml:space="preserve"> </w:t>
+      </w:r>
+      <w:r>
+        <w:rPr>
+          <w:b/>
+          <w:bCs/>
+          <w:lang w:val="en-US"/>
+        </w:rPr>
+        <w:t>FMLM</w:t>
+      </w:r>
+      <w:r>
+        <w:rPr>
+          <w:lang w:val="en-US"/>
+        </w:rPr>
+        <w:t xml:space="preserve">: Refers to the physical distance between </w:t>
+      </w:r>
+      <w:r>
+        <w:rPr>
+          <w:b/>
+          <w:bCs/>
+          <w:lang w:val="en-US"/>
+        </w:rPr>
+        <w:t>a passenger’s origin/destination</w:t>
+      </w:r>
+      <w:r>
+        <w:rPr>
+          <w:lang w:val="en-US"/>
+        </w:rPr>
+        <w:t xml:space="preserve"> and a </w:t>
+      </w:r>
+      <w:r>
+        <w:rPr>
+          <w:b/>
+          <w:bCs/>
+          <w:lang w:val="en-US"/>
+        </w:rPr>
+        <w:t>main transit hub</w:t>
+      </w:r>
+      <w:r>
+        <w:rPr>
+          <w:lang w:val="en-US"/>
+        </w:rPr>
+        <w:t xml:space="preserve"> (train stations/bus stops). If the distance is inconvenient or unsafe, passengers are more likely default to private vehicles</w:t>
+      </w:r>
+      <w:r>
+        <w:rPr>
+          <w:lang w:val="en-US"/>
+        </w:rPr>
+        <w:t>. This will then reduce the usage of public transit networks and worsen traffic congestion.</w:t>
+      </w:r>
+    </w:p>
+  </w:footnote>
+</w:footnotes>
 </file>
 
 <file path=word/numbering.xml><?xml version="1.0" encoding="utf-8"?>
@@ -8816,6 +10806,65 @@
       <w:u w:val="single"/>
     </w:rPr>
   </w:style>
+  <w:style w:type="paragraph" w:styleId="Bibliography">
+    <w:name w:val="Bibliography"/>
+    <w:basedOn w:val="Normal"/>
+    <w:next w:val="Normal"/>
+    <w:uiPriority w:val="37"/>
+    <w:unhideWhenUsed/>
+    <w:rsid w:val="005C23CC"/>
+  </w:style>
+  <w:style w:type="paragraph" w:styleId="FootnoteText">
+    <w:name w:val="footnote text"/>
+    <w:basedOn w:val="Normal"/>
+    <w:link w:val="FootnoteTextChar"/>
+    <w:uiPriority w:val="99"/>
+    <w:semiHidden/>
+    <w:unhideWhenUsed/>
+    <w:rsid w:val="00BA296D"/>
+    <w:pPr>
+      <w:spacing w:after="0" w:line="240" w:lineRule="auto"/>
+    </w:pPr>
+    <w:rPr>
+      <w:sz w:val="20"/>
+      <w:szCs w:val="20"/>
+    </w:rPr>
+  </w:style>
+  <w:style w:type="character" w:customStyle="1" w:styleId="FootnoteTextChar">
+    <w:name w:val="Footnote Text Char"/>
+    <w:basedOn w:val="DefaultParagraphFont"/>
+    <w:link w:val="FootnoteText"/>
+    <w:uiPriority w:val="99"/>
+    <w:semiHidden/>
+    <w:rsid w:val="00BA296D"/>
+    <w:rPr>
+      <w:rFonts w:ascii="Times New Roman" w:hAnsi="Times New Roman"/>
+      <w:sz w:val="20"/>
+      <w:szCs w:val="20"/>
+    </w:rPr>
+  </w:style>
+  <w:style w:type="character" w:styleId="FootnoteReference">
+    <w:name w:val="footnote reference"/>
+    <w:basedOn w:val="DefaultParagraphFont"/>
+    <w:uiPriority w:val="99"/>
+    <w:semiHidden/>
+    <w:unhideWhenUsed/>
+    <w:rsid w:val="00BA296D"/>
+    <w:rPr>
+      <w:vertAlign w:val="superscript"/>
+    </w:rPr>
+  </w:style>
+  <w:style w:type="paragraph" w:styleId="TableofFigures">
+    <w:name w:val="table of figures"/>
+    <w:basedOn w:val="Normal"/>
+    <w:next w:val="Normal"/>
+    <w:uiPriority w:val="99"/>
+    <w:unhideWhenUsed/>
+    <w:rsid w:val="001674E5"/>
+    <w:pPr>
+      <w:spacing w:after="0"/>
+    </w:pPr>
+  </w:style>
 </w:styles>
 </file>
 
@@ -9172,7 +11221,7 @@
     <b:Volume>22</b:Volume>
     <b:Issue>5</b:Issue>
     <b:DOI>10.1109/TITS.2020.2973365</b:DOI>
-    <b:RefOrder>2</b:RefOrder>
+    <b:RefOrder>1</b:RefOrder>
   </b:Source>
   <b:Source>
     <b:Tag>Nur25</b:Tag>
@@ -9218,7 +11267,7 @@
     <b:Volume>23</b:Volume>
     <b:Issue>6</b:Issue>
     <b:DOI>10.21837/pm.v23i39.1913</b:DOI>
-    <b:RefOrder>3</b:RefOrder>
+    <b:RefOrder>2</b:RefOrder>
   </b:Source>
   <b:Source>
     <b:Tag>Jin25</b:Tag>
@@ -9263,7 +11312,7 @@
     <b:Volume>4</b:Volume>
     <b:Issue>1</b:Issue>
     <b:DOI>10.1016/j.multra.2024.100184</b:DOI>
-    <b:RefOrder>4</b:RefOrder>
+    <b:RefOrder>3</b:RefOrder>
   </b:Source>
   <b:Source>
     <b:Tag>Cho22</b:Tag>
@@ -9303,7 +11352,7 @@
     <b:Volume>7</b:Volume>
     <b:Issue>21</b:Issue>
     <b:DOI>10.21834/ebpj.v7i21.3751</b:DOI>
-    <b:RefOrder>5</b:RefOrder>
+    <b:RefOrder>4</b:RefOrder>
   </b:Source>
   <b:Source>
     <b:Tag>Pen22</b:Tag>
@@ -9337,7 +11386,7 @@
     <b:Volume>23</b:Volume>
     <b:Issue>7</b:Issue>
     <b:DOI>10.1109/TITS.2021.3065404</b:DOI>
-    <b:RefOrder>6</b:RefOrder>
+    <b:RefOrder>5</b:RefOrder>
   </b:Source>
   <b:Source>
     <b:Tag>Lip21</b:Tag>
@@ -9375,7 +11424,7 @@
     <b:Volume>13</b:Volume>
     <b:Issue>20</b:Issue>
     <b:DOI>10.3390/su132011450</b:DOI>
-    <b:RefOrder>7</b:RefOrder>
+    <b:RefOrder>6</b:RefOrder>
   </b:Source>
   <b:Source>
     <b:Tag>MoZ25</b:Tag>
@@ -9402,7 +11451,7 @@
     <b:Month>Novemeber</b:Month>
     <b:Publisher>VTRC</b:Publisher>
     <b:URL>https://vtrc.virginia.gov/media/vtrc/vtrc-pdf/vtrc-pdf/26-R23.pdf</b:URL>
-    <b:RefOrder>8</b:RefOrder>
+    <b:RefOrder>7</b:RefOrder>
   </b:Source>
   <b:Source>
     <b:Tag>Zhi</b:Tag>
@@ -9443,13 +11492,264 @@
     <b:Publisher>Elsevier</b:Publisher>
     <b:Volume>135</b:Volume>
     <b:DOI>10.1016/j.datak.2021.101912</b:DOI>
-    <b:RefOrder>1</b:RefOrder>
+    <b:RefOrder>8</b:RefOrder>
+  </b:Source>
+  <b:Source>
+    <b:Tag>Sog24</b:Tag>
+    <b:SourceType>JournalArticle</b:SourceType>
+    <b:Guid>{D955C4BA-2D11-4A48-9C1D-24D95CCFF81A}</b:Guid>
+    <b:Author>
+      <b:Author>
+        <b:NameList>
+          <b:Person>
+            <b:Last>Sogbe</b:Last>
+            <b:First>Eugene</b:First>
+          </b:Person>
+          <b:Person>
+            <b:Last>Susilawati</b:Last>
+            <b:First>Susilawati</b:First>
+          </b:Person>
+          <b:Person>
+            <b:Last>Tan</b:Last>
+            <b:First>Chee</b:First>
+            <b:Middle>Pin</b:Middle>
+          </b:Person>
+        </b:NameList>
+      </b:Author>
+    </b:Author>
+    <b:Title>Scaling up public transport usage: a systematic literature review of service quality, satisfaction and attitude towards bus transport systems in developing countries</b:Title>
+    <b:Year>2024</b:Year>
+    <b:Month>September</b:Month>
+    <b:Day>26</b:Day>
+    <b:JournalName>Public Transport</b:JournalName>
+    <b:Pages>1 - 44</b:Pages>
+    <b:Publisher>Springer Nature Link</b:Publisher>
+    <b:Volume>17</b:Volume>
+    <b:DOI>10.1007/s12469-024-00367-6</b:DOI>
+    <b:RefOrder>9</b:RefOrder>
+  </b:Source>
+  <b:Source>
+    <b:Tag>Ahm21</b:Tag>
+    <b:SourceType>JournalArticle</b:SourceType>
+    <b:Guid>{FBB49DAB-FAAE-4794-B304-69BDFCD80DF3}</b:Guid>
+    <b:Title>Identification of Affecting Factors on the Travel Time Reliability for Bus Transportation</b:Title>
+    <b:JournalName>Knowledge-based Engineering and Science</b:JournalName>
+    <b:Year>2021</b:Year>
+    <b:Pages>19 - 30</b:Pages>
+    <b:Author>
+      <b:Author>
+        <b:NameList>
+          <b:Person>
+            <b:Last>Mohamed</b:Last>
+            <b:First>Ahmed</b:First>
+            <b:Middle>Hassan</b:Middle>
+          </b:Person>
+          <b:Person>
+            <b:Last>Adwan</b:Last>
+            <b:First>Ibrhim</b:First>
+            <b:Middle>A. I.</b:Middle>
+          </b:Person>
+          <b:Person>
+            <b:Last>Ahmeda</b:Last>
+            <b:First>Abobaker</b:First>
+            <b:Middle>G. F.</b:Middle>
+          </b:Person>
+          <b:Person>
+            <b:Last>Hrtemih</b:Last>
+            <b:First>Hamza</b:First>
+          </b:Person>
+          <b:Person>
+            <b:Last>Al-MSari</b:Last>
+            <b:First>Haitham</b:First>
+          </b:Person>
+        </b:NameList>
+      </b:Author>
+    </b:Author>
+    <b:Month>April</b:Month>
+    <b:Day>25</b:Day>
+    <b:Publisher>Public Knowledge Project Publishing Service</b:Publisher>
+    <b:Volume>2</b:Volume>
+    <b:Issue>1</b:Issue>
+    <b:DOI>10.51526/kbes.2021.2.1.19-30</b:DOI>
+    <b:RefOrder>10</b:RefOrder>
+  </b:Source>
+  <b:Source>
+    <b:Tag>Ahm22</b:Tag>
+    <b:SourceType>JournalArticle</b:SourceType>
+    <b:Guid>{DE8D8CC0-2E9C-4A53-AECF-CFC365B5ACC7}</b:Guid>
+    <b:Title>The Influence of Service Quality on User's Perceived Satisfaction with Light Rail Transit Service in Klang Valley, Malaysia</b:Title>
+    <b:JournalName>Mathematics</b:JournalName>
+    <b:Year>2022</b:Year>
+    <b:Pages>2213</b:Pages>
+    <b:Author>
+      <b:Author>
+        <b:NameList>
+          <b:Person>
+            <b:Last>Ibrahim</b:Last>
+            <b:First>Ahmad</b:First>
+            <b:Middle>Nazrul Hakimi</b:Middle>
+          </b:Person>
+          <b:Person>
+            <b:Last>Borhan</b:Last>
+            <b:First>Muhamad</b:First>
+            <b:Middle>Nazri</b:Middle>
+          </b:Person>
+          <b:Person>
+            <b:Last>Osman</b:Last>
+            <b:First>Mohd</b:First>
+            <b:Middle>Haniff</b:Middle>
+          </b:Person>
+          <b:Person>
+            <b:Last>Yazid</b:Last>
+            <b:First>Muhamad</b:First>
+            <b:Middle>Razuhanafi Mat</b:Middle>
+          </b:Person>
+          <b:Person>
+            <b:Last>Rohani</b:Last>
+            <b:First>Munzilah</b:First>
+            <b:Middle>Md.</b:Middle>
+          </b:Person>
+        </b:NameList>
+      </b:Author>
+    </b:Author>
+    <b:Month>June</b:Month>
+    <b:Day>24</b:Day>
+    <b:Publisher>MDPI</b:Publisher>
+    <b:Volume>10</b:Volume>
+    <b:DOI>10.3390/math10132213</b:DOI>
+    <b:RefOrder>11</b:RefOrder>
+  </b:Source>
+  <b:Source>
+    <b:Tag>Mah21</b:Tag>
+    <b:SourceType>JournalArticle</b:SourceType>
+    <b:Guid>{DC76B436-FA22-470D-AB8F-AB49C6319270}</b:Guid>
+    <b:Title>Rail Transport Delay and Its Effects on the Perceived Importance of a Real-time Information</b:Title>
+    <b:JournalName>Frontiers in Psychology</b:JournalName>
+    <b:Year>2021</b:Year>
+    <b:Pages>1 - 11</b:Pages>
+    <b:Author>
+      <b:Author>
+        <b:NameList>
+          <b:Person>
+            <b:Last>Rezapour</b:Last>
+            <b:First>Mahdi</b:First>
+          </b:Person>
+          <b:Person>
+            <b:Last>Ferraro</b:Last>
+            <b:First>F.</b:First>
+            <b:Middle>Richard</b:Middle>
+          </b:Person>
+        </b:NameList>
+      </b:Author>
+    </b:Author>
+    <b:Month>June</b:Month>
+    <b:Day>16</b:Day>
+    <b:Publisher>Frontiers</b:Publisher>
+    <b:Volume>12</b:Volume>
+    <b:DOI>10.3389/fpsyg.2021.619308</b:DOI>
+    <b:RefOrder>12</b:RefOrder>
+  </b:Source>
+  <b:Source>
+    <b:Tag>Nur22</b:Tag>
+    <b:SourceType>JournalArticle</b:SourceType>
+    <b:Guid>{1D256F2C-8CF5-43E6-994F-77FBCD7C2369}</b:Guid>
+    <b:Title>The Impact of Public Bus Service Quality on the Users’ Satisfaction: Evidence from a Developing Asian City</b:Title>
+    <b:JournalName>Review of Applied Socio-Economic Research</b:JournalName>
+    <b:Year>2022</b:Year>
+    <b:Pages>83 - 96</b:Pages>
+    <b:Author>
+      <b:Author>
+        <b:NameList>
+          <b:Person>
+            <b:Last>Ubaidillah</b:Last>
+            <b:First>Nur</b:First>
+            <b:Middle>Zaimah</b:Middle>
+          </b:Person>
+          <b:Person>
+            <b:Last>Sa'ad</b:Last>
+            <b:First>Nur</b:First>
+            <b:Middle>Haziqah</b:Middle>
+          </b:Person>
+          <b:Person>
+            <b:Last>Ismail</b:Last>
+            <b:First>Farhana</b:First>
+          </b:Person>
+          <b:Person>
+            <b:Last>Nordin</b:Last>
+            <b:First>Nordiana</b:First>
+            <b:Middle>Ahmad</b:Middle>
+          </b:Person>
+          <b:Person>
+            <b:Last>Baharuddin</b:Last>
+            <b:First>Nadhira</b:First>
+          </b:Person>
+          <b:Person>
+            <b:Last>Hassam</b:Last>
+            <b:First>Mohd</b:First>
+            <b:Middle>Khairul Hisyam</b:Middle>
+          </b:Person>
+        </b:NameList>
+      </b:Author>
+    </b:Author>
+    <b:Month>June</b:Month>
+    <b:Publisher>Reaser</b:Publisher>
+    <b:Volume>23</b:Volume>
+    <b:Issue>1</b:Issue>
+    <b:DOI>10.54609/reaser.v23i1.185</b:DOI>
+    <b:RefOrder>13</b:RefOrder>
+  </b:Source>
+  <b:Source>
+    <b:Tag>Mah25</b:Tag>
+    <b:SourceType>JournalArticle</b:SourceType>
+    <b:Guid>{CFAF9764-34F3-4E31-9679-167B4A4CC774}</b:Guid>
+    <b:Title>Assessing Public Transit Network Efficiency and Accessibility in Johor Bahru and Penang, Malaysia: A Data-driven Approach</b:Title>
+    <b:JournalName>Results in Engineering</b:JournalName>
+    <b:Year>2025</b:Year>
+    <b:Pages>106126</b:Pages>
+    <b:Author>
+      <b:Author>
+        <b:NameList>
+          <b:Person>
+            <b:Last>Hassan</b:Last>
+            <b:First>Mahbub</b:First>
+          </b:Person>
+          <b:Person>
+            <b:Last>Mahin</b:Last>
+            <b:First>Hridoy</b:First>
+            <b:Middle>Deb</b:Middle>
+          </b:Person>
+          <b:Person>
+            <b:Last>Ahmed</b:Last>
+            <b:First>Ferdoushi</b:First>
+          </b:Person>
+          <b:Person>
+            <b:Last>Hassan</b:Last>
+            <b:First>Md.</b:First>
+            <b:Middle>Maruf</b:Middle>
+          </b:Person>
+          <b:Person>
+            <b:Last>Rahaman</b:Last>
+            <b:First>Atikur</b:First>
+          </b:Person>
+          <b:Person>
+            <b:Last>Abdullah</b:Last>
+            <b:First>Masuk</b:First>
+          </b:Person>
+        </b:NameList>
+      </b:Author>
+    </b:Author>
+    <b:Month>July</b:Month>
+    <b:Day>4</b:Day>
+    <b:Publisher>Elsevier</b:Publisher>
+    <b:Volume>27</b:Volume>
+    <b:DOI>10.1016/j.rineng.2025.106126</b:DOI>
+    <b:RefOrder>14</b:RefOrder>
   </b:Source>
 </b:Sources>
 </file>
 
 <file path=customXml/itemProps1.xml><?xml version="1.0" encoding="utf-8"?>
-<ds:datastoreItem xmlns:ds="http://schemas.openxmlformats.org/officeDocument/2006/customXml" ds:itemID="{F0FB74F4-3AAA-4CAC-92A5-E30B35D2B176}">
+<ds:datastoreItem xmlns:ds="http://schemas.openxmlformats.org/officeDocument/2006/customXml" ds:itemID="{898980CC-CB89-40C5-9EB9-355FDC39CAB7}">
   <ds:schemaRefs>
     <ds:schemaRef ds:uri="http://schemas.openxmlformats.org/officeDocument/2006/bibliography"/>
   </ds:schemaRefs>

</xml_diff>

<commit_message>
fix: :bug: Fix HMT-TSF overfitting issue and adding future prediction in sequence-builder
</commit_message>
<xml_diff>
--- a/docs/24202141_p1_report.docx
+++ b/docs/24202141_p1_report.docx
@@ -4260,47 +4260,19 @@
         <w:rPr>
           <w:lang w:val="en-US"/>
         </w:rPr>
-        <w:t xml:space="preserve">Consequently, transit authorities face a critical bottleneck in optimizing schedules, routes, and intervals amid peak hours and holidays, thus increasing the unreliability of Malaysia’s public transit and dissatisfaction among passengers. To solve this problem, it requires a dual approach: (1) identify specific </w:t>
-      </w:r>
-      <w:proofErr w:type="spellStart"/>
+        <w:t>Consequently, transit authorities face a critical bottleneck in optimizing schedules, routes, and intervals amid peak hours and holidays, thus increasing the unreliability of Malaysia’s public transit and dissatisfaction among passengers. To solve this problem, it requires a dual approach: (1) identify specific spatio-temporal factors that heavily influence the ridership trend in Malaysia’s public transit; (2) develop a robust predictive model capable of accurately</w:t>
+      </w:r>
       <w:r>
         <w:rPr>
           <w:lang w:val="en-US"/>
         </w:rPr>
-        <w:t>spatio</w:t>
-      </w:r>
-      <w:proofErr w:type="spellEnd"/>
+        <w:t xml:space="preserve"> and consistently</w:t>
+      </w:r>
       <w:r>
         <w:rPr>
           <w:lang w:val="en-US"/>
         </w:rPr>
-        <w:t>-temporal factors that heavily influence the ridership trend in Malaysia’s public transit; (2) develop a robust predictive model capable of accurately</w:t>
-      </w:r>
-      <w:r>
-        <w:rPr>
-          <w:lang w:val="en-US"/>
-        </w:rPr>
-        <w:t xml:space="preserve"> and consistently</w:t>
-      </w:r>
-      <w:r>
-        <w:rPr>
-          <w:lang w:val="en-US"/>
-        </w:rPr>
-        <w:t xml:space="preserve"> forecasting daily ridership trends based on these identified </w:t>
-      </w:r>
-      <w:proofErr w:type="spellStart"/>
-      <w:r>
-        <w:rPr>
-          <w:lang w:val="en-US"/>
-        </w:rPr>
-        <w:t>spatio</w:t>
-      </w:r>
-      <w:proofErr w:type="spellEnd"/>
-      <w:r>
-        <w:rPr>
-          <w:lang w:val="en-US"/>
-        </w:rPr>
-        <w:t>-temporal features.</w:t>
+        <w:t xml:space="preserve"> forecasting daily ridership trends based on these identified spatio-temporal features.</w:t>
       </w:r>
     </w:p>
     <w:p>
@@ -5255,7 +5227,6 @@
             <w:r>
               <w:t xml:space="preserve">); </w:t>
             </w:r>
-            <w:proofErr w:type="spellStart"/>
             <w:r>
               <w:rPr>
                 <w:b/>
@@ -5263,7 +5234,6 @@
               </w:rPr>
               <w:t>Autoformer</w:t>
             </w:r>
-            <w:proofErr w:type="spellEnd"/>
             <w:r>
               <w:t xml:space="preserve">; </w:t>
             </w:r>
@@ -6377,19 +6347,11 @@
                 <w:lang w:val="en-US"/>
               </w:rPr>
             </w:pPr>
-            <w:proofErr w:type="spellStart"/>
             <w:r>
               <w:rPr>
                 <w:lang w:val="en-US"/>
               </w:rPr>
-              <w:t>Sogbe</w:t>
-            </w:r>
-            <w:proofErr w:type="spellEnd"/>
-            <w:r>
-              <w:rPr>
-                <w:lang w:val="en-US"/>
-              </w:rPr>
-              <w:t xml:space="preserve"> et al. (2024)</w:t>
+              <w:t>Sogbe et al. (2024)</w:t>
             </w:r>
           </w:p>
         </w:tc>
@@ -6704,7 +6666,7 @@
         </w:rPr>
         <w:lastRenderedPageBreak/>
         <w:drawing>
-          <wp:inline distT="0" distB="0" distL="0" distR="0" wp14:anchorId="125BB2D3" wp14:editId="1A1AED34">
+          <wp:inline distT="0" distB="0" distL="0" distR="0" wp14:anchorId="125BB2D3" wp14:editId="69E25D08">
             <wp:extent cx="5722620" cy="4290060"/>
             <wp:effectExtent l="19050" t="19050" r="11430" b="15240"/>
             <wp:docPr id="1339339132" name="Picture 1"/>
@@ -6984,7 +6946,28 @@
       </w:r>
       <w:bookmarkEnd w:id="14"/>
     </w:p>
-    <w:p/>
+    <w:p>
+      <w:pPr>
+        <w:ind w:firstLine="720"/>
+      </w:pPr>
+      <w:r>
+        <w:t xml:space="preserve">The contemporary urban landscape is characterized by an ever-increasing reliance on public transportation systems. This reliance is very critical for sustainable mobility and economic development as mentioned by </w:t>
+      </w:r>
+      <w:r>
+        <w:rPr>
+          <w:noProof/>
+          <w:lang w:val="en-US"/>
+        </w:rPr>
+        <w:t>Lu et al. (2020). The effective management and optimization of these systems are intrinsically linked to the availability and analysis of vast amounts of data. It then collectively forms a complex transit data ecosystem (Ge et al., 2021). These ecosystems encompass a multitude of data sources, generating high-volume, diverse-format, and variable-rate data. Keller et al. (2022) claims that these generated data offer significant potential for understanding and improving public transport services.</w:t>
+      </w:r>
+      <w:r>
+        <w:rPr>
+          <w:noProof/>
+          <w:lang w:val="en-US"/>
+        </w:rPr>
+        <w:t xml:space="preserve"> Nevertheless, the inherent complexity and heterogeneity of these data also introduce substantial challenges. Amir et al. (2025) highlighted that data quality, noise, and the presence of extreme anomalies, particularly in spatiotemporal contexts are among the problems to address. To develop a robust predictive models and informed decision-making in urban transit planning, it is paramount to tackle the challenges mentioned.</w:t>
+      </w:r>
+    </w:p>
     <w:p>
       <w:pPr>
         <w:pStyle w:val="Heading3"/>
@@ -7116,6 +7099,7 @@
           <w:szCs w:val="24"/>
           <w:u w:val="single"/>
         </w:rPr>
+        <w:lastRenderedPageBreak/>
         <w:t>Evolution from Traditional to DL Models</w:t>
       </w:r>
       <w:bookmarkEnd w:id="18"/>
@@ -7262,7 +7246,6 @@
           <w:szCs w:val="24"/>
           <w:u w:val="single"/>
         </w:rPr>
-        <w:lastRenderedPageBreak/>
         <w:t>AI</w:t>
       </w:r>
       <w:r>
@@ -7459,6 +7442,7 @@
           <w:szCs w:val="24"/>
           <w:u w:val="single"/>
         </w:rPr>
+        <w:lastRenderedPageBreak/>
         <w:t>Methodology</w:t>
       </w:r>
       <w:bookmarkEnd w:id="27"/>
@@ -7764,7 +7748,28 @@
           <w:iCs/>
           <w:noProof/>
         </w:rPr>
-        <w:t xml:space="preserve">IEEE </w:t>
+        <w:t>IEEE Transactions on Intelligent Transportation Systems, 23</w:t>
+      </w:r>
+      <w:r>
+        <w:rPr>
+          <w:noProof/>
+        </w:rPr>
+        <w:t>(7), 6950 - 6962. doi:10.1109/TITS.2021.3065404</w:t>
+      </w:r>
+    </w:p>
+    <w:p>
+      <w:pPr>
+        <w:pStyle w:val="Bibliography"/>
+        <w:ind w:left="720" w:hanging="720"/>
+        <w:rPr>
+          <w:noProof/>
+        </w:rPr>
+      </w:pPr>
+      <w:r>
+        <w:rPr>
+          <w:noProof/>
+        </w:rPr>
+        <w:t xml:space="preserve">Ge, L., Sarhani, M., Voss, S., &amp; Xie, L. (16 October, 2021). Review of Transit Data Sources: Potentials, Challenges and Complementarity. </w:t>
       </w:r>
       <w:r>
         <w:rPr>
@@ -7772,14 +7777,13 @@
           <w:iCs/>
           <w:noProof/>
         </w:rPr>
-        <w:lastRenderedPageBreak/>
-        <w:t>Transactions on Intelligent Transportation Systems, 23</w:t>
-      </w:r>
-      <w:r>
-        <w:rPr>
-          <w:noProof/>
-        </w:rPr>
-        <w:t>(7), 6950 - 6962. doi:10.1109/TITS.2021.3065404</w:t>
+        <w:t>Sustainability, 13</w:t>
+      </w:r>
+      <w:r>
+        <w:rPr>
+          <w:noProof/>
+        </w:rPr>
+        <w:t>(20), 11450. doi:10.3390/su132011450</w:t>
       </w:r>
     </w:p>
     <w:p>
@@ -7794,7 +7798,7 @@
         <w:rPr>
           <w:noProof/>
         </w:rPr>
-        <w:t xml:space="preserve">Ge, L., Sarhani, M., Voss, S., &amp; Xie, L. (16 October, 2021). Review of Transit Data Sources: Potentials, Challenges and Complementarity. </w:t>
+        <w:t xml:space="preserve">Hassan, M., Mahin, H. D., Ahmed, F., Hassan, M. M., Rahaman, A., &amp; Abdullah, M. (4 July, 2025). Assessing Public Transit Network Efficiency and Accessibility in Johor Bahru and Penang, Malaysia: A Data-driven Approach. </w:t>
       </w:r>
       <w:r>
         <w:rPr>
@@ -7802,13 +7806,13 @@
           <w:iCs/>
           <w:noProof/>
         </w:rPr>
-        <w:t>Sustainability, 13</w:t>
-      </w:r>
-      <w:r>
-        <w:rPr>
-          <w:noProof/>
-        </w:rPr>
-        <w:t>(20), 11450. doi:10.3390/su132011450</w:t>
+        <w:t>Results in Engineering, 27</w:t>
+      </w:r>
+      <w:r>
+        <w:rPr>
+          <w:noProof/>
+        </w:rPr>
+        <w:t>, 106126. doi:10.1016/j.rineng.2025.106126</w:t>
       </w:r>
     </w:p>
     <w:p>
@@ -7823,7 +7827,7 @@
         <w:rPr>
           <w:noProof/>
         </w:rPr>
-        <w:t xml:space="preserve">Hassan, M., Mahin, H. D., Ahmed, F., Hassan, M. M., Rahaman, A., &amp; Abdullah, M. (4 July, 2025). Assessing Public Transit Network Efficiency and Accessibility in Johor Bahru and Penang, Malaysia: A Data-driven Approach. </w:t>
+        <w:t xml:space="preserve">Ibrahim, A. N., Borhan, M. N., Osman, M. H., Yazid, M. R., &amp; Rohani, M. M. (24 June, 2022). The Influence of Service Quality on User's Perceived Satisfaction with Light Rail Transit Service in Klang Valley, Malaysia. </w:t>
       </w:r>
       <w:r>
         <w:rPr>
@@ -7831,13 +7835,13 @@
           <w:iCs/>
           <w:noProof/>
         </w:rPr>
-        <w:t>Results in Engineering, 27</w:t>
-      </w:r>
-      <w:r>
-        <w:rPr>
-          <w:noProof/>
-        </w:rPr>
-        <w:t>, 106126. doi:10.1016/j.rineng.2025.106126</w:t>
+        <w:t>Mathematics, 10</w:t>
+      </w:r>
+      <w:r>
+        <w:rPr>
+          <w:noProof/>
+        </w:rPr>
+        <w:t>, 2213. doi:10.3390/math10132213</w:t>
       </w:r>
     </w:p>
     <w:p>
@@ -7852,7 +7856,8 @@
         <w:rPr>
           <w:noProof/>
         </w:rPr>
-        <w:t xml:space="preserve">Ibrahim, A. N., Borhan, M. N., Osman, M. H., Yazid, M. R., &amp; Rohani, M. M. (24 June, 2022). The Influence of Service Quality on User's Perceived Satisfaction with Light Rail Transit Service in Klang Valley, Malaysia. </w:t>
+        <w:lastRenderedPageBreak/>
+        <w:t xml:space="preserve">Lu, K., Liu, J., Zhou, X., &amp; Han, B. (19 February, 2020). A Review of Big Data Applications in Urban Transit Systems. </w:t>
       </w:r>
       <w:r>
         <w:rPr>
@@ -7860,13 +7865,13 @@
           <w:iCs/>
           <w:noProof/>
         </w:rPr>
-        <w:t>Mathematics, 10</w:t>
-      </w:r>
-      <w:r>
-        <w:rPr>
-          <w:noProof/>
-        </w:rPr>
-        <w:t>, 2213. doi:10.3390/math10132213</w:t>
+        <w:t>IEEE Transactions on Intelligent Transportation Systems, 22</w:t>
+      </w:r>
+      <w:r>
+        <w:rPr>
+          <w:noProof/>
+        </w:rPr>
+        <w:t>(5), 2535-2552. doi:10.1109/TITS.2020.2973365</w:t>
       </w:r>
     </w:p>
     <w:p>
@@ -7881,7 +7886,7 @@
         <w:rPr>
           <w:noProof/>
         </w:rPr>
-        <w:t xml:space="preserve">Lu, K., Liu, J., Zhou, X., &amp; Han, B. (19 February, 2020). A Review of Big Data Applications in Urban Transit Systems. </w:t>
+        <w:t xml:space="preserve">Lv, Z., Li, J., Dong, C., Li, H., &amp; Xu, Z. (29 June, 2021). Deep Learning in the COVID-19 epidemic: A deep model for urban traffic revitalization index. </w:t>
       </w:r>
       <w:r>
         <w:rPr>
@@ -7889,13 +7894,13 @@
           <w:iCs/>
           <w:noProof/>
         </w:rPr>
-        <w:t>IEEE Transactions on Intelligent Transportation Systems, 22</w:t>
-      </w:r>
-      <w:r>
-        <w:rPr>
-          <w:noProof/>
-        </w:rPr>
-        <w:t>(5), 2535-2552. doi:10.1109/TITS.2020.2973365</w:t>
+        <w:t>Data &amp; Knowledge Engineering, 135</w:t>
+      </w:r>
+      <w:r>
+        <w:rPr>
+          <w:noProof/>
+        </w:rPr>
+        <w:t>, 101912. doi:10.1016/j.datak.2021.101912</w:t>
       </w:r>
     </w:p>
     <w:p>
@@ -7910,7 +7915,7 @@
         <w:rPr>
           <w:noProof/>
         </w:rPr>
-        <w:t xml:space="preserve">Lv, Z., Li, J., Dong, C., Li, H., &amp; Xu, Z. (29 June, 2021). Deep Learning in the COVID-19 epidemic: A deep model for urban traffic revitalization index. </w:t>
+        <w:t xml:space="preserve">Mee, C. K., Subramaniam, G., Ating, R., &amp; Separa, L. A. (30 September, 2022). Willingness to use Public Transport in Kuala Lumpur &amp; Manila. </w:t>
       </w:r>
       <w:r>
         <w:rPr>
@@ -7918,13 +7923,13 @@
           <w:iCs/>
           <w:noProof/>
         </w:rPr>
-        <w:t>Data &amp; Knowledge Engineering, 135</w:t>
-      </w:r>
-      <w:r>
-        <w:rPr>
-          <w:noProof/>
-        </w:rPr>
-        <w:t>, 101912. doi:10.1016/j.datak.2021.101912</w:t>
+        <w:t>Environment-Behaviour Proceedings Journal, 7</w:t>
+      </w:r>
+      <w:r>
+        <w:rPr>
+          <w:noProof/>
+        </w:rPr>
+        <w:t>(21), 1 - 9. doi:10.21834/ebpj.v7i21.3751</w:t>
       </w:r>
     </w:p>
     <w:p>
@@ -7939,7 +7944,7 @@
         <w:rPr>
           <w:noProof/>
         </w:rPr>
-        <w:t xml:space="preserve">Mee, C. K., Subramaniam, G., Ating, R., &amp; Separa, L. A. (30 September, 2022). Willingness to use Public Transport in Kuala Lumpur &amp; Manila. </w:t>
+        <w:t xml:space="preserve">Mohamed, A. H., Adwan, I. A., Ahmeda, A. G., Hrtemih, H., &amp; Al-MSari, H. (25 April, 2021). Identification of Affecting Factors on the Travel Time Reliability for Bus Transportation. </w:t>
       </w:r>
       <w:r>
         <w:rPr>
@@ -7947,13 +7952,13 @@
           <w:iCs/>
           <w:noProof/>
         </w:rPr>
-        <w:t>Environment-Behaviour Proceedings Journal, 7</w:t>
-      </w:r>
-      <w:r>
-        <w:rPr>
-          <w:noProof/>
-        </w:rPr>
-        <w:t>(21), 1 - 9. doi:10.21834/ebpj.v7i21.3751</w:t>
+        <w:t>Knowledge-based Engineering and Science, 2</w:t>
+      </w:r>
+      <w:r>
+        <w:rPr>
+          <w:noProof/>
+        </w:rPr>
+        <w:t>(1), 19 - 30. doi:10.51526/kbes.2021.2.1.19-30</w:t>
       </w:r>
     </w:p>
     <w:p>
@@ -7968,7 +7973,7 @@
         <w:rPr>
           <w:noProof/>
         </w:rPr>
-        <w:t xml:space="preserve">Mohamed, A. H., Adwan, I. A., Ahmeda, A. G., Hrtemih, H., &amp; Al-MSari, H. (25 April, 2021). Identification of Affecting Factors on the Travel Time Reliability for Bus Transportation. </w:t>
+        <w:t xml:space="preserve">Rezapour, M., &amp; Ferraro, F. R. (16 June, 2021). Rail Transport Delay and Its Effects on the Perceived Importance of a Real-time Information. </w:t>
       </w:r>
       <w:r>
         <w:rPr>
@@ -7976,13 +7981,13 @@
           <w:iCs/>
           <w:noProof/>
         </w:rPr>
-        <w:t>Knowledge-based Engineering and Science, 2</w:t>
-      </w:r>
-      <w:r>
-        <w:rPr>
-          <w:noProof/>
-        </w:rPr>
-        <w:t>(1), 19 - 30. doi:10.51526/kbes.2021.2.1.19-30</w:t>
+        <w:t>Frontiers in Psychology, 12</w:t>
+      </w:r>
+      <w:r>
+        <w:rPr>
+          <w:noProof/>
+        </w:rPr>
+        <w:t>, 1 - 11. doi:10.3389/fpsyg.2021.619308</w:t>
       </w:r>
     </w:p>
     <w:p>
@@ -7997,7 +8002,7 @@
         <w:rPr>
           <w:noProof/>
         </w:rPr>
-        <w:t xml:space="preserve">Rezapour, M., &amp; Ferraro, F. R. (16 June, 2021). Rail Transport Delay and Its Effects on the Perceived Importance of a Real-time Information. </w:t>
+        <w:t xml:space="preserve">Sogbe, E., Susilawati, S., &amp; Tan, C. P. (26 September, 2024). Scaling up public transport usage: a systematic literature review of service quality, satisfaction and attitude towards bus transport systems in developing countries. </w:t>
       </w:r>
       <w:r>
         <w:rPr>
@@ -8005,13 +8010,13 @@
           <w:iCs/>
           <w:noProof/>
         </w:rPr>
-        <w:t>Frontiers in Psychology, 12</w:t>
-      </w:r>
-      <w:r>
-        <w:rPr>
-          <w:noProof/>
-        </w:rPr>
-        <w:t>, 1 - 11. doi:10.3389/fpsyg.2021.619308</w:t>
+        <w:t>Public Transport, 17</w:t>
+      </w:r>
+      <w:r>
+        <w:rPr>
+          <w:noProof/>
+        </w:rPr>
+        <w:t>, 1 - 44. doi:10.1007/s12469-024-00367-6</w:t>
       </w:r>
     </w:p>
     <w:p>
@@ -8026,8 +8031,7 @@
         <w:rPr>
           <w:noProof/>
         </w:rPr>
-        <w:lastRenderedPageBreak/>
-        <w:t xml:space="preserve">Sogbe, E., Susilawati, S., &amp; Tan, C. P. (26 September, 2024). Scaling up public transport usage: a systematic literature review of service quality, satisfaction and attitude towards bus transport systems in developing countries. </w:t>
+        <w:t xml:space="preserve">Ubaidillah, N. Z., Sa'ad, N. H., Ismail, F., Nordin, N. A., Baharuddin, N., &amp; Hassam, M. K. (June, 2022). The Impact of Public Bus Service Quality on the Users’ Satisfaction: Evidence from a Developing Asian City. </w:t>
       </w:r>
       <w:r>
         <w:rPr>
@@ -8035,13 +8039,13 @@
           <w:iCs/>
           <w:noProof/>
         </w:rPr>
-        <w:t>Public Transport, 17</w:t>
-      </w:r>
-      <w:r>
-        <w:rPr>
-          <w:noProof/>
-        </w:rPr>
-        <w:t>, 1 - 44. doi:10.1007/s12469-024-00367-6</w:t>
+        <w:t>Review of Applied Socio-Economic Research, 23</w:t>
+      </w:r>
+      <w:r>
+        <w:rPr>
+          <w:noProof/>
+        </w:rPr>
+        <w:t>(1), 83 - 96. doi:10.54609/reaser.v23i1.185</w:t>
       </w:r>
     </w:p>
     <w:p>
@@ -8056,7 +8060,7 @@
         <w:rPr>
           <w:noProof/>
         </w:rPr>
-        <w:t xml:space="preserve">Ubaidillah, N. Z., Sa'ad, N. H., Ismail, F., Nordin, N. A., Baharuddin, N., &amp; Hassam, M. K. (June, 2022). The Impact of Public Bus Service Quality on the Users’ Satisfaction: Evidence from a Developing Asian City. </w:t>
+        <w:t xml:space="preserve">Wang, J., Liu, C., Wu, Z., Liao, R., Li, G., &amp; Lu, H. (March, 2025). The Roadmap and Strategy for Prioritizing the Development of Public Transport in China. </w:t>
       </w:r>
       <w:r>
         <w:rPr>
@@ -8064,13 +8068,13 @@
           <w:iCs/>
           <w:noProof/>
         </w:rPr>
-        <w:t>Review of Applied Socio-Economic Research, 23</w:t>
-      </w:r>
-      <w:r>
-        <w:rPr>
-          <w:noProof/>
-        </w:rPr>
-        <w:t>(1), 83 - 96. doi:10.54609/reaser.v23i1.185</w:t>
+        <w:t>Multimodal Transportation, 4</w:t>
+      </w:r>
+      <w:r>
+        <w:rPr>
+          <w:noProof/>
+        </w:rPr>
+        <w:t>(1), 100184. doi:10.1016/j.multra.2024.100184</w:t>
       </w:r>
     </w:p>
     <w:p>
@@ -8085,7 +8089,7 @@
         <w:rPr>
           <w:noProof/>
         </w:rPr>
-        <w:t xml:space="preserve">Wang, J., Liu, C., Wu, Z., Liao, R., Li, G., &amp; Lu, H. (March, 2025). The Roadmap and Strategy for Prioritizing the Development of Public Transport in China. </w:t>
+        <w:t xml:space="preserve">Zhao, M., &amp; Lan, C.-L. (Novemeber, 2025). Modeling Travel Time Reliability for Non-Interstate National Highway System Routes. </w:t>
       </w:r>
       <w:r>
         <w:rPr>
@@ -8093,42 +8097,20 @@
           <w:iCs/>
           <w:noProof/>
         </w:rPr>
-        <w:t>Multimodal Transportation, 4</w:t>
-      </w:r>
-      <w:r>
-        <w:rPr>
-          <w:noProof/>
-        </w:rPr>
-        <w:t>(1), 100184. doi:10.1016/j.multra.2024.100184</w:t>
-      </w:r>
-    </w:p>
-    <w:p>
-      <w:pPr>
-        <w:pStyle w:val="Bibliography"/>
-        <w:ind w:left="720" w:hanging="720"/>
-        <w:rPr>
-          <w:noProof/>
-        </w:rPr>
-      </w:pPr>
-      <w:r>
-        <w:rPr>
-          <w:noProof/>
-        </w:rPr>
-        <w:t xml:space="preserve">Zhao, M., &amp; Lan, C.-L. (Novemeber, 2025). Modeling Travel Time Reliability for Non-Interstate National Highway System Routes. </w:t>
-      </w:r>
-      <w:r>
-        <w:rPr>
-          <w:i/>
-          <w:iCs/>
-          <w:noProof/>
-        </w:rPr>
         <w:t>Virginia Transportation Research Council</w:t>
       </w:r>
       <w:r>
         <w:rPr>
           <w:noProof/>
         </w:rPr>
-        <w:t>, 1 - 68. Retrieved from https://vtrc.virginia.gov/media/vtrc/vtrc-pdf/vtrc-pdf/26-R23.pdf</w:t>
+        <w:t xml:space="preserve">, </w:t>
+      </w:r>
+      <w:r>
+        <w:rPr>
+          <w:noProof/>
+        </w:rPr>
+        <w:lastRenderedPageBreak/>
+        <w:t>1 - 68. Retrieved from https://vtrc.virginia.gov/media/vtrc/vtrc-pdf/vtrc-pdf/26-R23.pdf</w:t>
       </w:r>
     </w:p>
     <w:p>
@@ -11221,7 +11203,7 @@
     <b:Volume>22</b:Volume>
     <b:Issue>5</b:Issue>
     <b:DOI>10.1109/TITS.2020.2973365</b:DOI>
-    <b:RefOrder>1</b:RefOrder>
+    <b:RefOrder>2</b:RefOrder>
   </b:Source>
   <b:Source>
     <b:Tag>Nur25</b:Tag>
@@ -11267,7 +11249,7 @@
     <b:Volume>23</b:Volume>
     <b:Issue>6</b:Issue>
     <b:DOI>10.21837/pm.v23i39.1913</b:DOI>
-    <b:RefOrder>2</b:RefOrder>
+    <b:RefOrder>1</b:RefOrder>
   </b:Source>
   <b:Source>
     <b:Tag>Jin25</b:Tag>
@@ -11745,11 +11727,49 @@
     <b:DOI>10.1016/j.rineng.2025.106126</b:DOI>
     <b:RefOrder>14</b:RefOrder>
   </b:Source>
+  <b:Source>
+    <b:Tag>Chr22</b:Tag>
+    <b:SourceType>JournalArticle</b:SourceType>
+    <b:Guid>{D650A653-75C2-40F8-B236-E2991F00322B}</b:Guid>
+    <b:Title>Investigating the Potential of Data Science Methods for Sustainable Public Transport</b:Title>
+    <b:JournalName>Sustainability</b:JournalName>
+    <b:Year>2022</b:Year>
+    <b:Pages>4211</b:Pages>
+    <b:Author>
+      <b:Author>
+        <b:NameList>
+          <b:Person>
+            <b:Last>Keller</b:Last>
+            <b:First>Christine</b:First>
+          </b:Person>
+          <b:Person>
+            <b:Last>Gluck</b:Last>
+            <b:First>Felix</b:First>
+          </b:Person>
+          <b:Person>
+            <b:Last>Gerlach</b:Last>
+            <b:First>Carl</b:First>
+            <b:Middle>Friedrich</b:Middle>
+          </b:Person>
+          <b:Person>
+            <b:Last>Schlegel</b:Last>
+            <b:First>Thomas</b:First>
+          </b:Person>
+        </b:NameList>
+      </b:Author>
+    </b:Author>
+    <b:Month>April</b:Month>
+    <b:Day>1</b:Day>
+    <b:Publisher>MDPI</b:Publisher>
+    <b:Volume>14</b:Volume>
+    <b:DOI>10.3390/su14074211</b:DOI>
+    <b:RefOrder>15</b:RefOrder>
+  </b:Source>
 </b:Sources>
 </file>
 
 <file path=customXml/itemProps1.xml><?xml version="1.0" encoding="utf-8"?>
-<ds:datastoreItem xmlns:ds="http://schemas.openxmlformats.org/officeDocument/2006/customXml" ds:itemID="{898980CC-CB89-40C5-9EB9-355FDC39CAB7}">
+<ds:datastoreItem xmlns:ds="http://schemas.openxmlformats.org/officeDocument/2006/customXml" ds:itemID="{C1A319B0-B27B-49F0-8829-1330F2255BE9}">
   <ds:schemaRefs>
     <ds:schemaRef ds:uri="http://schemas.openxmlformats.org/officeDocument/2006/bibliography"/>
   </ds:schemaRefs>

</xml_diff>

<commit_message>
perf: :ambulance: Added overfitting/underfitting check on all 30 models
</commit_message>
<xml_diff>
--- a/docs/24202141_p1_report.docx
+++ b/docs/24202141_p1_report.docx
@@ -4260,19 +4260,47 @@
         <w:rPr>
           <w:lang w:val="en-US"/>
         </w:rPr>
-        <w:t>Consequently, transit authorities face a critical bottleneck in optimizing schedules, routes, and intervals amid peak hours and holidays, thus increasing the unreliability of Malaysia’s public transit and dissatisfaction among passengers. To solve this problem, it requires a dual approach: (1) identify specific spatio-temporal factors that heavily influence the ridership trend in Malaysia’s public transit; (2) develop a robust predictive model capable of accurately</w:t>
-      </w:r>
+        <w:t xml:space="preserve">Consequently, transit authorities face a critical bottleneck in optimizing schedules, routes, and intervals amid peak hours and holidays, thus increasing the unreliability of Malaysia’s public transit and dissatisfaction among passengers. To solve this problem, it requires a dual approach: (1) identify specific </w:t>
+      </w:r>
+      <w:proofErr w:type="spellStart"/>
       <w:r>
         <w:rPr>
           <w:lang w:val="en-US"/>
         </w:rPr>
+        <w:t>spatio</w:t>
+      </w:r>
+      <w:proofErr w:type="spellEnd"/>
+      <w:r>
+        <w:rPr>
+          <w:lang w:val="en-US"/>
+        </w:rPr>
+        <w:t>-temporal factors that heavily influence the ridership trend in Malaysia’s public transit; (2) develop a robust predictive model capable of accurately</w:t>
+      </w:r>
+      <w:r>
+        <w:rPr>
+          <w:lang w:val="en-US"/>
+        </w:rPr>
         <w:t xml:space="preserve"> and consistently</w:t>
       </w:r>
       <w:r>
         <w:rPr>
           <w:lang w:val="en-US"/>
         </w:rPr>
-        <w:t xml:space="preserve"> forecasting daily ridership trends based on these identified spatio-temporal features.</w:t>
+        <w:t xml:space="preserve"> forecasting daily ridership trends based on these identified </w:t>
+      </w:r>
+      <w:proofErr w:type="spellStart"/>
+      <w:r>
+        <w:rPr>
+          <w:lang w:val="en-US"/>
+        </w:rPr>
+        <w:t>spatio</w:t>
+      </w:r>
+      <w:proofErr w:type="spellEnd"/>
+      <w:r>
+        <w:rPr>
+          <w:lang w:val="en-US"/>
+        </w:rPr>
+        <w:t>-temporal features.</w:t>
       </w:r>
     </w:p>
     <w:p>
@@ -5227,6 +5255,7 @@
             <w:r>
               <w:t xml:space="preserve">); </w:t>
             </w:r>
+            <w:proofErr w:type="spellStart"/>
             <w:r>
               <w:rPr>
                 <w:b/>
@@ -5234,6 +5263,7 @@
               </w:rPr>
               <w:t>Autoformer</w:t>
             </w:r>
+            <w:proofErr w:type="spellEnd"/>
             <w:r>
               <w:t xml:space="preserve">; </w:t>
             </w:r>
@@ -6347,11 +6377,19 @@
                 <w:lang w:val="en-US"/>
               </w:rPr>
             </w:pPr>
+            <w:proofErr w:type="spellStart"/>
             <w:r>
               <w:rPr>
                 <w:lang w:val="en-US"/>
               </w:rPr>
-              <w:t>Sogbe et al. (2024)</w:t>
+              <w:t>Sogbe</w:t>
+            </w:r>
+            <w:proofErr w:type="spellEnd"/>
+            <w:r>
+              <w:rPr>
+                <w:lang w:val="en-US"/>
+              </w:rPr>
+              <w:t xml:space="preserve"> et al. (2024)</w:t>
             </w:r>
           </w:p>
         </w:tc>
@@ -6996,6 +7034,237 @@
       </w:r>
       <w:bookmarkEnd w:id="15"/>
     </w:p>
+    <w:p>
+      <w:pPr>
+        <w:ind w:firstLine="720"/>
+      </w:pPr>
+      <w:r>
+        <w:t>According to Ge et al. (2021), the t</w:t>
+      </w:r>
+      <w:r>
+        <w:t>ransit data ecosystems are rich and multifaceted</w:t>
+      </w:r>
+      <w:r>
+        <w:t>.</w:t>
+      </w:r>
+      <w:r>
+        <w:t xml:space="preserve"> </w:t>
+      </w:r>
+      <w:r>
+        <w:t>It d</w:t>
+      </w:r>
+      <w:r>
+        <w:t>raw</w:t>
+      </w:r>
+      <w:r>
+        <w:t>s</w:t>
+      </w:r>
+      <w:r>
+        <w:t xml:space="preserve"> information from both endogenous and exogenous sources</w:t>
+      </w:r>
+      <w:r>
+        <w:t xml:space="preserve">. </w:t>
+      </w:r>
+    </w:p>
+    <w:p>
+      <w:pPr>
+        <w:ind w:firstLine="720"/>
+      </w:pPr>
+      <w:r>
+        <w:t>Endogenous data are typically generated and directly accessible by transit agencies through their operational systems. Key endogenous sources include:</w:t>
+      </w:r>
+    </w:p>
+    <w:p>
+      <w:pPr>
+        <w:pStyle w:val="ListParagraph"/>
+        <w:numPr>
+          <w:ilvl w:val="0"/>
+          <w:numId w:val="17"/>
+        </w:numPr>
+      </w:pPr>
+      <w:r>
+        <w:rPr>
+          <w:b/>
+          <w:bCs/>
+        </w:rPr>
+        <w:lastRenderedPageBreak/>
+        <w:t>Automated Fare Collection (AFC) Systems</w:t>
+      </w:r>
+      <w:r>
+        <w:t>: These systems record passenger boarding and alighting information</w:t>
+      </w:r>
+      <w:r>
+        <w:t>.</w:t>
+      </w:r>
+      <w:r>
+        <w:t xml:space="preserve"> </w:t>
+      </w:r>
+      <w:r>
+        <w:t>It pr</w:t>
+      </w:r>
+      <w:r>
+        <w:t>ovid</w:t>
+      </w:r>
+      <w:r>
+        <w:t>es</w:t>
+      </w:r>
+      <w:r>
+        <w:t xml:space="preserve"> insights into ridership patterns, origin-destination matrices, and fare revenue</w:t>
+      </w:r>
+      <w:r>
+        <w:rPr>
+          <w:noProof/>
+          <w:lang w:val="en-US"/>
+        </w:rPr>
+        <w:t xml:space="preserve"> (Ge et al., 2021).</w:t>
+      </w:r>
+    </w:p>
+    <w:p>
+      <w:pPr>
+        <w:pStyle w:val="ListParagraph"/>
+        <w:numPr>
+          <w:ilvl w:val="0"/>
+          <w:numId w:val="17"/>
+        </w:numPr>
+      </w:pPr>
+      <w:r>
+        <w:rPr>
+          <w:b/>
+          <w:bCs/>
+        </w:rPr>
+        <w:t>Automated Vehicle Location (AVL) Systems</w:t>
+      </w:r>
+      <w:r>
+        <w:t xml:space="preserve">: AVL systems provide real-time location, speed, and schedule adherence data for individual vehicles. </w:t>
+      </w:r>
+      <w:r>
+        <w:t>It mainly u</w:t>
+      </w:r>
+      <w:r>
+        <w:t>tiliz</w:t>
+      </w:r>
+      <w:r>
+        <w:t>es</w:t>
+      </w:r>
+      <w:r>
+        <w:t xml:space="preserve"> GPS</w:t>
+      </w:r>
+      <w:r>
+        <w:t xml:space="preserve">, </w:t>
+      </w:r>
+      <w:r>
+        <w:t>signpost and odometer interpolation.</w:t>
+      </w:r>
+      <w:r>
+        <w:t xml:space="preserve"> </w:t>
+      </w:r>
+      <w:r>
+        <w:t xml:space="preserve">This data is crucial for monitoring service performance, predicting arrival times, and managing fleet operations </w:t>
+      </w:r>
+      <w:r>
+        <w:rPr>
+          <w:noProof/>
+          <w:lang w:val="en-US"/>
+        </w:rPr>
+        <w:t>(</w:t>
+      </w:r>
+      <w:r>
+        <w:rPr>
+          <w:noProof/>
+          <w:lang w:val="en-US"/>
+        </w:rPr>
+        <w:t xml:space="preserve">Ge et al., 2021; </w:t>
+      </w:r>
+      <w:r>
+        <w:rPr>
+          <w:noProof/>
+          <w:lang w:val="en-US"/>
+        </w:rPr>
+        <w:t>Liu et al., 2025)</w:t>
+      </w:r>
+      <w:r>
+        <w:t>.</w:t>
+      </w:r>
+    </w:p>
+    <w:p>
+      <w:pPr>
+        <w:pStyle w:val="ListParagraph"/>
+        <w:numPr>
+          <w:ilvl w:val="0"/>
+          <w:numId w:val="17"/>
+        </w:numPr>
+      </w:pPr>
+      <w:r>
+        <w:rPr>
+          <w:b/>
+          <w:bCs/>
+        </w:rPr>
+        <w:t xml:space="preserve">Automated Passenger Counting </w:t>
+      </w:r>
+      <w:r>
+        <w:rPr>
+          <w:b/>
+          <w:bCs/>
+        </w:rPr>
+        <w:t>(APC) Systems</w:t>
+      </w:r>
+      <w:r>
+        <w:t>: APC systems</w:t>
+      </w:r>
+      <w:r>
+        <w:t xml:space="preserve"> are integrated in </w:t>
+      </w:r>
+      <w:r>
+        <w:t>vehicles,</w:t>
+      </w:r>
+      <w:r>
+        <w:t xml:space="preserve"> and it</w:t>
+      </w:r>
+      <w:r>
+        <w:t xml:space="preserve"> accurately count passengers boarding and alighting. It offers detailed ridership statistics that complement AFC data and help assess vehicle occupancy (Ge et al., 2021).</w:t>
+      </w:r>
+    </w:p>
+    <w:p>
+      <w:pPr>
+        <w:pStyle w:val="ListParagraph"/>
+        <w:numPr>
+          <w:ilvl w:val="0"/>
+          <w:numId w:val="17"/>
+        </w:numPr>
+      </w:pPr>
+      <w:r>
+        <w:rPr>
+          <w:b/>
+          <w:bCs/>
+        </w:rPr>
+        <w:t>Vehicle Sensors and Systems</w:t>
+      </w:r>
+      <w:r>
+        <w:t xml:space="preserve">: Modern transit vehicles are equipped with various sensors that monitor operational parameters. For instance, engine performance, fuel consumption, door open/close events etc. These data contribute to maintenance scheduling and operational efficiency (Liu et al., 2025). </w:t>
+      </w:r>
+    </w:p>
+    <w:p>
+      <w:pPr>
+        <w:pStyle w:val="ListParagraph"/>
+        <w:numPr>
+          <w:ilvl w:val="0"/>
+          <w:numId w:val="17"/>
+        </w:numPr>
+      </w:pPr>
+      <w:r>
+        <w:rPr>
+          <w:b/>
+          <w:bCs/>
+        </w:rPr>
+        <w:t>GTFS Data</w:t>
+      </w:r>
+      <w:r>
+        <w:t xml:space="preserve">: </w:t>
+      </w:r>
+      <w:r>
+        <w:t>While often static, GTFS provides standardized information on routes, schedules, stops, and fares. It forms the foundational layer for many transit information systems and applications (Ge et al., 2021).</w:t>
+      </w:r>
+    </w:p>
     <w:p/>
     <w:p>
       <w:pPr>
@@ -7099,7 +7368,6 @@
           <w:szCs w:val="24"/>
           <w:u w:val="single"/>
         </w:rPr>
-        <w:lastRenderedPageBreak/>
         <w:t>Evolution from Traditional to DL Models</w:t>
       </w:r>
       <w:bookmarkEnd w:id="18"/>
@@ -7197,6 +7465,7 @@
           <w:szCs w:val="24"/>
           <w:u w:val="single"/>
         </w:rPr>
+        <w:lastRenderedPageBreak/>
         <w:t xml:space="preserve">Benchmarking </w:t>
       </w:r>
       <w:r>
@@ -7442,7 +7711,6 @@
           <w:szCs w:val="24"/>
           <w:u w:val="single"/>
         </w:rPr>
-        <w:lastRenderedPageBreak/>
         <w:t>Methodology</w:t>
       </w:r>
       <w:bookmarkEnd w:id="27"/>
@@ -7740,6 +8008,7 @@
         <w:rPr>
           <w:noProof/>
         </w:rPr>
+        <w:lastRenderedPageBreak/>
         <w:t xml:space="preserve">Chen, P., Fu, X., &amp; Wang, X. (7 July, 2022). A Graph Convolutional Stacked Bidirectional Unidirectional-LSTM Neural Network for Metro Ridership Prediction. </w:t>
       </w:r>
       <w:r>
@@ -7856,7 +8125,6 @@
         <w:rPr>
           <w:noProof/>
         </w:rPr>
-        <w:lastRenderedPageBreak/>
         <w:t xml:space="preserve">Lu, K., Liu, J., Zhou, X., &amp; Han, B. (19 February, 2020). A Review of Big Data Applications in Urban Transit Systems. </w:t>
       </w:r>
       <w:r>
@@ -7973,6 +8241,7 @@
         <w:rPr>
           <w:noProof/>
         </w:rPr>
+        <w:lastRenderedPageBreak/>
         <w:t xml:space="preserve">Rezapour, M., &amp; Ferraro, F. R. (16 June, 2021). Rail Transport Delay and Its Effects on the Perceived Importance of a Real-time Information. </w:t>
       </w:r>
       <w:r>
@@ -8103,14 +8372,7 @@
         <w:rPr>
           <w:noProof/>
         </w:rPr>
-        <w:t xml:space="preserve">, </w:t>
-      </w:r>
-      <w:r>
-        <w:rPr>
-          <w:noProof/>
-        </w:rPr>
-        <w:lastRenderedPageBreak/>
-        <w:t>1 - 68. Retrieved from https://vtrc.virginia.gov/media/vtrc/vtrc-pdf/vtrc-pdf/26-R23.pdf</w:t>
+        <w:t>, 1 - 68. Retrieved from https://vtrc.virginia.gov/media/vtrc/vtrc-pdf/vtrc-pdf/26-R23.pdf</w:t>
       </w:r>
     </w:p>
     <w:p>
@@ -8700,6 +8962,119 @@
     </w:lvl>
   </w:abstractNum>
   <w:abstractNum w:abstractNumId="5" w15:restartNumberingAfterBreak="0">
+    <w:nsid w:val="19CE31B7"/>
+    <w:multiLevelType w:val="hybridMultilevel"/>
+    <w:tmpl w:val="CF907BCC"/>
+    <w:lvl w:ilvl="0" w:tplc="44090001">
+      <w:start w:val="1"/>
+      <w:numFmt w:val="bullet"/>
+      <w:lvlText w:val=""/>
+      <w:lvlJc w:val="left"/>
+      <w:pPr>
+        <w:ind w:left="720" w:hanging="360"/>
+      </w:pPr>
+      <w:rPr>
+        <w:rFonts w:ascii="Symbol" w:hAnsi="Symbol" w:hint="default"/>
+      </w:rPr>
+    </w:lvl>
+    <w:lvl w:ilvl="1" w:tplc="44090003" w:tentative="1">
+      <w:start w:val="1"/>
+      <w:numFmt w:val="bullet"/>
+      <w:lvlText w:val="o"/>
+      <w:lvlJc w:val="left"/>
+      <w:pPr>
+        <w:ind w:left="1440" w:hanging="360"/>
+      </w:pPr>
+      <w:rPr>
+        <w:rFonts w:ascii="Courier New" w:hAnsi="Courier New" w:cs="Courier New" w:hint="default"/>
+      </w:rPr>
+    </w:lvl>
+    <w:lvl w:ilvl="2" w:tplc="44090005" w:tentative="1">
+      <w:start w:val="1"/>
+      <w:numFmt w:val="bullet"/>
+      <w:lvlText w:val=""/>
+      <w:lvlJc w:val="left"/>
+      <w:pPr>
+        <w:ind w:left="2160" w:hanging="360"/>
+      </w:pPr>
+      <w:rPr>
+        <w:rFonts w:ascii="Wingdings" w:hAnsi="Wingdings" w:hint="default"/>
+      </w:rPr>
+    </w:lvl>
+    <w:lvl w:ilvl="3" w:tplc="44090001" w:tentative="1">
+      <w:start w:val="1"/>
+      <w:numFmt w:val="bullet"/>
+      <w:lvlText w:val=""/>
+      <w:lvlJc w:val="left"/>
+      <w:pPr>
+        <w:ind w:left="2880" w:hanging="360"/>
+      </w:pPr>
+      <w:rPr>
+        <w:rFonts w:ascii="Symbol" w:hAnsi="Symbol" w:hint="default"/>
+      </w:rPr>
+    </w:lvl>
+    <w:lvl w:ilvl="4" w:tplc="44090003" w:tentative="1">
+      <w:start w:val="1"/>
+      <w:numFmt w:val="bullet"/>
+      <w:lvlText w:val="o"/>
+      <w:lvlJc w:val="left"/>
+      <w:pPr>
+        <w:ind w:left="3600" w:hanging="360"/>
+      </w:pPr>
+      <w:rPr>
+        <w:rFonts w:ascii="Courier New" w:hAnsi="Courier New" w:cs="Courier New" w:hint="default"/>
+      </w:rPr>
+    </w:lvl>
+    <w:lvl w:ilvl="5" w:tplc="44090005" w:tentative="1">
+      <w:start w:val="1"/>
+      <w:numFmt w:val="bullet"/>
+      <w:lvlText w:val=""/>
+      <w:lvlJc w:val="left"/>
+      <w:pPr>
+        <w:ind w:left="4320" w:hanging="360"/>
+      </w:pPr>
+      <w:rPr>
+        <w:rFonts w:ascii="Wingdings" w:hAnsi="Wingdings" w:hint="default"/>
+      </w:rPr>
+    </w:lvl>
+    <w:lvl w:ilvl="6" w:tplc="44090001" w:tentative="1">
+      <w:start w:val="1"/>
+      <w:numFmt w:val="bullet"/>
+      <w:lvlText w:val=""/>
+      <w:lvlJc w:val="left"/>
+      <w:pPr>
+        <w:ind w:left="5040" w:hanging="360"/>
+      </w:pPr>
+      <w:rPr>
+        <w:rFonts w:ascii="Symbol" w:hAnsi="Symbol" w:hint="default"/>
+      </w:rPr>
+    </w:lvl>
+    <w:lvl w:ilvl="7" w:tplc="44090003" w:tentative="1">
+      <w:start w:val="1"/>
+      <w:numFmt w:val="bullet"/>
+      <w:lvlText w:val="o"/>
+      <w:lvlJc w:val="left"/>
+      <w:pPr>
+        <w:ind w:left="5760" w:hanging="360"/>
+      </w:pPr>
+      <w:rPr>
+        <w:rFonts w:ascii="Courier New" w:hAnsi="Courier New" w:cs="Courier New" w:hint="default"/>
+      </w:rPr>
+    </w:lvl>
+    <w:lvl w:ilvl="8" w:tplc="44090005" w:tentative="1">
+      <w:start w:val="1"/>
+      <w:numFmt w:val="bullet"/>
+      <w:lvlText w:val=""/>
+      <w:lvlJc w:val="left"/>
+      <w:pPr>
+        <w:ind w:left="6480" w:hanging="360"/>
+      </w:pPr>
+      <w:rPr>
+        <w:rFonts w:ascii="Wingdings" w:hAnsi="Wingdings" w:hint="default"/>
+      </w:rPr>
+    </w:lvl>
+  </w:abstractNum>
+  <w:abstractNum w:abstractNumId="6" w15:restartNumberingAfterBreak="0">
     <w:nsid w:val="206A4D7B"/>
     <w:multiLevelType w:val="hybridMultilevel"/>
     <w:tmpl w:val="68EEF4B0"/>
@@ -8788,7 +9163,7 @@
       </w:pPr>
     </w:lvl>
   </w:abstractNum>
-  <w:abstractNum w:abstractNumId="6" w15:restartNumberingAfterBreak="0">
+  <w:abstractNum w:abstractNumId="7" w15:restartNumberingAfterBreak="0">
     <w:nsid w:val="224E535D"/>
     <w:multiLevelType w:val="hybridMultilevel"/>
     <w:tmpl w:val="C47A0DB4"/>
@@ -8877,7 +9252,7 @@
       </w:pPr>
     </w:lvl>
   </w:abstractNum>
-  <w:abstractNum w:abstractNumId="7" w15:restartNumberingAfterBreak="0">
+  <w:abstractNum w:abstractNumId="8" w15:restartNumberingAfterBreak="0">
     <w:nsid w:val="22BA62DA"/>
     <w:multiLevelType w:val="multilevel"/>
     <w:tmpl w:val="4409001F"/>
@@ -8963,7 +9338,7 @@
       </w:pPr>
     </w:lvl>
   </w:abstractNum>
-  <w:abstractNum w:abstractNumId="8" w15:restartNumberingAfterBreak="0">
+  <w:abstractNum w:abstractNumId="9" w15:restartNumberingAfterBreak="0">
     <w:nsid w:val="2C864025"/>
     <w:multiLevelType w:val="multilevel"/>
     <w:tmpl w:val="4409001F"/>
@@ -9049,7 +9424,7 @@
       </w:pPr>
     </w:lvl>
   </w:abstractNum>
-  <w:abstractNum w:abstractNumId="9" w15:restartNumberingAfterBreak="0">
+  <w:abstractNum w:abstractNumId="10" w15:restartNumberingAfterBreak="0">
     <w:nsid w:val="391A47EE"/>
     <w:multiLevelType w:val="hybridMultilevel"/>
     <w:tmpl w:val="608C2FC8"/>
@@ -9138,7 +9513,7 @@
       </w:pPr>
     </w:lvl>
   </w:abstractNum>
-  <w:abstractNum w:abstractNumId="10" w15:restartNumberingAfterBreak="0">
+  <w:abstractNum w:abstractNumId="11" w15:restartNumberingAfterBreak="0">
     <w:nsid w:val="4AC53607"/>
     <w:multiLevelType w:val="hybridMultilevel"/>
     <w:tmpl w:val="CAB8B28C"/>
@@ -9227,7 +9602,7 @@
       </w:pPr>
     </w:lvl>
   </w:abstractNum>
-  <w:abstractNum w:abstractNumId="11" w15:restartNumberingAfterBreak="0">
+  <w:abstractNum w:abstractNumId="12" w15:restartNumberingAfterBreak="0">
     <w:nsid w:val="4C767CF7"/>
     <w:multiLevelType w:val="hybridMultilevel"/>
     <w:tmpl w:val="E006DF60"/>
@@ -9316,7 +9691,7 @@
       </w:pPr>
     </w:lvl>
   </w:abstractNum>
-  <w:abstractNum w:abstractNumId="12" w15:restartNumberingAfterBreak="0">
+  <w:abstractNum w:abstractNumId="13" w15:restartNumberingAfterBreak="0">
     <w:nsid w:val="576B70A5"/>
     <w:multiLevelType w:val="hybridMultilevel"/>
     <w:tmpl w:val="CBCCF546"/>
@@ -9429,7 +9804,7 @@
       </w:rPr>
     </w:lvl>
   </w:abstractNum>
-  <w:abstractNum w:abstractNumId="13" w15:restartNumberingAfterBreak="0">
+  <w:abstractNum w:abstractNumId="14" w15:restartNumberingAfterBreak="0">
     <w:nsid w:val="595C5C89"/>
     <w:multiLevelType w:val="hybridMultilevel"/>
     <w:tmpl w:val="BB58A9A2"/>
@@ -9519,7 +9894,7 @@
       </w:pPr>
     </w:lvl>
   </w:abstractNum>
-  <w:abstractNum w:abstractNumId="14" w15:restartNumberingAfterBreak="0">
+  <w:abstractNum w:abstractNumId="15" w15:restartNumberingAfterBreak="0">
     <w:nsid w:val="707B624C"/>
     <w:multiLevelType w:val="hybridMultilevel"/>
     <w:tmpl w:val="4066D8D2"/>
@@ -9608,7 +9983,7 @@
       </w:pPr>
     </w:lvl>
   </w:abstractNum>
-  <w:abstractNum w:abstractNumId="15" w15:restartNumberingAfterBreak="0">
+  <w:abstractNum w:abstractNumId="16" w15:restartNumberingAfterBreak="0">
     <w:nsid w:val="76C22FEC"/>
     <w:multiLevelType w:val="hybridMultilevel"/>
     <w:tmpl w:val="7D661E6A"/>
@@ -9698,31 +10073,31 @@
     </w:lvl>
   </w:abstractNum>
   <w:num w:numId="1" w16cid:durableId="422532857">
-    <w:abstractNumId w:val="6"/>
+    <w:abstractNumId w:val="7"/>
   </w:num>
   <w:num w:numId="2" w16cid:durableId="1890915732">
+    <w:abstractNumId w:val="13"/>
+  </w:num>
+  <w:num w:numId="3" w16cid:durableId="558782592">
     <w:abstractNumId w:val="12"/>
   </w:num>
-  <w:num w:numId="3" w16cid:durableId="558782592">
-    <w:abstractNumId w:val="11"/>
-  </w:num>
   <w:num w:numId="4" w16cid:durableId="291253581">
-    <w:abstractNumId w:val="14"/>
+    <w:abstractNumId w:val="15"/>
   </w:num>
   <w:num w:numId="5" w16cid:durableId="991061032">
     <w:abstractNumId w:val="0"/>
   </w:num>
   <w:num w:numId="6" w16cid:durableId="1289168179">
-    <w:abstractNumId w:val="15"/>
+    <w:abstractNumId w:val="16"/>
   </w:num>
   <w:num w:numId="7" w16cid:durableId="197862497">
+    <w:abstractNumId w:val="11"/>
+  </w:num>
+  <w:num w:numId="8" w16cid:durableId="551042543">
     <w:abstractNumId w:val="10"/>
   </w:num>
-  <w:num w:numId="8" w16cid:durableId="551042543">
-    <w:abstractNumId w:val="9"/>
-  </w:num>
   <w:num w:numId="9" w16cid:durableId="608927404">
-    <w:abstractNumId w:val="13"/>
+    <w:abstractNumId w:val="14"/>
   </w:num>
   <w:num w:numId="10" w16cid:durableId="495653598">
     <w:abstractNumId w:val="2"/>
@@ -9731,10 +10106,10 @@
     <w:abstractNumId w:val="3"/>
   </w:num>
   <w:num w:numId="12" w16cid:durableId="395125979">
-    <w:abstractNumId w:val="8"/>
+    <w:abstractNumId w:val="9"/>
   </w:num>
   <w:num w:numId="13" w16cid:durableId="791440515">
-    <w:abstractNumId w:val="5"/>
+    <w:abstractNumId w:val="6"/>
   </w:num>
   <w:num w:numId="14" w16cid:durableId="1409495815">
     <w:abstractNumId w:val="4"/>
@@ -9743,7 +10118,10 @@
     <w:abstractNumId w:val="1"/>
   </w:num>
   <w:num w:numId="16" w16cid:durableId="373818277">
-    <w:abstractNumId w:val="7"/>
+    <w:abstractNumId w:val="8"/>
+  </w:num>
+  <w:num w:numId="17" w16cid:durableId="543252947">
+    <w:abstractNumId w:val="5"/>
   </w:num>
 </w:numbering>
 </file>
@@ -11249,7 +11627,7 @@
     <b:Volume>23</b:Volume>
     <b:Issue>6</b:Issue>
     <b:DOI>10.21837/pm.v23i39.1913</b:DOI>
-    <b:RefOrder>1</b:RefOrder>
+    <b:RefOrder>3</b:RefOrder>
   </b:Source>
   <b:Source>
     <b:Tag>Jin25</b:Tag>
@@ -11294,7 +11672,7 @@
     <b:Volume>4</b:Volume>
     <b:Issue>1</b:Issue>
     <b:DOI>10.1016/j.multra.2024.100184</b:DOI>
-    <b:RefOrder>3</b:RefOrder>
+    <b:RefOrder>4</b:RefOrder>
   </b:Source>
   <b:Source>
     <b:Tag>Cho22</b:Tag>
@@ -11334,7 +11712,7 @@
     <b:Volume>7</b:Volume>
     <b:Issue>21</b:Issue>
     <b:DOI>10.21834/ebpj.v7i21.3751</b:DOI>
-    <b:RefOrder>4</b:RefOrder>
+    <b:RefOrder>5</b:RefOrder>
   </b:Source>
   <b:Source>
     <b:Tag>Pen22</b:Tag>
@@ -11368,7 +11746,7 @@
     <b:Volume>23</b:Volume>
     <b:Issue>7</b:Issue>
     <b:DOI>10.1109/TITS.2021.3065404</b:DOI>
-    <b:RefOrder>5</b:RefOrder>
+    <b:RefOrder>6</b:RefOrder>
   </b:Source>
   <b:Source>
     <b:Tag>Lip21</b:Tag>
@@ -11406,7 +11784,7 @@
     <b:Volume>13</b:Volume>
     <b:Issue>20</b:Issue>
     <b:DOI>10.3390/su132011450</b:DOI>
-    <b:RefOrder>6</b:RefOrder>
+    <b:RefOrder>7</b:RefOrder>
   </b:Source>
   <b:Source>
     <b:Tag>MoZ25</b:Tag>
@@ -11433,7 +11811,7 @@
     <b:Month>Novemeber</b:Month>
     <b:Publisher>VTRC</b:Publisher>
     <b:URL>https://vtrc.virginia.gov/media/vtrc/vtrc-pdf/vtrc-pdf/26-R23.pdf</b:URL>
-    <b:RefOrder>7</b:RefOrder>
+    <b:RefOrder>8</b:RefOrder>
   </b:Source>
   <b:Source>
     <b:Tag>Zhi</b:Tag>
@@ -11474,7 +11852,7 @@
     <b:Publisher>Elsevier</b:Publisher>
     <b:Volume>135</b:Volume>
     <b:DOI>10.1016/j.datak.2021.101912</b:DOI>
-    <b:RefOrder>8</b:RefOrder>
+    <b:RefOrder>9</b:RefOrder>
   </b:Source>
   <b:Source>
     <b:Tag>Sog24</b:Tag>
@@ -11508,7 +11886,7 @@
     <b:Publisher>Springer Nature Link</b:Publisher>
     <b:Volume>17</b:Volume>
     <b:DOI>10.1007/s12469-024-00367-6</b:DOI>
-    <b:RefOrder>9</b:RefOrder>
+    <b:RefOrder>10</b:RefOrder>
   </b:Source>
   <b:Source>
     <b:Tag>Ahm21</b:Tag>
@@ -11553,7 +11931,7 @@
     <b:Volume>2</b:Volume>
     <b:Issue>1</b:Issue>
     <b:DOI>10.51526/kbes.2021.2.1.19-30</b:DOI>
-    <b:RefOrder>10</b:RefOrder>
+    <b:RefOrder>11</b:RefOrder>
   </b:Source>
   <b:Source>
     <b:Tag>Ahm22</b:Tag>
@@ -11599,7 +11977,7 @@
     <b:Publisher>MDPI</b:Publisher>
     <b:Volume>10</b:Volume>
     <b:DOI>10.3390/math10132213</b:DOI>
-    <b:RefOrder>11</b:RefOrder>
+    <b:RefOrder>12</b:RefOrder>
   </b:Source>
   <b:Source>
     <b:Tag>Mah21</b:Tag>
@@ -11629,7 +12007,7 @@
     <b:Publisher>Frontiers</b:Publisher>
     <b:Volume>12</b:Volume>
     <b:DOI>10.3389/fpsyg.2021.619308</b:DOI>
-    <b:RefOrder>12</b:RefOrder>
+    <b:RefOrder>13</b:RefOrder>
   </b:Source>
   <b:Source>
     <b:Tag>Nur22</b:Tag>
@@ -11678,7 +12056,7 @@
     <b:Volume>23</b:Volume>
     <b:Issue>1</b:Issue>
     <b:DOI>10.54609/reaser.v23i1.185</b:DOI>
-    <b:RefOrder>13</b:RefOrder>
+    <b:RefOrder>14</b:RefOrder>
   </b:Source>
   <b:Source>
     <b:Tag>Mah25</b:Tag>
@@ -11725,7 +12103,7 @@
     <b:Publisher>Elsevier</b:Publisher>
     <b:Volume>27</b:Volume>
     <b:DOI>10.1016/j.rineng.2025.106126</b:DOI>
-    <b:RefOrder>14</b:RefOrder>
+    <b:RefOrder>15</b:RefOrder>
   </b:Source>
   <b:Source>
     <b:Tag>Chr22</b:Tag>
@@ -11763,13 +12141,57 @@
     <b:Publisher>MDPI</b:Publisher>
     <b:Volume>14</b:Volume>
     <b:DOI>10.3390/su14074211</b:DOI>
-    <b:RefOrder>15</b:RefOrder>
+    <b:RefOrder>16</b:RefOrder>
+  </b:Source>
+  <b:Source>
+    <b:Tag>Che25</b:Tag>
+    <b:SourceType>JournalArticle</b:SourceType>
+    <b:Guid>{15E68AD3-3C8F-48D7-9DC3-C5C355AF0F7E}</b:Guid>
+    <b:Title>Vehicle Trajectory Data Processing, Analytics and Applications: A Survey</b:Title>
+    <b:JournalName>ACM Comput. Surv.</b:JournalName>
+    <b:Year>2025</b:Year>
+    <b:Pages>1 - 36</b:Pages>
+    <b:Author>
+      <b:Author>
+        <b:NameList>
+          <b:Person>
+            <b:Last>Liu</b:Last>
+            <b:First>Chenxi</b:First>
+          </b:Person>
+          <b:Person>
+            <b:Last>Xiao</b:Last>
+            <b:First>Zhu</b:First>
+          </b:Person>
+          <b:Person>
+            <b:Last>Long</b:Last>
+            <b:First>Wangchen</b:First>
+          </b:Person>
+          <b:Person>
+            <b:Last>Li</b:Last>
+            <b:First>Tong</b:First>
+          </b:Person>
+          <b:Person>
+            <b:Last>Jiang</b:Last>
+            <b:First>Hongbo</b:First>
+          </b:Person>
+          <b:Person>
+            <b:Last>Li</b:Last>
+            <b:First>Keqin</b:First>
+          </b:Person>
+        </b:NameList>
+      </b:Author>
+    </b:Author>
+    <b:Month>May</b:Month>
+    <b:Volume>57</b:Volume>
+    <b:Issue>9</b:Issue>
+    <b:DOI>10.1145/3715902</b:DOI>
+    <b:RefOrder>1</b:RefOrder>
   </b:Source>
 </b:Sources>
 </file>
 
 <file path=customXml/itemProps1.xml><?xml version="1.0" encoding="utf-8"?>
-<ds:datastoreItem xmlns:ds="http://schemas.openxmlformats.org/officeDocument/2006/customXml" ds:itemID="{C1A319B0-B27B-49F0-8829-1330F2255BE9}">
+<ds:datastoreItem xmlns:ds="http://schemas.openxmlformats.org/officeDocument/2006/customXml" ds:itemID="{656EF3E9-74EC-4C48-B89E-36D61E2BC0DC}">
   <ds:schemaRefs>
     <ds:schemaRef ds:uri="http://schemas.openxmlformats.org/officeDocument/2006/bibliography"/>
   </ds:schemaRefs>

</xml_diff>

<commit_message>
feat: :sparkles: Remove TFT, updated HMT-TSF SHAP scripts
</commit_message>
<xml_diff>
--- a/docs/24202141_p1_report.docx
+++ b/docs/24202141_p1_report.docx
@@ -3867,7 +3867,7 @@
         <w:rPr>
           <w:noProof/>
         </w:rPr>
-        <w:t xml:space="preserve"> Mee et al., (2022), </w:t>
+        <w:t xml:space="preserve"> Mee et al. (2022), </w:t>
       </w:r>
       <w:r>
         <w:rPr>
@@ -5970,15 +5970,15 @@
         <w:tblLook w:val="04A0" w:firstRow="1" w:lastRow="0" w:firstColumn="1" w:lastColumn="0" w:noHBand="0" w:noVBand="1"/>
       </w:tblPr>
       <w:tblGrid>
-        <w:gridCol w:w="1838"/>
-        <w:gridCol w:w="2827"/>
-        <w:gridCol w:w="2396"/>
-        <w:gridCol w:w="1955"/>
+        <w:gridCol w:w="1555"/>
+        <w:gridCol w:w="2693"/>
+        <w:gridCol w:w="2551"/>
+        <w:gridCol w:w="2217"/>
       </w:tblGrid>
       <w:tr>
         <w:tc>
           <w:tcPr>
-            <w:tcW w:w="1838" w:type="dxa"/>
+            <w:tcW w:w="1555" w:type="dxa"/>
             <w:shd w:val="clear" w:color="auto" w:fill="C1E4F5" w:themeFill="accent1" w:themeFillTint="33"/>
           </w:tcPr>
           <w:p>
@@ -6002,7 +6002,7 @@
         </w:tc>
         <w:tc>
           <w:tcPr>
-            <w:tcW w:w="2827" w:type="dxa"/>
+            <w:tcW w:w="2693" w:type="dxa"/>
             <w:shd w:val="clear" w:color="auto" w:fill="C1E4F5" w:themeFill="accent1" w:themeFillTint="33"/>
           </w:tcPr>
           <w:p>
@@ -6026,7 +6026,7 @@
         </w:tc>
         <w:tc>
           <w:tcPr>
-            <w:tcW w:w="2396" w:type="dxa"/>
+            <w:tcW w:w="2551" w:type="dxa"/>
             <w:shd w:val="clear" w:color="auto" w:fill="C1E4F5" w:themeFill="accent1" w:themeFillTint="33"/>
           </w:tcPr>
           <w:p>
@@ -6050,7 +6050,7 @@
         </w:tc>
         <w:tc>
           <w:tcPr>
-            <w:tcW w:w="1955" w:type="dxa"/>
+            <w:tcW w:w="2217" w:type="dxa"/>
             <w:shd w:val="clear" w:color="auto" w:fill="C1E4F5" w:themeFill="accent1" w:themeFillTint="33"/>
           </w:tcPr>
           <w:p>
@@ -6076,7 +6076,7 @@
       <w:tr>
         <w:tc>
           <w:tcPr>
-            <w:tcW w:w="1838" w:type="dxa"/>
+            <w:tcW w:w="1555" w:type="dxa"/>
             <w:shd w:val="clear" w:color="auto" w:fill="F2F2F2" w:themeFill="background1" w:themeFillShade="F2"/>
           </w:tcPr>
           <w:p>
@@ -6095,7 +6095,7 @@
         </w:tc>
         <w:tc>
           <w:tcPr>
-            <w:tcW w:w="2827" w:type="dxa"/>
+            <w:tcW w:w="2693" w:type="dxa"/>
           </w:tcPr>
           <w:p>
             <w:pPr>
@@ -6114,7 +6114,7 @@
         </w:tc>
         <w:tc>
           <w:tcPr>
-            <w:tcW w:w="2396" w:type="dxa"/>
+            <w:tcW w:w="2551" w:type="dxa"/>
           </w:tcPr>
           <w:p>
             <w:pPr>
@@ -6133,7 +6133,7 @@
         </w:tc>
         <w:tc>
           <w:tcPr>
-            <w:tcW w:w="1955" w:type="dxa"/>
+            <w:tcW w:w="2217" w:type="dxa"/>
           </w:tcPr>
           <w:p>
             <w:pPr>
@@ -6154,7 +6154,7 @@
       <w:tr>
         <w:tc>
           <w:tcPr>
-            <w:tcW w:w="1838" w:type="dxa"/>
+            <w:tcW w:w="1555" w:type="dxa"/>
             <w:shd w:val="clear" w:color="auto" w:fill="F2F2F2" w:themeFill="background1" w:themeFillShade="F2"/>
           </w:tcPr>
           <w:p>
@@ -6174,7 +6174,7 @@
         </w:tc>
         <w:tc>
           <w:tcPr>
-            <w:tcW w:w="2827" w:type="dxa"/>
+            <w:tcW w:w="2693" w:type="dxa"/>
           </w:tcPr>
           <w:p>
             <w:pPr>
@@ -6193,7 +6193,7 @@
         </w:tc>
         <w:tc>
           <w:tcPr>
-            <w:tcW w:w="2396" w:type="dxa"/>
+            <w:tcW w:w="2551" w:type="dxa"/>
           </w:tcPr>
           <w:p>
             <w:pPr>
@@ -6212,7 +6212,7 @@
         </w:tc>
         <w:tc>
           <w:tcPr>
-            <w:tcW w:w="1955" w:type="dxa"/>
+            <w:tcW w:w="2217" w:type="dxa"/>
           </w:tcPr>
           <w:p>
             <w:pPr>
@@ -6233,7 +6233,7 @@
       <w:tr>
         <w:tc>
           <w:tcPr>
-            <w:tcW w:w="1838" w:type="dxa"/>
+            <w:tcW w:w="1555" w:type="dxa"/>
             <w:shd w:val="clear" w:color="auto" w:fill="F2F2F2" w:themeFill="background1" w:themeFillShade="F2"/>
           </w:tcPr>
           <w:p>
@@ -6252,7 +6252,7 @@
         </w:tc>
         <w:tc>
           <w:tcPr>
-            <w:tcW w:w="2827" w:type="dxa"/>
+            <w:tcW w:w="2693" w:type="dxa"/>
           </w:tcPr>
           <w:p>
             <w:pPr>
@@ -6271,7 +6271,7 @@
         </w:tc>
         <w:tc>
           <w:tcPr>
-            <w:tcW w:w="2396" w:type="dxa"/>
+            <w:tcW w:w="2551" w:type="dxa"/>
           </w:tcPr>
           <w:p>
             <w:pPr>
@@ -6290,7 +6290,7 @@
         </w:tc>
         <w:tc>
           <w:tcPr>
-            <w:tcW w:w="1955" w:type="dxa"/>
+            <w:tcW w:w="2217" w:type="dxa"/>
           </w:tcPr>
           <w:p>
             <w:pPr>
@@ -6311,7 +6311,7 @@
       <w:tr>
         <w:tc>
           <w:tcPr>
-            <w:tcW w:w="1838" w:type="dxa"/>
+            <w:tcW w:w="1555" w:type="dxa"/>
             <w:shd w:val="clear" w:color="auto" w:fill="F2F2F2" w:themeFill="background1" w:themeFillShade="F2"/>
           </w:tcPr>
           <w:p>
@@ -6330,7 +6330,7 @@
         </w:tc>
         <w:tc>
           <w:tcPr>
-            <w:tcW w:w="2827" w:type="dxa"/>
+            <w:tcW w:w="2693" w:type="dxa"/>
           </w:tcPr>
           <w:p>
             <w:pPr>
@@ -6349,7 +6349,7 @@
         </w:tc>
         <w:tc>
           <w:tcPr>
-            <w:tcW w:w="2396" w:type="dxa"/>
+            <w:tcW w:w="2551" w:type="dxa"/>
           </w:tcPr>
           <w:p>
             <w:pPr>
@@ -6368,7 +6368,7 @@
         </w:tc>
         <w:tc>
           <w:tcPr>
-            <w:tcW w:w="1955" w:type="dxa"/>
+            <w:tcW w:w="2217" w:type="dxa"/>
           </w:tcPr>
           <w:p>
             <w:pPr>
@@ -6704,7 +6704,7 @@
         </w:rPr>
         <w:lastRenderedPageBreak/>
         <w:drawing>
-          <wp:inline distT="0" distB="0" distL="0" distR="0" wp14:anchorId="125BB2D3" wp14:editId="69E25D08">
+          <wp:inline distT="0" distB="0" distL="0" distR="0" wp14:anchorId="125BB2D3" wp14:editId="5CE7E8B4">
             <wp:extent cx="5722620" cy="4290060"/>
             <wp:effectExtent l="19050" t="19050" r="11430" b="15240"/>
             <wp:docPr id="1339339132" name="Picture 1"/>
@@ -7039,7 +7039,13 @@
         <w:ind w:firstLine="720"/>
       </w:pPr>
       <w:r>
-        <w:t>According to Ge et al. (2021), the t</w:t>
+        <w:t>Ge et al. (2021)</w:t>
+      </w:r>
+      <w:r>
+        <w:t xml:space="preserve"> mentioned that</w:t>
+      </w:r>
+      <w:r>
+        <w:t xml:space="preserve"> the t</w:t>
       </w:r>
       <w:r>
         <w:t>ransit data ecosystems are rich and multifaceted</w:t>
@@ -7071,7 +7077,72 @@
         <w:ind w:firstLine="720"/>
       </w:pPr>
       <w:r>
-        <w:t>Endogenous data are typically generated and directly accessible by transit agencies through their operational systems. Key endogenous sources include:</w:t>
+        <w:t xml:space="preserve">Endogenous data are typically generated and directly accessible by transit agencies through their operational systems. </w:t>
+      </w:r>
+      <w:r>
+        <w:t xml:space="preserve">According to </w:t>
+      </w:r>
+      <w:r>
+        <w:rPr>
+          <w:noProof/>
+          <w:lang w:val="en-US"/>
+        </w:rPr>
+        <w:t xml:space="preserve">Ge et al. </w:t>
+      </w:r>
+      <w:r>
+        <w:rPr>
+          <w:noProof/>
+          <w:lang w:val="en-US"/>
+        </w:rPr>
+        <w:t>(</w:t>
+      </w:r>
+      <w:r>
+        <w:rPr>
+          <w:noProof/>
+          <w:lang w:val="en-US"/>
+        </w:rPr>
+        <w:t>2021</w:t>
+      </w:r>
+      <w:r>
+        <w:rPr>
+          <w:noProof/>
+          <w:lang w:val="en-US"/>
+        </w:rPr>
+        <w:t>) and</w:t>
+      </w:r>
+      <w:r>
+        <w:rPr>
+          <w:noProof/>
+          <w:lang w:val="en-US"/>
+        </w:rPr>
+        <w:t xml:space="preserve"> Liu et al. </w:t>
+      </w:r>
+      <w:r>
+        <w:rPr>
+          <w:noProof/>
+          <w:lang w:val="en-US"/>
+        </w:rPr>
+        <w:t>(</w:t>
+      </w:r>
+      <w:r>
+        <w:rPr>
+          <w:noProof/>
+          <w:lang w:val="en-US"/>
+        </w:rPr>
+        <w:t>2025)</w:t>
+      </w:r>
+      <w:r>
+        <w:rPr>
+          <w:noProof/>
+          <w:lang w:val="en-US"/>
+        </w:rPr>
+        <w:t xml:space="preserve">, </w:t>
+      </w:r>
+      <w:r>
+        <w:t>k</w:t>
+      </w:r>
+      <w:r>
+        <w:t>ey endogenous sources include:</w:t>
       </w:r>
     </w:p>
     <w:p>
@@ -7116,7 +7187,7 @@
           <w:noProof/>
           <w:lang w:val="en-US"/>
         </w:rPr>
-        <w:t xml:space="preserve"> (Ge et al., 2021).</w:t>
+        <w:t>.</w:t>
       </w:r>
     </w:p>
     <w:p>
@@ -7138,49 +7209,16 @@
         <w:t xml:space="preserve">: AVL systems provide real-time location, speed, and schedule adherence data for individual vehicles. </w:t>
       </w:r>
       <w:r>
-        <w:t>It mainly u</w:t>
-      </w:r>
-      <w:r>
-        <w:t>tiliz</w:t>
-      </w:r>
-      <w:r>
-        <w:t>es</w:t>
-      </w:r>
-      <w:r>
-        <w:t xml:space="preserve"> GPS</w:t>
+        <w:t>It mainly utilizes GPS</w:t>
       </w:r>
       <w:r>
         <w:t xml:space="preserve">, </w:t>
       </w:r>
       <w:r>
-        <w:t>signpost and odometer interpolation.</w:t>
-      </w:r>
-      <w:r>
-        <w:t xml:space="preserve"> </w:t>
-      </w:r>
-      <w:r>
-        <w:t xml:space="preserve">This data is crucial for monitoring service performance, predicting arrival times, and managing fleet operations </w:t>
-      </w:r>
-      <w:r>
-        <w:rPr>
-          <w:noProof/>
-          <w:lang w:val="en-US"/>
-        </w:rPr>
-        <w:t>(</w:t>
-      </w:r>
-      <w:r>
-        <w:rPr>
-          <w:noProof/>
-          <w:lang w:val="en-US"/>
-        </w:rPr>
-        <w:t xml:space="preserve">Ge et al., 2021; </w:t>
-      </w:r>
-      <w:r>
-        <w:rPr>
-          <w:noProof/>
-          <w:lang w:val="en-US"/>
-        </w:rPr>
-        <w:t>Liu et al., 2025)</w:t>
+        <w:t xml:space="preserve">signpost and odometer interpolation. </w:t>
+      </w:r>
+      <w:r>
+        <w:t>This data is crucial for monitoring service performance, predicting arrival times, and managing fleet operations</w:t>
       </w:r>
       <w:r>
         <w:t>.</w:t>
@@ -7221,7 +7259,10 @@
         <w:t xml:space="preserve"> and it</w:t>
       </w:r>
       <w:r>
-        <w:t xml:space="preserve"> accurately count passengers boarding and alighting. It offers detailed ridership statistics that complement AFC data and help assess vehicle occupancy (Ge et al., 2021).</w:t>
+        <w:t xml:space="preserve"> accurately count passengers boarding and alighting. It offers detailed ridership statistics that complement AFC data and help assess vehicle occupancy</w:t>
+      </w:r>
+      <w:r>
+        <w:t>.</w:t>
       </w:r>
     </w:p>
     <w:p>
@@ -7240,7 +7281,10 @@
         <w:t>Vehicle Sensors and Systems</w:t>
       </w:r>
       <w:r>
-        <w:t xml:space="preserve">: Modern transit vehicles are equipped with various sensors that monitor operational parameters. For instance, engine performance, fuel consumption, door open/close events etc. These data contribute to maintenance scheduling and operational efficiency (Liu et al., 2025). </w:t>
+        <w:t>: Modern transit vehicles are equipped with various sensors that monitor operational parameters. For instance, engine performance, fuel consumption, door open/close events etc. These data contribute to maintenance scheduling and operational efficiency</w:t>
+      </w:r>
+      <w:r>
+        <w:t>.</w:t>
       </w:r>
     </w:p>
     <w:p>
@@ -7262,10 +7306,1052 @@
         <w:t xml:space="preserve">: </w:t>
       </w:r>
       <w:r>
-        <w:t>While often static, GTFS provides standardized information on routes, schedules, stops, and fares. It forms the foundational layer for many transit information systems and applications (Ge et al., 2021).</w:t>
+        <w:t>While often static, GTFS provides standardized information on routes, schedules, stops, and fares. It forms the foundational layer for many transit information systems and applications</w:t>
+      </w:r>
+      <w:r>
+        <w:t>.</w:t>
       </w:r>
     </w:p>
-    <w:p/>
+    <w:p>
+      <w:pPr>
+        <w:ind w:firstLine="720"/>
+        <w:rPr>
+          <w:lang w:val="en-US"/>
+        </w:rPr>
+      </w:pPr>
+      <w:r>
+        <w:rPr>
+          <w:lang w:val="en-US"/>
+        </w:rPr>
+        <w:t xml:space="preserve">Exogenous data, however, originates from external environments but significantly affects transit operations and passenger behavior. </w:t>
+      </w:r>
+      <w:r>
+        <w:rPr>
+          <w:lang w:val="en-US"/>
+        </w:rPr>
+        <w:t>According to Amir et al. (2025), k</w:t>
+      </w:r>
+      <w:r>
+        <w:rPr>
+          <w:lang w:val="en-US"/>
+        </w:rPr>
+        <w:t>ey exogenous sources include:</w:t>
+      </w:r>
+    </w:p>
+    <w:p>
+      <w:pPr>
+        <w:pStyle w:val="ListParagraph"/>
+        <w:numPr>
+          <w:ilvl w:val="0"/>
+          <w:numId w:val="18"/>
+        </w:numPr>
+        <w:rPr>
+          <w:lang w:val="en-US"/>
+        </w:rPr>
+      </w:pPr>
+      <w:r>
+        <w:rPr>
+          <w:b/>
+          <w:bCs/>
+          <w:lang w:val="en-US"/>
+        </w:rPr>
+        <w:t>Weather Data</w:t>
+      </w:r>
+      <w:r>
+        <w:rPr>
+          <w:lang w:val="en-US"/>
+        </w:rPr>
+        <w:t>: Conditions such as rain, temperature, and humidity can directly impact travel demand, vehicle speeds, and operational reliability</w:t>
+      </w:r>
+      <w:r>
+        <w:rPr>
+          <w:lang w:val="en-US"/>
+        </w:rPr>
+        <w:t>.</w:t>
+      </w:r>
+    </w:p>
+    <w:p>
+      <w:pPr>
+        <w:pStyle w:val="ListParagraph"/>
+        <w:numPr>
+          <w:ilvl w:val="0"/>
+          <w:numId w:val="18"/>
+        </w:numPr>
+        <w:rPr>
+          <w:lang w:val="en-US"/>
+        </w:rPr>
+      </w:pPr>
+      <w:r>
+        <w:rPr>
+          <w:b/>
+          <w:bCs/>
+          <w:lang w:val="en-US"/>
+        </w:rPr>
+        <w:t>Traffic Data</w:t>
+      </w:r>
+      <w:r>
+        <w:rPr>
+          <w:lang w:val="en-US"/>
+        </w:rPr>
+        <w:t>: Real-time and historical traffic information from road networks affects bus speeds and overall travel times, especially in mixed-traffic environments. Some passengers will travel to stations and park their vehicles then proceed to take rail transits as well</w:t>
+      </w:r>
+      <w:r>
+        <w:rPr>
+          <w:lang w:val="en-US"/>
+        </w:rPr>
+        <w:t>.</w:t>
+      </w:r>
+    </w:p>
+    <w:p>
+      <w:pPr>
+        <w:pStyle w:val="ListParagraph"/>
+        <w:numPr>
+          <w:ilvl w:val="0"/>
+          <w:numId w:val="18"/>
+        </w:numPr>
+        <w:rPr>
+          <w:lang w:val="en-US"/>
+        </w:rPr>
+      </w:pPr>
+      <w:r>
+        <w:rPr>
+          <w:b/>
+          <w:bCs/>
+          <w:lang w:val="en-US"/>
+        </w:rPr>
+        <w:t>POIs</w:t>
+      </w:r>
+      <w:r>
+        <w:rPr>
+          <w:lang w:val="en-US"/>
+        </w:rPr>
+        <w:t xml:space="preserve">: Locations of commercial, recreational, residential </w:t>
+      </w:r>
+      <w:r>
+        <w:rPr>
+          <w:lang w:val="en-US"/>
+        </w:rPr>
+        <w:t>can influence travel demand and passenger distribution across the transit networ</w:t>
+      </w:r>
+      <w:r>
+        <w:rPr>
+          <w:lang w:val="en-US"/>
+        </w:rPr>
+        <w:t>k.</w:t>
+      </w:r>
+    </w:p>
+    <w:p>
+      <w:pPr>
+        <w:pStyle w:val="ListParagraph"/>
+        <w:numPr>
+          <w:ilvl w:val="0"/>
+          <w:numId w:val="18"/>
+        </w:numPr>
+        <w:rPr>
+          <w:lang w:val="en-US"/>
+        </w:rPr>
+      </w:pPr>
+      <w:r>
+        <w:rPr>
+          <w:b/>
+          <w:bCs/>
+          <w:lang w:val="en-US"/>
+        </w:rPr>
+        <w:t>Demographic and Socio-economic Data</w:t>
+      </w:r>
+      <w:r>
+        <w:rPr>
+          <w:lang w:val="en-US"/>
+        </w:rPr>
+        <w:t>: Population density, income levels, employment centers are fundamental factors influencing long-term transit demand and plannin</w:t>
+      </w:r>
+      <w:r>
+        <w:rPr>
+          <w:lang w:val="en-US"/>
+        </w:rPr>
+        <w:t>g.</w:t>
+      </w:r>
+    </w:p>
+    <w:p>
+      <w:pPr>
+        <w:ind w:firstLine="720"/>
+        <w:rPr>
+          <w:lang w:val="en-US"/>
+        </w:rPr>
+      </w:pPr>
+      <w:r>
+        <w:rPr>
+          <w:lang w:val="en-US"/>
+        </w:rPr>
+        <w:lastRenderedPageBreak/>
+        <w:t xml:space="preserve">To have a holistic understanding of transit system performance and passenger needs, these endogenous and exogenous data sources are important. </w:t>
+      </w:r>
+    </w:p>
+    <w:tbl>
+      <w:tblPr>
+        <w:tblStyle w:val="TableGrid"/>
+        <w:tblW w:w="0" w:type="auto"/>
+        <w:tblLook w:val="04A0" w:firstRow="1" w:lastRow="0" w:firstColumn="1" w:lastColumn="0" w:noHBand="0" w:noVBand="1"/>
+      </w:tblPr>
+      <w:tblGrid>
+        <w:gridCol w:w="1403"/>
+        <w:gridCol w:w="2216"/>
+        <w:gridCol w:w="2582"/>
+        <w:gridCol w:w="2815"/>
+      </w:tblGrid>
+      <w:tr>
+        <w:tc>
+          <w:tcPr>
+            <w:tcW w:w="1403" w:type="dxa"/>
+            <w:shd w:val="clear" w:color="auto" w:fill="C1E4F5" w:themeFill="accent1" w:themeFillTint="33"/>
+          </w:tcPr>
+          <w:p>
+            <w:pPr>
+              <w:jc w:val="left"/>
+              <w:rPr>
+                <w:b/>
+                <w:bCs/>
+                <w:lang w:val="en-US"/>
+              </w:rPr>
+            </w:pPr>
+            <w:r>
+              <w:rPr>
+                <w:b/>
+                <w:bCs/>
+                <w:lang w:val="en-US"/>
+              </w:rPr>
+              <w:t xml:space="preserve">Category </w:t>
+            </w:r>
+          </w:p>
+        </w:tc>
+        <w:tc>
+          <w:tcPr>
+            <w:tcW w:w="2089" w:type="dxa"/>
+            <w:shd w:val="clear" w:color="auto" w:fill="C1E4F5" w:themeFill="accent1" w:themeFillTint="33"/>
+          </w:tcPr>
+          <w:p>
+            <w:pPr>
+              <w:jc w:val="left"/>
+              <w:rPr>
+                <w:b/>
+                <w:bCs/>
+                <w:lang w:val="en-US"/>
+              </w:rPr>
+            </w:pPr>
+            <w:r>
+              <w:rPr>
+                <w:b/>
+                <w:bCs/>
+                <w:lang w:val="en-US"/>
+              </w:rPr>
+              <w:t>Specific Examples</w:t>
+            </w:r>
+          </w:p>
+        </w:tc>
+        <w:tc>
+          <w:tcPr>
+            <w:tcW w:w="2646" w:type="dxa"/>
+            <w:shd w:val="clear" w:color="auto" w:fill="C1E4F5" w:themeFill="accent1" w:themeFillTint="33"/>
+          </w:tcPr>
+          <w:p>
+            <w:pPr>
+              <w:jc w:val="left"/>
+              <w:rPr>
+                <w:b/>
+                <w:bCs/>
+                <w:lang w:val="en-US"/>
+              </w:rPr>
+            </w:pPr>
+            <w:r>
+              <w:rPr>
+                <w:b/>
+                <w:bCs/>
+                <w:lang w:val="en-US"/>
+              </w:rPr>
+              <w:t>Typical Applications</w:t>
+            </w:r>
+          </w:p>
+        </w:tc>
+        <w:tc>
+          <w:tcPr>
+            <w:tcW w:w="2878" w:type="dxa"/>
+            <w:shd w:val="clear" w:color="auto" w:fill="C1E4F5" w:themeFill="accent1" w:themeFillTint="33"/>
+          </w:tcPr>
+          <w:p>
+            <w:pPr>
+              <w:jc w:val="left"/>
+              <w:rPr>
+                <w:b/>
+                <w:bCs/>
+                <w:lang w:val="en-US"/>
+              </w:rPr>
+            </w:pPr>
+            <w:r>
+              <w:rPr>
+                <w:b/>
+                <w:bCs/>
+                <w:lang w:val="en-US"/>
+              </w:rPr>
+              <w:t>Key Characteristics</w:t>
+            </w:r>
+          </w:p>
+        </w:tc>
+      </w:tr>
+      <w:tr>
+        <w:tc>
+          <w:tcPr>
+            <w:tcW w:w="1403" w:type="dxa"/>
+            <w:vMerge w:val="restart"/>
+            <w:shd w:val="clear" w:color="auto" w:fill="F2F2F2" w:themeFill="background1" w:themeFillShade="F2"/>
+          </w:tcPr>
+          <w:p>
+            <w:pPr>
+              <w:jc w:val="left"/>
+              <w:rPr>
+                <w:lang w:val="en-US"/>
+              </w:rPr>
+            </w:pPr>
+            <w:r>
+              <w:rPr>
+                <w:lang w:val="en-US"/>
+              </w:rPr>
+              <w:t>Endogenous</w:t>
+            </w:r>
+          </w:p>
+        </w:tc>
+        <w:tc>
+          <w:tcPr>
+            <w:tcW w:w="2089" w:type="dxa"/>
+          </w:tcPr>
+          <w:p>
+            <w:pPr>
+              <w:jc w:val="left"/>
+              <w:rPr>
+                <w:lang w:val="en-US"/>
+              </w:rPr>
+            </w:pPr>
+            <w:r>
+              <w:rPr>
+                <w:lang w:val="en-US"/>
+              </w:rPr>
+              <w:t>AFC Systems</w:t>
+            </w:r>
+          </w:p>
+        </w:tc>
+        <w:tc>
+          <w:tcPr>
+            <w:tcW w:w="2646" w:type="dxa"/>
+          </w:tcPr>
+          <w:p>
+            <w:pPr>
+              <w:jc w:val="left"/>
+              <w:rPr>
+                <w:lang w:val="en-US"/>
+              </w:rPr>
+            </w:pPr>
+            <w:r>
+              <w:rPr>
+                <w:lang w:val="en-US"/>
+              </w:rPr>
+              <w:t>Ridership analysis, origin-destination, revenue tracking</w:t>
+            </w:r>
+          </w:p>
+        </w:tc>
+        <w:tc>
+          <w:tcPr>
+            <w:tcW w:w="2878" w:type="dxa"/>
+          </w:tcPr>
+          <w:p>
+            <w:pPr>
+              <w:jc w:val="left"/>
+              <w:rPr>
+                <w:lang w:val="en-US"/>
+              </w:rPr>
+            </w:pPr>
+            <w:r>
+              <w:rPr>
+                <w:lang w:val="en-US"/>
+              </w:rPr>
+              <w:t>Transactional, passenger-centric</w:t>
+            </w:r>
+          </w:p>
+        </w:tc>
+      </w:tr>
+      <w:tr>
+        <w:tc>
+          <w:tcPr>
+            <w:tcW w:w="1403" w:type="dxa"/>
+            <w:vMerge/>
+            <w:shd w:val="clear" w:color="auto" w:fill="F2F2F2" w:themeFill="background1" w:themeFillShade="F2"/>
+          </w:tcPr>
+          <w:p>
+            <w:pPr>
+              <w:jc w:val="left"/>
+              <w:rPr>
+                <w:lang w:val="en-US"/>
+              </w:rPr>
+            </w:pPr>
+          </w:p>
+        </w:tc>
+        <w:tc>
+          <w:tcPr>
+            <w:tcW w:w="2089" w:type="dxa"/>
+          </w:tcPr>
+          <w:p>
+            <w:pPr>
+              <w:jc w:val="left"/>
+              <w:rPr>
+                <w:lang w:val="en-US"/>
+              </w:rPr>
+            </w:pPr>
+            <w:r>
+              <w:rPr>
+                <w:lang w:val="en-US"/>
+              </w:rPr>
+              <w:t>AVL Systems</w:t>
+            </w:r>
+          </w:p>
+        </w:tc>
+        <w:tc>
+          <w:tcPr>
+            <w:tcW w:w="2646" w:type="dxa"/>
+          </w:tcPr>
+          <w:p>
+            <w:pPr>
+              <w:jc w:val="left"/>
+              <w:rPr>
+                <w:lang w:val="en-US"/>
+              </w:rPr>
+            </w:pPr>
+            <w:r>
+              <w:rPr>
+                <w:lang w:val="en-US"/>
+              </w:rPr>
+              <w:t>Real-time tracking, schedule adherence, fleet management</w:t>
+            </w:r>
+          </w:p>
+        </w:tc>
+        <w:tc>
+          <w:tcPr>
+            <w:tcW w:w="2878" w:type="dxa"/>
+          </w:tcPr>
+          <w:p>
+            <w:pPr>
+              <w:jc w:val="left"/>
+              <w:rPr>
+                <w:lang w:val="en-US"/>
+              </w:rPr>
+            </w:pPr>
+            <w:r>
+              <w:rPr>
+                <w:lang w:val="en-US"/>
+              </w:rPr>
+              <w:t>Spatiotemporal, vehicle-centric</w:t>
+            </w:r>
+          </w:p>
+        </w:tc>
+      </w:tr>
+      <w:tr>
+        <w:tc>
+          <w:tcPr>
+            <w:tcW w:w="1403" w:type="dxa"/>
+            <w:vMerge/>
+            <w:shd w:val="clear" w:color="auto" w:fill="F2F2F2" w:themeFill="background1" w:themeFillShade="F2"/>
+          </w:tcPr>
+          <w:p>
+            <w:pPr>
+              <w:jc w:val="left"/>
+              <w:rPr>
+                <w:lang w:val="en-US"/>
+              </w:rPr>
+            </w:pPr>
+          </w:p>
+        </w:tc>
+        <w:tc>
+          <w:tcPr>
+            <w:tcW w:w="2089" w:type="dxa"/>
+          </w:tcPr>
+          <w:p>
+            <w:pPr>
+              <w:jc w:val="left"/>
+              <w:rPr>
+                <w:lang w:val="en-US"/>
+              </w:rPr>
+            </w:pPr>
+            <w:r>
+              <w:rPr>
+                <w:lang w:val="en-US"/>
+              </w:rPr>
+              <w:t>APC Systems</w:t>
+            </w:r>
+          </w:p>
+        </w:tc>
+        <w:tc>
+          <w:tcPr>
+            <w:tcW w:w="2646" w:type="dxa"/>
+          </w:tcPr>
+          <w:p>
+            <w:pPr>
+              <w:jc w:val="left"/>
+              <w:rPr>
+                <w:lang w:val="en-US"/>
+              </w:rPr>
+            </w:pPr>
+            <w:r>
+              <w:rPr>
+                <w:lang w:val="en-US"/>
+              </w:rPr>
+              <w:t>Occupancy rates, detailed ridership statistics</w:t>
+            </w:r>
+          </w:p>
+        </w:tc>
+        <w:tc>
+          <w:tcPr>
+            <w:tcW w:w="2878" w:type="dxa"/>
+          </w:tcPr>
+          <w:p>
+            <w:pPr>
+              <w:jc w:val="left"/>
+              <w:rPr>
+                <w:lang w:val="en-US"/>
+              </w:rPr>
+            </w:pPr>
+            <w:r>
+              <w:rPr>
+                <w:lang w:val="en-US"/>
+              </w:rPr>
+              <w:t>Discrete counts, vehicle-centric</w:t>
+            </w:r>
+          </w:p>
+        </w:tc>
+      </w:tr>
+      <w:tr>
+        <w:tc>
+          <w:tcPr>
+            <w:tcW w:w="1403" w:type="dxa"/>
+            <w:vMerge/>
+            <w:shd w:val="clear" w:color="auto" w:fill="F2F2F2" w:themeFill="background1" w:themeFillShade="F2"/>
+          </w:tcPr>
+          <w:p>
+            <w:pPr>
+              <w:jc w:val="left"/>
+              <w:rPr>
+                <w:lang w:val="en-US"/>
+              </w:rPr>
+            </w:pPr>
+          </w:p>
+        </w:tc>
+        <w:tc>
+          <w:tcPr>
+            <w:tcW w:w="2089" w:type="dxa"/>
+          </w:tcPr>
+          <w:p>
+            <w:pPr>
+              <w:jc w:val="left"/>
+              <w:rPr>
+                <w:lang w:val="en-US"/>
+              </w:rPr>
+            </w:pPr>
+            <w:r>
+              <w:rPr>
+                <w:lang w:val="en-US"/>
+              </w:rPr>
+              <w:t>Vehicle Sensors</w:t>
+            </w:r>
+          </w:p>
+        </w:tc>
+        <w:tc>
+          <w:tcPr>
+            <w:tcW w:w="2646" w:type="dxa"/>
+          </w:tcPr>
+          <w:p>
+            <w:pPr>
+              <w:jc w:val="left"/>
+              <w:rPr>
+                <w:lang w:val="en-US"/>
+              </w:rPr>
+            </w:pPr>
+            <w:r>
+              <w:rPr>
+                <w:lang w:val="en-US"/>
+              </w:rPr>
+              <w:t>Maintenance, operational efficiency</w:t>
+            </w:r>
+          </w:p>
+        </w:tc>
+        <w:tc>
+          <w:tcPr>
+            <w:tcW w:w="2878" w:type="dxa"/>
+          </w:tcPr>
+          <w:p>
+            <w:pPr>
+              <w:jc w:val="left"/>
+              <w:rPr>
+                <w:lang w:val="en-US"/>
+              </w:rPr>
+            </w:pPr>
+            <w:r>
+              <w:rPr>
+                <w:lang w:val="en-US"/>
+              </w:rPr>
+              <w:t>Real-time, diagnostic</w:t>
+            </w:r>
+          </w:p>
+        </w:tc>
+      </w:tr>
+      <w:tr>
+        <w:tc>
+          <w:tcPr>
+            <w:tcW w:w="1403" w:type="dxa"/>
+            <w:vMerge/>
+            <w:shd w:val="clear" w:color="auto" w:fill="F2F2F2" w:themeFill="background1" w:themeFillShade="F2"/>
+          </w:tcPr>
+          <w:p>
+            <w:pPr>
+              <w:jc w:val="left"/>
+              <w:rPr>
+                <w:lang w:val="en-US"/>
+              </w:rPr>
+            </w:pPr>
+          </w:p>
+        </w:tc>
+        <w:tc>
+          <w:tcPr>
+            <w:tcW w:w="2089" w:type="dxa"/>
+          </w:tcPr>
+          <w:p>
+            <w:pPr>
+              <w:jc w:val="left"/>
+              <w:rPr>
+                <w:lang w:val="en-US"/>
+              </w:rPr>
+            </w:pPr>
+            <w:r>
+              <w:rPr>
+                <w:lang w:val="en-US"/>
+              </w:rPr>
+              <w:t>GTFS Data</w:t>
+            </w:r>
+          </w:p>
+        </w:tc>
+        <w:tc>
+          <w:tcPr>
+            <w:tcW w:w="2646" w:type="dxa"/>
+          </w:tcPr>
+          <w:p>
+            <w:pPr>
+              <w:jc w:val="left"/>
+              <w:rPr>
+                <w:lang w:val="en-US"/>
+              </w:rPr>
+            </w:pPr>
+            <w:r>
+              <w:rPr>
+                <w:lang w:val="en-US"/>
+              </w:rPr>
+              <w:t>Route planning, schedule information, app development</w:t>
+            </w:r>
+          </w:p>
+        </w:tc>
+        <w:tc>
+          <w:tcPr>
+            <w:tcW w:w="2878" w:type="dxa"/>
+          </w:tcPr>
+          <w:p>
+            <w:pPr>
+              <w:jc w:val="left"/>
+              <w:rPr>
+                <w:lang w:val="en-US"/>
+              </w:rPr>
+            </w:pPr>
+            <w:r>
+              <w:rPr>
+                <w:lang w:val="en-US"/>
+              </w:rPr>
+              <w:t>Static, foundational</w:t>
+            </w:r>
+          </w:p>
+        </w:tc>
+      </w:tr>
+      <w:tr>
+        <w:tc>
+          <w:tcPr>
+            <w:tcW w:w="1403" w:type="dxa"/>
+            <w:vMerge w:val="restart"/>
+            <w:shd w:val="clear" w:color="auto" w:fill="F2F2F2" w:themeFill="background1" w:themeFillShade="F2"/>
+          </w:tcPr>
+          <w:p>
+            <w:pPr>
+              <w:jc w:val="left"/>
+              <w:rPr>
+                <w:lang w:val="en-US"/>
+              </w:rPr>
+            </w:pPr>
+            <w:r>
+              <w:rPr>
+                <w:lang w:val="en-US"/>
+              </w:rPr>
+              <w:t>Exogenous</w:t>
+            </w:r>
+          </w:p>
+        </w:tc>
+        <w:tc>
+          <w:tcPr>
+            <w:tcW w:w="2089" w:type="dxa"/>
+          </w:tcPr>
+          <w:p>
+            <w:pPr>
+              <w:jc w:val="left"/>
+              <w:rPr>
+                <w:lang w:val="en-US"/>
+              </w:rPr>
+            </w:pPr>
+            <w:r>
+              <w:rPr>
+                <w:lang w:val="en-US"/>
+              </w:rPr>
+              <w:t>Weather Data</w:t>
+            </w:r>
+          </w:p>
+        </w:tc>
+        <w:tc>
+          <w:tcPr>
+            <w:tcW w:w="2646" w:type="dxa"/>
+          </w:tcPr>
+          <w:p>
+            <w:pPr>
+              <w:jc w:val="left"/>
+              <w:rPr>
+                <w:lang w:val="en-US"/>
+              </w:rPr>
+            </w:pPr>
+            <w:r>
+              <w:rPr>
+                <w:lang w:val="en-US"/>
+              </w:rPr>
+              <w:t>Demand forecasting, operational adjustments</w:t>
+            </w:r>
+          </w:p>
+        </w:tc>
+        <w:tc>
+          <w:tcPr>
+            <w:tcW w:w="2878" w:type="dxa"/>
+          </w:tcPr>
+          <w:p>
+            <w:pPr>
+              <w:jc w:val="left"/>
+              <w:rPr>
+                <w:lang w:val="en-US"/>
+              </w:rPr>
+            </w:pPr>
+            <w:r>
+              <w:rPr>
+                <w:lang w:val="en-US"/>
+              </w:rPr>
+              <w:t>Environmental, dynamic</w:t>
+            </w:r>
+          </w:p>
+        </w:tc>
+      </w:tr>
+      <w:tr>
+        <w:tc>
+          <w:tcPr>
+            <w:tcW w:w="1403" w:type="dxa"/>
+            <w:vMerge/>
+            <w:shd w:val="clear" w:color="auto" w:fill="F2F2F2" w:themeFill="background1" w:themeFillShade="F2"/>
+          </w:tcPr>
+          <w:p>
+            <w:pPr>
+              <w:jc w:val="left"/>
+              <w:rPr>
+                <w:lang w:val="en-US"/>
+              </w:rPr>
+            </w:pPr>
+          </w:p>
+        </w:tc>
+        <w:tc>
+          <w:tcPr>
+            <w:tcW w:w="2089" w:type="dxa"/>
+          </w:tcPr>
+          <w:p>
+            <w:pPr>
+              <w:jc w:val="left"/>
+              <w:rPr>
+                <w:lang w:val="en-US"/>
+              </w:rPr>
+            </w:pPr>
+            <w:r>
+              <w:rPr>
+                <w:lang w:val="en-US"/>
+              </w:rPr>
+              <w:t>Traffic Data</w:t>
+            </w:r>
+          </w:p>
+        </w:tc>
+        <w:tc>
+          <w:tcPr>
+            <w:tcW w:w="2646" w:type="dxa"/>
+          </w:tcPr>
+          <w:p>
+            <w:pPr>
+              <w:jc w:val="left"/>
+              <w:rPr>
+                <w:lang w:val="en-US"/>
+              </w:rPr>
+            </w:pPr>
+            <w:r>
+              <w:rPr>
+                <w:lang w:val="en-US"/>
+              </w:rPr>
+              <w:t>Travel time prediction, congestion management</w:t>
+            </w:r>
+          </w:p>
+        </w:tc>
+        <w:tc>
+          <w:tcPr>
+            <w:tcW w:w="2878" w:type="dxa"/>
+          </w:tcPr>
+          <w:p>
+            <w:pPr>
+              <w:jc w:val="left"/>
+              <w:rPr>
+                <w:lang w:val="en-US"/>
+              </w:rPr>
+            </w:pPr>
+            <w:r>
+              <w:rPr>
+                <w:lang w:val="en-US"/>
+              </w:rPr>
+              <w:t>Real-time, network-wide</w:t>
+            </w:r>
+          </w:p>
+        </w:tc>
+      </w:tr>
+      <w:tr>
+        <w:tc>
+          <w:tcPr>
+            <w:tcW w:w="1403" w:type="dxa"/>
+            <w:vMerge/>
+            <w:shd w:val="clear" w:color="auto" w:fill="F2F2F2" w:themeFill="background1" w:themeFillShade="F2"/>
+          </w:tcPr>
+          <w:p>
+            <w:pPr>
+              <w:jc w:val="left"/>
+              <w:rPr>
+                <w:lang w:val="en-US"/>
+              </w:rPr>
+            </w:pPr>
+          </w:p>
+        </w:tc>
+        <w:tc>
+          <w:tcPr>
+            <w:tcW w:w="2089" w:type="dxa"/>
+          </w:tcPr>
+          <w:p>
+            <w:pPr>
+              <w:jc w:val="left"/>
+              <w:rPr>
+                <w:lang w:val="en-US"/>
+              </w:rPr>
+            </w:pPr>
+            <w:r>
+              <w:rPr>
+                <w:lang w:val="en-US"/>
+              </w:rPr>
+              <w:t>POIs</w:t>
+            </w:r>
+          </w:p>
+        </w:tc>
+        <w:tc>
+          <w:tcPr>
+            <w:tcW w:w="2646" w:type="dxa"/>
+          </w:tcPr>
+          <w:p>
+            <w:pPr>
+              <w:jc w:val="left"/>
+              <w:rPr>
+                <w:lang w:val="en-US"/>
+              </w:rPr>
+            </w:pPr>
+            <w:r>
+              <w:rPr>
+                <w:lang w:val="en-US"/>
+              </w:rPr>
+              <w:t>Demand modeling, urban planning</w:t>
+            </w:r>
+          </w:p>
+        </w:tc>
+        <w:tc>
+          <w:tcPr>
+            <w:tcW w:w="2878" w:type="dxa"/>
+          </w:tcPr>
+          <w:p>
+            <w:pPr>
+              <w:jc w:val="left"/>
+              <w:rPr>
+                <w:lang w:val="en-US"/>
+              </w:rPr>
+            </w:pPr>
+            <w:r>
+              <w:rPr>
+                <w:lang w:val="en-US"/>
+              </w:rPr>
+              <w:t>Static/dynamic</w:t>
+            </w:r>
+            <w:r>
+              <w:rPr>
+                <w:lang w:val="en-US"/>
+              </w:rPr>
+              <w:t>, location-based</w:t>
+            </w:r>
+          </w:p>
+        </w:tc>
+      </w:tr>
+      <w:tr>
+        <w:tc>
+          <w:tcPr>
+            <w:tcW w:w="1403" w:type="dxa"/>
+            <w:vMerge/>
+            <w:shd w:val="clear" w:color="auto" w:fill="F2F2F2" w:themeFill="background1" w:themeFillShade="F2"/>
+          </w:tcPr>
+          <w:p>
+            <w:pPr>
+              <w:jc w:val="left"/>
+              <w:rPr>
+                <w:lang w:val="en-US"/>
+              </w:rPr>
+            </w:pPr>
+          </w:p>
+        </w:tc>
+        <w:tc>
+          <w:tcPr>
+            <w:tcW w:w="2089" w:type="dxa"/>
+          </w:tcPr>
+          <w:p>
+            <w:pPr>
+              <w:jc w:val="left"/>
+              <w:rPr>
+                <w:lang w:val="en-US"/>
+              </w:rPr>
+            </w:pPr>
+            <w:r>
+              <w:rPr>
+                <w:lang w:val="en-US"/>
+              </w:rPr>
+              <w:t>Demographic/Socio-economic</w:t>
+            </w:r>
+          </w:p>
+        </w:tc>
+        <w:tc>
+          <w:tcPr>
+            <w:tcW w:w="2646" w:type="dxa"/>
+          </w:tcPr>
+          <w:p>
+            <w:pPr>
+              <w:jc w:val="left"/>
+              <w:rPr>
+                <w:lang w:val="en-US"/>
+              </w:rPr>
+            </w:pPr>
+            <w:r>
+              <w:rPr>
+                <w:lang w:val="en-US"/>
+              </w:rPr>
+              <w:t>Long-term planning, demand forecasting</w:t>
+            </w:r>
+          </w:p>
+        </w:tc>
+        <w:tc>
+          <w:tcPr>
+            <w:tcW w:w="2878" w:type="dxa"/>
+          </w:tcPr>
+          <w:p>
+            <w:pPr>
+              <w:jc w:val="left"/>
+              <w:rPr>
+                <w:lang w:val="en-US"/>
+              </w:rPr>
+            </w:pPr>
+            <w:r>
+              <w:rPr>
+                <w:lang w:val="en-US"/>
+              </w:rPr>
+              <w:t>Static/slow-changing, population-centric</w:t>
+            </w:r>
+          </w:p>
+        </w:tc>
+      </w:tr>
+    </w:tbl>
+    <w:p>
+      <w:pPr>
+        <w:pStyle w:val="Caption"/>
+        <w:spacing w:before="240"/>
+        <w:jc w:val="center"/>
+        <w:rPr>
+          <w:color w:val="auto"/>
+          <w:sz w:val="24"/>
+          <w:szCs w:val="24"/>
+          <w:lang w:val="en-US"/>
+        </w:rPr>
+      </w:pPr>
+      <w:r>
+        <w:rPr>
+          <w:color w:val="auto"/>
+          <w:sz w:val="24"/>
+          <w:szCs w:val="24"/>
+        </w:rPr>
+        <w:t xml:space="preserve">Table </w:t>
+      </w:r>
+      <w:r>
+        <w:rPr>
+          <w:color w:val="auto"/>
+          <w:sz w:val="24"/>
+          <w:szCs w:val="24"/>
+        </w:rPr>
+        <w:fldChar w:fldCharType="begin"/>
+      </w:r>
+      <w:r>
+        <w:rPr>
+          <w:color w:val="auto"/>
+          <w:sz w:val="24"/>
+          <w:szCs w:val="24"/>
+        </w:rPr>
+        <w:instrText xml:space="preserve"> SEQ Table \* ARABIC </w:instrText>
+      </w:r>
+      <w:r>
+        <w:rPr>
+          <w:color w:val="auto"/>
+          <w:sz w:val="24"/>
+          <w:szCs w:val="24"/>
+        </w:rPr>
+        <w:fldChar w:fldCharType="separate"/>
+      </w:r>
+      <w:r>
+        <w:rPr>
+          <w:noProof/>
+          <w:color w:val="auto"/>
+          <w:sz w:val="24"/>
+          <w:szCs w:val="24"/>
+        </w:rPr>
+        <w:t>3</w:t>
+      </w:r>
+      <w:r>
+        <w:rPr>
+          <w:color w:val="auto"/>
+          <w:sz w:val="24"/>
+          <w:szCs w:val="24"/>
+        </w:rPr>
+        <w:fldChar w:fldCharType="end"/>
+      </w:r>
+      <w:r>
+        <w:rPr>
+          <w:color w:val="auto"/>
+          <w:sz w:val="24"/>
+          <w:szCs w:val="24"/>
+        </w:rPr>
+        <w:t>: Detailed table of endogenous and exogenous data sources with examples, applications, and characteristics</w:t>
+      </w:r>
+    </w:p>
     <w:p>
       <w:pPr>
         <w:pStyle w:val="Heading3"/>
@@ -7314,7 +8400,570 @@
       </w:r>
       <w:bookmarkEnd w:id="16"/>
     </w:p>
-    <w:p/>
+    <w:p>
+      <w:pPr>
+        <w:ind w:firstLine="720"/>
+      </w:pPr>
+      <w:r>
+        <w:t>There are significant challenges when handling transit data</w:t>
+      </w:r>
+      <w:r>
+        <w:t xml:space="preserve"> like data quality, noise etc. and extensive preprocessing is required before inputting to AI model </w:t>
+      </w:r>
+      <w:r>
+        <w:rPr>
+          <w:noProof/>
+          <w:lang w:val="en-US"/>
+        </w:rPr>
+        <w:t>(Ge et al., 2021; Jevinger et al., 2024)</w:t>
+      </w:r>
+      <w:r>
+        <w:t xml:space="preserve">. Public transport agencies often struggle with fragmented and disjointed </w:t>
+      </w:r>
+      <w:r>
+        <w:lastRenderedPageBreak/>
+        <w:t>information</w:t>
+      </w:r>
+      <w:r>
+        <w:t xml:space="preserve"> they collected. This most likely hinder their ability to fully understand and interpret these available data </w:t>
+      </w:r>
+      <w:r>
+        <w:rPr>
+          <w:noProof/>
+          <w:lang w:val="en-US"/>
+        </w:rPr>
+        <w:t>(Keller et al., 2022)</w:t>
+      </w:r>
+      <w:r>
+        <w:t>.</w:t>
+      </w:r>
+    </w:p>
+    <w:p>
+      <w:pPr>
+        <w:ind w:firstLine="720"/>
+        <w:rPr>
+          <w:noProof/>
+          <w:lang w:val="en-US"/>
+        </w:rPr>
+      </w:pPr>
+      <w:r>
+        <w:t xml:space="preserve">Data </w:t>
+      </w:r>
+      <w:r>
+        <w:t>q</w:t>
+      </w:r>
+      <w:r>
+        <w:t xml:space="preserve">uality </w:t>
+      </w:r>
+      <w:r>
+        <w:t>i</w:t>
+      </w:r>
+      <w:r>
+        <w:t>ssues</w:t>
+      </w:r>
+      <w:r>
+        <w:t xml:space="preserve"> as</w:t>
+      </w:r>
+      <w:r>
+        <w:t xml:space="preserve"> supported by</w:t>
+      </w:r>
+      <w:r>
+        <w:t xml:space="preserve"> both </w:t>
+      </w:r>
+      <w:r>
+        <w:rPr>
+          <w:noProof/>
+          <w:lang w:val="en-US"/>
+        </w:rPr>
+        <w:t>S.K.B et al. (2024) and Amir et al. (2025)</w:t>
+      </w:r>
+      <w:r>
+        <w:rPr>
+          <w:noProof/>
+          <w:lang w:val="en-US"/>
+        </w:rPr>
+        <w:t xml:space="preserve"> are</w:t>
+      </w:r>
+      <w:r>
+        <w:rPr>
+          <w:noProof/>
+          <w:lang w:val="en-US"/>
+        </w:rPr>
+        <w:t>:</w:t>
+      </w:r>
+    </w:p>
+    <w:p>
+      <w:pPr>
+        <w:pStyle w:val="ListParagraph"/>
+        <w:numPr>
+          <w:ilvl w:val="0"/>
+          <w:numId w:val="19"/>
+        </w:numPr>
+        <w:rPr>
+          <w:noProof/>
+          <w:lang w:val="en-US"/>
+        </w:rPr>
+      </w:pPr>
+      <w:r>
+        <w:rPr>
+          <w:b/>
+          <w:bCs/>
+          <w:noProof/>
+          <w:lang w:val="en-US"/>
+        </w:rPr>
+        <w:t>Missing Data</w:t>
+      </w:r>
+      <w:r>
+        <w:rPr>
+          <w:noProof/>
+          <w:lang w:val="en-US"/>
+        </w:rPr>
+        <w:t>:</w:t>
+      </w:r>
+      <w:r>
+        <w:rPr>
+          <w:noProof/>
+          <w:lang w:val="en-US"/>
+        </w:rPr>
+        <w:t xml:space="preserve"> </w:t>
+      </w:r>
+      <w:r>
+        <w:rPr>
+          <w:noProof/>
+          <w:lang w:val="en-US"/>
+        </w:rPr>
+        <w:t>Occur when sensor failures, power/network outages, disconnectivity (IoT devices)</w:t>
+      </w:r>
+      <w:r>
+        <w:rPr>
+          <w:noProof/>
+          <w:lang w:val="en-US"/>
+        </w:rPr>
+        <w:t xml:space="preserve"> etc.</w:t>
+      </w:r>
+      <w:r>
+        <w:rPr>
+          <w:noProof/>
+          <w:lang w:val="en-US"/>
+        </w:rPr>
+        <w:t>.</w:t>
+      </w:r>
+      <w:r>
+        <w:rPr>
+          <w:noProof/>
+          <w:lang w:val="en-US"/>
+        </w:rPr>
+        <w:t xml:space="preserve"> This can cause biased analyses and inaccurate predictions if not handled.</w:t>
+      </w:r>
+    </w:p>
+    <w:p>
+      <w:pPr>
+        <w:pStyle w:val="ListParagraph"/>
+        <w:numPr>
+          <w:ilvl w:val="0"/>
+          <w:numId w:val="19"/>
+        </w:numPr>
+        <w:rPr>
+          <w:noProof/>
+          <w:lang w:val="en-US"/>
+        </w:rPr>
+      </w:pPr>
+      <w:r>
+        <w:rPr>
+          <w:b/>
+          <w:bCs/>
+          <w:noProof/>
+          <w:lang w:val="en-US"/>
+        </w:rPr>
+        <w:t>Inaccuracies and Errors</w:t>
+      </w:r>
+      <w:r>
+        <w:rPr>
+          <w:noProof/>
+          <w:lang w:val="en-US"/>
+        </w:rPr>
+        <w:t xml:space="preserve">: </w:t>
+      </w:r>
+      <w:r>
+        <w:rPr>
+          <w:noProof/>
+          <w:lang w:val="en-US"/>
+        </w:rPr>
+        <w:t>Incorrect values, numbering, typos, or measurement errors during data collection</w:t>
+      </w:r>
+      <w:r>
+        <w:rPr>
+          <w:noProof/>
+          <w:lang w:val="en-US"/>
+        </w:rPr>
+        <w:t xml:space="preserve">. For </w:t>
+      </w:r>
+      <w:r>
+        <w:rPr>
+          <w:noProof/>
+          <w:lang w:val="en-US"/>
+        </w:rPr>
+        <w:t>example</w:t>
+      </w:r>
+      <w:r>
+        <w:rPr>
+          <w:noProof/>
+          <w:lang w:val="en-US"/>
+        </w:rPr>
+        <w:t xml:space="preserve">, GPS data </w:t>
+      </w:r>
+      <w:r>
+        <w:rPr>
+          <w:noProof/>
+          <w:lang w:val="en-US"/>
+        </w:rPr>
+        <w:t>suffering signal loss, or odometer malfunction causing speed abnormalities.</w:t>
+      </w:r>
+    </w:p>
+    <w:p>
+      <w:pPr>
+        <w:pStyle w:val="ListParagraph"/>
+        <w:numPr>
+          <w:ilvl w:val="0"/>
+          <w:numId w:val="19"/>
+        </w:numPr>
+        <w:rPr>
+          <w:noProof/>
+          <w:lang w:val="en-US"/>
+        </w:rPr>
+      </w:pPr>
+      <w:r>
+        <w:rPr>
+          <w:b/>
+          <w:bCs/>
+          <w:noProof/>
+          <w:lang w:val="en-US"/>
+        </w:rPr>
+        <w:t>Inconsistencies</w:t>
+      </w:r>
+      <w:r>
+        <w:rPr>
+          <w:noProof/>
+          <w:lang w:val="en-US"/>
+        </w:rPr>
+        <w:t>: Data from different sources or legacy systems may use different formats, units, or resolutions. This will make integration complex and prone to errors. One of many existing pain points in urban mobility prediction is the lack of consistency across multimodal spatiotemporal data.</w:t>
+      </w:r>
+    </w:p>
+    <w:p>
+      <w:pPr>
+        <w:pStyle w:val="ListParagraph"/>
+        <w:numPr>
+          <w:ilvl w:val="0"/>
+          <w:numId w:val="19"/>
+        </w:numPr>
+      </w:pPr>
+      <w:r>
+        <w:rPr>
+          <w:b/>
+          <w:bCs/>
+          <w:noProof/>
+          <w:lang w:val="en-US"/>
+        </w:rPr>
+        <w:t>Outliers</w:t>
+      </w:r>
+      <w:r>
+        <w:rPr>
+          <w:noProof/>
+          <w:lang w:val="en-US"/>
+        </w:rPr>
+        <w:t xml:space="preserve">: Anomalous data points that </w:t>
+      </w:r>
+      <w:r>
+        <w:rPr>
+          <w:noProof/>
+          <w:lang w:val="en-US"/>
+        </w:rPr>
+        <w:t xml:space="preserve">veer off from the normal data can alter statistical analyses and model training. These can be real values but rare events or errors in data </w:t>
+      </w:r>
+      <w:r>
+        <w:rPr>
+          <w:noProof/>
+          <w:lang w:val="en-US"/>
+        </w:rPr>
+        <w:t>collection</w:t>
+      </w:r>
+      <w:r>
+        <w:rPr>
+          <w:noProof/>
+          <w:lang w:val="en-US"/>
+        </w:rPr>
+        <w:t xml:space="preserve"> like </w:t>
+      </w:r>
+      <w:r>
+        <w:rPr>
+          <w:noProof/>
+          <w:lang w:val="en-US"/>
+        </w:rPr>
+        <w:t xml:space="preserve">ridership data recorded </w:t>
+      </w:r>
+      <w:r>
+        <w:rPr>
+          <w:noProof/>
+          <w:lang w:val="en-US"/>
+        </w:rPr>
+        <w:t>during Malaysia’s MCO period.</w:t>
+      </w:r>
+    </w:p>
+    <w:p>
+      <w:pPr>
+        <w:ind w:firstLine="720"/>
+        <w:rPr>
+          <w:noProof/>
+          <w:lang w:val="en-US"/>
+        </w:rPr>
+      </w:pPr>
+      <w:r>
+        <w:t xml:space="preserve">Noise in transit data refers to irrelevant or meaningless information that can mask underlying patterns. </w:t>
+      </w:r>
+      <w:r>
+        <w:rPr>
+          <w:noProof/>
+          <w:lang w:val="en-US"/>
+        </w:rPr>
+        <w:t>Jevinger et al. (2024) emphasizes that substantial effort is needed to perform data preprocessing steps when dealing with public transport analytics.</w:t>
+      </w:r>
+    </w:p>
+    <w:p>
+      <w:pPr>
+        <w:ind w:firstLine="720"/>
+        <w:rPr>
+          <w:noProof/>
+          <w:lang w:val="en-US"/>
+        </w:rPr>
+      </w:pPr>
+      <w:r>
+        <w:rPr>
+          <w:noProof/>
+          <w:lang w:val="en-US"/>
+        </w:rPr>
+        <w:t>Common preprocessing challenges as supported by Ge et al. (2021), Keller et al. (2022), Jevinger et al. (2024), and Amir et al. (2025) include:</w:t>
+      </w:r>
+    </w:p>
+    <w:p>
+      <w:pPr>
+        <w:pStyle w:val="ListParagraph"/>
+        <w:numPr>
+          <w:ilvl w:val="0"/>
+          <w:numId w:val="20"/>
+        </w:numPr>
+        <w:rPr>
+          <w:noProof/>
+          <w:lang w:val="en-US"/>
+        </w:rPr>
+      </w:pPr>
+      <w:r>
+        <w:rPr>
+          <w:b/>
+          <w:bCs/>
+          <w:noProof/>
+          <w:lang w:val="en-US"/>
+        </w:rPr>
+        <w:t>Data Cleaning</w:t>
+      </w:r>
+      <w:r>
+        <w:rPr>
+          <w:noProof/>
+          <w:lang w:val="en-US"/>
+        </w:rPr>
+        <w:t>:</w:t>
+      </w:r>
+      <w:r>
+        <w:rPr>
+          <w:noProof/>
+          <w:lang w:val="en-US"/>
+        </w:rPr>
+        <w:t xml:space="preserve"> Handling missing values and duplications to ensure data integrity</w:t>
+      </w:r>
+      <w:r>
+        <w:rPr>
+          <w:noProof/>
+          <w:lang w:val="en-US"/>
+        </w:rPr>
+        <w:t>.</w:t>
+      </w:r>
+    </w:p>
+    <w:p>
+      <w:pPr>
+        <w:pStyle w:val="ListParagraph"/>
+        <w:numPr>
+          <w:ilvl w:val="0"/>
+          <w:numId w:val="20"/>
+        </w:numPr>
+        <w:rPr>
+          <w:noProof/>
+          <w:lang w:val="en-US"/>
+        </w:rPr>
+      </w:pPr>
+      <w:r>
+        <w:rPr>
+          <w:b/>
+          <w:bCs/>
+          <w:noProof/>
+          <w:lang w:val="en-US"/>
+        </w:rPr>
+        <w:t>Data Integration</w:t>
+      </w:r>
+      <w:r>
+        <w:rPr>
+          <w:noProof/>
+          <w:lang w:val="en-US"/>
+        </w:rPr>
+        <w:t xml:space="preserve">: Combining </w:t>
+      </w:r>
+      <w:r>
+        <w:rPr>
+          <w:noProof/>
+          <w:lang w:val="en-US"/>
+        </w:rPr>
+        <w:t>different</w:t>
+      </w:r>
+      <w:r>
+        <w:rPr>
+          <w:noProof/>
+          <w:lang w:val="en-US"/>
+        </w:rPr>
+        <w:t xml:space="preserve"> datasets from various sources</w:t>
+      </w:r>
+      <w:r>
+        <w:rPr>
+          <w:noProof/>
+          <w:lang w:val="en-US"/>
+        </w:rPr>
+        <w:t xml:space="preserve"> using </w:t>
+      </w:r>
+      <w:r>
+        <w:rPr>
+          <w:noProof/>
+          <w:lang w:val="en-US"/>
+        </w:rPr>
+        <w:t>complex mapping and transformation to achieve coherence.</w:t>
+      </w:r>
+    </w:p>
+    <w:p>
+      <w:pPr>
+        <w:pStyle w:val="ListParagraph"/>
+        <w:numPr>
+          <w:ilvl w:val="0"/>
+          <w:numId w:val="20"/>
+        </w:numPr>
+        <w:rPr>
+          <w:noProof/>
+          <w:lang w:val="en-US"/>
+        </w:rPr>
+      </w:pPr>
+      <w:r>
+        <w:rPr>
+          <w:b/>
+          <w:bCs/>
+          <w:noProof/>
+          <w:lang w:val="en-US"/>
+        </w:rPr>
+        <w:t>Data Transformation</w:t>
+      </w:r>
+      <w:r>
+        <w:rPr>
+          <w:noProof/>
+          <w:lang w:val="en-US"/>
+        </w:rPr>
+        <w:t xml:space="preserve">: </w:t>
+      </w:r>
+      <w:r>
+        <w:rPr>
+          <w:noProof/>
+          <w:lang w:val="en-US"/>
+        </w:rPr>
+        <w:t>Altering data without changing its context to suit the requirements of specific analytical models by converting raw data into meaningful features</w:t>
+      </w:r>
+      <w:r>
+        <w:rPr>
+          <w:noProof/>
+          <w:lang w:val="en-US"/>
+        </w:rPr>
+        <w:t>.</w:t>
+      </w:r>
+    </w:p>
+    <w:p>
+      <w:pPr>
+        <w:pStyle w:val="ListParagraph"/>
+        <w:numPr>
+          <w:ilvl w:val="0"/>
+          <w:numId w:val="20"/>
+        </w:numPr>
+        <w:rPr>
+          <w:noProof/>
+          <w:lang w:val="en-US"/>
+        </w:rPr>
+      </w:pPr>
+      <w:r>
+        <w:rPr>
+          <w:b/>
+          <w:bCs/>
+          <w:noProof/>
+          <w:lang w:val="en-US"/>
+        </w:rPr>
+        <w:t>Data Reduction</w:t>
+      </w:r>
+      <w:r>
+        <w:rPr>
+          <w:noProof/>
+          <w:lang w:val="en-US"/>
+        </w:rPr>
+        <w:t xml:space="preserve">: </w:t>
+      </w:r>
+      <w:r>
+        <w:rPr>
+          <w:noProof/>
+          <w:lang w:val="en-US"/>
+        </w:rPr>
+        <w:t>S</w:t>
+      </w:r>
+      <w:r>
+        <w:rPr>
+          <w:noProof/>
+          <w:lang w:val="en-US"/>
+        </w:rPr>
+        <w:t>electing relevant features or reducing data size while keeping essential information.</w:t>
+      </w:r>
+    </w:p>
+    <w:p>
+      <w:pPr>
+        <w:pStyle w:val="ListParagraph"/>
+        <w:numPr>
+          <w:ilvl w:val="0"/>
+          <w:numId w:val="20"/>
+        </w:numPr>
+      </w:pPr>
+      <w:r>
+        <w:rPr>
+          <w:b/>
+          <w:bCs/>
+          <w:noProof/>
+          <w:lang w:val="en-US"/>
+        </w:rPr>
+        <w:t>Privacy Concerns</w:t>
+      </w:r>
+      <w:r>
+        <w:rPr>
+          <w:noProof/>
+          <w:lang w:val="en-US"/>
+        </w:rPr>
+        <w:t>: Anonymizing sensitive passenger data such as travel records while retaining its analytical utility is a crucial ethical and technical challenge.</w:t>
+      </w:r>
+    </w:p>
+    <w:p>
+      <w:pPr>
+        <w:ind w:firstLine="720"/>
+      </w:pPr>
+      <w:r>
+        <w:lastRenderedPageBreak/>
+        <w:t>The amount of effort required for preprocessing highlights that raw transit data is hardly usable for advanced analytics fresh after collection, regardless of its volume. The full potential of transit data ecosystems can only be determined after effective preprocessing strategies are carried out.</w:t>
+      </w:r>
+    </w:p>
     <w:p>
       <w:pPr>
         <w:pStyle w:val="Heading3"/>
@@ -7465,7 +9114,6 @@
           <w:szCs w:val="24"/>
           <w:u w:val="single"/>
         </w:rPr>
-        <w:lastRenderedPageBreak/>
         <w:t xml:space="preserve">Benchmarking </w:t>
       </w:r>
       <w:r>
@@ -7715,6 +9363,7 @@
       </w:r>
       <w:bookmarkEnd w:id="27"/>
     </w:p>
+    <w:p/>
     <w:p>
       <w:pPr>
         <w:pStyle w:val="Heading2"/>
@@ -7739,10 +9388,12 @@
           <w:szCs w:val="24"/>
           <w:u w:val="single"/>
         </w:rPr>
+        <w:lastRenderedPageBreak/>
         <w:t>Data Collection</w:t>
       </w:r>
       <w:bookmarkEnd w:id="28"/>
     </w:p>
+    <w:p/>
     <w:p>
       <w:pPr>
         <w:pStyle w:val="Heading2"/>
@@ -7771,6 +9422,7 @@
       </w:r>
       <w:bookmarkEnd w:id="29"/>
     </w:p>
+    <w:p/>
     <w:p>
       <w:pPr>
         <w:pStyle w:val="Heading2"/>
@@ -7799,6 +9451,7 @@
       </w:r>
       <w:bookmarkEnd w:id="30"/>
     </w:p>
+    <w:p/>
     <w:p>
       <w:pPr>
         <w:pStyle w:val="Heading2"/>
@@ -7827,6 +9480,7 @@
       </w:r>
       <w:bookmarkEnd w:id="31"/>
     </w:p>
+    <w:p/>
     <w:p>
       <w:pPr>
         <w:pStyle w:val="Heading2"/>
@@ -7855,6 +9509,7 @@
       </w:r>
       <w:bookmarkEnd w:id="32"/>
     </w:p>
+    <w:p/>
     <w:p>
       <w:pPr>
         <w:pStyle w:val="Heading2"/>
@@ -7883,6 +9538,7 @@
       </w:r>
       <w:bookmarkEnd w:id="33"/>
     </w:p>
+    <w:p/>
     <w:p>
       <w:pPr>
         <w:pStyle w:val="Heading1"/>
@@ -7912,6 +9568,7 @@
       </w:r>
       <w:bookmarkEnd w:id="34"/>
     </w:p>
+    <w:p/>
     <w:p>
       <w:pPr>
         <w:pStyle w:val="Heading1"/>
@@ -8008,7 +9665,6 @@
         <w:rPr>
           <w:noProof/>
         </w:rPr>
-        <w:lastRenderedPageBreak/>
         <w:t xml:space="preserve">Chen, P., Fu, X., &amp; Wang, X. (7 July, 2022). A Graph Convolutional Stacked Bidirectional Unidirectional-LSTM Neural Network for Metro Ridership Prediction. </w:t>
       </w:r>
       <w:r>
@@ -8067,6 +9723,7 @@
         <w:rPr>
           <w:noProof/>
         </w:rPr>
+        <w:lastRenderedPageBreak/>
         <w:t xml:space="preserve">Hassan, M., Mahin, H. D., Ahmed, F., Hassan, M. M., Rahaman, A., &amp; Abdullah, M. (4 July, 2025). Assessing Public Transit Network Efficiency and Accessibility in Johor Bahru and Penang, Malaysia: A Data-driven Approach. </w:t>
       </w:r>
       <w:r>
@@ -8125,7 +9782,7 @@
         <w:rPr>
           <w:noProof/>
         </w:rPr>
-        <w:t xml:space="preserve">Lu, K., Liu, J., Zhou, X., &amp; Han, B. (19 February, 2020). A Review of Big Data Applications in Urban Transit Systems. </w:t>
+        <w:t xml:space="preserve">Jevinger, A., Zhao, C., Persson, J. A., &amp; Davidsson, P. (March, 2024). Artificial Intelligence for improving public transport: A mapping study. </w:t>
       </w:r>
       <w:r>
         <w:rPr>
@@ -8133,13 +9790,13 @@
           <w:iCs/>
           <w:noProof/>
         </w:rPr>
-        <w:t>IEEE Transactions on Intelligent Transportation Systems, 22</w:t>
-      </w:r>
-      <w:r>
-        <w:rPr>
-          <w:noProof/>
-        </w:rPr>
-        <w:t>(5), 2535-2552. doi:10.1109/TITS.2020.2973365</w:t>
+        <w:t>Public Transport, 16</w:t>
+      </w:r>
+      <w:r>
+        <w:rPr>
+          <w:noProof/>
+        </w:rPr>
+        <w:t>, 99 - 158. doi:10.1007/s12469-023-00334-7</w:t>
       </w:r>
     </w:p>
     <w:p>
@@ -8154,7 +9811,7 @@
         <w:rPr>
           <w:noProof/>
         </w:rPr>
-        <w:t xml:space="preserve">Lv, Z., Li, J., Dong, C., Li, H., &amp; Xu, Z. (29 June, 2021). Deep Learning in the COVID-19 epidemic: A deep model for urban traffic revitalization index. </w:t>
+        <w:t xml:space="preserve">Keller, C., Gluck, F., Gerlach, C. F., &amp; Schlegel, T. (1 April, 2022). Investigating the Potential of Data Science Methods for Sustainable Public Transport. </w:t>
       </w:r>
       <w:r>
         <w:rPr>
@@ -8162,13 +9819,13 @@
           <w:iCs/>
           <w:noProof/>
         </w:rPr>
-        <w:t>Data &amp; Knowledge Engineering, 135</w:t>
-      </w:r>
-      <w:r>
-        <w:rPr>
-          <w:noProof/>
-        </w:rPr>
-        <w:t>, 101912. doi:10.1016/j.datak.2021.101912</w:t>
+        <w:t>Sustainability, 14</w:t>
+      </w:r>
+      <w:r>
+        <w:rPr>
+          <w:noProof/>
+        </w:rPr>
+        <w:t>, 4211. doi:10.3390/su14074211</w:t>
       </w:r>
     </w:p>
     <w:p>
@@ -8183,7 +9840,7 @@
         <w:rPr>
           <w:noProof/>
         </w:rPr>
-        <w:t xml:space="preserve">Mee, C. K., Subramaniam, G., Ating, R., &amp; Separa, L. A. (30 September, 2022). Willingness to use Public Transport in Kuala Lumpur &amp; Manila. </w:t>
+        <w:t xml:space="preserve">Liu, C., Xiao, Z., Long, W., Li, T., Jiang, H., &amp; Li, K. (May, 2025). Vehicle Trajectory Data Processing, Analytics and Applications: A Survey. </w:t>
       </w:r>
       <w:r>
         <w:rPr>
@@ -8191,13 +9848,13 @@
           <w:iCs/>
           <w:noProof/>
         </w:rPr>
-        <w:t>Environment-Behaviour Proceedings Journal, 7</w:t>
-      </w:r>
-      <w:r>
-        <w:rPr>
-          <w:noProof/>
-        </w:rPr>
-        <w:t>(21), 1 - 9. doi:10.21834/ebpj.v7i21.3751</w:t>
+        <w:t>ACM Comput. Surv., 57</w:t>
+      </w:r>
+      <w:r>
+        <w:rPr>
+          <w:noProof/>
+        </w:rPr>
+        <w:t>(9), 1 - 36. doi:10.1145/3715902</w:t>
       </w:r>
     </w:p>
     <w:p>
@@ -8212,7 +9869,7 @@
         <w:rPr>
           <w:noProof/>
         </w:rPr>
-        <w:t xml:space="preserve">Mohamed, A. H., Adwan, I. A., Ahmeda, A. G., Hrtemih, H., &amp; Al-MSari, H. (25 April, 2021). Identification of Affecting Factors on the Travel Time Reliability for Bus Transportation. </w:t>
+        <w:t xml:space="preserve">Lu, K., Liu, J., Zhou, X., &amp; Han, B. (19 February, 2020). A Review of Big Data Applications in Urban Transit Systems. </w:t>
       </w:r>
       <w:r>
         <w:rPr>
@@ -8220,13 +9877,13 @@
           <w:iCs/>
           <w:noProof/>
         </w:rPr>
-        <w:t>Knowledge-based Engineering and Science, 2</w:t>
-      </w:r>
-      <w:r>
-        <w:rPr>
-          <w:noProof/>
-        </w:rPr>
-        <w:t>(1), 19 - 30. doi:10.51526/kbes.2021.2.1.19-30</w:t>
+        <w:t>IEEE Transactions on Intelligent Transportation Systems, 22</w:t>
+      </w:r>
+      <w:r>
+        <w:rPr>
+          <w:noProof/>
+        </w:rPr>
+        <w:t>(5), 2535-2552. doi:10.1109/TITS.2020.2973365</w:t>
       </w:r>
     </w:p>
     <w:p>
@@ -8241,6 +9898,93 @@
         <w:rPr>
           <w:noProof/>
         </w:rPr>
+        <w:t xml:space="preserve">Lv, Z., Li, J., Dong, C., Li, H., &amp; Xu, Z. (29 June, 2021). Deep Learning in the COVID-19 epidemic: A deep model for urban traffic revitalization index. </w:t>
+      </w:r>
+      <w:r>
+        <w:rPr>
+          <w:i/>
+          <w:iCs/>
+          <w:noProof/>
+        </w:rPr>
+        <w:t>Data &amp; Knowledge Engineering, 135</w:t>
+      </w:r>
+      <w:r>
+        <w:rPr>
+          <w:noProof/>
+        </w:rPr>
+        <w:t>, 101912. doi:10.1016/j.datak.2021.101912</w:t>
+      </w:r>
+    </w:p>
+    <w:p>
+      <w:pPr>
+        <w:pStyle w:val="Bibliography"/>
+        <w:ind w:left="720" w:hanging="720"/>
+        <w:rPr>
+          <w:noProof/>
+        </w:rPr>
+      </w:pPr>
+      <w:r>
+        <w:rPr>
+          <w:noProof/>
+        </w:rPr>
+        <w:t xml:space="preserve">Mee, C. K., Subramaniam, G., Ating, R., &amp; Separa, L. A. (30 September, 2022). Willingness to use Public Transport in Kuala Lumpur &amp; Manila. </w:t>
+      </w:r>
+      <w:r>
+        <w:rPr>
+          <w:i/>
+          <w:iCs/>
+          <w:noProof/>
+        </w:rPr>
+        <w:t>Environment-Behaviour Proceedings Journal, 7</w:t>
+      </w:r>
+      <w:r>
+        <w:rPr>
+          <w:noProof/>
+        </w:rPr>
+        <w:t>(21), 1 - 9. doi:10.21834/ebpj.v7i21.3751</w:t>
+      </w:r>
+    </w:p>
+    <w:p>
+      <w:pPr>
+        <w:pStyle w:val="Bibliography"/>
+        <w:ind w:left="720" w:hanging="720"/>
+        <w:rPr>
+          <w:noProof/>
+        </w:rPr>
+      </w:pPr>
+      <w:r>
+        <w:rPr>
+          <w:noProof/>
+        </w:rPr>
+        <w:t xml:space="preserve">Mohamed, A. H., Adwan, I. A., Ahmeda, A. G., Hrtemih, H., &amp; Al-MSari, H. (25 April, 2021). Identification of Affecting Factors on the Travel Time Reliability for Bus Transportation. </w:t>
+      </w:r>
+      <w:r>
+        <w:rPr>
+          <w:i/>
+          <w:iCs/>
+          <w:noProof/>
+        </w:rPr>
+        <w:t>Knowledge-based Engineering and Science, 2</w:t>
+      </w:r>
+      <w:r>
+        <w:rPr>
+          <w:noProof/>
+        </w:rPr>
+        <w:t>(1), 19 - 30. doi:10.51526/kbes.2021.2.1.19-30</w:t>
+      </w:r>
+    </w:p>
+    <w:p>
+      <w:pPr>
+        <w:pStyle w:val="Bibliography"/>
+        <w:ind w:left="720" w:hanging="720"/>
+        <w:rPr>
+          <w:noProof/>
+        </w:rPr>
+      </w:pPr>
+      <w:r>
+        <w:rPr>
+          <w:noProof/>
+        </w:rPr>
         <w:lastRenderedPageBreak/>
         <w:t xml:space="preserve">Rezapour, M., &amp; Ferraro, F. R. (16 June, 2021). Rail Transport Delay and Its Effects on the Perceived Importance of a Real-time Information. </w:t>
       </w:r>
@@ -8271,7 +10015,7 @@
         <w:rPr>
           <w:noProof/>
         </w:rPr>
-        <w:t xml:space="preserve">Sogbe, E., Susilawati, S., &amp; Tan, C. P. (26 September, 2024). Scaling up public transport usage: a systematic literature review of service quality, satisfaction and attitude towards bus transport systems in developing countries. </w:t>
+        <w:t xml:space="preserve">S.K.B, S., Mathivanan, S. K., Rajadurai, H., Cho, J., &amp; Easwaramoorthy, S. V. (30 December, 2024). A multi-modal geospatial–temporal LSTM based deep learning framework for predictive modeling of urban mobility patterns. </w:t>
       </w:r>
       <w:r>
         <w:rPr>
@@ -8279,13 +10023,13 @@
           <w:iCs/>
           <w:noProof/>
         </w:rPr>
-        <w:t>Public Transport, 17</w:t>
-      </w:r>
-      <w:r>
-        <w:rPr>
-          <w:noProof/>
-        </w:rPr>
-        <w:t>, 1 - 44. doi:10.1007/s12469-024-00367-6</w:t>
+        <w:t>Scientific Reports, 14</w:t>
+      </w:r>
+      <w:r>
+        <w:rPr>
+          <w:noProof/>
+        </w:rPr>
+        <w:t>, 1 - 19. doi:10.1038/s41598-024-74237-3</w:t>
       </w:r>
     </w:p>
     <w:p>
@@ -8300,7 +10044,7 @@
         <w:rPr>
           <w:noProof/>
         </w:rPr>
-        <w:t xml:space="preserve">Ubaidillah, N. Z., Sa'ad, N. H., Ismail, F., Nordin, N. A., Baharuddin, N., &amp; Hassam, M. K. (June, 2022). The Impact of Public Bus Service Quality on the Users’ Satisfaction: Evidence from a Developing Asian City. </w:t>
+        <w:t xml:space="preserve">Sogbe, E., Susilawati, S., &amp; Tan, C. P. (26 September, 2024). Scaling up public transport usage: a systematic literature review of service quality, satisfaction and attitude towards bus transport systems in developing countries. </w:t>
       </w:r>
       <w:r>
         <w:rPr>
@@ -8308,13 +10052,13 @@
           <w:iCs/>
           <w:noProof/>
         </w:rPr>
-        <w:t>Review of Applied Socio-Economic Research, 23</w:t>
-      </w:r>
-      <w:r>
-        <w:rPr>
-          <w:noProof/>
-        </w:rPr>
-        <w:t>(1), 83 - 96. doi:10.54609/reaser.v23i1.185</w:t>
+        <w:t>Public Transport, 17</w:t>
+      </w:r>
+      <w:r>
+        <w:rPr>
+          <w:noProof/>
+        </w:rPr>
+        <w:t>, 1 - 44. doi:10.1007/s12469-024-00367-6</w:t>
       </w:r>
     </w:p>
     <w:p>
@@ -8329,7 +10073,7 @@
         <w:rPr>
           <w:noProof/>
         </w:rPr>
-        <w:t xml:space="preserve">Wang, J., Liu, C., Wu, Z., Liao, R., Li, G., &amp; Lu, H. (March, 2025). The Roadmap and Strategy for Prioritizing the Development of Public Transport in China. </w:t>
+        <w:t xml:space="preserve">Ubaidillah, N. Z., Sa'ad, N. H., Ismail, F., Nordin, N. A., Baharuddin, N., &amp; Hassam, M. K. (June, 2022). The Impact of Public Bus Service Quality on the Users’ Satisfaction: Evidence from a Developing Asian City. </w:t>
       </w:r>
       <w:r>
         <w:rPr>
@@ -8337,13 +10081,13 @@
           <w:iCs/>
           <w:noProof/>
         </w:rPr>
-        <w:t>Multimodal Transportation, 4</w:t>
-      </w:r>
-      <w:r>
-        <w:rPr>
-          <w:noProof/>
-        </w:rPr>
-        <w:t>(1), 100184. doi:10.1016/j.multra.2024.100184</w:t>
+        <w:t>Review of Applied Socio-Economic Research, 23</w:t>
+      </w:r>
+      <w:r>
+        <w:rPr>
+          <w:noProof/>
+        </w:rPr>
+        <w:t>(1), 83 - 96. doi:10.54609/reaser.v23i1.185</w:t>
       </w:r>
     </w:p>
     <w:p>
@@ -8358,7 +10102,7 @@
         <w:rPr>
           <w:noProof/>
         </w:rPr>
-        <w:t xml:space="preserve">Zhao, M., &amp; Lan, C.-L. (Novemeber, 2025). Modeling Travel Time Reliability for Non-Interstate National Highway System Routes. </w:t>
+        <w:t xml:space="preserve">Wang, J., Liu, C., Wu, Z., Liao, R., Li, G., &amp; Lu, H. (March, 2025). The Roadmap and Strategy for Prioritizing the Development of Public Transport in China. </w:t>
       </w:r>
       <w:r>
         <w:rPr>
@@ -8366,17 +10110,47 @@
           <w:iCs/>
           <w:noProof/>
         </w:rPr>
-        <w:t>Virginia Transportation Research Council</w:t>
-      </w:r>
-      <w:r>
-        <w:rPr>
-          <w:noProof/>
-        </w:rPr>
-        <w:t>, 1 - 68. Retrieved from https://vtrc.virginia.gov/media/vtrc/vtrc-pdf/vtrc-pdf/26-R23.pdf</w:t>
+        <w:t>Multimodal Transportation, 4</w:t>
+      </w:r>
+      <w:r>
+        <w:rPr>
+          <w:noProof/>
+        </w:rPr>
+        <w:t>(1), 100184. doi:10.1016/j.multra.2024.100184</w:t>
       </w:r>
     </w:p>
     <w:p>
       <w:pPr>
+        <w:pStyle w:val="Bibliography"/>
+        <w:ind w:left="720" w:hanging="720"/>
+        <w:rPr>
+          <w:noProof/>
+        </w:rPr>
+      </w:pPr>
+      <w:r>
+        <w:rPr>
+          <w:noProof/>
+        </w:rPr>
+        <w:t xml:space="preserve">Zhao, M., &amp; Lan, C.-L. (Novemeber, 2025). Modeling Travel Time Reliability for Non-Interstate National Highway System Routes. </w:t>
+      </w:r>
+      <w:r>
+        <w:rPr>
+          <w:i/>
+          <w:iCs/>
+          <w:noProof/>
+        </w:rPr>
+        <w:t>Virginia Transportation Research Council</w:t>
+      </w:r>
+      <w:r>
+        <w:rPr>
+          <w:noProof/>
+        </w:rPr>
+        <w:t>, 1 - 68. Retrieved from https://vtrc.virginia.gov/media/vtrc/vtrc-pdf/vtrc-pdf/26-R23.pdf</w:t>
+      </w:r>
+    </w:p>
+    <w:p>
+      <w:pPr>
+        <w:spacing w:line="240" w:lineRule="auto"/>
         <w:rPr>
           <w:b/>
           <w:bCs/>
@@ -9339,6 +11113,119 @@
     </w:lvl>
   </w:abstractNum>
   <w:abstractNum w:abstractNumId="9" w15:restartNumberingAfterBreak="0">
+    <w:nsid w:val="24C84591"/>
+    <w:multiLevelType w:val="hybridMultilevel"/>
+    <w:tmpl w:val="03CE792E"/>
+    <w:lvl w:ilvl="0" w:tplc="44090001">
+      <w:start w:val="1"/>
+      <w:numFmt w:val="bullet"/>
+      <w:lvlText w:val=""/>
+      <w:lvlJc w:val="left"/>
+      <w:pPr>
+        <w:ind w:left="720" w:hanging="360"/>
+      </w:pPr>
+      <w:rPr>
+        <w:rFonts w:ascii="Symbol" w:hAnsi="Symbol" w:hint="default"/>
+      </w:rPr>
+    </w:lvl>
+    <w:lvl w:ilvl="1" w:tplc="44090003" w:tentative="1">
+      <w:start w:val="1"/>
+      <w:numFmt w:val="bullet"/>
+      <w:lvlText w:val="o"/>
+      <w:lvlJc w:val="left"/>
+      <w:pPr>
+        <w:ind w:left="1440" w:hanging="360"/>
+      </w:pPr>
+      <w:rPr>
+        <w:rFonts w:ascii="Courier New" w:hAnsi="Courier New" w:cs="Courier New" w:hint="default"/>
+      </w:rPr>
+    </w:lvl>
+    <w:lvl w:ilvl="2" w:tplc="44090005" w:tentative="1">
+      <w:start w:val="1"/>
+      <w:numFmt w:val="bullet"/>
+      <w:lvlText w:val=""/>
+      <w:lvlJc w:val="left"/>
+      <w:pPr>
+        <w:ind w:left="2160" w:hanging="360"/>
+      </w:pPr>
+      <w:rPr>
+        <w:rFonts w:ascii="Wingdings" w:hAnsi="Wingdings" w:hint="default"/>
+      </w:rPr>
+    </w:lvl>
+    <w:lvl w:ilvl="3" w:tplc="44090001" w:tentative="1">
+      <w:start w:val="1"/>
+      <w:numFmt w:val="bullet"/>
+      <w:lvlText w:val=""/>
+      <w:lvlJc w:val="left"/>
+      <w:pPr>
+        <w:ind w:left="2880" w:hanging="360"/>
+      </w:pPr>
+      <w:rPr>
+        <w:rFonts w:ascii="Symbol" w:hAnsi="Symbol" w:hint="default"/>
+      </w:rPr>
+    </w:lvl>
+    <w:lvl w:ilvl="4" w:tplc="44090003" w:tentative="1">
+      <w:start w:val="1"/>
+      <w:numFmt w:val="bullet"/>
+      <w:lvlText w:val="o"/>
+      <w:lvlJc w:val="left"/>
+      <w:pPr>
+        <w:ind w:left="3600" w:hanging="360"/>
+      </w:pPr>
+      <w:rPr>
+        <w:rFonts w:ascii="Courier New" w:hAnsi="Courier New" w:cs="Courier New" w:hint="default"/>
+      </w:rPr>
+    </w:lvl>
+    <w:lvl w:ilvl="5" w:tplc="44090005" w:tentative="1">
+      <w:start w:val="1"/>
+      <w:numFmt w:val="bullet"/>
+      <w:lvlText w:val=""/>
+      <w:lvlJc w:val="left"/>
+      <w:pPr>
+        <w:ind w:left="4320" w:hanging="360"/>
+      </w:pPr>
+      <w:rPr>
+        <w:rFonts w:ascii="Wingdings" w:hAnsi="Wingdings" w:hint="default"/>
+      </w:rPr>
+    </w:lvl>
+    <w:lvl w:ilvl="6" w:tplc="44090001" w:tentative="1">
+      <w:start w:val="1"/>
+      <w:numFmt w:val="bullet"/>
+      <w:lvlText w:val=""/>
+      <w:lvlJc w:val="left"/>
+      <w:pPr>
+        <w:ind w:left="5040" w:hanging="360"/>
+      </w:pPr>
+      <w:rPr>
+        <w:rFonts w:ascii="Symbol" w:hAnsi="Symbol" w:hint="default"/>
+      </w:rPr>
+    </w:lvl>
+    <w:lvl w:ilvl="7" w:tplc="44090003" w:tentative="1">
+      <w:start w:val="1"/>
+      <w:numFmt w:val="bullet"/>
+      <w:lvlText w:val="o"/>
+      <w:lvlJc w:val="left"/>
+      <w:pPr>
+        <w:ind w:left="5760" w:hanging="360"/>
+      </w:pPr>
+      <w:rPr>
+        <w:rFonts w:ascii="Courier New" w:hAnsi="Courier New" w:cs="Courier New" w:hint="default"/>
+      </w:rPr>
+    </w:lvl>
+    <w:lvl w:ilvl="8" w:tplc="44090005" w:tentative="1">
+      <w:start w:val="1"/>
+      <w:numFmt w:val="bullet"/>
+      <w:lvlText w:val=""/>
+      <w:lvlJc w:val="left"/>
+      <w:pPr>
+        <w:ind w:left="6480" w:hanging="360"/>
+      </w:pPr>
+      <w:rPr>
+        <w:rFonts w:ascii="Wingdings" w:hAnsi="Wingdings" w:hint="default"/>
+      </w:rPr>
+    </w:lvl>
+  </w:abstractNum>
+  <w:abstractNum w:abstractNumId="10" w15:restartNumberingAfterBreak="0">
     <w:nsid w:val="2C864025"/>
     <w:multiLevelType w:val="multilevel"/>
     <w:tmpl w:val="4409001F"/>
@@ -9424,7 +11311,7 @@
       </w:pPr>
     </w:lvl>
   </w:abstractNum>
-  <w:abstractNum w:abstractNumId="10" w15:restartNumberingAfterBreak="0">
+  <w:abstractNum w:abstractNumId="11" w15:restartNumberingAfterBreak="0">
     <w:nsid w:val="391A47EE"/>
     <w:multiLevelType w:val="hybridMultilevel"/>
     <w:tmpl w:val="608C2FC8"/>
@@ -9513,7 +11400,7 @@
       </w:pPr>
     </w:lvl>
   </w:abstractNum>
-  <w:abstractNum w:abstractNumId="11" w15:restartNumberingAfterBreak="0">
+  <w:abstractNum w:abstractNumId="12" w15:restartNumberingAfterBreak="0">
     <w:nsid w:val="4AC53607"/>
     <w:multiLevelType w:val="hybridMultilevel"/>
     <w:tmpl w:val="CAB8B28C"/>
@@ -9602,7 +11489,7 @@
       </w:pPr>
     </w:lvl>
   </w:abstractNum>
-  <w:abstractNum w:abstractNumId="12" w15:restartNumberingAfterBreak="0">
+  <w:abstractNum w:abstractNumId="13" w15:restartNumberingAfterBreak="0">
     <w:nsid w:val="4C767CF7"/>
     <w:multiLevelType w:val="hybridMultilevel"/>
     <w:tmpl w:val="E006DF60"/>
@@ -9691,7 +11578,233 @@
       </w:pPr>
     </w:lvl>
   </w:abstractNum>
-  <w:abstractNum w:abstractNumId="13" w15:restartNumberingAfterBreak="0">
+  <w:abstractNum w:abstractNumId="14" w15:restartNumberingAfterBreak="0">
+    <w:nsid w:val="4D1A3479"/>
+    <w:multiLevelType w:val="hybridMultilevel"/>
+    <w:tmpl w:val="71E03ACE"/>
+    <w:lvl w:ilvl="0" w:tplc="44090001">
+      <w:start w:val="1"/>
+      <w:numFmt w:val="bullet"/>
+      <w:lvlText w:val=""/>
+      <w:lvlJc w:val="left"/>
+      <w:pPr>
+        <w:ind w:left="720" w:hanging="360"/>
+      </w:pPr>
+      <w:rPr>
+        <w:rFonts w:ascii="Symbol" w:hAnsi="Symbol" w:hint="default"/>
+      </w:rPr>
+    </w:lvl>
+    <w:lvl w:ilvl="1" w:tplc="44090003" w:tentative="1">
+      <w:start w:val="1"/>
+      <w:numFmt w:val="bullet"/>
+      <w:lvlText w:val="o"/>
+      <w:lvlJc w:val="left"/>
+      <w:pPr>
+        <w:ind w:left="1440" w:hanging="360"/>
+      </w:pPr>
+      <w:rPr>
+        <w:rFonts w:ascii="Courier New" w:hAnsi="Courier New" w:cs="Courier New" w:hint="default"/>
+      </w:rPr>
+    </w:lvl>
+    <w:lvl w:ilvl="2" w:tplc="44090005" w:tentative="1">
+      <w:start w:val="1"/>
+      <w:numFmt w:val="bullet"/>
+      <w:lvlText w:val=""/>
+      <w:lvlJc w:val="left"/>
+      <w:pPr>
+        <w:ind w:left="2160" w:hanging="360"/>
+      </w:pPr>
+      <w:rPr>
+        <w:rFonts w:ascii="Wingdings" w:hAnsi="Wingdings" w:hint="default"/>
+      </w:rPr>
+    </w:lvl>
+    <w:lvl w:ilvl="3" w:tplc="44090001" w:tentative="1">
+      <w:start w:val="1"/>
+      <w:numFmt w:val="bullet"/>
+      <w:lvlText w:val=""/>
+      <w:lvlJc w:val="left"/>
+      <w:pPr>
+        <w:ind w:left="2880" w:hanging="360"/>
+      </w:pPr>
+      <w:rPr>
+        <w:rFonts w:ascii="Symbol" w:hAnsi="Symbol" w:hint="default"/>
+      </w:rPr>
+    </w:lvl>
+    <w:lvl w:ilvl="4" w:tplc="44090003" w:tentative="1">
+      <w:start w:val="1"/>
+      <w:numFmt w:val="bullet"/>
+      <w:lvlText w:val="o"/>
+      <w:lvlJc w:val="left"/>
+      <w:pPr>
+        <w:ind w:left="3600" w:hanging="360"/>
+      </w:pPr>
+      <w:rPr>
+        <w:rFonts w:ascii="Courier New" w:hAnsi="Courier New" w:cs="Courier New" w:hint="default"/>
+      </w:rPr>
+    </w:lvl>
+    <w:lvl w:ilvl="5" w:tplc="44090005" w:tentative="1">
+      <w:start w:val="1"/>
+      <w:numFmt w:val="bullet"/>
+      <w:lvlText w:val=""/>
+      <w:lvlJc w:val="left"/>
+      <w:pPr>
+        <w:ind w:left="4320" w:hanging="360"/>
+      </w:pPr>
+      <w:rPr>
+        <w:rFonts w:ascii="Wingdings" w:hAnsi="Wingdings" w:hint="default"/>
+      </w:rPr>
+    </w:lvl>
+    <w:lvl w:ilvl="6" w:tplc="44090001" w:tentative="1">
+      <w:start w:val="1"/>
+      <w:numFmt w:val="bullet"/>
+      <w:lvlText w:val=""/>
+      <w:lvlJc w:val="left"/>
+      <w:pPr>
+        <w:ind w:left="5040" w:hanging="360"/>
+      </w:pPr>
+      <w:rPr>
+        <w:rFonts w:ascii="Symbol" w:hAnsi="Symbol" w:hint="default"/>
+      </w:rPr>
+    </w:lvl>
+    <w:lvl w:ilvl="7" w:tplc="44090003" w:tentative="1">
+      <w:start w:val="1"/>
+      <w:numFmt w:val="bullet"/>
+      <w:lvlText w:val="o"/>
+      <w:lvlJc w:val="left"/>
+      <w:pPr>
+        <w:ind w:left="5760" w:hanging="360"/>
+      </w:pPr>
+      <w:rPr>
+        <w:rFonts w:ascii="Courier New" w:hAnsi="Courier New" w:cs="Courier New" w:hint="default"/>
+      </w:rPr>
+    </w:lvl>
+    <w:lvl w:ilvl="8" w:tplc="44090005" w:tentative="1">
+      <w:start w:val="1"/>
+      <w:numFmt w:val="bullet"/>
+      <w:lvlText w:val=""/>
+      <w:lvlJc w:val="left"/>
+      <w:pPr>
+        <w:ind w:left="6480" w:hanging="360"/>
+      </w:pPr>
+      <w:rPr>
+        <w:rFonts w:ascii="Wingdings" w:hAnsi="Wingdings" w:hint="default"/>
+      </w:rPr>
+    </w:lvl>
+  </w:abstractNum>
+  <w:abstractNum w:abstractNumId="15" w15:restartNumberingAfterBreak="0">
+    <w:nsid w:val="56652890"/>
+    <w:multiLevelType w:val="hybridMultilevel"/>
+    <w:tmpl w:val="89AC1C9A"/>
+    <w:lvl w:ilvl="0" w:tplc="44090001">
+      <w:start w:val="1"/>
+      <w:numFmt w:val="bullet"/>
+      <w:lvlText w:val=""/>
+      <w:lvlJc w:val="left"/>
+      <w:pPr>
+        <w:ind w:left="720" w:hanging="360"/>
+      </w:pPr>
+      <w:rPr>
+        <w:rFonts w:ascii="Symbol" w:hAnsi="Symbol" w:hint="default"/>
+      </w:rPr>
+    </w:lvl>
+    <w:lvl w:ilvl="1" w:tplc="44090003" w:tentative="1">
+      <w:start w:val="1"/>
+      <w:numFmt w:val="bullet"/>
+      <w:lvlText w:val="o"/>
+      <w:lvlJc w:val="left"/>
+      <w:pPr>
+        <w:ind w:left="1440" w:hanging="360"/>
+      </w:pPr>
+      <w:rPr>
+        <w:rFonts w:ascii="Courier New" w:hAnsi="Courier New" w:cs="Courier New" w:hint="default"/>
+      </w:rPr>
+    </w:lvl>
+    <w:lvl w:ilvl="2" w:tplc="44090005" w:tentative="1">
+      <w:start w:val="1"/>
+      <w:numFmt w:val="bullet"/>
+      <w:lvlText w:val=""/>
+      <w:lvlJc w:val="left"/>
+      <w:pPr>
+        <w:ind w:left="2160" w:hanging="360"/>
+      </w:pPr>
+      <w:rPr>
+        <w:rFonts w:ascii="Wingdings" w:hAnsi="Wingdings" w:hint="default"/>
+      </w:rPr>
+    </w:lvl>
+    <w:lvl w:ilvl="3" w:tplc="44090001" w:tentative="1">
+      <w:start w:val="1"/>
+      <w:numFmt w:val="bullet"/>
+      <w:lvlText w:val=""/>
+      <w:lvlJc w:val="left"/>
+      <w:pPr>
+        <w:ind w:left="2880" w:hanging="360"/>
+      </w:pPr>
+      <w:rPr>
+        <w:rFonts w:ascii="Symbol" w:hAnsi="Symbol" w:hint="default"/>
+      </w:rPr>
+    </w:lvl>
+    <w:lvl w:ilvl="4" w:tplc="44090003" w:tentative="1">
+      <w:start w:val="1"/>
+      <w:numFmt w:val="bullet"/>
+      <w:lvlText w:val="o"/>
+      <w:lvlJc w:val="left"/>
+      <w:pPr>
+        <w:ind w:left="3600" w:hanging="360"/>
+      </w:pPr>
+      <w:rPr>
+        <w:rFonts w:ascii="Courier New" w:hAnsi="Courier New" w:cs="Courier New" w:hint="default"/>
+      </w:rPr>
+    </w:lvl>
+    <w:lvl w:ilvl="5" w:tplc="44090005" w:tentative="1">
+      <w:start w:val="1"/>
+      <w:numFmt w:val="bullet"/>
+      <w:lvlText w:val=""/>
+      <w:lvlJc w:val="left"/>
+      <w:pPr>
+        <w:ind w:left="4320" w:hanging="360"/>
+      </w:pPr>
+      <w:rPr>
+        <w:rFonts w:ascii="Wingdings" w:hAnsi="Wingdings" w:hint="default"/>
+      </w:rPr>
+    </w:lvl>
+    <w:lvl w:ilvl="6" w:tplc="44090001" w:tentative="1">
+      <w:start w:val="1"/>
+      <w:numFmt w:val="bullet"/>
+      <w:lvlText w:val=""/>
+      <w:lvlJc w:val="left"/>
+      <w:pPr>
+        <w:ind w:left="5040" w:hanging="360"/>
+      </w:pPr>
+      <w:rPr>
+        <w:rFonts w:ascii="Symbol" w:hAnsi="Symbol" w:hint="default"/>
+      </w:rPr>
+    </w:lvl>
+    <w:lvl w:ilvl="7" w:tplc="44090003" w:tentative="1">
+      <w:start w:val="1"/>
+      <w:numFmt w:val="bullet"/>
+      <w:lvlText w:val="o"/>
+      <w:lvlJc w:val="left"/>
+      <w:pPr>
+        <w:ind w:left="5760" w:hanging="360"/>
+      </w:pPr>
+      <w:rPr>
+        <w:rFonts w:ascii="Courier New" w:hAnsi="Courier New" w:cs="Courier New" w:hint="default"/>
+      </w:rPr>
+    </w:lvl>
+    <w:lvl w:ilvl="8" w:tplc="44090005" w:tentative="1">
+      <w:start w:val="1"/>
+      <w:numFmt w:val="bullet"/>
+      <w:lvlText w:val=""/>
+      <w:lvlJc w:val="left"/>
+      <w:pPr>
+        <w:ind w:left="6480" w:hanging="360"/>
+      </w:pPr>
+      <w:rPr>
+        <w:rFonts w:ascii="Wingdings" w:hAnsi="Wingdings" w:hint="default"/>
+      </w:rPr>
+    </w:lvl>
+  </w:abstractNum>
+  <w:abstractNum w:abstractNumId="16" w15:restartNumberingAfterBreak="0">
     <w:nsid w:val="576B70A5"/>
     <w:multiLevelType w:val="hybridMultilevel"/>
     <w:tmpl w:val="CBCCF546"/>
@@ -9804,7 +11917,7 @@
       </w:rPr>
     </w:lvl>
   </w:abstractNum>
-  <w:abstractNum w:abstractNumId="14" w15:restartNumberingAfterBreak="0">
+  <w:abstractNum w:abstractNumId="17" w15:restartNumberingAfterBreak="0">
     <w:nsid w:val="595C5C89"/>
     <w:multiLevelType w:val="hybridMultilevel"/>
     <w:tmpl w:val="BB58A9A2"/>
@@ -9894,7 +12007,7 @@
       </w:pPr>
     </w:lvl>
   </w:abstractNum>
-  <w:abstractNum w:abstractNumId="15" w15:restartNumberingAfterBreak="0">
+  <w:abstractNum w:abstractNumId="18" w15:restartNumberingAfterBreak="0">
     <w:nsid w:val="707B624C"/>
     <w:multiLevelType w:val="hybridMultilevel"/>
     <w:tmpl w:val="4066D8D2"/>
@@ -9983,7 +12096,7 @@
       </w:pPr>
     </w:lvl>
   </w:abstractNum>
-  <w:abstractNum w:abstractNumId="16" w15:restartNumberingAfterBreak="0">
+  <w:abstractNum w:abstractNumId="19" w15:restartNumberingAfterBreak="0">
     <w:nsid w:val="76C22FEC"/>
     <w:multiLevelType w:val="hybridMultilevel"/>
     <w:tmpl w:val="7D661E6A"/>
@@ -10076,28 +12189,28 @@
     <w:abstractNumId w:val="7"/>
   </w:num>
   <w:num w:numId="2" w16cid:durableId="1890915732">
+    <w:abstractNumId w:val="16"/>
+  </w:num>
+  <w:num w:numId="3" w16cid:durableId="558782592">
     <w:abstractNumId w:val="13"/>
   </w:num>
-  <w:num w:numId="3" w16cid:durableId="558782592">
-    <w:abstractNumId w:val="12"/>
-  </w:num>
   <w:num w:numId="4" w16cid:durableId="291253581">
-    <w:abstractNumId w:val="15"/>
+    <w:abstractNumId w:val="18"/>
   </w:num>
   <w:num w:numId="5" w16cid:durableId="991061032">
     <w:abstractNumId w:val="0"/>
   </w:num>
   <w:num w:numId="6" w16cid:durableId="1289168179">
-    <w:abstractNumId w:val="16"/>
+    <w:abstractNumId w:val="19"/>
   </w:num>
   <w:num w:numId="7" w16cid:durableId="197862497">
+    <w:abstractNumId w:val="12"/>
+  </w:num>
+  <w:num w:numId="8" w16cid:durableId="551042543">
     <w:abstractNumId w:val="11"/>
   </w:num>
-  <w:num w:numId="8" w16cid:durableId="551042543">
-    <w:abstractNumId w:val="10"/>
-  </w:num>
   <w:num w:numId="9" w16cid:durableId="608927404">
-    <w:abstractNumId w:val="14"/>
+    <w:abstractNumId w:val="17"/>
   </w:num>
   <w:num w:numId="10" w16cid:durableId="495653598">
     <w:abstractNumId w:val="2"/>
@@ -10106,7 +12219,7 @@
     <w:abstractNumId w:val="3"/>
   </w:num>
   <w:num w:numId="12" w16cid:durableId="395125979">
-    <w:abstractNumId w:val="9"/>
+    <w:abstractNumId w:val="10"/>
   </w:num>
   <w:num w:numId="13" w16cid:durableId="791440515">
     <w:abstractNumId w:val="6"/>
@@ -10122,6 +12235,15 @@
   </w:num>
   <w:num w:numId="17" w16cid:durableId="543252947">
     <w:abstractNumId w:val="5"/>
+  </w:num>
+  <w:num w:numId="18" w16cid:durableId="2012677018">
+    <w:abstractNumId w:val="14"/>
+  </w:num>
+  <w:num w:numId="19" w16cid:durableId="1749880287">
+    <w:abstractNumId w:val="15"/>
+  </w:num>
+  <w:num w:numId="20" w16cid:durableId="2025666564">
+    <w:abstractNumId w:val="9"/>
   </w:num>
 </w:numbering>
 </file>
@@ -11581,7 +13703,7 @@
     <b:Volume>22</b:Volume>
     <b:Issue>5</b:Issue>
     <b:DOI>10.1109/TITS.2020.2973365</b:DOI>
-    <b:RefOrder>2</b:RefOrder>
+    <b:RefOrder>1</b:RefOrder>
   </b:Source>
   <b:Source>
     <b:Tag>Nur25</b:Tag>
@@ -11627,7 +13749,7 @@
     <b:Volume>23</b:Volume>
     <b:Issue>6</b:Issue>
     <b:DOI>10.21837/pm.v23i39.1913</b:DOI>
-    <b:RefOrder>3</b:RefOrder>
+    <b:RefOrder>2</b:RefOrder>
   </b:Source>
   <b:Source>
     <b:Tag>Jin25</b:Tag>
@@ -11672,7 +13794,7 @@
     <b:Volume>4</b:Volume>
     <b:Issue>1</b:Issue>
     <b:DOI>10.1016/j.multra.2024.100184</b:DOI>
-    <b:RefOrder>4</b:RefOrder>
+    <b:RefOrder>3</b:RefOrder>
   </b:Source>
   <b:Source>
     <b:Tag>Cho22</b:Tag>
@@ -11712,7 +13834,7 @@
     <b:Volume>7</b:Volume>
     <b:Issue>21</b:Issue>
     <b:DOI>10.21834/ebpj.v7i21.3751</b:DOI>
-    <b:RefOrder>5</b:RefOrder>
+    <b:RefOrder>4</b:RefOrder>
   </b:Source>
   <b:Source>
     <b:Tag>Pen22</b:Tag>
@@ -11746,7 +13868,7 @@
     <b:Volume>23</b:Volume>
     <b:Issue>7</b:Issue>
     <b:DOI>10.1109/TITS.2021.3065404</b:DOI>
-    <b:RefOrder>6</b:RefOrder>
+    <b:RefOrder>5</b:RefOrder>
   </b:Source>
   <b:Source>
     <b:Tag>Lip21</b:Tag>
@@ -11784,7 +13906,7 @@
     <b:Volume>13</b:Volume>
     <b:Issue>20</b:Issue>
     <b:DOI>10.3390/su132011450</b:DOI>
-    <b:RefOrder>7</b:RefOrder>
+    <b:RefOrder>6</b:RefOrder>
   </b:Source>
   <b:Source>
     <b:Tag>MoZ25</b:Tag>
@@ -11811,7 +13933,7 @@
     <b:Month>Novemeber</b:Month>
     <b:Publisher>VTRC</b:Publisher>
     <b:URL>https://vtrc.virginia.gov/media/vtrc/vtrc-pdf/vtrc-pdf/26-R23.pdf</b:URL>
-    <b:RefOrder>8</b:RefOrder>
+    <b:RefOrder>7</b:RefOrder>
   </b:Source>
   <b:Source>
     <b:Tag>Zhi</b:Tag>
@@ -11852,7 +13974,7 @@
     <b:Publisher>Elsevier</b:Publisher>
     <b:Volume>135</b:Volume>
     <b:DOI>10.1016/j.datak.2021.101912</b:DOI>
-    <b:RefOrder>9</b:RefOrder>
+    <b:RefOrder>8</b:RefOrder>
   </b:Source>
   <b:Source>
     <b:Tag>Sog24</b:Tag>
@@ -11886,7 +14008,7 @@
     <b:Publisher>Springer Nature Link</b:Publisher>
     <b:Volume>17</b:Volume>
     <b:DOI>10.1007/s12469-024-00367-6</b:DOI>
-    <b:RefOrder>10</b:RefOrder>
+    <b:RefOrder>9</b:RefOrder>
   </b:Source>
   <b:Source>
     <b:Tag>Ahm21</b:Tag>
@@ -11931,7 +14053,7 @@
     <b:Volume>2</b:Volume>
     <b:Issue>1</b:Issue>
     <b:DOI>10.51526/kbes.2021.2.1.19-30</b:DOI>
-    <b:RefOrder>11</b:RefOrder>
+    <b:RefOrder>10</b:RefOrder>
   </b:Source>
   <b:Source>
     <b:Tag>Ahm22</b:Tag>
@@ -11977,7 +14099,7 @@
     <b:Publisher>MDPI</b:Publisher>
     <b:Volume>10</b:Volume>
     <b:DOI>10.3390/math10132213</b:DOI>
-    <b:RefOrder>12</b:RefOrder>
+    <b:RefOrder>11</b:RefOrder>
   </b:Source>
   <b:Source>
     <b:Tag>Mah21</b:Tag>
@@ -12007,7 +14129,7 @@
     <b:Publisher>Frontiers</b:Publisher>
     <b:Volume>12</b:Volume>
     <b:DOI>10.3389/fpsyg.2021.619308</b:DOI>
-    <b:RefOrder>13</b:RefOrder>
+    <b:RefOrder>12</b:RefOrder>
   </b:Source>
   <b:Source>
     <b:Tag>Nur22</b:Tag>
@@ -12056,7 +14178,7 @@
     <b:Volume>23</b:Volume>
     <b:Issue>1</b:Issue>
     <b:DOI>10.54609/reaser.v23i1.185</b:DOI>
-    <b:RefOrder>14</b:RefOrder>
+    <b:RefOrder>13</b:RefOrder>
   </b:Source>
   <b:Source>
     <b:Tag>Mah25</b:Tag>
@@ -12103,7 +14225,7 @@
     <b:Publisher>Elsevier</b:Publisher>
     <b:Volume>27</b:Volume>
     <b:DOI>10.1016/j.rineng.2025.106126</b:DOI>
-    <b:RefOrder>15</b:RefOrder>
+    <b:RefOrder>14</b:RefOrder>
   </b:Source>
   <b:Source>
     <b:Tag>Chr22</b:Tag>
@@ -12141,7 +14263,7 @@
     <b:Publisher>MDPI</b:Publisher>
     <b:Volume>14</b:Volume>
     <b:DOI>10.3390/su14074211</b:DOI>
-    <b:RefOrder>16</b:RefOrder>
+    <b:RefOrder>15</b:RefOrder>
   </b:Source>
   <b:Source>
     <b:Tag>Che25</b:Tag>
@@ -12185,13 +14307,93 @@
     <b:Volume>57</b:Volume>
     <b:Issue>9</b:Issue>
     <b:DOI>10.1145/3715902</b:DOI>
-    <b:RefOrder>1</b:RefOrder>
+    <b:RefOrder>16</b:RefOrder>
+  </b:Source>
+  <b:Source>
+    <b:Tag>AJe24</b:Tag>
+    <b:SourceType>JournalArticle</b:SourceType>
+    <b:Guid>{B0998175-43CB-450B-832A-80FE043884A9}</b:Guid>
+    <b:Author>
+      <b:Author>
+        <b:NameList>
+          <b:Person>
+            <b:Last>Jevinger</b:Last>
+            <b:First>A.</b:First>
+          </b:Person>
+          <b:Person>
+            <b:Last>Zhao</b:Last>
+            <b:First>C.</b:First>
+          </b:Person>
+          <b:Person>
+            <b:Last>Persson</b:Last>
+            <b:First>J.</b:First>
+            <b:Middle>A.</b:Middle>
+          </b:Person>
+          <b:Person>
+            <b:Last>Davidsson</b:Last>
+            <b:First>P.</b:First>
+          </b:Person>
+        </b:NameList>
+      </b:Author>
+    </b:Author>
+    <b:Title>Artificial Intelligence for improving public transport: A mapping study</b:Title>
+    <b:JournalName>Public Transport</b:JournalName>
+    <b:Year>2024</b:Year>
+    <b:Pages>99 - 158</b:Pages>
+    <b:Month>March</b:Month>
+    <b:Publisher>Springer Nature Link</b:Publisher>
+    <b:Volume>16</b:Volume>
+    <b:DOI>10.1007/s12469-023-00334-7</b:DOI>
+    <b:RefOrder>17</b:RefOrder>
+  </b:Source>
+  <b:Source>
+    <b:Tag>San24</b:Tag>
+    <b:SourceType>JournalArticle</b:SourceType>
+    <b:Guid>{60D15476-4D68-44E7-A60A-C582AE0FB2D7}</b:Guid>
+    <b:Title>A multi-modal geospatial–temporal LSTM based deep learning framework for predictive modeling of urban mobility patterns</b:Title>
+    <b:JournalName>Scientific Reports</b:JournalName>
+    <b:Year>2024</b:Year>
+    <b:Pages>1 - 19</b:Pages>
+    <b:Author>
+      <b:Author>
+        <b:NameList>
+          <b:Person>
+            <b:Last>S.K.B</b:Last>
+            <b:First>Sangeetha</b:First>
+          </b:Person>
+          <b:Person>
+            <b:Last>Mathivanan</b:Last>
+            <b:First>Sandeep</b:First>
+            <b:Middle>Kumar</b:Middle>
+          </b:Person>
+          <b:Person>
+            <b:Last>Rajadurai</b:Last>
+            <b:First>Hariharan</b:First>
+          </b:Person>
+          <b:Person>
+            <b:Last>Cho</b:Last>
+            <b:First>Jaehyuk</b:First>
+          </b:Person>
+          <b:Person>
+            <b:Last>Easwaramoorthy</b:Last>
+            <b:First>Sathishkumar</b:First>
+            <b:Middle>Veerappampalayam</b:Middle>
+          </b:Person>
+        </b:NameList>
+      </b:Author>
+    </b:Author>
+    <b:Month>December</b:Month>
+    <b:Day>30</b:Day>
+    <b:Publisher>Scientific Reports</b:Publisher>
+    <b:Volume>14</b:Volume>
+    <b:DOI>10.1038/s41598-024-74237-3</b:DOI>
+    <b:RefOrder>18</b:RefOrder>
   </b:Source>
 </b:Sources>
 </file>
 
 <file path=customXml/itemProps1.xml><?xml version="1.0" encoding="utf-8"?>
-<ds:datastoreItem xmlns:ds="http://schemas.openxmlformats.org/officeDocument/2006/customXml" ds:itemID="{656EF3E9-74EC-4C48-B89E-36D61E2BC0DC}">
+<ds:datastoreItem xmlns:ds="http://schemas.openxmlformats.org/officeDocument/2006/customXml" ds:itemID="{C1E01755-D7FA-4170-B43C-AC5B76A8FFDD}">
   <ds:schemaRefs>
     <ds:schemaRef ds:uri="http://schemas.openxmlformats.org/officeDocument/2006/bibliography"/>
   </ds:schemaRefs>

</xml_diff>

<commit_message>
feat: :sparkles: Added HMT-TSF analysis document
</commit_message>
<xml_diff>
--- a/docs/24202141_p1_report.docx
+++ b/docs/24202141_p1_report.docx
@@ -5177,19 +5177,31 @@
           <w:p>
             <w:pPr>
               <w:jc w:val="left"/>
+            </w:pPr>
+            <w:r>
+              <w:t>A</w:t>
+            </w:r>
+            <w:r>
+              <w:t xml:space="preserve">ttention-based </w:t>
+            </w:r>
+            <w:r>
+              <w:t>STGCN</w:t>
+            </w:r>
+            <w:r>
+              <w:t xml:space="preserve"> (</w:t>
+            </w:r>
+            <w:r>
               <w:rPr>
                 <w:b/>
                 <w:bCs/>
               </w:rPr>
-            </w:pPr>
-            <w:r>
-              <w:t>A</w:t>
-            </w:r>
-            <w:r>
-              <w:t xml:space="preserve">ttention-based </w:t>
-            </w:r>
-            <w:r>
-              <w:t>STGCN</w:t>
+              <w:t>ASTGCN</w:t>
+            </w:r>
+            <w:r>
+              <w:t xml:space="preserve">); </w:t>
+            </w:r>
+            <w:r>
+              <w:t>Temporal Pattern Attention</w:t>
             </w:r>
             <w:r>
               <w:t xml:space="preserve"> (</w:t>
@@ -5199,61 +5211,27 @@
                 <w:b/>
                 <w:bCs/>
               </w:rPr>
-              <w:t>ASTGCN</w:t>
-            </w:r>
-            <w:r>
-              <w:t xml:space="preserve">); </w:t>
-            </w:r>
-            <w:r>
-              <w:t>Temporal Pattern Attention</w:t>
-            </w:r>
-            <w:r>
-              <w:t xml:space="preserve"> (</w:t>
+              <w:t>TPA</w:t>
+            </w:r>
+            <w:r>
+              <w:t>)</w:t>
             </w:r>
             <w:r>
               <w:rPr>
                 <w:b/>
                 <w:bCs/>
               </w:rPr>
-              <w:t>TPA</w:t>
-            </w:r>
-            <w:r>
-              <w:t>)</w:t>
+              <w:t>-LSTM</w:t>
             </w:r>
             <w:r>
               <w:rPr>
                 <w:b/>
                 <w:bCs/>
               </w:rPr>
-              <w:t>-LSTM</w:t>
-            </w:r>
-            <w:r>
-              <w:rPr>
-                <w:b/>
-                <w:bCs/>
-              </w:rPr>
-              <w:t xml:space="preserve">; </w:t>
-            </w:r>
-            <w:r>
-              <w:t>Temporal Fusion Transformer</w:t>
-            </w:r>
-          </w:p>
-          <w:p>
-            <w:pPr>
-              <w:jc w:val="left"/>
-            </w:pPr>
-            <w:r>
-              <w:t>(</w:t>
-            </w:r>
-            <w:r>
-              <w:rPr>
-                <w:b/>
-                <w:bCs/>
-              </w:rPr>
-              <w:t>TFT</w:t>
-            </w:r>
-            <w:r>
-              <w:t xml:space="preserve">); </w:t>
+              <w:t>;</w:t>
+            </w:r>
+            <w:r>
+              <w:t xml:space="preserve"> </w:t>
             </w:r>
             <w:proofErr w:type="spellStart"/>
             <w:r>
@@ -6704,7 +6682,7 @@
         </w:rPr>
         <w:lastRenderedPageBreak/>
         <w:drawing>
-          <wp:inline distT="0" distB="0" distL="0" distR="0" wp14:anchorId="125BB2D3" wp14:editId="5CE7E8B4">
+          <wp:inline distT="0" distB="0" distL="0" distR="0" wp14:anchorId="125BB2D3" wp14:editId="580EF6B4">
             <wp:extent cx="5722620" cy="4290060"/>
             <wp:effectExtent l="19050" t="19050" r="11430" b="15240"/>
             <wp:docPr id="1339339132" name="Picture 1"/>
@@ -7087,56 +7065,7 @@
           <w:noProof/>
           <w:lang w:val="en-US"/>
         </w:rPr>
-        <w:t xml:space="preserve">Ge et al. </w:t>
-      </w:r>
-      <w:r>
-        <w:rPr>
-          <w:noProof/>
-          <w:lang w:val="en-US"/>
-        </w:rPr>
-        <w:t>(</w:t>
-      </w:r>
-      <w:r>
-        <w:rPr>
-          <w:noProof/>
-          <w:lang w:val="en-US"/>
-        </w:rPr>
-        <w:t>2021</w:t>
-      </w:r>
-      <w:r>
-        <w:rPr>
-          <w:noProof/>
-          <w:lang w:val="en-US"/>
-        </w:rPr>
-        <w:t>) and</w:t>
-      </w:r>
-      <w:r>
-        <w:rPr>
-          <w:noProof/>
-          <w:lang w:val="en-US"/>
-        </w:rPr>
-        <w:t xml:space="preserve"> Liu et al. </w:t>
-      </w:r>
-      <w:r>
-        <w:rPr>
-          <w:noProof/>
-          <w:lang w:val="en-US"/>
-        </w:rPr>
-        <w:t>(</w:t>
-      </w:r>
-      <w:r>
-        <w:rPr>
-          <w:noProof/>
-          <w:lang w:val="en-US"/>
-        </w:rPr>
-        <w:t>2025)</w:t>
-      </w:r>
-      <w:r>
-        <w:rPr>
-          <w:noProof/>
-          <w:lang w:val="en-US"/>
-        </w:rPr>
-        <w:t xml:space="preserve">, </w:t>
+        <w:t xml:space="preserve">Ge et al. (2021) and Liu et al. (2025), </w:t>
       </w:r>
       <w:r>
         <w:t>k</w:t>

</xml_diff>

<commit_message>
fix: :bug: Fix bug on feature align and sequence builder, update results
</commit_message>
<xml_diff>
--- a/docs/24202141_p1_report.docx
+++ b/docs/24202141_p1_report.docx
@@ -5646,7 +5646,96 @@
       </w:r>
       <w:bookmarkEnd w:id="6"/>
     </w:p>
-    <w:p/>
+    <w:p>
+      <w:pPr>
+        <w:pStyle w:val="Heading2"/>
+        <w:numPr>
+          <w:ilvl w:val="1"/>
+          <w:numId w:val="10"/>
+        </w:numPr>
+        <w:rPr>
+          <w:b/>
+          <w:bCs/>
+          <w:sz w:val="24"/>
+          <w:szCs w:val="24"/>
+          <w:u w:val="single"/>
+        </w:rPr>
+      </w:pPr>
+      <w:r>
+        <w:rPr>
+          <w:b/>
+          <w:bCs/>
+          <w:sz w:val="24"/>
+          <w:szCs w:val="24"/>
+          <w:u w:val="single"/>
+        </w:rPr>
+        <w:t>Expected Outcome</w:t>
+      </w:r>
+      <w:r>
+        <w:rPr>
+          <w:b/>
+          <w:bCs/>
+          <w:sz w:val="24"/>
+          <w:szCs w:val="24"/>
+          <w:u w:val="single"/>
+        </w:rPr>
+        <w:t>s</w:t>
+      </w:r>
+    </w:p>
+    <w:p>
+      <w:pPr>
+        <w:pStyle w:val="ListParagraph"/>
+        <w:numPr>
+          <w:ilvl w:val="0"/>
+          <w:numId w:val="22"/>
+        </w:numPr>
+      </w:pPr>
+      <w:r>
+        <w:t>Provide a detailed comparative analysis evaluating multiple deep learning models across distinct lookback windows, explicitly segmented by MCO periods.</w:t>
+      </w:r>
+    </w:p>
+    <w:p>
+      <w:pPr>
+        <w:pStyle w:val="ListParagraph"/>
+        <w:numPr>
+          <w:ilvl w:val="0"/>
+          <w:numId w:val="22"/>
+        </w:numPr>
+      </w:pPr>
+      <w:r>
+        <w:t xml:space="preserve">Introduce a superior forecasting model that outperforms existing SOTA baselines across all lookback windows and MCO phases, accompanied by a reduced feature variant according to SHAP-based feature importance ranking, to determine </w:t>
+      </w:r>
+      <w:r>
+        <w:t>the effect of the removal of near-zero important</w:t>
+      </w:r>
+      <w:r>
+        <w:t xml:space="preserve"> spatial and temporal feature</w:t>
+      </w:r>
+      <w:r>
+        <w:t>s</w:t>
+      </w:r>
+      <w:r>
+        <w:t xml:space="preserve"> toward ridership</w:t>
+      </w:r>
+      <w:r>
+        <w:t xml:space="preserve"> prediction</w:t>
+      </w:r>
+      <w:r>
+        <w:t>.</w:t>
+      </w:r>
+    </w:p>
+    <w:p>
+      <w:pPr>
+        <w:pStyle w:val="ListParagraph"/>
+        <w:numPr>
+          <w:ilvl w:val="0"/>
+          <w:numId w:val="22"/>
+        </w:numPr>
+      </w:pPr>
+      <w:r>
+        <w:t>Develop a functional command-line interface (CLI) inference tool capable of predicting a 7-day ridership distribution horizon across all 12 distinct transit networks utilizing historical distribution percentages using the proposed model.</w:t>
+      </w:r>
+    </w:p>
     <w:p>
       <w:pPr>
         <w:pStyle w:val="Heading1"/>
@@ -5719,7 +5808,11 @@
         <w:ind w:firstLine="720"/>
       </w:pPr>
       <w:r>
-        <w:t xml:space="preserve">Public transport reliability is the primary linkage between service supply and passenger model choice. It serves as the critical determinant of transit demand. According to Lu et al. (2020), </w:t>
+        <w:t xml:space="preserve">Public transport reliability is the primary linkage between service supply and passenger model choice. It serves as the critical determinant of transit demand. According to Lu et al. </w:t>
+      </w:r>
+      <w:r>
+        <w:lastRenderedPageBreak/>
+        <w:t xml:space="preserve">(2020), </w:t>
       </w:r>
       <w:r>
         <w:t>the presence of big data applications has successfully influenced the efficiency of urban transit systems by finding the equilibrium between travel demand and network supply.</w:t>
@@ -5776,7 +5869,6 @@
           <w:szCs w:val="24"/>
           <w:u w:val="single"/>
         </w:rPr>
-        <w:lastRenderedPageBreak/>
         <w:t>Defining Reliability: Metrics and User Perception</w:t>
       </w:r>
       <w:bookmarkEnd w:id="9"/>
@@ -5920,7 +6012,14 @@
         <w:rPr>
           <w:noProof/>
         </w:rPr>
-        <w:t xml:space="preserve"> May 2026 at LRT Ampang-Sri Petaling line while passing through a track switch near Chan Sow Lin station. </w:t>
+        <w:t xml:space="preserve"> May 2026 at LRT </w:t>
+      </w:r>
+      <w:r>
+        <w:rPr>
+          <w:noProof/>
+        </w:rPr>
+        <w:lastRenderedPageBreak/>
+        <w:t xml:space="preserve">Ampang-Sri Petaling line while passing through a track switch near Chan Sow Lin station. </w:t>
       </w:r>
       <w:r>
         <w:rPr>
@@ -6145,7 +6244,6 @@
               <w:rPr>
                 <w:lang w:val="en-US"/>
               </w:rPr>
-              <w:lastRenderedPageBreak/>
               <w:t>Informational</w:t>
             </w:r>
           </w:p>
@@ -6632,7 +6730,15 @@
           <w:noProof/>
           <w:lang w:val="en-US"/>
         </w:rPr>
-        <w:t>. On the other hand, the perceived unreliability of bus services in cities like Kota Samarahan has kept ridership levels low, despite high car ownership costs (Ubaidillah, et al., 2022). The analysis suggests that the ridership will remain stagnant until public transit system are as reliable as passenger perceived</w:t>
+        <w:t xml:space="preserve">. On the other hand, the perceived unreliability of bus services in cities like Kota Samarahan has kept ridership levels </w:t>
+      </w:r>
+      <w:r>
+        <w:rPr>
+          <w:noProof/>
+          <w:lang w:val="en-US"/>
+        </w:rPr>
+        <w:lastRenderedPageBreak/>
+        <w:t>low, despite high car ownership costs (Ubaidillah, et al., 2022). The analysis suggests that the ridership will remain stagnant until public transit system are as reliable as passenger perceived</w:t>
       </w:r>
       <w:r>
         <w:rPr>
@@ -6680,9 +6786,8 @@
           <w:noProof/>
           <w:lang w:val="en-US"/>
         </w:rPr>
-        <w:lastRenderedPageBreak/>
         <w:drawing>
-          <wp:inline distT="0" distB="0" distL="0" distR="0" wp14:anchorId="125BB2D3" wp14:editId="580EF6B4">
+          <wp:inline distT="0" distB="0" distL="0" distR="0" wp14:anchorId="125BB2D3" wp14:editId="3F79B128">
             <wp:extent cx="5722620" cy="4290060"/>
             <wp:effectExtent l="19050" t="19050" r="11430" b="15240"/>
             <wp:docPr id="1339339132" name="Picture 1"/>
@@ -6879,7 +6984,15 @@
           <w:noProof/>
           <w:lang w:val="en-US"/>
         </w:rPr>
-        <w:t>point out that the national public transport usage remains at appoximately 20%, well below the 40% target set by the National Transport Policy (NTP) 2019 – 2030. In regions like Sarawak, car ownership remains exceptionaly high (292 cars per 1,000 inhabitants). This is driven by the perceived inadequacy of bus service quality in terns of tangibility and responsiveness. It highlights that infrastructure alone is insufficient to drive demand whereas service reliability and quality must be localized and consistent.</w:t>
+        <w:t xml:space="preserve">point out that the national public transport usage remains at appoximately 20%, well below the 40% target set by the National Transport Policy (NTP) 2019 – 2030. In regions like Sarawak, car ownership remains exceptionaly high (292 cars per 1,000 inhabitants). This is driven by the perceived inadequacy of bus service </w:t>
+      </w:r>
+      <w:r>
+        <w:rPr>
+          <w:noProof/>
+          <w:lang w:val="en-US"/>
+        </w:rPr>
+        <w:lastRenderedPageBreak/>
+        <w:t>quality in terns of tangibility and responsiveness. It highlights that infrastructure alone is insufficient to drive demand whereas service reliability and quality must be localized and consistent.</w:t>
       </w:r>
     </w:p>
     <w:p>
@@ -6894,15 +7007,7 @@
           <w:noProof/>
           <w:lang w:val="en-US"/>
         </w:rPr>
-        <w:t xml:space="preserve">Recent advancements in data-driven transit management offer a potential pathway to improving this landscape. Hassan et al. (2025) stated the success of the myBas intiative in Johor Bahru and Penang by utilizing GTFS data to optimize netwrok efficiency. It has recorded over </w:t>
-      </w:r>
-      <w:r>
-        <w:rPr>
-          <w:noProof/>
-          <w:lang w:val="en-US"/>
-        </w:rPr>
-        <w:lastRenderedPageBreak/>
-        <w:t>14.5 million passenger trips in 2024. Despite these localized successes, the broader Malaysian context still struggles with the “first-mile last-mile”</w:t>
+        <w:t>Recent advancements in data-driven transit management offer a potential pathway to improving this landscape. Hassan et al. (2025) stated the success of the myBas intiative in Johor Bahru and Penang by utilizing GTFS data to optimize netwrok efficiency. It has recorded over 14.5 million passenger trips in 2024. Despite these localized successes, the broader Malaysian context still struggles with the “first-mile last-mile”</w:t>
       </w:r>
       <w:r>
         <w:rPr>
@@ -7008,6 +7113,7 @@
           <w:szCs w:val="24"/>
           <w:u w:val="single"/>
         </w:rPr>
+        <w:lastRenderedPageBreak/>
         <w:t>Sources of Transit Data</w:t>
       </w:r>
       <w:bookmarkEnd w:id="15"/>
@@ -7087,7 +7193,6 @@
           <w:b/>
           <w:bCs/>
         </w:rPr>
-        <w:lastRenderedPageBreak/>
         <w:t>Automated Fare Collection (AFC) Systems</w:t>
       </w:r>
       <w:r>
@@ -7348,6 +7453,7 @@
           <w:bCs/>
           <w:lang w:val="en-US"/>
         </w:rPr>
+        <w:lastRenderedPageBreak/>
         <w:t>POIs</w:t>
       </w:r>
       <w:r>
@@ -7412,7 +7518,6 @@
         <w:rPr>
           <w:lang w:val="en-US"/>
         </w:rPr>
-        <w:lastRenderedPageBreak/>
         <w:t xml:space="preserve">To have a holistic understanding of transit system performance and passenger needs, these endogenous and exogenous data sources are important. </w:t>
       </w:r>
     </w:p>
@@ -8305,6 +8410,7 @@
           <w:szCs w:val="24"/>
           <w:u w:val="single"/>
         </w:rPr>
+        <w:lastRenderedPageBreak/>
         <w:t>Data Quality</w:t>
       </w:r>
       <w:r>
@@ -8347,11 +8453,7 @@
         <w:t>(Ge et al., 2021; Jevinger et al., 2024)</w:t>
       </w:r>
       <w:r>
-        <w:t xml:space="preserve">. Public transport agencies often struggle with fragmented and disjointed </w:t>
-      </w:r>
-      <w:r>
-        <w:lastRenderedPageBreak/>
-        <w:t>information</w:t>
+        <w:t>. Public transport agencies often struggle with fragmented and disjointed information</w:t>
       </w:r>
       <w:r>
         <w:t xml:space="preserve"> they collected. This most likely hinder their ability to fully understand and interpret these available data </w:t>
@@ -8835,6 +8937,7 @@
           <w:noProof/>
           <w:lang w:val="en-US"/>
         </w:rPr>
+        <w:lastRenderedPageBreak/>
         <w:t>Data Reduction</w:t>
       </w:r>
       <w:r>
@@ -8889,7 +8992,6 @@
         <w:ind w:firstLine="720"/>
       </w:pPr>
       <w:r>
-        <w:lastRenderedPageBreak/>
         <w:t>The amount of effort required for preprocessing highlights that raw transit data is hardly usable for advanced analytics fresh after collection, regardless of its volume. The full potential of transit data ecosystems can only be determined after effective preprocessing strategies are carried out.</w:t>
       </w:r>
     </w:p>
@@ -9258,6 +9360,7 @@
           <w:szCs w:val="24"/>
           <w:u w:val="single"/>
         </w:rPr>
+        <w:lastRenderedPageBreak/>
         <w:t>Research Gap</w:t>
       </w:r>
       <w:bookmarkEnd w:id="26"/>
@@ -9317,7 +9420,6 @@
           <w:szCs w:val="24"/>
           <w:u w:val="single"/>
         </w:rPr>
-        <w:lastRenderedPageBreak/>
         <w:t>Data Collection</w:t>
       </w:r>
       <w:bookmarkEnd w:id="28"/>
@@ -9467,6 +9569,7 @@
       </w:r>
       <w:bookmarkEnd w:id="33"/>
     </w:p>
+    <w:p/>
     <w:p/>
     <w:p>
       <w:pPr>
@@ -9484,7 +9587,7 @@
           <w:u w:val="single"/>
         </w:rPr>
       </w:pPr>
-      <w:bookmarkStart w:id="34" w:name="_Toc230901630"/>
+      <w:bookmarkStart w:id="34" w:name="_Toc230901631"/>
       <w:r>
         <w:rPr>
           <w:b/>
@@ -9493,39 +9596,9 @@
           <w:szCs w:val="24"/>
           <w:u w:val="single"/>
         </w:rPr>
-        <w:t>Expected Outcomes</w:t>
+        <w:t>References</w:t>
       </w:r>
       <w:bookmarkEnd w:id="34"/>
-    </w:p>
-    <w:p/>
-    <w:p>
-      <w:pPr>
-        <w:pStyle w:val="Heading1"/>
-        <w:numPr>
-          <w:ilvl w:val="0"/>
-          <w:numId w:val="10"/>
-        </w:numPr>
-        <w:jc w:val="left"/>
-        <w:rPr>
-          <w:b/>
-          <w:bCs/>
-          <w:sz w:val="24"/>
-          <w:szCs w:val="24"/>
-          <w:u w:val="single"/>
-        </w:rPr>
-      </w:pPr>
-      <w:bookmarkStart w:id="35" w:name="_Toc230901631"/>
-      <w:r>
-        <w:rPr>
-          <w:b/>
-          <w:bCs/>
-          <w:sz w:val="24"/>
-          <w:szCs w:val="24"/>
-          <w:u w:val="single"/>
-        </w:rPr>
-        <w:t>References</w:t>
-      </w:r>
-      <w:bookmarkEnd w:id="35"/>
     </w:p>
     <w:p>
       <w:pPr>
@@ -9623,6 +9696,7 @@
         <w:rPr>
           <w:noProof/>
         </w:rPr>
+        <w:lastRenderedPageBreak/>
         <w:t xml:space="preserve">Ge, L., Sarhani, M., Voss, S., &amp; Xie, L. (16 October, 2021). Review of Transit Data Sources: Potentials, Challenges and Complementarity. </w:t>
       </w:r>
       <w:r>
@@ -9652,7 +9726,6 @@
         <w:rPr>
           <w:noProof/>
         </w:rPr>
-        <w:lastRenderedPageBreak/>
         <w:t xml:space="preserve">Hassan, M., Mahin, H. D., Ahmed, F., Hassan, M. M., Rahaman, A., &amp; Abdullah, M. (4 July, 2025). Assessing Public Transit Network Efficiency and Accessibility in Johor Bahru and Penang, Malaysia: A Data-driven Approach. </w:t>
       </w:r>
       <w:r>
@@ -9885,6 +9958,7 @@
         <w:rPr>
           <w:noProof/>
         </w:rPr>
+        <w:lastRenderedPageBreak/>
         <w:t xml:space="preserve">Mohamed, A. H., Adwan, I. A., Ahmeda, A. G., Hrtemih, H., &amp; Al-MSari, H. (25 April, 2021). Identification of Affecting Factors on the Travel Time Reliability for Bus Transportation. </w:t>
       </w:r>
       <w:r>
@@ -9914,7 +9988,6 @@
         <w:rPr>
           <w:noProof/>
         </w:rPr>
-        <w:lastRenderedPageBreak/>
         <w:t xml:space="preserve">Rezapour, M., &amp; Ferraro, F. R. (16 June, 2021). Rail Transport Delay and Its Effects on the Perceived Importance of a Real-time Information. </w:t>
       </w:r>
       <w:r>
@@ -11847,6 +11920,119 @@
     </w:lvl>
   </w:abstractNum>
   <w:abstractNum w:abstractNumId="17" w15:restartNumberingAfterBreak="0">
+    <w:nsid w:val="58824DF6"/>
+    <w:multiLevelType w:val="hybridMultilevel"/>
+    <w:tmpl w:val="CBEA4438"/>
+    <w:lvl w:ilvl="0" w:tplc="44090005">
+      <w:start w:val="1"/>
+      <w:numFmt w:val="bullet"/>
+      <w:lvlText w:val=""/>
+      <w:lvlJc w:val="left"/>
+      <w:pPr>
+        <w:ind w:left="720" w:hanging="360"/>
+      </w:pPr>
+      <w:rPr>
+        <w:rFonts w:ascii="Wingdings" w:hAnsi="Wingdings" w:hint="default"/>
+      </w:rPr>
+    </w:lvl>
+    <w:lvl w:ilvl="1" w:tplc="44090003" w:tentative="1">
+      <w:start w:val="1"/>
+      <w:numFmt w:val="bullet"/>
+      <w:lvlText w:val="o"/>
+      <w:lvlJc w:val="left"/>
+      <w:pPr>
+        <w:ind w:left="1440" w:hanging="360"/>
+      </w:pPr>
+      <w:rPr>
+        <w:rFonts w:ascii="Courier New" w:hAnsi="Courier New" w:cs="Courier New" w:hint="default"/>
+      </w:rPr>
+    </w:lvl>
+    <w:lvl w:ilvl="2" w:tplc="44090005" w:tentative="1">
+      <w:start w:val="1"/>
+      <w:numFmt w:val="bullet"/>
+      <w:lvlText w:val=""/>
+      <w:lvlJc w:val="left"/>
+      <w:pPr>
+        <w:ind w:left="2160" w:hanging="360"/>
+      </w:pPr>
+      <w:rPr>
+        <w:rFonts w:ascii="Wingdings" w:hAnsi="Wingdings" w:hint="default"/>
+      </w:rPr>
+    </w:lvl>
+    <w:lvl w:ilvl="3" w:tplc="44090001" w:tentative="1">
+      <w:start w:val="1"/>
+      <w:numFmt w:val="bullet"/>
+      <w:lvlText w:val=""/>
+      <w:lvlJc w:val="left"/>
+      <w:pPr>
+        <w:ind w:left="2880" w:hanging="360"/>
+      </w:pPr>
+      <w:rPr>
+        <w:rFonts w:ascii="Symbol" w:hAnsi="Symbol" w:hint="default"/>
+      </w:rPr>
+    </w:lvl>
+    <w:lvl w:ilvl="4" w:tplc="44090003" w:tentative="1">
+      <w:start w:val="1"/>
+      <w:numFmt w:val="bullet"/>
+      <w:lvlText w:val="o"/>
+      <w:lvlJc w:val="left"/>
+      <w:pPr>
+        <w:ind w:left="3600" w:hanging="360"/>
+      </w:pPr>
+      <w:rPr>
+        <w:rFonts w:ascii="Courier New" w:hAnsi="Courier New" w:cs="Courier New" w:hint="default"/>
+      </w:rPr>
+    </w:lvl>
+    <w:lvl w:ilvl="5" w:tplc="44090005" w:tentative="1">
+      <w:start w:val="1"/>
+      <w:numFmt w:val="bullet"/>
+      <w:lvlText w:val=""/>
+      <w:lvlJc w:val="left"/>
+      <w:pPr>
+        <w:ind w:left="4320" w:hanging="360"/>
+      </w:pPr>
+      <w:rPr>
+        <w:rFonts w:ascii="Wingdings" w:hAnsi="Wingdings" w:hint="default"/>
+      </w:rPr>
+    </w:lvl>
+    <w:lvl w:ilvl="6" w:tplc="44090001" w:tentative="1">
+      <w:start w:val="1"/>
+      <w:numFmt w:val="bullet"/>
+      <w:lvlText w:val=""/>
+      <w:lvlJc w:val="left"/>
+      <w:pPr>
+        <w:ind w:left="5040" w:hanging="360"/>
+      </w:pPr>
+      <w:rPr>
+        <w:rFonts w:ascii="Symbol" w:hAnsi="Symbol" w:hint="default"/>
+      </w:rPr>
+    </w:lvl>
+    <w:lvl w:ilvl="7" w:tplc="44090003" w:tentative="1">
+      <w:start w:val="1"/>
+      <w:numFmt w:val="bullet"/>
+      <w:lvlText w:val="o"/>
+      <w:lvlJc w:val="left"/>
+      <w:pPr>
+        <w:ind w:left="5760" w:hanging="360"/>
+      </w:pPr>
+      <w:rPr>
+        <w:rFonts w:ascii="Courier New" w:hAnsi="Courier New" w:cs="Courier New" w:hint="default"/>
+      </w:rPr>
+    </w:lvl>
+    <w:lvl w:ilvl="8" w:tplc="44090005" w:tentative="1">
+      <w:start w:val="1"/>
+      <w:numFmt w:val="bullet"/>
+      <w:lvlText w:val=""/>
+      <w:lvlJc w:val="left"/>
+      <w:pPr>
+        <w:ind w:left="6480" w:hanging="360"/>
+      </w:pPr>
+      <w:rPr>
+        <w:rFonts w:ascii="Wingdings" w:hAnsi="Wingdings" w:hint="default"/>
+      </w:rPr>
+    </w:lvl>
+  </w:abstractNum>
+  <w:abstractNum w:abstractNumId="18" w15:restartNumberingAfterBreak="0">
     <w:nsid w:val="595C5C89"/>
     <w:multiLevelType w:val="hybridMultilevel"/>
     <w:tmpl w:val="BB58A9A2"/>
@@ -11936,7 +12122,7 @@
       </w:pPr>
     </w:lvl>
   </w:abstractNum>
-  <w:abstractNum w:abstractNumId="18" w15:restartNumberingAfterBreak="0">
+  <w:abstractNum w:abstractNumId="19" w15:restartNumberingAfterBreak="0">
     <w:nsid w:val="707B624C"/>
     <w:multiLevelType w:val="hybridMultilevel"/>
     <w:tmpl w:val="4066D8D2"/>
@@ -12025,7 +12211,7 @@
       </w:pPr>
     </w:lvl>
   </w:abstractNum>
-  <w:abstractNum w:abstractNumId="19" w15:restartNumberingAfterBreak="0">
+  <w:abstractNum w:abstractNumId="20" w15:restartNumberingAfterBreak="0">
     <w:nsid w:val="76C22FEC"/>
     <w:multiLevelType w:val="hybridMultilevel"/>
     <w:tmpl w:val="7D661E6A"/>
@@ -12111,6 +12297,92 @@
       <w:lvlJc w:val="right"/>
       <w:pPr>
         <w:ind w:left="6480" w:hanging="180"/>
+      </w:pPr>
+    </w:lvl>
+  </w:abstractNum>
+  <w:abstractNum w:abstractNumId="21" w15:restartNumberingAfterBreak="0">
+    <w:nsid w:val="7EF55F5C"/>
+    <w:multiLevelType w:val="multilevel"/>
+    <w:tmpl w:val="4409001F"/>
+    <w:lvl w:ilvl="0">
+      <w:start w:val="1"/>
+      <w:numFmt w:val="decimal"/>
+      <w:lvlText w:val="%1."/>
+      <w:lvlJc w:val="left"/>
+      <w:pPr>
+        <w:ind w:left="360" w:hanging="360"/>
+      </w:pPr>
+    </w:lvl>
+    <w:lvl w:ilvl="1">
+      <w:start w:val="1"/>
+      <w:numFmt w:val="decimal"/>
+      <w:lvlText w:val="%1.%2."/>
+      <w:lvlJc w:val="left"/>
+      <w:pPr>
+        <w:ind w:left="792" w:hanging="432"/>
+      </w:pPr>
+    </w:lvl>
+    <w:lvl w:ilvl="2">
+      <w:start w:val="1"/>
+      <w:numFmt w:val="decimal"/>
+      <w:lvlText w:val="%1.%2.%3."/>
+      <w:lvlJc w:val="left"/>
+      <w:pPr>
+        <w:ind w:left="1224" w:hanging="504"/>
+      </w:pPr>
+    </w:lvl>
+    <w:lvl w:ilvl="3">
+      <w:start w:val="1"/>
+      <w:numFmt w:val="decimal"/>
+      <w:lvlText w:val="%1.%2.%3.%4."/>
+      <w:lvlJc w:val="left"/>
+      <w:pPr>
+        <w:ind w:left="1728" w:hanging="648"/>
+      </w:pPr>
+    </w:lvl>
+    <w:lvl w:ilvl="4">
+      <w:start w:val="1"/>
+      <w:numFmt w:val="decimal"/>
+      <w:lvlText w:val="%1.%2.%3.%4.%5."/>
+      <w:lvlJc w:val="left"/>
+      <w:pPr>
+        <w:ind w:left="2232" w:hanging="792"/>
+      </w:pPr>
+    </w:lvl>
+    <w:lvl w:ilvl="5">
+      <w:start w:val="1"/>
+      <w:numFmt w:val="decimal"/>
+      <w:lvlText w:val="%1.%2.%3.%4.%5.%6."/>
+      <w:lvlJc w:val="left"/>
+      <w:pPr>
+        <w:ind w:left="2736" w:hanging="936"/>
+      </w:pPr>
+    </w:lvl>
+    <w:lvl w:ilvl="6">
+      <w:start w:val="1"/>
+      <w:numFmt w:val="decimal"/>
+      <w:lvlText w:val="%1.%2.%3.%4.%5.%6.%7."/>
+      <w:lvlJc w:val="left"/>
+      <w:pPr>
+        <w:ind w:left="3240" w:hanging="1080"/>
+      </w:pPr>
+    </w:lvl>
+    <w:lvl w:ilvl="7">
+      <w:start w:val="1"/>
+      <w:numFmt w:val="decimal"/>
+      <w:lvlText w:val="%1.%2.%3.%4.%5.%6.%7.%8."/>
+      <w:lvlJc w:val="left"/>
+      <w:pPr>
+        <w:ind w:left="3744" w:hanging="1224"/>
+      </w:pPr>
+    </w:lvl>
+    <w:lvl w:ilvl="8">
+      <w:start w:val="1"/>
+      <w:numFmt w:val="decimal"/>
+      <w:lvlText w:val="%1.%2.%3.%4.%5.%6.%7.%8.%9."/>
+      <w:lvlJc w:val="left"/>
+      <w:pPr>
+        <w:ind w:left="4320" w:hanging="1440"/>
       </w:pPr>
     </w:lvl>
   </w:abstractNum>
@@ -12124,13 +12396,13 @@
     <w:abstractNumId w:val="13"/>
   </w:num>
   <w:num w:numId="4" w16cid:durableId="291253581">
-    <w:abstractNumId w:val="18"/>
+    <w:abstractNumId w:val="19"/>
   </w:num>
   <w:num w:numId="5" w16cid:durableId="991061032">
     <w:abstractNumId w:val="0"/>
   </w:num>
   <w:num w:numId="6" w16cid:durableId="1289168179">
-    <w:abstractNumId w:val="19"/>
+    <w:abstractNumId w:val="20"/>
   </w:num>
   <w:num w:numId="7" w16cid:durableId="197862497">
     <w:abstractNumId w:val="12"/>
@@ -12139,7 +12411,7 @@
     <w:abstractNumId w:val="11"/>
   </w:num>
   <w:num w:numId="9" w16cid:durableId="608927404">
-    <w:abstractNumId w:val="17"/>
+    <w:abstractNumId w:val="18"/>
   </w:num>
   <w:num w:numId="10" w16cid:durableId="495653598">
     <w:abstractNumId w:val="2"/>
@@ -12173,6 +12445,12 @@
   </w:num>
   <w:num w:numId="20" w16cid:durableId="2025666564">
     <w:abstractNumId w:val="9"/>
+  </w:num>
+  <w:num w:numId="21" w16cid:durableId="348602363">
+    <w:abstractNumId w:val="21"/>
+  </w:num>
+  <w:num w:numId="22" w16cid:durableId="1301305275">
+    <w:abstractNumId w:val="17"/>
   </w:num>
 </w:numbering>
 </file>

</xml_diff>

<commit_message>
chore: :wrench: Rerun all models on all configurations, update feature engineering sequence building pipeline for MCO and no-MCO, include HMT-TSF feature reduced variant results, Update relevant docs
</commit_message>
<xml_diff>
--- a/docs/24202141_p1_report.docx
+++ b/docs/24202141_p1_report.docx
@@ -4010,7 +4010,7 @@
         <w:t>ith intricate</w:t>
       </w:r>
       <w:r>
-        <w:t xml:space="preserve"> spatio-temporal interconnections</w:t>
+        <w:t xml:space="preserve"> spatiotemporal interconnections</w:t>
       </w:r>
       <w:r>
         <w:t xml:space="preserve"> </w:t>
@@ -4170,7 +4170,13 @@
         <w:t xml:space="preserve"> and consistent</w:t>
       </w:r>
       <w:r>
-        <w:t xml:space="preserve"> ridership predictions with complex spatio-temporal</w:t>
+        <w:t xml:space="preserve"> ridership predictions with complex </w:t>
+      </w:r>
+      <w:r>
+        <w:t>spatio</w:t>
+      </w:r>
+      <w:r>
+        <w:t>temporal</w:t>
       </w:r>
       <w:r>
         <w:t xml:space="preserve"> data. This directly </w:t>
@@ -4267,14 +4273,20 @@
         <w:rPr>
           <w:lang w:val="en-US"/>
         </w:rPr>
-        <w:t>spatio</w:t>
+        <w:t>spatiotemporal</w:t>
+      </w:r>
+      <w:r>
+        <w:rPr>
+          <w:lang w:val="en-US"/>
+        </w:rPr>
+        <w:t>temporal</w:t>
       </w:r>
       <w:proofErr w:type="spellEnd"/>
       <w:r>
         <w:rPr>
           <w:lang w:val="en-US"/>
         </w:rPr>
-        <w:t>-temporal factors that heavily influence the ridership trend in Malaysia’s public transit; (2) develop a robust predictive model capable of accurately</w:t>
+        <w:t xml:space="preserve"> factors that heavily influence the ridership trend in Malaysia’s public transit; (2) develop a robust predictive model capable of accurately</w:t>
       </w:r>
       <w:r>
         <w:rPr>
@@ -4293,14 +4305,20 @@
         <w:rPr>
           <w:lang w:val="en-US"/>
         </w:rPr>
-        <w:t>spatio</w:t>
+        <w:t>spatiotemporal</w:t>
+      </w:r>
+      <w:r>
+        <w:rPr>
+          <w:lang w:val="en-US"/>
+        </w:rPr>
+        <w:t>temporal</w:t>
       </w:r>
       <w:proofErr w:type="spellEnd"/>
       <w:r>
         <w:rPr>
           <w:lang w:val="en-US"/>
         </w:rPr>
-        <w:t>-temporal features.</w:t>
+        <w:t xml:space="preserve"> features.</w:t>
       </w:r>
     </w:p>
     <w:p>
@@ -4507,7 +4525,13 @@
         <w:t xml:space="preserve"> </w:t>
       </w:r>
       <w:r>
-        <w:t>existing DL architectures (spatio-temporal, graph-based, and attention-based)</w:t>
+        <w:t>existing DL architectures (</w:t>
+      </w:r>
+      <w:r>
+        <w:t>spatiotemporal-based</w:t>
+      </w:r>
+      <w:r>
+        <w:t>, graph-based, and attention-based)</w:t>
       </w:r>
       <w:r>
         <w:t xml:space="preserve"> </w:t>
@@ -4619,7 +4643,13 @@
         <w:t xml:space="preserve"> </w:t>
       </w:r>
       <w:r>
-        <w:t>Hybrid Multi-scale Temporal Spatio-Feature (HMT-TSF) Forecaster</w:t>
+        <w:t xml:space="preserve">Hybrid Multi-scale Temporal </w:t>
+      </w:r>
+      <w:r>
+        <w:t xml:space="preserve">Spatio </w:t>
+      </w:r>
+      <w:r>
+        <w:t>Feature (HMT-TSF) Forecaster</w:t>
       </w:r>
       <w:r>
         <w:t xml:space="preserve"> </w:t>
@@ -4712,7 +4742,10 @@
         <w:t xml:space="preserve">baseline, </w:t>
       </w:r>
       <w:r>
-        <w:t>spatio-temporal</w:t>
+        <w:t>spatio</w:t>
+      </w:r>
+      <w:r>
+        <w:t>temporal</w:t>
       </w:r>
       <w:r>
         <w:t>-based, graph-based</w:t>
@@ -4798,9 +4831,9 @@
         <w:tblLook w:val="04A0" w:firstRow="1" w:lastRow="0" w:firstColumn="1" w:lastColumn="0" w:noHBand="0" w:noVBand="1"/>
       </w:tblPr>
       <w:tblGrid>
-        <w:gridCol w:w="1696"/>
-        <w:gridCol w:w="1276"/>
-        <w:gridCol w:w="6044"/>
+        <w:gridCol w:w="1667"/>
+        <w:gridCol w:w="1803"/>
+        <w:gridCol w:w="5546"/>
       </w:tblGrid>
       <w:tr>
         <w:tc>
@@ -4940,7 +4973,14 @@
                 <w:b/>
                 <w:bCs/>
               </w:rPr>
-              <w:t>Spatio-temporal</w:t>
+              <w:t>Spatio</w:t>
+            </w:r>
+            <w:r>
+              <w:rPr>
+                <w:b/>
+                <w:bCs/>
+              </w:rPr>
+              <w:t>temporal</w:t>
             </w:r>
           </w:p>
         </w:tc>
@@ -4963,7 +5003,13 @@
               <w:t>BiLSTM</w:t>
             </w:r>
             <w:r>
-              <w:t>); Spatio-Temporal LSTM (</w:t>
+              <w:t xml:space="preserve">); </w:t>
+            </w:r>
+            <w:r>
+              <w:t>Spatiotemporal</w:t>
+            </w:r>
+            <w:r>
+              <w:t xml:space="preserve"> LSTM (</w:t>
             </w:r>
             <w:r>
               <w:rPr>
@@ -5044,7 +5090,10 @@
               <w:jc w:val="left"/>
             </w:pPr>
             <w:r>
-              <w:t>Spatio-Temporal Graph Convolutional Network</w:t>
+              <w:t>Spatiotemporal</w:t>
+            </w:r>
+            <w:r>
+              <w:t xml:space="preserve"> Graph Convolutional Network</w:t>
             </w:r>
             <w:r>
               <w:t xml:space="preserve"> (</w:t>
@@ -5108,6 +5157,7 @@
               <w:t xml:space="preserve">); </w:t>
             </w:r>
             <w:r>
+              <w:lastRenderedPageBreak/>
               <w:t>Periodicity-Aware Dynamic Relational</w:t>
             </w:r>
             <w:r>
@@ -5298,7 +5348,13 @@
               <w:jc w:val="left"/>
             </w:pPr>
             <w:r>
-              <w:t>Hybrid Multi-scale Temporal Spatio-Feature</w:t>
+              <w:t xml:space="preserve">Hybrid Multi-scale Temporal </w:t>
+            </w:r>
+            <w:r>
+              <w:t xml:space="preserve">Spatio </w:t>
+            </w:r>
+            <w:r>
+              <w:t>Feature</w:t>
             </w:r>
             <w:r>
               <w:t xml:space="preserve"> (</w:t>
@@ -5761,6 +5817,7 @@
           <w:szCs w:val="24"/>
           <w:u w:val="single"/>
         </w:rPr>
+        <w:lastRenderedPageBreak/>
         <w:t>Literature Review</w:t>
       </w:r>
       <w:bookmarkEnd w:id="7"/>
@@ -5808,11 +5865,7 @@
         <w:ind w:firstLine="720"/>
       </w:pPr>
       <w:r>
-        <w:t xml:space="preserve">Public transport reliability is the primary linkage between service supply and passenger model choice. It serves as the critical determinant of transit demand. According to Lu et al. </w:t>
-      </w:r>
-      <w:r>
-        <w:lastRenderedPageBreak/>
-        <w:t xml:space="preserve">(2020), </w:t>
+        <w:t xml:space="preserve">Public transport reliability is the primary linkage between service supply and passenger model choice. It serves as the critical determinant of transit demand. According to Lu et al. (2020), </w:t>
       </w:r>
       <w:r>
         <w:t>the presence of big data applications has successfully influenced the efficiency of urban transit systems by finding the equilibrium between travel demand and network supply.</w:t>
@@ -5981,7 +6034,14 @@
         <w:rPr>
           <w:noProof/>
         </w:rPr>
-        <w:t xml:space="preserve">Their study of Malaysian rail passengers revealed that inaccurate or imprecise real-time information can aggravate feelings of anger and uncertainty. Consequently, it will tarnish the perceived quality of the entire transit network. For example, </w:t>
+        <w:t xml:space="preserve">Their study of Malaysian </w:t>
+      </w:r>
+      <w:r>
+        <w:rPr>
+          <w:noProof/>
+        </w:rPr>
+        <w:lastRenderedPageBreak/>
+        <w:t xml:space="preserve">rail passengers revealed that inaccurate or imprecise real-time information can aggravate feelings of anger and uncertainty. Consequently, it will tarnish the perceived quality of the entire transit network. For example, </w:t>
       </w:r>
       <w:r>
         <w:rPr>
@@ -6012,14 +6072,7 @@
         <w:rPr>
           <w:noProof/>
         </w:rPr>
-        <w:t xml:space="preserve"> May 2026 at LRT </w:t>
-      </w:r>
-      <w:r>
-        <w:rPr>
-          <w:noProof/>
-        </w:rPr>
-        <w:lastRenderedPageBreak/>
-        <w:t xml:space="preserve">Ampang-Sri Petaling line while passing through a track switch near Chan Sow Lin station. </w:t>
+        <w:t xml:space="preserve"> May 2026 at LRT Ampang-Sri Petaling line while passing through a track switch near Chan Sow Lin station. </w:t>
       </w:r>
       <w:r>
         <w:rPr>
@@ -6688,6 +6741,7 @@
           <w:noProof/>
           <w:lang w:val="en-US"/>
         </w:rPr>
+        <w:lastRenderedPageBreak/>
         <w:t xml:space="preserve">Furthermore, </w:t>
       </w:r>
       <w:r>
@@ -6730,15 +6784,7 @@
           <w:noProof/>
           <w:lang w:val="en-US"/>
         </w:rPr>
-        <w:t xml:space="preserve">. On the other hand, the perceived unreliability of bus services in cities like Kota Samarahan has kept ridership levels </w:t>
-      </w:r>
-      <w:r>
-        <w:rPr>
-          <w:noProof/>
-          <w:lang w:val="en-US"/>
-        </w:rPr>
-        <w:lastRenderedPageBreak/>
-        <w:t>low, despite high car ownership costs (Ubaidillah, et al., 2022). The analysis suggests that the ridership will remain stagnant until public transit system are as reliable as passenger perceived</w:t>
+        <w:t>. On the other hand, the perceived unreliability of bus services in cities like Kota Samarahan has kept ridership levels low, despite high car ownership costs (Ubaidillah, et al., 2022). The analysis suggests that the ridership will remain stagnant until public transit system are as reliable as passenger perceived</w:t>
       </w:r>
       <w:r>
         <w:rPr>
@@ -6787,7 +6833,7 @@
           <w:lang w:val="en-US"/>
         </w:rPr>
         <w:drawing>
-          <wp:inline distT="0" distB="0" distL="0" distR="0" wp14:anchorId="125BB2D3" wp14:editId="3F79B128">
+          <wp:inline distT="0" distB="0" distL="0" distR="0" wp14:anchorId="125BB2D3" wp14:editId="3C9C50AF">
             <wp:extent cx="5722620" cy="4290060"/>
             <wp:effectExtent l="19050" t="19050" r="11430" b="15240"/>
             <wp:docPr id="1339339132" name="Picture 1"/>
@@ -6951,7 +6997,14 @@
         <w:rPr>
           <w:lang w:val="en-US"/>
         </w:rPr>
-        <w:t>modal shares. This can be supported with governmental projects like MRT Putrajaya line, MRT Shah Alam line, and the upcoming MRT3</w:t>
+        <w:t xml:space="preserve">modal shares. This can be </w:t>
+      </w:r>
+      <w:r>
+        <w:rPr>
+          <w:lang w:val="en-US"/>
+        </w:rPr>
+        <w:lastRenderedPageBreak/>
+        <w:t>supported with governmental projects like MRT Putrajaya line, MRT Shah Alam line, and the upcoming MRT3</w:t>
       </w:r>
       <w:r>
         <w:rPr>
@@ -6984,15 +7037,7 @@
           <w:noProof/>
           <w:lang w:val="en-US"/>
         </w:rPr>
-        <w:t xml:space="preserve">point out that the national public transport usage remains at appoximately 20%, well below the 40% target set by the National Transport Policy (NTP) 2019 – 2030. In regions like Sarawak, car ownership remains exceptionaly high (292 cars per 1,000 inhabitants). This is driven by the perceived inadequacy of bus service </w:t>
-      </w:r>
-      <w:r>
-        <w:rPr>
-          <w:noProof/>
-          <w:lang w:val="en-US"/>
-        </w:rPr>
-        <w:lastRenderedPageBreak/>
-        <w:t>quality in terns of tangibility and responsiveness. It highlights that infrastructure alone is insufficient to drive demand whereas service reliability and quality must be localized and consistent.</w:t>
+        <w:t>point out that the national public transport usage remains at appoximately 20%, well below the 40% target set by the National Transport Policy (NTP) 2019 – 2030. In regions like Sarawak, car ownership remains exceptionaly high (292 cars per 1,000 inhabitants). This is driven by the perceived inadequacy of bus service quality in terns of tangibility and responsiveness. It highlights that infrastructure alone is insufficient to drive demand whereas service reliability and quality must be localized and consistent.</w:t>
       </w:r>
     </w:p>
     <w:p>
@@ -7036,7 +7081,21 @@
           <w:noProof/>
           <w:lang w:val="en-US"/>
         </w:rPr>
-        <w:t>the focus is shifting from purely physical expansion to the integration of DL and big data analytics. Both approaches are to mitigate unreliability as evidenced by the growing body of research into spatio-temporal ridership forecasting (Chen et al., 2022; Amir et al., 2025).</w:t>
+        <w:t xml:space="preserve">the focus is shifting from purely physical expansion to the integration of DL and big data analytics. Both approaches are to mitigate unreliability as evidenced by the growing body of research into </w:t>
+      </w:r>
+      <w:r>
+        <w:rPr>
+          <w:noProof/>
+          <w:lang w:val="en-US"/>
+        </w:rPr>
+        <w:t>spatiotemporal</w:t>
+      </w:r>
+      <w:r>
+        <w:rPr>
+          <w:noProof/>
+          <w:lang w:val="en-US"/>
+        </w:rPr>
+        <w:t>temporal ridership forecasting (Chen et al., 2022; Amir et al., 2025).</w:t>
       </w:r>
     </w:p>
     <w:p>
@@ -7086,7 +7145,15 @@
           <w:noProof/>
           <w:lang w:val="en-US"/>
         </w:rPr>
-        <w:t xml:space="preserve"> Nevertheless, the inherent complexity and heterogeneity of these data also introduce substantial challenges. Amir et al. (2025) highlighted that data quality, noise, and the presence of extreme anomalies, particularly in spatiotemporal contexts are among the problems to address. To develop a robust predictive models and informed decision-making in urban transit planning, it is paramount to tackle the challenges mentioned.</w:t>
+        <w:t xml:space="preserve"> Nevertheless, the inherent complexity and heterogeneity of these data also introduce substantial challenges. Amir et al. (2025) highlighted that data quality, noise, and the presence of extreme anomalies, </w:t>
+      </w:r>
+      <w:r>
+        <w:rPr>
+          <w:noProof/>
+          <w:lang w:val="en-US"/>
+        </w:rPr>
+        <w:lastRenderedPageBreak/>
+        <w:t>particularly in spatiotemporal contexts are among the problems to address. To develop a robust predictive models and informed decision-making in urban transit planning, it is paramount to tackle the challenges mentioned.</w:t>
       </w:r>
     </w:p>
     <w:p>
@@ -7113,7 +7180,6 @@
           <w:szCs w:val="24"/>
           <w:u w:val="single"/>
         </w:rPr>
-        <w:lastRenderedPageBreak/>
         <w:t>Sources of Transit Data</w:t>
       </w:r>
       <w:bookmarkEnd w:id="15"/>
@@ -7421,6 +7487,7 @@
           <w:bCs/>
           <w:lang w:val="en-US"/>
         </w:rPr>
+        <w:lastRenderedPageBreak/>
         <w:t>Traffic Data</w:t>
       </w:r>
       <w:r>
@@ -7453,7 +7520,6 @@
           <w:bCs/>
           <w:lang w:val="en-US"/>
         </w:rPr>
-        <w:lastRenderedPageBreak/>
         <w:t>POIs</w:t>
       </w:r>
       <w:r>
@@ -8410,7 +8476,6 @@
           <w:szCs w:val="24"/>
           <w:u w:val="single"/>
         </w:rPr>
-        <w:lastRenderedPageBreak/>
         <w:t>Data Quality</w:t>
       </w:r>
       <w:r>
@@ -8837,6 +8902,7 @@
           <w:noProof/>
           <w:lang w:val="en-US"/>
         </w:rPr>
+        <w:lastRenderedPageBreak/>
         <w:t>Data Integration</w:t>
       </w:r>
       <w:r>
@@ -8937,7 +9003,6 @@
           <w:noProof/>
           <w:lang w:val="en-US"/>
         </w:rPr>
-        <w:lastRenderedPageBreak/>
         <w:t>Data Reduction</w:t>
       </w:r>
       <w:r>
@@ -9023,7 +9088,208 @@
       </w:r>
       <w:bookmarkEnd w:id="17"/>
     </w:p>
-    <w:p/>
+    <w:p>
+      <w:pPr>
+        <w:ind w:firstLine="720"/>
+      </w:pPr>
+      <w:r>
+        <w:t xml:space="preserve">Spatiotemporal data is susceptible to extreme anomalies that can significantly impact the accuracy and reliability of predictive models </w:t>
+      </w:r>
+      <w:r>
+        <w:rPr>
+          <w:noProof/>
+        </w:rPr>
+        <w:t>(Maria-Arribas et al., 2026)</w:t>
+      </w:r>
+      <w:r>
+        <w:t xml:space="preserve">. Most of these data is characterized by its simultaneous variation across space and time. These anomalies often are unusual events or patterns that deviate drastically from expected behaviour. It is mostly driven by external factors </w:t>
+      </w:r>
+      <w:r>
+        <w:t xml:space="preserve">aliened from routine data collection </w:t>
+      </w:r>
+      <w:r>
+        <w:rPr>
+          <w:noProof/>
+        </w:rPr>
+        <w:t>(Wang et al., 2025)</w:t>
+      </w:r>
+      <w:r>
+        <w:t>.</w:t>
+      </w:r>
+    </w:p>
+    <w:p>
+      <w:pPr>
+        <w:ind w:firstLine="720"/>
+      </w:pPr>
+      <w:r>
+        <w:t>One of many obvious examples of an extreme anomaly in transit ridership data is from Malaysia</w:t>
+      </w:r>
+      <w:r>
+        <w:t>’s MCO during COVID-19 pandemic. From March 2020 to December 2021, the public transport ridership experienced a steep decline of 85-90%, which created a highly noisy and abnormal patterns. If models are trained on them without proper consideration, it can introduce several problems because it is not a typical urban mobility behaviour. Such extreme outlier data can lead to:</w:t>
+      </w:r>
+    </w:p>
+    <w:p>
+      <w:pPr>
+        <w:pStyle w:val="ListParagraph"/>
+        <w:numPr>
+          <w:ilvl w:val="0"/>
+          <w:numId w:val="23"/>
+        </w:numPr>
+      </w:pPr>
+      <w:r>
+        <w:t>Models may overfit to the anomalous data, resulting in poor generalization capabilities when predicting under normal conditions. This is also known as predictive bias.</w:t>
+      </w:r>
+    </w:p>
+    <w:p>
+      <w:pPr>
+        <w:pStyle w:val="ListParagraph"/>
+        <w:numPr>
+          <w:ilvl w:val="0"/>
+          <w:numId w:val="23"/>
+        </w:numPr>
+      </w:pPr>
+      <w:r>
+        <w:t>The drastic shifts in patterns during anomalies can confuse models, making them struggle to capture true, normal peaks and trends.</w:t>
+      </w:r>
+    </w:p>
+    <w:p>
+      <w:pPr>
+        <w:pStyle w:val="ListParagraph"/>
+        <w:numPr>
+          <w:ilvl w:val="0"/>
+          <w:numId w:val="23"/>
+        </w:numPr>
+      </w:pPr>
+      <w:r>
+        <w:t xml:space="preserve">Anomalies can hide underlying regularities or create </w:t>
+      </w:r>
+      <w:r>
+        <w:t>fake correlations, causing incorrect results about system dynamics (Wang et al., 2025).</w:t>
+      </w:r>
+    </w:p>
+    <w:p>
+      <w:pPr>
+        <w:ind w:firstLine="720"/>
+      </w:pPr>
+      <w:r>
+        <w:lastRenderedPageBreak/>
+        <w:t xml:space="preserve">As a result, specialized techniques are required to detect and handle extreme anomalies in spatiotemporal data. Traditional anomaly detection methods often rely on statistical thresholds or distance-based approaches. Yet, when applied on complex, high-dimensional spatiotemporal data, it may be less effective as claimed by </w:t>
+      </w:r>
+      <w:r>
+        <w:rPr>
+          <w:noProof/>
+        </w:rPr>
+        <w:t xml:space="preserve">Bhartiya et al. (2023). They also mentioned that more advanced approaches are being developed to identify </w:t>
+      </w:r>
+      <w:r>
+        <w:rPr>
+          <w:noProof/>
+        </w:rPr>
+        <w:t>anomalie</w:t>
+      </w:r>
+      <w:r>
+        <w:rPr>
+          <w:noProof/>
+        </w:rPr>
+        <w:t xml:space="preserve">s. For example, </w:t>
+      </w:r>
+      <w:r>
+        <w:rPr>
+          <w:noProof/>
+        </w:rPr>
+        <w:t>ensemble deep learning methods</w:t>
+      </w:r>
+      <w:r>
+        <w:rPr>
+          <w:noProof/>
+        </w:rPr>
+        <w:t xml:space="preserve">. </w:t>
+      </w:r>
+      <w:r>
+        <w:rPr>
+          <w:noProof/>
+        </w:rPr>
+        <w:t xml:space="preserve">It </w:t>
+      </w:r>
+      <w:r>
+        <w:rPr>
+          <w:noProof/>
+        </w:rPr>
+        <w:t>aim</w:t>
+      </w:r>
+      <w:r>
+        <w:rPr>
+          <w:noProof/>
+        </w:rPr>
+        <w:t>s</w:t>
+      </w:r>
+      <w:r>
+        <w:rPr>
+          <w:noProof/>
+        </w:rPr>
+        <w:t xml:space="preserve"> to </w:t>
+      </w:r>
+      <w:r>
+        <w:rPr>
+          <w:noProof/>
+        </w:rPr>
+        <w:t>distinguish</w:t>
+      </w:r>
+      <w:r>
+        <w:rPr>
+          <w:noProof/>
+        </w:rPr>
+        <w:t xml:space="preserve"> mild fluctuations and significant deviations to </w:t>
+      </w:r>
+      <w:r>
+        <w:rPr>
+          <w:noProof/>
+        </w:rPr>
+        <w:t>stablize</w:t>
+      </w:r>
+      <w:r>
+        <w:rPr>
+          <w:noProof/>
+        </w:rPr>
+        <w:t xml:space="preserve"> predictive models </w:t>
+      </w:r>
+      <w:r>
+        <w:rPr>
+          <w:noProof/>
+        </w:rPr>
+        <w:t>on</w:t>
+      </w:r>
+      <w:r>
+        <w:rPr>
+          <w:noProof/>
+        </w:rPr>
+        <w:t xml:space="preserve"> unexpected events. The strategic data segmentation with and without such extreme periods is one of the crucial highlights in the research. It is used to evaluate and mitigate their impact on predictive accuracy and bias </w:t>
+      </w:r>
+      <w:r>
+        <w:rPr>
+          <w:noProof/>
+        </w:rPr>
+        <w:t>based on the</w:t>
+      </w:r>
+      <w:r>
+        <w:rPr>
+          <w:noProof/>
+        </w:rPr>
+        <w:t xml:space="preserve"> performance of existing SOTA baselines </w:t>
+      </w:r>
+      <w:r>
+        <w:rPr>
+          <w:noProof/>
+        </w:rPr>
+        <w:t>and</w:t>
+      </w:r>
+      <w:r>
+        <w:rPr>
+          <w:noProof/>
+        </w:rPr>
+        <w:t xml:space="preserve"> the proposed model.</w:t>
+      </w:r>
+    </w:p>
     <w:p>
       <w:pPr>
         <w:pStyle w:val="Heading2"/>
@@ -9052,7 +9318,26 @@
       </w:r>
       <w:bookmarkEnd w:id="18"/>
     </w:p>
-    <w:p/>
+    <w:p>
+      <w:pPr>
+        <w:ind w:firstLine="720"/>
+      </w:pPr>
+      <w:r>
+        <w:t xml:space="preserve">From the reliance on traditional statistical and machine learning (ML) models to the adoption of sophisticated DL architecture, the landscape of urban transit prediction has been levelled up </w:t>
+      </w:r>
+      <w:r>
+        <w:t>substantially</w:t>
+      </w:r>
+      <w:r>
+        <w:t>.</w:t>
+      </w:r>
+      <w:r>
+        <w:t xml:space="preserve"> This change is primarily inspired by the increasing volume and variety of spatiotemporal data collected within modern transit systems. Moreover, the inability of conventional models to capture such intricate</w:t>
+      </w:r>
+      <w:r>
+        <w:t xml:space="preserve">, deeply intertwined, and non-linear patterns also contributed to the change (Lu et al., 2020; Ge et al., 2021). The emergence of big data analytics and advanced DL methodologies provide a promising channel for training models because these models can process complex spatiotemporal interconnections within public transit network (Chen et al., 2022). </w:t>
+      </w:r>
+    </w:p>
     <w:p>
       <w:pPr>
         <w:pStyle w:val="Heading3"/>
@@ -9091,7 +9376,496 @@
       </w:r>
       <w:bookmarkEnd w:id="19"/>
     </w:p>
-    <w:p/>
+    <w:p>
+      <w:pPr>
+        <w:ind w:firstLine="720"/>
+      </w:pPr>
+      <w:r>
+        <w:t xml:space="preserve">Historically, urban transit prediction has relied on a bunch of traditional statistical and ML models, especially for ridership forecasting. </w:t>
+      </w:r>
+      <w:r>
+        <w:t xml:space="preserve">Examples of these traditional architectures are Historical Average (HA), Auto-Regressive Integrated Moving Average (ARIMA), and Vector Auto-Regressive (VAR) models. In addition, according to </w:t>
+      </w:r>
+      <w:r>
+        <w:rPr>
+          <w:noProof/>
+        </w:rPr>
+        <w:t>Yin et al. (2022)</w:t>
+      </w:r>
+      <w:r>
+        <w:t>, conventional ML techniques such as Support Vector Regression (SVR) and Random Forest Regression (RFR) have been developed as well</w:t>
+      </w:r>
+      <w:r>
+        <w:t>.</w:t>
+      </w:r>
+    </w:p>
+    <w:tbl>
+      <w:tblPr>
+        <w:tblStyle w:val="TableGrid"/>
+        <w:tblW w:w="0" w:type="auto"/>
+        <w:tblLook w:val="04A0" w:firstRow="1" w:lastRow="0" w:firstColumn="1" w:lastColumn="0" w:noHBand="0" w:noVBand="1"/>
+      </w:tblPr>
+      <w:tblGrid>
+        <w:gridCol w:w="2263"/>
+        <w:gridCol w:w="3261"/>
+        <w:gridCol w:w="3492"/>
+      </w:tblGrid>
+      <w:tr>
+        <w:tc>
+          <w:tcPr>
+            <w:tcW w:w="2263" w:type="dxa"/>
+            <w:shd w:val="clear" w:color="auto" w:fill="C1E4F5" w:themeFill="accent1" w:themeFillTint="33"/>
+          </w:tcPr>
+          <w:p>
+            <w:pPr>
+              <w:rPr>
+                <w:b/>
+                <w:bCs/>
+              </w:rPr>
+            </w:pPr>
+            <w:r>
+              <w:rPr>
+                <w:b/>
+                <w:bCs/>
+              </w:rPr>
+              <w:t>Aspect</w:t>
+            </w:r>
+          </w:p>
+        </w:tc>
+        <w:tc>
+          <w:tcPr>
+            <w:tcW w:w="3261" w:type="dxa"/>
+            <w:shd w:val="clear" w:color="auto" w:fill="C1E4F5" w:themeFill="accent1" w:themeFillTint="33"/>
+          </w:tcPr>
+          <w:p>
+            <w:pPr>
+              <w:rPr>
+                <w:b/>
+                <w:bCs/>
+              </w:rPr>
+            </w:pPr>
+            <w:r>
+              <w:rPr>
+                <w:b/>
+                <w:bCs/>
+              </w:rPr>
+              <w:t>Traditional Models</w:t>
+            </w:r>
+          </w:p>
+        </w:tc>
+        <w:tc>
+          <w:tcPr>
+            <w:tcW w:w="3492" w:type="dxa"/>
+            <w:shd w:val="clear" w:color="auto" w:fill="C1E4F5" w:themeFill="accent1" w:themeFillTint="33"/>
+          </w:tcPr>
+          <w:p>
+            <w:pPr>
+              <w:rPr>
+                <w:b/>
+                <w:bCs/>
+              </w:rPr>
+            </w:pPr>
+            <w:r>
+              <w:rPr>
+                <w:b/>
+                <w:bCs/>
+              </w:rPr>
+              <w:t>DL Models</w:t>
+            </w:r>
+          </w:p>
+        </w:tc>
+      </w:tr>
+      <w:tr>
+        <w:tc>
+          <w:tcPr>
+            <w:tcW w:w="2263" w:type="dxa"/>
+            <w:shd w:val="clear" w:color="auto" w:fill="F2F2F2" w:themeFill="background1" w:themeFillShade="F2"/>
+          </w:tcPr>
+          <w:p>
+            <w:pPr>
+              <w:rPr>
+                <w:b/>
+                <w:bCs/>
+              </w:rPr>
+            </w:pPr>
+            <w:r>
+              <w:rPr>
+                <w:b/>
+                <w:bCs/>
+              </w:rPr>
+              <w:t>Data Handling</w:t>
+            </w:r>
+          </w:p>
+        </w:tc>
+        <w:tc>
+          <w:tcPr>
+            <w:tcW w:w="3261" w:type="dxa"/>
+          </w:tcPr>
+          <w:p>
+            <w:r>
+              <w:t>Small-scale, structured</w:t>
+            </w:r>
+          </w:p>
+        </w:tc>
+        <w:tc>
+          <w:tcPr>
+            <w:tcW w:w="3492" w:type="dxa"/>
+          </w:tcPr>
+          <w:p>
+            <w:r>
+              <w:t>Large-scale, multi-source</w:t>
+            </w:r>
+          </w:p>
+        </w:tc>
+      </w:tr>
+      <w:tr>
+        <w:tc>
+          <w:tcPr>
+            <w:tcW w:w="2263" w:type="dxa"/>
+            <w:shd w:val="clear" w:color="auto" w:fill="F2F2F2" w:themeFill="background1" w:themeFillShade="F2"/>
+          </w:tcPr>
+          <w:p>
+            <w:pPr>
+              <w:rPr>
+                <w:b/>
+                <w:bCs/>
+              </w:rPr>
+            </w:pPr>
+            <w:r>
+              <w:rPr>
+                <w:b/>
+                <w:bCs/>
+              </w:rPr>
+              <w:t>Dependencies</w:t>
+            </w:r>
+          </w:p>
+        </w:tc>
+        <w:tc>
+          <w:tcPr>
+            <w:tcW w:w="3261" w:type="dxa"/>
+          </w:tcPr>
+          <w:p>
+            <w:r>
+              <w:t>Linear, short-term</w:t>
+            </w:r>
+          </w:p>
+        </w:tc>
+        <w:tc>
+          <w:tcPr>
+            <w:tcW w:w="3492" w:type="dxa"/>
+          </w:tcPr>
+          <w:p>
+            <w:r>
+              <w:t>Non-linear, long-term</w:t>
+            </w:r>
+          </w:p>
+        </w:tc>
+      </w:tr>
+      <w:tr>
+        <w:tc>
+          <w:tcPr>
+            <w:tcW w:w="2263" w:type="dxa"/>
+            <w:shd w:val="clear" w:color="auto" w:fill="F2F2F2" w:themeFill="background1" w:themeFillShade="F2"/>
+          </w:tcPr>
+          <w:p>
+            <w:pPr>
+              <w:rPr>
+                <w:b/>
+                <w:bCs/>
+              </w:rPr>
+            </w:pPr>
+            <w:r>
+              <w:rPr>
+                <w:b/>
+                <w:bCs/>
+              </w:rPr>
+              <w:t>Complexity</w:t>
+            </w:r>
+          </w:p>
+        </w:tc>
+        <w:tc>
+          <w:tcPr>
+            <w:tcW w:w="3261" w:type="dxa"/>
+          </w:tcPr>
+          <w:p>
+            <w:r>
+              <w:t>Low (functional forms)</w:t>
+            </w:r>
+          </w:p>
+        </w:tc>
+        <w:tc>
+          <w:tcPr>
+            <w:tcW w:w="3492" w:type="dxa"/>
+          </w:tcPr>
+          <w:p>
+            <w:r>
+              <w:t>High (hierarchical features)</w:t>
+            </w:r>
+          </w:p>
+        </w:tc>
+      </w:tr>
+      <w:tr>
+        <w:tc>
+          <w:tcPr>
+            <w:tcW w:w="2263" w:type="dxa"/>
+            <w:shd w:val="clear" w:color="auto" w:fill="F2F2F2" w:themeFill="background1" w:themeFillShade="F2"/>
+          </w:tcPr>
+          <w:p>
+            <w:pPr>
+              <w:rPr>
+                <w:b/>
+                <w:bCs/>
+              </w:rPr>
+            </w:pPr>
+            <w:r>
+              <w:rPr>
+                <w:b/>
+                <w:bCs/>
+              </w:rPr>
+              <w:t>Assumptions</w:t>
+            </w:r>
+          </w:p>
+        </w:tc>
+        <w:tc>
+          <w:tcPr>
+            <w:tcW w:w="3261" w:type="dxa"/>
+          </w:tcPr>
+          <w:p>
+            <w:r>
+              <w:t>Strict (Stationarity, normality)</w:t>
+            </w:r>
+          </w:p>
+        </w:tc>
+        <w:tc>
+          <w:tcPr>
+            <w:tcW w:w="3492" w:type="dxa"/>
+          </w:tcPr>
+          <w:p>
+            <w:r>
+              <w:t>Minimal (Data-driven)</w:t>
+            </w:r>
+          </w:p>
+        </w:tc>
+      </w:tr>
+      <w:tr>
+        <w:tc>
+          <w:tcPr>
+            <w:tcW w:w="2263" w:type="dxa"/>
+            <w:shd w:val="clear" w:color="auto" w:fill="F2F2F2" w:themeFill="background1" w:themeFillShade="F2"/>
+          </w:tcPr>
+          <w:p>
+            <w:pPr>
+              <w:rPr>
+                <w:b/>
+                <w:bCs/>
+              </w:rPr>
+            </w:pPr>
+            <w:r>
+              <w:rPr>
+                <w:b/>
+                <w:bCs/>
+              </w:rPr>
+              <w:lastRenderedPageBreak/>
+              <w:t>Interpretability</w:t>
+            </w:r>
+          </w:p>
+        </w:tc>
+        <w:tc>
+          <w:tcPr>
+            <w:tcW w:w="3261" w:type="dxa"/>
+          </w:tcPr>
+          <w:p>
+            <w:r>
+              <w:t>High</w:t>
+            </w:r>
+          </w:p>
+        </w:tc>
+        <w:tc>
+          <w:tcPr>
+            <w:tcW w:w="3492" w:type="dxa"/>
+          </w:tcPr>
+          <w:p>
+            <w:r>
+              <w:t>Lower (Black-box nature)</w:t>
+            </w:r>
+          </w:p>
+        </w:tc>
+      </w:tr>
+      <w:tr>
+        <w:tc>
+          <w:tcPr>
+            <w:tcW w:w="2263" w:type="dxa"/>
+            <w:shd w:val="clear" w:color="auto" w:fill="F2F2F2" w:themeFill="background1" w:themeFillShade="F2"/>
+          </w:tcPr>
+          <w:p>
+            <w:pPr>
+              <w:rPr>
+                <w:b/>
+                <w:bCs/>
+              </w:rPr>
+            </w:pPr>
+            <w:r>
+              <w:rPr>
+                <w:b/>
+                <w:bCs/>
+              </w:rPr>
+              <w:t>Scalability</w:t>
+            </w:r>
+          </w:p>
+        </w:tc>
+        <w:tc>
+          <w:tcPr>
+            <w:tcW w:w="3261" w:type="dxa"/>
+          </w:tcPr>
+          <w:p>
+            <w:r>
+              <w:t>Limited</w:t>
+            </w:r>
+          </w:p>
+        </w:tc>
+        <w:tc>
+          <w:tcPr>
+            <w:tcW w:w="3492" w:type="dxa"/>
+          </w:tcPr>
+          <w:p>
+            <w:r>
+              <w:t>High</w:t>
+            </w:r>
+          </w:p>
+        </w:tc>
+      </w:tr>
+    </w:tbl>
+    <w:p>
+      <w:pPr>
+        <w:pStyle w:val="Caption"/>
+        <w:spacing w:before="240"/>
+        <w:jc w:val="center"/>
+        <w:rPr>
+          <w:color w:val="auto"/>
+          <w:sz w:val="24"/>
+          <w:szCs w:val="24"/>
+        </w:rPr>
+      </w:pPr>
+      <w:r>
+        <w:rPr>
+          <w:color w:val="auto"/>
+          <w:sz w:val="24"/>
+          <w:szCs w:val="24"/>
+        </w:rPr>
+        <w:t xml:space="preserve">Table </w:t>
+      </w:r>
+      <w:r>
+        <w:rPr>
+          <w:color w:val="auto"/>
+          <w:sz w:val="24"/>
+          <w:szCs w:val="24"/>
+        </w:rPr>
+        <w:fldChar w:fldCharType="begin"/>
+      </w:r>
+      <w:r>
+        <w:rPr>
+          <w:color w:val="auto"/>
+          <w:sz w:val="24"/>
+          <w:szCs w:val="24"/>
+        </w:rPr>
+        <w:instrText xml:space="preserve"> SEQ Table \* ARABIC </w:instrText>
+      </w:r>
+      <w:r>
+        <w:rPr>
+          <w:color w:val="auto"/>
+          <w:sz w:val="24"/>
+          <w:szCs w:val="24"/>
+        </w:rPr>
+        <w:fldChar w:fldCharType="separate"/>
+      </w:r>
+      <w:r>
+        <w:rPr>
+          <w:noProof/>
+          <w:color w:val="auto"/>
+          <w:sz w:val="24"/>
+          <w:szCs w:val="24"/>
+        </w:rPr>
+        <w:t>4</w:t>
+      </w:r>
+      <w:r>
+        <w:rPr>
+          <w:color w:val="auto"/>
+          <w:sz w:val="24"/>
+          <w:szCs w:val="24"/>
+        </w:rPr>
+        <w:fldChar w:fldCharType="end"/>
+      </w:r>
+      <w:r>
+        <w:rPr>
+          <w:color w:val="auto"/>
+          <w:sz w:val="24"/>
+          <w:szCs w:val="24"/>
+        </w:rPr>
+        <w:t>: A brief comparison of different aspects between traditional models and DL models</w:t>
+      </w:r>
+    </w:p>
+    <w:p>
+      <w:pPr>
+        <w:ind w:firstLine="720"/>
+      </w:pPr>
+      <w:r>
+        <w:t xml:space="preserve">Based on table 4 above, the interpretability and straightforwardness of traditional models are best for simpler scenarios. Contrastingly, it often struggles with dynamic and complex nature of modern transit data. </w:t>
+      </w:r>
+    </w:p>
+    <w:p>
+      <w:pPr>
+        <w:ind w:firstLine="720"/>
+        <w:rPr>
+          <w:noProof/>
+        </w:rPr>
+      </w:pPr>
+      <w:r>
+        <w:t xml:space="preserve">Yin et al. (2022) highlight that statistical methods generally need data to satisfy specific </w:t>
+      </w:r>
+      <w:r>
+        <w:t>assumptions,</w:t>
+      </w:r>
+      <w:r>
+        <w:t xml:space="preserve"> </w:t>
+      </w:r>
+      <w:r>
+        <w:t xml:space="preserve">but time-varying traffic data is unpredictable. These methods also mostly limited to smaller datasets instead of larger datasets. Similarly, </w:t>
+      </w:r>
+      <w:proofErr w:type="spellStart"/>
+      <w:r>
+        <w:t>Sobrie</w:t>
+      </w:r>
+      <w:proofErr w:type="spellEnd"/>
+      <w:r>
+        <w:rPr>
+          <w:noProof/>
+        </w:rPr>
+        <w:t xml:space="preserve"> et al. (2023) also prove that even though rule-based models are commonly used in business operations because it is easy to interpret and deploy, they also reach</w:t>
+      </w:r>
+      <w:r>
+        <w:rPr>
+          <w:noProof/>
+        </w:rPr>
+        <w:t xml:space="preserve"> their limits when inputted with complex spatiotemporal settings like railway delay prediction. These inflexible models presume functional forms and general rules without adequately weighing in varying time-space interactions.</w:t>
+      </w:r>
+    </w:p>
+    <w:p>
+      <w:pPr>
+        <w:ind w:firstLine="720"/>
+      </w:pPr>
+      <w:r>
+        <w:rPr>
+          <w:noProof/>
+        </w:rPr>
+        <w:t>The main advantage of traditional models is solely because of their interpretability and computational efficiency for basic smaller-scale datasets. Nevertheless, their natural premise on data distribution and linearity make them imponent</w:t>
+      </w:r>
+      <w:r>
+        <w:rPr>
+          <w:noProof/>
+        </w:rPr>
+        <w:t xml:space="preserve"> in highly volatile and dynamic environments. These limitations emphasizes on the imperative for more advanced modeling foundation to handle the complexities of present-day transit data. The development and adoption of DL approaches are motivated by the inability of traditional models to effectively utilizes large, diverse datasets and capture multifaceted spatiotemporal relationships.</w:t>
+      </w:r>
+    </w:p>
     <w:p>
       <w:pPr>
         <w:pStyle w:val="Heading3"/>
@@ -9282,6 +10056,7 @@
           <w:szCs w:val="24"/>
           <w:u w:val="single"/>
         </w:rPr>
+        <w:lastRenderedPageBreak/>
         <w:t>Deployment Challenges</w:t>
       </w:r>
       <w:r>
@@ -9360,7 +10135,6 @@
           <w:szCs w:val="24"/>
           <w:u w:val="single"/>
         </w:rPr>
-        <w:lastRenderedPageBreak/>
         <w:t>Research Gap</w:t>
       </w:r>
       <w:bookmarkEnd w:id="26"/>
@@ -9440,7 +10214,6 @@
           <w:u w:val="single"/>
         </w:rPr>
       </w:pPr>
-      <w:bookmarkStart w:id="29" w:name="_Toc230901625"/>
       <w:r>
         <w:rPr>
           <w:b/>
@@ -9449,9 +10222,18 @@
           <w:szCs w:val="24"/>
           <w:u w:val="single"/>
         </w:rPr>
-        <w:t>Data Preprocessing</w:t>
-      </w:r>
-      <w:bookmarkEnd w:id="29"/>
+        <w:t xml:space="preserve">Data </w:t>
+      </w:r>
+      <w:r>
+        <w:rPr>
+          <w:b/>
+          <w:bCs/>
+          <w:sz w:val="24"/>
+          <w:szCs w:val="24"/>
+          <w:u w:val="single"/>
+        </w:rPr>
+        <w:t>Understanding</w:t>
+      </w:r>
     </w:p>
     <w:p/>
     <w:p>
@@ -9469,7 +10251,7 @@
           <w:u w:val="single"/>
         </w:rPr>
       </w:pPr>
-      <w:bookmarkStart w:id="30" w:name="_Toc230901626"/>
+      <w:bookmarkStart w:id="29" w:name="_Toc230901625"/>
       <w:r>
         <w:rPr>
           <w:b/>
@@ -9478,9 +10260,9 @@
           <w:szCs w:val="24"/>
           <w:u w:val="single"/>
         </w:rPr>
-        <w:t>Feature Engineering</w:t>
-      </w:r>
-      <w:bookmarkEnd w:id="30"/>
+        <w:t>Data Preprocessing</w:t>
+      </w:r>
+      <w:bookmarkEnd w:id="29"/>
     </w:p>
     <w:p/>
     <w:p>
@@ -9498,7 +10280,7 @@
           <w:u w:val="single"/>
         </w:rPr>
       </w:pPr>
-      <w:bookmarkStart w:id="31" w:name="_Toc230901627"/>
+      <w:bookmarkStart w:id="30" w:name="_Toc230901626"/>
       <w:r>
         <w:rPr>
           <w:b/>
@@ -9507,9 +10289,9 @@
           <w:szCs w:val="24"/>
           <w:u w:val="single"/>
         </w:rPr>
-        <w:t>Explanatory Data Analysis</w:t>
-      </w:r>
-      <w:bookmarkEnd w:id="31"/>
+        <w:t>Feature Engineering</w:t>
+      </w:r>
+      <w:bookmarkEnd w:id="30"/>
     </w:p>
     <w:p/>
     <w:p>
@@ -9527,7 +10309,7 @@
           <w:u w:val="single"/>
         </w:rPr>
       </w:pPr>
-      <w:bookmarkStart w:id="32" w:name="_Toc230901628"/>
+      <w:bookmarkStart w:id="31" w:name="_Toc230901627"/>
       <w:r>
         <w:rPr>
           <w:b/>
@@ -9536,9 +10318,9 @@
           <w:szCs w:val="24"/>
           <w:u w:val="single"/>
         </w:rPr>
-        <w:t>Baseline &amp; Comparative Models</w:t>
-      </w:r>
-      <w:bookmarkEnd w:id="32"/>
+        <w:t>Explanatory Data Analysis</w:t>
+      </w:r>
+      <w:bookmarkEnd w:id="31"/>
     </w:p>
     <w:p/>
     <w:p>
@@ -9556,7 +10338,7 @@
           <w:u w:val="single"/>
         </w:rPr>
       </w:pPr>
-      <w:bookmarkStart w:id="33" w:name="_Toc230901629"/>
+      <w:bookmarkStart w:id="32" w:name="_Toc230901628"/>
       <w:r>
         <w:rPr>
           <w:b/>
@@ -9565,11 +10347,91 @@
           <w:szCs w:val="24"/>
           <w:u w:val="single"/>
         </w:rPr>
+        <w:t>Baseline &amp; Comparative Models</w:t>
+      </w:r>
+      <w:bookmarkEnd w:id="32"/>
+    </w:p>
+    <w:p/>
+    <w:p>
+      <w:pPr>
+        <w:pStyle w:val="Heading2"/>
+        <w:numPr>
+          <w:ilvl w:val="1"/>
+          <w:numId w:val="10"/>
+        </w:numPr>
+        <w:rPr>
+          <w:b/>
+          <w:bCs/>
+          <w:sz w:val="24"/>
+          <w:szCs w:val="24"/>
+          <w:u w:val="single"/>
+        </w:rPr>
+      </w:pPr>
+      <w:bookmarkStart w:id="33" w:name="_Toc230901629"/>
+      <w:r>
+        <w:rPr>
+          <w:b/>
+          <w:bCs/>
+          <w:sz w:val="24"/>
+          <w:szCs w:val="24"/>
+          <w:u w:val="single"/>
+        </w:rPr>
+        <w:t xml:space="preserve">Hybrid Multi-scale Temporal </w:t>
+      </w:r>
+      <w:proofErr w:type="spellStart"/>
+      <w:r>
+        <w:rPr>
+          <w:b/>
+          <w:bCs/>
+          <w:sz w:val="24"/>
+          <w:szCs w:val="24"/>
+          <w:u w:val="single"/>
+        </w:rPr>
+        <w:t>Spatiotemporal</w:t>
+      </w:r>
+      <w:r>
+        <w:rPr>
+          <w:b/>
+          <w:bCs/>
+          <w:sz w:val="24"/>
+          <w:szCs w:val="24"/>
+          <w:u w:val="single"/>
+        </w:rPr>
+        <w:t>Feature</w:t>
+      </w:r>
+      <w:proofErr w:type="spellEnd"/>
+      <w:r>
+        <w:rPr>
+          <w:b/>
+          <w:bCs/>
+          <w:sz w:val="24"/>
+          <w:szCs w:val="24"/>
+          <w:u w:val="single"/>
+        </w:rPr>
+        <w:t xml:space="preserve"> (HMT-TSF) </w:t>
+      </w:r>
+      <w:r>
+        <w:rPr>
+          <w:b/>
+          <w:bCs/>
+          <w:sz w:val="24"/>
+          <w:szCs w:val="24"/>
+          <w:u w:val="single"/>
+        </w:rPr>
+        <w:t xml:space="preserve">- </w:t>
+      </w:r>
+      <w:r>
+        <w:rPr>
+          <w:b/>
+          <w:bCs/>
+          <w:sz w:val="24"/>
+          <w:szCs w:val="24"/>
+          <w:u w:val="single"/>
+        </w:rPr>
         <w:t>Proposed Model</w:t>
       </w:r>
       <w:bookmarkEnd w:id="33"/>
     </w:p>
-    <w:p/>
     <w:p/>
     <w:p>
       <w:pPr>
@@ -9638,7 +10500,14 @@
         <w:rPr>
           <w:noProof/>
         </w:rPr>
-        <w:t xml:space="preserve">Amir, N. N., Anuar, N. S., Ismail, B., Azreen, N. A., &amp; Ramli, N. A. (28 December, 2025). Ridership Prediction System for Rapid Bus Kuantan and Penang using Multi-Feature Analysis. </w:t>
+        <w:t xml:space="preserve">Amir, N. N., Anuar, N. S., Ismail, B., Azreen, N. A., &amp; Ramli, N. A. (28 December, 2025). Ridership Prediction System for Rapid Bus Kuantan and Penang using Multi-Feature </w:t>
+      </w:r>
+      <w:r>
+        <w:rPr>
+          <w:noProof/>
+        </w:rPr>
+        <w:lastRenderedPageBreak/>
+        <w:t xml:space="preserve">Analysis. </w:t>
       </w:r>
       <w:r>
         <w:rPr>
@@ -9667,7 +10536,7 @@
         <w:rPr>
           <w:noProof/>
         </w:rPr>
-        <w:t xml:space="preserve">Chen, P., Fu, X., &amp; Wang, X. (7 July, 2022). A Graph Convolutional Stacked Bidirectional Unidirectional-LSTM Neural Network for Metro Ridership Prediction. </w:t>
+        <w:t xml:space="preserve">Bhartiya, P., Bhatele, M., &amp; Gour, L. (July, 2023). Anomaly Detection and Short-Term Prediction of Traffic Flow by using Ensemble Deep Learning Approach. </w:t>
       </w:r>
       <w:r>
         <w:rPr>
@@ -9675,13 +10544,13 @@
           <w:iCs/>
           <w:noProof/>
         </w:rPr>
-        <w:t>IEEE Transactions on Intelligent Transportation Systems, 23</w:t>
-      </w:r>
-      <w:r>
-        <w:rPr>
-          <w:noProof/>
-        </w:rPr>
-        <w:t>(7), 6950 - 6962. doi:10.1109/TITS.2021.3065404</w:t>
+        <w:t>International Journal of Research Publication and Reviews, 4</w:t>
+      </w:r>
+      <w:r>
+        <w:rPr>
+          <w:noProof/>
+        </w:rPr>
+        <w:t>(7), 1951 - 1959.</w:t>
       </w:r>
     </w:p>
     <w:p>
@@ -9696,8 +10565,7 @@
         <w:rPr>
           <w:noProof/>
         </w:rPr>
-        <w:lastRenderedPageBreak/>
-        <w:t xml:space="preserve">Ge, L., Sarhani, M., Voss, S., &amp; Xie, L. (16 October, 2021). Review of Transit Data Sources: Potentials, Challenges and Complementarity. </w:t>
+        <w:t xml:space="preserve">Chen, P., Fu, X., &amp; Wang, X. (7 July, 2022). A Graph Convolutional Stacked Bidirectional Unidirectional-LSTM Neural Network for Metro Ridership Prediction. </w:t>
       </w:r>
       <w:r>
         <w:rPr>
@@ -9705,13 +10573,13 @@
           <w:iCs/>
           <w:noProof/>
         </w:rPr>
-        <w:t>Sustainability, 13</w:t>
-      </w:r>
-      <w:r>
-        <w:rPr>
-          <w:noProof/>
-        </w:rPr>
-        <w:t>(20), 11450. doi:10.3390/su132011450</w:t>
+        <w:t>IEEE Transactions on Intelligent Transportation Systems, 23</w:t>
+      </w:r>
+      <w:r>
+        <w:rPr>
+          <w:noProof/>
+        </w:rPr>
+        <w:t>(7), 6950 - 6962. doi:10.1109/TITS.2021.3065404</w:t>
       </w:r>
     </w:p>
     <w:p>
@@ -9726,7 +10594,7 @@
         <w:rPr>
           <w:noProof/>
         </w:rPr>
-        <w:t xml:space="preserve">Hassan, M., Mahin, H. D., Ahmed, F., Hassan, M. M., Rahaman, A., &amp; Abdullah, M. (4 July, 2025). Assessing Public Transit Network Efficiency and Accessibility in Johor Bahru and Penang, Malaysia: A Data-driven Approach. </w:t>
+        <w:t xml:space="preserve">Ge, L., Sarhani, M., Voss, S., &amp; Xie, L. (16 October, 2021). Review of Transit Data Sources: Potentials, Challenges and Complementarity. </w:t>
       </w:r>
       <w:r>
         <w:rPr>
@@ -9734,13 +10602,13 @@
           <w:iCs/>
           <w:noProof/>
         </w:rPr>
-        <w:t>Results in Engineering, 27</w:t>
-      </w:r>
-      <w:r>
-        <w:rPr>
-          <w:noProof/>
-        </w:rPr>
-        <w:t>, 106126. doi:10.1016/j.rineng.2025.106126</w:t>
+        <w:t>Sustainability, 13</w:t>
+      </w:r>
+      <w:r>
+        <w:rPr>
+          <w:noProof/>
+        </w:rPr>
+        <w:t>(20), 11450. doi:10.3390/su132011450</w:t>
       </w:r>
     </w:p>
     <w:p>
@@ -9755,7 +10623,7 @@
         <w:rPr>
           <w:noProof/>
         </w:rPr>
-        <w:t xml:space="preserve">Ibrahim, A. N., Borhan, M. N., Osman, M. H., Yazid, M. R., &amp; Rohani, M. M. (24 June, 2022). The Influence of Service Quality on User's Perceived Satisfaction with Light Rail Transit Service in Klang Valley, Malaysia. </w:t>
+        <w:t xml:space="preserve">Hassan, M., Mahin, H. D., Ahmed, F., Hassan, M. M., Rahaman, A., &amp; Abdullah, M. (4 July, 2025). Assessing Public Transit Network Efficiency and Accessibility in Johor Bahru and Penang, Malaysia: A Data-driven Approach. </w:t>
       </w:r>
       <w:r>
         <w:rPr>
@@ -9763,13 +10631,13 @@
           <w:iCs/>
           <w:noProof/>
         </w:rPr>
-        <w:t>Mathematics, 10</w:t>
-      </w:r>
-      <w:r>
-        <w:rPr>
-          <w:noProof/>
-        </w:rPr>
-        <w:t>, 2213. doi:10.3390/math10132213</w:t>
+        <w:t>Results in Engineering, 27</w:t>
+      </w:r>
+      <w:r>
+        <w:rPr>
+          <w:noProof/>
+        </w:rPr>
+        <w:t>, 106126. doi:10.1016/j.rineng.2025.106126</w:t>
       </w:r>
     </w:p>
     <w:p>
@@ -9784,7 +10652,7 @@
         <w:rPr>
           <w:noProof/>
         </w:rPr>
-        <w:t xml:space="preserve">Jevinger, A., Zhao, C., Persson, J. A., &amp; Davidsson, P. (March, 2024). Artificial Intelligence for improving public transport: A mapping study. </w:t>
+        <w:t xml:space="preserve">Ibrahim, A. N., Borhan, M. N., Osman, M. H., Yazid, M. R., &amp; Rohani, M. M. (24 June, 2022). The Influence of Service Quality on User's Perceived Satisfaction with Light Rail Transit Service in Klang Valley, Malaysia. </w:t>
       </w:r>
       <w:r>
         <w:rPr>
@@ -9792,13 +10660,13 @@
           <w:iCs/>
           <w:noProof/>
         </w:rPr>
-        <w:t>Public Transport, 16</w:t>
-      </w:r>
-      <w:r>
-        <w:rPr>
-          <w:noProof/>
-        </w:rPr>
-        <w:t>, 99 - 158. doi:10.1007/s12469-023-00334-7</w:t>
+        <w:t>Mathematics, 10</w:t>
+      </w:r>
+      <w:r>
+        <w:rPr>
+          <w:noProof/>
+        </w:rPr>
+        <w:t>, 2213. doi:10.3390/math10132213</w:t>
       </w:r>
     </w:p>
     <w:p>
@@ -9813,7 +10681,7 @@
         <w:rPr>
           <w:noProof/>
         </w:rPr>
-        <w:t xml:space="preserve">Keller, C., Gluck, F., Gerlach, C. F., &amp; Schlegel, T. (1 April, 2022). Investigating the Potential of Data Science Methods for Sustainable Public Transport. </w:t>
+        <w:t xml:space="preserve">Jevinger, A., Zhao, C., Persson, J. A., &amp; Davidsson, P. (March, 2024). Artificial Intelligence for improving public transport: A mapping study. </w:t>
       </w:r>
       <w:r>
         <w:rPr>
@@ -9821,13 +10689,13 @@
           <w:iCs/>
           <w:noProof/>
         </w:rPr>
-        <w:t>Sustainability, 14</w:t>
-      </w:r>
-      <w:r>
-        <w:rPr>
-          <w:noProof/>
-        </w:rPr>
-        <w:t>, 4211. doi:10.3390/su14074211</w:t>
+        <w:t>Public Transport, 16</w:t>
+      </w:r>
+      <w:r>
+        <w:rPr>
+          <w:noProof/>
+        </w:rPr>
+        <w:t>, 99 - 158. doi:10.1007/s12469-023-00334-7</w:t>
       </w:r>
     </w:p>
     <w:p>
@@ -9842,7 +10710,7 @@
         <w:rPr>
           <w:noProof/>
         </w:rPr>
-        <w:t xml:space="preserve">Liu, C., Xiao, Z., Long, W., Li, T., Jiang, H., &amp; Li, K. (May, 2025). Vehicle Trajectory Data Processing, Analytics and Applications: A Survey. </w:t>
+        <w:t xml:space="preserve">Keller, C., Gluck, F., Gerlach, C. F., &amp; Schlegel, T. (1 April, 2022). Investigating the Potential of Data Science Methods for Sustainable Public Transport. </w:t>
       </w:r>
       <w:r>
         <w:rPr>
@@ -9850,13 +10718,13 @@
           <w:iCs/>
           <w:noProof/>
         </w:rPr>
-        <w:t>ACM Comput. Surv., 57</w:t>
-      </w:r>
-      <w:r>
-        <w:rPr>
-          <w:noProof/>
-        </w:rPr>
-        <w:t>(9), 1 - 36. doi:10.1145/3715902</w:t>
+        <w:t>Sustainability, 14</w:t>
+      </w:r>
+      <w:r>
+        <w:rPr>
+          <w:noProof/>
+        </w:rPr>
+        <w:t>, 4211. doi:10.3390/su14074211</w:t>
       </w:r>
     </w:p>
     <w:p>
@@ -9871,7 +10739,7 @@
         <w:rPr>
           <w:noProof/>
         </w:rPr>
-        <w:t xml:space="preserve">Lu, K., Liu, J., Zhou, X., &amp; Han, B. (19 February, 2020). A Review of Big Data Applications in Urban Transit Systems. </w:t>
+        <w:t xml:space="preserve">Liu, C., Xiao, Z., Long, W., Li, T., Jiang, H., &amp; Li, K. (May, 2025). Vehicle Trajectory Data Processing, Analytics and Applications: A Survey. </w:t>
       </w:r>
       <w:r>
         <w:rPr>
@@ -9879,13 +10747,13 @@
           <w:iCs/>
           <w:noProof/>
         </w:rPr>
-        <w:t>IEEE Transactions on Intelligent Transportation Systems, 22</w:t>
-      </w:r>
-      <w:r>
-        <w:rPr>
-          <w:noProof/>
-        </w:rPr>
-        <w:t>(5), 2535-2552. doi:10.1109/TITS.2020.2973365</w:t>
+        <w:t>ACM Comput. Surv., 57</w:t>
+      </w:r>
+      <w:r>
+        <w:rPr>
+          <w:noProof/>
+        </w:rPr>
+        <w:t>(9), 1 - 36. doi:10.1145/3715902</w:t>
       </w:r>
     </w:p>
     <w:p>
@@ -9900,7 +10768,8 @@
         <w:rPr>
           <w:noProof/>
         </w:rPr>
-        <w:t xml:space="preserve">Lv, Z., Li, J., Dong, C., Li, H., &amp; Xu, Z. (29 June, 2021). Deep Learning in the COVID-19 epidemic: A deep model for urban traffic revitalization index. </w:t>
+        <w:lastRenderedPageBreak/>
+        <w:t xml:space="preserve">Lu, K., Liu, J., Zhou, X., &amp; Han, B. (19 February, 2020). A Review of Big Data Applications in Urban Transit Systems. </w:t>
       </w:r>
       <w:r>
         <w:rPr>
@@ -9908,13 +10777,13 @@
           <w:iCs/>
           <w:noProof/>
         </w:rPr>
-        <w:t>Data &amp; Knowledge Engineering, 135</w:t>
-      </w:r>
-      <w:r>
-        <w:rPr>
-          <w:noProof/>
-        </w:rPr>
-        <w:t>, 101912. doi:10.1016/j.datak.2021.101912</w:t>
+        <w:t>IEEE Transactions on Intelligent Transportation Systems, 22</w:t>
+      </w:r>
+      <w:r>
+        <w:rPr>
+          <w:noProof/>
+        </w:rPr>
+        <w:t>(5), 2535-2552. doi:10.1109/TITS.2020.2973365</w:t>
       </w:r>
     </w:p>
     <w:p>
@@ -9929,7 +10798,7 @@
         <w:rPr>
           <w:noProof/>
         </w:rPr>
-        <w:t xml:space="preserve">Mee, C. K., Subramaniam, G., Ating, R., &amp; Separa, L. A. (30 September, 2022). Willingness to use Public Transport in Kuala Lumpur &amp; Manila. </w:t>
+        <w:t xml:space="preserve">Lv, Z., Li, J., Dong, C., Li, H., &amp; Xu, Z. (29 June, 2021). Deep Learning in the COVID-19 epidemic: A deep model for urban traffic revitalization index. </w:t>
       </w:r>
       <w:r>
         <w:rPr>
@@ -9937,13 +10806,13 @@
           <w:iCs/>
           <w:noProof/>
         </w:rPr>
-        <w:t>Environment-Behaviour Proceedings Journal, 7</w:t>
-      </w:r>
-      <w:r>
-        <w:rPr>
-          <w:noProof/>
-        </w:rPr>
-        <w:t>(21), 1 - 9. doi:10.21834/ebpj.v7i21.3751</w:t>
+        <w:t>Data &amp; Knowledge Engineering, 135</w:t>
+      </w:r>
+      <w:r>
+        <w:rPr>
+          <w:noProof/>
+        </w:rPr>
+        <w:t>, 101912. doi:10.1016/j.datak.2021.101912</w:t>
       </w:r>
     </w:p>
     <w:p>
@@ -9958,8 +10827,19 @@
         <w:rPr>
           <w:noProof/>
         </w:rPr>
-        <w:lastRenderedPageBreak/>
-        <w:t xml:space="preserve">Mohamed, A. H., Adwan, I. A., Ahmeda, A. G., Hrtemih, H., &amp; Al-MSari, H. (25 April, 2021). Identification of Affecting Factors on the Travel Time Reliability for Bus Transportation. </w:t>
+        <w:t xml:space="preserve">Maria-Arribas, D., Pantrigo, J. J., &amp; Cuesta-Infante, A. (25 February, 2026). A massive, graph augmented, traffic dataset for machine leraning and deep learning </w:t>
+      </w:r>
+      <w:r>
+        <w:rPr>
+          <w:noProof/>
+        </w:rPr>
+        <w:t>spatiotemporal</w:t>
+      </w:r>
+      <w:r>
+        <w:rPr>
+          <w:noProof/>
+        </w:rPr>
+        <w:t xml:space="preserve">temporal traffic analysis. </w:t>
       </w:r>
       <w:r>
         <w:rPr>
@@ -9967,13 +10847,13 @@
           <w:iCs/>
           <w:noProof/>
         </w:rPr>
-        <w:t>Knowledge-based Engineering and Science, 2</w:t>
-      </w:r>
-      <w:r>
-        <w:rPr>
-          <w:noProof/>
-        </w:rPr>
-        <w:t>(1), 19 - 30. doi:10.51526/kbes.2021.2.1.19-30</w:t>
+        <w:t>Research Square</w:t>
+      </w:r>
+      <w:r>
+        <w:rPr>
+          <w:noProof/>
+        </w:rPr>
+        <w:t>, 1 - 17. doi:10.21203/rs.3.rs-8670080/v1</w:t>
       </w:r>
     </w:p>
     <w:p>
@@ -9988,7 +10868,7 @@
         <w:rPr>
           <w:noProof/>
         </w:rPr>
-        <w:t xml:space="preserve">Rezapour, M., &amp; Ferraro, F. R. (16 June, 2021). Rail Transport Delay and Its Effects on the Perceived Importance of a Real-time Information. </w:t>
+        <w:t xml:space="preserve">Mee, C. K., Subramaniam, G., Ating, R., &amp; Separa, L. A. (30 September, 2022). Willingness to use Public Transport in Kuala Lumpur &amp; Manila. </w:t>
       </w:r>
       <w:r>
         <w:rPr>
@@ -9996,13 +10876,13 @@
           <w:iCs/>
           <w:noProof/>
         </w:rPr>
-        <w:t>Frontiers in Psychology, 12</w:t>
-      </w:r>
-      <w:r>
-        <w:rPr>
-          <w:noProof/>
-        </w:rPr>
-        <w:t>, 1 - 11. doi:10.3389/fpsyg.2021.619308</w:t>
+        <w:t>Environment-Behaviour Proceedings Journal, 7</w:t>
+      </w:r>
+      <w:r>
+        <w:rPr>
+          <w:noProof/>
+        </w:rPr>
+        <w:t>(21), 1 - 9. doi:10.21834/ebpj.v7i21.3751</w:t>
       </w:r>
     </w:p>
     <w:p>
@@ -10017,7 +10897,7 @@
         <w:rPr>
           <w:noProof/>
         </w:rPr>
-        <w:t xml:space="preserve">S.K.B, S., Mathivanan, S. K., Rajadurai, H., Cho, J., &amp; Easwaramoorthy, S. V. (30 December, 2024). A multi-modal geospatial–temporal LSTM based deep learning framework for predictive modeling of urban mobility patterns. </w:t>
+        <w:t xml:space="preserve">Mohamed, A. H., Adwan, I. A., Ahmeda, A. G., Hrtemih, H., &amp; Al-MSari, H. (25 April, 2021). Identification of Affecting Factors on the Travel Time Reliability for Bus Transportation. </w:t>
       </w:r>
       <w:r>
         <w:rPr>
@@ -10025,13 +10905,13 @@
           <w:iCs/>
           <w:noProof/>
         </w:rPr>
-        <w:t>Scientific Reports, 14</w:t>
-      </w:r>
-      <w:r>
-        <w:rPr>
-          <w:noProof/>
-        </w:rPr>
-        <w:t>, 1 - 19. doi:10.1038/s41598-024-74237-3</w:t>
+        <w:t>Knowledge-based Engineering and Science, 2</w:t>
+      </w:r>
+      <w:r>
+        <w:rPr>
+          <w:noProof/>
+        </w:rPr>
+        <w:t>(1), 19 - 30. doi:10.51526/kbes.2021.2.1.19-30</w:t>
       </w:r>
     </w:p>
     <w:p>
@@ -10046,7 +10926,7 @@
         <w:rPr>
           <w:noProof/>
         </w:rPr>
-        <w:t xml:space="preserve">Sogbe, E., Susilawati, S., &amp; Tan, C. P. (26 September, 2024). Scaling up public transport usage: a systematic literature review of service quality, satisfaction and attitude towards bus transport systems in developing countries. </w:t>
+        <w:t xml:space="preserve">Rezapour, M., &amp; Ferraro, F. R. (16 June, 2021). Rail Transport Delay and Its Effects on the Perceived Importance of a Real-time Information. </w:t>
       </w:r>
       <w:r>
         <w:rPr>
@@ -10054,13 +10934,13 @@
           <w:iCs/>
           <w:noProof/>
         </w:rPr>
-        <w:t>Public Transport, 17</w:t>
-      </w:r>
-      <w:r>
-        <w:rPr>
-          <w:noProof/>
-        </w:rPr>
-        <w:t>, 1 - 44. doi:10.1007/s12469-024-00367-6</w:t>
+        <w:t>Frontiers in Psychology, 12</w:t>
+      </w:r>
+      <w:r>
+        <w:rPr>
+          <w:noProof/>
+        </w:rPr>
+        <w:t>, 1 - 11. doi:10.3389/fpsyg.2021.619308</w:t>
       </w:r>
     </w:p>
     <w:p>
@@ -10075,7 +10955,7 @@
         <w:rPr>
           <w:noProof/>
         </w:rPr>
-        <w:t xml:space="preserve">Ubaidillah, N. Z., Sa'ad, N. H., Ismail, F., Nordin, N. A., Baharuddin, N., &amp; Hassam, M. K. (June, 2022). The Impact of Public Bus Service Quality on the Users’ Satisfaction: Evidence from a Developing Asian City. </w:t>
+        <w:t xml:space="preserve">S.K.B, S., Mathivanan, S. K., Rajadurai, H., Cho, J., &amp; Easwaramoorthy, S. V. (30 December, 2024). A multi-modal geospatial–temporal LSTM based deep learning framework for predictive modeling of urban mobility patterns. </w:t>
       </w:r>
       <w:r>
         <w:rPr>
@@ -10083,13 +10963,13 @@
           <w:iCs/>
           <w:noProof/>
         </w:rPr>
-        <w:t>Review of Applied Socio-Economic Research, 23</w:t>
-      </w:r>
-      <w:r>
-        <w:rPr>
-          <w:noProof/>
-        </w:rPr>
-        <w:t>(1), 83 - 96. doi:10.54609/reaser.v23i1.185</w:t>
+        <w:t>Scientific Reports, 14</w:t>
+      </w:r>
+      <w:r>
+        <w:rPr>
+          <w:noProof/>
+        </w:rPr>
+        <w:t>, 1 - 19. doi:10.1038/s41598-024-74237-3</w:t>
       </w:r>
     </w:p>
     <w:p>
@@ -10104,7 +10984,7 @@
         <w:rPr>
           <w:noProof/>
         </w:rPr>
-        <w:t xml:space="preserve">Wang, J., Liu, C., Wu, Z., Liao, R., Li, G., &amp; Lu, H. (March, 2025). The Roadmap and Strategy for Prioritizing the Development of Public Transport in China. </w:t>
+        <w:t xml:space="preserve">Sogbe, E., Susilawati, S., &amp; Tan, C. P. (26 September, 2024). Scaling up public transport usage: a systematic literature review of service quality, satisfaction and attitude towards bus transport systems in developing countries. </w:t>
       </w:r>
       <w:r>
         <w:rPr>
@@ -10112,6 +10992,71 @@
           <w:iCs/>
           <w:noProof/>
         </w:rPr>
+        <w:t>Public Transport, 17</w:t>
+      </w:r>
+      <w:r>
+        <w:rPr>
+          <w:noProof/>
+        </w:rPr>
+        <w:t>, 1 - 44. doi:10.1007/s12469-024-00367-6</w:t>
+      </w:r>
+    </w:p>
+    <w:p>
+      <w:pPr>
+        <w:pStyle w:val="Bibliography"/>
+        <w:ind w:left="720" w:hanging="720"/>
+        <w:rPr>
+          <w:noProof/>
+        </w:rPr>
+      </w:pPr>
+      <w:r>
+        <w:rPr>
+          <w:noProof/>
+        </w:rPr>
+        <w:t xml:space="preserve">Ubaidillah, N. Z., Sa'ad, N. H., Ismail, F., Nordin, N. A., Baharuddin, N., &amp; Hassam, M. K. (June, 2022). The Impact of Public Bus Service Quality on the Users’ Satisfaction: </w:t>
+      </w:r>
+      <w:r>
+        <w:rPr>
+          <w:noProof/>
+        </w:rPr>
+        <w:lastRenderedPageBreak/>
+        <w:t xml:space="preserve">Evidence from a Developing Asian City. </w:t>
+      </w:r>
+      <w:r>
+        <w:rPr>
+          <w:i/>
+          <w:iCs/>
+          <w:noProof/>
+        </w:rPr>
+        <w:t>Review of Applied Socio-Economic Research, 23</w:t>
+      </w:r>
+      <w:r>
+        <w:rPr>
+          <w:noProof/>
+        </w:rPr>
+        <w:t>(1), 83 - 96. doi:10.54609/reaser.v23i1.185</w:t>
+      </w:r>
+    </w:p>
+    <w:p>
+      <w:pPr>
+        <w:pStyle w:val="Bibliography"/>
+        <w:ind w:left="720" w:hanging="720"/>
+        <w:rPr>
+          <w:noProof/>
+        </w:rPr>
+      </w:pPr>
+      <w:r>
+        <w:rPr>
+          <w:noProof/>
+        </w:rPr>
+        <w:t xml:space="preserve">Wang, J., Liu, C., Wu, Z., Liao, R., Li, G., &amp; Lu, H. (March, 2025). The Roadmap and Strategy for Prioritizing the Development of Public Transport in China. </w:t>
+      </w:r>
+      <w:r>
+        <w:rPr>
+          <w:i/>
+          <w:iCs/>
+          <w:noProof/>
+        </w:rPr>
         <w:t>Multimodal Transportation, 4</w:t>
       </w:r>
       <w:r>
@@ -10119,6 +11064,35 @@
           <w:noProof/>
         </w:rPr>
         <w:t>(1), 100184. doi:10.1016/j.multra.2024.100184</w:t>
+      </w:r>
+    </w:p>
+    <w:p>
+      <w:pPr>
+        <w:pStyle w:val="Bibliography"/>
+        <w:ind w:left="720" w:hanging="720"/>
+        <w:rPr>
+          <w:noProof/>
+        </w:rPr>
+      </w:pPr>
+      <w:r>
+        <w:rPr>
+          <w:noProof/>
+        </w:rPr>
+        <w:t xml:space="preserve">Wang, L., Zhou, Y., &amp; Ke, W. (March, 2025). Harmful data enhanced anomaly detection for quasi-periodic multivariate time series. </w:t>
+      </w:r>
+      <w:r>
+        <w:rPr>
+          <w:i/>
+          <w:iCs/>
+          <w:noProof/>
+        </w:rPr>
+        <w:t>Applied Intelligence, 55</w:t>
+      </w:r>
+      <w:r>
+        <w:rPr>
+          <w:noProof/>
+        </w:rPr>
+        <w:t>(7), 1 - 21. doi:10.1007/s10489-025-06461-x</w:t>
       </w:r>
     </w:p>
     <w:p>
@@ -10388,6 +11362,119 @@
     </w:lvl>
   </w:abstractNum>
   <w:abstractNum w:abstractNumId="1" w15:restartNumberingAfterBreak="0">
+    <w:nsid w:val="0652326A"/>
+    <w:multiLevelType w:val="hybridMultilevel"/>
+    <w:tmpl w:val="7BFAC60E"/>
+    <w:lvl w:ilvl="0" w:tplc="44090005">
+      <w:start w:val="1"/>
+      <w:numFmt w:val="bullet"/>
+      <w:lvlText w:val=""/>
+      <w:lvlJc w:val="left"/>
+      <w:pPr>
+        <w:ind w:left="720" w:hanging="360"/>
+      </w:pPr>
+      <w:rPr>
+        <w:rFonts w:ascii="Wingdings" w:hAnsi="Wingdings" w:hint="default"/>
+      </w:rPr>
+    </w:lvl>
+    <w:lvl w:ilvl="1" w:tplc="44090003" w:tentative="1">
+      <w:start w:val="1"/>
+      <w:numFmt w:val="bullet"/>
+      <w:lvlText w:val="o"/>
+      <w:lvlJc w:val="left"/>
+      <w:pPr>
+        <w:ind w:left="1440" w:hanging="360"/>
+      </w:pPr>
+      <w:rPr>
+        <w:rFonts w:ascii="Courier New" w:hAnsi="Courier New" w:cs="Courier New" w:hint="default"/>
+      </w:rPr>
+    </w:lvl>
+    <w:lvl w:ilvl="2" w:tplc="44090005" w:tentative="1">
+      <w:start w:val="1"/>
+      <w:numFmt w:val="bullet"/>
+      <w:lvlText w:val=""/>
+      <w:lvlJc w:val="left"/>
+      <w:pPr>
+        <w:ind w:left="2160" w:hanging="360"/>
+      </w:pPr>
+      <w:rPr>
+        <w:rFonts w:ascii="Wingdings" w:hAnsi="Wingdings" w:hint="default"/>
+      </w:rPr>
+    </w:lvl>
+    <w:lvl w:ilvl="3" w:tplc="44090001" w:tentative="1">
+      <w:start w:val="1"/>
+      <w:numFmt w:val="bullet"/>
+      <w:lvlText w:val=""/>
+      <w:lvlJc w:val="left"/>
+      <w:pPr>
+        <w:ind w:left="2880" w:hanging="360"/>
+      </w:pPr>
+      <w:rPr>
+        <w:rFonts w:ascii="Symbol" w:hAnsi="Symbol" w:hint="default"/>
+      </w:rPr>
+    </w:lvl>
+    <w:lvl w:ilvl="4" w:tplc="44090003" w:tentative="1">
+      <w:start w:val="1"/>
+      <w:numFmt w:val="bullet"/>
+      <w:lvlText w:val="o"/>
+      <w:lvlJc w:val="left"/>
+      <w:pPr>
+        <w:ind w:left="3600" w:hanging="360"/>
+      </w:pPr>
+      <w:rPr>
+        <w:rFonts w:ascii="Courier New" w:hAnsi="Courier New" w:cs="Courier New" w:hint="default"/>
+      </w:rPr>
+    </w:lvl>
+    <w:lvl w:ilvl="5" w:tplc="44090005" w:tentative="1">
+      <w:start w:val="1"/>
+      <w:numFmt w:val="bullet"/>
+      <w:lvlText w:val=""/>
+      <w:lvlJc w:val="left"/>
+      <w:pPr>
+        <w:ind w:left="4320" w:hanging="360"/>
+      </w:pPr>
+      <w:rPr>
+        <w:rFonts w:ascii="Wingdings" w:hAnsi="Wingdings" w:hint="default"/>
+      </w:rPr>
+    </w:lvl>
+    <w:lvl w:ilvl="6" w:tplc="44090001" w:tentative="1">
+      <w:start w:val="1"/>
+      <w:numFmt w:val="bullet"/>
+      <w:lvlText w:val=""/>
+      <w:lvlJc w:val="left"/>
+      <w:pPr>
+        <w:ind w:left="5040" w:hanging="360"/>
+      </w:pPr>
+      <w:rPr>
+        <w:rFonts w:ascii="Symbol" w:hAnsi="Symbol" w:hint="default"/>
+      </w:rPr>
+    </w:lvl>
+    <w:lvl w:ilvl="7" w:tplc="44090003" w:tentative="1">
+      <w:start w:val="1"/>
+      <w:numFmt w:val="bullet"/>
+      <w:lvlText w:val="o"/>
+      <w:lvlJc w:val="left"/>
+      <w:pPr>
+        <w:ind w:left="5760" w:hanging="360"/>
+      </w:pPr>
+      <w:rPr>
+        <w:rFonts w:ascii="Courier New" w:hAnsi="Courier New" w:cs="Courier New" w:hint="default"/>
+      </w:rPr>
+    </w:lvl>
+    <w:lvl w:ilvl="8" w:tplc="44090005" w:tentative="1">
+      <w:start w:val="1"/>
+      <w:numFmt w:val="bullet"/>
+      <w:lvlText w:val=""/>
+      <w:lvlJc w:val="left"/>
+      <w:pPr>
+        <w:ind w:left="6480" w:hanging="360"/>
+      </w:pPr>
+      <w:rPr>
+        <w:rFonts w:ascii="Wingdings" w:hAnsi="Wingdings" w:hint="default"/>
+      </w:rPr>
+    </w:lvl>
+  </w:abstractNum>
+  <w:abstractNum w:abstractNumId="2" w15:restartNumberingAfterBreak="0">
     <w:nsid w:val="07644860"/>
     <w:multiLevelType w:val="hybridMultilevel"/>
     <w:tmpl w:val="C9A0BDD8"/>
@@ -10476,7 +11563,7 @@
       </w:pPr>
     </w:lvl>
   </w:abstractNum>
-  <w:abstractNum w:abstractNumId="2" w15:restartNumberingAfterBreak="0">
+  <w:abstractNum w:abstractNumId="3" w15:restartNumberingAfterBreak="0">
     <w:nsid w:val="07C37237"/>
     <w:multiLevelType w:val="multilevel"/>
     <w:tmpl w:val="4409001F"/>
@@ -10562,7 +11649,7 @@
       </w:pPr>
     </w:lvl>
   </w:abstractNum>
-  <w:abstractNum w:abstractNumId="3" w15:restartNumberingAfterBreak="0">
+  <w:abstractNum w:abstractNumId="4" w15:restartNumberingAfterBreak="0">
     <w:nsid w:val="0CAE27FB"/>
     <w:multiLevelType w:val="multilevel"/>
     <w:tmpl w:val="4409001F"/>
@@ -10648,7 +11735,93 @@
       </w:pPr>
     </w:lvl>
   </w:abstractNum>
-  <w:abstractNum w:abstractNumId="4" w15:restartNumberingAfterBreak="0">
+  <w:abstractNum w:abstractNumId="5" w15:restartNumberingAfterBreak="0">
+    <w:nsid w:val="0CFA0F0C"/>
+    <w:multiLevelType w:val="multilevel"/>
+    <w:tmpl w:val="4409001F"/>
+    <w:lvl w:ilvl="0">
+      <w:start w:val="1"/>
+      <w:numFmt w:val="decimal"/>
+      <w:lvlText w:val="%1."/>
+      <w:lvlJc w:val="left"/>
+      <w:pPr>
+        <w:ind w:left="360" w:hanging="360"/>
+      </w:pPr>
+    </w:lvl>
+    <w:lvl w:ilvl="1">
+      <w:start w:val="1"/>
+      <w:numFmt w:val="decimal"/>
+      <w:lvlText w:val="%1.%2."/>
+      <w:lvlJc w:val="left"/>
+      <w:pPr>
+        <w:ind w:left="792" w:hanging="432"/>
+      </w:pPr>
+    </w:lvl>
+    <w:lvl w:ilvl="2">
+      <w:start w:val="1"/>
+      <w:numFmt w:val="decimal"/>
+      <w:lvlText w:val="%1.%2.%3."/>
+      <w:lvlJc w:val="left"/>
+      <w:pPr>
+        <w:ind w:left="1224" w:hanging="504"/>
+      </w:pPr>
+    </w:lvl>
+    <w:lvl w:ilvl="3">
+      <w:start w:val="1"/>
+      <w:numFmt w:val="decimal"/>
+      <w:lvlText w:val="%1.%2.%3.%4."/>
+      <w:lvlJc w:val="left"/>
+      <w:pPr>
+        <w:ind w:left="1728" w:hanging="648"/>
+      </w:pPr>
+    </w:lvl>
+    <w:lvl w:ilvl="4">
+      <w:start w:val="1"/>
+      <w:numFmt w:val="decimal"/>
+      <w:lvlText w:val="%1.%2.%3.%4.%5."/>
+      <w:lvlJc w:val="left"/>
+      <w:pPr>
+        <w:ind w:left="2232" w:hanging="792"/>
+      </w:pPr>
+    </w:lvl>
+    <w:lvl w:ilvl="5">
+      <w:start w:val="1"/>
+      <w:numFmt w:val="decimal"/>
+      <w:lvlText w:val="%1.%2.%3.%4.%5.%6."/>
+      <w:lvlJc w:val="left"/>
+      <w:pPr>
+        <w:ind w:left="2736" w:hanging="936"/>
+      </w:pPr>
+    </w:lvl>
+    <w:lvl w:ilvl="6">
+      <w:start w:val="1"/>
+      <w:numFmt w:val="decimal"/>
+      <w:lvlText w:val="%1.%2.%3.%4.%5.%6.%7."/>
+      <w:lvlJc w:val="left"/>
+      <w:pPr>
+        <w:ind w:left="3240" w:hanging="1080"/>
+      </w:pPr>
+    </w:lvl>
+    <w:lvl w:ilvl="7">
+      <w:start w:val="1"/>
+      <w:numFmt w:val="decimal"/>
+      <w:lvlText w:val="%1.%2.%3.%4.%5.%6.%7.%8."/>
+      <w:lvlJc w:val="left"/>
+      <w:pPr>
+        <w:ind w:left="3744" w:hanging="1224"/>
+      </w:pPr>
+    </w:lvl>
+    <w:lvl w:ilvl="8">
+      <w:start w:val="1"/>
+      <w:numFmt w:val="decimal"/>
+      <w:lvlText w:val="%1.%2.%3.%4.%5.%6.%7.%8.%9."/>
+      <w:lvlJc w:val="left"/>
+      <w:pPr>
+        <w:ind w:left="4320" w:hanging="1440"/>
+      </w:pPr>
+    </w:lvl>
+  </w:abstractNum>
+  <w:abstractNum w:abstractNumId="6" w15:restartNumberingAfterBreak="0">
     <w:nsid w:val="111B6815"/>
     <w:multiLevelType w:val="hybridMultilevel"/>
     <w:tmpl w:val="ABFC905E"/>
@@ -10737,7 +11910,7 @@
       </w:pPr>
     </w:lvl>
   </w:abstractNum>
-  <w:abstractNum w:abstractNumId="5" w15:restartNumberingAfterBreak="0">
+  <w:abstractNum w:abstractNumId="7" w15:restartNumberingAfterBreak="0">
     <w:nsid w:val="19CE31B7"/>
     <w:multiLevelType w:val="hybridMultilevel"/>
     <w:tmpl w:val="CF907BCC"/>
@@ -10850,7 +12023,7 @@
       </w:rPr>
     </w:lvl>
   </w:abstractNum>
-  <w:abstractNum w:abstractNumId="6" w15:restartNumberingAfterBreak="0">
+  <w:abstractNum w:abstractNumId="8" w15:restartNumberingAfterBreak="0">
     <w:nsid w:val="206A4D7B"/>
     <w:multiLevelType w:val="hybridMultilevel"/>
     <w:tmpl w:val="68EEF4B0"/>
@@ -10939,7 +12112,7 @@
       </w:pPr>
     </w:lvl>
   </w:abstractNum>
-  <w:abstractNum w:abstractNumId="7" w15:restartNumberingAfterBreak="0">
+  <w:abstractNum w:abstractNumId="9" w15:restartNumberingAfterBreak="0">
     <w:nsid w:val="224E535D"/>
     <w:multiLevelType w:val="hybridMultilevel"/>
     <w:tmpl w:val="C47A0DB4"/>
@@ -11028,7 +12201,7 @@
       </w:pPr>
     </w:lvl>
   </w:abstractNum>
-  <w:abstractNum w:abstractNumId="8" w15:restartNumberingAfterBreak="0">
+  <w:abstractNum w:abstractNumId="10" w15:restartNumberingAfterBreak="0">
     <w:nsid w:val="22BA62DA"/>
     <w:multiLevelType w:val="multilevel"/>
     <w:tmpl w:val="4409001F"/>
@@ -11114,7 +12287,7 @@
       </w:pPr>
     </w:lvl>
   </w:abstractNum>
-  <w:abstractNum w:abstractNumId="9" w15:restartNumberingAfterBreak="0">
+  <w:abstractNum w:abstractNumId="11" w15:restartNumberingAfterBreak="0">
     <w:nsid w:val="24C84591"/>
     <w:multiLevelType w:val="hybridMultilevel"/>
     <w:tmpl w:val="03CE792E"/>
@@ -11227,7 +12400,7 @@
       </w:rPr>
     </w:lvl>
   </w:abstractNum>
-  <w:abstractNum w:abstractNumId="10" w15:restartNumberingAfterBreak="0">
+  <w:abstractNum w:abstractNumId="12" w15:restartNumberingAfterBreak="0">
     <w:nsid w:val="2C864025"/>
     <w:multiLevelType w:val="multilevel"/>
     <w:tmpl w:val="4409001F"/>
@@ -11313,7 +12486,7 @@
       </w:pPr>
     </w:lvl>
   </w:abstractNum>
-  <w:abstractNum w:abstractNumId="11" w15:restartNumberingAfterBreak="0">
+  <w:abstractNum w:abstractNumId="13" w15:restartNumberingAfterBreak="0">
     <w:nsid w:val="391A47EE"/>
     <w:multiLevelType w:val="hybridMultilevel"/>
     <w:tmpl w:val="608C2FC8"/>
@@ -11402,7 +12575,7 @@
       </w:pPr>
     </w:lvl>
   </w:abstractNum>
-  <w:abstractNum w:abstractNumId="12" w15:restartNumberingAfterBreak="0">
+  <w:abstractNum w:abstractNumId="14" w15:restartNumberingAfterBreak="0">
     <w:nsid w:val="4AC53607"/>
     <w:multiLevelType w:val="hybridMultilevel"/>
     <w:tmpl w:val="CAB8B28C"/>
@@ -11491,7 +12664,7 @@
       </w:pPr>
     </w:lvl>
   </w:abstractNum>
-  <w:abstractNum w:abstractNumId="13" w15:restartNumberingAfterBreak="0">
+  <w:abstractNum w:abstractNumId="15" w15:restartNumberingAfterBreak="0">
     <w:nsid w:val="4C767CF7"/>
     <w:multiLevelType w:val="hybridMultilevel"/>
     <w:tmpl w:val="E006DF60"/>
@@ -11580,7 +12753,7 @@
       </w:pPr>
     </w:lvl>
   </w:abstractNum>
-  <w:abstractNum w:abstractNumId="14" w15:restartNumberingAfterBreak="0">
+  <w:abstractNum w:abstractNumId="16" w15:restartNumberingAfterBreak="0">
     <w:nsid w:val="4D1A3479"/>
     <w:multiLevelType w:val="hybridMultilevel"/>
     <w:tmpl w:val="71E03ACE"/>
@@ -11693,7 +12866,7 @@
       </w:rPr>
     </w:lvl>
   </w:abstractNum>
-  <w:abstractNum w:abstractNumId="15" w15:restartNumberingAfterBreak="0">
+  <w:abstractNum w:abstractNumId="17" w15:restartNumberingAfterBreak="0">
     <w:nsid w:val="56652890"/>
     <w:multiLevelType w:val="hybridMultilevel"/>
     <w:tmpl w:val="89AC1C9A"/>
@@ -11806,7 +12979,7 @@
       </w:rPr>
     </w:lvl>
   </w:abstractNum>
-  <w:abstractNum w:abstractNumId="16" w15:restartNumberingAfterBreak="0">
+  <w:abstractNum w:abstractNumId="18" w15:restartNumberingAfterBreak="0">
     <w:nsid w:val="576B70A5"/>
     <w:multiLevelType w:val="hybridMultilevel"/>
     <w:tmpl w:val="CBCCF546"/>
@@ -11919,7 +13092,7 @@
       </w:rPr>
     </w:lvl>
   </w:abstractNum>
-  <w:abstractNum w:abstractNumId="17" w15:restartNumberingAfterBreak="0">
+  <w:abstractNum w:abstractNumId="19" w15:restartNumberingAfterBreak="0">
     <w:nsid w:val="58824DF6"/>
     <w:multiLevelType w:val="hybridMultilevel"/>
     <w:tmpl w:val="CBEA4438"/>
@@ -12032,7 +13205,7 @@
       </w:rPr>
     </w:lvl>
   </w:abstractNum>
-  <w:abstractNum w:abstractNumId="18" w15:restartNumberingAfterBreak="0">
+  <w:abstractNum w:abstractNumId="20" w15:restartNumberingAfterBreak="0">
     <w:nsid w:val="595C5C89"/>
     <w:multiLevelType w:val="hybridMultilevel"/>
     <w:tmpl w:val="BB58A9A2"/>
@@ -12122,7 +13295,7 @@
       </w:pPr>
     </w:lvl>
   </w:abstractNum>
-  <w:abstractNum w:abstractNumId="19" w15:restartNumberingAfterBreak="0">
+  <w:abstractNum w:abstractNumId="21" w15:restartNumberingAfterBreak="0">
     <w:nsid w:val="707B624C"/>
     <w:multiLevelType w:val="hybridMultilevel"/>
     <w:tmpl w:val="4066D8D2"/>
@@ -12211,7 +13384,7 @@
       </w:pPr>
     </w:lvl>
   </w:abstractNum>
-  <w:abstractNum w:abstractNumId="20" w15:restartNumberingAfterBreak="0">
+  <w:abstractNum w:abstractNumId="22" w15:restartNumberingAfterBreak="0">
     <w:nsid w:val="76C22FEC"/>
     <w:multiLevelType w:val="hybridMultilevel"/>
     <w:tmpl w:val="7D661E6A"/>
@@ -12300,7 +13473,7 @@
       </w:pPr>
     </w:lvl>
   </w:abstractNum>
-  <w:abstractNum w:abstractNumId="21" w15:restartNumberingAfterBreak="0">
+  <w:abstractNum w:abstractNumId="23" w15:restartNumberingAfterBreak="0">
     <w:nsid w:val="7EF55F5C"/>
     <w:multiLevelType w:val="multilevel"/>
     <w:tmpl w:val="4409001F"/>
@@ -12387,70 +13560,76 @@
     </w:lvl>
   </w:abstractNum>
   <w:num w:numId="1" w16cid:durableId="422532857">
-    <w:abstractNumId w:val="7"/>
+    <w:abstractNumId w:val="9"/>
   </w:num>
   <w:num w:numId="2" w16cid:durableId="1890915732">
-    <w:abstractNumId w:val="16"/>
+    <w:abstractNumId w:val="18"/>
   </w:num>
   <w:num w:numId="3" w16cid:durableId="558782592">
-    <w:abstractNumId w:val="13"/>
+    <w:abstractNumId w:val="15"/>
   </w:num>
   <w:num w:numId="4" w16cid:durableId="291253581">
-    <w:abstractNumId w:val="19"/>
+    <w:abstractNumId w:val="21"/>
   </w:num>
   <w:num w:numId="5" w16cid:durableId="991061032">
     <w:abstractNumId w:val="0"/>
   </w:num>
   <w:num w:numId="6" w16cid:durableId="1289168179">
+    <w:abstractNumId w:val="22"/>
+  </w:num>
+  <w:num w:numId="7" w16cid:durableId="197862497">
+    <w:abstractNumId w:val="14"/>
+  </w:num>
+  <w:num w:numId="8" w16cid:durableId="551042543">
+    <w:abstractNumId w:val="13"/>
+  </w:num>
+  <w:num w:numId="9" w16cid:durableId="608927404">
     <w:abstractNumId w:val="20"/>
   </w:num>
-  <w:num w:numId="7" w16cid:durableId="197862497">
+  <w:num w:numId="10" w16cid:durableId="495653598">
+    <w:abstractNumId w:val="3"/>
+  </w:num>
+  <w:num w:numId="11" w16cid:durableId="2090609939">
+    <w:abstractNumId w:val="4"/>
+  </w:num>
+  <w:num w:numId="12" w16cid:durableId="395125979">
     <w:abstractNumId w:val="12"/>
   </w:num>
-  <w:num w:numId="8" w16cid:durableId="551042543">
+  <w:num w:numId="13" w16cid:durableId="791440515">
+    <w:abstractNumId w:val="8"/>
+  </w:num>
+  <w:num w:numId="14" w16cid:durableId="1409495815">
+    <w:abstractNumId w:val="6"/>
+  </w:num>
+  <w:num w:numId="15" w16cid:durableId="770663729">
+    <w:abstractNumId w:val="2"/>
+  </w:num>
+  <w:num w:numId="16" w16cid:durableId="373818277">
+    <w:abstractNumId w:val="10"/>
+  </w:num>
+  <w:num w:numId="17" w16cid:durableId="543252947">
+    <w:abstractNumId w:val="7"/>
+  </w:num>
+  <w:num w:numId="18" w16cid:durableId="2012677018">
+    <w:abstractNumId w:val="16"/>
+  </w:num>
+  <w:num w:numId="19" w16cid:durableId="1749880287">
+    <w:abstractNumId w:val="17"/>
+  </w:num>
+  <w:num w:numId="20" w16cid:durableId="2025666564">
     <w:abstractNumId w:val="11"/>
   </w:num>
-  <w:num w:numId="9" w16cid:durableId="608927404">
-    <w:abstractNumId w:val="18"/>
+  <w:num w:numId="21" w16cid:durableId="348602363">
+    <w:abstractNumId w:val="23"/>
   </w:num>
-  <w:num w:numId="10" w16cid:durableId="495653598">
-    <w:abstractNumId w:val="2"/>
+  <w:num w:numId="22" w16cid:durableId="1301305275">
+    <w:abstractNumId w:val="19"/>
   </w:num>
-  <w:num w:numId="11" w16cid:durableId="2090609939">
-    <w:abstractNumId w:val="3"/>
-  </w:num>
-  <w:num w:numId="12" w16cid:durableId="395125979">
-    <w:abstractNumId w:val="10"/>
-  </w:num>
-  <w:num w:numId="13" w16cid:durableId="791440515">
-    <w:abstractNumId w:val="6"/>
-  </w:num>
-  <w:num w:numId="14" w16cid:durableId="1409495815">
-    <w:abstractNumId w:val="4"/>
-  </w:num>
-  <w:num w:numId="15" w16cid:durableId="770663729">
+  <w:num w:numId="23" w16cid:durableId="757943127">
     <w:abstractNumId w:val="1"/>
   </w:num>
-  <w:num w:numId="16" w16cid:durableId="373818277">
-    <w:abstractNumId w:val="8"/>
-  </w:num>
-  <w:num w:numId="17" w16cid:durableId="543252947">
+  <w:num w:numId="24" w16cid:durableId="1942488227">
     <w:abstractNumId w:val="5"/>
-  </w:num>
-  <w:num w:numId="18" w16cid:durableId="2012677018">
-    <w:abstractNumId w:val="14"/>
-  </w:num>
-  <w:num w:numId="19" w16cid:durableId="1749880287">
-    <w:abstractNumId w:val="15"/>
-  </w:num>
-  <w:num w:numId="20" w16cid:durableId="2025666564">
-    <w:abstractNumId w:val="9"/>
-  </w:num>
-  <w:num w:numId="21" w16cid:durableId="348602363">
-    <w:abstractNumId w:val="21"/>
-  </w:num>
-  <w:num w:numId="22" w16cid:durableId="1301305275">
-    <w:abstractNumId w:val="17"/>
   </w:num>
 </w:numbering>
 </file>
@@ -13061,7 +14240,6 @@
   <w:style w:type="character" w:default="1" w:styleId="DefaultParagraphFont">
     <w:name w:val="Default Paragraph Font"/>
     <w:uiPriority w:val="1"/>
-    <w:semiHidden/>
     <w:unhideWhenUsed/>
   </w:style>
   <w:style w:type="table" w:default="1" w:styleId="TableNormal">
@@ -13910,7 +15088,7 @@
     <b:Volume>22</b:Volume>
     <b:Issue>5</b:Issue>
     <b:DOI>10.1109/TITS.2020.2973365</b:DOI>
-    <b:RefOrder>1</b:RefOrder>
+    <b:RefOrder>2</b:RefOrder>
   </b:Source>
   <b:Source>
     <b:Tag>Nur25</b:Tag>
@@ -13956,7 +15134,7 @@
     <b:Volume>23</b:Volume>
     <b:Issue>6</b:Issue>
     <b:DOI>10.21837/pm.v23i39.1913</b:DOI>
-    <b:RefOrder>2</b:RefOrder>
+    <b:RefOrder>3</b:RefOrder>
   </b:Source>
   <b:Source>
     <b:Tag>Jin25</b:Tag>
@@ -14001,7 +15179,7 @@
     <b:Volume>4</b:Volume>
     <b:Issue>1</b:Issue>
     <b:DOI>10.1016/j.multra.2024.100184</b:DOI>
-    <b:RefOrder>3</b:RefOrder>
+    <b:RefOrder>4</b:RefOrder>
   </b:Source>
   <b:Source>
     <b:Tag>Cho22</b:Tag>
@@ -14041,7 +15219,7 @@
     <b:Volume>7</b:Volume>
     <b:Issue>21</b:Issue>
     <b:DOI>10.21834/ebpj.v7i21.3751</b:DOI>
-    <b:RefOrder>4</b:RefOrder>
+    <b:RefOrder>5</b:RefOrder>
   </b:Source>
   <b:Source>
     <b:Tag>Pen22</b:Tag>
@@ -14075,7 +15253,7 @@
     <b:Volume>23</b:Volume>
     <b:Issue>7</b:Issue>
     <b:DOI>10.1109/TITS.2021.3065404</b:DOI>
-    <b:RefOrder>5</b:RefOrder>
+    <b:RefOrder>6</b:RefOrder>
   </b:Source>
   <b:Source>
     <b:Tag>Lip21</b:Tag>
@@ -14113,7 +15291,7 @@
     <b:Volume>13</b:Volume>
     <b:Issue>20</b:Issue>
     <b:DOI>10.3390/su132011450</b:DOI>
-    <b:RefOrder>6</b:RefOrder>
+    <b:RefOrder>7</b:RefOrder>
   </b:Source>
   <b:Source>
     <b:Tag>MoZ25</b:Tag>
@@ -14140,7 +15318,7 @@
     <b:Month>Novemeber</b:Month>
     <b:Publisher>VTRC</b:Publisher>
     <b:URL>https://vtrc.virginia.gov/media/vtrc/vtrc-pdf/vtrc-pdf/26-R23.pdf</b:URL>
-    <b:RefOrder>7</b:RefOrder>
+    <b:RefOrder>8</b:RefOrder>
   </b:Source>
   <b:Source>
     <b:Tag>Zhi</b:Tag>
@@ -14181,7 +15359,7 @@
     <b:Publisher>Elsevier</b:Publisher>
     <b:Volume>135</b:Volume>
     <b:DOI>10.1016/j.datak.2021.101912</b:DOI>
-    <b:RefOrder>8</b:RefOrder>
+    <b:RefOrder>9</b:RefOrder>
   </b:Source>
   <b:Source>
     <b:Tag>Sog24</b:Tag>
@@ -14215,7 +15393,7 @@
     <b:Publisher>Springer Nature Link</b:Publisher>
     <b:Volume>17</b:Volume>
     <b:DOI>10.1007/s12469-024-00367-6</b:DOI>
-    <b:RefOrder>9</b:RefOrder>
+    <b:RefOrder>10</b:RefOrder>
   </b:Source>
   <b:Source>
     <b:Tag>Ahm21</b:Tag>
@@ -14260,7 +15438,7 @@
     <b:Volume>2</b:Volume>
     <b:Issue>1</b:Issue>
     <b:DOI>10.51526/kbes.2021.2.1.19-30</b:DOI>
-    <b:RefOrder>10</b:RefOrder>
+    <b:RefOrder>11</b:RefOrder>
   </b:Source>
   <b:Source>
     <b:Tag>Ahm22</b:Tag>
@@ -14306,7 +15484,7 @@
     <b:Publisher>MDPI</b:Publisher>
     <b:Volume>10</b:Volume>
     <b:DOI>10.3390/math10132213</b:DOI>
-    <b:RefOrder>11</b:RefOrder>
+    <b:RefOrder>12</b:RefOrder>
   </b:Source>
   <b:Source>
     <b:Tag>Mah21</b:Tag>
@@ -14336,7 +15514,7 @@
     <b:Publisher>Frontiers</b:Publisher>
     <b:Volume>12</b:Volume>
     <b:DOI>10.3389/fpsyg.2021.619308</b:DOI>
-    <b:RefOrder>12</b:RefOrder>
+    <b:RefOrder>13</b:RefOrder>
   </b:Source>
   <b:Source>
     <b:Tag>Nur22</b:Tag>
@@ -14385,7 +15563,7 @@
     <b:Volume>23</b:Volume>
     <b:Issue>1</b:Issue>
     <b:DOI>10.54609/reaser.v23i1.185</b:DOI>
-    <b:RefOrder>13</b:RefOrder>
+    <b:RefOrder>14</b:RefOrder>
   </b:Source>
   <b:Source>
     <b:Tag>Mah25</b:Tag>
@@ -14432,7 +15610,7 @@
     <b:Publisher>Elsevier</b:Publisher>
     <b:Volume>27</b:Volume>
     <b:DOI>10.1016/j.rineng.2025.106126</b:DOI>
-    <b:RefOrder>14</b:RefOrder>
+    <b:RefOrder>15</b:RefOrder>
   </b:Source>
   <b:Source>
     <b:Tag>Chr22</b:Tag>
@@ -14470,7 +15648,7 @@
     <b:Publisher>MDPI</b:Publisher>
     <b:Volume>14</b:Volume>
     <b:DOI>10.3390/su14074211</b:DOI>
-    <b:RefOrder>15</b:RefOrder>
+    <b:RefOrder>16</b:RefOrder>
   </b:Source>
   <b:Source>
     <b:Tag>Che25</b:Tag>
@@ -14514,7 +15692,7 @@
     <b:Volume>57</b:Volume>
     <b:Issue>9</b:Issue>
     <b:DOI>10.1145/3715902</b:DOI>
-    <b:RefOrder>16</b:RefOrder>
+    <b:RefOrder>17</b:RefOrder>
   </b:Source>
   <b:Source>
     <b:Tag>AJe24</b:Tag>
@@ -14551,7 +15729,7 @@
     <b:Publisher>Springer Nature Link</b:Publisher>
     <b:Volume>16</b:Volume>
     <b:DOI>10.1007/s12469-023-00334-7</b:DOI>
-    <b:RefOrder>17</b:RefOrder>
+    <b:RefOrder>18</b:RefOrder>
   </b:Source>
   <b:Source>
     <b:Tag>San24</b:Tag>
@@ -14594,13 +15772,192 @@
     <b:Publisher>Scientific Reports</b:Publisher>
     <b:Volume>14</b:Volume>
     <b:DOI>10.1038/s41598-024-74237-3</b:DOI>
-    <b:RefOrder>18</b:RefOrder>
+    <b:RefOrder>19</b:RefOrder>
+  </b:Source>
+  <b:Source>
+    <b:Tag>Dav26</b:Tag>
+    <b:SourceType>JournalArticle</b:SourceType>
+    <b:Guid>{A83C8EA7-384D-464D-838B-9162A2CE9B09}</b:Guid>
+    <b:Title>A massive, graph augmented, traffic dataset for machine leraning and deep learning spatio-temporal traffic analysis</b:Title>
+    <b:JournalName>Research Square</b:JournalName>
+    <b:Year>2026</b:Year>
+    <b:Pages>1 - 17</b:Pages>
+    <b:Author>
+      <b:Author>
+        <b:NameList>
+          <b:Person>
+            <b:Last>Maria-Arribas</b:Last>
+            <b:First>David</b:First>
+          </b:Person>
+          <b:Person>
+            <b:Last>Pantrigo</b:Last>
+            <b:First>Juan</b:First>
+            <b:Middle>J.</b:Middle>
+          </b:Person>
+          <b:Person>
+            <b:Last>Cuesta-Infante</b:Last>
+            <b:First>Alfredo</b:First>
+          </b:Person>
+        </b:NameList>
+      </b:Author>
+    </b:Author>
+    <b:Month>February</b:Month>
+    <b:Day>25</b:Day>
+    <b:DOI>10.21203/rs.3.rs-8670080/v1</b:DOI>
+    <b:RefOrder>20</b:RefOrder>
+  </b:Source>
+  <b:Source>
+    <b:Tag>Liy25</b:Tag>
+    <b:SourceType>JournalArticle</b:SourceType>
+    <b:Guid>{E7B270DE-D9FF-4DCB-A41A-3243FF6A3FC8}</b:Guid>
+    <b:Title>Harmful data enhanced anomaly detection for quasi-periodic multivariate time series</b:Title>
+    <b:JournalName>Applied Intelligence</b:JournalName>
+    <b:Year>2025</b:Year>
+    <b:Pages>1 - 21</b:Pages>
+    <b:Author>
+      <b:Author>
+        <b:NameList>
+          <b:Person>
+            <b:Last>Wang</b:Last>
+            <b:First>Liyuan</b:First>
+          </b:Person>
+          <b:Person>
+            <b:Last>Zhou</b:Last>
+            <b:First>Yong</b:First>
+          </b:Person>
+          <b:Person>
+            <b:Last>Ke</b:Last>
+            <b:First>Wuping</b:First>
+          </b:Person>
+        </b:NameList>
+      </b:Author>
+    </b:Author>
+    <b:Month>March</b:Month>
+    <b:Publisher>Springer Nature Link</b:Publisher>
+    <b:Volume>55</b:Volume>
+    <b:Issue>7</b:Issue>
+    <b:DOI>10.1007/s10489-025-06461-x</b:DOI>
+    <b:RefOrder>21</b:RefOrder>
+  </b:Source>
+  <b:Source>
+    <b:Tag>Poo23</b:Tag>
+    <b:SourceType>JournalArticle</b:SourceType>
+    <b:Guid>{152293D6-37BF-45A3-96D8-437068DB55D0}</b:Guid>
+    <b:Title>Anomaly Detection and Short-Term Prediction of Traffic Flow by using Ensemble Deep Learning Approach</b:Title>
+    <b:JournalName>International Journal of Research Publication and Reviews</b:JournalName>
+    <b:Year>2023</b:Year>
+    <b:Pages>1951 - 1959</b:Pages>
+    <b:Author>
+      <b:Author>
+        <b:NameList>
+          <b:Person>
+            <b:Last>Bhartiya</b:Last>
+            <b:First>Poonam</b:First>
+          </b:Person>
+          <b:Person>
+            <b:Last>Bhatele</b:Last>
+            <b:First>Mukta</b:First>
+          </b:Person>
+          <b:Person>
+            <b:Last>Gour</b:Last>
+            <b:First>Lokendra</b:First>
+          </b:Person>
+        </b:NameList>
+      </b:Author>
+    </b:Author>
+    <b:Month>July</b:Month>
+    <b:Volume>4</b:Volume>
+    <b:Issue>7</b:Issue>
+    <b:RefOrder>22</b:RefOrder>
+  </b:Source>
+  <b:Source>
+    <b:Tag>Xue22</b:Tag>
+    <b:SourceType>JournalArticle</b:SourceType>
+    <b:Guid>{710D9C81-26C0-489A-82A3-956849BCFDF4}</b:Guid>
+    <b:Title>Deep Learning on Traffic Prediction: Methods, Analysis, and Future Directions</b:Title>
+    <b:JournalName>IEEE Transactions on Intelligent Transportation Systems</b:JournalName>
+    <b:Year>2022</b:Year>
+    <b:Pages>4927 - 4943</b:Pages>
+    <b:Author>
+      <b:Author>
+        <b:NameList>
+          <b:Person>
+            <b:Last>Yin</b:Last>
+            <b:First>Xueyan</b:First>
+          </b:Person>
+          <b:Person>
+            <b:Last>Wu</b:Last>
+            <b:First>Genze</b:First>
+          </b:Person>
+          <b:Person>
+            <b:Last>Wei</b:Last>
+            <b:First>Jinze</b:First>
+          </b:Person>
+          <b:Person>
+            <b:Last>Shen</b:Last>
+            <b:First>Yanming</b:First>
+          </b:Person>
+          <b:Person>
+            <b:Last>Qi</b:Last>
+            <b:First>Heng</b:First>
+          </b:Person>
+          <b:Person>
+            <b:Last>Yin</b:Last>
+            <b:First>Baocai</b:First>
+          </b:Person>
+        </b:NameList>
+      </b:Author>
+    </b:Author>
+    <b:Month>June</b:Month>
+    <b:Publisher>IEEE</b:Publisher>
+    <b:Volume>23</b:Volume>
+    <b:Issue>6</b:Issue>
+    <b:DOI>10.1109/TITS.2021.3054840</b:DOI>
+    <b:RefOrder>23</b:RefOrder>
+  </b:Source>
+  <b:Source>
+    <b:Tag>Leo23</b:Tag>
+    <b:SourceType>JournalArticle</b:SourceType>
+    <b:Guid>{B536349B-425B-4EA8-A5EC-874A2431AF7C}</b:Guid>
+    <b:Title>Capturing complexity over space and time via deep learning: An application to real-time delay prediction in railways</b:Title>
+    <b:JournalName>European Journal of Operational Research</b:JournalName>
+    <b:Year>2023</b:Year>
+    <b:Pages>1201 - 1217</b:Pages>
+    <b:Author>
+      <b:Author>
+        <b:NameList>
+          <b:Person>
+            <b:Last>Sobrie</b:Last>
+            <b:First>Leon</b:First>
+          </b:Person>
+          <b:Person>
+            <b:Last>Verschelde</b:Last>
+            <b:First>Marijn</b:First>
+          </b:Person>
+          <b:Person>
+            <b:Last>Hennebel</b:Last>
+            <b:First>Veerle</b:First>
+          </b:Person>
+          <b:Person>
+            <b:Last>Roets</b:Last>
+            <b:First>Bart</b:First>
+          </b:Person>
+        </b:NameList>
+      </b:Author>
+    </b:Author>
+    <b:Month>April</b:Month>
+    <b:Day>1</b:Day>
+    <b:Publisher>Elsevier</b:Publisher>
+    <b:Volume>310</b:Volume>
+    <b:Issue>3</b:Issue>
+    <b:DOI>10.1016/j.ejor.2023.03.040</b:DOI>
+    <b:RefOrder>1</b:RefOrder>
   </b:Source>
 </b:Sources>
 </file>
 
 <file path=customXml/itemProps1.xml><?xml version="1.0" encoding="utf-8"?>
-<ds:datastoreItem xmlns:ds="http://schemas.openxmlformats.org/officeDocument/2006/customXml" ds:itemID="{C1E01755-D7FA-4170-B43C-AC5B76A8FFDD}">
+<ds:datastoreItem xmlns:ds="http://schemas.openxmlformats.org/officeDocument/2006/customXml" ds:itemID="{224BBA15-A2BF-44A6-A416-C3AE7022E7AA}">
   <ds:schemaRefs>
     <ds:schemaRef ds:uri="http://schemas.openxmlformats.org/officeDocument/2006/bibliography"/>
   </ds:schemaRefs>

</xml_diff>

<commit_message>
test: :beers: Rerun HMT-TSF on all configurations and generated new .csv for shap cross run and upload .npy to repo
</commit_message>
<xml_diff>
--- a/docs/24202141_p1_report.docx
+++ b/docs/24202141_p1_report.docx
@@ -3430,7 +3430,7 @@
           <w:lang w:val="en-US"/>
         </w:rPr>
         <w:drawing>
-          <wp:inline distT="0" distB="0" distL="0" distR="0" wp14:anchorId="125BB2D3" wp14:editId="03712FDD">
+          <wp:inline distT="0" distB="0" distL="0" distR="0" wp14:anchorId="125BB2D3" wp14:editId="72853238">
             <wp:extent cx="5722620" cy="4290060"/>
             <wp:effectExtent l="19050" t="19050" r="11430" b="15240"/>
             <wp:docPr id="1339339132" name="Picture 1"/>
@@ -7614,7 +7614,7 @@
           <w:noProof/>
         </w:rPr>
         <w:drawing>
-          <wp:inline distT="0" distB="0" distL="0" distR="0" wp14:anchorId="55D5E98C" wp14:editId="5EC695E4">
+          <wp:inline distT="0" distB="0" distL="0" distR="0" wp14:anchorId="55D5E98C" wp14:editId="7F54C7E2">
             <wp:extent cx="5732145" cy="4191000"/>
             <wp:effectExtent l="19050" t="19050" r="20955" b="19050"/>
             <wp:docPr id="186974485" name="Picture 1"/>

</xml_diff>